<commit_message>
editing the main text
</commit_message>
<xml_diff>
--- a/paper/paper.docx
+++ b/paper/paper.docx
@@ -951,19 +951,13 @@
         <w:t xml:space="preserve"> </w:t>
       </w:r>
       <w:r>
-        <w:t xml:space="preserve">model,</w:t>
-      </w:r>
-      <w:r>
-        <w:t xml:space="preserve"> </w:t>
-      </w:r>
-      <w:r>
-        <w:t xml:space="preserve">while</w:t>
-      </w:r>
-      <w:r>
-        <w:t xml:space="preserve"> </w:t>
-      </w:r>
-      <w:r>
-        <w:t xml:space="preserve">the</w:t>
+        <w:t xml:space="preserve">model.</w:t>
+      </w:r>
+      <w:r>
+        <w:t xml:space="preserve"> </w:t>
+      </w:r>
+      <w:r>
+        <w:t xml:space="preserve">The</w:t>
       </w:r>
       <w:r>
         <w:t xml:space="preserve"> </w:t>
@@ -2115,7 +2109,45 @@
         <w:t xml:space="preserve"> </w:t>
       </w:r>
       <w:r>
-        <w:t xml:space="preserve">used Bayesian modeling methods to estimate the timing of the transition between the Proto and Early Aurignacian, placing the Proto-Aurignacian at 41.5 - 39.9 ka BP, and the early Aurignacian at 39.8 - 37.8 ka BP. They found that the Proto-Aurignacian occurs during the Greenland Interstadials (GI) 9 and 10, periods of climatic amelioration, while the Early Aurignacian began with the Henrich Stadial, which is characterized by dry and arid conditions, and ends with GI 8. The chronological and technological distinctness of the Proto and Early Aurignacian has been questioned, with some analyses suggesting they may represent coexisting facies rather than successive phases</w:t>
+        <w:t xml:space="preserve">used Bayesian modeling methods to estimate the timing of the transition between the Proto and Early Aurignacian, placing the Proto-Aurignacian at 41.5 - 39.9 ka BP, and the early Aurignacian at 39.8 - 37.8 ka BP. They found that the Proto-Aurignacian occurs during the Greenland Interstadials (GI) 9 and 10, periods of climatic amelioration, while the Early Aurignacian began with the Henrich Stadial, which is characterized by dry and arid conditions, and ends with GI 8.</w:t>
+      </w:r>
+    </w:p>
+    <w:p>
+      <w:pPr>
+        <w:pStyle w:val="BodyText"/>
+      </w:pPr>
+      <w:r>
+        <w:t xml:space="preserve">We adopt the two-phase framework (Aur-P1/Aur-P2; of</w:t>
+      </w:r>
+      <w:r>
+        <w:t xml:space="preserve"> </w:t>
+      </w:r>
+      <w:r>
+        <w:t xml:space="preserve">[19]</w:t>
+      </w:r>
+      <w:r>
+        <w:t xml:space="preserve"> </w:t>
+      </w:r>
+      <w:r>
+        <w:t xml:space="preserve">as a first-order chronological scaffold, acknowledging that phases are analytical conveniences rather than discrete cultural entities</w:t>
+      </w:r>
+      <w:r>
+        <w:t xml:space="preserve"> </w:t>
+      </w:r>
+      <w:r>
+        <w:t xml:space="preserve">[15,18]</w:t>
+      </w:r>
+      <w:r>
+        <w:t xml:space="preserve">. The chronological and technological distinctness of the Proto- and Early Aurignacian is difficult to sustain</w:t>
+      </w:r>
+      <w:r>
+        <w:t xml:space="preserve"> </w:t>
+      </w:r>
+      <w:r>
+        <w:t xml:space="preserve">[20]</w:t>
+      </w:r>
+      <w:r>
+        <w:t xml:space="preserve">, and some analyses suggest these represent coexisting facies rather than successive phases</w:t>
       </w:r>
       <w:r>
         <w:t xml:space="preserve"> </w:t>
@@ -2124,6 +2156,15 @@
         <w:t xml:space="preserve">[22]</w:t>
       </w:r>
       <w:r>
+        <w:t xml:space="preserve">. We therefore pool the Proto and Early Aurignac into Aur-P1 (43–37 ka BP) and treat the Evolved/Late Aurignac as Aur-P2 (37–32 ka BP), following the two-phase scheme of</w:t>
+      </w:r>
+      <w:r>
+        <w:t xml:space="preserve"> </w:t>
+      </w:r>
+      <w:r>
+        <w:t xml:space="preserve">[19]</w:t>
+      </w:r>
+      <w:r>
         <w:t xml:space="preserve">.</w:t>
       </w:r>
     </w:p>
@@ -2132,60 +2173,7 @@
         <w:pStyle w:val="BodyText"/>
       </w:pPr>
       <w:r>
-        <w:t xml:space="preserve">We adopt a two-phase framework (Aur-P1/Aur-P2;</w:t>
-      </w:r>
-      <w:r>
-        <w:t xml:space="preserve"> </w:t>
-      </w:r>
-      <w:r>
-        <w:t xml:space="preserve">[19]</w:t>
-      </w:r>
-      <w:r>
-        <w:t xml:space="preserve">) as a first-order chronological scaffold, acknowledging that phases are analytical conveniences rather than discrete cultural entities</w:t>
-      </w:r>
-      <w:r>
-        <w:t xml:space="preserve"> </w:t>
-      </w:r>
-      <w:r>
-        <w:t xml:space="preserve">[15,18]</w:t>
-      </w:r>
-      <w:r>
-        <w:t xml:space="preserve">. The chronological and technological distinctness of the Proto- and Early Aurignacian is difficult to sustain</w:t>
-      </w:r>
-      <w:r>
-        <w:t xml:space="preserve"> </w:t>
-      </w:r>
-      <w:r>
-        <w:t xml:space="preserve">[20]</w:t>
-      </w:r>
-      <w:r>
-        <w:t xml:space="preserve">, and some analyses suggest these represent coexisting facies rather than successive phases</w:t>
-      </w:r>
-      <w:r>
-        <w:t xml:space="preserve"> </w:t>
-      </w:r>
-      <w:r>
-        <w:t xml:space="preserve">[22]</w:t>
-      </w:r>
-      <w:r>
-        <w:t xml:space="preserve">. We therefore pool the Proto and Early Aurignac into Aur-P1 (43–37 ka BP) and treat the Evolved/Late Aurignac as Aur-P2 (37–32 ka BP), following the two-phase scheme of</w:t>
-      </w:r>
-      <w:r>
-        <w:t xml:space="preserve"> </w:t>
-      </w:r>
-      <w:r>
-        <w:t xml:space="preserve">[19]</w:t>
-      </w:r>
-      <w:r>
-        <w:t xml:space="preserve">. We test the sensitivity of our results to this baseline by also running four-phase and boundary-shift variants (Supplement S4, S5.5). Phase assignments follow published site attributions, translated from legacy Périgord terminology where necessary.</w:t>
-      </w:r>
-    </w:p>
-    <w:p>
-      <w:pPr>
-        <w:pStyle w:val="BodyText"/>
-      </w:pPr>
-      <w:r>
-        <w:t xml:space="preserve">Phase assignments follow specialist technological attributions from the published literature rather than radiocarbon dates alone, which can conflict with the archaeological content of a layer. Recent reassessments are therefore incorporated directly into the main analysis: Abri Pataud is placed in the Early Aurignacian (Aurignacian I) on the basis of its lithic technology</w:t>
+        <w:t xml:space="preserve">Our phase assignments follow specialist technological attributions from the published literature rather than radiocarbon dates alone, which can conflict with the archaeological content of a layer. Recent reassessments are therefore incorporated directly into our main analysis: Abri Pataud is placed in the Early Aurignacian (Aur-P1) on the basis of its lithic technology</w:t>
       </w:r>
       <w:r>
         <w:t xml:space="preserve"> </w:t>
@@ -2194,7 +2182,7 @@
         <w:t xml:space="preserve">[23,24]</w:t>
       </w:r>
       <w:r>
-        <w:t xml:space="preserve">, La Ferrassie in the Early Aurignacian on the basis of Layer 7 directly above the Châtelperronian</w:t>
+        <w:t xml:space="preserve">, La Ferrassie in the Early Aurignacian (Aur-P1) on the basis of Layer 7 directly above the Châtelperronian</w:t>
       </w:r>
       <w:r>
         <w:t xml:space="preserve"> </w:t>
@@ -2203,7 +2191,7 @@
         <w:t xml:space="preserve">[25]</w:t>
       </w:r>
       <w:r>
-        <w:t xml:space="preserve">, Mladeč in the Evolved Aurignacian on the basis of its massive-base bone points and ~31 ka BP dates</w:t>
+        <w:t xml:space="preserve">, Mladeč in the Evolved Aurignacian (Aur-P2) on the basis of its massive-base bone points and ~31 ka BP dates</w:t>
       </w:r>
       <w:r>
         <w:t xml:space="preserve"> </w:t>
@@ -2218,7 +2206,7 @@
         <w:t xml:space="preserve"> </w:t>
       </w:r>
       <w:r>
-        <w:t xml:space="preserve">[27,28]</w:t>
+        <w:t xml:space="preserve">[Aur-P1, 27,28]</w:t>
       </w:r>
       <w:r>
         <w:t xml:space="preserve">. Two sites are excluded from the analysis because their assemblages are too mixed to assign to a single phase reliably: Spy</w:t>
@@ -2242,7 +2230,37 @@
         <w:t xml:space="preserve">[31]</w:t>
       </w:r>
       <w:r>
-        <w:t xml:space="preserve">.</w:t>
+        <w:t xml:space="preserve">. We detail the rationale and procedure for assigning archaeological sites to Aurignacian phases in our Supplementary Material item</w:t>
+      </w:r>
+      <w:r>
+        <w:t xml:space="preserve"> </w:t>
+      </w:r>
+      <w:r>
+        <w:t xml:space="preserve">“</w:t>
+      </w:r>
+      <w:r>
+        <w:t xml:space="preserve">Site Phase Assignments</w:t>
+      </w:r>
+      <w:r>
+        <w:t xml:space="preserve">”</w:t>
+      </w:r>
+      <w:r>
+        <w:t xml:space="preserve">. We test the sensitivity of our results to this baseline by also running four-phase and boundary-shift variants (Supplementary Material item</w:t>
+      </w:r>
+      <w:r>
+        <w:t xml:space="preserve"> </w:t>
+      </w:r>
+      <w:r>
+        <w:t xml:space="preserve">“</w:t>
+      </w:r>
+      <w:r>
+        <w:t xml:space="preserve">Sensitivity Analyses</w:t>
+      </w:r>
+      <w:r>
+        <w:t xml:space="preserve">”</w:t>
+      </w:r>
+      <w:r>
+        <w:t xml:space="preserve">).</w:t>
       </w:r>
     </w:p>
     <w:tbl>
@@ -2468,7 +2486,7 @@
         <w:pStyle w:val="BodyText"/>
       </w:pPr>
       <w:r>
-        <w:t xml:space="preserve">We hypothesize that the early and late phases, and the environmental changes across them, may correspond to differences in the dynamics of cultural groups, as represented by patterns in the distribution of geometric signs. We aim to address two questions. First, within each phase (Aur-P1, Aur-P2), do geometric signs partition sites into a two-group structure distinguishing restricted-range (few sign types) from broad-range (many sign types) sign repertoires, and is this structure robust? Second, how does the sign-sharing network differ between Aur-P1 and Aur-P2 in connectivity, community structure, and hub organisation, once network size is accounted for, and does geographic distance explain sign assemblage dissimilarity in either phase? To answer these questions we use seriation analysis, network analysis, and PerMANOVA tests.</w:t>
+        <w:t xml:space="preserve">We hypothesize that the early and late phases, and the environmental changes across them, may correspond to differences in the dynamics of cultural groups, as represented by patterns in the distribution of geometric signs. We aim to address two questions. First, within each phase (Aur-P1, Aur-P2), are there any regularities in the repertoires of geometric signs at Aurignacian sites that suggest sign use was structured in some way? Second, how does the sign-sharing network differ between Aur-P1 and Aur-P2 in connectivity, community structure, and hub organisation, once network size is accounted for, and does geographic distance explain sign assemblage dissimilarity in either phase? To answer these questions we use seriation analysis, network analysis, and PerMANOVA tests.</w:t>
       </w:r>
     </w:p>
     <w:bookmarkEnd w:id="23"/>
@@ -2522,7 +2540,22 @@
         <w:t xml:space="preserve">”</w:t>
       </w:r>
       <w:r>
-        <w:t xml:space="preserve">. To improve the quality of our data we excluded seven sites from the sample: only Willendorf (one sign present); Riparo di Fontana Nuova, Muralovka, Shanidar Cave, and Hayonim Cave (extreme geographic distance from the other sites); Grotte De La Princesse Pauline and Šandalja II (dated much later than the rest of the assemblages). This resulted in a sample of 410 objects found at 28 sites in 7 countries, and 54 sign types used in this study (</w:t>
+        <w:t xml:space="preserve">. To improve the quality of our data we excluded eight sites from the sample: Willendorf (one sign present); Riparo di Fontana Nuova, Muralovka, Shanidar Cave, and Hayonim Cave (extreme geographic distance from the other sites); El Salitre (lacking a reliable chronological context); and Grotte De La Princesse Pauline and Šandalja II (dated much later than the rest of the assemblages). A full accounting of how we assign archaeological sites to Aurignacian phases is presented in our Supplementary Material item</w:t>
+      </w:r>
+      <w:r>
+        <w:t xml:space="preserve"> </w:t>
+      </w:r>
+      <w:r>
+        <w:t xml:space="preserve">“</w:t>
+      </w:r>
+      <w:r>
+        <w:t xml:space="preserve">Site Phase Assignments</w:t>
+      </w:r>
+      <w:r>
+        <w:t xml:space="preserve">”</w:t>
+      </w:r>
+      <w:r>
+        <w:t xml:space="preserve">. Our sample for analysis includes 410 objects found at 28 sites in 7 countries, and 54 sign types (</w:t>
       </w:r>
       <w:hyperlink w:anchor="fig-site-map">
         <w:r>
@@ -2644,7 +2677,7 @@
         </w:r>
       </w:hyperlink>
       <w:r>
-        <w:t xml:space="preserve">). The Aur-P1 phase has 20 sites and 26 sign types, and the Aur-P2 phase has 8 sites and 10 sign types. A Mantel test to evaluate the correlation between distance in time and distribution of sign types did not find a statistically significant correlation (R = 0.061, p = 0.009). This suggests that substantial changes in sign types did not occur over time during the Aurignacian period.</w:t>
+        <w:t xml:space="preserve">). The Aur-P1 phase has 20 sites and 26 sign types, and the Aur-P2 phase has 8 sites and 10 sign types. A Mantel test to evaluate the correlation between distance in time and distribution of sign types found a weak but nominally statistically significant correlation (R = 0.061, p = 0.009). The very small effect size (R ≈ 0.06) indicates that temporal distance explains only a small fraction of the variation in sign-type distribution, suggesting that substantial changes in sign types did not occur over time during the Aurignacian period.</w:t>
       </w:r>
     </w:p>
     <w:bookmarkEnd w:id="28"/>
@@ -3431,7 +3464,7 @@
         <w:t xml:space="preserve">[46]</w:t>
       </w:r>
       <w:r>
-        <w:t xml:space="preserve">, and the null-benchmarked and size-normalised (Erdős–Rényi) comparisons in Supplement S5.9 evaluate this structure net of network size. Pairwise permutation tests with Benjamini–Hochberg correction show that the phases do not differ significantly in edge density (p = 0.2516, 0.2516), betweenness (p = 0.456, 0.456), or component count (p = 0.4956, 0.4956), but differ significantly in modularity (adjusted p &lt; 0.001), indicating that the Aur-P1 and Aur-P2 networks differ in their community structure rather than in their overall density.</w:t>
+        <w:t xml:space="preserve">, and the null-benchmarked and size-normalised (Erdős–Rényi) comparisons in Supplement S5.9 evaluate this structure net of network size. Pairwise permutation tests with Benjamini–Hochberg correction show that the phases do not differ significantly in edge density (p = 0.2523), betweenness (p = 0.4629), or component count (p = 0.5072), but differ significantly in modularity (adjusted p &lt; 0.001), indicating that the Aur-P1 and Aur-P2 networks differ in their community structure rather than in their overall density.</w:t>
       </w:r>
     </w:p>
     <w:tbl>
@@ -3832,7 +3865,7 @@
         <w:t xml:space="preserve"> </w:t>
       </w:r>
       <w:r>
-        <w:t xml:space="preserve">shows that connectivity also differs between the phases. Aur-P1 produced the more edge-rich network with the higher mean degree (7.5°) and a hub structure centred on key sites, while Aur-P2 shows fewer edges and a lower mean degree (4.2°). Pairwise permutation tests indicate that the phases differ significantly in modularity (adjusted p &lt; 0.001) but not in edge density (p = 0.2516, 0.2516), betweenness (p = 0.456, 0.456), or component count (p = 0.4956, 0.4956), so the Aur-P1–Aur-P2 contrast is best described as a difference in community structure rather than in overall connectedness. The perMANOVA tests confirm that the restricted- and broad-range groups are significantly separated in sign composition within Aur-P1 (R² = 0.195, p = 0.001), while the separation within Aur-P2 is not significant (R² = 0.226, p = 0.147), consistent with the smaller and weaker Aur-P2 structure reported in the Results.</w:t>
+        <w:t xml:space="preserve">shows that connectivity also differs between the phases. Aur-P1 produced the more edge-rich network with the higher mean degree (7.5°) and a hub structure centred on key sites, while Aur-P2 shows fewer edges and a lower mean degree (4.2°). Pairwise permutation tests indicate that the phases differ significantly in modularity (adjusted p &lt; 0.001) but not in edge density (p = 0.2523), betweenness (p = 0.4629), or component count (p = 0.5072), so the Aur-P1–Aur-P2 contrast is best described as a difference in community structure rather than in overall connectedness. The perMANOVA tests confirm that the restricted- and broad-range groups are significantly separated in sign composition within Aur-P1 (R² = 0.195, p = 0.001), while the separation within Aur-P2 is not significant (R² = 0.226, p = 0.147), consistent with the smaller and weaker Aur-P2 structure reported in the Results.</w:t>
       </w:r>
     </w:p>
     <w:p>
@@ -4182,7 +4215,7 @@
         </w:r>
       </w:hyperlink>
       <w:r>
-        <w:t xml:space="preserve">). Supporting this distinction, diversity excess (as an indicator of aggregation candidates) showed a significant negative correlation with network degree (ρ = -0.38, p = 0.0459501), indicating that aggregation candidates are less connected rather than merely decoupled from network hubs. The correlation with betweenness was not significant (ρ = -0.14, p = 0.4820486). Object count was unrelated to centrality (degree: ρ = 0.44, p = 0.0176994), suggesting that hubs are not simply well-sampled sites. The elevated diversity identifying aggregation candidates differs significantly between the restricted and broad-range groups (Wilcoxon W = 62, p = 0.1033813), confirming that this metric captures variation relevant to the restricted/broad grouping.</w:t>
+        <w:t xml:space="preserve">). Supporting this distinction, diversity excess (as an indicator of aggregation candidates) showed a significant negative correlation with network degree (ρ = -0.38, p = 0.0459501), indicating that aggregation candidates are less connected rather than merely decoupled from network hubs. The correlation with betweenness was not significant (ρ = -0.14, p = 0.4820486). Object count was positively correlated with degree centrality (degree: ρ = 0.44, p = 0.0176994), indicating that hubs tend to be among the better-sampled sites. The elevated diversity identifying aggregation candidates did not differ significantly between the restricted and broad-range groups (Wilcoxon W = 62, p = 0.1033813), so this metric does not by itself track the restricted/broad grouping.</w:t>
       </w:r>
     </w:p>
     <w:tbl>

</xml_diff>

<commit_message>
update template to output tables with Arial 10 pt
</commit_message>
<xml_diff>
--- a/paper/paper.docx
+++ b/paper/paper.docx
@@ -639,13 +639,721 @@
         <w:t xml:space="preserve"> </w:t>
       </w:r>
       <w:r>
-        <w:t xml:space="preserve">rather</w:t>
-      </w:r>
-      <w:r>
-        <w:t xml:space="preserve"> </w:t>
-      </w:r>
-      <w:r>
-        <w:t xml:space="preserve">than</w:t>
+        <w:t xml:space="preserve">within</w:t>
+      </w:r>
+      <w:r>
+        <w:t xml:space="preserve"> </w:t>
+      </w:r>
+      <w:r>
+        <w:t xml:space="preserve">each</w:t>
+      </w:r>
+      <w:r>
+        <w:t xml:space="preserve"> </w:t>
+      </w:r>
+      <w:r>
+        <w:t xml:space="preserve">phase,</w:t>
+      </w:r>
+      <w:r>
+        <w:t xml:space="preserve"> </w:t>
+      </w:r>
+      <w:r>
+        <w:t xml:space="preserve">and</w:t>
+      </w:r>
+      <w:r>
+        <w:t xml:space="preserve"> </w:t>
+      </w:r>
+      <w:r>
+        <w:t xml:space="preserve">whether</w:t>
+      </w:r>
+      <w:r>
+        <w:t xml:space="preserve"> </w:t>
+      </w:r>
+      <w:r>
+        <w:t xml:space="preserve">the</w:t>
+      </w:r>
+      <w:r>
+        <w:t xml:space="preserve"> </w:t>
+      </w:r>
+      <w:r>
+        <w:t xml:space="preserve">sign-sharing</w:t>
+      </w:r>
+      <w:r>
+        <w:t xml:space="preserve"> </w:t>
+      </w:r>
+      <w:r>
+        <w:t xml:space="preserve">network</w:t>
+      </w:r>
+      <w:r>
+        <w:t xml:space="preserve"> </w:t>
+      </w:r>
+      <w:r>
+        <w:t xml:space="preserve">differs</w:t>
+      </w:r>
+      <w:r>
+        <w:t xml:space="preserve"> </w:t>
+      </w:r>
+      <w:r>
+        <w:t xml:space="preserve">between</w:t>
+      </w:r>
+      <w:r>
+        <w:t xml:space="preserve"> </w:t>
+      </w:r>
+      <w:r>
+        <w:t xml:space="preserve">the</w:t>
+      </w:r>
+      <w:r>
+        <w:t xml:space="preserve"> </w:t>
+      </w:r>
+      <w:r>
+        <w:t xml:space="preserve">early</w:t>
+      </w:r>
+      <w:r>
+        <w:t xml:space="preserve"> </w:t>
+      </w:r>
+      <w:r>
+        <w:t xml:space="preserve">and</w:t>
+      </w:r>
+      <w:r>
+        <w:t xml:space="preserve"> </w:t>
+      </w:r>
+      <w:r>
+        <w:t xml:space="preserve">late</w:t>
+      </w:r>
+      <w:r>
+        <w:t xml:space="preserve"> </w:t>
+      </w:r>
+      <w:r>
+        <w:t xml:space="preserve">Aurignacian.</w:t>
+      </w:r>
+      <w:r>
+        <w:t xml:space="preserve"> </w:t>
+      </w:r>
+      <w:r>
+        <w:t xml:space="preserve">Within</w:t>
+      </w:r>
+      <w:r>
+        <w:t xml:space="preserve"> </w:t>
+      </w:r>
+      <w:r>
+        <w:t xml:space="preserve">the</w:t>
+      </w:r>
+      <w:r>
+        <w:t xml:space="preserve"> </w:t>
+      </w:r>
+      <w:r>
+        <w:t xml:space="preserve">early</w:t>
+      </w:r>
+      <w:r>
+        <w:t xml:space="preserve"> </w:t>
+      </w:r>
+      <w:r>
+        <w:t xml:space="preserve">phase</w:t>
+      </w:r>
+      <w:r>
+        <w:t xml:space="preserve"> </w:t>
+      </w:r>
+      <w:r>
+        <w:t xml:space="preserve">(Aur-P1;</w:t>
+      </w:r>
+      <w:r>
+        <w:t xml:space="preserve"> </w:t>
+      </w:r>
+      <w:r>
+        <w:t xml:space="preserve">20</w:t>
+      </w:r>
+      <w:r>
+        <w:t xml:space="preserve"> </w:t>
+      </w:r>
+      <w:r>
+        <w:t xml:space="preserve">sites)</w:t>
+      </w:r>
+      <w:r>
+        <w:t xml:space="preserve"> </w:t>
+      </w:r>
+      <w:r>
+        <w:t xml:space="preserve">we</w:t>
+      </w:r>
+      <w:r>
+        <w:t xml:space="preserve"> </w:t>
+      </w:r>
+      <w:r>
+        <w:t xml:space="preserve">identify</w:t>
+      </w:r>
+      <w:r>
+        <w:t xml:space="preserve"> </w:t>
+      </w:r>
+      <w:r>
+        <w:t xml:space="preserve">a</w:t>
+      </w:r>
+      <w:r>
+        <w:t xml:space="preserve"> </w:t>
+      </w:r>
+      <w:r>
+        <w:t xml:space="preserve">robust</w:t>
+      </w:r>
+      <w:r>
+        <w:t xml:space="preserve"> </w:t>
+      </w:r>
+      <w:r>
+        <w:t xml:space="preserve">two-group</w:t>
+      </w:r>
+      <w:r>
+        <w:t xml:space="preserve"> </w:t>
+      </w:r>
+      <w:r>
+        <w:t xml:space="preserve">structure</w:t>
+      </w:r>
+      <w:r>
+        <w:t xml:space="preserve"> </w:t>
+      </w:r>
+      <w:r>
+        <w:t xml:space="preserve">of</w:t>
+      </w:r>
+      <w:r>
+        <w:t xml:space="preserve"> </w:t>
+      </w:r>
+      <w:r>
+        <w:t xml:space="preserve">restricted</w:t>
+      </w:r>
+      <w:r>
+        <w:t xml:space="preserve"> </w:t>
+      </w:r>
+      <w:r>
+        <w:t xml:space="preserve">versus</w:t>
+      </w:r>
+      <w:r>
+        <w:t xml:space="preserve"> </w:t>
+      </w:r>
+      <w:r>
+        <w:t xml:space="preserve">broad</w:t>
+      </w:r>
+      <w:r>
+        <w:t xml:space="preserve"> </w:t>
+      </w:r>
+      <w:r>
+        <w:t xml:space="preserve">geometric-sign</w:t>
+      </w:r>
+      <w:r>
+        <w:t xml:space="preserve"> </w:t>
+      </w:r>
+      <w:r>
+        <w:t xml:space="preserve">repertoires</w:t>
+      </w:r>
+      <w:r>
+        <w:t xml:space="preserve"> </w:t>
+      </w:r>
+      <w:r>
+        <w:t xml:space="preserve">that</w:t>
+      </w:r>
+      <w:r>
+        <w:t xml:space="preserve"> </w:t>
+      </w:r>
+      <w:r>
+        <w:t xml:space="preserve">is</w:t>
+      </w:r>
+      <w:r>
+        <w:t xml:space="preserve"> </w:t>
+      </w:r>
+      <w:r>
+        <w:t xml:space="preserve">stable</w:t>
+      </w:r>
+      <w:r>
+        <w:t xml:space="preserve"> </w:t>
+      </w:r>
+      <w:r>
+        <w:t xml:space="preserve">under</w:t>
+      </w:r>
+      <w:r>
+        <w:t xml:space="preserve"> </w:t>
+      </w:r>
+      <w:r>
+        <w:t xml:space="preserve">bootstrap</w:t>
+      </w:r>
+      <w:r>
+        <w:t xml:space="preserve"> </w:t>
+      </w:r>
+      <w:r>
+        <w:t xml:space="preserve">resampling</w:t>
+      </w:r>
+      <w:r>
+        <w:t xml:space="preserve"> </w:t>
+      </w:r>
+      <w:r>
+        <w:t xml:space="preserve">and</w:t>
+      </w:r>
+      <w:r>
+        <w:t xml:space="preserve"> </w:t>
+      </w:r>
+      <w:r>
+        <w:t xml:space="preserve">largely</w:t>
+      </w:r>
+      <w:r>
+        <w:t xml:space="preserve"> </w:t>
+      </w:r>
+      <w:r>
+        <w:t xml:space="preserve">recovered</w:t>
+      </w:r>
+      <w:r>
+        <w:t xml:space="preserve"> </w:t>
+      </w:r>
+      <w:r>
+        <w:t xml:space="preserve">by</w:t>
+      </w:r>
+      <w:r>
+        <w:t xml:space="preserve"> </w:t>
+      </w:r>
+      <w:r>
+        <w:t xml:space="preserve">an</w:t>
+      </w:r>
+      <w:r>
+        <w:t xml:space="preserve"> </w:t>
+      </w:r>
+      <w:r>
+        <w:t xml:space="preserve">independent</w:t>
+      </w:r>
+      <w:r>
+        <w:t xml:space="preserve"> </w:t>
+      </w:r>
+      <w:r>
+        <w:t xml:space="preserve">stochastic</w:t>
+      </w:r>
+      <w:r>
+        <w:t xml:space="preserve"> </w:t>
+      </w:r>
+      <w:r>
+        <w:t xml:space="preserve">block</w:t>
+      </w:r>
+      <w:r>
+        <w:t xml:space="preserve"> </w:t>
+      </w:r>
+      <w:r>
+        <w:t xml:space="preserve">model.</w:t>
+      </w:r>
+      <w:r>
+        <w:t xml:space="preserve"> </w:t>
+      </w:r>
+      <w:r>
+        <w:t xml:space="preserve">The</w:t>
+      </w:r>
+      <w:r>
+        <w:t xml:space="preserve"> </w:t>
+      </w:r>
+      <w:r>
+        <w:t xml:space="preserve">small</w:t>
+      </w:r>
+      <w:r>
+        <w:t xml:space="preserve"> </w:t>
+      </w:r>
+      <w:r>
+        <w:t xml:space="preserve">late</w:t>
+      </w:r>
+      <w:r>
+        <w:t xml:space="preserve"> </w:t>
+      </w:r>
+      <w:r>
+        <w:t xml:space="preserve">phase</w:t>
+      </w:r>
+      <w:r>
+        <w:t xml:space="preserve"> </w:t>
+      </w:r>
+      <w:r>
+        <w:t xml:space="preserve">(Aur-P2;</w:t>
+      </w:r>
+      <w:r>
+        <w:t xml:space="preserve"> </w:t>
+      </w:r>
+      <w:r>
+        <w:t xml:space="preserve">8</w:t>
+      </w:r>
+      <w:r>
+        <w:t xml:space="preserve"> </w:t>
+      </w:r>
+      <w:r>
+        <w:t xml:space="preserve">sites)</w:t>
+      </w:r>
+      <w:r>
+        <w:t xml:space="preserve"> </w:t>
+      </w:r>
+      <w:r>
+        <w:t xml:space="preserve">shows</w:t>
+      </w:r>
+      <w:r>
+        <w:t xml:space="preserve"> </w:t>
+      </w:r>
+      <w:r>
+        <w:t xml:space="preserve">a</w:t>
+      </w:r>
+      <w:r>
+        <w:t xml:space="preserve"> </w:t>
+      </w:r>
+      <w:r>
+        <w:t xml:space="preserve">weaker,</w:t>
+      </w:r>
+      <w:r>
+        <w:t xml:space="preserve"> </w:t>
+      </w:r>
+      <w:r>
+        <w:t xml:space="preserve">less</w:t>
+      </w:r>
+      <w:r>
+        <w:t xml:space="preserve"> </w:t>
+      </w:r>
+      <w:r>
+        <w:t xml:space="preserve">resolved</w:t>
+      </w:r>
+      <w:r>
+        <w:t xml:space="preserve"> </w:t>
+      </w:r>
+      <w:r>
+        <w:t xml:space="preserve">structure.</w:t>
+      </w:r>
+      <w:r>
+        <w:t xml:space="preserve"> </w:t>
+      </w:r>
+      <w:r>
+        <w:t xml:space="preserve">The</w:t>
+      </w:r>
+      <w:r>
+        <w:t xml:space="preserve"> </w:t>
+      </w:r>
+      <w:r>
+        <w:t xml:space="preserve">early</w:t>
+      </w:r>
+      <w:r>
+        <w:t xml:space="preserve"> </w:t>
+      </w:r>
+      <w:r>
+        <w:t xml:space="preserve">phase</w:t>
+      </w:r>
+      <w:r>
+        <w:t xml:space="preserve"> </w:t>
+      </w:r>
+      <w:r>
+        <w:t xml:space="preserve">supports</w:t>
+      </w:r>
+      <w:r>
+        <w:t xml:space="preserve"> </w:t>
+      </w:r>
+      <w:r>
+        <w:t xml:space="preserve">a</w:t>
+      </w:r>
+      <w:r>
+        <w:t xml:space="preserve"> </w:t>
+      </w:r>
+      <w:r>
+        <w:t xml:space="preserve">larger,</w:t>
+      </w:r>
+      <w:r>
+        <w:t xml:space="preserve"> </w:t>
+      </w:r>
+      <w:r>
+        <w:t xml:space="preserve">more</w:t>
+      </w:r>
+      <w:r>
+        <w:t xml:space="preserve"> </w:t>
+      </w:r>
+      <w:r>
+        <w:t xml:space="preserve">network</w:t>
+      </w:r>
+      <w:r>
+        <w:t xml:space="preserve"> </w:t>
+      </w:r>
+      <w:r>
+        <w:t xml:space="preserve">centred</w:t>
+      </w:r>
+      <w:r>
+        <w:t xml:space="preserve"> </w:t>
+      </w:r>
+      <w:r>
+        <w:t xml:space="preserve">on</w:t>
+      </w:r>
+      <w:r>
+        <w:t xml:space="preserve"> </w:t>
+      </w:r>
+      <w:r>
+        <w:t xml:space="preserve">key</w:t>
+      </w:r>
+      <w:r>
+        <w:t xml:space="preserve"> </w:t>
+      </w:r>
+      <w:r>
+        <w:t xml:space="preserve">sites,</w:t>
+      </w:r>
+      <w:r>
+        <w:t xml:space="preserve"> </w:t>
+      </w:r>
+      <w:r>
+        <w:t xml:space="preserve">but</w:t>
+      </w:r>
+      <w:r>
+        <w:t xml:space="preserve"> </w:t>
+      </w:r>
+      <w:r>
+        <w:t xml:space="preserve">once</w:t>
+      </w:r>
+      <w:r>
+        <w:t xml:space="preserve"> </w:t>
+      </w:r>
+      <w:r>
+        <w:t xml:space="preserve">network</w:t>
+      </w:r>
+      <w:r>
+        <w:t xml:space="preserve"> </w:t>
+      </w:r>
+      <w:r>
+        <w:t xml:space="preserve">size</w:t>
+      </w:r>
+      <w:r>
+        <w:t xml:space="preserve"> </w:t>
+      </w:r>
+      <w:r>
+        <w:t xml:space="preserve">is</w:t>
+      </w:r>
+      <w:r>
+        <w:t xml:space="preserve"> </w:t>
+      </w:r>
+      <w:r>
+        <w:t xml:space="preserve">taken</w:t>
+      </w:r>
+      <w:r>
+        <w:t xml:space="preserve"> </w:t>
+      </w:r>
+      <w:r>
+        <w:t xml:space="preserve">into</w:t>
+      </w:r>
+      <w:r>
+        <w:t xml:space="preserve"> </w:t>
+      </w:r>
+      <w:r>
+        <w:t xml:space="preserve">account</w:t>
+      </w:r>
+      <w:r>
+        <w:t xml:space="preserve"> </w:t>
+      </w:r>
+      <w:r>
+        <w:t xml:space="preserve">the</w:t>
+      </w:r>
+      <w:r>
+        <w:t xml:space="preserve"> </w:t>
+      </w:r>
+      <w:r>
+        <w:t xml:space="preserve">late</w:t>
+      </w:r>
+      <w:r>
+        <w:t xml:space="preserve"> </w:t>
+      </w:r>
+      <w:r>
+        <w:t xml:space="preserve">phase</w:t>
+      </w:r>
+      <w:r>
+        <w:t xml:space="preserve"> </w:t>
+      </w:r>
+      <w:r>
+        <w:t xml:space="preserve">shows</w:t>
+      </w:r>
+      <w:r>
+        <w:t xml:space="preserve"> </w:t>
+      </w:r>
+      <w:r>
+        <w:t xml:space="preserve">higher</w:t>
+      </w:r>
+      <w:r>
+        <w:t xml:space="preserve"> </w:t>
+      </w:r>
+      <w:r>
+        <w:t xml:space="preserve">edge</w:t>
+      </w:r>
+      <w:r>
+        <w:t xml:space="preserve"> </w:t>
+      </w:r>
+      <w:r>
+        <w:t xml:space="preserve">density,</w:t>
+      </w:r>
+      <w:r>
+        <w:t xml:space="preserve"> </w:t>
+      </w:r>
+      <w:r>
+        <w:t xml:space="preserve">and</w:t>
+      </w:r>
+      <w:r>
+        <w:t xml:space="preserve"> </w:t>
+      </w:r>
+      <w:r>
+        <w:t xml:space="preserve">formal</w:t>
+      </w:r>
+      <w:r>
+        <w:t xml:space="preserve"> </w:t>
+      </w:r>
+      <w:r>
+        <w:t xml:space="preserve">permutation</w:t>
+      </w:r>
+      <w:r>
+        <w:t xml:space="preserve"> </w:t>
+      </w:r>
+      <w:r>
+        <w:t xml:space="preserve">tests</w:t>
+      </w:r>
+      <w:r>
+        <w:t xml:space="preserve"> </w:t>
+      </w:r>
+      <w:r>
+        <w:t xml:space="preserve">indicate</w:t>
+      </w:r>
+      <w:r>
+        <w:t xml:space="preserve"> </w:t>
+      </w:r>
+      <w:r>
+        <w:t xml:space="preserve">that</w:t>
+      </w:r>
+      <w:r>
+        <w:t xml:space="preserve"> </w:t>
+      </w:r>
+      <w:r>
+        <w:t xml:space="preserve">the</w:t>
+      </w:r>
+      <w:r>
+        <w:t xml:space="preserve"> </w:t>
+      </w:r>
+      <w:r>
+        <w:t xml:space="preserve">phases</w:t>
+      </w:r>
+      <w:r>
+        <w:t xml:space="preserve"> </w:t>
+      </w:r>
+      <w:r>
+        <w:t xml:space="preserve">differ</w:t>
+      </w:r>
+      <w:r>
+        <w:t xml:space="preserve"> </w:t>
+      </w:r>
+      <w:r>
+        <w:t xml:space="preserve">in</w:t>
+      </w:r>
+      <w:r>
+        <w:t xml:space="preserve"> </w:t>
+      </w:r>
+      <w:r>
+        <w:t xml:space="preserve">community</w:t>
+      </w:r>
+      <w:r>
+        <w:t xml:space="preserve"> </w:t>
+      </w:r>
+      <w:r>
+        <w:t xml:space="preserve">structure</w:t>
+      </w:r>
+      <w:r>
+        <w:t xml:space="preserve"> </w:t>
+      </w:r>
+      <w:r>
+        <w:t xml:space="preserve">(modularity)</w:t>
+      </w:r>
+      <w:r>
+        <w:t xml:space="preserve"> </w:t>
+      </w:r>
+      <w:r>
+        <w:t xml:space="preserve">but</w:t>
+      </w:r>
+      <w:r>
+        <w:t xml:space="preserve"> </w:t>
+      </w:r>
+      <w:r>
+        <w:t xml:space="preserve">not</w:t>
+      </w:r>
+      <w:r>
+        <w:t xml:space="preserve"> </w:t>
+      </w:r>
+      <w:r>
+        <w:t xml:space="preserve">in</w:t>
+      </w:r>
+      <w:r>
+        <w:t xml:space="preserve"> </w:t>
+      </w:r>
+      <w:r>
+        <w:t xml:space="preserve">edge</w:t>
+      </w:r>
+      <w:r>
+        <w:t xml:space="preserve"> </w:t>
+      </w:r>
+      <w:r>
+        <w:t xml:space="preserve">density,</w:t>
+      </w:r>
+      <w:r>
+        <w:t xml:space="preserve"> </w:t>
+      </w:r>
+      <w:r>
+        <w:t xml:space="preserve">betweenness,</w:t>
+      </w:r>
+      <w:r>
+        <w:t xml:space="preserve"> </w:t>
+      </w:r>
+      <w:r>
+        <w:t xml:space="preserve">or</w:t>
+      </w:r>
+      <w:r>
+        <w:t xml:space="preserve"> </w:t>
+      </w:r>
+      <w:r>
+        <w:t xml:space="preserve">component</w:t>
+      </w:r>
+      <w:r>
+        <w:t xml:space="preserve"> </w:t>
+      </w:r>
+      <w:r>
+        <w:t xml:space="preserve">count.</w:t>
+      </w:r>
+      <w:r>
+        <w:t xml:space="preserve"> </w:t>
+      </w:r>
+      <w:r>
+        <w:t xml:space="preserve">Mantel</w:t>
+      </w:r>
+      <w:r>
+        <w:t xml:space="preserve"> </w:t>
+      </w:r>
+      <w:r>
+        <w:t xml:space="preserve">tests</w:t>
+      </w:r>
+      <w:r>
+        <w:t xml:space="preserve"> </w:t>
+      </w:r>
+      <w:r>
+        <w:t xml:space="preserve">did</w:t>
+      </w:r>
+      <w:r>
+        <w:t xml:space="preserve"> </w:t>
+      </w:r>
+      <w:r>
+        <w:t xml:space="preserve">not</w:t>
+      </w:r>
+      <w:r>
+        <w:t xml:space="preserve"> </w:t>
+      </w:r>
+      <w:r>
+        <w:t xml:space="preserve">detect</w:t>
+      </w:r>
+      <w:r>
+        <w:t xml:space="preserve"> </w:t>
+      </w:r>
+      <w:r>
+        <w:t xml:space="preserve">a</w:t>
+      </w:r>
+      <w:r>
+        <w:t xml:space="preserve"> </w:t>
+      </w:r>
+      <w:r>
+        <w:t xml:space="preserve">significant</w:t>
+      </w:r>
+      <w:r>
+        <w:t xml:space="preserve"> </w:t>
+      </w:r>
+      <w:r>
+        <w:t xml:space="preserve">correlation</w:t>
+      </w:r>
+      <w:r>
+        <w:t xml:space="preserve"> </w:t>
+      </w:r>
+      <w:r>
+        <w:t xml:space="preserve">between</w:t>
       </w:r>
       <w:r>
         <w:t xml:space="preserve"> </w:t>
@@ -657,19 +1365,37 @@
         <w:t xml:space="preserve"> </w:t>
       </w:r>
       <w:r>
-        <w:t xml:space="preserve">isolation</w:t>
-      </w:r>
-      <w:r>
-        <w:t xml:space="preserve"> </w:t>
-      </w:r>
-      <w:r>
-        <w:t xml:space="preserve">within</w:t>
-      </w:r>
-      <w:r>
-        <w:t xml:space="preserve"> </w:t>
-      </w:r>
-      <w:r>
-        <w:t xml:space="preserve">each</w:t>
+        <w:t xml:space="preserve">distance</w:t>
+      </w:r>
+      <w:r>
+        <w:t xml:space="preserve"> </w:t>
+      </w:r>
+      <w:r>
+        <w:t xml:space="preserve">and</w:t>
+      </w:r>
+      <w:r>
+        <w:t xml:space="preserve"> </w:t>
+      </w:r>
+      <w:r>
+        <w:t xml:space="preserve">sign</w:t>
+      </w:r>
+      <w:r>
+        <w:t xml:space="preserve"> </w:t>
+      </w:r>
+      <w:r>
+        <w:t xml:space="preserve">distribution</w:t>
+      </w:r>
+      <w:r>
+        <w:t xml:space="preserve"> </w:t>
+      </w:r>
+      <w:r>
+        <w:t xml:space="preserve">in</w:t>
+      </w:r>
+      <w:r>
+        <w:t xml:space="preserve"> </w:t>
+      </w:r>
+      <w:r>
+        <w:t xml:space="preserve">either</w:t>
       </w:r>
       <w:r>
         <w:t xml:space="preserve"> </w:t>
@@ -687,31 +1413,37 @@
         <w:t xml:space="preserve"> </w:t>
       </w:r>
       <w:r>
-        <w:t xml:space="preserve">whether</w:t>
-      </w:r>
-      <w:r>
-        <w:t xml:space="preserve"> </w:t>
-      </w:r>
-      <w:r>
         <w:t xml:space="preserve">the</w:t>
       </w:r>
       <w:r>
         <w:t xml:space="preserve"> </w:t>
       </w:r>
       <w:r>
-        <w:t xml:space="preserve">sign-sharing</w:t>
-      </w:r>
-      <w:r>
-        <w:t xml:space="preserve"> </w:t>
-      </w:r>
-      <w:r>
-        <w:t xml:space="preserve">network</w:t>
-      </w:r>
-      <w:r>
-        <w:t xml:space="preserve"> </w:t>
-      </w:r>
-      <w:r>
-        <w:t xml:space="preserve">differs</w:t>
+        <w:t xml:space="preserve">isolation-by-distance</w:t>
+      </w:r>
+      <w:r>
+        <w:t xml:space="preserve"> </w:t>
+      </w:r>
+      <w:r>
+        <w:t xml:space="preserve">relationship</w:t>
+      </w:r>
+      <w:r>
+        <w:t xml:space="preserve"> </w:t>
+      </w:r>
+      <w:r>
+        <w:t xml:space="preserve">does</w:t>
+      </w:r>
+      <w:r>
+        <w:t xml:space="preserve"> </w:t>
+      </w:r>
+      <w:r>
+        <w:t xml:space="preserve">not</w:t>
+      </w:r>
+      <w:r>
+        <w:t xml:space="preserve"> </w:t>
+      </w:r>
+      <w:r>
+        <w:t xml:space="preserve">differ</w:t>
       </w:r>
       <w:r>
         <w:t xml:space="preserve"> </w:t>
@@ -723,901 +1455,289 @@
         <w:t xml:space="preserve"> </w:t>
       </w:r>
       <w:r>
+        <w:t xml:space="preserve">them,</w:t>
+      </w:r>
+      <w:r>
+        <w:t xml:space="preserve"> </w:t>
+      </w:r>
+      <w:r>
+        <w:t xml:space="preserve">although</w:t>
+      </w:r>
+      <w:r>
+        <w:t xml:space="preserve"> </w:t>
+      </w:r>
+      <w:r>
+        <w:t xml:space="preserve">this</w:t>
+      </w:r>
+      <w:r>
+        <w:t xml:space="preserve"> </w:t>
+      </w:r>
+      <w:r>
+        <w:t xml:space="preserve">null</w:t>
+      </w:r>
+      <w:r>
+        <w:t xml:space="preserve"> </w:t>
+      </w:r>
+      <w:r>
+        <w:t xml:space="preserve">result</w:t>
+      </w:r>
+      <w:r>
+        <w:t xml:space="preserve"> </w:t>
+      </w:r>
+      <w:r>
+        <w:t xml:space="preserve">should</w:t>
+      </w:r>
+      <w:r>
+        <w:t xml:space="preserve"> </w:t>
+      </w:r>
+      <w:r>
+        <w:t xml:space="preserve">be</w:t>
+      </w:r>
+      <w:r>
+        <w:t xml:space="preserve"> </w:t>
+      </w:r>
+      <w:r>
+        <w:t xml:space="preserve">interpreted</w:t>
+      </w:r>
+      <w:r>
+        <w:t xml:space="preserve"> </w:t>
+      </w:r>
+      <w:r>
+        <w:t xml:space="preserve">cautiously</w:t>
+      </w:r>
+      <w:r>
+        <w:t xml:space="preserve"> </w:t>
+      </w:r>
+      <w:r>
+        <w:t xml:space="preserve">given</w:t>
+      </w:r>
+      <w:r>
+        <w:t xml:space="preserve"> </w:t>
+      </w:r>
+      <w:r>
         <w:t xml:space="preserve">the</w:t>
       </w:r>
       <w:r>
         <w:t xml:space="preserve"> </w:t>
       </w:r>
       <w:r>
-        <w:t xml:space="preserve">early</w:t>
+        <w:t xml:space="preserve">small</w:t>
+      </w:r>
+      <w:r>
+        <w:t xml:space="preserve"> </w:t>
+      </w:r>
+      <w:r>
+        <w:t xml:space="preserve">sample</w:t>
+      </w:r>
+      <w:r>
+        <w:t xml:space="preserve"> </w:t>
+      </w:r>
+      <w:r>
+        <w:t xml:space="preserve">sizes.</w:t>
+      </w:r>
+      <w:r>
+        <w:t xml:space="preserve"> </w:t>
+      </w:r>
+      <w:r>
+        <w:t xml:space="preserve">These</w:t>
+      </w:r>
+      <w:r>
+        <w:t xml:space="preserve"> </w:t>
+      </w:r>
+      <w:r>
+        <w:t xml:space="preserve">results</w:t>
+      </w:r>
+      <w:r>
+        <w:t xml:space="preserve"> </w:t>
+      </w:r>
+      <w:r>
+        <w:t xml:space="preserve">indicate</w:t>
+      </w:r>
+      <w:r>
+        <w:t xml:space="preserve"> </w:t>
+      </w:r>
+      <w:r>
+        <w:t xml:space="preserve">that</w:t>
+      </w:r>
+      <w:r>
+        <w:t xml:space="preserve"> </w:t>
+      </w:r>
+      <w:r>
+        <w:t xml:space="preserve">the</w:t>
+      </w:r>
+      <w:r>
+        <w:t xml:space="preserve"> </w:t>
+      </w:r>
+      <w:r>
+        <w:t xml:space="preserve">restricted/broad</w:t>
+      </w:r>
+      <w:r>
+        <w:t xml:space="preserve"> </w:t>
+      </w:r>
+      <w:r>
+        <w:t xml:space="preserve">separation</w:t>
+      </w:r>
+      <w:r>
+        <w:t xml:space="preserve"> </w:t>
+      </w:r>
+      <w:r>
+        <w:t xml:space="preserve">is</w:t>
+      </w:r>
+      <w:r>
+        <w:t xml:space="preserve"> </w:t>
+      </w:r>
+      <w:r>
+        <w:t xml:space="preserve">a</w:t>
+      </w:r>
+      <w:r>
+        <w:t xml:space="preserve"> </w:t>
+      </w:r>
+      <w:r>
+        <w:t xml:space="preserve">persistent</w:t>
+      </w:r>
+      <w:r>
+        <w:t xml:space="preserve"> </w:t>
+      </w:r>
+      <w:r>
+        <w:t xml:space="preserve">organisational</w:t>
+      </w:r>
+      <w:r>
+        <w:t xml:space="preserve"> </w:t>
+      </w:r>
+      <w:r>
+        <w:t xml:space="preserve">feature</w:t>
+      </w:r>
+      <w:r>
+        <w:t xml:space="preserve"> </w:t>
+      </w:r>
+      <w:r>
+        <w:t xml:space="preserve">of</w:t>
+      </w:r>
+      <w:r>
+        <w:t xml:space="preserve"> </w:t>
+      </w:r>
+      <w:r>
+        <w:t xml:space="preserve">Aurignacian</w:t>
+      </w:r>
+      <w:r>
+        <w:t xml:space="preserve"> </w:t>
+      </w:r>
+      <w:r>
+        <w:t xml:space="preserve">symbolic</w:t>
+      </w:r>
+      <w:r>
+        <w:t xml:space="preserve"> </w:t>
+      </w:r>
+      <w:r>
+        <w:t xml:space="preserve">culture;</w:t>
+      </w:r>
+      <w:r>
+        <w:t xml:space="preserve"> </w:t>
+      </w:r>
+      <w:r>
+        <w:t xml:space="preserve">the</w:t>
+      </w:r>
+      <w:r>
+        <w:t xml:space="preserve"> </w:t>
+      </w:r>
+      <w:r>
+        <w:t xml:space="preserve">absence</w:t>
+      </w:r>
+      <w:r>
+        <w:t xml:space="preserve"> </w:t>
+      </w:r>
+      <w:r>
+        <w:t xml:space="preserve">of</w:t>
+      </w:r>
+      <w:r>
+        <w:t xml:space="preserve"> </w:t>
+      </w:r>
+      <w:r>
+        <w:t xml:space="preserve">a</w:t>
+      </w:r>
+      <w:r>
+        <w:t xml:space="preserve"> </w:t>
+      </w:r>
+      <w:r>
+        <w:t xml:space="preserve">significant</w:t>
+      </w:r>
+      <w:r>
+        <w:t xml:space="preserve"> </w:t>
+      </w:r>
+      <w:r>
+        <w:t xml:space="preserve">geographic</w:t>
+      </w:r>
+      <w:r>
+        <w:t xml:space="preserve"> </w:t>
+      </w:r>
+      <w:r>
+        <w:t xml:space="preserve">correlation</w:t>
+      </w:r>
+      <w:r>
+        <w:t xml:space="preserve"> </w:t>
+      </w:r>
+      <w:r>
+        <w:t xml:space="preserve">is</w:t>
+      </w:r>
+      <w:r>
+        <w:t xml:space="preserve"> </w:t>
+      </w:r>
+      <w:r>
+        <w:t xml:space="preserve">consistent</w:t>
+      </w:r>
+      <w:r>
+        <w:t xml:space="preserve"> </w:t>
+      </w:r>
+      <w:r>
+        <w:t xml:space="preserve">with</w:t>
+      </w:r>
+      <w:r>
+        <w:t xml:space="preserve"> </w:t>
+      </w:r>
+      <w:r>
+        <w:t xml:space="preserve">this</w:t>
+      </w:r>
+      <w:r>
+        <w:t xml:space="preserve"> </w:t>
+      </w:r>
+      <w:r>
+        <w:t xml:space="preserve">interpretation</w:t>
+      </w:r>
+      <w:r>
+        <w:t xml:space="preserve"> </w:t>
+      </w:r>
+      <w:r>
+        <w:t xml:space="preserve">but</w:t>
+      </w:r>
+      <w:r>
+        <w:t xml:space="preserve"> </w:t>
+      </w:r>
+      <w:r>
+        <w:t xml:space="preserve">does</w:t>
+      </w:r>
+      <w:r>
+        <w:t xml:space="preserve"> </w:t>
+      </w:r>
+      <w:r>
+        <w:t xml:space="preserve">not</w:t>
+      </w:r>
+      <w:r>
+        <w:t xml:space="preserve"> </w:t>
+      </w:r>
+      <w:r>
+        <w:t xml:space="preserve">establish</w:t>
+      </w:r>
+      <w:r>
+        <w:t xml:space="preserve"> </w:t>
+      </w:r>
+      <w:r>
+        <w:t xml:space="preserve">it,</w:t>
       </w:r>
       <w:r>
         <w:t xml:space="preserve"> </w:t>
       </w:r>
       <w:r>
         <w:t xml:space="preserve">and</w:t>
-      </w:r>
-      <w:r>
-        <w:t xml:space="preserve"> </w:t>
-      </w:r>
-      <w:r>
-        <w:t xml:space="preserve">late</w:t>
-      </w:r>
-      <w:r>
-        <w:t xml:space="preserve"> </w:t>
-      </w:r>
-      <w:r>
-        <w:t xml:space="preserve">Aurignacian.</w:t>
-      </w:r>
-      <w:r>
-        <w:t xml:space="preserve"> </w:t>
-      </w:r>
-      <w:r>
-        <w:t xml:space="preserve">Within</w:t>
-      </w:r>
-      <w:r>
-        <w:t xml:space="preserve"> </w:t>
-      </w:r>
-      <w:r>
-        <w:t xml:space="preserve">the</w:t>
-      </w:r>
-      <w:r>
-        <w:t xml:space="preserve"> </w:t>
-      </w:r>
-      <w:r>
-        <w:t xml:space="preserve">early</w:t>
-      </w:r>
-      <w:r>
-        <w:t xml:space="preserve"> </w:t>
-      </w:r>
-      <w:r>
-        <w:t xml:space="preserve">phase</w:t>
-      </w:r>
-      <w:r>
-        <w:t xml:space="preserve"> </w:t>
-      </w:r>
-      <w:r>
-        <w:t xml:space="preserve">(Aur-P1;</w:t>
-      </w:r>
-      <w:r>
-        <w:t xml:space="preserve"> </w:t>
-      </w:r>
-      <w:r>
-        <w:t xml:space="preserve">20</w:t>
-      </w:r>
-      <w:r>
-        <w:t xml:space="preserve"> </w:t>
-      </w:r>
-      <w:r>
-        <w:t xml:space="preserve">sites)</w:t>
-      </w:r>
-      <w:r>
-        <w:t xml:space="preserve"> </w:t>
-      </w:r>
-      <w:r>
-        <w:t xml:space="preserve">we</w:t>
-      </w:r>
-      <w:r>
-        <w:t xml:space="preserve"> </w:t>
-      </w:r>
-      <w:r>
-        <w:t xml:space="preserve">identify</w:t>
-      </w:r>
-      <w:r>
-        <w:t xml:space="preserve"> </w:t>
-      </w:r>
-      <w:r>
-        <w:t xml:space="preserve">a</w:t>
-      </w:r>
-      <w:r>
-        <w:t xml:space="preserve"> </w:t>
-      </w:r>
-      <w:r>
-        <w:t xml:space="preserve">robust</w:t>
-      </w:r>
-      <w:r>
-        <w:t xml:space="preserve"> </w:t>
-      </w:r>
-      <w:r>
-        <w:t xml:space="preserve">two-group</w:t>
-      </w:r>
-      <w:r>
-        <w:t xml:space="preserve"> </w:t>
-      </w:r>
-      <w:r>
-        <w:t xml:space="preserve">structure</w:t>
-      </w:r>
-      <w:r>
-        <w:t xml:space="preserve"> </w:t>
-      </w:r>
-      <w:r>
-        <w:t xml:space="preserve">of</w:t>
-      </w:r>
-      <w:r>
-        <w:t xml:space="preserve"> </w:t>
-      </w:r>
-      <w:r>
-        <w:t xml:space="preserve">restricted</w:t>
-      </w:r>
-      <w:r>
-        <w:t xml:space="preserve"> </w:t>
-      </w:r>
-      <w:r>
-        <w:t xml:space="preserve">versus</w:t>
-      </w:r>
-      <w:r>
-        <w:t xml:space="preserve"> </w:t>
-      </w:r>
-      <w:r>
-        <w:t xml:space="preserve">broad</w:t>
-      </w:r>
-      <w:r>
-        <w:t xml:space="preserve"> </w:t>
-      </w:r>
-      <w:r>
-        <w:t xml:space="preserve">geometric-sign</w:t>
-      </w:r>
-      <w:r>
-        <w:t xml:space="preserve"> </w:t>
-      </w:r>
-      <w:r>
-        <w:t xml:space="preserve">repertoires</w:t>
-      </w:r>
-      <w:r>
-        <w:t xml:space="preserve"> </w:t>
-      </w:r>
-      <w:r>
-        <w:t xml:space="preserve">that</w:t>
-      </w:r>
-      <w:r>
-        <w:t xml:space="preserve"> </w:t>
-      </w:r>
-      <w:r>
-        <w:t xml:space="preserve">is</w:t>
-      </w:r>
-      <w:r>
-        <w:t xml:space="preserve"> </w:t>
-      </w:r>
-      <w:r>
-        <w:t xml:space="preserve">stable</w:t>
-      </w:r>
-      <w:r>
-        <w:t xml:space="preserve"> </w:t>
-      </w:r>
-      <w:r>
-        <w:t xml:space="preserve">under</w:t>
-      </w:r>
-      <w:r>
-        <w:t xml:space="preserve"> </w:t>
-      </w:r>
-      <w:r>
-        <w:t xml:space="preserve">bootstrap</w:t>
-      </w:r>
-      <w:r>
-        <w:t xml:space="preserve"> </w:t>
-      </w:r>
-      <w:r>
-        <w:t xml:space="preserve">resampling</w:t>
-      </w:r>
-      <w:r>
-        <w:t xml:space="preserve"> </w:t>
-      </w:r>
-      <w:r>
-        <w:t xml:space="preserve">and</w:t>
-      </w:r>
-      <w:r>
-        <w:t xml:space="preserve"> </w:t>
-      </w:r>
-      <w:r>
-        <w:t xml:space="preserve">largely</w:t>
-      </w:r>
-      <w:r>
-        <w:t xml:space="preserve"> </w:t>
-      </w:r>
-      <w:r>
-        <w:t xml:space="preserve">recovered</w:t>
-      </w:r>
-      <w:r>
-        <w:t xml:space="preserve"> </w:t>
-      </w:r>
-      <w:r>
-        <w:t xml:space="preserve">by</w:t>
-      </w:r>
-      <w:r>
-        <w:t xml:space="preserve"> </w:t>
-      </w:r>
-      <w:r>
-        <w:t xml:space="preserve">an</w:t>
-      </w:r>
-      <w:r>
-        <w:t xml:space="preserve"> </w:t>
-      </w:r>
-      <w:r>
-        <w:t xml:space="preserve">independent</w:t>
-      </w:r>
-      <w:r>
-        <w:t xml:space="preserve"> </w:t>
-      </w:r>
-      <w:r>
-        <w:t xml:space="preserve">stochastic</w:t>
-      </w:r>
-      <w:r>
-        <w:t xml:space="preserve"> </w:t>
-      </w:r>
-      <w:r>
-        <w:t xml:space="preserve">block</w:t>
-      </w:r>
-      <w:r>
-        <w:t xml:space="preserve"> </w:t>
-      </w:r>
-      <w:r>
-        <w:t xml:space="preserve">model.</w:t>
-      </w:r>
-      <w:r>
-        <w:t xml:space="preserve"> </w:t>
-      </w:r>
-      <w:r>
-        <w:t xml:space="preserve">The</w:t>
-      </w:r>
-      <w:r>
-        <w:t xml:space="preserve"> </w:t>
-      </w:r>
-      <w:r>
-        <w:t xml:space="preserve">small</w:t>
-      </w:r>
-      <w:r>
-        <w:t xml:space="preserve"> </w:t>
-      </w:r>
-      <w:r>
-        <w:t xml:space="preserve">late</w:t>
-      </w:r>
-      <w:r>
-        <w:t xml:space="preserve"> </w:t>
-      </w:r>
-      <w:r>
-        <w:t xml:space="preserve">phase</w:t>
-      </w:r>
-      <w:r>
-        <w:t xml:space="preserve"> </w:t>
-      </w:r>
-      <w:r>
-        <w:t xml:space="preserve">(Aur-P2;</w:t>
-      </w:r>
-      <w:r>
-        <w:t xml:space="preserve"> </w:t>
-      </w:r>
-      <w:r>
-        <w:t xml:space="preserve">8</w:t>
-      </w:r>
-      <w:r>
-        <w:t xml:space="preserve"> </w:t>
-      </w:r>
-      <w:r>
-        <w:t xml:space="preserve">sites)</w:t>
-      </w:r>
-      <w:r>
-        <w:t xml:space="preserve"> </w:t>
-      </w:r>
-      <w:r>
-        <w:t xml:space="preserve">shows</w:t>
-      </w:r>
-      <w:r>
-        <w:t xml:space="preserve"> </w:t>
-      </w:r>
-      <w:r>
-        <w:t xml:space="preserve">a</w:t>
-      </w:r>
-      <w:r>
-        <w:t xml:space="preserve"> </w:t>
-      </w:r>
-      <w:r>
-        <w:t xml:space="preserve">weaker,</w:t>
-      </w:r>
-      <w:r>
-        <w:t xml:space="preserve"> </w:t>
-      </w:r>
-      <w:r>
-        <w:t xml:space="preserve">less</w:t>
-      </w:r>
-      <w:r>
-        <w:t xml:space="preserve"> </w:t>
-      </w:r>
-      <w:r>
-        <w:t xml:space="preserve">resolved</w:t>
-      </w:r>
-      <w:r>
-        <w:t xml:space="preserve"> </w:t>
-      </w:r>
-      <w:r>
-        <w:t xml:space="preserve">structure.</w:t>
-      </w:r>
-      <w:r>
-        <w:t xml:space="preserve"> </w:t>
-      </w:r>
-      <w:r>
-        <w:t xml:space="preserve">The</w:t>
-      </w:r>
-      <w:r>
-        <w:t xml:space="preserve"> </w:t>
-      </w:r>
-      <w:r>
-        <w:t xml:space="preserve">early</w:t>
-      </w:r>
-      <w:r>
-        <w:t xml:space="preserve"> </w:t>
-      </w:r>
-      <w:r>
-        <w:t xml:space="preserve">phase</w:t>
-      </w:r>
-      <w:r>
-        <w:t xml:space="preserve"> </w:t>
-      </w:r>
-      <w:r>
-        <w:t xml:space="preserve">supports</w:t>
-      </w:r>
-      <w:r>
-        <w:t xml:space="preserve"> </w:t>
-      </w:r>
-      <w:r>
-        <w:t xml:space="preserve">a</w:t>
-      </w:r>
-      <w:r>
-        <w:t xml:space="preserve"> </w:t>
-      </w:r>
-      <w:r>
-        <w:t xml:space="preserve">larger,</w:t>
-      </w:r>
-      <w:r>
-        <w:t xml:space="preserve"> </w:t>
-      </w:r>
-      <w:r>
-        <w:t xml:space="preserve">more</w:t>
-      </w:r>
-      <w:r>
-        <w:t xml:space="preserve"> </w:t>
-      </w:r>
-      <w:r>
-        <w:t xml:space="preserve">hub-centred</w:t>
-      </w:r>
-      <w:r>
-        <w:t xml:space="preserve"> </w:t>
-      </w:r>
-      <w:r>
-        <w:t xml:space="preserve">network,</w:t>
-      </w:r>
-      <w:r>
-        <w:t xml:space="preserve"> </w:t>
-      </w:r>
-      <w:r>
-        <w:t xml:space="preserve">but</w:t>
-      </w:r>
-      <w:r>
-        <w:t xml:space="preserve"> </w:t>
-      </w:r>
-      <w:r>
-        <w:t xml:space="preserve">once</w:t>
-      </w:r>
-      <w:r>
-        <w:t xml:space="preserve"> </w:t>
-      </w:r>
-      <w:r>
-        <w:t xml:space="preserve">network</w:t>
-      </w:r>
-      <w:r>
-        <w:t xml:space="preserve"> </w:t>
-      </w:r>
-      <w:r>
-        <w:t xml:space="preserve">size</w:t>
-      </w:r>
-      <w:r>
-        <w:t xml:space="preserve"> </w:t>
-      </w:r>
-      <w:r>
-        <w:t xml:space="preserve">is</w:t>
-      </w:r>
-      <w:r>
-        <w:t xml:space="preserve"> </w:t>
-      </w:r>
-      <w:r>
-        <w:t xml:space="preserve">taken</w:t>
-      </w:r>
-      <w:r>
-        <w:t xml:space="preserve"> </w:t>
-      </w:r>
-      <w:r>
-        <w:t xml:space="preserve">into</w:t>
-      </w:r>
-      <w:r>
-        <w:t xml:space="preserve"> </w:t>
-      </w:r>
-      <w:r>
-        <w:t xml:space="preserve">account</w:t>
-      </w:r>
-      <w:r>
-        <w:t xml:space="preserve"> </w:t>
-      </w:r>
-      <w:r>
-        <w:t xml:space="preserve">the</w:t>
-      </w:r>
-      <w:r>
-        <w:t xml:space="preserve"> </w:t>
-      </w:r>
-      <w:r>
-        <w:t xml:space="preserve">late</w:t>
-      </w:r>
-      <w:r>
-        <w:t xml:space="preserve"> </w:t>
-      </w:r>
-      <w:r>
-        <w:t xml:space="preserve">phase</w:t>
-      </w:r>
-      <w:r>
-        <w:t xml:space="preserve"> </w:t>
-      </w:r>
-      <w:r>
-        <w:t xml:space="preserve">shows</w:t>
-      </w:r>
-      <w:r>
-        <w:t xml:space="preserve"> </w:t>
-      </w:r>
-      <w:r>
-        <w:t xml:space="preserve">higher</w:t>
-      </w:r>
-      <w:r>
-        <w:t xml:space="preserve"> </w:t>
-      </w:r>
-      <w:r>
-        <w:t xml:space="preserve">edge</w:t>
-      </w:r>
-      <w:r>
-        <w:t xml:space="preserve"> </w:t>
-      </w:r>
-      <w:r>
-        <w:t xml:space="preserve">density,</w:t>
-      </w:r>
-      <w:r>
-        <w:t xml:space="preserve"> </w:t>
-      </w:r>
-      <w:r>
-        <w:t xml:space="preserve">and</w:t>
-      </w:r>
-      <w:r>
-        <w:t xml:space="preserve"> </w:t>
-      </w:r>
-      <w:r>
-        <w:t xml:space="preserve">formal</w:t>
-      </w:r>
-      <w:r>
-        <w:t xml:space="preserve"> </w:t>
-      </w:r>
-      <w:r>
-        <w:t xml:space="preserve">permutation</w:t>
-      </w:r>
-      <w:r>
-        <w:t xml:space="preserve"> </w:t>
-      </w:r>
-      <w:r>
-        <w:t xml:space="preserve">tests</w:t>
-      </w:r>
-      <w:r>
-        <w:t xml:space="preserve"> </w:t>
-      </w:r>
-      <w:r>
-        <w:t xml:space="preserve">indicate</w:t>
-      </w:r>
-      <w:r>
-        <w:t xml:space="preserve"> </w:t>
-      </w:r>
-      <w:r>
-        <w:t xml:space="preserve">that</w:t>
-      </w:r>
-      <w:r>
-        <w:t xml:space="preserve"> </w:t>
-      </w:r>
-      <w:r>
-        <w:t xml:space="preserve">the</w:t>
-      </w:r>
-      <w:r>
-        <w:t xml:space="preserve"> </w:t>
-      </w:r>
-      <w:r>
-        <w:t xml:space="preserve">phases</w:t>
-      </w:r>
-      <w:r>
-        <w:t xml:space="preserve"> </w:t>
-      </w:r>
-      <w:r>
-        <w:t xml:space="preserve">differ</w:t>
-      </w:r>
-      <w:r>
-        <w:t xml:space="preserve"> </w:t>
-      </w:r>
-      <w:r>
-        <w:t xml:space="preserve">in</w:t>
-      </w:r>
-      <w:r>
-        <w:t xml:space="preserve"> </w:t>
-      </w:r>
-      <w:r>
-        <w:t xml:space="preserve">community</w:t>
-      </w:r>
-      <w:r>
-        <w:t xml:space="preserve"> </w:t>
-      </w:r>
-      <w:r>
-        <w:t xml:space="preserve">structure</w:t>
-      </w:r>
-      <w:r>
-        <w:t xml:space="preserve"> </w:t>
-      </w:r>
-      <w:r>
-        <w:t xml:space="preserve">(modularity)</w:t>
-      </w:r>
-      <w:r>
-        <w:t xml:space="preserve"> </w:t>
-      </w:r>
-      <w:r>
-        <w:t xml:space="preserve">but</w:t>
-      </w:r>
-      <w:r>
-        <w:t xml:space="preserve"> </w:t>
-      </w:r>
-      <w:r>
-        <w:t xml:space="preserve">not</w:t>
-      </w:r>
-      <w:r>
-        <w:t xml:space="preserve"> </w:t>
-      </w:r>
-      <w:r>
-        <w:t xml:space="preserve">in</w:t>
-      </w:r>
-      <w:r>
-        <w:t xml:space="preserve"> </w:t>
-      </w:r>
-      <w:r>
-        <w:t xml:space="preserve">edge</w:t>
-      </w:r>
-      <w:r>
-        <w:t xml:space="preserve"> </w:t>
-      </w:r>
-      <w:r>
-        <w:t xml:space="preserve">density,</w:t>
-      </w:r>
-      <w:r>
-        <w:t xml:space="preserve"> </w:t>
-      </w:r>
-      <w:r>
-        <w:t xml:space="preserve">betweenness,</w:t>
-      </w:r>
-      <w:r>
-        <w:t xml:space="preserve"> </w:t>
-      </w:r>
-      <w:r>
-        <w:t xml:space="preserve">or</w:t>
-      </w:r>
-      <w:r>
-        <w:t xml:space="preserve"> </w:t>
-      </w:r>
-      <w:r>
-        <w:t xml:space="preserve">component</w:t>
-      </w:r>
-      <w:r>
-        <w:t xml:space="preserve"> </w:t>
-      </w:r>
-      <w:r>
-        <w:t xml:space="preserve">count.</w:t>
-      </w:r>
-      <w:r>
-        <w:t xml:space="preserve"> </w:t>
-      </w:r>
-      <w:r>
-        <w:t xml:space="preserve">Mantel</w:t>
-      </w:r>
-      <w:r>
-        <w:t xml:space="preserve"> </w:t>
-      </w:r>
-      <w:r>
-        <w:t xml:space="preserve">tests</w:t>
-      </w:r>
-      <w:r>
-        <w:t xml:space="preserve"> </w:t>
-      </w:r>
-      <w:r>
-        <w:t xml:space="preserve">show</w:t>
-      </w:r>
-      <w:r>
-        <w:t xml:space="preserve"> </w:t>
-      </w:r>
-      <w:r>
-        <w:t xml:space="preserve">that</w:t>
-      </w:r>
-      <w:r>
-        <w:t xml:space="preserve"> </w:t>
-      </w:r>
-      <w:r>
-        <w:t xml:space="preserve">geographic</w:t>
-      </w:r>
-      <w:r>
-        <w:t xml:space="preserve"> </w:t>
-      </w:r>
-      <w:r>
-        <w:t xml:space="preserve">distance</w:t>
-      </w:r>
-      <w:r>
-        <w:t xml:space="preserve"> </w:t>
-      </w:r>
-      <w:r>
-        <w:t xml:space="preserve">does</w:t>
-      </w:r>
-      <w:r>
-        <w:t xml:space="preserve"> </w:t>
-      </w:r>
-      <w:r>
-        <w:t xml:space="preserve">not</w:t>
-      </w:r>
-      <w:r>
-        <w:t xml:space="preserve"> </w:t>
-      </w:r>
-      <w:r>
-        <w:t xml:space="preserve">account</w:t>
-      </w:r>
-      <w:r>
-        <w:t xml:space="preserve"> </w:t>
-      </w:r>
-      <w:r>
-        <w:t xml:space="preserve">for</w:t>
-      </w:r>
-      <w:r>
-        <w:t xml:space="preserve"> </w:t>
-      </w:r>
-      <w:r>
-        <w:t xml:space="preserve">sign</w:t>
-      </w:r>
-      <w:r>
-        <w:t xml:space="preserve"> </w:t>
-      </w:r>
-      <w:r>
-        <w:t xml:space="preserve">distribution</w:t>
-      </w:r>
-      <w:r>
-        <w:t xml:space="preserve"> </w:t>
-      </w:r>
-      <w:r>
-        <w:t xml:space="preserve">in</w:t>
-      </w:r>
-      <w:r>
-        <w:t xml:space="preserve"> </w:t>
-      </w:r>
-      <w:r>
-        <w:t xml:space="preserve">either</w:t>
-      </w:r>
-      <w:r>
-        <w:t xml:space="preserve"> </w:t>
-      </w:r>
-      <w:r>
-        <w:t xml:space="preserve">phase,</w:t>
-      </w:r>
-      <w:r>
-        <w:t xml:space="preserve"> </w:t>
-      </w:r>
-      <w:r>
-        <w:t xml:space="preserve">and</w:t>
-      </w:r>
-      <w:r>
-        <w:t xml:space="preserve"> </w:t>
-      </w:r>
-      <w:r>
-        <w:t xml:space="preserve">the</w:t>
-      </w:r>
-      <w:r>
-        <w:t xml:space="preserve"> </w:t>
-      </w:r>
-      <w:r>
-        <w:t xml:space="preserve">isolation-by-distance</w:t>
-      </w:r>
-      <w:r>
-        <w:t xml:space="preserve"> </w:t>
-      </w:r>
-      <w:r>
-        <w:t xml:space="preserve">relationship</w:t>
-      </w:r>
-      <w:r>
-        <w:t xml:space="preserve"> </w:t>
-      </w:r>
-      <w:r>
-        <w:t xml:space="preserve">does</w:t>
-      </w:r>
-      <w:r>
-        <w:t xml:space="preserve"> </w:t>
-      </w:r>
-      <w:r>
-        <w:t xml:space="preserve">not</w:t>
-      </w:r>
-      <w:r>
-        <w:t xml:space="preserve"> </w:t>
-      </w:r>
-      <w:r>
-        <w:t xml:space="preserve">differ</w:t>
-      </w:r>
-      <w:r>
-        <w:t xml:space="preserve"> </w:t>
-      </w:r>
-      <w:r>
-        <w:t xml:space="preserve">between</w:t>
-      </w:r>
-      <w:r>
-        <w:t xml:space="preserve"> </w:t>
-      </w:r>
-      <w:r>
-        <w:t xml:space="preserve">them.</w:t>
-      </w:r>
-      <w:r>
-        <w:t xml:space="preserve"> </w:t>
-      </w:r>
-      <w:r>
-        <w:t xml:space="preserve">These</w:t>
-      </w:r>
-      <w:r>
-        <w:t xml:space="preserve"> </w:t>
-      </w:r>
-      <w:r>
-        <w:t xml:space="preserve">results</w:t>
-      </w:r>
-      <w:r>
-        <w:t xml:space="preserve"> </w:t>
-      </w:r>
-      <w:r>
-        <w:t xml:space="preserve">indicate</w:t>
-      </w:r>
-      <w:r>
-        <w:t xml:space="preserve"> </w:t>
-      </w:r>
-      <w:r>
-        <w:t xml:space="preserve">that</w:t>
-      </w:r>
-      <w:r>
-        <w:t xml:space="preserve"> </w:t>
-      </w:r>
-      <w:r>
-        <w:t xml:space="preserve">the</w:t>
-      </w:r>
-      <w:r>
-        <w:t xml:space="preserve"> </w:t>
-      </w:r>
-      <w:r>
-        <w:t xml:space="preserve">restricted/broad</w:t>
-      </w:r>
-      <w:r>
-        <w:t xml:space="preserve"> </w:t>
-      </w:r>
-      <w:r>
-        <w:t xml:space="preserve">separation</w:t>
-      </w:r>
-      <w:r>
-        <w:t xml:space="preserve"> </w:t>
-      </w:r>
-      <w:r>
-        <w:t xml:space="preserve">is</w:t>
-      </w:r>
-      <w:r>
-        <w:t xml:space="preserve"> </w:t>
-      </w:r>
-      <w:r>
-        <w:t xml:space="preserve">a</w:t>
-      </w:r>
-      <w:r>
-        <w:t xml:space="preserve"> </w:t>
-      </w:r>
-      <w:r>
-        <w:t xml:space="preserve">persistent</w:t>
-      </w:r>
-      <w:r>
-        <w:t xml:space="preserve"> </w:t>
-      </w:r>
-      <w:r>
-        <w:t xml:space="preserve">organisational</w:t>
-      </w:r>
-      <w:r>
-        <w:t xml:space="preserve"> </w:t>
-      </w:r>
-      <w:r>
-        <w:t xml:space="preserve">feature</w:t>
-      </w:r>
-      <w:r>
-        <w:t xml:space="preserve"> </w:t>
-      </w:r>
-      <w:r>
-        <w:t xml:space="preserve">of</w:t>
-      </w:r>
-      <w:r>
-        <w:t xml:space="preserve"> </w:t>
-      </w:r>
-      <w:r>
-        <w:t xml:space="preserve">Aurignacian</w:t>
-      </w:r>
-      <w:r>
-        <w:t xml:space="preserve"> </w:t>
-      </w:r>
-      <w:r>
-        <w:t xml:space="preserve">symbolic</w:t>
-      </w:r>
-      <w:r>
-        <w:t xml:space="preserve"> </w:t>
-      </w:r>
-      <w:r>
-        <w:t xml:space="preserve">culture</w:t>
-      </w:r>
-      <w:r>
-        <w:t xml:space="preserve"> </w:t>
-      </w:r>
-      <w:r>
-        <w:t xml:space="preserve">rather</w:t>
-      </w:r>
-      <w:r>
-        <w:t xml:space="preserve"> </w:t>
-      </w:r>
-      <w:r>
-        <w:t xml:space="preserve">than</w:t>
-      </w:r>
-      <w:r>
-        <w:t xml:space="preserve"> </w:t>
-      </w:r>
-      <w:r>
-        <w:t xml:space="preserve">an</w:t>
-      </w:r>
-      <w:r>
-        <w:t xml:space="preserve"> </w:t>
-      </w:r>
-      <w:r>
-        <w:t xml:space="preserve">artefact</w:t>
-      </w:r>
-      <w:r>
-        <w:t xml:space="preserve"> </w:t>
-      </w:r>
-      <w:r>
-        <w:t xml:space="preserve">of</w:t>
-      </w:r>
-      <w:r>
-        <w:t xml:space="preserve"> </w:t>
-      </w:r>
-      <w:r>
-        <w:t xml:space="preserve">geographic</w:t>
-      </w:r>
-      <w:r>
-        <w:t xml:space="preserve"> </w:t>
-      </w:r>
-      <w:r>
-        <w:t xml:space="preserve">isolation</w:t>
-      </w:r>
-      <w:r>
-        <w:t xml:space="preserve"> </w:t>
-      </w:r>
-      <w:r>
-        <w:t xml:space="preserve">or</w:t>
-      </w:r>
-      <w:r>
-        <w:t xml:space="preserve"> </w:t>
-      </w:r>
-      <w:r>
-        <w:t xml:space="preserve">site</w:t>
-      </w:r>
-      <w:r>
-        <w:t xml:space="preserve"> </w:t>
-      </w:r>
-      <w:r>
-        <w:t xml:space="preserve">assignment,</w:t>
-      </w:r>
-      <w:r>
-        <w:t xml:space="preserve"> </w:t>
-      </w:r>
-      <w:r>
-        <w:t xml:space="preserve">and</w:t>
-      </w:r>
-      <w:r>
-        <w:t xml:space="preserve"> </w:t>
-      </w:r>
-      <w:r>
-        <w:t xml:space="preserve">that</w:t>
       </w:r>
       <w:r>
         <w:t xml:space="preserve"> </w:t>
@@ -1829,7 +1949,7 @@
         <w:t xml:space="preserve">[2–7]</w:t>
       </w:r>
       <w:r>
-        <w:t xml:space="preserve">. The Aurignacian technocomplex (ca. 43 - 30 ka BP) is often linked to the dispersal of</w:t>
+        <w:t xml:space="preserve">. The Aurignacian technocomplex (ca. 43–30 ka BP) is often linked to the dispersal of</w:t>
       </w:r>
       <w:r>
         <w:t xml:space="preserve"> </w:t>
@@ -2022,7 +2142,7 @@
         <w:pStyle w:val="FirstParagraph"/>
       </w:pPr>
       <w:r>
-        <w:t xml:space="preserve">The Aurignacian period (~43-30 ka BP) is largely characterized by material culture indicators such as carinated scrapers, blades and bladelets, and split-based bone and ivory tools</w:t>
+        <w:t xml:space="preserve">The Aurignacian period (~43–30 ka BP) is largely characterized by material culture indicators such as carinated scrapers, blades and bladelets, and split-based bone and ivory tools</w:t>
       </w:r>
       <w:r>
         <w:t xml:space="preserve"> </w:t>
@@ -2088,7 +2208,7 @@
         <w:t xml:space="preserve"> </w:t>
       </w:r>
       <w:r>
-        <w:t xml:space="preserve">divided the Aurignacian into two main phases, Aur-P1 (Proto/Early, 43–37 ka BP), and Aur-P2 (Evolved/Late, 37-32 ka BP), noting that the technological and chronological differences between the Proto and Early Aurignacian are difficult to distinguish</w:t>
+        <w:t xml:space="preserve">divided the Aurignacian into two main phases, Aur-P1 (Proto/Early, 43–37 ka BP), and Aur-P2 (Evolved/Late, 37–32 ka BP), noting that the technological and chronological differences between the Proto and Early Aurignacian are difficult to distinguish</w:t>
       </w:r>
       <w:r>
         <w:t xml:space="preserve"> </w:t>
@@ -2109,7 +2229,7 @@
         <w:t xml:space="preserve"> </w:t>
       </w:r>
       <w:r>
-        <w:t xml:space="preserve">used Bayesian modeling methods to estimate the timing of the transition between the Proto and Early Aurignacian, placing the Proto-Aurignacian at 41.5 - 39.9 ka BP, and the early Aurignacian at 39.8 - 37.8 ka BP. They found that the Proto-Aurignacian occurs during the Greenland Interstadials (GI) 9 and 10, periods of climatic amelioration, while the Early Aurignacian began with the Henrich Stadial, which is characterized by dry and arid conditions, and ends with GI 8.</w:t>
+        <w:t xml:space="preserve">used Bayesian modeling methods to estimate the timing of the transition between the Proto and Early Aurignacian, placing the Proto-Aurignacian at 41.5–39.9 ka BP, and the early Aurignacian at 39.8–37.8 ka BP. They found that the Proto-Aurignacian occurs during the Greenland Interstadials (GI) 9 and 10, periods of climatic amelioration, while the Early Aurignacian began with the Henrich Stadial, which is characterized by dry and arid conditions, and ends with GI 8.</w:t>
       </w:r>
     </w:p>
     <w:p>
@@ -2165,7 +2285,34 @@
         <w:t xml:space="preserve">[19]</w:t>
       </w:r>
       <w:r>
-        <w:t xml:space="preserve">.</w:t>
+        <w:t xml:space="preserve">. This merger is also chronologically warranted: South-west German sites whose lithic technology is assigned to the Early Aurignacian commonly overlap in calibrated age with Mediterranean assemblages attributed to the Proto-Aurignacian, so the Proto/Early boundary functions as a coeval boundary rather than a continental succession (e.g.</w:t>
+      </w:r>
+      <w:r>
+        <w:t xml:space="preserve"> </w:t>
+      </w:r>
+      <w:r>
+        <w:t xml:space="preserve">[23]</w:t>
+      </w:r>
+      <w:r>
+        <w:t xml:space="preserve">;</w:t>
+      </w:r>
+      <w:r>
+        <w:t xml:space="preserve"> </w:t>
+      </w:r>
+      <w:r>
+        <w:t xml:space="preserve">[20]</w:t>
+      </w:r>
+      <w:r>
+        <w:t xml:space="preserve">;</w:t>
+      </w:r>
+      <w:r>
+        <w:t xml:space="preserve"> </w:t>
+      </w:r>
+      <w:r>
+        <w:t xml:space="preserve">[22]</w:t>
+      </w:r>
+      <w:r>
+        <w:t xml:space="preserve">).</w:t>
       </w:r>
     </w:p>
     <w:p>
@@ -2179,7 +2326,7 @@
         <w:t xml:space="preserve"> </w:t>
       </w:r>
       <w:r>
-        <w:t xml:space="preserve">[23,24]</w:t>
+        <w:t xml:space="preserve">[24,25]</w:t>
       </w:r>
       <w:r>
         <w:t xml:space="preserve">, La Ferrassie in the Early Aurignacian (Aur-P1) on the basis of Layer 7 directly above the Châtelperronian</w:t>
@@ -2188,7 +2335,7 @@
         <w:t xml:space="preserve"> </w:t>
       </w:r>
       <w:r>
-        <w:t xml:space="preserve">[25]</w:t>
+        <w:t xml:space="preserve">[26]</w:t>
       </w:r>
       <w:r>
         <w:t xml:space="preserve">, Mladeč in the Evolved Aurignacian (Aur-P2) on the basis of its massive-base bone points and ~31 ka BP dates</w:t>
@@ -2197,7 +2344,7 @@
         <w:t xml:space="preserve"> </w:t>
       </w:r>
       <w:r>
-        <w:t xml:space="preserve">[26]</w:t>
+        <w:t xml:space="preserve">[27]</w:t>
       </w:r>
       <w:r>
         <w:t xml:space="preserve">, and the Swabian Jura sites of Hohle Fels and Geissenklösterle in the Early Aurignacian</w:t>
@@ -2206,7 +2353,7 @@
         <w:t xml:space="preserve"> </w:t>
       </w:r>
       <w:r>
-        <w:t xml:space="preserve">[Aur-P1, 27,28]</w:t>
+        <w:t xml:space="preserve">[23,Aur-P1, 28]</w:t>
       </w:r>
       <w:r>
         <w:t xml:space="preserve">. Two sites are excluded from the analysis because their assemblages are too mixed to assign to a single phase reliably: Spy</w:t>
@@ -2221,7 +2368,7 @@
         <w:t xml:space="preserve"> </w:t>
       </w:r>
       <w:r>
-        <w:t xml:space="preserve">and El Castillo. The robustness of these assignments to reverting to purely date-based criteria is tested in Supplement S7, where stratigraphic mixing concerns at Vogelherd are also addressed</w:t>
+        <w:t xml:space="preserve">and El Castillo. The robustness of these assignments to reverting to purely date-based criteria is tested in Supplement S8, where stratigraphic mixing concerns at Vogelherd are also addressed</w:t>
       </w:r>
       <w:r>
         <w:t xml:space="preserve"> </w:t>
@@ -2486,7 +2633,7 @@
         <w:pStyle w:val="BodyText"/>
       </w:pPr>
       <w:r>
-        <w:t xml:space="preserve">We hypothesize that the early and late phases, and the environmental changes across them, may correspond to differences in the dynamics of cultural groups, as represented by patterns in the distribution of geometric signs. We aim to address two questions. First, within each phase (Aur-P1, Aur-P2), are there any regularities in the repertoires of geometric signs at Aurignacian sites that suggest sign use was structured in some way? Second, how does the sign-sharing network differ between Aur-P1 and Aur-P2 in connectivity, community structure, and hub organisation, once network size is accounted for, and does geographic distance explain sign assemblage dissimilarity in either phase? To answer these questions we use seriation analysis, network analysis, and PerMANOVA tests.</w:t>
+        <w:t xml:space="preserve">We hypothesize that the early and late phases, and the environmental changes across them, may correspond to differences in the dynamics of cultural groups, as represented by patterns in the distribution of geometric signs. We aim to address two questions. First, within each phase (Aur-P1, Aur-P2), are there any regularities in the repertoires of geometric signs at Aurignacian sites that suggest sign use was structured in some way? Second, how does the sign-sharing network differ between Aur-P1 and Aur-P2 in connectivity, community structure, and centrality, once network size is accounted for, and does geographic distance explain sign assemblage dissimilarity in either phase? To answer these questions we use seriation analysis, network analysis, and PerMANOVA tests.</w:t>
       </w:r>
     </w:p>
     <w:bookmarkEnd w:id="23"/>
@@ -2663,10 +2810,7 @@
         <w:t xml:space="preserve">[33]</w:t>
       </w:r>
       <w:r>
-        <w:t xml:space="preserve">. The calibrated radiocarbon dates of the sampled data range from approximately 32,893 BP to 44,778 BP, spanning an overall time range of 11,885 years. Each object was assigned to a chronological phase following specialist technological attributions from the published literature, supplemented by calibrated radiocarbon dates where technological attribution is unavailable (Supplement S7; the date ranges defining the two-phase scheme are summarised in</w:t>
-      </w:r>
-      <w:r>
-        <w:t xml:space="preserve"> </w:t>
+        <w:t xml:space="preserve">. The calibrated radiocarbon dates of the sampled data range from approximately 33 to 45 ka BP, spanning an overall time range of 12 ka. Each object was assigned to a chronological phase following specialist technological attributions from the published literature, supplemented by calibrated radiocarbon dates where technological attribution is unavailable (</w:t>
       </w:r>
       <w:hyperlink w:anchor="tbl-aur-table">
         <w:r>
@@ -2677,7 +2821,28 @@
         </w:r>
       </w:hyperlink>
       <w:r>
-        <w:t xml:space="preserve">). The Aur-P1 phase has 20 sites and 26 sign types, and the Aur-P2 phase has 8 sites and 10 sign types. A Mantel test to evaluate the correlation between distance in time and distribution of sign types found a weak but nominally statistically significant correlation (R = 0.061, p = 0.009). The very small effect size (R ≈ 0.06) indicates that temporal distance explains only a small fraction of the variation in sign-type distribution, suggesting that substantial changes in sign types did not occur over time during the Aurignacian period.</w:t>
+        <w:t xml:space="preserve"> </w:t>
+      </w:r>
+      <w:r>
+        <w:t xml:space="preserve">and see our Supplementary Material item</w:t>
+      </w:r>
+      <w:r>
+        <w:t xml:space="preserve"> </w:t>
+      </w:r>
+      <w:r>
+        <w:t xml:space="preserve">“</w:t>
+      </w:r>
+      <w:r>
+        <w:t xml:space="preserve">Site Phase Assignments</w:t>
+      </w:r>
+      <w:r>
+        <w:t xml:space="preserve">”</w:t>
+      </w:r>
+      <w:r>
+        <w:t xml:space="preserve"> </w:t>
+      </w:r>
+      <w:r>
+        <w:t xml:space="preserve">for more details about specific sites). The Aur-P1 phase has 20 sites and 26 sign types, and the Aur-P2 phase has 8 sites and 10 sign types. A Mantel test to evaluate the correlation between distance in time and distribution of sign types found a weak but nominally statistically significant correlation (R = 0.061, p = 0.009). The very small effect size (R ≈ 0.06) indicates that temporal distance explains only a small fraction of the variation in sign-type distribution, suggesting that substantial changes in sign types did not occur over time during the Aurignacian period.</w:t>
       </w:r>
     </w:p>
     <w:bookmarkEnd w:id="28"/>
@@ -2782,7 +2947,43 @@
         </w:r>
       </w:hyperlink>
       <w:r>
-        <w:t xml:space="preserve">. None of the phases have a statistically significant correlation between sign type distribution and geographical distance, suggesting that isolation by distance alone does not fully account for the observed patterns, although this null result should be interpreted cautiously given the small sample sizes (Supplement S5.8). We further verify these results using geodesic distances in kilometres rather than flat-coordinate Euclidean distances (Supplement S3).</w:t>
+        <w:t xml:space="preserve">. None of the phases have a statistically significant correlation between sign type distribution and geographical distance, suggesting that isolation by distance alone does not fully account for the observed patterns, although this null result should be interpreted cautiously given the small sample sizes (see our Supplementary Material item</w:t>
+      </w:r>
+      <w:r>
+        <w:t xml:space="preserve"> </w:t>
+      </w:r>
+      <w:r>
+        <w:t xml:space="preserve">“</w:t>
+      </w:r>
+      <w:r>
+        <w:t xml:space="preserve">Sensitivity Analyses</w:t>
+      </w:r>
+      <w:r>
+        <w:t xml:space="preserve">”</w:t>
+      </w:r>
+      <w:r>
+        <w:t xml:space="preserve"> </w:t>
+      </w:r>
+      <w:r>
+        <w:t xml:space="preserve">S5.8). Further verification these results using geodesic distances in kilometres rather than flat-coordinate Euclidean distances also shows a null result (see our Supplementary Material item</w:t>
+      </w:r>
+      <w:r>
+        <w:t xml:space="preserve"> </w:t>
+      </w:r>
+      <w:r>
+        <w:t xml:space="preserve">“</w:t>
+      </w:r>
+      <w:r>
+        <w:t xml:space="preserve">Sensitivity Analyses</w:t>
+      </w:r>
+      <w:r>
+        <w:t xml:space="preserve">”</w:t>
+      </w:r>
+      <w:r>
+        <w:t xml:space="preserve"> </w:t>
+      </w:r>
+      <w:r>
+        <w:t xml:space="preserve">S3).</w:t>
       </w:r>
     </w:p>
     <w:tbl>
@@ -3017,7 +3218,25 @@
         <w:t xml:space="preserve">[40]</w:t>
       </w:r>
       <w:r>
-        <w:t xml:space="preserve">. Each node is a site, and each edge is a measure of sign type distribution similarity, each edge weight is the Jaccard similarity (1 − Jaccard dissimilarity). To avoid cluttering the graph, all edges below the value of 0.2 were removed: an edge is only drawn if two sites share ≥ 20% Jaccard similarity i.e., the intersection of their sign types is at least 20% of their union. We justify this threshold and demonstrate its robustness through sensitivity analyses at alternative thresholds (0.1 and 0.3), alternative similarity metrics (Sørensen-Dice, Simpson), a continuous threshold sweep from 0.05 to 0.50, and quantitative edge-set and adjacency-matrix agreement metrics across thresholds (Supplement S1, S2, S5.2, S5.6). Results were plotted with the Fruchterman-Reingold layout</w:t>
+        <w:t xml:space="preserve">. Each node is a site, and each edge weight is the Jaccard similarity between the two sites’ sign-type presence/absence vectors, computed as 1 − Jaccard(dissimilarity) so that higher values mean more shared sign types. To avoid cluttering the graph, all edges below the value of 0.2 were removed: an edge is only drawn if two sites share ≥ 20% Jaccard similarity, i.e., the intersection of their sign types is at least 20% of their union. We justify this threshold and demonstrate its robustness through sensitivity analyses at alternative thresholds (0.1 and 0.3), alternative similarity metrics (Sørensen-Dice, Simpson), a continuous threshold sweep from 0.05 to 0.50, and quantitative edge-set and adjacency-matrix agreement metrics across thresholds (see our Supplementary Material item</w:t>
+      </w:r>
+      <w:r>
+        <w:t xml:space="preserve"> </w:t>
+      </w:r>
+      <w:r>
+        <w:t xml:space="preserve">“</w:t>
+      </w:r>
+      <w:r>
+        <w:t xml:space="preserve">Sensitivity Analyses</w:t>
+      </w:r>
+      <w:r>
+        <w:t xml:space="preserve">”</w:t>
+      </w:r>
+      <w:r>
+        <w:t xml:space="preserve"> </w:t>
+      </w:r>
+      <w:r>
+        <w:t xml:space="preserve">S1, S2, S5.2, S5.6). Results were plotted with the Fruchterman-Reingold layout</w:t>
       </w:r>
       <w:r>
         <w:t xml:space="preserve"> </w:t>
@@ -3122,7 +3341,25 @@
         <w:t xml:space="preserve"> </w:t>
       </w:r>
       <w:r>
-        <w:t xml:space="preserve">packages. Because the restricted/broad group assignments were derived from visual inspection of the seriation results using the same sign data tested here, we validate these assignments against data-driven Louvain community detection and report the comparison in Supplement S5. We further test the robustness of the partition with bootstrap consensus clustering of sites and with stochastic block models, which select the number of groups model-independently and assign posterior membership probabilities to each site (Supplement S6).</w:t>
+        <w:t xml:space="preserve">packages. Because the restricted/broad group assignments were derived from visual inspection of the seriation results using the same sign data tested here, we validate these assignments against data-driven Louvain community detection and report the comparison in Supplement S5. We further test the robustness of the partition with bootstrap consensus clustering of sites and with stochastic block models, which select the number of groups model-independently and assign posterior membership probabilities to each site (see our Supplementary Material item</w:t>
+      </w:r>
+      <w:r>
+        <w:t xml:space="preserve"> </w:t>
+      </w:r>
+      <w:r>
+        <w:t xml:space="preserve">“</w:t>
+      </w:r>
+      <w:r>
+        <w:t xml:space="preserve">Sensitivity Analyses</w:t>
+      </w:r>
+      <w:r>
+        <w:t xml:space="preserve">”</w:t>
+      </w:r>
+      <w:r>
+        <w:t xml:space="preserve"> </w:t>
+      </w:r>
+      <w:r>
+        <w:t xml:space="preserve">S6).</w:t>
       </w:r>
     </w:p>
     <w:bookmarkEnd w:id="31"/>
@@ -3168,7 +3405,7 @@
             <w:r>
               <w:drawing>
                 <wp:inline>
-                  <wp:extent cx="5504749" cy="9174581"/>
+                  <wp:extent cx="5943600" cy="3657600"/>
                   <wp:effectExtent b="0" l="0" r="0" t="0"/>
                   <wp:docPr descr="" title="" id="34" name="Picture"/>
                   <a:graphic>
@@ -3189,7 +3426,7 @@
                         <pic:spPr bwMode="auto">
                           <a:xfrm>
                             <a:off x="0" y="0"/>
-                            <a:ext cx="5504749" cy="9174581"/>
+                            <a:ext cx="5943600" cy="3657600"/>
                           </a:xfrm>
                           <a:prstGeom prst="rect">
                             <a:avLst/>
@@ -3230,7 +3467,25 @@
         <w:pStyle w:val="BodyText"/>
       </w:pPr>
       <w:r>
-        <w:t xml:space="preserve">For each of the two phases, our seriation analysis identifies two groups. One group has a restricted range of sign types (1-3 types), which tend to be visually simpler signs. A second group has a broader range (up to 17 types), which include more complex signs. Simpler signs composed of fewer components, like line and notch, are the most prevalent across both phases. In Aur-P1 the restricted-range group (9 sites) is slightly smaller than the broad-range group (11 sites); in Aur-P2 the restricted-range group (6 sites) is larger than the broad-range group (2 sites). Bootstrap resampling of sites confirms that the Aur-P1 two-group structure is stable to sampling variation; the stochastic block model independently selects a three-block structure for Aur-P1 and a two-block structure for Aur-P2 (Results below), reproducing the manual restricted/broad split to differing degrees across phases. Per-site robustness of the restricted/broad assignment is quantified in Supplement S6.</w:t>
+        <w:t xml:space="preserve">For each of the two phases, our seriation analysis identifies two groups. One group has a restricted range of sign types (1-3 types), which tend to be visually simpler signs. A second group has a broader range (up to 17 types), which include more complex signs. Simpler signs composed of fewer components, like line and notch, are the most prevalent across both phases. In Aur-P1 the restricted-range group (9 sites) is slightly smaller than the broad-range group (11 sites); in Aur-P2 the restricted-range group (6 sites) is larger than the broad-range group (2 sites). Bootstrap resampling of sites confirms that the Aur-P1 two-group structure is stable to sampling variation; the stochastic block model independently selects a three-block structure for Aur-P1 and a two-block structure for Aur-P2 , reproducing the manual restricted/broad split to differing degrees across phases. Per-site robustness of the restricted/broad assignment is quantified in our Supplementary Material item</w:t>
+      </w:r>
+      <w:r>
+        <w:t xml:space="preserve"> </w:t>
+      </w:r>
+      <w:r>
+        <w:t xml:space="preserve">“</w:t>
+      </w:r>
+      <w:r>
+        <w:t xml:space="preserve">Sensitivity Analyses</w:t>
+      </w:r>
+      <w:r>
+        <w:t xml:space="preserve">”</w:t>
+      </w:r>
+      <w:r>
+        <w:t xml:space="preserve"> </w:t>
+      </w:r>
+      <w:r>
+        <w:t xml:space="preserve">S6.</w:t>
       </w:r>
     </w:p>
     <w:p>
@@ -3322,7 +3577,7 @@
               <w:pStyle w:val="ImageCaption"/>
             </w:pPr>
             <w:r>
-              <w:t xml:space="preserve">Figure 3: Networks depicting cultural similarity among sites for each phase based on Jaccard dissimilarity of geometric sign presence/absence. Nodes represent sites and edges connect pairs with similarity ≥0.2. Node size reflects degree centrality, and edge thickness corresponds to similarity strength. The Aur-P1 network shows the highest overall connectivity, whereas the Aur-P2 phase exhibits weaker and more fragmented connections. These networks illustrate phase-specific differences in the intensity and configuration of inter-site cultural links.</w:t>
+              <w:t xml:space="preserve">Figure 3: Networks depicting cultural similarity among sites for each phase based on Jaccard similarity of geometric sign presence/absence. Nodes represent sites and edges connect pairs whose Jaccard similarity is ≥0.2 (i.e., the intersection of their sign types is at least 20% of their union). Node size reflects degree centrality, and edge thickness corresponds to similarity strength. The Aur-P1 network shows the highest overall connectivity, whereas the Aur-P2 phase exhibits weaker and more fragmented connections. These networks illustrate phase-specific differences in the intensity and configuration of inter-site cultural links.</w:t>
             </w:r>
           </w:p>
           <w:bookmarkEnd w:id="40"/>
@@ -3402,7 +3657,7 @@
               <w:pStyle w:val="ImageCaption"/>
             </w:pPr>
             <w:r>
-              <w:t xml:space="preserve">Figure 4: Networks statistics for the two phases. The grey lines are the null 95% confidence interval, the colored dot is the observed statistic value (orange = p&lt;0.05, blue = not significantly different from a within-phase random distribution). The horizontal brackets at the top of each panel show p-values of pairwise randomisation tests for significant differences in network statistics between phases.</w:t>
+              <w:t xml:space="preserve">Figure 4: Networks statistics for the two phases. The vertical black lines are the null 95% confidence interval, the colored dot is the observed statistic value (orange = p&lt;0.05, blue = not significantly different from a within-phase random distribution). The horizontal brackets at the top of each panel show p-values of pairwise randomisation tests for significant differences in network statistics between phases.</w:t>
             </w:r>
           </w:p>
           <w:bookmarkEnd w:id="44"/>
@@ -3428,7 +3683,7 @@
         </w:r>
       </w:hyperlink>
       <w:r>
-        <w:t xml:space="preserve">, and provide insight into the differences in connectivity between the two phases. In Aur-P1, which combines the earliest Aurignacian material with the material previously attributed to the Proto-Aurignacian, the network analysis reveals two clearly defined groups consistent with the seriation: a broad-range group (Geissenklösterle, Hohle Fels, Vogelherd, Cellier, Blanchard, La Ferrassie, Castanet, Solutré, Grotte du Renne, Les Cottés, Trou al’Wesse) and a restricted-range group (Abri Pataud, Fumane, Pod Hradem, Riparo Bombrini, Grottes de Fonds-de-Forêt, Labeko Koba, Hohlenstein-Stadel, Gatzarria, Grotte de la Verpillière I). As in the seriation, there is some connectivity between the two groups, notably through sites such as La Ferrassie, which links both ranges.</w:t>
+        <w:t xml:space="preserve">, and provide insight into the differences in connectivity between the two phases. In Aur-P1 the network analysis reveals two clearly defined groups consistent with the seriation: a broad-range group (Geissenklösterle, Hohle Fels, Vogelherd, Cellier, Blanchard, La Ferrassie, Castanet, Solutré, Grotte du Renne, Les Cottés, Trou al’Wesse) and a restricted-range group (Abri Pataud, Fumane, Pod Hradem, Riparo Bombrini, Grottes de Fonds-de-Forêt, Labeko Koba, Hohlenstein-Stadel, Gatzarria, Grotte de la Verpillière I). As in the seriation, there is some connectivity between the two groups, notably through sites such as La Ferrassie, which links both ranges.</w:t>
       </w:r>
     </w:p>
     <w:p>
@@ -3455,7 +3710,7 @@
         <w:t xml:space="preserve"> </w:t>
       </w:r>
       <w:r>
-        <w:t xml:space="preserve">shows the results of permutation tests (n = 10^{4}) assessing whether the observed statistics differ from a random distribution within each phase, and pairwise randomisation tests comparing the two phases. Within-phase, edge density does not significantly differ from random in either phase. Modularity is moderate in Aur-P1 (0.3-0.4), consistent with the restricted/broad community structure</w:t>
+        <w:t xml:space="preserve">shows the results of permutation tests (n = 10⁴) assessing whether the observed statistics differ from a random distribution within each phase, and pairwise randomisation tests comparing the two phases. Within-phase, edge density does not significantly differ from random in either phase. Modularity is moderate in Aur-P1 (0.3-0.4), consistent with the restricted/broad community structure</w:t>
       </w:r>
       <w:r>
         <w:t xml:space="preserve"> </w:t>
@@ -3464,7 +3719,25 @@
         <w:t xml:space="preserve">[46]</w:t>
       </w:r>
       <w:r>
-        <w:t xml:space="preserve">, and the null-benchmarked and size-normalised (Erdős–Rényi) comparisons in Supplement S5.9 evaluate this structure net of network size. Pairwise permutation tests with Benjamini–Hochberg correction show that the phases do not differ significantly in edge density (p = 0.2523), betweenness (p = 0.4629), or component count (p = 0.5072), but differ significantly in modularity (adjusted p &lt; 0.001), indicating that the Aur-P1 and Aur-P2 networks differ in their community structure rather than in their overall density.</w:t>
+        <w:t xml:space="preserve">, and the null-benchmarked and size-normalised (Erdős–Rényi) comparisons in our Supplementary Material item</w:t>
+      </w:r>
+      <w:r>
+        <w:t xml:space="preserve"> </w:t>
+      </w:r>
+      <w:r>
+        <w:t xml:space="preserve">“</w:t>
+      </w:r>
+      <w:r>
+        <w:t xml:space="preserve">Sensitivity Analyses</w:t>
+      </w:r>
+      <w:r>
+        <w:t xml:space="preserve">”</w:t>
+      </w:r>
+      <w:r>
+        <w:t xml:space="preserve"> </w:t>
+      </w:r>
+      <w:r>
+        <w:t xml:space="preserve">S5.9 evaluate this structure net of network size. Pairwise permutation tests with Benjamini–Hochberg correction show that the phases do not differ significantly in edge density (p = 0.2523), betweenness (p = 0.4629), or component count (p = 0.5072), but differ significantly in modularity (adjusted p &lt; 0.001), indicating that the Aur-P1 and Aur-P2 networks differ in their community structure rather than in their overall density.</w:t>
       </w:r>
     </w:p>
     <w:tbl>
@@ -3540,7 +3813,7 @@
               <w:pStyle w:val="ImageCaption"/>
             </w:pPr>
             <w:r>
-              <w:t xml:space="preserve">Figure 5: Geographic distribution of cultural groups in the two Aurignacian phases (Aur-P1, Aur-P2). Sites are colored according to their group membership (Restricted-range or Broader range) as identified by seriation and network analysis. The spatial arrangement shows that sites belonging to the same cultural group are not strictly clustered geographically, consistent with the Mantel test results that did not detect a significant correlation between geographic proximity and geometric sign similarity.</w:t>
+              <w:t xml:space="preserve">Figure 5: Geographic distribution of sign-use groups (Restricted-range and Broader range) in the two Aurignacian phases (Aur-P1, Aur-P2). Sites are colored according to their group membership (Restricted-range or Broader range) as identified by seriation and network analysis. The spatial arrangement shows that sites belonging to the same sign-use group are not strictly clustered geographically, consistent with the Mantel test results that did not detect a significant correlation between geographic proximity and geometric sign similarity.</w:t>
             </w:r>
           </w:p>
           <w:bookmarkEnd w:id="48"/>
@@ -3831,7 +4104,7 @@
         <w:pStyle w:val="FirstParagraph"/>
       </w:pPr>
       <w:r>
-        <w:t xml:space="preserve">Our first aim was to determine whether a two-group (restricted-range vs broad-range) structure exists within each phase, and how diversity, size, connectivity, and distribution vary between the phases. The results from</w:t>
+        <w:t xml:space="preserve">Our first aim was to determine whether any structure in sign type composition exists within each phase, and how diversity, size, connectivity, and distribution vary between the phases. The results from</w:t>
       </w:r>
       <w:r>
         <w:t xml:space="preserve"> </w:t>
@@ -3848,7 +4121,7 @@
         <w:t xml:space="preserve"> </w:t>
       </w:r>
       <w:r>
-        <w:t xml:space="preserve">show that each phase can be divided into two main cultural groups, with sign type number and diversity serving as the major dividing factor. Group size differed between phases: in Aur-P1 the restricted-range group (9 sites) was slightly smaller than the broad-range group (11 sites), whereas in the much smaller Aur-P2 the restricted-range group (6 sites) exceeded the broad-range group (2 sites).</w:t>
+        <w:t xml:space="preserve">show that each phase can be divided into two main sign-use groups, with sign type frequency and diversity serving as the major dividing factor. Group size differed between phases: in Aur-P1 the restricted-range group (9 sites) was slightly smaller than the broad-range group (11 sites), whereas in the much smaller Aur-P2 the restricted-range group (6 sites) exceeded the broad-range group (2 sites).</w:t>
       </w:r>
       <w:r>
         <w:t xml:space="preserve"> </w:t>
@@ -3891,7 +4164,33 @@
         <w:t xml:space="preserve">[4,54–65]</w:t>
       </w:r>
       <w:r>
-        <w:t xml:space="preserve">. Drawing on this work, we interpret the broader/restricted range grouping in the geometric sign data as consistent with variation in social structure: the broader range groups, with a higher variety of signs and more visually complex signs, plausibly indicate communities with a greater variety of formalized social roles, whereas the sites with a restricted range of signs indicate communities with fewer formalized social roles. Because the number of sign types recorded at a site is bounded by the number of objects recovered, we considered whether this divide is an artefact of sampling effort; across sites, object count and sign-type count are strongly correlated (Spearman ρ = 0.85, p &lt; 0.001). However, node degree within each phase is not correlated with sign-type richness (Supplement S5.4), indicating that the network connectivity patterns are not driven by assemblage size. Two observations argue against sampling effort being the whole explanation. First, group membership is not solely a function of sign-type richness: low-sampling sites such as Les Cottés (two objects) and Trou al’Wesse (one object) fall within the broad-range group because their sign types are shared with broad-range sites, so composition matters as well as richness. Second, the diversity analysis that controls for sample size (</w:t>
+        <w:t xml:space="preserve">. Drawing on this work, we speculate that the broader/restricted range grouping in the geometric sign data may be consistent with variation in social structure: the broader range groups, with a higher variety of signs and more visually complex signs, plausibly indicate communities with a greater variety of formalized social roles, whereas the sites with a restricted range of signs indicate communities with fewer formalized social roles.</w:t>
+      </w:r>
+    </w:p>
+    <w:p>
+      <w:pPr>
+        <w:pStyle w:val="BodyText"/>
+      </w:pPr>
+      <w:r>
+        <w:t xml:space="preserve">Because the number of sign types recorded at a site is bounded by the number of objects recovered, we considered whether this divide is an artefact of sampling effort. We found that across sites, object count and sign-type count are strongly correlated (Spearman ρ = 0.85, p &lt; 0.001). However, node degree within each phase is not correlated with sign-type richness (see our Supplementary Material item</w:t>
+      </w:r>
+      <w:r>
+        <w:t xml:space="preserve"> </w:t>
+      </w:r>
+      <w:r>
+        <w:t xml:space="preserve">“</w:t>
+      </w:r>
+      <w:r>
+        <w:t xml:space="preserve">Sensitivity Analyses</w:t>
+      </w:r>
+      <w:r>
+        <w:t xml:space="preserve">”</w:t>
+      </w:r>
+      <w:r>
+        <w:t xml:space="preserve"> </w:t>
+      </w:r>
+      <w:r>
+        <w:t xml:space="preserve">S5.4), indicating that the network connectivity patterns are not driven by assemblage size. Two observations argue against sampling effort being the whole explanation. First, group membership is not solely a function of sign-type richness: low-sampling sites such as Les Cottés (two objects) and Trou al’Wesse (one object) fall within the broad-range group because their sign types are shared with broad-range sites, so composition matters as well as richness. Second, the diversity analysis that controls for sample size (</w:t>
       </w:r>
       <w:hyperlink w:anchor="fig-div-plot">
         <w:r>
@@ -3938,7 +4237,25 @@
         </w:r>
       </w:hyperlink>
       <w:r>
-        <w:t xml:space="preserve">), although this null result should be interpreted cautiously given the small sample sizes and limited statistical power (Supplement S5.8). If this pattern holds with larger samples, it would suggest that the observed connectivity is not fully attributable to spatial proximity, and may instead reflect social processes such as non-utilitarian mobility. Previous studies have shown a range of variation in magnitudes and types of mobility among hunter-gatherer groups</w:t>
+        <w:t xml:space="preserve">), although this null result should be interpreted cautiously given the small sample sizes and limited statistical power (our Supplementary Material item</w:t>
+      </w:r>
+      <w:r>
+        <w:t xml:space="preserve"> </w:t>
+      </w:r>
+      <w:r>
+        <w:t xml:space="preserve">“</w:t>
+      </w:r>
+      <w:r>
+        <w:t xml:space="preserve">Sensitivity Analyses</w:t>
+      </w:r>
+      <w:r>
+        <w:t xml:space="preserve">”</w:t>
+      </w:r>
+      <w:r>
+        <w:t xml:space="preserve"> </w:t>
+      </w:r>
+      <w:r>
+        <w:t xml:space="preserve">S5.8). If this pattern holds with larger samples, it would suggest that the observed connectivity is not fully attributable to spatial proximity, and may instead reflect social processes such as non-utilitarian mobility. Previous studies have shown a range of variation in magnitudes and types of mobility among hunter-gatherer groups</w:t>
       </w:r>
       <w:r>
         <w:t xml:space="preserve"> </w:t>
@@ -4291,7 +4608,7 @@
               <w:pStyle w:val="ImageCaption"/>
             </w:pPr>
             <w:r>
-              <w:t xml:space="preserve">Figure 6: Aggregation sites identified by elevated sign diversity. Observed geometric sign diversity at each site compared with expectations derived from randomized assemblages controlling for sample size. The blue expectation curve is the mean diversity index per sample size. The red lines enclose a band that is the 95% confidence interval. Sites above the blue expectation curve may be interpreted as aggregation sites, reflecting unusually diverse sign repertoires relative to regional norms.</w:t>
+              <w:t xml:space="preserve">Figure 6: Sites with elevated sign diversity, compared with randomised expectations. Observed geometric sign diversity at each site compared with expectations derived from randomised assemblages controlling for sample size. The blue expectation curve is the mean diversity index per sample size. The red lines enclose a band that is the 95% confidence interval. Sites above the blue expectation curve are candidate aggregation sites, reflecting unusually diverse sign repertoires relative to regional norms; however, elevated diversity may also reflect sample size, recovery history, research intensity, preservation or site function rather than aggregation.</w:t>
             </w:r>
           </w:p>
           <w:bookmarkEnd w:id="56"/>
@@ -4313,7 +4630,7 @@
         <w:pStyle w:val="FirstParagraph"/>
       </w:pPr>
       <w:r>
-        <w:t xml:space="preserve">The second aim was to determine what these patterns reveal about the dynamics of social organization throughout the Aurignacian. The results suggest that the early Aurignacian (Aur-P1), which combines the Proto and Early Aurignacian material culture, was characterised by denser inter-site connectivity than the late Aurignacian (Aur-P2). Aur-P1’s network has the higher mean degree (7.5) with a hub structure centred on key sites, whereas Aur-P2 shows fewer sites and edges and a lower mean degree (4.2). Despite this strong connectivity, geographic distance had little influence on sign distribution in Aur-P1 (Mantel R = 0.045;</w:t>
+        <w:t xml:space="preserve">Our second aim was to determine what these patterns reveal about the dynamics of social organization throughout the Aurignacian. The results suggest that the early Aurignacian (Aur-P1), which combines the Proto and Early Aurignacian material culture, was characterised by denser inter-site connectivity than the late Aurignacian (Aur-P2). Aur-P1’s network has the higher mean degree (7.5) with a hub structure centred on key sites, whereas Aur-P2 shows fewer sites and edges and a lower mean degree (4.2). Despite this strong connectivity, geographic distance had little influence on sign distribution in Aur-P1 (Mantel R = 0.045;</w:t>
       </w:r>
       <w:r>
         <w:t xml:space="preserve"> </w:t>
@@ -4327,7 +4644,7 @@
         </w:r>
       </w:hyperlink>
       <w:r>
-        <w:t xml:space="preserve">), and no significant geographic signal was detected in either phase (Aur-P2: R = -0.303). A permutation test of the difference between these Mantel correlations (D = 0.35, p = 0.164; sites permuted between phases 1,000 times) shows that the isolation-by-distance relationship does not differ significantly between the phases, indicating that the observed interactions cannot be attributed to spatial proximity in either phase.</w:t>
+        <w:t xml:space="preserve">), and no significant geographic signal was detected in either phase (Aur-P2: R = -0.303). A permutation test of the difference between these Mantel correlations (D = 0.35, p = 0.164; sites permuted between phases 1,000 times) shows that the isolation-by-distance relationship does not differ significantly between the phases, so the spatial-proximity explanation is not supported by this analysis.</w:t>
       </w:r>
     </w:p>
     <w:p>
@@ -4335,7 +4652,7 @@
         <w:pStyle w:val="BodyText"/>
       </w:pPr>
       <w:r>
-        <w:t xml:space="preserve">These results are consistent with previous work on the environmental and population change during these phases. From 45 - 43.25 ka BP, the population density in Europe was extremely low, due to the unfavorable environmental conditions of Greenland Stadial 12 (44 ka BP) and the slow westward expansion of early modern humans</w:t>
+        <w:t xml:space="preserve">These results are consistent with previous work on the environmental and population change during these phases. From 45–43.25 ka BP, the population density in Europe was extremely low, due to the unfavorable environmental conditions of Greenland Stadial 12 (44 ka BP) and the slow westward expansion of early modern humans</w:t>
       </w:r>
       <w:r>
         <w:t xml:space="preserve"> </w:t>
@@ -4344,7 +4661,13 @@
         <w:t xml:space="preserve">[88]</w:t>
       </w:r>
       <w:r>
-        <w:t xml:space="preserve">. This was followed by rapid expansion from 43.25-41 ka BP, with the maximum extent of early Aurignacian (Aur-P1) settlement being reached around 41 ka BP. This rapid population expansion could be what stimulated the emergence of signs as a marker of group membership. Other studies have also found similar associations in other regions and time periods between increases in quantity and diversity of art, and increases in population density</w:t>
+        <w:t xml:space="preserve">. This was followed by rapid expansion from 43.25–41 ka BP, with the maximum extent of early Aurignacian (Aur-P1) settlement being reached around 41 ka BP (</w:t>
+      </w:r>
+      <w:r>
+        <w:t xml:space="preserve">[20]</w:t>
+      </w:r>
+      <w:r>
+        <w:t xml:space="preserve">). Although population growth is the condition under which sign systems typically gain a communicative function, the causal link between demographic expansion and the emergence of geometric signs as a group-membership marker cannot be established from the sign-sharing data alone and should be treated as a contextual correlate rather than a demonstrated driver. Other studies have also found similar associations in other regions and time periods between increases in quantity and diversity of art, and increases in population density</w:t>
       </w:r>
       <w:r>
         <w:t xml:space="preserve"> </w:t>
@@ -4410,7 +4733,7 @@
         <w:t xml:space="preserve"> </w:t>
       </w:r>
       <w:r>
-        <w:t xml:space="preserve">of seasonal or satellite use, with Core Areas corresponding to regions where our network hubs are located — notably the Dordogne (La Ferrassie) in Aur-P1. This Core/Extended framework aligns with our finding that the Aur-P1 network’s higher mean degree reflects aggregation zones where inter-group interactions concentrated, while the lower-connectivity periphery may represent Extended Areas visited periodically. In Aur-P2 the reduced sample and weaker community structure are consistent with more localised interaction as populations consolidated. These demographic conditions have implications for how cultural information flowed through Aurignacian populations, which we explore through the lens of cultural transmission theory.</w:t>
+        <w:t xml:space="preserve">of seasonal or satellite use, with Core Areas corresponding to regions where our network hubs are located — notably the Dordogne (La Ferrassie) in Aur-P1. This Core/Extended framework is consistent with our finding that the Aur-P1 network’s higher mean degree suggests aggregation-related congregation rather than demonstrates it, while the lower-connectivity periphery may represent Extended Areas visited periodically. In Aur-P2 the reduced sample and weaker community structure are consistent with more localised interaction as populations consolidated. These demographic conditions may shape how cultural information flowed through Aurignacian populations, which we explore below through the lens of cultural transmission theory.</w:t>
       </w:r>
     </w:p>
     <w:p>
@@ -4932,7 +5255,7 @@
         <w:t xml:space="preserve"> </w:t>
       </w:r>
       <w:r>
-        <w:t xml:space="preserve">further show that hunter-gatherer mobility patterns profoundly affect our ability to reconstruct social networks from archaeological assemblages, with implications for how we interpret network metrics such as mean degree and transitivity. These methodological constraints should be borne in mind when interpreting the social organisation patterns discussed above.</w:t>
+        <w:t xml:space="preserve">further show that hunter-gatherer mobility patterns profoundly affect our ability to reconstruct social networks from archaeological assemblages, with implications for how we interpret network metrics such as mean degree and transitivity. These methodological constraints should be borne in mind when interpreting the inferred social organisation patterns discussed above.</w:t>
       </w:r>
     </w:p>
     <w:p>
@@ -4946,7 +5269,7 @@
         <w:t xml:space="preserve"> </w:t>
       </w:r>
       <w:r>
-        <w:t xml:space="preserve">[23,24]</w:t>
+        <w:t xml:space="preserve">[24,25]</w:t>
       </w:r>
       <w:r>
         <w:t xml:space="preserve">, La Ferrassie’s Aurignacian begins with the Early Aurignacian directly above the Châtelperronian</w:t>
@@ -4955,7 +5278,7 @@
         <w:t xml:space="preserve"> </w:t>
       </w:r>
       <w:r>
-        <w:t xml:space="preserve">[25]</w:t>
+        <w:t xml:space="preserve">[26]</w:t>
       </w:r>
       <w:r>
         <w:t xml:space="preserve">, and Mladeč’s massive-base bone points and ~31 ka BP dates indicate an Evolved (Aur-P2) attribution</w:t>
@@ -4964,7 +5287,7 @@
         <w:t xml:space="preserve"> </w:t>
       </w:r>
       <w:r>
-        <w:t xml:space="preserve">[26]</w:t>
+        <w:t xml:space="preserve">[27]</w:t>
       </w:r>
       <w:r>
         <w:t xml:space="preserve">. Additionally, Vogelherd Cave’s stratigraphy is severely compromised by excavation methodology and post-depositional disturbance, with documented mixing between Aurignacian, Gravettian, and Magdalenian layers</w:t>
@@ -4976,7 +5299,7 @@
         <w:t xml:space="preserve">[31]</w:t>
       </w:r>
       <w:r>
-        <w:t xml:space="preserve">. After exclusions, Aur-P2 rests on only 8 sites and 34 objects, so its two-group structure and network statistics must be read with explicit power caveats, and any claim about it is made conditional on that small sample. We test the sensitivity of our assignments to reverting to purely date-based criteria in Supplement S7.</w:t>
+        <w:t xml:space="preserve">. After exclusions, Aur-P2 rests on only 8 sites and 34 objects, so its two-group structure and network statistics must be read with explicit power caveats, and any claim about it is made conditional on that small sample. We test the sensitivity of our assignments to reverting to purely date-based criteria in Supplement S8. The Proto/Early merger reflects this documented chronological overlap and further avoids treating the poorly-sampled Proto as a distinct analytic phase.</w:t>
       </w:r>
     </w:p>
     <w:bookmarkEnd w:id="60"/>
@@ -4994,16 +5317,7 @@
         <w:pStyle w:val="FirstParagraph"/>
       </w:pPr>
       <w:r>
-        <w:t xml:space="preserve">All data and code needed to reproduce the analyses in this paper are publicly available. The processed dataset (</w:t>
-      </w:r>
-      <w:r>
-        <w:rPr>
-          <w:rStyle w:val="VerbatimChar"/>
-        </w:rPr>
-        <w:t xml:space="preserve">signBase_Version1.0.csv</w:t>
-      </w:r>
-      <w:r>
-        <w:t xml:space="preserve">) is included with this paper as Supporting Information. The original unprocessed dataset is available from the SignBase repository</w:t>
+        <w:t xml:space="preserve">All data and code needed to reproduce the analyses in this paper are publicly available. The original unprocessed dataset is available in the signBase_Version1.0.csv file from the SignBase repository</w:t>
       </w:r>
       <w:r>
         <w:t xml:space="preserve"> </w:t>
@@ -5012,22 +5326,7 @@
         <w:t xml:space="preserve">[10]</w:t>
       </w:r>
       <w:r>
-        <w:t xml:space="preserve">. Eight sites were excluded during data cleaning because they fall outside the Aurignacian geographic scope or lack a reliable calendrical context (Willendorf, Riparo di Fontana Nuova, Muralovka, Shanidar Cave, Hayonim Cave, El Salitre, Grotte De La Princesse Pauline, Šandalja II), and two further sites (Spy, El Castillo) were excluded because their assemblages are too mixed to assign to a single phase reliably. All analysis functions are defined in</w:t>
-      </w:r>
-      <w:r>
-        <w:t xml:space="preserve"> </w:t>
-      </w:r>
-      <w:r>
-        <w:rPr>
-          <w:rStyle w:val="VerbatimChar"/>
-        </w:rPr>
-        <w:t xml:space="preserve">paper/functions.R</w:t>
-      </w:r>
-      <w:r>
-        <w:t xml:space="preserve"> </w:t>
-      </w:r>
-      <w:r>
-        <w:t xml:space="preserve">and sourced at the start of each rendering session. The following R packages were used: dplyr, ggplot2, igraph, knitr, MASS, purrr, readxl, reshape2, rnaturalearth, scales, sf, statnet, tidyr, vegan. The full analysis pipeline can be reproduced by rendering</w:t>
+        <w:t xml:space="preserve">. The processed dataset is included with our Open Access research compendium at http://doi.org/XXX/XXX. This compendium includes a list of all the R package names, their version numbers, and custom R functions used to generate the results presented here. The compendium includes the Quarto documents</w:t>
       </w:r>
       <w:r>
         <w:t xml:space="preserve"> </w:t>
@@ -5039,10 +5338,7 @@
         <w:t xml:space="preserve">paper.qmd</w:t>
       </w:r>
       <w:r>
-        <w:t xml:space="preserve"> </w:t>
-      </w:r>
-      <w:r>
-        <w:t xml:space="preserve">and</w:t>
+        <w:t xml:space="preserve">,</w:t>
       </w:r>
       <w:r>
         <w:t xml:space="preserve"> </w:t>
@@ -5051,13 +5347,25 @@
         <w:rPr>
           <w:rStyle w:val="VerbatimChar"/>
         </w:rPr>
-        <w:t xml:space="preserve">supplement.qmd</w:t>
-      </w:r>
-      <w:r>
-        <w:t xml:space="preserve"> </w:t>
-      </w:r>
-      <w:r>
-        <w:t xml:space="preserve">with Quarto. This computational reproducibility approach follows best practices for transparent and open archaeological science</w:t>
+        <w:t xml:space="preserve">supplement-sensitivity.qmd</w:t>
+      </w:r>
+      <w:r>
+        <w:t xml:space="preserve">, and</w:t>
+      </w:r>
+      <w:r>
+        <w:t xml:space="preserve"> </w:t>
+      </w:r>
+      <w:r>
+        <w:rPr>
+          <w:rStyle w:val="VerbatimChar"/>
+        </w:rPr>
+        <w:t xml:space="preserve">supplement-site-assignment.qmd</w:t>
+      </w:r>
+      <w:r>
+        <w:t xml:space="preserve"> </w:t>
+      </w:r>
+      <w:r>
+        <w:t xml:space="preserve">which can be rendered to reproduce the full analysis pipeline. This computational reproducibility approach follows best practices for transparent and open archaeological science</w:t>
       </w:r>
       <w:r>
         <w:t xml:space="preserve"> </w:t>
@@ -5128,7 +5436,40 @@
         <w:t xml:space="preserve">	</w:t>
       </w:r>
       <w:r>
-        <w:t xml:space="preserve">d’Errico F, Baker J, Pereira D, Álvarez-Fernández E, Lázničková-Galetová M, Rigaud S. Multivariate analyses of aurignacian and gravettian personal ornaments support cultural continuity in the early upper palaeolithic. PLOS ONE 2025;20:1–24.</w:t>
+        <w:t xml:space="preserve">d’Errico F, Baker J, Pereira D, Álvarez-Fernández E, Lázničková-Galetová M, Rigaud S. Multivariate analyses of</w:t>
+      </w:r>
+      <w:r>
+        <w:t xml:space="preserve"> </w:t>
+      </w:r>
+      <w:r>
+        <w:t xml:space="preserve">Aurignacian</w:t>
+      </w:r>
+      <w:r>
+        <w:t xml:space="preserve"> </w:t>
+      </w:r>
+      <w:r>
+        <w:t xml:space="preserve">and</w:t>
+      </w:r>
+      <w:r>
+        <w:t xml:space="preserve"> </w:t>
+      </w:r>
+      <w:r>
+        <w:t xml:space="preserve">Gravettian</w:t>
+      </w:r>
+      <w:r>
+        <w:t xml:space="preserve"> </w:t>
+      </w:r>
+      <w:r>
+        <w:t xml:space="preserve">personal ornaments support cultural continuity in the</w:t>
+      </w:r>
+      <w:r>
+        <w:t xml:space="preserve"> </w:t>
+      </w:r>
+      <w:r>
+        <w:t xml:space="preserve">Early Upper Palaeolithic</w:t>
+      </w:r>
+      <w:r>
+        <w:t xml:space="preserve">. PLOS ONE 2025;20:1–24.</w:t>
       </w:r>
       <w:r>
         <w:t xml:space="preserve"> </w:t>
@@ -5161,7 +5502,16 @@
         <w:t xml:space="preserve">	</w:t>
       </w:r>
       <w:r>
-        <w:t xml:space="preserve">Baker J, Rigaud S, Pereira D, Courtenay LA, d’Errico F. Evidence from personal ornaments suggest nine distinct cultural groups between 34,000 and 24,000 years ago in europe. Nature Human Behaviour 2024;8:431–44.</w:t>
+        <w:t xml:space="preserve">Baker J, Rigaud S, Pereira D, Courtenay LA, d’Errico F. Evidence from personal ornaments suggest nine distinct cultural groups between 34,000 and 24,000 years ago in</w:t>
+      </w:r>
+      <w:r>
+        <w:t xml:space="preserve"> </w:t>
+      </w:r>
+      <w:r>
+        <w:t xml:space="preserve">Europe</w:t>
+      </w:r>
+      <w:r>
+        <w:t xml:space="preserve">. Nature Human Behaviour 2024;8:431–44.</w:t>
       </w:r>
     </w:p>
     <w:bookmarkEnd w:id="66"/>
@@ -5213,7 +5563,19 @@
         <w:t xml:space="preserve">	</w:t>
       </w:r>
       <w:r>
-        <w:t xml:space="preserve">Kuhn SL, Stiner MC. Paleolithic ornaments: Implications for cognition, demography and identity. Diogenes 2007;54:40–8.</w:t>
+        <w:t xml:space="preserve">Kuhn SL, Stiner MC.</w:t>
+      </w:r>
+      <w:r>
+        <w:t xml:space="preserve"> </w:t>
+      </w:r>
+      <w:r>
+        <w:t xml:space="preserve">Paleolithic</w:t>
+      </w:r>
+      <w:r>
+        <w:t xml:space="preserve"> </w:t>
+      </w:r>
+      <w:r>
+        <w:t xml:space="preserve">ornaments: Implications for cognition, demography and identity. Diogenes 2007;54:40–8.</w:t>
       </w:r>
       <w:r>
         <w:t xml:space="preserve"> </w:t>
@@ -5246,7 +5608,31 @@
         <w:t xml:space="preserve">	</w:t>
       </w:r>
       <w:r>
-        <w:t xml:space="preserve">Vanhaeren M, d’Errico F. Aurignacian ethno-linguistic geography of europe revealed by personal ornaments. Journal of Archaeological Science 2006;33:1105–28.</w:t>
+        <w:t xml:space="preserve">Vanhaeren M, d’Errico F.</w:t>
+      </w:r>
+      <w:r>
+        <w:t xml:space="preserve"> </w:t>
+      </w:r>
+      <w:r>
+        <w:t xml:space="preserve">Aurignacian</w:t>
+      </w:r>
+      <w:r>
+        <w:t xml:space="preserve"> </w:t>
+      </w:r>
+      <w:r>
+        <w:t xml:space="preserve">ethno-linguistic geography of</w:t>
+      </w:r>
+      <w:r>
+        <w:t xml:space="preserve"> </w:t>
+      </w:r>
+      <w:r>
+        <w:t xml:space="preserve">Europe</w:t>
+      </w:r>
+      <w:r>
+        <w:t xml:space="preserve"> </w:t>
+      </w:r>
+      <w:r>
+        <w:t xml:space="preserve">revealed by personal ornaments. Journal of Archaeological Science 2006;33:1105–28.</w:t>
       </w:r>
       <w:r>
         <w:t xml:space="preserve"> </w:t>
@@ -5279,7 +5665,31 @@
         <w:t xml:space="preserve">	</w:t>
       </w:r>
       <w:r>
-        <w:t xml:space="preserve">Fuentes O, Lucas C, Robert E. An approach to palaeolithic networks: The question of symbolic territories and their interpretation through magdalenian art. Quaternary International 2019;503:233–47.</w:t>
+        <w:t xml:space="preserve">Fuentes O, Lucas C, Robert E. An approach to</w:t>
+      </w:r>
+      <w:r>
+        <w:t xml:space="preserve"> </w:t>
+      </w:r>
+      <w:r>
+        <w:t xml:space="preserve">Palaeolithic</w:t>
+      </w:r>
+      <w:r>
+        <w:t xml:space="preserve"> </w:t>
+      </w:r>
+      <w:r>
+        <w:t xml:space="preserve">networks: The question of symbolic territories and their interpretation through</w:t>
+      </w:r>
+      <w:r>
+        <w:t xml:space="preserve"> </w:t>
+      </w:r>
+      <w:r>
+        <w:t xml:space="preserve">Magdalenian</w:t>
+      </w:r>
+      <w:r>
+        <w:t xml:space="preserve"> </w:t>
+      </w:r>
+      <w:r>
+        <w:t xml:space="preserve">art. Quaternary International 2019;503:233–47.</w:t>
       </w:r>
       <w:r>
         <w:t xml:space="preserve"> </w:t>
@@ -5312,7 +5722,43 @@
         <w:t xml:space="preserve">	</w:t>
       </w:r>
       <w:r>
-        <w:t xml:space="preserve">Tejero J-M, Grimaldi S. Assessing bone and antler exploitation at riparo mochi (balzi rossi, italy): Implications for the characterization of the aurignacian in south-western europe. Journal of Archaeological Science 2015;61:59–77.</w:t>
+        <w:t xml:space="preserve">Tejero J-M, Grimaldi S. Assessing bone and antler exploitation at riparo mochi (</w:t>
+      </w:r>
+      <w:r>
+        <w:t xml:space="preserve">Balzi Rossi</w:t>
+      </w:r>
+      <w:r>
+        <w:t xml:space="preserve">,</w:t>
+      </w:r>
+      <w:r>
+        <w:t xml:space="preserve"> </w:t>
+      </w:r>
+      <w:r>
+        <w:t xml:space="preserve">Italy</w:t>
+      </w:r>
+      <w:r>
+        <w:t xml:space="preserve">): Implications for the characterization of the</w:t>
+      </w:r>
+      <w:r>
+        <w:t xml:space="preserve"> </w:t>
+      </w:r>
+      <w:r>
+        <w:t xml:space="preserve">Aurignacian</w:t>
+      </w:r>
+      <w:r>
+        <w:t xml:space="preserve"> </w:t>
+      </w:r>
+      <w:r>
+        <w:t xml:space="preserve">in</w:t>
+      </w:r>
+      <w:r>
+        <w:t xml:space="preserve"> </w:t>
+      </w:r>
+      <w:r>
+        <w:t xml:space="preserve">South-Western Europe</w:t>
+      </w:r>
+      <w:r>
+        <w:t xml:space="preserve">. Journal of Archaeological Science 2015;61:59–77.</w:t>
       </w:r>
       <w:r>
         <w:t xml:space="preserve"> </w:t>
@@ -5345,7 +5791,28 @@
         <w:t xml:space="preserve">	</w:t>
       </w:r>
       <w:r>
-        <w:t xml:space="preserve">Tartar E. The recognition of a new type of bone tools in early aurignacian assemblages: Implications for understanding the appearance of osseous technology in europe. Journal of Archaeological Science 2012;39:2348–60.</w:t>
+        <w:t xml:space="preserve">Tartar E. The recognition of a new type of bone tools in early</w:t>
+      </w:r>
+      <w:r>
+        <w:t xml:space="preserve"> </w:t>
+      </w:r>
+      <w:r>
+        <w:t xml:space="preserve">Aurignacian</w:t>
+      </w:r>
+      <w:r>
+        <w:t xml:space="preserve"> </w:t>
+      </w:r>
+      <w:r>
+        <w:t xml:space="preserve">assemblages: Implications for understanding the appearance of osseous technology in</w:t>
+      </w:r>
+      <w:r>
+        <w:t xml:space="preserve"> </w:t>
+      </w:r>
+      <w:r>
+        <w:t xml:space="preserve">Europe</w:t>
+      </w:r>
+      <w:r>
+        <w:t xml:space="preserve">. Journal of Archaeological Science 2012;39:2348–60.</w:t>
       </w:r>
       <w:r>
         <w:t xml:space="preserve"> </w:t>
@@ -5378,7 +5845,25 @@
         <w:t xml:space="preserve">	</w:t>
       </w:r>
       <w:r>
-        <w:t xml:space="preserve">Dutkiewicz E, Russo G, Lee S, Bentz C. SignBase, a collection of geometric signs on mobile objects in the paleolithic. Scientific Data 2020;7:364.</w:t>
+        <w:t xml:space="preserve">Dutkiewicz E, Russo G, Lee S, Bentz C.</w:t>
+      </w:r>
+      <w:r>
+        <w:t xml:space="preserve"> </w:t>
+      </w:r>
+      <w:r>
+        <w:t xml:space="preserve">SignBase</w:t>
+      </w:r>
+      <w:r>
+        <w:t xml:space="preserve">, a collection of geometric signs on mobile objects in the</w:t>
+      </w:r>
+      <w:r>
+        <w:t xml:space="preserve"> </w:t>
+      </w:r>
+      <w:r>
+        <w:t xml:space="preserve">Paleolithic</w:t>
+      </w:r>
+      <w:r>
+        <w:t xml:space="preserve">. Scientific Data 2020;7:364.</w:t>
       </w:r>
       <w:r>
         <w:t xml:space="preserve"> </w:t>
@@ -5444,7 +5929,19 @@
         <w:t xml:space="preserve">	</w:t>
       </w:r>
       <w:r>
-        <w:t xml:space="preserve">Chu W, Richter J. Aurignacian cultural unit. Encyclopedia of global archaeology, Cham: Springer International Publishing; 2020, p. 1–10.</w:t>
+        <w:t xml:space="preserve">Chu W, Richter J.</w:t>
+      </w:r>
+      <w:r>
+        <w:t xml:space="preserve"> </w:t>
+      </w:r>
+      <w:r>
+        <w:t xml:space="preserve">Aurignacian</w:t>
+      </w:r>
+      <w:r>
+        <w:t xml:space="preserve"> </w:t>
+      </w:r>
+      <w:r>
+        <w:t xml:space="preserve">cultural unit. Encyclopedia of global archaeology, Cham: Springer International Publishing; 2020, p. 1–10.</w:t>
       </w:r>
       <w:r>
         <w:t xml:space="preserve"> </w:t>
@@ -5477,7 +5974,31 @@
         <w:t xml:space="preserve">	</w:t>
       </w:r>
       <w:r>
-        <w:t xml:space="preserve">Dinnis R, Bessudnov A, Chiotti L, Flas D, Michel A. Thoughts on the structure of the european aurignacian, with particular focus on hohle fels IV. Proceedings of the Prehistoric Society 2019;85:29–60.</w:t>
+        <w:t xml:space="preserve">Dinnis R, Bessudnov A, Chiotti L, Flas D, Michel A. Thoughts on the structure of the</w:t>
+      </w:r>
+      <w:r>
+        <w:t xml:space="preserve"> </w:t>
+      </w:r>
+      <w:r>
+        <w:t xml:space="preserve">European</w:t>
+      </w:r>
+      <w:r>
+        <w:t xml:space="preserve"> </w:t>
+      </w:r>
+      <w:r>
+        <w:t xml:space="preserve">Aurignacian</w:t>
+      </w:r>
+      <w:r>
+        <w:t xml:space="preserve">, with particular focus on</w:t>
+      </w:r>
+      <w:r>
+        <w:t xml:space="preserve"> </w:t>
+      </w:r>
+      <w:r>
+        <w:t xml:space="preserve">Hohle Fels IV</w:t>
+      </w:r>
+      <w:r>
+        <w:t xml:space="preserve">. Proceedings of the Prehistoric Society 2019;85:29–60.</w:t>
       </w:r>
     </w:p>
     <w:bookmarkEnd w:id="85"/>
@@ -5496,7 +6017,40 @@
         <w:t xml:space="preserve">	</w:t>
       </w:r>
       <w:r>
-        <w:t xml:space="preserve">Falcucci A, Conard NJ, Peresani M, et al. Breaking through the aquitaine frame: A re-evaluation on the significance of regional variants during the aurignacian as seen from a key record in southern europe. Journal of Anthropological Sciences 2020;98:99–140.</w:t>
+        <w:t xml:space="preserve">Falcucci A, Conard NJ, Peresani M, et al. Breaking through the</w:t>
+      </w:r>
+      <w:r>
+        <w:t xml:space="preserve"> </w:t>
+      </w:r>
+      <w:r>
+        <w:t xml:space="preserve">Aquitaine</w:t>
+      </w:r>
+      <w:r>
+        <w:t xml:space="preserve"> </w:t>
+      </w:r>
+      <w:r>
+        <w:t xml:space="preserve">frame: A re-evaluation on the significance of regional variants during the</w:t>
+      </w:r>
+      <w:r>
+        <w:t xml:space="preserve"> </w:t>
+      </w:r>
+      <w:r>
+        <w:t xml:space="preserve">Aurignacian</w:t>
+      </w:r>
+      <w:r>
+        <w:t xml:space="preserve"> </w:t>
+      </w:r>
+      <w:r>
+        <w:t xml:space="preserve">as seen from a key record in southern</w:t>
+      </w:r>
+      <w:r>
+        <w:t xml:space="preserve"> </w:t>
+      </w:r>
+      <w:r>
+        <w:t xml:space="preserve">Europe</w:t>
+      </w:r>
+      <w:r>
+        <w:t xml:space="preserve">. Journal of Anthropological Sciences 2020;98:99–140.</w:t>
       </w:r>
     </w:p>
     <w:bookmarkEnd w:id="86"/>
@@ -5515,7 +6069,28 @@
         <w:t xml:space="preserve">	</w:t>
       </w:r>
       <w:r>
-        <w:t xml:space="preserve">Clark GA, Riel-Salvatore J. What’s in a name? Observations on the compositional integrity of the aurignacian. The mediterranean from 50 000 to 25 000 BP, vol. 323, Oxbow Books; 2009.</w:t>
+        <w:t xml:space="preserve">Clark GA, Riel-Salvatore J. What’s in a name? Observations on the compositional integrity of the</w:t>
+      </w:r>
+      <w:r>
+        <w:t xml:space="preserve"> </w:t>
+      </w:r>
+      <w:r>
+        <w:t xml:space="preserve">Aurignacian</w:t>
+      </w:r>
+      <w:r>
+        <w:t xml:space="preserve">. The</w:t>
+      </w:r>
+      <w:r>
+        <w:t xml:space="preserve"> </w:t>
+      </w:r>
+      <w:r>
+        <w:t xml:space="preserve">Mediterranean</w:t>
+      </w:r>
+      <w:r>
+        <w:t xml:space="preserve"> </w:t>
+      </w:r>
+      <w:r>
+        <w:t xml:space="preserve">from 50 000 to 25 000 BP, vol. 323, Oxbow Books; 2009.</w:t>
       </w:r>
     </w:p>
     <w:bookmarkEnd w:id="87"/>
@@ -5534,7 +6109,31 @@
         <w:t xml:space="preserve">	</w:t>
       </w:r>
       <w:r>
-        <w:t xml:space="preserve">Zilhão J, d’Errico F, Banks WE, Teyssandier N. A data-driven paradigm shift for the middle-to-upper palaeolithic transition and the neandertal debate. Quaternary Environments and Humans 2024;2:100037.</w:t>
+        <w:t xml:space="preserve">Zilhão J, d’Errico F, Banks WE, Teyssandier N. A data-driven paradigm shift for the</w:t>
+      </w:r>
+      <w:r>
+        <w:t xml:space="preserve"> </w:t>
+      </w:r>
+      <w:r>
+        <w:t xml:space="preserve">Middle-to-Upper Palaeolithic</w:t>
+      </w:r>
+      <w:r>
+        <w:t xml:space="preserve"> </w:t>
+      </w:r>
+      <w:r>
+        <w:t xml:space="preserve">transition and the</w:t>
+      </w:r>
+      <w:r>
+        <w:t xml:space="preserve"> </w:t>
+      </w:r>
+      <w:r>
+        <w:t xml:space="preserve">Neandertal</w:t>
+      </w:r>
+      <w:r>
+        <w:t xml:space="preserve"> </w:t>
+      </w:r>
+      <w:r>
+        <w:t xml:space="preserve">debate. Quaternary Environments and Humans 2024;2:100037.</w:t>
       </w:r>
     </w:p>
     <w:bookmarkEnd w:id="88"/>
@@ -5553,7 +6152,19 @@
         <w:t xml:space="preserve">	</w:t>
       </w:r>
       <w:r>
-        <w:t xml:space="preserve">Bordes J-G. News from the west: A reevaluation of the classical aurignacian sequence of the p</w:t>
+        <w:t xml:space="preserve">Bordes J-G. News from the west: A reevaluation of the classical</w:t>
+      </w:r>
+      <w:r>
+        <w:t xml:space="preserve"> </w:t>
+      </w:r>
+      <w:r>
+        <w:t xml:space="preserve">Aurignacian</w:t>
+      </w:r>
+      <w:r>
+        <w:t xml:space="preserve"> </w:t>
+      </w:r>
+      <w:r>
+        <w:t xml:space="preserve">sequence of the p</w:t>
       </w:r>
       <w:r>
         <w:t xml:space="preserve">é</w:t>
@@ -5578,7 +6189,31 @@
         <w:t xml:space="preserve">	</w:t>
       </w:r>
       <w:r>
-        <w:t xml:space="preserve">Canessa T, Peña P de la. Unpacking lithic assemblage variability in the early upper palaeolithic: A multivariate approach to the structure of the iberian aurignacian. Plos One 2026;21:e0345202.</w:t>
+        <w:t xml:space="preserve">Canessa T, Peña P de la. Unpacking lithic assemblage variability in the</w:t>
+      </w:r>
+      <w:r>
+        <w:t xml:space="preserve"> </w:t>
+      </w:r>
+      <w:r>
+        <w:t xml:space="preserve">Early Upper Palaeolithic</w:t>
+      </w:r>
+      <w:r>
+        <w:t xml:space="preserve">: A multivariate approach to the structure of the</w:t>
+      </w:r>
+      <w:r>
+        <w:t xml:space="preserve"> </w:t>
+      </w:r>
+      <w:r>
+        <w:t xml:space="preserve">Iberian</w:t>
+      </w:r>
+      <w:r>
+        <w:t xml:space="preserve"> </w:t>
+      </w:r>
+      <w:r>
+        <w:t xml:space="preserve">Aurignacian</w:t>
+      </w:r>
+      <w:r>
+        <w:t xml:space="preserve">. Plos One 2026;21:e0345202.</w:t>
       </w:r>
     </w:p>
     <w:bookmarkEnd w:id="90"/>
@@ -5597,7 +6232,19 @@
         <w:t xml:space="preserve">	</w:t>
       </w:r>
       <w:r>
-        <w:t xml:space="preserve">Shao Y, Limberg H, Klein K, Wegener C, Schmidt I, Weniger G-C, et al. Human-existence probability of the aurignacian techno-complex under extreme climate conditions. Quaternary Science Reviews 2021;263:106995. https://doi.org/</w:t>
+        <w:t xml:space="preserve">Shao Y, Limberg H, Klein K, Wegener C, Schmidt I, Weniger G-C, et al. Human-existence probability of the</w:t>
+      </w:r>
+      <w:r>
+        <w:t xml:space="preserve"> </w:t>
+      </w:r>
+      <w:r>
+        <w:t xml:space="preserve">Aurignacian</w:t>
+      </w:r>
+      <w:r>
+        <w:t xml:space="preserve"> </w:t>
+      </w:r>
+      <w:r>
+        <w:t xml:space="preserve">techno-complex under extreme climate conditions. Quaternary Science Reviews 2021;263:106995. https://doi.org/</w:t>
       </w:r>
       <w:hyperlink r:id="rId91">
         <w:r>
@@ -5627,7 +6274,25 @@
         <w:t xml:space="preserve">	</w:t>
       </w:r>
       <w:r>
-        <w:t xml:space="preserve">Schmidt I, Zimmermann A. Population dynamics and socio-spatial organization of the aurignacian: Scalable quantitative demographic data for western and central europe. PLoS ONE 2019;14:e0211562.</w:t>
+        <w:t xml:space="preserve">Schmidt I, Zimmermann A. Population dynamics and socio-spatial organization of the</w:t>
+      </w:r>
+      <w:r>
+        <w:t xml:space="preserve"> </w:t>
+      </w:r>
+      <w:r>
+        <w:t xml:space="preserve">Aurignacian</w:t>
+      </w:r>
+      <w:r>
+        <w:t xml:space="preserve">: Scalable quantitative demographic data for western and</w:t>
+      </w:r>
+      <w:r>
+        <w:t xml:space="preserve"> </w:t>
+      </w:r>
+      <w:r>
+        <w:t xml:space="preserve">Central Europe</w:t>
+      </w:r>
+      <w:r>
+        <w:t xml:space="preserve">. PLoS ONE 2019;14:e0211562.</w:t>
       </w:r>
       <w:r>
         <w:t xml:space="preserve"> </w:t>
@@ -5660,7 +6325,37 @@
         <w:t xml:space="preserve">	</w:t>
       </w:r>
       <w:r>
-        <w:t xml:space="preserve">Banks WE, d’Errico F, Zilhão J. Human–climate interaction during the early upper paleolithic: Testing the hypothesis of an adaptive shift between the proto-aurignacian and the early aurignacian. Journal of Human Evolution 2013;64:39–55. https://doi.org/</w:t>
+        <w:t xml:space="preserve">Banks WE, d’Errico F, Zilhão J. Human–climate interaction during the</w:t>
+      </w:r>
+      <w:r>
+        <w:t xml:space="preserve"> </w:t>
+      </w:r>
+      <w:r>
+        <w:t xml:space="preserve">Early Upper Paleolithic</w:t>
+      </w:r>
+      <w:r>
+        <w:t xml:space="preserve">: Testing the hypothesis of an adaptive shift between the</w:t>
+      </w:r>
+      <w:r>
+        <w:t xml:space="preserve"> </w:t>
+      </w:r>
+      <w:r>
+        <w:t xml:space="preserve">Proto-Aurignacian</w:t>
+      </w:r>
+      <w:r>
+        <w:t xml:space="preserve"> </w:t>
+      </w:r>
+      <w:r>
+        <w:t xml:space="preserve">and the early</w:t>
+      </w:r>
+      <w:r>
+        <w:t xml:space="preserve"> </w:t>
+      </w:r>
+      <w:r>
+        <w:t xml:space="preserve">Aurignacian</w:t>
+      </w:r>
+      <w:r>
+        <w:t xml:space="preserve">. Journal of Human Evolution 2013;64:39–55. https://doi.org/</w:t>
       </w:r>
       <w:hyperlink r:id="rId95">
         <w:r>
@@ -5690,7 +6385,40 @@
         <w:t xml:space="preserve">	</w:t>
       </w:r>
       <w:r>
-        <w:t xml:space="preserve">Falcucci A, Conard NJ, Peresani M. A critical assessment of the protoaurignacian lithic technology at fumane cave and its implications for the definition of the earliest aurignacian. PLoS ONE 2017;12:e0189241.</w:t>
+        <w:t xml:space="preserve">Falcucci A, Conard NJ, Peresani M. A critical assessment of the</w:t>
+      </w:r>
+      <w:r>
+        <w:t xml:space="preserve"> </w:t>
+      </w:r>
+      <w:r>
+        <w:t xml:space="preserve">Protoaurignacian</w:t>
+      </w:r>
+      <w:r>
+        <w:t xml:space="preserve"> </w:t>
+      </w:r>
+      <w:r>
+        <w:t xml:space="preserve">lithic technology at</w:t>
+      </w:r>
+      <w:r>
+        <w:t xml:space="preserve"> </w:t>
+      </w:r>
+      <w:r>
+        <w:t xml:space="preserve">Fumane Cave</w:t>
+      </w:r>
+      <w:r>
+        <w:t xml:space="preserve"> </w:t>
+      </w:r>
+      <w:r>
+        <w:t xml:space="preserve">and its implications for the definition of the earliest</w:t>
+      </w:r>
+      <w:r>
+        <w:t xml:space="preserve"> </w:t>
+      </w:r>
+      <w:r>
+        <w:t xml:space="preserve">Aurignacian</w:t>
+      </w:r>
+      <w:r>
+        <w:t xml:space="preserve">. PLoS ONE 2017;12:e0189241.</w:t>
       </w:r>
       <w:r>
         <w:t xml:space="preserve"> </w:t>
@@ -5708,7 +6436,7 @@
       </w:r>
     </w:p>
     <w:bookmarkEnd w:id="98"/>
-    <w:bookmarkStart w:id="99" w:name="ref-Chiotti_2005"/>
+    <w:bookmarkStart w:id="100" w:name="ref-Bataille_Conard_2019"/>
     <w:p>
       <w:pPr>
         <w:pStyle w:val="Bibliography"/>
@@ -5723,11 +6451,79 @@
         <w:t xml:space="preserve">	</w:t>
       </w:r>
       <w:r>
-        <w:t xml:space="preserve">Chiotti L. Les industries lithiques aurignaciennes de l’abri pataud. Oxford: Archaeopress; 2005.</w:t>
-      </w:r>
-    </w:p>
-    <w:bookmarkEnd w:id="99"/>
-    <w:bookmarkStart w:id="101" w:name="ref-Higham_Abri_Pataud_2011"/>
+        <w:t xml:space="preserve">Bataille G, Conard NJ. Burin-core technology in</w:t>
+      </w:r>
+      <w:r>
+        <w:t xml:space="preserve"> </w:t>
+      </w:r>
+      <w:r>
+        <w:t xml:space="preserve">Aurignacian</w:t>
+      </w:r>
+      <w:r>
+        <w:t xml:space="preserve"> </w:t>
+      </w:r>
+      <w:r>
+        <w:t xml:space="preserve">horizons</w:t>
+      </w:r>
+      <w:r>
+        <w:t xml:space="preserve"> </w:t>
+      </w:r>
+      <w:r>
+        <w:t xml:space="preserve">IIIa</w:t>
+      </w:r>
+      <w:r>
+        <w:t xml:space="preserve"> </w:t>
+      </w:r>
+      <w:r>
+        <w:t xml:space="preserve">and</w:t>
+      </w:r>
+      <w:r>
+        <w:t xml:space="preserve"> </w:t>
+      </w:r>
+      <w:r>
+        <w:t xml:space="preserve">IV</w:t>
+      </w:r>
+      <w:r>
+        <w:t xml:space="preserve"> </w:t>
+      </w:r>
+      <w:r>
+        <w:t xml:space="preserve">of</w:t>
+      </w:r>
+      <w:r>
+        <w:t xml:space="preserve"> </w:t>
+      </w:r>
+      <w:r>
+        <w:t xml:space="preserve">Hohle Fels</w:t>
+      </w:r>
+      <w:r>
+        <w:t xml:space="preserve"> </w:t>
+      </w:r>
+      <w:r>
+        <w:t xml:space="preserve">cave (</w:t>
+      </w:r>
+      <w:r>
+        <w:t xml:space="preserve">Southwestern Germany</w:t>
+      </w:r>
+      <w:r>
+        <w:t xml:space="preserve">). Quartär 2019;65:7–30.</w:t>
+      </w:r>
+      <w:r>
+        <w:t xml:space="preserve"> </w:t>
+      </w:r>
+      <w:hyperlink r:id="rId99">
+        <w:r>
+          <w:rPr>
+            <w:rStyle w:val="Hyperlink"/>
+          </w:rPr>
+          <w:t xml:space="preserve">https://doi.org/10.7485/QU65_2</w:t>
+        </w:r>
+      </w:hyperlink>
+      <w:r>
+        <w:t xml:space="preserve">.</w:t>
+      </w:r>
+    </w:p>
+    <w:bookmarkEnd w:id="100"/>
+    <w:bookmarkStart w:id="101" w:name="ref-Chiotti_2005"/>
     <w:p>
       <w:pPr>
         <w:pStyle w:val="Bibliography"/>
@@ -5742,12 +6538,49 @@
         <w:t xml:space="preserve">	</w:t>
       </w:r>
       <w:r>
-        <w:t xml:space="preserve">Higham TFG, Jacobi RM, Julien C, Ramsey CB, Studenik C, Trinkaus E. The earliest evidence for anatomically modern humans in northwestern europe. Journal of Human Evolution 2011;61:549–63.</w:t>
-      </w:r>
-      <w:r>
-        <w:t xml:space="preserve"> </w:t>
-      </w:r>
-      <w:hyperlink r:id="rId100">
+        <w:t xml:space="preserve">Chiotti L. Les industries lithiques aurignaciennes de l’abri</w:t>
+      </w:r>
+      <w:r>
+        <w:t xml:space="preserve"> </w:t>
+      </w:r>
+      <w:r>
+        <w:t xml:space="preserve">Pataud</w:t>
+      </w:r>
+      <w:r>
+        <w:t xml:space="preserve">. Oxford: Archaeopress; 2005.</w:t>
+      </w:r>
+    </w:p>
+    <w:bookmarkEnd w:id="101"/>
+    <w:bookmarkStart w:id="103" w:name="ref-Higham_Abri_Pataud_2011"/>
+    <w:p>
+      <w:pPr>
+        <w:pStyle w:val="Bibliography"/>
+      </w:pPr>
+      <w:r>
+        <w:t xml:space="preserve">[25]</w:t>
+      </w:r>
+      <w:r>
+        <w:t xml:space="preserve"> </w:t>
+      </w:r>
+      <w:r>
+        <w:t xml:space="preserve">	</w:t>
+      </w:r>
+      <w:r>
+        <w:t xml:space="preserve">Higham TFG, Jacobi RM, Julien C, Ramsey CB, Studenik C, Trinkaus E. The earliest evidence for anatomically modern humans in northwestern</w:t>
+      </w:r>
+      <w:r>
+        <w:t xml:space="preserve"> </w:t>
+      </w:r>
+      <w:r>
+        <w:t xml:space="preserve">Europe</w:t>
+      </w:r>
+      <w:r>
+        <w:t xml:space="preserve">. Journal of Human Evolution 2011;61:549–63.</w:t>
+      </w:r>
+      <w:r>
+        <w:t xml:space="preserve"> </w:t>
+      </w:r>
+      <w:hyperlink r:id="rId102">
         <w:r>
           <w:rPr>
             <w:rStyle w:val="Hyperlink"/>
@@ -5759,28 +6592,58 @@
         <w:t xml:space="preserve">.</w:t>
       </w:r>
     </w:p>
-    <w:bookmarkEnd w:id="101"/>
-    <w:bookmarkStart w:id="103" w:name="ref-Talamo_La_Ferrassie_2020"/>
-    <w:p>
-      <w:pPr>
-        <w:pStyle w:val="Bibliography"/>
-      </w:pPr>
-      <w:r>
-        <w:t xml:space="preserve">[25]</w:t>
-      </w:r>
-      <w:r>
-        <w:t xml:space="preserve"> </w:t>
-      </w:r>
-      <w:r>
-        <w:t xml:space="preserve">	</w:t>
-      </w:r>
-      <w:r>
-        <w:t xml:space="preserve">Talamo S, Kels S, Roussel M, Schmidt P, competition M, Bocherens H. Direct radiocarbon dating and taphonomy of the aurignacian sequence of la ferrassie (france). Journal of Quaternary Science 2020;35:958–69.</w:t>
-      </w:r>
-      <w:r>
-        <w:t xml:space="preserve"> </w:t>
-      </w:r>
-      <w:hyperlink r:id="rId102">
+    <w:bookmarkEnd w:id="103"/>
+    <w:bookmarkStart w:id="105" w:name="ref-Talamo_La_Ferrassie_2020"/>
+    <w:p>
+      <w:pPr>
+        <w:pStyle w:val="Bibliography"/>
+      </w:pPr>
+      <w:r>
+        <w:t xml:space="preserve">[26]</w:t>
+      </w:r>
+      <w:r>
+        <w:t xml:space="preserve"> </w:t>
+      </w:r>
+      <w:r>
+        <w:t xml:space="preserve">	</w:t>
+      </w:r>
+      <w:r>
+        <w:t xml:space="preserve">Talamo S, Kels S, Roussel M, Schmidt P, competition M, Bocherens H. Direct radiocarbon dating and taphonomy of the</w:t>
+      </w:r>
+      <w:r>
+        <w:t xml:space="preserve"> </w:t>
+      </w:r>
+      <w:r>
+        <w:t xml:space="preserve">Aurignacian</w:t>
+      </w:r>
+      <w:r>
+        <w:t xml:space="preserve"> </w:t>
+      </w:r>
+      <w:r>
+        <w:t xml:space="preserve">sequence of</w:t>
+      </w:r>
+      <w:r>
+        <w:t xml:space="preserve"> </w:t>
+      </w:r>
+      <w:r>
+        <w:t xml:space="preserve">La Ferrassie</w:t>
+      </w:r>
+      <w:r>
+        <w:t xml:space="preserve"> </w:t>
+      </w:r>
+      <w:r>
+        <w:t xml:space="preserve">(</w:t>
+      </w:r>
+      <w:r>
+        <w:t xml:space="preserve">France</w:t>
+      </w:r>
+      <w:r>
+        <w:t xml:space="preserve">). Journal of Quaternary Science 2020;35:958–69.</w:t>
+      </w:r>
+      <w:r>
+        <w:t xml:space="preserve"> </w:t>
+      </w:r>
+      <w:hyperlink r:id="rId104">
         <w:r>
           <w:rPr>
             <w:rStyle w:val="Hyperlink"/>
@@ -5792,28 +6655,70 @@
         <w:t xml:space="preserve">.</w:t>
       </w:r>
     </w:p>
-    <w:bookmarkEnd w:id="103"/>
-    <w:bookmarkStart w:id="105" w:name="ref-Oliva_2006"/>
-    <w:p>
-      <w:pPr>
-        <w:pStyle w:val="Bibliography"/>
-      </w:pPr>
-      <w:r>
-        <w:t xml:space="preserve">[26]</w:t>
-      </w:r>
-      <w:r>
-        <w:t xml:space="preserve"> </w:t>
-      </w:r>
-      <w:r>
-        <w:t xml:space="preserve">	</w:t>
-      </w:r>
-      <w:r>
-        <w:t xml:space="preserve">Oliva M. The upper paleolithic finds from the mladeč cave. In: Teschler-Nicola M, editor. Early modern humans at the moravian gate: The mladeč caves and their remains, Vienna: Springer; 2006, p. 41–74.</w:t>
-      </w:r>
-      <w:r>
-        <w:t xml:space="preserve"> </w:t>
-      </w:r>
-      <w:hyperlink r:id="rId104">
+    <w:bookmarkEnd w:id="105"/>
+    <w:bookmarkStart w:id="107" w:name="ref-Oliva_2006"/>
+    <w:p>
+      <w:pPr>
+        <w:pStyle w:val="Bibliography"/>
+      </w:pPr>
+      <w:r>
+        <w:t xml:space="preserve">[27]</w:t>
+      </w:r>
+      <w:r>
+        <w:t xml:space="preserve"> </w:t>
+      </w:r>
+      <w:r>
+        <w:t xml:space="preserve">	</w:t>
+      </w:r>
+      <w:r>
+        <w:t xml:space="preserve">Oliva M. The</w:t>
+      </w:r>
+      <w:r>
+        <w:t xml:space="preserve"> </w:t>
+      </w:r>
+      <w:r>
+        <w:t xml:space="preserve">Upper Paleolithic</w:t>
+      </w:r>
+      <w:r>
+        <w:t xml:space="preserve"> </w:t>
+      </w:r>
+      <w:r>
+        <w:t xml:space="preserve">finds from the</w:t>
+      </w:r>
+      <w:r>
+        <w:t xml:space="preserve"> </w:t>
+      </w:r>
+      <w:r>
+        <w:t xml:space="preserve">Mladeč Cave</w:t>
+      </w:r>
+      <w:r>
+        <w:t xml:space="preserve">. In: Teschler-Nicola M, editor. Early modern humans at the</w:t>
+      </w:r>
+      <w:r>
+        <w:t xml:space="preserve"> </w:t>
+      </w:r>
+      <w:r>
+        <w:t xml:space="preserve">Moravian Gate</w:t>
+      </w:r>
+      <w:r>
+        <w:t xml:space="preserve">: The</w:t>
+      </w:r>
+      <w:r>
+        <w:t xml:space="preserve"> </w:t>
+      </w:r>
+      <w:r>
+        <w:t xml:space="preserve">Mladeč Caves</w:t>
+      </w:r>
+      <w:r>
+        <w:t xml:space="preserve"> </w:t>
+      </w:r>
+      <w:r>
+        <w:t xml:space="preserve">and their remains, Vienna: Springer; 2006, p. 41–74.</w:t>
+      </w:r>
+      <w:r>
+        <w:t xml:space="preserve"> </w:t>
+      </w:r>
+      <w:hyperlink r:id="rId106">
         <w:r>
           <w:rPr>
             <w:rStyle w:val="Hyperlink"/>
@@ -5825,28 +6730,70 @@
         <w:t xml:space="preserve">.</w:t>
       </w:r>
     </w:p>
-    <w:bookmarkEnd w:id="105"/>
-    <w:bookmarkStart w:id="107" w:name="ref-Bataille_Conard_2018"/>
-    <w:p>
-      <w:pPr>
-        <w:pStyle w:val="Bibliography"/>
-      </w:pPr>
-      <w:r>
-        <w:t xml:space="preserve">[27]</w:t>
-      </w:r>
-      <w:r>
-        <w:t xml:space="preserve"> </w:t>
-      </w:r>
-      <w:r>
-        <w:t xml:space="preserve">	</w:t>
-      </w:r>
-      <w:r>
-        <w:t xml:space="preserve">Bataille G, Conard NJ. Blade and bladelet production at hohle fels cave, AH IV in the swabian jura and its importance for characterizing the technological variability of the aurignacian in central europe. PLoS ONE 2018;13:e0194097.</w:t>
-      </w:r>
-      <w:r>
-        <w:t xml:space="preserve"> </w:t>
-      </w:r>
-      <w:hyperlink r:id="rId106">
+    <w:bookmarkEnd w:id="107"/>
+    <w:bookmarkStart w:id="109" w:name="ref-Bataille_Conard_2018"/>
+    <w:p>
+      <w:pPr>
+        <w:pStyle w:val="Bibliography"/>
+      </w:pPr>
+      <w:r>
+        <w:t xml:space="preserve">[28]</w:t>
+      </w:r>
+      <w:r>
+        <w:t xml:space="preserve"> </w:t>
+      </w:r>
+      <w:r>
+        <w:t xml:space="preserve">	</w:t>
+      </w:r>
+      <w:r>
+        <w:t xml:space="preserve">Bataille G, Conard NJ. Blade and bladelet production at</w:t>
+      </w:r>
+      <w:r>
+        <w:t xml:space="preserve"> </w:t>
+      </w:r>
+      <w:r>
+        <w:t xml:space="preserve">Hohle Fels Cave</w:t>
+      </w:r>
+      <w:r>
+        <w:t xml:space="preserve">, AH IV in the</w:t>
+      </w:r>
+      <w:r>
+        <w:t xml:space="preserve"> </w:t>
+      </w:r>
+      <w:r>
+        <w:t xml:space="preserve">Swabian Jura</w:t>
+      </w:r>
+      <w:r>
+        <w:t xml:space="preserve"> </w:t>
+      </w:r>
+      <w:r>
+        <w:t xml:space="preserve">and its importance for characterizing the technological variability of the</w:t>
+      </w:r>
+      <w:r>
+        <w:t xml:space="preserve"> </w:t>
+      </w:r>
+      <w:r>
+        <w:t xml:space="preserve">Aurignacian</w:t>
+      </w:r>
+      <w:r>
+        <w:t xml:space="preserve"> </w:t>
+      </w:r>
+      <w:r>
+        <w:t xml:space="preserve">in</w:t>
+      </w:r>
+      <w:r>
+        <w:t xml:space="preserve"> </w:t>
+      </w:r>
+      <w:r>
+        <w:t xml:space="preserve">Central Europe</w:t>
+      </w:r>
+      <w:r>
+        <w:t xml:space="preserve">. PLoS ONE 2018;13:e0194097.</w:t>
+      </w:r>
+      <w:r>
+        <w:t xml:space="preserve"> </w:t>
+      </w:r>
+      <w:hyperlink r:id="rId108">
         <w:r>
           <w:rPr>
             <w:rStyle w:val="Hyperlink"/>
@@ -5858,75 +6805,6 @@
         <w:t xml:space="preserve">.</w:t>
       </w:r>
     </w:p>
-    <w:bookmarkEnd w:id="107"/>
-    <w:bookmarkStart w:id="109" w:name="ref-Bataille_Conard_2019"/>
-    <w:p>
-      <w:pPr>
-        <w:pStyle w:val="Bibliography"/>
-      </w:pPr>
-      <w:r>
-        <w:t xml:space="preserve">[28]</w:t>
-      </w:r>
-      <w:r>
-        <w:t xml:space="preserve"> </w:t>
-      </w:r>
-      <w:r>
-        <w:t xml:space="preserve">	</w:t>
-      </w:r>
-      <w:r>
-        <w:t xml:space="preserve">Bataille G, Conard NJ. Burin-core technology in aurignacian horizons</w:t>
-      </w:r>
-      <w:r>
-        <w:t xml:space="preserve"> </w:t>
-      </w:r>
-      <w:r>
-        <w:t xml:space="preserve">IIIa</w:t>
-      </w:r>
-      <w:r>
-        <w:t xml:space="preserve"> </w:t>
-      </w:r>
-      <w:r>
-        <w:t xml:space="preserve">and</w:t>
-      </w:r>
-      <w:r>
-        <w:t xml:space="preserve"> </w:t>
-      </w:r>
-      <w:r>
-        <w:t xml:space="preserve">IV</w:t>
-      </w:r>
-      <w:r>
-        <w:t xml:space="preserve"> </w:t>
-      </w:r>
-      <w:r>
-        <w:t xml:space="preserve">of</w:t>
-      </w:r>
-      <w:r>
-        <w:t xml:space="preserve"> </w:t>
-      </w:r>
-      <w:r>
-        <w:t xml:space="preserve">Hohle Fels</w:t>
-      </w:r>
-      <w:r>
-        <w:t xml:space="preserve"> </w:t>
-      </w:r>
-      <w:r>
-        <w:t xml:space="preserve">cave (southwestern germany). Quartär 2019;65:7–30.</w:t>
-      </w:r>
-      <w:r>
-        <w:t xml:space="preserve"> </w:t>
-      </w:r>
-      <w:hyperlink r:id="rId108">
-        <w:r>
-          <w:rPr>
-            <w:rStyle w:val="Hyperlink"/>
-          </w:rPr>
-          <w:t xml:space="preserve">https://doi.org/10.7485/QU65_2</w:t>
-        </w:r>
-      </w:hyperlink>
-      <w:r>
-        <w:t xml:space="preserve">.</w:t>
-      </w:r>
-    </w:p>
     <w:bookmarkEnd w:id="109"/>
     <w:bookmarkStart w:id="110" w:name="ref-Flas_et_al_2013"/>
     <w:p>
@@ -5943,7 +6821,19 @@
         <w:t xml:space="preserve">	</w:t>
       </w:r>
       <w:r>
-        <w:t xml:space="preserve">Flas D, Tartar É, Bordes J-G, Le Brun-Ricalens F, Zwyns N. New perspectives on the aurignacian from</w:t>
+        <w:t xml:space="preserve">Flas D, Tartar É, Bordes J-G, Le Brun-Ricalens F, Zwyns N. New perspectives on the</w:t>
+      </w:r>
+      <w:r>
+        <w:t xml:space="preserve"> </w:t>
+      </w:r>
+      <w:r>
+        <w:t xml:space="preserve">Aurignacian</w:t>
+      </w:r>
+      <w:r>
+        <w:t xml:space="preserve"> </w:t>
+      </w:r>
+      <w:r>
+        <w:t xml:space="preserve">from</w:t>
       </w:r>
       <w:r>
         <w:t xml:space="preserve"> </w:t>
@@ -6049,7 +6939,46 @@
         <w:t xml:space="preserve"> </w:t>
       </w:r>
       <w:r>
-        <w:t xml:space="preserve">complexes in the european aurignacian context. In: White R, Bourrillon R, editors. Aurignacian genius: Art, technology and society of the first modern humans in europe, vol. 7, P@lethnology, Toulouse; 2015, p. 57–75.</w:t>
+        <w:t xml:space="preserve">complexes in the</w:t>
+      </w:r>
+      <w:r>
+        <w:t xml:space="preserve"> </w:t>
+      </w:r>
+      <w:r>
+        <w:t xml:space="preserve">European</w:t>
+      </w:r>
+      <w:r>
+        <w:t xml:space="preserve"> </w:t>
+      </w:r>
+      <w:r>
+        <w:t xml:space="preserve">Aurignacian</w:t>
+      </w:r>
+      <w:r>
+        <w:t xml:space="preserve"> </w:t>
+      </w:r>
+      <w:r>
+        <w:t xml:space="preserve">context. In: White R, Bourrillon R, editors.</w:t>
+      </w:r>
+      <w:r>
+        <w:t xml:space="preserve"> </w:t>
+      </w:r>
+      <w:r>
+        <w:t xml:space="preserve">Aurignacian</w:t>
+      </w:r>
+      <w:r>
+        <w:t xml:space="preserve"> </w:t>
+      </w:r>
+      <w:r>
+        <w:t xml:space="preserve">genius: Art, technology and society of the first modern humans in</w:t>
+      </w:r>
+      <w:r>
+        <w:t xml:space="preserve"> </w:t>
+      </w:r>
+      <w:r>
+        <w:t xml:space="preserve">Europe</w:t>
+      </w:r>
+      <w:r>
+        <w:t xml:space="preserve">, vol. 7, P@lethnology, Toulouse; 2015, p. 57–75.</w:t>
       </w:r>
       <w:r>
         <w:t xml:space="preserve"> </w:t>
@@ -6127,7 +7056,16 @@
         <w:t xml:space="preserve">	</w:t>
       </w:r>
       <w:r>
-        <w:t xml:space="preserve">Fletcher WJ, Sánchez Goñi MF, Allen JRM, Cheddadi R, Combourieu-Nebout N, Huntley B, et al. Millennial-scale variability during the last glacial in vegetation records from europe. Quaternary Science Reviews 2010;29:2839–64.</w:t>
+        <w:t xml:space="preserve">Fletcher WJ, Sánchez Goñi MF, Allen JRM, Cheddadi R, Combourieu-Nebout N, Huntley B, et al. Millennial-scale variability during the last glacial in vegetation records from</w:t>
+      </w:r>
+      <w:r>
+        <w:t xml:space="preserve"> </w:t>
+      </w:r>
+      <w:r>
+        <w:t xml:space="preserve">Europe</w:t>
+      </w:r>
+      <w:r>
+        <w:t xml:space="preserve">. Quaternary Science Reviews 2010;29:2839–64.</w:t>
       </w:r>
       <w:r>
         <w:t xml:space="preserve"> </w:t>
@@ -6193,7 +7131,16 @@
         <w:t xml:space="preserve">	</w:t>
       </w:r>
       <w:r>
-        <w:t xml:space="preserve">Lycett SJ. Confirmation of the role of geographic isolation by distance in among-tribe variations in beadwork designs and manufacture on the high plains. Archaeological and Anthropological Sciences 2019;11:2837–47.</w:t>
+        <w:t xml:space="preserve">Lycett SJ. Confirmation of the role of geographic isolation by distance in among-tribe variations in beadwork designs and manufacture on the</w:t>
+      </w:r>
+      <w:r>
+        <w:t xml:space="preserve"> </w:t>
+      </w:r>
+      <w:r>
+        <w:t xml:space="preserve">High Plains</w:t>
+      </w:r>
+      <w:r>
+        <w:t xml:space="preserve">. Archaeological and Anthropological Sciences 2019;11:2837–47.</w:t>
       </w:r>
       <w:r>
         <w:t xml:space="preserve"> </w:t>
@@ -6289,7 +7236,19 @@
         <w:t xml:space="preserve">	</w:t>
       </w:r>
       <w:r>
-        <w:t xml:space="preserve">Rigaud S, d’Errico F, Vanhaeren M. Ornaments reveal resistance of north european cultures to the spread of farming. PLOS ONE 2015;10:e0121166.</w:t>
+        <w:t xml:space="preserve">Rigaud S, d’Errico F, Vanhaeren M. Ornaments reveal resistance of</w:t>
+      </w:r>
+      <w:r>
+        <w:t xml:space="preserve"> </w:t>
+      </w:r>
+      <w:r>
+        <w:t xml:space="preserve">North European</w:t>
+      </w:r>
+      <w:r>
+        <w:t xml:space="preserve"> </w:t>
+      </w:r>
+      <w:r>
+        <w:t xml:space="preserve">cultures to the spread of farming. PLOS ONE 2015;10:e0121166.</w:t>
       </w:r>
       <w:r>
         <w:t xml:space="preserve"> </w:t>
@@ -6580,7 +7539,22 @@
         <w:t xml:space="preserve"> </w:t>
       </w:r>
       <w:r>
-        <w:t xml:space="preserve">cultural evolution models in neolithic europe. Evolution and Human Behavior 2015;36:103–9.</w:t>
+        <w:t xml:space="preserve">cultural evolution models in</w:t>
+      </w:r>
+      <w:r>
+        <w:t xml:space="preserve"> </w:t>
+      </w:r>
+      <w:r>
+        <w:t xml:space="preserve">Neolithic</w:t>
+      </w:r>
+      <w:r>
+        <w:t xml:space="preserve"> </w:t>
+      </w:r>
+      <w:r>
+        <w:t xml:space="preserve">Europe</w:t>
+      </w:r>
+      <w:r>
+        <w:t xml:space="preserve">. Evolution and Human Behavior 2015;36:103–9.</w:t>
       </w:r>
       <w:r>
         <w:t xml:space="preserve"> </w:t>
@@ -6813,7 +7787,16 @@
         <w:t xml:space="preserve">	</w:t>
       </w:r>
       <w:r>
-        <w:t xml:space="preserve">Singh M, Glowacki L. Human social organization during the late pleistocene: Beyond the nomadic-egalitarian model. Evolution and Human Behavior 2022;43:418–31. https://doi.org/</w:t>
+        <w:t xml:space="preserve">Singh M, Glowacki L. Human social organization during the</w:t>
+      </w:r>
+      <w:r>
+        <w:t xml:space="preserve"> </w:t>
+      </w:r>
+      <w:r>
+        <w:t xml:space="preserve">Late Pleistocene</w:t>
+      </w:r>
+      <w:r>
+        <w:t xml:space="preserve">: Beyond the nomadic-egalitarian model. Evolution and Human Behavior 2022;43:418–31. https://doi.org/</w:t>
       </w:r>
       <w:hyperlink r:id="rId155">
         <w:r>
@@ -6843,7 +7826,25 @@
         <w:t xml:space="preserve">	</w:t>
       </w:r>
       <w:r>
-        <w:t xml:space="preserve">Schwendler RH. Diversity in social organization across magdalenian western europe ca. 17–12,000 BP. Quaternary International 2012;272–273:333–53. https://doi.org/</w:t>
+        <w:t xml:space="preserve">Schwendler RH. Diversity in social organization across</w:t>
+      </w:r>
+      <w:r>
+        <w:t xml:space="preserve"> </w:t>
+      </w:r>
+      <w:r>
+        <w:t xml:space="preserve">Magdalenian</w:t>
+      </w:r>
+      <w:r>
+        <w:t xml:space="preserve"> </w:t>
+      </w:r>
+      <w:r>
+        <w:t xml:space="preserve">Western Europe</w:t>
+      </w:r>
+      <w:r>
+        <w:t xml:space="preserve"> </w:t>
+      </w:r>
+      <w:r>
+        <w:t xml:space="preserve">ca. 17–12,000 BP. Quaternary International 2012;272–273:333–53. https://doi.org/</w:t>
       </w:r>
       <w:hyperlink r:id="rId157">
         <w:r>
@@ -6939,7 +7940,16 @@
         <w:t xml:space="preserve">	</w:t>
       </w:r>
       <w:r>
-        <w:t xml:space="preserve">Larsson L. A tooth for a tooth: Tooth ornaments from the graves at the cemeteries of zvejnieki. Back to the origin: New research in the mesolithic-neolithic zvejnieki cemetery and environment, northern latvia, vol. 52, Almqvist &amp; Wiksell International; 2006, p. 253–87.</w:t>
+        <w:t xml:space="preserve">Larsson L. A tooth for a tooth: Tooth ornaments from the graves at the cemeteries of zvejnieki. Back to the origin: New research in the mesolithic-</w:t>
+      </w:r>
+      <w:r>
+        <w:t xml:space="preserve">Neolithic</w:t>
+      </w:r>
+      <w:r>
+        <w:t xml:space="preserve"> </w:t>
+      </w:r>
+      <w:r>
+        <w:t xml:space="preserve">zvejnieki cemetery and environment, northern latvia, vol. 52, Almqvist &amp; Wiksell International; 2006, p. 253–87.</w:t>
       </w:r>
     </w:p>
     <w:bookmarkEnd w:id="163"/>
@@ -7043,7 +8053,19 @@
         <w:t xml:space="preserve">	</w:t>
       </w:r>
       <w:r>
-        <w:t xml:space="preserve">Conkey M. Ritual communication, social elaboration, and the variable trajectories of paleolithic material culture. In: Price TD, Brown JA, editors. Prehistoric hunters-gatherers, Academic Press; 1985, p. 299–323. https://doi.org/</w:t>
+        <w:t xml:space="preserve">Conkey M. Ritual communication, social elaboration, and the variable trajectories of</w:t>
+      </w:r>
+      <w:r>
+        <w:t xml:space="preserve"> </w:t>
+      </w:r>
+      <w:r>
+        <w:t xml:space="preserve">Paleolithic</w:t>
+      </w:r>
+      <w:r>
+        <w:t xml:space="preserve"> </w:t>
+      </w:r>
+      <w:r>
+        <w:t xml:space="preserve">material culture. In: Price TD, Brown JA, editors. Prehistoric hunters-gatherers, Academic Press; 1985, p. 299–323. https://doi.org/</w:t>
       </w:r>
       <w:hyperlink r:id="rId169">
         <w:r>
@@ -7073,7 +8095,16 @@
         <w:t xml:space="preserve">	</w:t>
       </w:r>
       <w:r>
-        <w:t xml:space="preserve">Conkey M. Style and information in cultural evolution: Toward a predictive model for the paleolithic. Social archaeology: Beyond subsistence and dating, New York: Academic Press; 1978, p. 61–85.</w:t>
+        <w:t xml:space="preserve">Conkey M. Style and information in cultural evolution: Toward a predictive model for the</w:t>
+      </w:r>
+      <w:r>
+        <w:t xml:space="preserve"> </w:t>
+      </w:r>
+      <w:r>
+        <w:t xml:space="preserve">Paleolithic</w:t>
+      </w:r>
+      <w:r>
+        <w:t xml:space="preserve">. Social archaeology: Beyond subsistence and dating, New York: Academic Press; 1978, p. 61–85.</w:t>
       </w:r>
     </w:p>
     <w:bookmarkEnd w:id="171"/>
@@ -7386,7 +8417,31 @@
         <w:t xml:space="preserve">	</w:t>
       </w:r>
       <w:r>
-        <w:t xml:space="preserve">Romano V, Lozano S, Fernández-López de Pablo J. Reconstructing social networks of late glacial and holocene hunter–gatherers to understand cultural evolution. Philosophical Transactions of the Royal Society B 2022;377. https://doi.org/</w:t>
+        <w:t xml:space="preserve">Romano V, Lozano S, Fernández-López de Pablo J. Reconstructing social networks of</w:t>
+      </w:r>
+      <w:r>
+        <w:t xml:space="preserve"> </w:t>
+      </w:r>
+      <w:r>
+        <w:t xml:space="preserve">Late Glacial</w:t>
+      </w:r>
+      <w:r>
+        <w:t xml:space="preserve"> </w:t>
+      </w:r>
+      <w:r>
+        <w:t xml:space="preserve">and</w:t>
+      </w:r>
+      <w:r>
+        <w:t xml:space="preserve"> </w:t>
+      </w:r>
+      <w:r>
+        <w:t xml:space="preserve">Holocene</w:t>
+      </w:r>
+      <w:r>
+        <w:t xml:space="preserve"> </w:t>
+      </w:r>
+      <w:r>
+        <w:t xml:space="preserve">hunter–gatherers to understand cultural evolution. Philosophical Transactions of the Royal Society B 2022;377. https://doi.org/</w:t>
       </w:r>
       <w:hyperlink r:id="rId189">
         <w:r>
@@ -7416,7 +8471,16 @@
         <w:t xml:space="preserve">	</w:t>
       </w:r>
       <w:r>
-        <w:t xml:space="preserve">Kelly P. Comparing australian message sticks and sequentially marked objects of the upper palaeolithic: Problems and opportunities. Topics in Cognitive Science 2024.</w:t>
+        <w:t xml:space="preserve">Kelly P. Comparing australian message sticks and sequentially marked objects of the</w:t>
+      </w:r>
+      <w:r>
+        <w:t xml:space="preserve"> </w:t>
+      </w:r>
+      <w:r>
+        <w:t xml:space="preserve">Upper Palaeolithic</w:t>
+      </w:r>
+      <w:r>
+        <w:t xml:space="preserve">: Problems and opportunities. Topics in Cognitive Science 2024.</w:t>
       </w:r>
       <w:r>
         <w:t xml:space="preserve"> </w:t>
@@ -7515,7 +8579,40 @@
         <w:t xml:space="preserve">	</w:t>
       </w:r>
       <w:r>
-        <w:t xml:space="preserve">Iizuka F, Ferguson JR, Izuho M. Late pleistocene pottery production and exchange: Provenance studies of hunter-gatherer wares from southern kyushu, japan by neutron activation analysis. PLOS ONE 2022;17:e0265329.</w:t>
+        <w:t xml:space="preserve">Iizuka F, Ferguson JR, Izuho M.</w:t>
+      </w:r>
+      <w:r>
+        <w:t xml:space="preserve"> </w:t>
+      </w:r>
+      <w:r>
+        <w:t xml:space="preserve">Late Pleistocene</w:t>
+      </w:r>
+      <w:r>
+        <w:t xml:space="preserve"> </w:t>
+      </w:r>
+      <w:r>
+        <w:t xml:space="preserve">pottery production and exchange: Provenance studies of hunter-gatherer wares from southern</w:t>
+      </w:r>
+      <w:r>
+        <w:t xml:space="preserve"> </w:t>
+      </w:r>
+      <w:r>
+        <w:t xml:space="preserve">Kyushu</w:t>
+      </w:r>
+      <w:r>
+        <w:t xml:space="preserve">,</w:t>
+      </w:r>
+      <w:r>
+        <w:t xml:space="preserve"> </w:t>
+      </w:r>
+      <w:r>
+        <w:t xml:space="preserve">Japan</w:t>
+      </w:r>
+      <w:r>
+        <w:t xml:space="preserve"> </w:t>
+      </w:r>
+      <w:r>
+        <w:t xml:space="preserve">by neutron activation analysis. PLOS ONE 2022;17:e0265329.</w:t>
       </w:r>
       <w:r>
         <w:t xml:space="preserve"> </w:t>
@@ -7581,7 +8678,40 @@
         <w:t xml:space="preserve">	</w:t>
       </w:r>
       <w:r>
-        <w:t xml:space="preserve">Maher LA, Conkey M. Homes for hunters?: Exploring the concept of home at hunter-gatherer sites in upper paleolithic europe and epipaleolithic southwest asia. Current Anthropology 2019;60:91–137.</w:t>
+        <w:t xml:space="preserve">Maher LA, Conkey M. Homes for hunters?: Exploring the concept of home at hunter-gatherer sites in</w:t>
+      </w:r>
+      <w:r>
+        <w:t xml:space="preserve"> </w:t>
+      </w:r>
+      <w:r>
+        <w:t xml:space="preserve">Upper Paleolithic</w:t>
+      </w:r>
+      <w:r>
+        <w:t xml:space="preserve"> </w:t>
+      </w:r>
+      <w:r>
+        <w:t xml:space="preserve">Europe</w:t>
+      </w:r>
+      <w:r>
+        <w:t xml:space="preserve"> </w:t>
+      </w:r>
+      <w:r>
+        <w:t xml:space="preserve">and</w:t>
+      </w:r>
+      <w:r>
+        <w:t xml:space="preserve"> </w:t>
+      </w:r>
+      <w:r>
+        <w:t xml:space="preserve">Epipaleolithic</w:t>
+      </w:r>
+      <w:r>
+        <w:t xml:space="preserve"> </w:t>
+      </w:r>
+      <w:r>
+        <w:t xml:space="preserve">Southwest Asia</w:t>
+      </w:r>
+      <w:r>
+        <w:t xml:space="preserve">. Current Anthropology 2019;60:91–137.</w:t>
       </w:r>
       <w:r>
         <w:t xml:space="preserve"> </w:t>
@@ -7614,7 +8744,28 @@
         <w:t xml:space="preserve">	</w:t>
       </w:r>
       <w:r>
-        <w:t xml:space="preserve">Bahn PG. Inter-site and inter-regional links during the upper palaeolithic: The pyrenean evidence. Oxford Journal of Archaeology 1982;1:247–68.</w:t>
+        <w:t xml:space="preserve">Bahn PG. Inter-site and inter-regional links during the</w:t>
+      </w:r>
+      <w:r>
+        <w:t xml:space="preserve"> </w:t>
+      </w:r>
+      <w:r>
+        <w:t xml:space="preserve">Upper Palaeolithic</w:t>
+      </w:r>
+      <w:r>
+        <w:t xml:space="preserve">: The</w:t>
+      </w:r>
+      <w:r>
+        <w:t xml:space="preserve"> </w:t>
+      </w:r>
+      <w:r>
+        <w:t xml:space="preserve">Pyrenean</w:t>
+      </w:r>
+      <w:r>
+        <w:t xml:space="preserve"> </w:t>
+      </w:r>
+      <w:r>
+        <w:t xml:space="preserve">evidence. Oxford Journal of Archaeology 1982;1:247–68.</w:t>
       </w:r>
     </w:p>
     <w:bookmarkEnd w:id="203"/>
@@ -7633,7 +8784,43 @@
         <w:t xml:space="preserve">	</w:t>
       </w:r>
       <w:r>
-        <w:t xml:space="preserve">Bourdier C. Rock art and social geography in the upper paleolithic. Contribution to the socio-cultural function of the roc-aux-sorciers rock-shelter (angles-sur-l’anglin, france) from the viewpoint of its sculpted frieze. Journal of Anthropological Archaeology 2013;32:368–82.</w:t>
+        <w:t xml:space="preserve">Bourdier C. Rock art and social geography in the</w:t>
+      </w:r>
+      <w:r>
+        <w:t xml:space="preserve"> </w:t>
+      </w:r>
+      <w:r>
+        <w:t xml:space="preserve">Upper Paleolithic</w:t>
+      </w:r>
+      <w:r>
+        <w:t xml:space="preserve">. Contribution to the socio-cultural function of the</w:t>
+      </w:r>
+      <w:r>
+        <w:t xml:space="preserve"> </w:t>
+      </w:r>
+      <w:r>
+        <w:t xml:space="preserve">Roc-aux-Sorciers</w:t>
+      </w:r>
+      <w:r>
+        <w:t xml:space="preserve"> </w:t>
+      </w:r>
+      <w:r>
+        <w:t xml:space="preserve">rock-shelter (</w:t>
+      </w:r>
+      <w:r>
+        <w:t xml:space="preserve">Angles-sur-l’Anglin</w:t>
+      </w:r>
+      <w:r>
+        <w:t xml:space="preserve">,</w:t>
+      </w:r>
+      <w:r>
+        <w:t xml:space="preserve"> </w:t>
+      </w:r>
+      <w:r>
+        <w:t xml:space="preserve">France</w:t>
+      </w:r>
+      <w:r>
+        <w:t xml:space="preserve">) from the viewpoint of its sculpted frieze. Journal of Anthropological Archaeology 2013;32:368–82.</w:t>
       </w:r>
       <w:r>
         <w:t xml:space="preserve"> </w:t>
@@ -7699,7 +8886,19 @@
         <w:t xml:space="preserve">	</w:t>
       </w:r>
       <w:r>
-        <w:t xml:space="preserve">White R. Rethinking the middle/upper paleolithic transition. Current Anthropology 1992;33:85–108.</w:t>
+        <w:t xml:space="preserve">White R. Rethinking the</w:t>
+      </w:r>
+      <w:r>
+        <w:t xml:space="preserve"> </w:t>
+      </w:r>
+      <w:r>
+        <w:t xml:space="preserve">Middle/Upper Paleolithic</w:t>
+      </w:r>
+      <w:r>
+        <w:t xml:space="preserve"> </w:t>
+      </w:r>
+      <w:r>
+        <w:t xml:space="preserve">transition. Current Anthropology 1992;33:85–108.</w:t>
       </w:r>
     </w:p>
     <w:bookmarkEnd w:id="208"/>
@@ -7718,7 +8917,31 @@
         <w:t xml:space="preserve">	</w:t>
       </w:r>
       <w:r>
-        <w:t xml:space="preserve">Soffer O, Adovasio JM, Enloe JG, Audouze F, Zubrow EBW. The roles of perishable technologies in upper paleolithic lives. The magdalenian household, SUNY Press; 2010, p. 235–44.</w:t>
+        <w:t xml:space="preserve">Soffer O, Adovasio JM, Enloe JG, Audouze F, Zubrow EBW. The roles of perishable technologies in</w:t>
+      </w:r>
+      <w:r>
+        <w:t xml:space="preserve"> </w:t>
+      </w:r>
+      <w:r>
+        <w:t xml:space="preserve">Upper Paleolithic</w:t>
+      </w:r>
+      <w:r>
+        <w:t xml:space="preserve"> </w:t>
+      </w:r>
+      <w:r>
+        <w:t xml:space="preserve">lives. The</w:t>
+      </w:r>
+      <w:r>
+        <w:t xml:space="preserve"> </w:t>
+      </w:r>
+      <w:r>
+        <w:t xml:space="preserve">Magdalenian</w:t>
+      </w:r>
+      <w:r>
+        <w:t xml:space="preserve"> </w:t>
+      </w:r>
+      <w:r>
+        <w:t xml:space="preserve">household, SUNY Press; 2010, p. 235–44.</w:t>
       </w:r>
     </w:p>
     <w:bookmarkEnd w:id="209"/>
@@ -7747,7 +8970,43 @@
           <w:rPr>
             <w:rStyle w:val="Hyperlink"/>
           </w:rPr>
-          <w:t xml:space="preserve">Alternative interpretations of the late upper paleolithic in central europe</w:t>
+          <w:t xml:space="preserve">Alternative interpretations of the</w:t>
+        </w:r>
+        <w:r>
+          <w:rPr>
+            <w:rStyle w:val="Hyperlink"/>
+          </w:rPr>
+          <w:t xml:space="preserve"> </w:t>
+        </w:r>
+        <w:r>
+          <w:rPr>
+            <w:rStyle w:val="Hyperlink"/>
+          </w:rPr>
+          <w:t xml:space="preserve">Late Upper Paleolithic</w:t>
+        </w:r>
+        <w:r>
+          <w:rPr>
+            <w:rStyle w:val="Hyperlink"/>
+          </w:rPr>
+          <w:t xml:space="preserve"> </w:t>
+        </w:r>
+        <w:r>
+          <w:rPr>
+            <w:rStyle w:val="Hyperlink"/>
+          </w:rPr>
+          <w:t xml:space="preserve">in</w:t>
+        </w:r>
+        <w:r>
+          <w:rPr>
+            <w:rStyle w:val="Hyperlink"/>
+          </w:rPr>
+          <w:t xml:space="preserve"> </w:t>
+        </w:r>
+        <w:r>
+          <w:rPr>
+            <w:rStyle w:val="Hyperlink"/>
+          </w:rPr>
+          <w:t xml:space="preserve">Central Europe</w:t>
         </w:r>
       </w:hyperlink>
       <w:r>
@@ -7836,7 +9095,28 @@
         <w:t xml:space="preserve">	</w:t>
       </w:r>
       <w:r>
-        <w:t xml:space="preserve">Shao Y, Wegener C, Klein K, Schmidt I, Weniger G-C. Reconstruction of human dispersal during aurignacian on pan-european scale. Nature Communications 2024;15:7406.</w:t>
+        <w:t xml:space="preserve">Shao Y, Wegener C, Klein K, Schmidt I, Weniger G-C. Reconstruction of human dispersal during</w:t>
+      </w:r>
+      <w:r>
+        <w:t xml:space="preserve"> </w:t>
+      </w:r>
+      <w:r>
+        <w:t xml:space="preserve">Aurignacian</w:t>
+      </w:r>
+      <w:r>
+        <w:t xml:space="preserve"> </w:t>
+      </w:r>
+      <w:r>
+        <w:t xml:space="preserve">on pan-</w:t>
+      </w:r>
+      <w:r>
+        <w:t xml:space="preserve">European</w:t>
+      </w:r>
+      <w:r>
+        <w:t xml:space="preserve"> </w:t>
+      </w:r>
+      <w:r>
+        <w:t xml:space="preserve">scale. Nature Communications 2024;15:7406.</w:t>
       </w:r>
       <w:r>
         <w:t xml:space="preserve"> </w:t>
@@ -7921,7 +9201,19 @@
         <w:t xml:space="preserve">	</w:t>
       </w:r>
       <w:r>
-        <w:t xml:space="preserve">McDonald J, Veth P, Lilley I. Rock art and social identity: A comparison of holocene graphic systems in arid and fertile environments. Archaeology of oceania: Australia and the pacific islands, Malden, Mass: Blackwell Publishing; 2006, p. 96–115.</w:t>
+        <w:t xml:space="preserve">McDonald J, Veth P, Lilley I. Rock art and social identity: A comparison of</w:t>
+      </w:r>
+      <w:r>
+        <w:t xml:space="preserve"> </w:t>
+      </w:r>
+      <w:r>
+        <w:t xml:space="preserve">Holocene</w:t>
+      </w:r>
+      <w:r>
+        <w:t xml:space="preserve"> </w:t>
+      </w:r>
+      <w:r>
+        <w:t xml:space="preserve">graphic systems in arid and fertile environments. Archaeology of oceania: Australia and the pacific islands, Malden, Mass: Blackwell Publishing; 2006, p. 96–115.</w:t>
       </w:r>
     </w:p>
     <w:bookmarkEnd w:id="221"/>
@@ -7980,7 +9272,43 @@
           <w:rPr>
             <w:rStyle w:val="Hyperlink"/>
           </w:rPr>
-          <w:t xml:space="preserve">Art as information: Explaining upper palaeolithic art in western europe</w:t>
+          <w:t xml:space="preserve">Art as information: Explaining</w:t>
+        </w:r>
+        <w:r>
+          <w:rPr>
+            <w:rStyle w:val="Hyperlink"/>
+          </w:rPr>
+          <w:t xml:space="preserve"> </w:t>
+        </w:r>
+        <w:r>
+          <w:rPr>
+            <w:rStyle w:val="Hyperlink"/>
+          </w:rPr>
+          <w:t xml:space="preserve">Upper Palaeolithic</w:t>
+        </w:r>
+        <w:r>
+          <w:rPr>
+            <w:rStyle w:val="Hyperlink"/>
+          </w:rPr>
+          <w:t xml:space="preserve"> </w:t>
+        </w:r>
+        <w:r>
+          <w:rPr>
+            <w:rStyle w:val="Hyperlink"/>
+          </w:rPr>
+          <w:t xml:space="preserve">art in</w:t>
+        </w:r>
+        <w:r>
+          <w:rPr>
+            <w:rStyle w:val="Hyperlink"/>
+          </w:rPr>
+          <w:t xml:space="preserve"> </w:t>
+        </w:r>
+        <w:r>
+          <w:rPr>
+            <w:rStyle w:val="Hyperlink"/>
+          </w:rPr>
+          <w:t xml:space="preserve">Western Europe</w:t>
         </w:r>
       </w:hyperlink>
       <w:r>
@@ -8093,7 +9421,28 @@
         <w:t xml:space="preserve">	</w:t>
       </w:r>
       <w:r>
-        <w:t xml:space="preserve">Kovacevic M, Shennan S, Vanhaeren M, d’Errico F, Thomas MG. Simulating geographical variation in material culture: Were early modern humans in europe ethnically structured? In: Mesoudi A, Aoki K, editors. Learning strategies and cultural evolution during the palaeolithic, Springer Japan; 2015, p. 103–20.</w:t>
+        <w:t xml:space="preserve">Kovacevic M, Shennan S, Vanhaeren M, d’Errico F, Thomas MG. Simulating geographical variation in material culture: Were early modern humans in</w:t>
+      </w:r>
+      <w:r>
+        <w:t xml:space="preserve"> </w:t>
+      </w:r>
+      <w:r>
+        <w:t xml:space="preserve">Europe</w:t>
+      </w:r>
+      <w:r>
+        <w:t xml:space="preserve"> </w:t>
+      </w:r>
+      <w:r>
+        <w:t xml:space="preserve">ethnically structured? In: Mesoudi A, Aoki K, editors. Learning strategies and cultural evolution during the</w:t>
+      </w:r>
+      <w:r>
+        <w:t xml:space="preserve"> </w:t>
+      </w:r>
+      <w:r>
+        <w:t xml:space="preserve">Palaeolithic</w:t>
+      </w:r>
+      <w:r>
+        <w:t xml:space="preserve">, Springer Japan; 2015, p. 103–20.</w:t>
       </w:r>
       <w:r>
         <w:t xml:space="preserve"> </w:t>
@@ -8297,7 +9646,19 @@
         <w:t xml:space="preserve">	</w:t>
       </w:r>
       <w:r>
-        <w:t xml:space="preserve">Bacon B, Khatiri A, Palmer J, Freeth T, Pettitt P, Kentridge RW. An upper palaeolithic proto-writing system and phenological calendar. Cambridge Archaeological Journal 2023;100:371–89.</w:t>
+        <w:t xml:space="preserve">Bacon B, Khatiri A, Palmer J, Freeth T, Pettitt P, Kentridge RW. An</w:t>
+      </w:r>
+      <w:r>
+        <w:t xml:space="preserve"> </w:t>
+      </w:r>
+      <w:r>
+        <w:t xml:space="preserve">Upper Palaeolithic</w:t>
+      </w:r>
+      <w:r>
+        <w:t xml:space="preserve"> </w:t>
+      </w:r>
+      <w:r>
+        <w:t xml:space="preserve">proto-writing system and phenological calendar. Cambridge Archaeological Journal 2023;100:371–89.</w:t>
       </w:r>
     </w:p>
     <w:bookmarkEnd w:id="242"/>
@@ -8316,7 +9677,19 @@
         <w:t xml:space="preserve">	</w:t>
       </w:r>
       <w:r>
-        <w:t xml:space="preserve">d’Errico F, Courtenay LA, Núñez R, Santos da Rosa N, Sproat R, Blasi D. Inferring conventional sign systems from paleolithic engravings: Methodological and theoretical challenges. SSRN Electronic Journal 2026.</w:t>
+        <w:t xml:space="preserve">d’Errico F, Courtenay LA, Núñez R, Santos da Rosa N, Sproat R, Blasi D. Inferring conventional sign systems from</w:t>
+      </w:r>
+      <w:r>
+        <w:t xml:space="preserve"> </w:t>
+      </w:r>
+      <w:r>
+        <w:t xml:space="preserve">Paleolithic</w:t>
+      </w:r>
+      <w:r>
+        <w:t xml:space="preserve"> </w:t>
+      </w:r>
+      <w:r>
+        <w:t xml:space="preserve">engravings: Methodological and theoretical challenges. SSRN Electronic Journal 2026.</w:t>
       </w:r>
       <w:r>
         <w:t xml:space="preserve"> </w:t>
@@ -8355,13 +9728,37 @@
         <w:t xml:space="preserve"> </w:t>
       </w:r>
       <w:r>
-        <w:t xml:space="preserve">“An upper palaeolithic proto-writing system and phenological calendar”</w:t>
-      </w:r>
-      <w:r>
-        <w:t xml:space="preserve"> </w:t>
-      </w:r>
-      <w:r>
-        <w:t xml:space="preserve">by bennett bacon et al. (2023). Journal of Paleolithic Archaeology 2023;6:32.</w:t>
+        <w:t xml:space="preserve">“An</w:t>
+      </w:r>
+      <w:r>
+        <w:t xml:space="preserve"> </w:t>
+      </w:r>
+      <w:r>
+        <w:t xml:space="preserve">Upper Palaeolithic</w:t>
+      </w:r>
+      <w:r>
+        <w:t xml:space="preserve"> </w:t>
+      </w:r>
+      <w:r>
+        <w:t xml:space="preserve">proto-writing system and phenological calendar”</w:t>
+      </w:r>
+      <w:r>
+        <w:t xml:space="preserve"> </w:t>
+      </w:r>
+      <w:r>
+        <w:t xml:space="preserve">by</w:t>
+      </w:r>
+      <w:r>
+        <w:t xml:space="preserve"> </w:t>
+      </w:r>
+      <w:r>
+        <w:t xml:space="preserve">Bennett Bacon</w:t>
+      </w:r>
+      <w:r>
+        <w:t xml:space="preserve"> </w:t>
+      </w:r>
+      <w:r>
+        <w:t xml:space="preserve">et al. (2023). Journal of Paleolithic Archaeology 2023;6:32.</w:t>
       </w:r>
       <w:r>
         <w:t xml:space="preserve"> </w:t>
@@ -8394,7 +9791,19 @@
         <w:t xml:space="preserve">	</w:t>
       </w:r>
       <w:r>
-        <w:t xml:space="preserve">Magli G. The alleged phenological calendar in palaeolithic art: Critical analysis from the viewpoint of statistics and cultural astronomy. Mind 2024;133:1–15.</w:t>
+        <w:t xml:space="preserve">Magli G. The alleged phenological calendar in</w:t>
+      </w:r>
+      <w:r>
+        <w:t xml:space="preserve"> </w:t>
+      </w:r>
+      <w:r>
+        <w:t xml:space="preserve">Palaeolithic</w:t>
+      </w:r>
+      <w:r>
+        <w:t xml:space="preserve"> </w:t>
+      </w:r>
+      <w:r>
+        <w:t xml:space="preserve">art: Critical analysis from the viewpoint of statistics and cultural astronomy. Mind 2024;133:1–15.</w:t>
       </w:r>
       <w:r>
         <w:t xml:space="preserve"> </w:t>
@@ -8427,7 +9836,19 @@
         <w:t xml:space="preserve">	</w:t>
       </w:r>
       <w:r>
-        <w:t xml:space="preserve">Nowell A, Bahn P, Quellec J-L. Evaluating the evidence for lunar calendars in upper palaeolithic parietal art. Cambridge Archaeological Journal 2024:1–18.</w:t>
+        <w:t xml:space="preserve">Nowell A, Bahn P, Quellec J-L. Evaluating the evidence for lunar calendars in</w:t>
+      </w:r>
+      <w:r>
+        <w:t xml:space="preserve"> </w:t>
+      </w:r>
+      <w:r>
+        <w:t xml:space="preserve">Upper Palaeolithic</w:t>
+      </w:r>
+      <w:r>
+        <w:t xml:space="preserve"> </w:t>
+      </w:r>
+      <w:r>
+        <w:t xml:space="preserve">parietal art. Cambridge Archaeological Journal 2024:1–18.</w:t>
       </w:r>
       <w:r>
         <w:t xml:space="preserve"> </w:t>
@@ -8460,7 +9881,46 @@
         <w:t xml:space="preserve">	</w:t>
       </w:r>
       <w:r>
-        <w:t xml:space="preserve">Horiuchi S, Takakura J. Modeling learning strategies and the expansion of the social network in the beginning of upper palaeolithic europe: Analysis by agent-based simulation. In: Nishiaki Y, Jöris O, editors. Learning among neanderthals and palaeolithic modern humans: Archaeological evidence, Springer Nature Singapore; 2019, p. 179–91.</w:t>
+        <w:t xml:space="preserve">Horiuchi S, Takakura J. Modeling learning strategies and the expansion of the social network in the beginning of</w:t>
+      </w:r>
+      <w:r>
+        <w:t xml:space="preserve"> </w:t>
+      </w:r>
+      <w:r>
+        <w:t xml:space="preserve">Upper Palaeolithic</w:t>
+      </w:r>
+      <w:r>
+        <w:t xml:space="preserve"> </w:t>
+      </w:r>
+      <w:r>
+        <w:t xml:space="preserve">Europe</w:t>
+      </w:r>
+      <w:r>
+        <w:t xml:space="preserve">: Analysis by agent-based simulation. In: Nishiaki Y, Jöris O, editors. Learning among</w:t>
+      </w:r>
+      <w:r>
+        <w:t xml:space="preserve"> </w:t>
+      </w:r>
+      <w:r>
+        <w:t xml:space="preserve">Neanderthals</w:t>
+      </w:r>
+      <w:r>
+        <w:t xml:space="preserve"> </w:t>
+      </w:r>
+      <w:r>
+        <w:t xml:space="preserve">and</w:t>
+      </w:r>
+      <w:r>
+        <w:t xml:space="preserve"> </w:t>
+      </w:r>
+      <w:r>
+        <w:t xml:space="preserve">Palaeolithic</w:t>
+      </w:r>
+      <w:r>
+        <w:t xml:space="preserve"> </w:t>
+      </w:r>
+      <w:r>
+        <w:t xml:space="preserve">modern humans: Archaeological evidence, Springer Nature Singapore; 2019, p. 179–91.</w:t>
       </w:r>
       <w:r>
         <w:t xml:space="preserve"> </w:t>
@@ -8493,7 +9953,28 @@
         <w:t xml:space="preserve">	</w:t>
       </w:r>
       <w:r>
-        <w:t xml:space="preserve">Rogers L. Human-material interaction in the aurignacian of europe, 35,000-27,000 BP: An analysis of marine shell ornament distribution. PhD thesis. University of Victoria, 2013.</w:t>
+        <w:t xml:space="preserve">Rogers L. Human-material interaction in the</w:t>
+      </w:r>
+      <w:r>
+        <w:t xml:space="preserve"> </w:t>
+      </w:r>
+      <w:r>
+        <w:t xml:space="preserve">Aurignacian</w:t>
+      </w:r>
+      <w:r>
+        <w:t xml:space="preserve"> </w:t>
+      </w:r>
+      <w:r>
+        <w:t xml:space="preserve">of</w:t>
+      </w:r>
+      <w:r>
+        <w:t xml:space="preserve"> </w:t>
+      </w:r>
+      <w:r>
+        <w:t xml:space="preserve">Europe</w:t>
+      </w:r>
+      <w:r>
+        <w:t xml:space="preserve">, 35,000-27,000 BP: An analysis of marine shell ornament distribution. PhD thesis. University of Victoria, 2013.</w:t>
       </w:r>
     </w:p>
     <w:bookmarkEnd w:id="253"/>
@@ -8512,7 +9993,49 @@
         <w:t xml:space="preserve">	</w:t>
       </w:r>
       <w:r>
-        <w:t xml:space="preserve">Golovanova LV, Doronichev VB, Doronicheva EV, Sapega VF, Shackley MS. Long-distance contacts and social networks of the upper palaeolithic humans in the north-western caucasus (on data from mezmaiskaya cave, russia). Journal of Archaeological Science: Reports 2021;39:103118. https://doi.org/</w:t>
+        <w:t xml:space="preserve">Golovanova LV, Doronichev VB, Doronicheva EV, Sapega VF, Shackley MS. Long-distance contacts and social networks of the</w:t>
+      </w:r>
+      <w:r>
+        <w:t xml:space="preserve"> </w:t>
+      </w:r>
+      <w:r>
+        <w:t xml:space="preserve">Upper Palaeolithic</w:t>
+      </w:r>
+      <w:r>
+        <w:t xml:space="preserve"> </w:t>
+      </w:r>
+      <w:r>
+        <w:t xml:space="preserve">humans in the</w:t>
+      </w:r>
+      <w:r>
+        <w:t xml:space="preserve"> </w:t>
+      </w:r>
+      <w:r>
+        <w:t xml:space="preserve">North-Western Caucasus</w:t>
+      </w:r>
+      <w:r>
+        <w:t xml:space="preserve"> </w:t>
+      </w:r>
+      <w:r>
+        <w:t xml:space="preserve">(on data from</w:t>
+      </w:r>
+      <w:r>
+        <w:t xml:space="preserve"> </w:t>
+      </w:r>
+      <w:r>
+        <w:t xml:space="preserve">Mezmaiskaya Cave</w:t>
+      </w:r>
+      <w:r>
+        <w:t xml:space="preserve">,</w:t>
+      </w:r>
+      <w:r>
+        <w:t xml:space="preserve"> </w:t>
+      </w:r>
+      <w:r>
+        <w:t xml:space="preserve">Russia</w:t>
+      </w:r>
+      <w:r>
+        <w:t xml:space="preserve">). Journal of Archaeological Science: Reports 2021;39:103118. https://doi.org/</w:t>
       </w:r>
       <w:hyperlink r:id="rId254">
         <w:r>
@@ -8542,7 +10065,19 @@
         <w:t xml:space="preserve">	</w:t>
       </w:r>
       <w:r>
-        <w:t xml:space="preserve">Gamble C. Interaction and alliance in palaeolithic society. Man 1982;17:92–107.</w:t>
+        <w:t xml:space="preserve">Gamble C. Interaction and alliance in</w:t>
+      </w:r>
+      <w:r>
+        <w:t xml:space="preserve"> </w:t>
+      </w:r>
+      <w:r>
+        <w:t xml:space="preserve">Palaeolithic</w:t>
+      </w:r>
+      <w:r>
+        <w:t xml:space="preserve"> </w:t>
+      </w:r>
+      <w:r>
+        <w:t xml:space="preserve">society. Man 1982;17:92–107.</w:t>
       </w:r>
       <w:r>
         <w:t xml:space="preserve"> </w:t>
@@ -8575,7 +10110,31 @@
         <w:t xml:space="preserve">	</w:t>
       </w:r>
       <w:r>
-        <w:t xml:space="preserve">Greenbaum G, Friesem DE, Hovers E, Feldman MW, Kolodny O. Was inter-population connectivity of neanderthals and modern humans the driver of the upper paleolithic transition rather than its product? Quaternary Science Reviews 2019;217:316–29. https://doi.org/</w:t>
+        <w:t xml:space="preserve">Greenbaum G, Friesem DE, Hovers E, Feldman MW, Kolodny O. Was inter-population connectivity of</w:t>
+      </w:r>
+      <w:r>
+        <w:t xml:space="preserve"> </w:t>
+      </w:r>
+      <w:r>
+        <w:t xml:space="preserve">Neanderthals</w:t>
+      </w:r>
+      <w:r>
+        <w:t xml:space="preserve"> </w:t>
+      </w:r>
+      <w:r>
+        <w:t xml:space="preserve">and modern humans the driver of the</w:t>
+      </w:r>
+      <w:r>
+        <w:t xml:space="preserve"> </w:t>
+      </w:r>
+      <w:r>
+        <w:t xml:space="preserve">Upper Paleolithic</w:t>
+      </w:r>
+      <w:r>
+        <w:t xml:space="preserve"> </w:t>
+      </w:r>
+      <w:r>
+        <w:t xml:space="preserve">transition rather than its product? Quaternary Science Reviews 2019;217:316–29. https://doi.org/</w:t>
       </w:r>
       <w:hyperlink r:id="rId258">
         <w:r>
@@ -8737,7 +10296,19 @@
         <w:t xml:space="preserve">	</w:t>
       </w:r>
       <w:r>
-        <w:t xml:space="preserve">Gravel-Miguel C, Coward F. Paleolithic social networks and behavioral modernity. The oxford handbook of archaeological network research, Oxford University Press; 2023.</w:t>
+        <w:t xml:space="preserve">Gravel-Miguel C, Coward F.</w:t>
+      </w:r>
+      <w:r>
+        <w:t xml:space="preserve"> </w:t>
+      </w:r>
+      <w:r>
+        <w:t xml:space="preserve">Paleolithic</w:t>
+      </w:r>
+      <w:r>
+        <w:t xml:space="preserve"> </w:t>
+      </w:r>
+      <w:r>
+        <w:t xml:space="preserve">social networks and behavioral modernity. The oxford handbook of archaeological network research, Oxford University Press; 2023.</w:t>
       </w:r>
       <w:r>
         <w:t xml:space="preserve"> </w:t>
@@ -8770,7 +10341,19 @@
         <w:t xml:space="preserve">	</w:t>
       </w:r>
       <w:r>
-        <w:t xml:space="preserve">Von Petzinger G. Making the abstract concrete: The place of geometric signs in french upper paleolithic parietal art. Master of Arts in Anthropology. University of Victoria, 2009.</w:t>
+        <w:t xml:space="preserve">Von Petzinger G. Making the abstract concrete: The place of geometric signs in french</w:t>
+      </w:r>
+      <w:r>
+        <w:t xml:space="preserve"> </w:t>
+      </w:r>
+      <w:r>
+        <w:t xml:space="preserve">Upper Paleolithic</w:t>
+      </w:r>
+      <w:r>
+        <w:t xml:space="preserve"> </w:t>
+      </w:r>
+      <w:r>
+        <w:t xml:space="preserve">parietal art. Master of Arts in Anthropology. University of Victoria, 2009.</w:t>
       </w:r>
     </w:p>
     <w:bookmarkEnd w:id="270"/>
@@ -9854,6 +11437,11 @@
     <w:pPr>
       <w:spacing w:after="36" w:before="36"/>
     </w:pPr>
+    <w:rPr>
+      <w:rFonts w:ascii="Arial" w:cs="Arial" w:hAnsi="Arial"/>
+      <w:sz w:val="20"/>
+      <w:szCs w:val="20"/>
+    </w:rPr>
   </w:style>
   <w:style w:styleId="Title" w:type="paragraph">
     <w:name w:val="Title"/>

</xml_diff>

<commit_message>
colours on seriation plot
</commit_message>
<xml_diff>
--- a/paper/paper.docx
+++ b/paper/paper.docx
@@ -179,7 +179,7 @@
         <w:t xml:space="preserve"> </w:t>
       </w:r>
       <w:r>
-        <w:t xml:space="preserve">5,</w:t>
+        <w:t xml:space="preserve">6,</w:t>
       </w:r>
       <w:r>
         <w:t xml:space="preserve"> </w:t>
@@ -190,84 +190,70 @@
     </w:p>
     <w:p>
       <w:pPr>
-        <w:pStyle w:val="AbstractTitle"/>
-      </w:pPr>
-      <w:r>
-        <w:t xml:space="preserve">Abstract</w:t>
-      </w:r>
-    </w:p>
-    <w:p>
-      <w:pPr>
-        <w:pStyle w:val="Abstract"/>
-      </w:pPr>
-      <w:r>
-        <w:t xml:space="preserve">The</w:t>
-      </w:r>
-      <w:r>
-        <w:t xml:space="preserve"> </w:t>
-      </w:r>
-      <w:r>
-        <w:t xml:space="preserve">Aurignacian</w:t>
-      </w:r>
-      <w:r>
-        <w:t xml:space="preserve"> </w:t>
-      </w:r>
-      <w:r>
-        <w:t xml:space="preserve">technocomplex</w:t>
-      </w:r>
-      <w:r>
-        <w:t xml:space="preserve"> </w:t>
-      </w:r>
-      <w:r>
-        <w:t xml:space="preserve">(ca.</w:t>
-      </w:r>
-      <w:r>
-        <w:t xml:space="preserve"> </w:t>
-      </w:r>
-      <w:r>
-        <w:t xml:space="preserve">43–30</w:t>
-      </w:r>
-      <w:r>
-        <w:t xml:space="preserve"> </w:t>
-      </w:r>
-      <w:r>
-        <w:t xml:space="preserve">ka</w:t>
-      </w:r>
-      <w:r>
-        <w:t xml:space="preserve"> </w:t>
-      </w:r>
-      <w:r>
-        <w:t xml:space="preserve">BP)</w:t>
-      </w:r>
-      <w:r>
-        <w:t xml:space="preserve"> </w:t>
-      </w:r>
-      <w:r>
-        <w:t xml:space="preserve">marks</w:t>
-      </w:r>
-      <w:r>
-        <w:t xml:space="preserve"> </w:t>
-      </w:r>
-      <w:r>
-        <w:t xml:space="preserve">a</w:t>
-      </w:r>
-      <w:r>
-        <w:t xml:space="preserve"> </w:t>
-      </w:r>
-      <w:r>
-        <w:t xml:space="preserve">pivotal</w:t>
-      </w:r>
-      <w:r>
-        <w:t xml:space="preserve"> </w:t>
-      </w:r>
-      <w:r>
-        <w:t xml:space="preserve">expansion</w:t>
-      </w:r>
-      <w:r>
-        <w:t xml:space="preserve"> </w:t>
-      </w:r>
-      <w:r>
-        <w:t xml:space="preserve">of</w:t>
+        <w:pStyle w:val="FirstParagraph"/>
+      </w:pPr>
+      <w:r>
+        <w:rPr>
+          <w:vertAlign w:val="superscript"/>
+        </w:rPr>
+        <w:t xml:space="preserve">1</w:t>
+      </w:r>
+      <w:r>
+        <w:t xml:space="preserve"> </w:t>
+      </w:r>
+      <w:r>
+        <w:t xml:space="preserve">Department of Anthropology, University of Washington, Seattle, USA</w:t>
+      </w:r>
+      <w:r>
+        <w:br/>
+      </w:r>
+      <w:r>
+        <w:rPr>
+          <w:vertAlign w:val="superscript"/>
+        </w:rPr>
+        <w:t xml:space="preserve">2</w:t>
+      </w:r>
+      <w:r>
+        <w:t xml:space="preserve"> </w:t>
+      </w:r>
+      <w:r>
+        <w:t xml:space="preserve">Scientific Computing and Imaging Institute, University of Utah, Salt Lake City, USA</w:t>
+      </w:r>
+    </w:p>
+    <w:p>
+      <w:pPr>
+        <w:pStyle w:val="BodyText"/>
+      </w:pPr>
+      <w:r>
+        <w:rPr>
+          <w:vertAlign w:val="superscript"/>
+        </w:rPr>
+        <w:t xml:space="preserve">✉</w:t>
+      </w:r>
+      <w:r>
+        <w:t xml:space="preserve"> </w:t>
+      </w:r>
+      <w:r>
+        <w:t xml:space="preserve">Correspondence:</w:t>
+      </w:r>
+      <w:r>
+        <w:t xml:space="preserve"> </w:t>
+      </w:r>
+      <w:hyperlink r:id="rId20">
+        <w:r>
+          <w:rPr>
+            <w:rStyle w:val="Hyperlink"/>
+          </w:rPr>
+          <w:t xml:space="preserve">Ben Marwick &lt;bmarwick@uw.edu&gt;</w:t>
+        </w:r>
+      </w:hyperlink>
+    </w:p>
+    <w:p>
+      <w:pPr>
+        <w:pStyle w:val="BodyText"/>
+      </w:pPr>
+      <w:r>
+        <w:t xml:space="preserve">Abstract: The Aurignacian technocomplex (ca. 43–30 ka BP) marks a pivotal expansion of</w:t>
       </w:r>
       <w:r>
         <w:t xml:space="preserve"> </w:t>
@@ -277,1766 +263,25 @@
           <w:iCs/>
           <w:i/>
         </w:rPr>
-        <w:t xml:space="preserve">Homo</w:t>
-      </w:r>
-      <w:r>
-        <w:rPr>
-          <w:iCs/>
-          <w:i/>
-        </w:rPr>
-        <w:t xml:space="preserve"> </w:t>
-      </w:r>
-      <w:r>
-        <w:rPr>
-          <w:iCs/>
-          <w:i/>
-        </w:rPr>
-        <w:t xml:space="preserve">sapiens</w:t>
-      </w:r>
-      <w:r>
-        <w:t xml:space="preserve"> </w:t>
-      </w:r>
-      <w:r>
-        <w:t xml:space="preserve">into</w:t>
-      </w:r>
-      <w:r>
-        <w:t xml:space="preserve"> </w:t>
-      </w:r>
-      <w:r>
-        <w:t xml:space="preserve">Western</w:t>
-      </w:r>
-      <w:r>
-        <w:t xml:space="preserve"> </w:t>
-      </w:r>
-      <w:r>
-        <w:t xml:space="preserve">Eurasia,</w:t>
-      </w:r>
-      <w:r>
-        <w:t xml:space="preserve"> </w:t>
-      </w:r>
-      <w:r>
-        <w:t xml:space="preserve">yet</w:t>
-      </w:r>
-      <w:r>
-        <w:t xml:space="preserve"> </w:t>
-      </w:r>
-      <w:r>
-        <w:t xml:space="preserve">the</w:t>
-      </w:r>
-      <w:r>
-        <w:t xml:space="preserve"> </w:t>
-      </w:r>
-      <w:r>
-        <w:t xml:space="preserve">evolution</w:t>
-      </w:r>
-      <w:r>
-        <w:t xml:space="preserve"> </w:t>
-      </w:r>
-      <w:r>
-        <w:t xml:space="preserve">of</w:t>
-      </w:r>
-      <w:r>
-        <w:t xml:space="preserve"> </w:t>
-      </w:r>
-      <w:r>
-        <w:t xml:space="preserve">social</w:t>
-      </w:r>
-      <w:r>
-        <w:t xml:space="preserve"> </w:t>
-      </w:r>
-      <w:r>
-        <w:t xml:space="preserve">organization</w:t>
-      </w:r>
-      <w:r>
-        <w:t xml:space="preserve"> </w:t>
-      </w:r>
-      <w:r>
-        <w:t xml:space="preserve">during</w:t>
-      </w:r>
-      <w:r>
-        <w:t xml:space="preserve"> </w:t>
-      </w:r>
-      <w:r>
-        <w:t xml:space="preserve">this</w:t>
-      </w:r>
-      <w:r>
-        <w:t xml:space="preserve"> </w:t>
-      </w:r>
-      <w:r>
-        <w:t xml:space="preserve">transition</w:t>
-      </w:r>
-      <w:r>
-        <w:t xml:space="preserve"> </w:t>
-      </w:r>
-      <w:r>
-        <w:t xml:space="preserve">remains</w:t>
-      </w:r>
-      <w:r>
-        <w:t xml:space="preserve"> </w:t>
-      </w:r>
-      <w:r>
-        <w:t xml:space="preserve">debated.</w:t>
-      </w:r>
-      <w:r>
-        <w:t xml:space="preserve"> </w:t>
-      </w:r>
-      <w:r>
-        <w:t xml:space="preserve">Here</w:t>
-      </w:r>
-      <w:r>
-        <w:t xml:space="preserve"> </w:t>
-      </w:r>
-      <w:r>
-        <w:t xml:space="preserve">we</w:t>
-      </w:r>
-      <w:r>
-        <w:t xml:space="preserve"> </w:t>
-      </w:r>
-      <w:r>
-        <w:t xml:space="preserve">investigate</w:t>
-      </w:r>
-      <w:r>
-        <w:t xml:space="preserve"> </w:t>
-      </w:r>
-      <w:r>
-        <w:t xml:space="preserve">social</w:t>
-      </w:r>
-      <w:r>
-        <w:t xml:space="preserve"> </w:t>
-      </w:r>
-      <w:r>
-        <w:t xml:space="preserve">dynamics</w:t>
-      </w:r>
-      <w:r>
-        <w:t xml:space="preserve"> </w:t>
-      </w:r>
-      <w:r>
-        <w:t xml:space="preserve">through</w:t>
-      </w:r>
-      <w:r>
-        <w:t xml:space="preserve"> </w:t>
-      </w:r>
-      <w:r>
-        <w:t xml:space="preserve">the</w:t>
-      </w:r>
-      <w:r>
-        <w:t xml:space="preserve"> </w:t>
-      </w:r>
-      <w:r>
-        <w:t xml:space="preserve">analysis</w:t>
-      </w:r>
-      <w:r>
-        <w:t xml:space="preserve"> </w:t>
-      </w:r>
-      <w:r>
-        <w:t xml:space="preserve">of</w:t>
-      </w:r>
-      <w:r>
-        <w:t xml:space="preserve"> </w:t>
-      </w:r>
-      <w:r>
-        <w:t xml:space="preserve">geometric</w:t>
-      </w:r>
-      <w:r>
-        <w:t xml:space="preserve"> </w:t>
-      </w:r>
-      <w:r>
-        <w:t xml:space="preserve">signs</w:t>
-      </w:r>
-      <w:r>
-        <w:t xml:space="preserve"> </w:t>
-      </w:r>
-      <w:r>
-        <w:t xml:space="preserve">on</w:t>
-      </w:r>
-      <w:r>
-        <w:t xml:space="preserve"> </w:t>
-      </w:r>
-      <w:r>
-        <w:t xml:space="preserve">mobile</w:t>
-      </w:r>
-      <w:r>
-        <w:t xml:space="preserve"> </w:t>
-      </w:r>
-      <w:r>
-        <w:t xml:space="preserve">objects</w:t>
-      </w:r>
-      <w:r>
-        <w:t xml:space="preserve"> </w:t>
-      </w:r>
-      <w:r>
-        <w:t xml:space="preserve">within</w:t>
-      </w:r>
-      <w:r>
-        <w:t xml:space="preserve"> </w:t>
-      </w:r>
-      <w:r>
-        <w:t xml:space="preserve">a</w:t>
-      </w:r>
-      <w:r>
-        <w:t xml:space="preserve"> </w:t>
-      </w:r>
-      <w:r>
-        <w:t xml:space="preserve">two-phase</w:t>
-      </w:r>
-      <w:r>
-        <w:t xml:space="preserve"> </w:t>
-      </w:r>
-      <w:r>
-        <w:t xml:space="preserve">framework</w:t>
-      </w:r>
-      <w:r>
-        <w:t xml:space="preserve"> </w:t>
-      </w:r>
-      <w:r>
-        <w:t xml:space="preserve">(Aur-P1/Aur-P2;</w:t>
-      </w:r>
-      <w:r>
-        <w:t xml:space="preserve"> </w:t>
-      </w:r>
-      <w:r>
-        <w:t xml:space="preserve">Shao</w:t>
-      </w:r>
-      <w:r>
-        <w:t xml:space="preserve"> </w:t>
-      </w:r>
-      <w:r>
-        <w:t xml:space="preserve">et</w:t>
-      </w:r>
-      <w:r>
-        <w:t xml:space="preserve"> </w:t>
-      </w:r>
-      <w:r>
-        <w:t xml:space="preserve">al. 2021)</w:t>
-      </w:r>
-      <w:r>
-        <w:t xml:space="preserve"> </w:t>
-      </w:r>
-      <w:r>
-        <w:t xml:space="preserve">that</w:t>
-      </w:r>
-      <w:r>
-        <w:t xml:space="preserve"> </w:t>
-      </w:r>
-      <w:r>
-        <w:t xml:space="preserve">respects</w:t>
-      </w:r>
-      <w:r>
-        <w:t xml:space="preserve"> </w:t>
-      </w:r>
-      <w:r>
-        <w:t xml:space="preserve">specialist</w:t>
-      </w:r>
-      <w:r>
-        <w:t xml:space="preserve"> </w:t>
-      </w:r>
-      <w:r>
-        <w:t xml:space="preserve">technological</w:t>
-      </w:r>
-      <w:r>
-        <w:t xml:space="preserve"> </w:t>
-      </w:r>
-      <w:r>
-        <w:t xml:space="preserve">attributions</w:t>
-      </w:r>
-      <w:r>
-        <w:t xml:space="preserve"> </w:t>
-      </w:r>
-      <w:r>
-        <w:t xml:space="preserve">in</w:t>
-      </w:r>
-      <w:r>
-        <w:t xml:space="preserve"> </w:t>
-      </w:r>
-      <w:r>
-        <w:t xml:space="preserve">site</w:t>
-      </w:r>
-      <w:r>
-        <w:t xml:space="preserve"> </w:t>
-      </w:r>
-      <w:r>
-        <w:t xml:space="preserve">assignment.</w:t>
-      </w:r>
-      <w:r>
-        <w:t xml:space="preserve"> </w:t>
-      </w:r>
-      <w:r>
-        <w:t xml:space="preserve">Using</w:t>
-      </w:r>
-      <w:r>
-        <w:t xml:space="preserve"> </w:t>
-      </w:r>
-      <w:r>
-        <w:t xml:space="preserve">seriation</w:t>
-      </w:r>
-      <w:r>
-        <w:t xml:space="preserve"> </w:t>
-      </w:r>
-      <w:r>
-        <w:t xml:space="preserve">and</w:t>
-      </w:r>
-      <w:r>
-        <w:t xml:space="preserve"> </w:t>
-      </w:r>
-      <w:r>
-        <w:t xml:space="preserve">network</w:t>
-      </w:r>
-      <w:r>
-        <w:t xml:space="preserve"> </w:t>
-      </w:r>
-      <w:r>
-        <w:t xml:space="preserve">analysis,</w:t>
-      </w:r>
-      <w:r>
-        <w:t xml:space="preserve"> </w:t>
-      </w:r>
-      <w:r>
-        <w:t xml:space="preserve">we</w:t>
-      </w:r>
-      <w:r>
-        <w:t xml:space="preserve"> </w:t>
-      </w:r>
-      <w:r>
-        <w:t xml:space="preserve">examine</w:t>
-      </w:r>
-      <w:r>
-        <w:t xml:space="preserve"> </w:t>
-      </w:r>
-      <w:r>
-        <w:t xml:space="preserve">whether</w:t>
-      </w:r>
-      <w:r>
-        <w:t xml:space="preserve"> </w:t>
-      </w:r>
-      <w:r>
-        <w:t xml:space="preserve">sign</w:t>
-      </w:r>
-      <w:r>
-        <w:t xml:space="preserve"> </w:t>
-      </w:r>
-      <w:r>
-        <w:t xml:space="preserve">distribution</w:t>
-      </w:r>
-      <w:r>
-        <w:t xml:space="preserve"> </w:t>
-      </w:r>
-      <w:r>
-        <w:t xml:space="preserve">reflects</w:t>
-      </w:r>
-      <w:r>
-        <w:t xml:space="preserve"> </w:t>
-      </w:r>
-      <w:r>
-        <w:t xml:space="preserve">cultural</w:t>
-      </w:r>
-      <w:r>
-        <w:t xml:space="preserve"> </w:t>
-      </w:r>
-      <w:r>
-        <w:t xml:space="preserve">grouping</w:t>
-      </w:r>
-      <w:r>
-        <w:t xml:space="preserve"> </w:t>
-      </w:r>
-      <w:r>
-        <w:t xml:space="preserve">within</w:t>
-      </w:r>
-      <w:r>
-        <w:t xml:space="preserve"> </w:t>
-      </w:r>
-      <w:r>
-        <w:t xml:space="preserve">each</w:t>
-      </w:r>
-      <w:r>
-        <w:t xml:space="preserve"> </w:t>
-      </w:r>
-      <w:r>
-        <w:t xml:space="preserve">phase,</w:t>
-      </w:r>
-      <w:r>
-        <w:t xml:space="preserve"> </w:t>
-      </w:r>
-      <w:r>
-        <w:t xml:space="preserve">and</w:t>
-      </w:r>
-      <w:r>
-        <w:t xml:space="preserve"> </w:t>
-      </w:r>
-      <w:r>
-        <w:t xml:space="preserve">whether</w:t>
-      </w:r>
-      <w:r>
-        <w:t xml:space="preserve"> </w:t>
-      </w:r>
-      <w:r>
-        <w:t xml:space="preserve">the</w:t>
-      </w:r>
-      <w:r>
-        <w:t xml:space="preserve"> </w:t>
-      </w:r>
-      <w:r>
-        <w:t xml:space="preserve">sign-sharing</w:t>
-      </w:r>
-      <w:r>
-        <w:t xml:space="preserve"> </w:t>
-      </w:r>
-      <w:r>
-        <w:t xml:space="preserve">network</w:t>
-      </w:r>
-      <w:r>
-        <w:t xml:space="preserve"> </w:t>
-      </w:r>
-      <w:r>
-        <w:t xml:space="preserve">differs</w:t>
-      </w:r>
-      <w:r>
-        <w:t xml:space="preserve"> </w:t>
-      </w:r>
-      <w:r>
-        <w:t xml:space="preserve">between</w:t>
-      </w:r>
-      <w:r>
-        <w:t xml:space="preserve"> </w:t>
-      </w:r>
-      <w:r>
-        <w:t xml:space="preserve">the</w:t>
-      </w:r>
-      <w:r>
-        <w:t xml:space="preserve"> </w:t>
-      </w:r>
-      <w:r>
-        <w:t xml:space="preserve">early</w:t>
-      </w:r>
-      <w:r>
-        <w:t xml:space="preserve"> </w:t>
-      </w:r>
-      <w:r>
-        <w:t xml:space="preserve">and</w:t>
-      </w:r>
-      <w:r>
-        <w:t xml:space="preserve"> </w:t>
-      </w:r>
-      <w:r>
-        <w:t xml:space="preserve">late</w:t>
-      </w:r>
-      <w:r>
-        <w:t xml:space="preserve"> </w:t>
-      </w:r>
-      <w:r>
-        <w:t xml:space="preserve">Aurignacian.</w:t>
-      </w:r>
-      <w:r>
-        <w:t xml:space="preserve"> </w:t>
-      </w:r>
-      <w:r>
-        <w:t xml:space="preserve">Within</w:t>
-      </w:r>
-      <w:r>
-        <w:t xml:space="preserve"> </w:t>
-      </w:r>
-      <w:r>
-        <w:t xml:space="preserve">the</w:t>
-      </w:r>
-      <w:r>
-        <w:t xml:space="preserve"> </w:t>
-      </w:r>
-      <w:r>
-        <w:t xml:space="preserve">early</w:t>
-      </w:r>
-      <w:r>
-        <w:t xml:space="preserve"> </w:t>
-      </w:r>
-      <w:r>
-        <w:t xml:space="preserve">phase</w:t>
-      </w:r>
-      <w:r>
-        <w:t xml:space="preserve"> </w:t>
-      </w:r>
-      <w:r>
-        <w:t xml:space="preserve">(Aur-P1;</w:t>
-      </w:r>
-      <w:r>
-        <w:t xml:space="preserve"> </w:t>
-      </w:r>
-      <w:r>
-        <w:t xml:space="preserve">20</w:t>
-      </w:r>
-      <w:r>
-        <w:t xml:space="preserve"> </w:t>
-      </w:r>
-      <w:r>
-        <w:t xml:space="preserve">sites)</w:t>
-      </w:r>
-      <w:r>
-        <w:t xml:space="preserve"> </w:t>
-      </w:r>
-      <w:r>
-        <w:t xml:space="preserve">we</w:t>
-      </w:r>
-      <w:r>
-        <w:t xml:space="preserve"> </w:t>
-      </w:r>
-      <w:r>
-        <w:t xml:space="preserve">identify</w:t>
-      </w:r>
-      <w:r>
-        <w:t xml:space="preserve"> </w:t>
-      </w:r>
-      <w:r>
-        <w:t xml:space="preserve">a</w:t>
-      </w:r>
-      <w:r>
-        <w:t xml:space="preserve"> </w:t>
-      </w:r>
-      <w:r>
-        <w:t xml:space="preserve">robust</w:t>
-      </w:r>
-      <w:r>
-        <w:t xml:space="preserve"> </w:t>
-      </w:r>
-      <w:r>
-        <w:t xml:space="preserve">two-group</w:t>
-      </w:r>
-      <w:r>
-        <w:t xml:space="preserve"> </w:t>
-      </w:r>
-      <w:r>
-        <w:t xml:space="preserve">structure</w:t>
-      </w:r>
-      <w:r>
-        <w:t xml:space="preserve"> </w:t>
-      </w:r>
-      <w:r>
-        <w:t xml:space="preserve">of</w:t>
-      </w:r>
-      <w:r>
-        <w:t xml:space="preserve"> </w:t>
-      </w:r>
-      <w:r>
-        <w:t xml:space="preserve">restricted</w:t>
-      </w:r>
-      <w:r>
-        <w:t xml:space="preserve"> </w:t>
-      </w:r>
-      <w:r>
-        <w:t xml:space="preserve">versus</w:t>
-      </w:r>
-      <w:r>
-        <w:t xml:space="preserve"> </w:t>
-      </w:r>
-      <w:r>
-        <w:t xml:space="preserve">broad</w:t>
-      </w:r>
-      <w:r>
-        <w:t xml:space="preserve"> </w:t>
-      </w:r>
-      <w:r>
-        <w:t xml:space="preserve">geometric-sign</w:t>
-      </w:r>
-      <w:r>
-        <w:t xml:space="preserve"> </w:t>
-      </w:r>
-      <w:r>
-        <w:t xml:space="preserve">repertoires</w:t>
-      </w:r>
-      <w:r>
-        <w:t xml:space="preserve"> </w:t>
-      </w:r>
-      <w:r>
-        <w:t xml:space="preserve">that</w:t>
-      </w:r>
-      <w:r>
-        <w:t xml:space="preserve"> </w:t>
-      </w:r>
-      <w:r>
-        <w:t xml:space="preserve">is</w:t>
-      </w:r>
-      <w:r>
-        <w:t xml:space="preserve"> </w:t>
-      </w:r>
-      <w:r>
-        <w:t xml:space="preserve">stable</w:t>
-      </w:r>
-      <w:r>
-        <w:t xml:space="preserve"> </w:t>
-      </w:r>
-      <w:r>
-        <w:t xml:space="preserve">under</w:t>
-      </w:r>
-      <w:r>
-        <w:t xml:space="preserve"> </w:t>
-      </w:r>
-      <w:r>
-        <w:t xml:space="preserve">bootstrap</w:t>
-      </w:r>
-      <w:r>
-        <w:t xml:space="preserve"> </w:t>
-      </w:r>
-      <w:r>
-        <w:t xml:space="preserve">resampling</w:t>
-      </w:r>
-      <w:r>
-        <w:t xml:space="preserve"> </w:t>
-      </w:r>
-      <w:r>
-        <w:t xml:space="preserve">and</w:t>
-      </w:r>
-      <w:r>
-        <w:t xml:space="preserve"> </w:t>
-      </w:r>
-      <w:r>
-        <w:t xml:space="preserve">largely</w:t>
-      </w:r>
-      <w:r>
-        <w:t xml:space="preserve"> </w:t>
-      </w:r>
-      <w:r>
-        <w:t xml:space="preserve">recovered</w:t>
-      </w:r>
-      <w:r>
-        <w:t xml:space="preserve"> </w:t>
-      </w:r>
-      <w:r>
-        <w:t xml:space="preserve">by</w:t>
-      </w:r>
-      <w:r>
-        <w:t xml:space="preserve"> </w:t>
-      </w:r>
-      <w:r>
-        <w:t xml:space="preserve">an</w:t>
-      </w:r>
-      <w:r>
-        <w:t xml:space="preserve"> </w:t>
-      </w:r>
-      <w:r>
-        <w:t xml:space="preserve">independent</w:t>
-      </w:r>
-      <w:r>
-        <w:t xml:space="preserve"> </w:t>
-      </w:r>
-      <w:r>
-        <w:t xml:space="preserve">stochastic</w:t>
-      </w:r>
-      <w:r>
-        <w:t xml:space="preserve"> </w:t>
-      </w:r>
-      <w:r>
-        <w:t xml:space="preserve">block</w:t>
-      </w:r>
-      <w:r>
-        <w:t xml:space="preserve"> </w:t>
-      </w:r>
-      <w:r>
-        <w:t xml:space="preserve">model.</w:t>
-      </w:r>
-      <w:r>
-        <w:t xml:space="preserve"> </w:t>
-      </w:r>
-      <w:r>
-        <w:t xml:space="preserve">The</w:t>
-      </w:r>
-      <w:r>
-        <w:t xml:space="preserve"> </w:t>
-      </w:r>
-      <w:r>
-        <w:t xml:space="preserve">small</w:t>
-      </w:r>
-      <w:r>
-        <w:t xml:space="preserve"> </w:t>
-      </w:r>
-      <w:r>
-        <w:t xml:space="preserve">late</w:t>
-      </w:r>
-      <w:r>
-        <w:t xml:space="preserve"> </w:t>
-      </w:r>
-      <w:r>
-        <w:t xml:space="preserve">phase</w:t>
-      </w:r>
-      <w:r>
-        <w:t xml:space="preserve"> </w:t>
-      </w:r>
-      <w:r>
-        <w:t xml:space="preserve">(Aur-P2;</w:t>
-      </w:r>
-      <w:r>
-        <w:t xml:space="preserve"> </w:t>
-      </w:r>
-      <w:r>
-        <w:t xml:space="preserve">9</w:t>
-      </w:r>
-      <w:r>
-        <w:t xml:space="preserve"> </w:t>
-      </w:r>
-      <w:r>
-        <w:t xml:space="preserve">sites)</w:t>
-      </w:r>
-      <w:r>
-        <w:t xml:space="preserve"> </w:t>
-      </w:r>
-      <w:r>
-        <w:t xml:space="preserve">shows</w:t>
-      </w:r>
-      <w:r>
-        <w:t xml:space="preserve"> </w:t>
-      </w:r>
-      <w:r>
-        <w:t xml:space="preserve">a</w:t>
-      </w:r>
-      <w:r>
-        <w:t xml:space="preserve"> </w:t>
-      </w:r>
-      <w:r>
-        <w:t xml:space="preserve">weaker,</w:t>
-      </w:r>
-      <w:r>
-        <w:t xml:space="preserve"> </w:t>
-      </w:r>
-      <w:r>
-        <w:t xml:space="preserve">less</w:t>
-      </w:r>
-      <w:r>
-        <w:t xml:space="preserve"> </w:t>
-      </w:r>
-      <w:r>
-        <w:t xml:space="preserve">resolved</w:t>
-      </w:r>
-      <w:r>
-        <w:t xml:space="preserve"> </w:t>
-      </w:r>
-      <w:r>
-        <w:t xml:space="preserve">structure.</w:t>
-      </w:r>
-      <w:r>
-        <w:t xml:space="preserve"> </w:t>
-      </w:r>
-      <w:r>
-        <w:t xml:space="preserve">The</w:t>
-      </w:r>
-      <w:r>
-        <w:t xml:space="preserve"> </w:t>
-      </w:r>
-      <w:r>
-        <w:t xml:space="preserve">early</w:t>
-      </w:r>
-      <w:r>
-        <w:t xml:space="preserve"> </w:t>
-      </w:r>
-      <w:r>
-        <w:t xml:space="preserve">phase</w:t>
-      </w:r>
-      <w:r>
-        <w:t xml:space="preserve"> </w:t>
-      </w:r>
-      <w:r>
-        <w:t xml:space="preserve">supports</w:t>
-      </w:r>
-      <w:r>
-        <w:t xml:space="preserve"> </w:t>
-      </w:r>
-      <w:r>
-        <w:t xml:space="preserve">a</w:t>
-      </w:r>
-      <w:r>
-        <w:t xml:space="preserve"> </w:t>
-      </w:r>
-      <w:r>
-        <w:t xml:space="preserve">larger</w:t>
-      </w:r>
-      <w:r>
-        <w:t xml:space="preserve"> </w:t>
-      </w:r>
-      <w:r>
-        <w:t xml:space="preserve">network</w:t>
-      </w:r>
-      <w:r>
-        <w:t xml:space="preserve"> </w:t>
-      </w:r>
-      <w:r>
-        <w:t xml:space="preserve">centred</w:t>
-      </w:r>
-      <w:r>
-        <w:t xml:space="preserve"> </w:t>
-      </w:r>
-      <w:r>
-        <w:t xml:space="preserve">on</w:t>
-      </w:r>
-      <w:r>
-        <w:t xml:space="preserve"> </w:t>
-      </w:r>
-      <w:r>
-        <w:t xml:space="preserve">key</w:t>
-      </w:r>
-      <w:r>
-        <w:t xml:space="preserve"> </w:t>
-      </w:r>
-      <w:r>
-        <w:t xml:space="preserve">sites,</w:t>
-      </w:r>
-      <w:r>
-        <w:t xml:space="preserve"> </w:t>
-      </w:r>
-      <w:r>
-        <w:t xml:space="preserve">but</w:t>
-      </w:r>
-      <w:r>
-        <w:t xml:space="preserve"> </w:t>
-      </w:r>
-      <w:r>
-        <w:t xml:space="preserve">once</w:t>
-      </w:r>
-      <w:r>
-        <w:t xml:space="preserve"> </w:t>
-      </w:r>
-      <w:r>
-        <w:t xml:space="preserve">network</w:t>
-      </w:r>
-      <w:r>
-        <w:t xml:space="preserve"> </w:t>
-      </w:r>
-      <w:r>
-        <w:t xml:space="preserve">size</w:t>
-      </w:r>
-      <w:r>
-        <w:t xml:space="preserve"> </w:t>
-      </w:r>
-      <w:r>
-        <w:t xml:space="preserve">is</w:t>
-      </w:r>
-      <w:r>
-        <w:t xml:space="preserve"> </w:t>
-      </w:r>
-      <w:r>
-        <w:t xml:space="preserve">taken</w:t>
-      </w:r>
-      <w:r>
-        <w:t xml:space="preserve"> </w:t>
-      </w:r>
-      <w:r>
-        <w:t xml:space="preserve">into</w:t>
-      </w:r>
-      <w:r>
-        <w:t xml:space="preserve"> </w:t>
-      </w:r>
-      <w:r>
-        <w:t xml:space="preserve">account</w:t>
-      </w:r>
-      <w:r>
-        <w:t xml:space="preserve"> </w:t>
-      </w:r>
-      <w:r>
-        <w:t xml:space="preserve">the</w:t>
-      </w:r>
-      <w:r>
-        <w:t xml:space="preserve"> </w:t>
-      </w:r>
-      <w:r>
-        <w:t xml:space="preserve">late</w:t>
-      </w:r>
-      <w:r>
-        <w:t xml:space="preserve"> </w:t>
-      </w:r>
-      <w:r>
-        <w:t xml:space="preserve">phase</w:t>
-      </w:r>
-      <w:r>
-        <w:t xml:space="preserve"> </w:t>
-      </w:r>
-      <w:r>
-        <w:t xml:space="preserve">shows</w:t>
-      </w:r>
-      <w:r>
-        <w:t xml:space="preserve"> </w:t>
-      </w:r>
-      <w:r>
-        <w:t xml:space="preserve">higher</w:t>
-      </w:r>
-      <w:r>
-        <w:t xml:space="preserve"> </w:t>
-      </w:r>
-      <w:r>
-        <w:t xml:space="preserve">edge</w:t>
-      </w:r>
-      <w:r>
-        <w:t xml:space="preserve"> </w:t>
-      </w:r>
-      <w:r>
-        <w:t xml:space="preserve">density,</w:t>
-      </w:r>
-      <w:r>
-        <w:t xml:space="preserve"> </w:t>
-      </w:r>
-      <w:r>
-        <w:t xml:space="preserve">and</w:t>
-      </w:r>
-      <w:r>
-        <w:t xml:space="preserve"> </w:t>
-      </w:r>
-      <w:r>
-        <w:t xml:space="preserve">formal</w:t>
-      </w:r>
-      <w:r>
-        <w:t xml:space="preserve"> </w:t>
-      </w:r>
-      <w:r>
-        <w:t xml:space="preserve">permutation</w:t>
-      </w:r>
-      <w:r>
-        <w:t xml:space="preserve"> </w:t>
-      </w:r>
-      <w:r>
-        <w:t xml:space="preserve">tests</w:t>
-      </w:r>
-      <w:r>
-        <w:t xml:space="preserve"> </w:t>
-      </w:r>
-      <w:r>
-        <w:t xml:space="preserve">indicate</w:t>
-      </w:r>
-      <w:r>
-        <w:t xml:space="preserve"> </w:t>
-      </w:r>
-      <w:r>
-        <w:t xml:space="preserve">that</w:t>
-      </w:r>
-      <w:r>
-        <w:t xml:space="preserve"> </w:t>
-      </w:r>
-      <w:r>
-        <w:t xml:space="preserve">the</w:t>
-      </w:r>
-      <w:r>
-        <w:t xml:space="preserve"> </w:t>
-      </w:r>
-      <w:r>
-        <w:t xml:space="preserve">phases</w:t>
-      </w:r>
-      <w:r>
-        <w:t xml:space="preserve"> </w:t>
-      </w:r>
-      <w:r>
-        <w:t xml:space="preserve">do</w:t>
-      </w:r>
-      <w:r>
-        <w:t xml:space="preserve"> </w:t>
-      </w:r>
-      <w:r>
-        <w:t xml:space="preserve">not</w:t>
-      </w:r>
-      <w:r>
-        <w:t xml:space="preserve"> </w:t>
-      </w:r>
-      <w:r>
-        <w:t xml:space="preserve">differ</w:t>
-      </w:r>
-      <w:r>
-        <w:t xml:space="preserve"> </w:t>
-      </w:r>
-      <w:r>
-        <w:t xml:space="preserve">significantly</w:t>
-      </w:r>
-      <w:r>
-        <w:t xml:space="preserve"> </w:t>
-      </w:r>
-      <w:r>
-        <w:t xml:space="preserve">in</w:t>
-      </w:r>
-      <w:r>
-        <w:t xml:space="preserve"> </w:t>
-      </w:r>
-      <w:r>
-        <w:t xml:space="preserve">edge</w:t>
-      </w:r>
-      <w:r>
-        <w:t xml:space="preserve"> </w:t>
-      </w:r>
-      <w:r>
-        <w:t xml:space="preserve">density,</w:t>
-      </w:r>
-      <w:r>
-        <w:t xml:space="preserve"> </w:t>
-      </w:r>
-      <w:r>
-        <w:t xml:space="preserve">modularity,</w:t>
-      </w:r>
-      <w:r>
-        <w:t xml:space="preserve"> </w:t>
-      </w:r>
-      <w:r>
-        <w:t xml:space="preserve">betweenness,</w:t>
-      </w:r>
-      <w:r>
-        <w:t xml:space="preserve"> </w:t>
-      </w:r>
-      <w:r>
-        <w:t xml:space="preserve">or</w:t>
-      </w:r>
-      <w:r>
-        <w:t xml:space="preserve"> </w:t>
-      </w:r>
-      <w:r>
-        <w:t xml:space="preserve">component</w:t>
-      </w:r>
-      <w:r>
-        <w:t xml:space="preserve"> </w:t>
-      </w:r>
-      <w:r>
-        <w:t xml:space="preserve">count,</w:t>
-      </w:r>
-      <w:r>
-        <w:t xml:space="preserve"> </w:t>
-      </w:r>
-      <w:r>
-        <w:t xml:space="preserve">so</w:t>
-      </w:r>
-      <w:r>
-        <w:t xml:space="preserve"> </w:t>
-      </w:r>
-      <w:r>
-        <w:t xml:space="preserve">the</w:t>
-      </w:r>
-      <w:r>
-        <w:t xml:space="preserve"> </w:t>
-      </w:r>
-      <w:r>
-        <w:t xml:space="preserve">observed</w:t>
-      </w:r>
-      <w:r>
-        <w:t xml:space="preserve"> </w:t>
-      </w:r>
-      <w:r>
-        <w:t xml:space="preserve">differences</w:t>
-      </w:r>
-      <w:r>
-        <w:t xml:space="preserve"> </w:t>
-      </w:r>
-      <w:r>
-        <w:t xml:space="preserve">in</w:t>
-      </w:r>
-      <w:r>
-        <w:t xml:space="preserve"> </w:t>
-      </w:r>
-      <w:r>
-        <w:t xml:space="preserve">connectivity</w:t>
-      </w:r>
-      <w:r>
-        <w:t xml:space="preserve"> </w:t>
-      </w:r>
-      <w:r>
-        <w:t xml:space="preserve">track</w:t>
-      </w:r>
-      <w:r>
-        <w:t xml:space="preserve"> </w:t>
-      </w:r>
-      <w:r>
-        <w:t xml:space="preserve">the</w:t>
-      </w:r>
-      <w:r>
-        <w:t xml:space="preserve"> </w:t>
-      </w:r>
-      <w:r>
-        <w:t xml:space="preserve">larger</w:t>
-      </w:r>
-      <w:r>
-        <w:t xml:space="preserve"> </w:t>
-      </w:r>
-      <w:r>
-        <w:t xml:space="preserve">size</w:t>
-      </w:r>
-      <w:r>
-        <w:t xml:space="preserve"> </w:t>
-      </w:r>
-      <w:r>
-        <w:t xml:space="preserve">of</w:t>
-      </w:r>
-      <w:r>
-        <w:t xml:space="preserve"> </w:t>
-      </w:r>
-      <w:r>
-        <w:t xml:space="preserve">the</w:t>
-      </w:r>
-      <w:r>
-        <w:t xml:space="preserve"> </w:t>
-      </w:r>
-      <w:r>
-        <w:t xml:space="preserve">early</w:t>
-      </w:r>
-      <w:r>
-        <w:t xml:space="preserve"> </w:t>
-      </w:r>
-      <w:r>
-        <w:t xml:space="preserve">phase</w:t>
-      </w:r>
-      <w:r>
-        <w:t xml:space="preserve"> </w:t>
-      </w:r>
-      <w:r>
-        <w:t xml:space="preserve">rather</w:t>
-      </w:r>
-      <w:r>
-        <w:t xml:space="preserve"> </w:t>
-      </w:r>
-      <w:r>
-        <w:t xml:space="preserve">than</w:t>
-      </w:r>
-      <w:r>
-        <w:t xml:space="preserve"> </w:t>
-      </w:r>
-      <w:r>
-        <w:t xml:space="preserve">a</w:t>
-      </w:r>
-      <w:r>
-        <w:t xml:space="preserve"> </w:t>
-      </w:r>
-      <w:r>
-        <w:t xml:space="preserve">statistically</w:t>
-      </w:r>
-      <w:r>
-        <w:t xml:space="preserve"> </w:t>
-      </w:r>
-      <w:r>
-        <w:t xml:space="preserve">distinguishable</w:t>
-      </w:r>
-      <w:r>
-        <w:t xml:space="preserve"> </w:t>
-      </w:r>
-      <w:r>
-        <w:t xml:space="preserve">community</w:t>
-      </w:r>
-      <w:r>
-        <w:t xml:space="preserve"> </w:t>
-      </w:r>
-      <w:r>
-        <w:t xml:space="preserve">structure.</w:t>
-      </w:r>
-      <w:r>
-        <w:t xml:space="preserve"> </w:t>
-      </w:r>
-      <w:r>
-        <w:t xml:space="preserve">Mantel</w:t>
-      </w:r>
-      <w:r>
-        <w:t xml:space="preserve"> </w:t>
-      </w:r>
-      <w:r>
-        <w:t xml:space="preserve">tests</w:t>
-      </w:r>
-      <w:r>
-        <w:t xml:space="preserve"> </w:t>
-      </w:r>
-      <w:r>
-        <w:t xml:space="preserve">did</w:t>
-      </w:r>
-      <w:r>
-        <w:t xml:space="preserve"> </w:t>
-      </w:r>
-      <w:r>
-        <w:t xml:space="preserve">not</w:t>
-      </w:r>
-      <w:r>
-        <w:t xml:space="preserve"> </w:t>
-      </w:r>
-      <w:r>
-        <w:t xml:space="preserve">detect</w:t>
-      </w:r>
-      <w:r>
-        <w:t xml:space="preserve"> </w:t>
-      </w:r>
-      <w:r>
-        <w:t xml:space="preserve">a</w:t>
-      </w:r>
-      <w:r>
-        <w:t xml:space="preserve"> </w:t>
-      </w:r>
-      <w:r>
-        <w:t xml:space="preserve">significant</w:t>
-      </w:r>
-      <w:r>
-        <w:t xml:space="preserve"> </w:t>
-      </w:r>
-      <w:r>
-        <w:t xml:space="preserve">correlation</w:t>
-      </w:r>
-      <w:r>
-        <w:t xml:space="preserve"> </w:t>
-      </w:r>
-      <w:r>
-        <w:t xml:space="preserve">between</w:t>
-      </w:r>
-      <w:r>
-        <w:t xml:space="preserve"> </w:t>
-      </w:r>
-      <w:r>
-        <w:t xml:space="preserve">geographic</w:t>
-      </w:r>
-      <w:r>
-        <w:t xml:space="preserve"> </w:t>
-      </w:r>
-      <w:r>
-        <w:t xml:space="preserve">distance</w:t>
-      </w:r>
-      <w:r>
-        <w:t xml:space="preserve"> </w:t>
-      </w:r>
-      <w:r>
-        <w:t xml:space="preserve">and</w:t>
-      </w:r>
-      <w:r>
-        <w:t xml:space="preserve"> </w:t>
-      </w:r>
-      <w:r>
-        <w:t xml:space="preserve">sign</w:t>
-      </w:r>
-      <w:r>
-        <w:t xml:space="preserve"> </w:t>
-      </w:r>
-      <w:r>
-        <w:t xml:space="preserve">distribution</w:t>
-      </w:r>
-      <w:r>
-        <w:t xml:space="preserve"> </w:t>
-      </w:r>
-      <w:r>
-        <w:t xml:space="preserve">in</w:t>
-      </w:r>
-      <w:r>
-        <w:t xml:space="preserve"> </w:t>
-      </w:r>
-      <w:r>
-        <w:t xml:space="preserve">either</w:t>
-      </w:r>
-      <w:r>
-        <w:t xml:space="preserve"> </w:t>
-      </w:r>
-      <w:r>
-        <w:t xml:space="preserve">phase,</w:t>
-      </w:r>
-      <w:r>
-        <w:t xml:space="preserve"> </w:t>
-      </w:r>
-      <w:r>
-        <w:t xml:space="preserve">and</w:t>
-      </w:r>
-      <w:r>
-        <w:t xml:space="preserve"> </w:t>
-      </w:r>
-      <w:r>
-        <w:t xml:space="preserve">the</w:t>
-      </w:r>
-      <w:r>
-        <w:t xml:space="preserve"> </w:t>
-      </w:r>
-      <w:r>
-        <w:t xml:space="preserve">isolation-by-distance</w:t>
-      </w:r>
-      <w:r>
-        <w:t xml:space="preserve"> </w:t>
-      </w:r>
-      <w:r>
-        <w:t xml:space="preserve">relationship</w:t>
-      </w:r>
-      <w:r>
-        <w:t xml:space="preserve"> </w:t>
-      </w:r>
-      <w:r>
-        <w:t xml:space="preserve">does</w:t>
-      </w:r>
-      <w:r>
-        <w:t xml:space="preserve"> </w:t>
-      </w:r>
-      <w:r>
-        <w:t xml:space="preserve">not</w:t>
-      </w:r>
-      <w:r>
-        <w:t xml:space="preserve"> </w:t>
-      </w:r>
-      <w:r>
-        <w:t xml:space="preserve">differ</w:t>
-      </w:r>
-      <w:r>
-        <w:t xml:space="preserve"> </w:t>
-      </w:r>
-      <w:r>
-        <w:t xml:space="preserve">between</w:t>
-      </w:r>
-      <w:r>
-        <w:t xml:space="preserve"> </w:t>
-      </w:r>
-      <w:r>
-        <w:t xml:space="preserve">them,</w:t>
-      </w:r>
-      <w:r>
-        <w:t xml:space="preserve"> </w:t>
-      </w:r>
-      <w:r>
-        <w:t xml:space="preserve">although</w:t>
-      </w:r>
-      <w:r>
-        <w:t xml:space="preserve"> </w:t>
-      </w:r>
-      <w:r>
-        <w:t xml:space="preserve">this</w:t>
-      </w:r>
-      <w:r>
-        <w:t xml:space="preserve"> </w:t>
-      </w:r>
-      <w:r>
-        <w:t xml:space="preserve">null</w:t>
-      </w:r>
-      <w:r>
-        <w:t xml:space="preserve"> </w:t>
-      </w:r>
-      <w:r>
-        <w:t xml:space="preserve">result</w:t>
-      </w:r>
-      <w:r>
-        <w:t xml:space="preserve"> </w:t>
-      </w:r>
-      <w:r>
-        <w:t xml:space="preserve">should</w:t>
-      </w:r>
-      <w:r>
-        <w:t xml:space="preserve"> </w:t>
-      </w:r>
-      <w:r>
-        <w:t xml:space="preserve">be</w:t>
-      </w:r>
-      <w:r>
-        <w:t xml:space="preserve"> </w:t>
-      </w:r>
-      <w:r>
-        <w:t xml:space="preserve">interpreted</w:t>
-      </w:r>
-      <w:r>
-        <w:t xml:space="preserve"> </w:t>
-      </w:r>
-      <w:r>
-        <w:t xml:space="preserve">cautiously</w:t>
-      </w:r>
-      <w:r>
-        <w:t xml:space="preserve"> </w:t>
-      </w:r>
-      <w:r>
-        <w:t xml:space="preserve">given</w:t>
-      </w:r>
-      <w:r>
-        <w:t xml:space="preserve"> </w:t>
-      </w:r>
-      <w:r>
-        <w:t xml:space="preserve">the</w:t>
-      </w:r>
-      <w:r>
-        <w:t xml:space="preserve"> </w:t>
-      </w:r>
-      <w:r>
-        <w:t xml:space="preserve">small</w:t>
-      </w:r>
-      <w:r>
-        <w:t xml:space="preserve"> </w:t>
-      </w:r>
-      <w:r>
-        <w:t xml:space="preserve">sample</w:t>
-      </w:r>
-      <w:r>
-        <w:t xml:space="preserve"> </w:t>
-      </w:r>
-      <w:r>
-        <w:t xml:space="preserve">sizes.</w:t>
-      </w:r>
-      <w:r>
-        <w:t xml:space="preserve"> </w:t>
-      </w:r>
-      <w:r>
-        <w:t xml:space="preserve">These</w:t>
-      </w:r>
-      <w:r>
-        <w:t xml:space="preserve"> </w:t>
-      </w:r>
-      <w:r>
-        <w:t xml:space="preserve">results</w:t>
-      </w:r>
-      <w:r>
-        <w:t xml:space="preserve"> </w:t>
-      </w:r>
-      <w:r>
-        <w:t xml:space="preserve">indicate</w:t>
-      </w:r>
-      <w:r>
-        <w:t xml:space="preserve"> </w:t>
-      </w:r>
-      <w:r>
-        <w:t xml:space="preserve">that</w:t>
-      </w:r>
-      <w:r>
-        <w:t xml:space="preserve"> </w:t>
-      </w:r>
-      <w:r>
-        <w:t xml:space="preserve">the</w:t>
-      </w:r>
-      <w:r>
-        <w:t xml:space="preserve"> </w:t>
-      </w:r>
-      <w:r>
-        <w:t xml:space="preserve">restricted/broad</w:t>
-      </w:r>
-      <w:r>
-        <w:t xml:space="preserve"> </w:t>
-      </w:r>
-      <w:r>
-        <w:t xml:space="preserve">separation</w:t>
-      </w:r>
-      <w:r>
-        <w:t xml:space="preserve"> </w:t>
-      </w:r>
-      <w:r>
-        <w:t xml:space="preserve">is</w:t>
-      </w:r>
-      <w:r>
-        <w:t xml:space="preserve"> </w:t>
-      </w:r>
-      <w:r>
-        <w:t xml:space="preserve">a</w:t>
-      </w:r>
-      <w:r>
-        <w:t xml:space="preserve"> </w:t>
-      </w:r>
-      <w:r>
-        <w:t xml:space="preserve">persistent</w:t>
-      </w:r>
-      <w:r>
-        <w:t xml:space="preserve"> </w:t>
-      </w:r>
-      <w:r>
-        <w:t xml:space="preserve">organisational</w:t>
-      </w:r>
-      <w:r>
-        <w:t xml:space="preserve"> </w:t>
-      </w:r>
-      <w:r>
-        <w:t xml:space="preserve">feature</w:t>
-      </w:r>
-      <w:r>
-        <w:t xml:space="preserve"> </w:t>
-      </w:r>
-      <w:r>
-        <w:t xml:space="preserve">of</w:t>
-      </w:r>
-      <w:r>
-        <w:t xml:space="preserve"> </w:t>
-      </w:r>
-      <w:r>
-        <w:t xml:space="preserve">Aurignacian</w:t>
-      </w:r>
-      <w:r>
-        <w:t xml:space="preserve"> </w:t>
-      </w:r>
-      <w:r>
-        <w:t xml:space="preserve">symbolic</w:t>
-      </w:r>
-      <w:r>
-        <w:t xml:space="preserve"> </w:t>
-      </w:r>
-      <w:r>
-        <w:t xml:space="preserve">culture;</w:t>
-      </w:r>
-      <w:r>
-        <w:t xml:space="preserve"> </w:t>
-      </w:r>
-      <w:r>
-        <w:t xml:space="preserve">the</w:t>
-      </w:r>
-      <w:r>
-        <w:t xml:space="preserve"> </w:t>
-      </w:r>
-      <w:r>
-        <w:t xml:space="preserve">absence</w:t>
-      </w:r>
-      <w:r>
-        <w:t xml:space="preserve"> </w:t>
-      </w:r>
-      <w:r>
-        <w:t xml:space="preserve">of</w:t>
-      </w:r>
-      <w:r>
-        <w:t xml:space="preserve"> </w:t>
-      </w:r>
-      <w:r>
-        <w:t xml:space="preserve">a</w:t>
-      </w:r>
-      <w:r>
-        <w:t xml:space="preserve"> </w:t>
-      </w:r>
-      <w:r>
-        <w:t xml:space="preserve">significant</w:t>
-      </w:r>
-      <w:r>
-        <w:t xml:space="preserve"> </w:t>
-      </w:r>
-      <w:r>
-        <w:t xml:space="preserve">geographic</w:t>
-      </w:r>
-      <w:r>
-        <w:t xml:space="preserve"> </w:t>
-      </w:r>
-      <w:r>
-        <w:t xml:space="preserve">correlation</w:t>
-      </w:r>
-      <w:r>
-        <w:t xml:space="preserve"> </w:t>
-      </w:r>
-      <w:r>
-        <w:t xml:space="preserve">is</w:t>
-      </w:r>
-      <w:r>
-        <w:t xml:space="preserve"> </w:t>
-      </w:r>
-      <w:r>
-        <w:t xml:space="preserve">consistent</w:t>
-      </w:r>
-      <w:r>
-        <w:t xml:space="preserve"> </w:t>
-      </w:r>
-      <w:r>
-        <w:t xml:space="preserve">with</w:t>
-      </w:r>
-      <w:r>
-        <w:t xml:space="preserve"> </w:t>
-      </w:r>
-      <w:r>
-        <w:t xml:space="preserve">this</w:t>
-      </w:r>
-      <w:r>
-        <w:t xml:space="preserve"> </w:t>
-      </w:r>
-      <w:r>
-        <w:t xml:space="preserve">interpretation</w:t>
-      </w:r>
-      <w:r>
-        <w:t xml:space="preserve"> </w:t>
-      </w:r>
-      <w:r>
-        <w:t xml:space="preserve">but</w:t>
-      </w:r>
-      <w:r>
-        <w:t xml:space="preserve"> </w:t>
-      </w:r>
-      <w:r>
-        <w:t xml:space="preserve">does</w:t>
-      </w:r>
-      <w:r>
-        <w:t xml:space="preserve"> </w:t>
-      </w:r>
-      <w:r>
-        <w:t xml:space="preserve">not</w:t>
-      </w:r>
-      <w:r>
-        <w:t xml:space="preserve"> </w:t>
-      </w:r>
-      <w:r>
-        <w:t xml:space="preserve">establish</w:t>
-      </w:r>
-      <w:r>
-        <w:t xml:space="preserve"> </w:t>
-      </w:r>
-      <w:r>
-        <w:t xml:space="preserve">it,</w:t>
-      </w:r>
-      <w:r>
-        <w:t xml:space="preserve"> </w:t>
-      </w:r>
-      <w:r>
-        <w:t xml:space="preserve">and</w:t>
-      </w:r>
-      <w:r>
-        <w:t xml:space="preserve"> </w:t>
-      </w:r>
-      <w:r>
-        <w:t xml:space="preserve">the</w:t>
-      </w:r>
-      <w:r>
-        <w:t xml:space="preserve"> </w:t>
-      </w:r>
-      <w:r>
-        <w:t xml:space="preserve">connectivity</w:t>
-      </w:r>
-      <w:r>
-        <w:t xml:space="preserve"> </w:t>
-      </w:r>
-      <w:r>
-        <w:t xml:space="preserve">dynamics</w:t>
-      </w:r>
-      <w:r>
-        <w:t xml:space="preserve"> </w:t>
-      </w:r>
-      <w:r>
-        <w:t xml:space="preserve">of</w:t>
-      </w:r>
-      <w:r>
-        <w:t xml:space="preserve"> </w:t>
-      </w:r>
-      <w:r>
-        <w:t xml:space="preserve">the</w:t>
-      </w:r>
-      <w:r>
-        <w:t xml:space="preserve"> </w:t>
-      </w:r>
-      <w:r>
-        <w:t xml:space="preserve">two</w:t>
-      </w:r>
-      <w:r>
-        <w:t xml:space="preserve"> </w:t>
-      </w:r>
-      <w:r>
-        <w:t xml:space="preserve">phases</w:t>
-      </w:r>
-      <w:r>
-        <w:t xml:space="preserve"> </w:t>
-      </w:r>
-      <w:r>
-        <w:t xml:space="preserve">should</w:t>
-      </w:r>
-      <w:r>
-        <w:t xml:space="preserve"> </w:t>
-      </w:r>
-      <w:r>
-        <w:t xml:space="preserve">be</w:t>
-      </w:r>
-      <w:r>
-        <w:t xml:space="preserve"> </w:t>
-      </w:r>
-      <w:r>
-        <w:t xml:space="preserve">compared</w:t>
-      </w:r>
-      <w:r>
-        <w:t xml:space="preserve"> </w:t>
-      </w:r>
-      <w:r>
-        <w:t xml:space="preserve">net</w:t>
-      </w:r>
-      <w:r>
-        <w:t xml:space="preserve"> </w:t>
-      </w:r>
-      <w:r>
-        <w:t xml:space="preserve">of</w:t>
-      </w:r>
-      <w:r>
-        <w:t xml:space="preserve"> </w:t>
-      </w:r>
-      <w:r>
-        <w:t xml:space="preserve">network</w:t>
-      </w:r>
-      <w:r>
-        <w:t xml:space="preserve"> </w:t>
-      </w:r>
-      <w:r>
-        <w:t xml:space="preserve">size</w:t>
-      </w:r>
-      <w:r>
-        <w:t xml:space="preserve"> </w:t>
-      </w:r>
-      <w:r>
-        <w:t xml:space="preserve">rather</w:t>
-      </w:r>
-      <w:r>
-        <w:t xml:space="preserve"> </w:t>
-      </w:r>
-      <w:r>
-        <w:t xml:space="preserve">than</w:t>
-      </w:r>
-      <w:r>
-        <w:t xml:space="preserve"> </w:t>
-      </w:r>
-      <w:r>
-        <w:t xml:space="preserve">through</w:t>
-      </w:r>
-      <w:r>
-        <w:t xml:space="preserve"> </w:t>
-      </w:r>
-      <w:r>
-        <w:t xml:space="preserve">a</w:t>
-      </w:r>
-      <w:r>
-        <w:t xml:space="preserve"> </w:t>
-      </w:r>
-      <w:r>
-        <w:t xml:space="preserve">simple</w:t>
-      </w:r>
-      <w:r>
-        <w:t xml:space="preserve"> </w:t>
-      </w:r>
-      <w:r>
-        <w:t xml:space="preserve">densest-hub</w:t>
-      </w:r>
-      <w:r>
-        <w:t xml:space="preserve"> </w:t>
-      </w:r>
-      <w:r>
-        <w:t xml:space="preserve">narrative.</w:t>
+        <w:t xml:space="preserve">Homo sapiens</w:t>
+      </w:r>
+      <w:r>
+        <w:t xml:space="preserve"> </w:t>
+      </w:r>
+      <w:r>
+        <w:t xml:space="preserve">into Western Eurasia, yet the evolution of social organization during this transition remains debated. Here we investigate social dynamics through the analysis of geometric signs on mobile objects within a two-phase framework (Aur-P1/Aur-P2; Shao et al. 2021) that respects specialist technological attributions in site assignment. Using seriation and network analysis, we examine whether sign distribution reflects cultural grouping within each phase, and whether the sign-sharing network differs between the early and late Aurignacian. Within the early phase (Aur-P1; 20 sites) we identify a robust two-group structure of restricted versus broad geometric-sign repertoires that is stable under bootstrap resampling and largely recovered by an independent stochastic block model. The small late phase (Aur-P2; 9 sites) shows a weaker, less resolved structure. The early phase supports a larger network centred on key sites, but once network size is taken into account the late phase shows higher edge density, and formal permutation tests indicate that the phases do not differ significantly in edge density, modularity, betweenness, or component count, so the observed differences in connectivity track the larger size of the early phase rather than a statistically distinguishable community structure. Mantel tests did not detect a significant correlation between geographic distance and sign distribution in either phase, and the isolation-by-distance relationship does not differ between them, although this null result should be interpreted cautiously given the small sample sizes. These results indicate that the restricted/broad separation is a persistent organisational feature of Aurignacian symbolic culture; the absence of a significant geographic correlation is consistent with this interpretation but does not establish it, and the connectivity dynamics of the two phases should be compared net of network size rather than through a simple densest-hub narrative.</w:t>
+      </w:r>
+    </w:p>
+    <w:p>
+      <w:r>
+        <w:pict>
+          <v:rect style="width:0;height:1.5pt" o:hralign="center" o:hrstd="t" o:hr="t"/>
+        </w:pict>
       </w:r>
     </w:p>
     <w:p>
       <w:pPr>
         <w:pStyle w:val="FirstParagraph"/>
-      </w:pPr>
-      <w:r>
-        <w:rPr>
-          <w:vertAlign w:val="superscript"/>
-        </w:rPr>
-        <w:t xml:space="preserve">1</w:t>
-      </w:r>
-      <w:r>
-        <w:t xml:space="preserve"> </w:t>
-      </w:r>
-      <w:r>
-        <w:t xml:space="preserve">Department of Anthropology, University of Washington, Seattle, USA</w:t>
-      </w:r>
-      <w:r>
-        <w:br/>
-      </w:r>
-      <w:r>
-        <w:rPr>
-          <w:vertAlign w:val="superscript"/>
-        </w:rPr>
-        <w:t xml:space="preserve">2</w:t>
-      </w:r>
-      <w:r>
-        <w:t xml:space="preserve"> </w:t>
-      </w:r>
-      <w:r>
-        <w:t xml:space="preserve">Scientific Computing and Imaging Institute, University of Utah, Salt Lake City, USA</w:t>
-      </w:r>
-    </w:p>
-    <w:p>
-      <w:pPr>
-        <w:pStyle w:val="BodyText"/>
-      </w:pPr>
-      <w:r>
-        <w:rPr>
-          <w:vertAlign w:val="superscript"/>
-        </w:rPr>
-        <w:t xml:space="preserve">✉</w:t>
-      </w:r>
-      <w:r>
-        <w:t xml:space="preserve"> </w:t>
-      </w:r>
-      <w:r>
-        <w:t xml:space="preserve">Correspondence:</w:t>
-      </w:r>
-      <w:r>
-        <w:t xml:space="preserve"> </w:t>
-      </w:r>
-      <w:hyperlink r:id="rId20">
-        <w:r>
-          <w:rPr>
-            <w:rStyle w:val="Hyperlink"/>
-          </w:rPr>
-          <w:t xml:space="preserve">Ben Marwick &lt;bmarwick@uw.edu&gt;</w:t>
-        </w:r>
-      </w:hyperlink>
-    </w:p>
-    <w:p>
-      <w:pPr>
-        <w:pStyle w:val="BodyText"/>
       </w:pPr>
       <w:r>
         <w:t xml:space="preserve">Archaeological evidence from the Upper Palaeolithic period indicates increasingly complex social organization across Europe</w:t>
@@ -2859,7 +1104,7 @@
             <w:r>
               <w:drawing>
                 <wp:inline>
-                  <wp:extent cx="5943600" cy="3714749"/>
+                  <wp:extent cx="5943600" cy="4953000"/>
                   <wp:effectExtent b="0" l="0" r="0" t="0"/>
                   <wp:docPr descr="" title="" id="25" name="Picture"/>
                   <a:graphic>
@@ -2880,7 +1125,7 @@
                         <pic:spPr bwMode="auto">
                           <a:xfrm>
                             <a:off x="0" y="0"/>
-                            <a:ext cx="5943600" cy="3714749"/>
+                            <a:ext cx="5943600" cy="4953000"/>
                           </a:xfrm>
                           <a:prstGeom prst="rect">
                             <a:avLst/>
@@ -3575,7 +1820,7 @@
               <w:pStyle w:val="ImageCaption"/>
             </w:pPr>
             <w:r>
-              <w:t xml:space="preserve">Figure 2: Seriation reveals recurrent group structure across Upper Palaeolithic phases. Presence–absence matrices of geometric sign types reordered using Brower-Kile seriation algorithm for (A) Aur-P1 and (B) Aur-P2 phases. Rows represent sites and columns represent sign types. Blocks of co-occurring signs indicate culturally coherent groupings. Despite chronological turnover in specific sign types, two broad classes of assemblages—restricted-range and broad-range—recur across both phases, suggesting persistent structuring in symbolic signaling practices. Restricted group is in yellow, broader group is in blue.</w:t>
+              <w:t xml:space="preserve">Figure 2: Seriation reveals recurrent group structure across Upper Palaeolithic phases. Presence–absence matrices of geometric sign types reordered using Brower-Kile seriation algorithm for (A) Aur-P1 and (B) Aur-P2 phases. Rows represent sites and columns represent sign types. Blocks of co-occurring signs indicate culturally coherent groupings. Despite chronological turnover in specific sign types, two broad classes of assemblages—restricted-range and broad-range—recur across both phases, suggesting persistent structuring in symbolic signaling practices. Restricted group is in yellow, broader group is in green.</w:t>
             </w:r>
           </w:p>
           <w:bookmarkEnd w:id="36"/>
@@ -3621,7 +1866,7 @@
         <w:pStyle w:val="BodyText"/>
       </w:pPr>
       <w:r>
-        <w:t xml:space="preserve">In Aur-P2 the restricted-range group consists of Les Rois, Sirgenstein Cave, La Viña, Mladeč, Gargas, and Vindija Cave, carrying few sign types, while the broad-range group consists of Trou Magrite, Bockstein-Törle, and Hohle Fels, which share a wider repertoire (including hatching and oblique notch, obnotch; Hohle Fels additionally contributes dashline, dot, cross, zigzag, v, and circumspiral). While the Aur-P1 seriation results hint at a robust two-member structure, the Aur-P2 partition rests on only nine sites and, as the bootstrap and model-selection results show, is both smaller and weaker. Network analysis allows us to evaluate how these groups may have been socially connected.</w:t>
+        <w:t xml:space="preserve">In Aur-P2 the restricted-range group consists of Les Rois, Sirgenstein Cave, La Viña, Mladeč, Gargas, and Vindija Cave, carrying few sign types, while the broad-range group consists of Trou Magrite, Bockstein-Törle, and Hohle Fels, which share a wider repertoire (including hatching and oblique notch, obnotch; Hohle Fels additionally contributes dashline, dot, cross, zigzag, v, and circumspiral). While the Aur-P1 seriation results hint at a robust two-member structure, the Aur-P2 partition rests on only 9 sites and, as the bootstrap and model-selection results show, is both smaller and weaker. Network analysis allows us to evaluate how these groups may have been socially connected.</w:t>
       </w:r>
     </w:p>
     <w:tbl>
@@ -4205,7 +2450,7 @@
         </w:r>
       </w:hyperlink>
       <w:r>
-        <w:t xml:space="preserve">). While R^2 is stable across phases, the pseudo-F statistic differs: the Aur-P1 phase shows the greater group separation (F = 4.382) than Aur-P2 (F = 2.008). The betadisper test for homogeneity of multivariate dispersions shows that group dispersion does not differ significantly between restricted and broad groups in either phase (Aur-P1: p = 0.124, Aur-P2: p = 0.771). This confirms that the perMANOVA results reflect differences in group centroids rather than differences in dispersion.</w:t>
+        <w:t xml:space="preserve">). While R² is stable across phases, the pseudo-F statistic differs: the Aur-P1 phase shows the greater group separation (F = 4.382) than Aur-P2 (F = 2.008). The betadisper test for homogeneity of multivariate dispersions shows that group dispersion does not differ significantly between restricted and broad groups in either phase (Aur-P1: p = 0.124, Aur-P2: p = 0.771). This confirms that the perMANOVA results reflect differences in group centroids rather than differences in dispersion.</w:t>
       </w:r>
     </w:p>
     <w:bookmarkEnd w:id="51"/>
@@ -4661,7 +2906,7 @@
         </w:r>
       </w:hyperlink>
       <w:r>
-        <w:t xml:space="preserve">). Supporting this distinction, diversity excess (as an indicator of aggregation candidates) showed a significant negative correlation with network degree (ρ = -0.35, p = 0.0614295), indicating that aggregation candidates are less connected rather than merely decoupled from network hubs. The correlation with betweenness was not significant (ρ = -0.18, p = 0.3487049). Object count was positively correlated with degree centrality (degree: ρ = 0.35, p = 0.063328), indicating that hubs tend to be among the better-sampled sites. The elevated diversity identifying aggregation candidates did not differ significantly between the restricted and broad-range groups (Wilcoxon W = 59, p = 0.0436321), so this metric does not by itself track the restricted/broad grouping.</w:t>
+        <w:t xml:space="preserve">). Supporting this distinction, diversity excess (as an indicator of aggregation candidates) showed a significant negative correlation with network degree (ρ = -0.35, p = 0.061), indicating that aggregation candidates are less connected rather than merely decoupled from network hubs. The correlation with betweenness was not significant (ρ = -0.18, p = 0.349). Object count was positively correlated with degree centrality (degree: ρ = 0.35, p = 0.063328), indicating that hubs tend to be among the better-sampled sites. The elevated diversity identifying aggregation candidates did not differ significantly between the restricted and broad-range groups (Wilcoxon W = 59, p = 0.044), so this metric does not by itself track the restricted/broad grouping.</w:t>
       </w:r>
     </w:p>
     <w:tbl>
@@ -5428,7 +3673,7 @@
         <w:t xml:space="preserve">[32]</w:t>
       </w:r>
       <w:r>
-        <w:t xml:space="preserve">. After exclusions, Aur-P2 rests on only 9 sites and 63 objects, so its two-group structure and network statistics must be read with explicit power caveats, and any claim about it is made conditional on that small sample. We test the sensitivity of our assignments to reverting to purely date-based criteria in Supplement S8. The Proto/Early merger reflects this documented chronological overlap and further avoids treating the poorly-sampled Proto as a distinct analytic phase.</w:t>
+        <w:t xml:space="preserve">. After exclusions, Aur-P2 rests on only 9 sites and 9 objects, so its two-group structure and network statistics must be read with explicit power caveats, and any claim about it is made conditional on that small sample. We test the sensitivity of our assignments to reverting to purely date-based criteria in Supplement S8. The Proto/Early merger reflects this documented chronological overlap and further avoids treating the poorly-sampled Proto as a distinct analytic phase.</w:t>
       </w:r>
     </w:p>
     <w:bookmarkEnd w:id="60"/>

</xml_diff>

<commit_message>
fixing a bug in aperm()
</commit_message>
<xml_diff>
--- a/paper/paper.docx
+++ b/paper/paper.docx
@@ -2084,7 +2084,7 @@
         <w:t xml:space="preserve">4</w:t>
       </w:r>
       <w:r>
-        <w:t xml:space="preserve">) assessing whether the observed statistics differ from a random distribution within each phase, and pairwise randomisation tests comparing the two phases. Within-phase, edge density does not significantly differ from random in either phase. Modularity is moderate in Aur-P1 (0.3-0.4), consistent with the restricted/broad community structure</w:t>
+        <w:t xml:space="preserve">) assessing whether the observed statistics differ from a random distribution within each phase, and pairwise randomisation tests comparing the two phases. Within-phase, Aur-P2 edge density is significantly higher than expected under random site assignment (p &lt; 0.001), while Aur-P1 edge density does not differ from the within-phase null. Aur-P1’s modularity and betweenness are likewise significantly higher than expected (p &lt; 0.001), consistent with the restricted/broad community structure</w:t>
       </w:r>
       <w:r>
         <w:t xml:space="preserve"> </w:t>
@@ -2093,7 +2093,7 @@
         <w:t xml:space="preserve">[46]</w:t>
       </w:r>
       <w:r>
-        <w:t xml:space="preserve">, and the null-benchmarked and size-normalised (Erdős–Rényi) comparisons in our Supplementary Material item</w:t>
+        <w:t xml:space="preserve">, whereas Aur-P2’s modularity and betweenness, and both phases’ component counts, do not differ from the null. The null-benchmarked and size-normalised (Erdős–Rényi) comparisons in our Supplementary Material item</w:t>
       </w:r>
       <w:r>
         <w:t xml:space="preserve"> </w:t>

</xml_diff>

<commit_message>
refresh reply to reviewers
</commit_message>
<xml_diff>
--- a/paper/paper.docx
+++ b/paper/paper.docx
@@ -253,40 +253,7 @@
         <w:pStyle w:val="BodyText"/>
       </w:pPr>
       <w:r>
-        <w:t>Abstract: The Aurignacian technocomplex (ca. 43–30 ka BP) marks a pivotal expansion of Homo sapiens into Western Eurasia, yet the evolution of social organization during this transition remains debated. Here we investigate social dynamics through the analysis of geometric signs on mobile objects within a two-phase framework (Aur-P1/Aur-P2; Shao et al. 2021) that respects specialist technological attributions in site assignment. Using seriation and network analysis, we examine whether sign distribution reflects cultural grouping within each phase, and whether the sign-sharing network differs between the early and late Aurignacian. Within the early phase (Aur-P1; 20 sites) we identify a robust two-group structure of restricted versus broad geometric-sign repertoires that is stable under bootstrap resampling and largely recovered by an independent stochastic block model. The small late phase (Aur-P2; 9 sites) shows a weaker, less resolved structure. The early phase supports a larger network centred on key sites, but once network size is taken into account the late phase shows descriptively higher edge density (though not statistically significant, p = 0.4404), and formal permutation tests indicate that the phases do not differ significantly in edge density, modularity, mean betweenness, or component count, so the observed differences in connectivity track the larger size of the early phase rather than a statistically distinguishable community structure. Mantel tests did not detect a significant correlation between geographic distance and sign distribution in either phase, and the isolation-by-distance relationship does not differ between them, although this null result should be interpreted cautiously given the small sample sizes. These results indicate that the restricted/broad separation is a persistent organisational feature of Aurignacian symbolic culture; the absence of a significant geographic correlation is consistent with this interpretation but does not establish it, and the connectivity dynamics of the two phases should be compared net of network size rather than through a simple densest-hub narrative.</w:t>
-      </w:r>
-    </w:p>
-    <w:p>
-      <w:r>
-        <w:pict>
-          <v:rect style="width:0;height:1.5pt" o:hralign="center" o:hrstd="t" o:hr="t"/>
-        </w:pict>
-      </w:r>
-    </w:p>
-    <w:p>
-      <w:pPr>
-        <w:pStyle w:val="FirstParagraph"/>
-      </w:pPr>
-      <w:r>
-        <w:t xml:space="preserve">Archaeological evidence from the Upper Palaeolithic period indicates increasingly complex social organization across Europe</w:t>
-      </w:r>
-      <w:r>
-        <w:t xml:space="preserve"> </w:t>
-      </w:r>
-      <w:r>
-        <w:t xml:space="preserve">[1]</w:t>
-      </w:r>
-      <w:r>
-        <w:t xml:space="preserve">. Archaeologists have frequently used ancient art, the abundance of which is a distinctive quality of the period, as a proxy for cultural difference in order to understand the shifting patterns of social organization and diversity of the Upper Palaeolithic</w:t>
-      </w:r>
-      <w:r>
-        <w:t xml:space="preserve"> </w:t>
-      </w:r>
-      <w:r>
-        <w:t xml:space="preserve">[2–7]</w:t>
-      </w:r>
-      <w:r>
-        <w:t xml:space="preserve">. The Aurignacian technocomplex (ca. 43–30 ka BP) is often linked to the dispersal of</w:t>
+        <w:t xml:space="preserve">Abstract: The Aurignacian technocomplex (ca. 43–30 ka BP) marks a pivotal expansion of</w:t>
       </w:r>
       <w:r>
         <w:t xml:space="preserve"> </w:t>
@@ -302,43 +269,14 @@
         <w:t xml:space="preserve"> </w:t>
       </w:r>
       <w:r>
-        <w:t xml:space="preserve">across Western Eurasia, and is characterized by lithic and osseous markers</w:t>
-      </w:r>
-      <w:r>
-        <w:t xml:space="preserve"> </w:t>
-      </w:r>
-      <w:r>
-        <w:t xml:space="preserve">[8,9]</w:t>
-      </w:r>
-      <w:r>
-        <w:t xml:space="preserve">, some of which are decorated with geometric signs</w:t>
-      </w:r>
-      <w:r>
-        <w:t xml:space="preserve"> </w:t>
-      </w:r>
-      <w:r>
-        <w:t xml:space="preserve">[10]</w:t>
-      </w:r>
-      <w:r>
-        <w:t xml:space="preserve">. Personal ornaments, such as the 41,500 year-old decorated ivory pendant from Stajnia Cave</w:t>
-      </w:r>
-      <w:r>
-        <w:t xml:space="preserve"> </w:t>
-      </w:r>
-      <w:r>
-        <w:t xml:space="preserve">[11]</w:t>
-      </w:r>
-      <w:r>
-        <w:t xml:space="preserve">, provide direct evidence of symbolic behavior and cultural connectivity during this period. We investigated human social organization dynamics implied by the distribution and variation of geometric sign types found on mobile objects in Europe within a two-phase framework (Aur-P1/Aur-P2; Shao et al. 2021).</w:t>
-      </w:r>
-    </w:p>
-    <w:bookmarkStart w:id="21" w:name="X06869f42bdedda871dbae178d8ab917db5544af"/>
-    <w:p>
-      <w:pPr>
-        <w:pStyle w:val="Heading2"/>
-      </w:pPr>
-      <w:r>
-        <w:t xml:space="preserve">Cultural group identification in the Upper Palaeolithic</w:t>
+        <w:t xml:space="preserve">into Western Eurasia, yet the evolution of social organization during this transition remains debated. Here we investigate social dynamics through the analysis of geometric signs on mobile objects within a two-phase framework (Aur-P1/Aur-P2; Shao et al. 2021) that respects specialist technological attributions in site assignment. Using seriation and network analysis, we examine whether sign distribution reflects sign-use grouping within each phase, and whether the sign-sharing network differs between the early and late Aurignacian. Within the early phase (Aur-P1; 20 sites) we identify a robust two-group structure of restricted versus broad geometric-sign repertoires that is stable under bootstrap resampling and largely recovered by an independent stochastic block model. The small late phase (Aur-P2; 9 sites) shows a weaker, less resolved structure. The early phase supports a larger network centred on key sites, but formal permutation tests indicate that the phases do not differ significantly in edge density, modularity, mean betweenness, or component count, so the observed differences in connectivity track the larger size of the early phase rather than a statistically distinguishable community structure. Mantel tests did not detect a significant correlation between geographic distance and sign distribution in either phase, and the isolation-by-distance relationship does not differ between them, although this null result should be interpreted cautiously given the small sample sizes. These results indicate that the restricted/broad separation is a persistent organisational feature of Aurignacian symbolic culture; the absence of a significant geographic correlation is consistent with this interpretation but does not establish it, and the connectivity dynamics of the two phases should be compared net of network size rather than through a simple densest-hub narrative.</w:t>
+      </w:r>
+    </w:p>
+    <w:p>
+      <w:r>
+        <w:pict>
+          <v:rect style="width:0;height:1.5pt" o:hralign="center" o:hrstd="t" o:hr="t"/>
+        </w:pict>
       </w:r>
     </w:p>
     <w:p>
@@ -346,106 +284,25 @@
         <w:pStyle w:val="FirstParagraph"/>
       </w:pPr>
       <w:r>
-        <w:t xml:space="preserve">Previous work has fruitfully explored social organization dynamics of the Upper Palaeolithic using statistical analyses of objects to understand patterns of cultural groups. Multivariate analyses of beads from the Gravettian technocomplex suggest an east to west cline of nine cultural groups</w:t>
-      </w:r>
-      <w:r>
-        <w:t xml:space="preserve"> </w:t>
-      </w:r>
-      <w:r>
-        <w:t xml:space="preserve">[3]</w:t>
-      </w:r>
-      <w:r>
-        <w:t xml:space="preserve">. Seriation analysis, PCoA, and network analysis were used to identify groups from 134 discrete bead types recovered from both burial and occupation sites. To validate their claims of cultural groups,</w:t>
-      </w:r>
-      <w:r>
-        <w:t xml:space="preserve"> </w:t>
-      </w:r>
-      <w:r>
-        <w:t xml:space="preserve">[3]</w:t>
-      </w:r>
-      <w:r>
-        <w:t xml:space="preserve"> </w:t>
-      </w:r>
-      <w:r>
-        <w:t xml:space="preserve">used a Mantel test to evaluate an isolation-by-distance hypothesis, which proposes that cultural difference can be primarily explained by geographic distance. They found that geographic distance alone did not solely account for the bead distribution. The nine geographically discrete groups encompass the regions of eastern, northwestern and central Europe, the northern and southern Iberian peninsula, southern and northern Italy, and the eastern and western Mediterranean regions.</w:t>
-      </w:r>
-    </w:p>
-    <w:p>
-      <w:pPr>
-        <w:pStyle w:val="BodyText"/>
-      </w:pPr>
-      <w:r>
-        <w:t xml:space="preserve">Similar analyses of personal ornament types from the Aurignacian identified fourteen geographically cohesive groups</w:t>
-      </w:r>
-      <w:r>
-        <w:t xml:space="preserve"> </w:t>
-      </w:r>
-      <w:r>
-        <w:t xml:space="preserve">[6]</w:t>
-      </w:r>
-      <w:r>
-        <w:t xml:space="preserve">. Drawing on ethnographic studies that show how body decoration and ornamentation indicate ethno-linguistic identity,</w:t>
-      </w:r>
-      <w:r>
-        <w:t xml:space="preserve"> </w:t>
-      </w:r>
-      <w:r>
-        <w:t xml:space="preserve">[6]</w:t>
-      </w:r>
-      <w:r>
-        <w:t xml:space="preserve"> </w:t>
-      </w:r>
-      <w:r>
-        <w:t xml:space="preserve">used Aurignacian personal ornamentation as a proxy for ethno-linguistic diversity. The variation in personal ornament types is interpreted as evidence of long-lasting cultural differences and as robustly establishing the ethno-linguistic diversity of the Aurignacian period. Seriation, correspondence, and GIS analyses of 157 distinct ornament types from 98 Aurignacian sites in Europe and the Near East identified geographically cohesive groups sharing similar ornament type associations. These groups sweep counter-clockwise throughout western France, northern Spain, the Pyrenees, and the Mediterranean region.</w:t>
-      </w:r>
-    </w:p>
-    <w:p>
-      <w:pPr>
-        <w:pStyle w:val="BodyText"/>
-      </w:pPr>
-      <w:r>
-        <w:t xml:space="preserve">Cultural groups have also been identified from forty-two quadrilateral geometric signs from four cave sites in the Cantabrian region of Spain, likely associated with the Magdalenian period, spanning a distance of 30 kilometers</w:t>
-      </w:r>
-      <w:r>
-        <w:t xml:space="preserve"> </w:t>
-      </w:r>
-      <w:r>
-        <w:t xml:space="preserve">[4]</w:t>
-      </w:r>
-      <w:r>
-        <w:t xml:space="preserve">. Multivariate analysis of 45 morphological characteristics of the signs revealed two clusters. To interpret these clusters,</w:t>
-      </w:r>
-      <w:r>
-        <w:t xml:space="preserve"> </w:t>
-      </w:r>
-      <w:r>
-        <w:t xml:space="preserve">[4]</w:t>
-      </w:r>
-      <w:r>
-        <w:t xml:space="preserve"> </w:t>
-      </w:r>
-      <w:r>
-        <w:t xml:space="preserve">drew on case studies of geometric signs as identity markers, including South African engraved ostrich shells from 60 ka BP, maker’s marks on Gallo-Roman pottery, and 19th century French craft guild members’ personal marks. Using these case studies as analogies,</w:t>
-      </w:r>
-      <w:r>
-        <w:t xml:space="preserve"> </w:t>
-      </w:r>
-      <w:r>
-        <w:t xml:space="preserve">[4]</w:t>
-      </w:r>
-      <w:r>
-        <w:t xml:space="preserve"> </w:t>
-      </w:r>
-      <w:r>
-        <w:t xml:space="preserve">interpreted the Magdalenian geometric signs as identity markers, and the two clusters as representative of two cultural groups.</w:t>
-      </w:r>
-    </w:p>
-    <w:p>
-      <w:pPr>
-        <w:pStyle w:val="BodyText"/>
-      </w:pPr>
-      <w:r>
-        <w:t xml:space="preserve">In this study, we extend this previous work using geometric signs as identity markers to investigate cultural group dynamics in the Aurignacian period, providing a novel approach to understanding how early groups of</w:t>
+        <w:t xml:space="preserve">Archaeological evidence from the Upper Palaeolithic period indicates increasingly complex social organization across Europe</w:t>
+      </w:r>
+      <w:r>
+        <w:t xml:space="preserve"> </w:t>
+      </w:r>
+      <w:r>
+        <w:t xml:space="preserve">[1]</w:t>
+      </w:r>
+      <w:r>
+        <w:t xml:space="preserve">. Archaeologists have frequently used ancient art, the abundance of which is a distinctive quality of the period, as a proxy for cultural difference in order to understand the shifting patterns of social organization and diversity of the Upper Palaeolithic</w:t>
+      </w:r>
+      <w:r>
+        <w:t xml:space="preserve"> </w:t>
+      </w:r>
+      <w:r>
+        <w:t xml:space="preserve">[2–7]</w:t>
+      </w:r>
+      <w:r>
+        <w:t xml:space="preserve">. The Aurignacian technocomplex (ca. 43–30 ka BP) is often linked to the dispersal of</w:t>
       </w:r>
       <w:r>
         <w:t xml:space="preserve"> </w:t>
@@ -461,6 +318,165 @@
         <w:t xml:space="preserve"> </w:t>
       </w:r>
       <w:r>
+        <w:t xml:space="preserve">across Western Eurasia, and is characterized by lithic and osseous markers</w:t>
+      </w:r>
+      <w:r>
+        <w:t xml:space="preserve"> </w:t>
+      </w:r>
+      <w:r>
+        <w:t xml:space="preserve">[8,9]</w:t>
+      </w:r>
+      <w:r>
+        <w:t xml:space="preserve">, some of which are decorated with geometric signs</w:t>
+      </w:r>
+      <w:r>
+        <w:t xml:space="preserve"> </w:t>
+      </w:r>
+      <w:r>
+        <w:t xml:space="preserve">[10]</w:t>
+      </w:r>
+      <w:r>
+        <w:t xml:space="preserve">. Personal ornaments, such as the 41,500 year-old decorated ivory pendant from Stajnia Cave</w:t>
+      </w:r>
+      <w:r>
+        <w:t xml:space="preserve"> </w:t>
+      </w:r>
+      <w:r>
+        <w:t xml:space="preserve">[11]</w:t>
+      </w:r>
+      <w:r>
+        <w:t xml:space="preserve">, provide direct evidence of symbolic behavior and cultural connectivity during this period. We investigated human social organization dynamics implied by the distribution and variation of geometric sign types found on mobile objects in Europe within a two-phase framework (Aur-P1/Aur-P2; Shao et al. 2021).</w:t>
+      </w:r>
+    </w:p>
+    <w:bookmarkStart w:id="21" w:name="X06869f42bdedda871dbae178d8ab917db5544af"/>
+    <w:p>
+      <w:pPr>
+        <w:pStyle w:val="Heading2"/>
+      </w:pPr>
+      <w:r>
+        <w:t xml:space="preserve">Cultural group identification in the Upper Palaeolithic</w:t>
+      </w:r>
+    </w:p>
+    <w:p>
+      <w:pPr>
+        <w:pStyle w:val="FirstParagraph"/>
+      </w:pPr>
+      <w:r>
+        <w:t xml:space="preserve">Previous work has fruitfully explored social organization dynamics of the Upper Palaeolithic using statistical analyses of objects to understand patterns of cultural groups. Multivariate analyses of beads from the Gravettian technocomplex suggest an east to west cline of nine cultural groups</w:t>
+      </w:r>
+      <w:r>
+        <w:t xml:space="preserve"> </w:t>
+      </w:r>
+      <w:r>
+        <w:t xml:space="preserve">[3]</w:t>
+      </w:r>
+      <w:r>
+        <w:t xml:space="preserve">. Seriation analysis, PCoA, and network analysis were used to identify groups from 134 discrete bead types recovered from both burial and occupation sites. To validate their claims of cultural groups,</w:t>
+      </w:r>
+      <w:r>
+        <w:t xml:space="preserve"> </w:t>
+      </w:r>
+      <w:r>
+        <w:t xml:space="preserve">[3]</w:t>
+      </w:r>
+      <w:r>
+        <w:t xml:space="preserve"> </w:t>
+      </w:r>
+      <w:r>
+        <w:t xml:space="preserve">used a Mantel test to evaluate an isolation-by-distance hypothesis, which proposes that cultural difference can be primarily explained by geographic distance. They found that geographic distance alone did not solely account for the bead distribution. The nine geographically discrete groups encompass the regions of eastern, northwestern and central Europe, the northern and southern Iberian peninsula, southern and northern Italy, and the eastern and western Mediterranean regions.</w:t>
+      </w:r>
+    </w:p>
+    <w:p>
+      <w:pPr>
+        <w:pStyle w:val="BodyText"/>
+      </w:pPr>
+      <w:r>
+        <w:t xml:space="preserve">Similar analyses of personal ornament types from the Aurignacian identified fourteen geographically cohesive groups</w:t>
+      </w:r>
+      <w:r>
+        <w:t xml:space="preserve"> </w:t>
+      </w:r>
+      <w:r>
+        <w:t xml:space="preserve">[6]</w:t>
+      </w:r>
+      <w:r>
+        <w:t xml:space="preserve">. Drawing on ethnographic studies that show how body decoration and ornamentation indicate ethno-linguistic identity,</w:t>
+      </w:r>
+      <w:r>
+        <w:t xml:space="preserve"> </w:t>
+      </w:r>
+      <w:r>
+        <w:t xml:space="preserve">[6]</w:t>
+      </w:r>
+      <w:r>
+        <w:t xml:space="preserve"> </w:t>
+      </w:r>
+      <w:r>
+        <w:t xml:space="preserve">used Aurignacian personal ornamentation as a proxy for ethno-linguistic diversity. The variation in personal ornament types is interpreted as evidence of long-lasting cultural differences and as robustly establishing the ethno-linguistic diversity of the Aurignacian period. Seriation, correspondence, and GIS analyses of 157 distinct ornament types from 98 Aurignacian sites in Europe and the Near East identified geographically cohesive groups sharing similar ornament type associations. These groups sweep counter-clockwise throughout western France, northern Spain, the Pyrenees, and the Mediterranean region.</w:t>
+      </w:r>
+    </w:p>
+    <w:p>
+      <w:pPr>
+        <w:pStyle w:val="BodyText"/>
+      </w:pPr>
+      <w:r>
+        <w:t xml:space="preserve">Cultural groups have also been identified from forty-two quadrilateral geometric signs from four cave sites in the Cantabrian region of Spain, likely associated with the Magdalenian period, spanning a distance of 30 kilometers</w:t>
+      </w:r>
+      <w:r>
+        <w:t xml:space="preserve"> </w:t>
+      </w:r>
+      <w:r>
+        <w:t xml:space="preserve">[4]</w:t>
+      </w:r>
+      <w:r>
+        <w:t xml:space="preserve">. Multivariate analysis of 45 morphological characteristics of the signs revealed two clusters. To interpret these clusters,</w:t>
+      </w:r>
+      <w:r>
+        <w:t xml:space="preserve"> </w:t>
+      </w:r>
+      <w:r>
+        <w:t xml:space="preserve">[4]</w:t>
+      </w:r>
+      <w:r>
+        <w:t xml:space="preserve"> </w:t>
+      </w:r>
+      <w:r>
+        <w:t xml:space="preserve">drew on case studies of geometric signs as identity markers, including South African engraved ostrich shells from 60 ka BP, maker’s marks on Gallo-Roman pottery, and 19th century French craft guild members’ personal marks. Using these case studies as analogies,</w:t>
+      </w:r>
+      <w:r>
+        <w:t xml:space="preserve"> </w:t>
+      </w:r>
+      <w:r>
+        <w:t xml:space="preserve">[4]</w:t>
+      </w:r>
+      <w:r>
+        <w:t xml:space="preserve"> </w:t>
+      </w:r>
+      <w:r>
+        <w:t xml:space="preserve">interpreted the Magdalenian geometric signs as identity markers, and the two clusters as representative of two cultural groups.</w:t>
+      </w:r>
+    </w:p>
+    <w:p>
+      <w:pPr>
+        <w:pStyle w:val="BodyText"/>
+      </w:pPr>
+      <w:r>
+        <w:t xml:space="preserve">In this study, we extend this previous work using geometric signs as identity markers to investigate cultural group dynamics in the Aurignacian period, providing a novel approach to understanding how early groups of</w:t>
+      </w:r>
+      <w:r>
+        <w:t xml:space="preserve"> </w:t>
+      </w:r>
+      <w:r>
+        <w:rPr>
+          <w:iCs/>
+          <w:i/>
+        </w:rPr>
+        <w:t xml:space="preserve">Homo sapiens</w:t>
+      </w:r>
+      <w:r>
+        <w:t xml:space="preserve"> </w:t>
+      </w:r>
+      <w:r>
         <w:t xml:space="preserve">interacted with each other and their environments. Our archaeological and modelling results support the view that geometric signs are informative proxies for reconstructing past cultural diversity and correlate with past population dynamics.</w:t>
       </w:r>
     </w:p>
@@ -717,7 +733,25 @@
         <w:t xml:space="preserve"> </w:t>
       </w:r>
       <w:r>
-        <w:t xml:space="preserve">and El Castillo. The robustness of these assignments to reverting to purely date-based criteria is tested in Supplement S8, where stratigraphic mixing concerns at Vogelherd are also addressed</w:t>
+        <w:t xml:space="preserve">and El Castillo. The robustness of these assignments to reverting to purely date-based criteria is tested in Supplement</w:t>
+      </w:r>
+      <w:r>
+        <w:t xml:space="preserve"> </w:t>
+      </w:r>
+      <w:r>
+        <w:t xml:space="preserve">“</w:t>
+      </w:r>
+      <w:r>
+        <w:t xml:space="preserve">Site Phase Assignments</w:t>
+      </w:r>
+      <w:r>
+        <w:t xml:space="preserve">”</w:t>
+      </w:r>
+      <w:r>
+        <w:t xml:space="preserve"> </w:t>
+      </w:r>
+      <w:r>
+        <w:t xml:space="preserve">S8, where stratigraphic mixing concerns at Vogelherd are also addressed</w:t>
       </w:r>
       <w:r>
         <w:t xml:space="preserve"> </w:t>
@@ -763,37 +797,57 @@
       <w:tblPr>
         <w:tblStyle w:val="Table"/>
         <w:tblW w:type="pct" w:w="5000"/>
-        <w:tblLook w:firstRow="0" w:lastRow="0" w:firstColumn="0" w:lastColumn="0" w:noHBand="0" w:noVBand="0" w:val="0000"/>
+        <w:tblLook w:firstRow="1" w:lastRow="1" w:firstColumn="0" w:lastColumn="0" w:noHBand="0" w:noVBand="0" w:val="0023"/>
         <w:jc w:val="start"/>
         <w:tblLayout w:type="fixed"/>
+        <w:tblBorders>
+          <w:top w:val="single" w:sz="8" w:space="0" w:color="000000"/>
+          <w:bottom w:val="single" w:sz="8" w:space="0" w:color="000000"/>
+          <w:insideH w:val="none" w:sz="8" w:space="0" w:color="000000"/>
+        </w:tblBorders>
       </w:tblPr>
       <w:tblGrid>
         <w:gridCol w:w="7920"/>
       </w:tblGrid>
       <w:tr>
         <w:tc>
-          <w:tcPr/>
+          <w:tcPr>
+            <w:tcBorders>
+              <w:top w:val="single" w:sz="8" w:space="0" w:color="000000"/>
+              <w:bottom w:val="single" w:sz="8" w:space="0" w:color="000000"/>
+            </w:tcBorders>
+          </w:tcPr>
           <w:bookmarkStart w:id="22" w:name="tbl-aur-table"/>
           <w:tbl>
             <w:tblPr>
               <w:tblStyle w:val="Table"/>
               <w:tblW w:type="pct" w:w="5000"/>
-              <w:tblLook w:firstRow="1" w:lastRow="0" w:firstColumn="0" w:lastColumn="0" w:noHBand="0" w:noVBand="0" w:val="0020"/>
+              <w:tblLook w:firstRow="1" w:lastRow="1" w:firstColumn="0" w:lastColumn="0" w:noHBand="0" w:noVBand="0" w:val="0023"/>
               <w:jc w:val="start"/>
               <w:tblLayout w:type="fixed"/>
+              <w:tblBorders>
+                <w:top w:val="single" w:sz="8" w:space="0" w:color="000000"/>
+                <w:bottom w:val="single" w:sz="8" w:space="0" w:color="000000"/>
+                <w:insideH w:val="none" w:sz="8" w:space="0" w:color="000000"/>
+              </w:tblBorders>
             </w:tblPr>
             <w:tblGrid>
-              <w:gridCol w:w="208"/>
-              <w:gridCol w:w="170"/>
-              <w:gridCol w:w="6914"/>
-              <w:gridCol w:w="626"/>
+              <w:gridCol w:w="205"/>
+              <w:gridCol w:w="168"/>
+              <w:gridCol w:w="6928"/>
+              <w:gridCol w:w="617"/>
             </w:tblGrid>
             <w:tr>
               <w:trPr>
                 <w:tblHeader w:val="true"/>
               </w:trPr>
               <w:tc>
-                <w:tcPr/>
+                <w:tcPr>
+                  <w:tcBorders>
+                    <w:top w:val="single" w:sz="8" w:space="0" w:color="000000"/>
+                    <w:bottom w:val="single" w:sz="8" w:space="0" w:color="000000"/>
+                  </w:tcBorders>
+                </w:tcPr>
                 <w:p>
                   <w:pPr>
                     <w:pStyle w:val="Compact"/>
@@ -801,12 +855,22 @@
                     <w:jc w:val="center"/>
                   </w:pPr>
                   <w:r>
+                    <w:rPr>
+                      <w:rFonts w:ascii="Arial" w:hAnsi="Arial" w:eastAsia="Arial" w:cs="Arial"/>
+                      <w:sz w:val="16"/>
+                      <w:szCs w:val="16"/>
+                    </w:rPr>
                     <w:t xml:space="preserve">Time Period Name</w:t>
                   </w:r>
                 </w:p>
               </w:tc>
               <w:tc>
-                <w:tcPr/>
+                <w:tcPr>
+                  <w:tcBorders>
+                    <w:top w:val="single" w:sz="8" w:space="0" w:color="000000"/>
+                    <w:bottom w:val="single" w:sz="8" w:space="0" w:color="000000"/>
+                  </w:tcBorders>
+                </w:tcPr>
                 <w:p>
                   <w:pPr>
                     <w:pStyle w:val="Compact"/>
@@ -814,12 +878,22 @@
                     <w:jc w:val="center"/>
                   </w:pPr>
                   <w:r>
+                    <w:rPr>
+                      <w:rFonts w:ascii="Arial" w:hAnsi="Arial" w:eastAsia="Arial" w:cs="Arial"/>
+                      <w:sz w:val="16"/>
+                      <w:szCs w:val="16"/>
+                    </w:rPr>
                     <w:t xml:space="preserve">Dates (ka cal BP)</w:t>
                   </w:r>
                 </w:p>
               </w:tc>
               <w:tc>
-                <w:tcPr/>
+                <w:tcPr>
+                  <w:tcBorders>
+                    <w:top w:val="single" w:sz="8" w:space="0" w:color="000000"/>
+                    <w:bottom w:val="single" w:sz="8" w:space="0" w:color="000000"/>
+                  </w:tcBorders>
+                </w:tcPr>
                 <w:p>
                   <w:pPr>
                     <w:pStyle w:val="Compact"/>
@@ -827,12 +901,22 @@
                     <w:jc w:val="center"/>
                   </w:pPr>
                   <w:r>
+                    <w:rPr>
+                      <w:rFonts w:ascii="Arial" w:hAnsi="Arial" w:eastAsia="Arial" w:cs="Arial"/>
+                      <w:sz w:val="16"/>
+                      <w:szCs w:val="16"/>
+                    </w:rPr>
                     <w:t xml:space="preserve">Material Culture Markers</w:t>
                   </w:r>
                 </w:p>
               </w:tc>
               <w:tc>
-                <w:tcPr/>
+                <w:tcPr>
+                  <w:tcBorders>
+                    <w:top w:val="single" w:sz="8" w:space="0" w:color="000000"/>
+                    <w:bottom w:val="single" w:sz="8" w:space="0" w:color="000000"/>
+                  </w:tcBorders>
+                </w:tcPr>
                 <w:p>
                   <w:pPr>
                     <w:pStyle w:val="Compact"/>
@@ -840,6 +924,11 @@
                     <w:jc w:val="center"/>
                   </w:pPr>
                   <w:r>
+                    <w:rPr>
+                      <w:rFonts w:ascii="Arial" w:hAnsi="Arial" w:eastAsia="Arial" w:cs="Arial"/>
+                      <w:sz w:val="16"/>
+                      <w:szCs w:val="16"/>
+                    </w:rPr>
                     <w:t xml:space="preserve">Environmental Context</w:t>
                   </w:r>
                 </w:p>
@@ -855,6 +944,11 @@
                     <w:jc w:val="center"/>
                   </w:pPr>
                   <w:r>
+                    <w:rPr>
+                      <w:rFonts w:ascii="Arial" w:hAnsi="Arial" w:eastAsia="Arial" w:cs="Arial"/>
+                      <w:sz w:val="16"/>
+                      <w:szCs w:val="16"/>
+                    </w:rPr>
                     <w:t xml:space="preserve">Aur-P1 (Proto/Early)</w:t>
                   </w:r>
                 </w:p>
@@ -868,6 +962,11 @@
                     <w:jc w:val="center"/>
                   </w:pPr>
                   <w:r>
+                    <w:rPr>
+                      <w:rFonts w:ascii="Arial" w:hAnsi="Arial" w:eastAsia="Arial" w:cs="Arial"/>
+                      <w:sz w:val="16"/>
+                      <w:szCs w:val="16"/>
+                    </w:rPr>
                     <w:t xml:space="preserve">43 - 37</w:t>
                   </w:r>
                 </w:p>
@@ -881,7 +980,12 @@
                     <w:jc w:val="center"/>
                   </w:pPr>
                   <w:r>
-                    <w:t xml:space="preserve">Blades and bladelets initially produced within a single, continuous reduction sequence from the same unipolar/prismatic core, rather than from separate blade and bladelet cores; bladelets are the main target, large, straight-profiled, and turned into Dufour bladelets of the Dufour subtype via marginal direct, inverse or alternate retouch; bone/antler points are initially very rare, then regionally variable. Blade and bladelet production later run as separate reduction sequences, with carinated and nosed end-scrapers systematically used as bladelet cores; thick blades with invasive, scalar Aurignacian retouch, sometimes waisted/strangled; Dufour bladelets later include the smaller Roc-de-Combe subtype alongside Dufour.</w:t>
+                    <w:rPr>
+                      <w:rFonts w:ascii="Arial" w:hAnsi="Arial" w:eastAsia="Arial" w:cs="Arial"/>
+                      <w:sz w:val="16"/>
+                      <w:szCs w:val="16"/>
+                    </w:rPr>
+                    <w:t xml:space="preserve">Blades and bladelets initially produced within a single, continuous reduction sequence from the same unipolar/prismatic core, rather than from separate blade and bladelet cores; bladelets are the main target, large, straight-profiled, and turned into Dufour bladelets of the Dufour subtype via marginal direct, inverse or alternate retouch; split-based bone/antler points are initially very rare, then regionally variable. Blade and bladelet production later run as separate reduction sequences, with carinated and nosed end-scrapers systematically used as bladelet cores; thick blades with invasive, scalar Aurignacian retouch, sometimes waisted/strangled; Dufour bladelets later include the smaller Roc-de-Combe subtype alongside Dufour.</w:t>
                   </w:r>
                 </w:p>
               </w:tc>
@@ -894,6 +998,11 @@
                     <w:jc w:val="center"/>
                   </w:pPr>
                   <w:r>
+                    <w:rPr>
+                      <w:rFonts w:ascii="Arial" w:hAnsi="Arial" w:eastAsia="Arial" w:cs="Arial"/>
+                      <w:sz w:val="16"/>
+                      <w:szCs w:val="16"/>
+                    </w:rPr>
                     <w:t xml:space="preserve">Starts at Greenland Stadial 12, ends at Greenland Interstadial 8</w:t>
                   </w:r>
                 </w:p>
@@ -901,7 +1010,11 @@
             </w:tr>
             <w:tr>
               <w:tc>
-                <w:tcPr/>
+                <w:tcPr>
+                  <w:tcBorders>
+                    <w:bottom w:val="single" w:sz="8" w:space="0" w:color="000000"/>
+                  </w:tcBorders>
+                </w:tcPr>
                 <w:p>
                   <w:pPr>
                     <w:pStyle w:val="Compact"/>
@@ -909,12 +1022,21 @@
                     <w:jc w:val="center"/>
                   </w:pPr>
                   <w:r>
+                    <w:rPr>
+                      <w:rFonts w:ascii="Arial" w:hAnsi="Arial" w:eastAsia="Arial" w:cs="Arial"/>
+                      <w:sz w:val="16"/>
+                      <w:szCs w:val="16"/>
+                    </w:rPr>
                     <w:t xml:space="preserve">Aur-P2 (Evolved/Late)</w:t>
                   </w:r>
                 </w:p>
               </w:tc>
               <w:tc>
-                <w:tcPr/>
+                <w:tcPr>
+                  <w:tcBorders>
+                    <w:bottom w:val="single" w:sz="8" w:space="0" w:color="000000"/>
+                  </w:tcBorders>
+                </w:tcPr>
                 <w:p>
                   <w:pPr>
                     <w:pStyle w:val="Compact"/>
@@ -922,12 +1044,21 @@
                     <w:jc w:val="center"/>
                   </w:pPr>
                   <w:r>
+                    <w:rPr>
+                      <w:rFonts w:ascii="Arial" w:hAnsi="Arial" w:eastAsia="Arial" w:cs="Arial"/>
+                      <w:sz w:val="16"/>
+                      <w:szCs w:val="16"/>
+                    </w:rPr>
                     <w:t xml:space="preserve">37 - 32</w:t>
                   </w:r>
                 </w:p>
               </w:tc>
               <w:tc>
-                <w:tcPr/>
+                <w:tcPr>
+                  <w:tcBorders>
+                    <w:bottom w:val="single" w:sz="8" w:space="0" w:color="000000"/>
+                  </w:tcBorders>
+                </w:tcPr>
                 <w:p>
                   <w:pPr>
                     <w:pStyle w:val="Compact"/>
@@ -935,12 +1066,21 @@
                     <w:jc w:val="center"/>
                   </w:pPr>
                   <w:r>
+                    <w:rPr>
+                      <w:rFonts w:ascii="Arial" w:hAnsi="Arial" w:eastAsia="Arial" w:cs="Arial"/>
+                      <w:sz w:val="16"/>
+                      <w:szCs w:val="16"/>
+                    </w:rPr>
                     <w:t xml:space="preserve">Carinated/nosed-scraper bladelet-core technology intensifies further; busked (busqué) burins become numerous, later joined/replaced by the closely related Vachons-type burin; Dufour bladelets now dominated by the smaller, twisted Roc-de-Combe subtype; split-based points become rare, replaced first by flattened lozenge-shaped bone/antler points (with the busked burins), then oval-sectioned lozenge points (with Vachons burins), and finally biconical points</w:t>
                   </w:r>
                 </w:p>
               </w:tc>
               <w:tc>
-                <w:tcPr/>
+                <w:tcPr>
+                  <w:tcBorders>
+                    <w:bottom w:val="single" w:sz="8" w:space="0" w:color="000000"/>
+                  </w:tcBorders>
+                </w:tcPr>
                 <w:p>
                   <w:pPr>
                     <w:pStyle w:val="Compact"/>
@@ -948,6 +1088,11 @@
                     <w:jc w:val="center"/>
                   </w:pPr>
                   <w:r>
+                    <w:rPr>
+                      <w:rFonts w:ascii="Arial" w:hAnsi="Arial" w:eastAsia="Arial" w:cs="Arial"/>
+                      <w:sz w:val="16"/>
+                      <w:szCs w:val="16"/>
+                    </w:rPr>
                     <w:t xml:space="preserve">GI 8 - 6</w:t>
                   </w:r>
                 </w:p>
@@ -964,12 +1109,24 @@
               <w:pStyle w:val="ImageCaption"/>
             </w:pPr>
             <w:r>
+              <w:rPr>
+                <w:rFonts w:ascii="Arial" w:hAnsi="Arial" w:eastAsia="Arial"/>
+                <w:sz w:val="16"/>
+              </w:rPr>
               <w:t xml:space="preserve">Table 1: Summary of chronological, cultural and environmental characteristics of Aurignacian periods</w:t>
             </w:r>
             <w:r>
+              <w:rPr>
+                <w:rFonts w:ascii="Arial" w:hAnsi="Arial" w:eastAsia="Arial"/>
+                <w:sz w:val="16"/>
+              </w:rPr>
               <w:t xml:space="preserve"> </w:t>
             </w:r>
             <w:r>
+              <w:rPr>
+                <w:rFonts w:ascii="Arial" w:hAnsi="Arial" w:eastAsia="Arial"/>
+                <w:sz w:val="16"/>
+              </w:rPr>
               <w:t xml:space="preserve">[12,20,21,32]</w:t>
             </w:r>
           </w:p>
@@ -1069,16 +1226,26 @@
       <w:tblPr>
         <w:tblStyle w:val="Table"/>
         <w:tblW w:type="pct" w:w="5000"/>
-        <w:tblLook w:firstRow="0" w:lastRow="0" w:firstColumn="0" w:lastColumn="0" w:noHBand="0" w:noVBand="0" w:val="0000"/>
+        <w:tblLook w:firstRow="1" w:lastRow="1" w:firstColumn="0" w:lastColumn="0" w:noHBand="0" w:noVBand="0" w:val="0023"/>
         <w:jc w:val="start"/>
         <w:tblLayout w:type="fixed"/>
+        <w:tblBorders>
+          <w:top w:val="single" w:sz="8" w:space="0" w:color="000000"/>
+          <w:bottom w:val="single" w:sz="8" w:space="0" w:color="000000"/>
+          <w:insideH w:val="none" w:sz="8" w:space="0" w:color="000000"/>
+        </w:tblBorders>
       </w:tblPr>
       <w:tblGrid>
         <w:gridCol w:w="7920"/>
       </w:tblGrid>
       <w:tr>
         <w:tc>
-          <w:tcPr/>
+          <w:tcPr>
+            <w:tcBorders>
+              <w:top w:val="single" w:sz="8" w:space="0" w:color="000000"/>
+              <w:bottom w:val="single" w:sz="8" w:space="0" w:color="000000"/>
+            </w:tcBorders>
+          </w:tcPr>
           <w:bookmarkStart w:id="27" w:name="fig-site-map"/>
           <w:p>
             <w:pPr>
@@ -1086,6 +1253,10 @@
               <w:jc w:val="center"/>
             </w:pPr>
             <w:r>
+              <w:rPr>
+                <w:rFonts w:ascii="Arial" w:hAnsi="Arial" w:eastAsia="Arial"/>
+                <w:sz w:val="16"/>
+              </w:rPr>
               <w:drawing>
                 <wp:inline>
                   <wp:extent cx="5943600" cy="4953000"/>
@@ -1138,6 +1309,10 @@
               <w:pStyle w:val="ImageCaption"/>
             </w:pPr>
             <w:r>
+              <w:rPr>
+                <w:rFonts w:ascii="Arial" w:hAnsi="Arial" w:eastAsia="Arial"/>
+                <w:sz w:val="16"/>
+              </w:rPr>
               <w:t xml:space="preserve">Figure 1: A: Map of sites in each Aurignacian phase that contain geometric signs on mobile objects. B: Abundance of signs over time, phases indicated by colours. C. Distribution of object count by site, phases indicated by colours</w:t>
             </w:r>
           </w:p>
@@ -1339,23 +1514,38 @@
       <w:tblPr>
         <w:tblStyle w:val="Table"/>
         <w:tblW w:type="pct" w:w="5000"/>
-        <w:tblLook w:firstRow="0" w:lastRow="0" w:firstColumn="0" w:lastColumn="0" w:noHBand="0" w:noVBand="0" w:val="0000"/>
+        <w:tblLook w:firstRow="1" w:lastRow="1" w:firstColumn="0" w:lastColumn="0" w:noHBand="0" w:noVBand="0" w:val="0023"/>
         <w:jc w:val="start"/>
         <w:tblLayout w:type="fixed"/>
+        <w:tblBorders>
+          <w:top w:val="single" w:sz="8" w:space="0" w:color="000000"/>
+          <w:bottom w:val="single" w:sz="8" w:space="0" w:color="000000"/>
+          <w:insideH w:val="none" w:sz="8" w:space="0" w:color="000000"/>
+        </w:tblBorders>
       </w:tblPr>
       <w:tblGrid>
         <w:gridCol w:w="7920"/>
       </w:tblGrid>
       <w:tr>
         <w:tc>
-          <w:tcPr/>
+          <w:tcPr>
+            <w:tcBorders>
+              <w:top w:val="single" w:sz="8" w:space="0" w:color="000000"/>
+              <w:bottom w:val="single" w:sz="8" w:space="0" w:color="000000"/>
+            </w:tcBorders>
+          </w:tcPr>
           <w:bookmarkStart w:id="29" w:name="tbl-mantel-table"/>
           <w:tbl>
             <w:tblPr>
               <w:tblStyle w:val="Table"/>
               <w:tblW w:type="auto" w:w="0"/>
-              <w:tblLook w:firstRow="1" w:lastRow="0" w:firstColumn="0" w:lastColumn="0" w:noHBand="0" w:noVBand="0" w:val="0020"/>
+              <w:tblLook w:firstRow="1" w:lastRow="1" w:firstColumn="0" w:lastColumn="0" w:noHBand="0" w:noVBand="0" w:val="0023"/>
               <w:jc w:val="start"/>
+              <w:tblBorders>
+                <w:top w:val="single" w:sz="8" w:space="0" w:color="000000"/>
+                <w:bottom w:val="single" w:sz="8" w:space="0" w:color="000000"/>
+                <w:insideH w:val="none" w:sz="8" w:space="0" w:color="000000"/>
+              </w:tblBorders>
             </w:tblPr>
             <w:tblGrid>
               <w:gridCol w:w="2640"/>
@@ -1367,7 +1557,12 @@
                 <w:tblHeader w:val="true"/>
               </w:trPr>
               <w:tc>
-                <w:tcPr/>
+                <w:tcPr>
+                  <w:tcBorders>
+                    <w:top w:val="single" w:sz="8" w:space="0" w:color="000000"/>
+                    <w:bottom w:val="single" w:sz="8" w:space="0" w:color="000000"/>
+                  </w:tcBorders>
+                </w:tcPr>
                 <w:p>
                   <w:pPr>
                     <w:pStyle w:val="Compact"/>
@@ -1375,12 +1570,22 @@
                     <w:jc w:val="center"/>
                   </w:pPr>
                   <w:r>
+                    <w:rPr>
+                      <w:rFonts w:ascii="Arial" w:hAnsi="Arial" w:eastAsia="Arial" w:cs="Arial"/>
+                      <w:sz w:val="16"/>
+                      <w:szCs w:val="16"/>
+                    </w:rPr>
                     <w:t xml:space="preserve">Aurignacian phase</w:t>
                   </w:r>
                 </w:p>
               </w:tc>
               <w:tc>
-                <w:tcPr/>
+                <w:tcPr>
+                  <w:tcBorders>
+                    <w:top w:val="single" w:sz="8" w:space="0" w:color="000000"/>
+                    <w:bottom w:val="single" w:sz="8" w:space="0" w:color="000000"/>
+                  </w:tcBorders>
+                </w:tcPr>
                 <w:p>
                   <w:pPr>
                     <w:pStyle w:val="Compact"/>
@@ -1388,12 +1593,22 @@
                     <w:jc w:val="center"/>
                   </w:pPr>
                   <w:r>
+                    <w:rPr>
+                      <w:rFonts w:ascii="Arial" w:hAnsi="Arial" w:eastAsia="Arial" w:cs="Arial"/>
+                      <w:sz w:val="16"/>
+                      <w:szCs w:val="16"/>
+                    </w:rPr>
                     <w:t xml:space="preserve">Mantel R</w:t>
                   </w:r>
                 </w:p>
               </w:tc>
               <w:tc>
-                <w:tcPr/>
+                <w:tcPr>
+                  <w:tcBorders>
+                    <w:top w:val="single" w:sz="8" w:space="0" w:color="000000"/>
+                    <w:bottom w:val="single" w:sz="8" w:space="0" w:color="000000"/>
+                  </w:tcBorders>
+                </w:tcPr>
                 <w:p>
                   <w:pPr>
                     <w:pStyle w:val="Compact"/>
@@ -1401,6 +1616,11 @@
                     <w:jc w:val="center"/>
                   </w:pPr>
                   <w:r>
+                    <w:rPr>
+                      <w:rFonts w:ascii="Arial" w:hAnsi="Arial" w:eastAsia="Arial" w:cs="Arial"/>
+                      <w:sz w:val="16"/>
+                      <w:szCs w:val="16"/>
+                    </w:rPr>
                     <w:t xml:space="preserve">Mantel p</w:t>
                   </w:r>
                 </w:p>
@@ -1416,6 +1636,11 @@
                     <w:jc w:val="center"/>
                   </w:pPr>
                   <w:r>
+                    <w:rPr>
+                      <w:rFonts w:ascii="Arial" w:hAnsi="Arial" w:eastAsia="Arial" w:cs="Arial"/>
+                      <w:sz w:val="16"/>
+                      <w:szCs w:val="16"/>
+                    </w:rPr>
                     <w:t xml:space="preserve">Aur-P1</w:t>
                   </w:r>
                 </w:p>
@@ -1429,6 +1654,11 @@
                     <w:jc w:val="center"/>
                   </w:pPr>
                   <w:r>
+                    <w:rPr>
+                      <w:rFonts w:ascii="Arial" w:hAnsi="Arial" w:eastAsia="Arial" w:cs="Arial"/>
+                      <w:sz w:val="16"/>
+                      <w:szCs w:val="16"/>
+                    </w:rPr>
                     <w:t xml:space="preserve">0.046</w:t>
                   </w:r>
                 </w:p>
@@ -1442,6 +1672,11 @@
                     <w:jc w:val="center"/>
                   </w:pPr>
                   <w:r>
+                    <w:rPr>
+                      <w:rFonts w:ascii="Arial" w:hAnsi="Arial" w:eastAsia="Arial" w:cs="Arial"/>
+                      <w:sz w:val="16"/>
+                      <w:szCs w:val="16"/>
+                    </w:rPr>
                     <w:t xml:space="preserve">0.301</w:t>
                   </w:r>
                 </w:p>
@@ -1449,7 +1684,11 @@
             </w:tr>
             <w:tr>
               <w:tc>
-                <w:tcPr/>
+                <w:tcPr>
+                  <w:tcBorders>
+                    <w:bottom w:val="single" w:sz="8" w:space="0" w:color="000000"/>
+                  </w:tcBorders>
+                </w:tcPr>
                 <w:p>
                   <w:pPr>
                     <w:pStyle w:val="Compact"/>
@@ -1457,12 +1696,21 @@
                     <w:jc w:val="center"/>
                   </w:pPr>
                   <w:r>
+                    <w:rPr>
+                      <w:rFonts w:ascii="Arial" w:hAnsi="Arial" w:eastAsia="Arial" w:cs="Arial"/>
+                      <w:sz w:val="16"/>
+                      <w:szCs w:val="16"/>
+                    </w:rPr>
                     <w:t xml:space="preserve">Aur-P2</w:t>
                   </w:r>
                 </w:p>
               </w:tc>
               <w:tc>
-                <w:tcPr/>
+                <w:tcPr>
+                  <w:tcBorders>
+                    <w:bottom w:val="single" w:sz="8" w:space="0" w:color="000000"/>
+                  </w:tcBorders>
+                </w:tcPr>
                 <w:p>
                   <w:pPr>
                     <w:pStyle w:val="Compact"/>
@@ -1470,12 +1718,21 @@
                     <w:jc w:val="center"/>
                   </w:pPr>
                   <w:r>
+                    <w:rPr>
+                      <w:rFonts w:ascii="Arial" w:hAnsi="Arial" w:eastAsia="Arial" w:cs="Arial"/>
+                      <w:sz w:val="16"/>
+                      <w:szCs w:val="16"/>
+                    </w:rPr>
                     <w:t xml:space="preserve">-0.299</w:t>
                   </w:r>
                 </w:p>
               </w:tc>
               <w:tc>
-                <w:tcPr/>
+                <w:tcPr>
+                  <w:tcBorders>
+                    <w:bottom w:val="single" w:sz="8" w:space="0" w:color="000000"/>
+                  </w:tcBorders>
+                </w:tcPr>
                 <w:p>
                   <w:pPr>
                     <w:pStyle w:val="Compact"/>
@@ -1483,6 +1740,11 @@
                     <w:jc w:val="center"/>
                   </w:pPr>
                   <w:r>
+                    <w:rPr>
+                      <w:rFonts w:ascii="Arial" w:hAnsi="Arial" w:eastAsia="Arial" w:cs="Arial"/>
+                      <w:sz w:val="16"/>
+                      <w:szCs w:val="16"/>
+                    </w:rPr>
                     <w:t xml:space="preserve">0.933</w:t>
                   </w:r>
                 </w:p>
@@ -1499,6 +1761,10 @@
               <w:pStyle w:val="ImageCaption"/>
             </w:pPr>
             <w:r>
+              <w:rPr>
+                <w:rFonts w:ascii="Arial" w:hAnsi="Arial" w:eastAsia="Arial"/>
+                <w:sz w:val="16"/>
+              </w:rPr>
               <w:t xml:space="preserve">Table 2: Table of the results per phase for the Mantel test between a Jaccard matrix of sign type diversity and a geographic distance matrix</w:t>
             </w:r>
           </w:p>
@@ -1726,16 +1992,26 @@
       <w:tblPr>
         <w:tblStyle w:val="Table"/>
         <w:tblW w:type="pct" w:w="5000"/>
-        <w:tblLook w:firstRow="0" w:lastRow="0" w:firstColumn="0" w:lastColumn="0" w:noHBand="0" w:noVBand="0" w:val="0000"/>
+        <w:tblLook w:firstRow="1" w:lastRow="1" w:firstColumn="0" w:lastColumn="0" w:noHBand="0" w:noVBand="0" w:val="0023"/>
         <w:jc w:val="start"/>
         <w:tblLayout w:type="fixed"/>
+        <w:tblBorders>
+          <w:top w:val="single" w:sz="8" w:space="0" w:color="000000"/>
+          <w:bottom w:val="single" w:sz="8" w:space="0" w:color="000000"/>
+          <w:insideH w:val="none" w:sz="8" w:space="0" w:color="000000"/>
+        </w:tblBorders>
       </w:tblPr>
       <w:tblGrid>
         <w:gridCol w:w="7920"/>
       </w:tblGrid>
       <w:tr>
         <w:tc>
-          <w:tcPr/>
+          <w:tcPr>
+            <w:tcBorders>
+              <w:top w:val="single" w:sz="8" w:space="0" w:color="000000"/>
+              <w:bottom w:val="single" w:sz="8" w:space="0" w:color="000000"/>
+            </w:tcBorders>
+          </w:tcPr>
           <w:bookmarkStart w:id="36" w:name="fig-seriation"/>
           <w:p>
             <w:pPr>
@@ -1743,6 +2019,10 @@
               <w:jc w:val="center"/>
             </w:pPr>
             <w:r>
+              <w:rPr>
+                <w:rFonts w:ascii="Arial" w:hAnsi="Arial" w:eastAsia="Arial"/>
+                <w:sz w:val="16"/>
+              </w:rPr>
               <w:drawing>
                 <wp:inline>
                   <wp:extent cx="5943600" cy="7429499"/>
@@ -1795,6 +2075,10 @@
               <w:pStyle w:val="ImageCaption"/>
             </w:pPr>
             <w:r>
+              <w:rPr>
+                <w:rFonts w:ascii="Arial" w:hAnsi="Arial" w:eastAsia="Arial"/>
+                <w:sz w:val="16"/>
+              </w:rPr>
               <w:t xml:space="preserve">Figure 2: Seriation reveals recurrent group structure across Upper Palaeolithic phases. Presence–absence matrices of geometric sign types reordered using manual Brower‑Kile seriation for (A) Aur-P1 and (B) Aur-P2 phases. Rows represent sites and columns represent sign types. Blocks of co-occurring signs indicate culturally coherent groupings. Despite chronological turnover in specific sign types, two broad classes of assemblages—restricted-range and broad-range—recur across both phases, suggesting persistent structuring in symbolic signaling practices. Restricted group is in red, broader group is in blue.</w:t>
             </w:r>
           </w:p>
@@ -1807,7 +2091,7 @@
         <w:pStyle w:val="BodyText"/>
       </w:pPr>
       <w:r>
-        <w:t xml:space="preserve">For each of the two phases, our seriation analysis identifies two groups. One group has a restricted range of sign types (1-3 types), which tend to be visually simpler signs. A second group has a broader range (up to 17 types), which include more complex signs. Simpler signs composed of fewer components, like line and notch, are the most prevalent across both phases. In Aur-P1 the restricted-range group (9 sites) is slightly smaller than the broad-range group (11 sites); in Aur-P2 the restricted-range group (6 sites) is larger than the broad-range group (3 sites). Bootstrap resampling of sites confirms that the Aur-P1 two-group structure is stable to sampling variation; the stochastic block model independently selects a three-block structure for Aur-P1, reproducing the manual restricted/broad split for all but one site, and a single-block structure for the small Aur-P2 sample, providing no model-based support for a two-group split there (Supplement S6.3). Per-site robustness of the restricted/broad assignment is quantified in our Supplementary Material item</w:t>
+        <w:t xml:space="preserve">For each of the two phases, our seriation analysis identifies two groups. One group has a restricted range of sign types (1-3 types), which tend to be visually simpler signs. A second group has a broader range (up to 17 types), which include more complex signs. Simpler signs composed of fewer components, like line and notch, are the most prevalent across both phases. In Aur-P1 the restricted-range group (9 sites) is slightly smaller than the broad-range group (11 sites); in Aur-P2 the restricted-range group (6 sites) is larger than the broad-range group (3 sites). Bootstrap resampling of sites confirms that the Aur-P1 two-group structure is stable to sampling variation; the stochastic block model independently selects a three-block structure for Aur-P1, reproducing the manual restricted/broad split for all but one site, and a single-block structure for the small Aur-P2 sample, providing no model-based support for a two-group split there (Supplementary Material item</w:t>
       </w:r>
       <w:r>
         <w:t xml:space="preserve"> </w:t>
@@ -1825,7 +2109,7 @@
         <w:t xml:space="preserve"> </w:t>
       </w:r>
       <w:r>
-        <w:t xml:space="preserve">S6.</w:t>
+        <w:t xml:space="preserve">S6.3).</w:t>
       </w:r>
     </w:p>
     <w:p>
@@ -1848,16 +2132,26 @@
       <w:tblPr>
         <w:tblStyle w:val="Table"/>
         <w:tblW w:type="pct" w:w="5000"/>
-        <w:tblLook w:firstRow="0" w:lastRow="0" w:firstColumn="0" w:lastColumn="0" w:noHBand="0" w:noVBand="0" w:val="0000"/>
+        <w:tblLook w:firstRow="1" w:lastRow="1" w:firstColumn="0" w:lastColumn="0" w:noHBand="0" w:noVBand="0" w:val="0023"/>
         <w:jc w:val="start"/>
         <w:tblLayout w:type="fixed"/>
+        <w:tblBorders>
+          <w:top w:val="single" w:sz="8" w:space="0" w:color="000000"/>
+          <w:bottom w:val="single" w:sz="8" w:space="0" w:color="000000"/>
+          <w:insideH w:val="none" w:sz="8" w:space="0" w:color="000000"/>
+        </w:tblBorders>
       </w:tblPr>
       <w:tblGrid>
         <w:gridCol w:w="7920"/>
       </w:tblGrid>
       <w:tr>
         <w:tc>
-          <w:tcPr/>
+          <w:tcPr>
+            <w:tcBorders>
+              <w:top w:val="single" w:sz="8" w:space="0" w:color="000000"/>
+              <w:bottom w:val="single" w:sz="8" w:space="0" w:color="000000"/>
+            </w:tcBorders>
+          </w:tcPr>
           <w:bookmarkStart w:id="40" w:name="fig-neighbor-net"/>
           <w:p>
             <w:pPr>
@@ -1865,6 +2159,10 @@
               <w:jc w:val="center"/>
             </w:pPr>
             <w:r>
+              <w:rPr>
+                <w:rFonts w:ascii="Arial" w:hAnsi="Arial" w:eastAsia="Arial"/>
+                <w:sz w:val="16"/>
+              </w:rPr>
               <w:drawing>
                 <wp:inline>
                   <wp:extent cx="5943600" cy="3566160"/>
@@ -1917,6 +2215,10 @@
               <w:pStyle w:val="ImageCaption"/>
             </w:pPr>
             <w:r>
+              <w:rPr>
+                <w:rFonts w:ascii="Arial" w:hAnsi="Arial" w:eastAsia="Arial"/>
+                <w:sz w:val="16"/>
+              </w:rPr>
               <w:t xml:space="preserve">Figure 3: Networks depicting cultural similarity among sites for each phase based on Jaccard similarity of geometric sign presence/absence. Nodes represent sites and edges connect pairs whose Jaccard similarity is ≥0.2 (i.e., the intersection of their sign types is at least 20% of their union). Node size reflects degree centrality, and edge thickness corresponds to similarity strength. The Aur-P1 network shows the highest overall connectivity, whereas the Aur-P2 phase exhibits weaker and more fragmented connections. These networks illustrate phase-specific differences in the intensity and configuration of inter-site cultural links.</w:t>
             </w:r>
           </w:p>
@@ -1928,16 +2230,26 @@
       <w:tblPr>
         <w:tblStyle w:val="Table"/>
         <w:tblW w:type="pct" w:w="5000"/>
-        <w:tblLook w:firstRow="0" w:lastRow="0" w:firstColumn="0" w:lastColumn="0" w:noHBand="0" w:noVBand="0" w:val="0000"/>
+        <w:tblLook w:firstRow="1" w:lastRow="1" w:firstColumn="0" w:lastColumn="0" w:noHBand="0" w:noVBand="0" w:val="0023"/>
         <w:jc w:val="start"/>
         <w:tblLayout w:type="fixed"/>
+        <w:tblBorders>
+          <w:top w:val="single" w:sz="8" w:space="0" w:color="000000"/>
+          <w:bottom w:val="single" w:sz="8" w:space="0" w:color="000000"/>
+          <w:insideH w:val="none" w:sz="8" w:space="0" w:color="000000"/>
+        </w:tblBorders>
       </w:tblPr>
       <w:tblGrid>
         <w:gridCol w:w="7920"/>
       </w:tblGrid>
       <w:tr>
         <w:tc>
-          <w:tcPr/>
+          <w:tcPr>
+            <w:tcBorders>
+              <w:top w:val="single" w:sz="8" w:space="0" w:color="000000"/>
+              <w:bottom w:val="single" w:sz="8" w:space="0" w:color="000000"/>
+            </w:tcBorders>
+          </w:tcPr>
           <w:bookmarkStart w:id="44" w:name="fig-neighbor-net-stats"/>
           <w:p>
             <w:pPr>
@@ -1945,6 +2257,10 @@
               <w:jc w:val="center"/>
             </w:pPr>
             <w:r>
+              <w:rPr>
+                <w:rFonts w:ascii="Arial" w:hAnsi="Arial" w:eastAsia="Arial"/>
+                <w:sz w:val="16"/>
+              </w:rPr>
               <w:drawing>
                 <wp:inline>
                   <wp:extent cx="5943600" cy="4086225"/>
@@ -1997,6 +2313,10 @@
               <w:pStyle w:val="ImageCaption"/>
             </w:pPr>
             <w:r>
+              <w:rPr>
+                <w:rFonts w:ascii="Arial" w:hAnsi="Arial" w:eastAsia="Arial"/>
+                <w:sz w:val="16"/>
+              </w:rPr>
               <w:t xml:space="preserve">Figure 4: Network statistics for the two phases. The vertical black lines are the null 95% confidence interval, the observed statistic value is shown as a solid black circle (BH-adjusted p &lt; 0.05) or a hollow circle (not significantly different from a within-phase random distribution). The horizontal brackets at the top of each panel show p-values of pairwise randomisation tests for significant differences in network statistics between phases.</w:t>
             </w:r>
           </w:p>
@@ -2031,31 +2351,87 @@
         <w:pStyle w:val="BodyText"/>
       </w:pPr>
       <w:r>
-        <w:t xml:space="preserve">In Aur-P2 the two-group structure is again recovered, with a broad-range group (Trou Magrite, Bockstein-Törle, Hohle Fels) and a restricted-range group (Les Rois, Sirgenstein Cave, La Viña, Mladeč, Gargas, Vindija Cave). Inter-group connectivity remains evident, but the network is far smaller, reflecting the reduced sample of this phase.</w:t>
+        <w:t xml:space="preserve">In Aur-P2 the two-group structure is again recovered, with a broad-range group (Trou Magrite, Bockstein-Törle, Hohle Fels) and a restricted-range group (Les Rois, Sirgenstein Cave, La Viña, Mladeč, Gargas, Vindija Cave). Connectivity connectivity between sign-use groups remains evident, but the network is far smaller, reflecting the reduced sample of this phase.</w:t>
       </w:r>
     </w:p>
     <w:p>
       <w:pPr>
         <w:pStyle w:val="BodyText"/>
       </w:pPr>
-      <w:r>
-        <w:t>Figure 4 shows the results of permutation tests (n = 104) assessing whether the observed statistics differ from a random distribution within each phase, and pairwise randomisation tests comparing the two phases. Within-phase, none of the tested statistics — edge density, modularity (Louvain), mean betweenness, or component count — differs significantly from its within-phase relabelling null in either phase: all observed values fall within the null 95% confidence intervals and all Benjamini–Hochberg-adjusted p-values are ≥ 0.05. The restricted/broad grouping is instead supported by the model-based and null-benchmarked community-structure analyses in our Supplementary Material item “Sensitivity Analyses” (S5.1, S5.3, S5.9), which evaluate the observed structure net of network size. Pairwise permutation tests with Benjamini–Hochberg correction show that the phases do not differ significantly in any of the tested network statistics — edge density (p = 0.4404), modularity (p = 0.3018), mean betweenness (p = 0.6224), or component count (p = 0.5155). The Aur-P1–Aur-P2 contrast is therefore primarily one of network scale rather than a statistically distinguishable community structure.</w:t>
+      <w:hyperlink w:anchor="fig-neighbor-net-stats">
+        <w:r>
+          <w:rPr>
+            <w:rStyle w:val="Hyperlink"/>
+          </w:rPr>
+          <w:t xml:space="preserve">Figure 4</w:t>
+        </w:r>
+      </w:hyperlink>
+      <w:r>
+        <w:t xml:space="preserve"> </w:t>
+      </w:r>
+      <w:r>
+        <w:t xml:space="preserve">shows the results of permutation tests (n = 10</w:t>
+      </w:r>
+      <w:r>
+        <w:rPr>
+          <w:vertAlign w:val="superscript"/>
+        </w:rPr>
+        <w:t xml:space="preserve">4</w:t>
+      </w:r>
+      <w:r>
+        <w:t xml:space="preserve">) assessing whether the observed statistics differ from a random distribution within each phase, and pairwise randomisation tests comparing the two phases. Within-phase, none of the tested statistics — edge density, modularity (Louvain), mean betweenness, or component count — differs significantly from its within-phase relabelling null in either phase: all observed values fall within the null 95% confidence intervals and all Benjamini–Hochberg-adjusted p-values are ≥ 0.05. The restricted/broad grouping is instead supported by the model-based and null-benchmarked community-structure analyses in our Supplementary Material item</w:t>
+      </w:r>
+      <w:r>
+        <w:t xml:space="preserve"> </w:t>
+      </w:r>
+      <w:r>
+        <w:t xml:space="preserve">“</w:t>
+      </w:r>
+      <w:r>
+        <w:t xml:space="preserve">Sensitivity Analyses</w:t>
+      </w:r>
+      <w:r>
+        <w:t xml:space="preserve">”</w:t>
+      </w:r>
+      <w:r>
+        <w:t xml:space="preserve"> </w:t>
+      </w:r>
+      <w:r>
+        <w:t xml:space="preserve">(S5.1, S5.3, S5.9), which evaluate the observed structure net of network size. Pairwise permutation tests with Benjamini–Hochberg correction show that the phases do not differ significantly in any of the tested network statistics — edge density (p = 0.4404), modularity (p = 0.3018), mean betweenness (p = 0.6224), or component count (p = 0.5155). The Aur-P1–Aur-P2 contrast is therefore primarily one of network scale rather than a statistically distinguishable community structure.</w:t>
+      </w:r>
+    </w:p>
+    <w:p>
+      <w:pPr>
+        <w:pStyle w:val="BodyText"/>
+      </w:pPr>
+      <w:r>
+        <w:t xml:space="preserve">We assessed the sensitivity of our two-phase framework to site assignment criteria in three ways: (1) reverting to purely date-based assignment (S8 Analysis A); (2) excluding the stratigraphically mixed site Vogelherd entirely (S8 Analysis B); (3) excluding figurines concentrated at Vogelherd (S7). Under all conditions, the Aur-P1 &gt; Aur-P2 connectivity ordering is preserved (Aur-P1 mean degree: 7.50 baseline, 7.26 no Vogelherd, 7.40 no figurines; Aur-P2: 4.22). Excluding Vogelherd reduces Aur-P1 edges by 8% and mean degree by 3.2%, but does not alter the phase contrast or the within-phase two-group structure (S8.3, S7.5).</w:t>
       </w:r>
     </w:p>
     <w:tbl>
       <w:tblPr>
         <w:tblStyle w:val="Table"/>
         <w:tblW w:type="pct" w:w="5000"/>
-        <w:tblLook w:firstRow="0" w:lastRow="0" w:firstColumn="0" w:lastColumn="0" w:noHBand="0" w:noVBand="0" w:val="0000"/>
+        <w:tblLook w:firstRow="1" w:lastRow="1" w:firstColumn="0" w:lastColumn="0" w:noHBand="0" w:noVBand="0" w:val="0023"/>
         <w:jc w:val="start"/>
         <w:tblLayout w:type="fixed"/>
+        <w:tblBorders>
+          <w:top w:val="single" w:sz="8" w:space="0" w:color="000000"/>
+          <w:bottom w:val="single" w:sz="8" w:space="0" w:color="000000"/>
+          <w:insideH w:val="none" w:sz="8" w:space="0" w:color="000000"/>
+        </w:tblBorders>
       </w:tblPr>
       <w:tblGrid>
         <w:gridCol w:w="7920"/>
       </w:tblGrid>
       <w:tr>
         <w:tc>
-          <w:tcPr/>
+          <w:tcPr>
+            <w:tcBorders>
+              <w:top w:val="single" w:sz="8" w:space="0" w:color="000000"/>
+              <w:bottom w:val="single" w:sz="8" w:space="0" w:color="000000"/>
+            </w:tcBorders>
+          </w:tcPr>
           <w:bookmarkStart w:id="48" w:name="fig-group-map"/>
           <w:p>
             <w:pPr>
@@ -2063,6 +2439,10 @@
               <w:jc w:val="center"/>
             </w:pPr>
             <w:r>
+              <w:rPr>
+                <w:rFonts w:ascii="Arial" w:hAnsi="Arial" w:eastAsia="Arial"/>
+                <w:sz w:val="16"/>
+              </w:rPr>
               <w:drawing>
                 <wp:inline>
                   <wp:extent cx="5943600" cy="4754880"/>
@@ -2115,6 +2495,10 @@
               <w:pStyle w:val="ImageCaption"/>
             </w:pPr>
             <w:r>
+              <w:rPr>
+                <w:rFonts w:ascii="Arial" w:hAnsi="Arial" w:eastAsia="Arial"/>
+                <w:sz w:val="16"/>
+              </w:rPr>
               <w:t xml:space="preserve">Figure 5: Geographic distribution of sign-use groups (Restricted-range and Broader range) in the two Aurignacian phases (Aur-P1, Aur-P2). Sites are colored according to their group membership (Restricted-range or Broader range) as identified by seriation and network analysis. The spatial arrangement shows that sites belonging to the same sign-use group are not strictly clustered geographically, consistent with the Mantel test results that did not detect a significant correlation between geographic proximity and geometric sign similarity.</w:t>
             </w:r>
           </w:p>
@@ -2138,7 +2522,7 @@
         </w:r>
       </w:hyperlink>
       <w:r>
-        <w:t xml:space="preserve">). In Aur-P1, sites are distributed widely across Western and Central Europe, with some geographical overlapping between the restricted- and broad-range groups, consistent with the inter-group connectivity evident in the network analysis. In Aur-P2, the surviving sites are more widely dispersed, though this reflects the much smaller sample of this phase.</w:t>
+        <w:t xml:space="preserve">). In Aur-P1, sites are distributed widely across Western and Central Europe, with some geographical overlapping between the restricted- and broad-range groups, consistent with the connectivity between sign-use groups evident in the network analysis. In Aur-P2, the surviving sites are more widely dispersed, though this reflects the much smaller sample of this phase.</w:t>
       </w:r>
     </w:p>
     <w:bookmarkEnd w:id="49"/>
@@ -2155,23 +2539,38 @@
       <w:tblPr>
         <w:tblStyle w:val="Table"/>
         <w:tblW w:type="pct" w:w="5000"/>
-        <w:tblLook w:firstRow="0" w:lastRow="0" w:firstColumn="0" w:lastColumn="0" w:noHBand="0" w:noVBand="0" w:val="0000"/>
+        <w:tblLook w:firstRow="1" w:lastRow="1" w:firstColumn="0" w:lastColumn="0" w:noHBand="0" w:noVBand="0" w:val="0023"/>
         <w:jc w:val="start"/>
         <w:tblLayout w:type="fixed"/>
+        <w:tblBorders>
+          <w:top w:val="single" w:sz="8" w:space="0" w:color="000000"/>
+          <w:bottom w:val="single" w:sz="8" w:space="0" w:color="000000"/>
+          <w:insideH w:val="none" w:sz="8" w:space="0" w:color="000000"/>
+        </w:tblBorders>
       </w:tblPr>
       <w:tblGrid>
         <w:gridCol w:w="7920"/>
       </w:tblGrid>
       <w:tr>
         <w:tc>
-          <w:tcPr/>
+          <w:tcPr>
+            <w:tcBorders>
+              <w:top w:val="single" w:sz="8" w:space="0" w:color="000000"/>
+              <w:bottom w:val="single" w:sz="8" w:space="0" w:color="000000"/>
+            </w:tcBorders>
+          </w:tcPr>
           <w:bookmarkStart w:id="50" w:name="tbl-strength-table"/>
           <w:tbl>
             <w:tblPr>
               <w:tblStyle w:val="Table"/>
               <w:tblW w:type="auto" w:w="0"/>
-              <w:tblLook w:firstRow="1" w:lastRow="0" w:firstColumn="0" w:lastColumn="0" w:noHBand="0" w:noVBand="0" w:val="0020"/>
+              <w:tblLook w:firstRow="1" w:lastRow="1" w:firstColumn="0" w:lastColumn="0" w:noHBand="0" w:noVBand="0" w:val="0023"/>
               <w:jc w:val="start"/>
+              <w:tblBorders>
+                <w:top w:val="single" w:sz="8" w:space="0" w:color="000000"/>
+                <w:bottom w:val="single" w:sz="8" w:space="0" w:color="000000"/>
+                <w:insideH w:val="none" w:sz="8" w:space="0" w:color="000000"/>
+              </w:tblBorders>
             </w:tblPr>
             <w:tblGrid>
               <w:gridCol w:w="1980"/>
@@ -2184,7 +2583,12 @@
                 <w:tblHeader w:val="true"/>
               </w:trPr>
               <w:tc>
-                <w:tcPr/>
+                <w:tcPr>
+                  <w:tcBorders>
+                    <w:top w:val="single" w:sz="8" w:space="0" w:color="000000"/>
+                    <w:bottom w:val="single" w:sz="8" w:space="0" w:color="000000"/>
+                  </w:tcBorders>
+                </w:tcPr>
                 <w:p>
                   <w:pPr>
                     <w:pStyle w:val="Compact"/>
@@ -2192,12 +2596,22 @@
                     <w:jc w:val="center"/>
                   </w:pPr>
                   <w:r>
+                    <w:rPr>
+                      <w:rFonts w:ascii="Arial" w:hAnsi="Arial" w:eastAsia="Arial" w:cs="Arial"/>
+                      <w:sz w:val="16"/>
+                      <w:szCs w:val="16"/>
+                    </w:rPr>
                     <w:t xml:space="preserve">Aurignacian phase</w:t>
                   </w:r>
                 </w:p>
               </w:tc>
               <w:tc>
-                <w:tcPr/>
+                <w:tcPr>
+                  <w:tcBorders>
+                    <w:top w:val="single" w:sz="8" w:space="0" w:color="000000"/>
+                    <w:bottom w:val="single" w:sz="8" w:space="0" w:color="000000"/>
+                  </w:tcBorders>
+                </w:tcPr>
                 <w:p>
                   <w:pPr>
                     <w:pStyle w:val="Compact"/>
@@ -2205,12 +2619,22 @@
                     <w:jc w:val="center"/>
                   </w:pPr>
                   <w:r>
+                    <w:rPr>
+                      <w:rFonts w:ascii="Arial" w:hAnsi="Arial" w:eastAsia="Arial" w:cs="Arial"/>
+                      <w:sz w:val="16"/>
+                      <w:szCs w:val="16"/>
+                    </w:rPr>
                     <w:t xml:space="preserve">PerMANOVA R2</w:t>
                   </w:r>
                 </w:p>
               </w:tc>
               <w:tc>
-                <w:tcPr/>
+                <w:tcPr>
+                  <w:tcBorders>
+                    <w:top w:val="single" w:sz="8" w:space="0" w:color="000000"/>
+                    <w:bottom w:val="single" w:sz="8" w:space="0" w:color="000000"/>
+                  </w:tcBorders>
+                </w:tcPr>
                 <w:p>
                   <w:pPr>
                     <w:pStyle w:val="Compact"/>
@@ -2218,12 +2642,22 @@
                     <w:jc w:val="center"/>
                   </w:pPr>
                   <w:r>
+                    <w:rPr>
+                      <w:rFonts w:ascii="Arial" w:hAnsi="Arial" w:eastAsia="Arial" w:cs="Arial"/>
+                      <w:sz w:val="16"/>
+                      <w:szCs w:val="16"/>
+                    </w:rPr>
                     <w:t xml:space="preserve">PerMANOVA F</w:t>
                   </w:r>
                 </w:p>
               </w:tc>
               <w:tc>
-                <w:tcPr/>
+                <w:tcPr>
+                  <w:tcBorders>
+                    <w:top w:val="single" w:sz="8" w:space="0" w:color="000000"/>
+                    <w:bottom w:val="single" w:sz="8" w:space="0" w:color="000000"/>
+                  </w:tcBorders>
+                </w:tcPr>
                 <w:p>
                   <w:pPr>
                     <w:pStyle w:val="Compact"/>
@@ -2231,6 +2665,11 @@
                     <w:jc w:val="center"/>
                   </w:pPr>
                   <w:r>
+                    <w:rPr>
+                      <w:rFonts w:ascii="Arial" w:hAnsi="Arial" w:eastAsia="Arial" w:cs="Arial"/>
+                      <w:sz w:val="16"/>
+                      <w:szCs w:val="16"/>
+                    </w:rPr>
                     <w:t xml:space="preserve">PerMANOVA p</w:t>
                   </w:r>
                 </w:p>
@@ -2246,6 +2685,11 @@
                     <w:jc w:val="center"/>
                   </w:pPr>
                   <w:r>
+                    <w:rPr>
+                      <w:rFonts w:ascii="Arial" w:hAnsi="Arial" w:eastAsia="Arial" w:cs="Arial"/>
+                      <w:sz w:val="16"/>
+                      <w:szCs w:val="16"/>
+                    </w:rPr>
                     <w:t xml:space="preserve">Aur-P1</w:t>
                   </w:r>
                 </w:p>
@@ -2259,6 +2703,11 @@
                     <w:jc w:val="center"/>
                   </w:pPr>
                   <w:r>
+                    <w:rPr>
+                      <w:rFonts w:ascii="Arial" w:hAnsi="Arial" w:eastAsia="Arial" w:cs="Arial"/>
+                      <w:sz w:val="16"/>
+                      <w:szCs w:val="16"/>
+                    </w:rPr>
                     <w:t xml:space="preserve">0.196</w:t>
                   </w:r>
                 </w:p>
@@ -2272,6 +2721,11 @@
                     <w:jc w:val="center"/>
                   </w:pPr>
                   <w:r>
+                    <w:rPr>
+                      <w:rFonts w:ascii="Arial" w:hAnsi="Arial" w:eastAsia="Arial" w:cs="Arial"/>
+                      <w:sz w:val="16"/>
+                      <w:szCs w:val="16"/>
+                    </w:rPr>
                     <w:t xml:space="preserve">4.382</w:t>
                   </w:r>
                 </w:p>
@@ -2285,6 +2739,11 @@
                     <w:jc w:val="center"/>
                   </w:pPr>
                   <w:r>
+                    <w:rPr>
+                      <w:rFonts w:ascii="Arial" w:hAnsi="Arial" w:eastAsia="Arial" w:cs="Arial"/>
+                      <w:sz w:val="16"/>
+                      <w:szCs w:val="16"/>
+                    </w:rPr>
                     <w:t xml:space="preserve">0.001</w:t>
                   </w:r>
                 </w:p>
@@ -2292,7 +2751,11 @@
             </w:tr>
             <w:tr>
               <w:tc>
-                <w:tcPr/>
+                <w:tcPr>
+                  <w:tcBorders>
+                    <w:bottom w:val="single" w:sz="8" w:space="0" w:color="000000"/>
+                  </w:tcBorders>
+                </w:tcPr>
                 <w:p>
                   <w:pPr>
                     <w:pStyle w:val="Compact"/>
@@ -2300,12 +2763,21 @@
                     <w:jc w:val="center"/>
                   </w:pPr>
                   <w:r>
+                    <w:rPr>
+                      <w:rFonts w:ascii="Arial" w:hAnsi="Arial" w:eastAsia="Arial" w:cs="Arial"/>
+                      <w:sz w:val="16"/>
+                      <w:szCs w:val="16"/>
+                    </w:rPr>
                     <w:t xml:space="preserve">Aur-P2</w:t>
                   </w:r>
                 </w:p>
               </w:tc>
               <w:tc>
-                <w:tcPr/>
+                <w:tcPr>
+                  <w:tcBorders>
+                    <w:bottom w:val="single" w:sz="8" w:space="0" w:color="000000"/>
+                  </w:tcBorders>
+                </w:tcPr>
                 <w:p>
                   <w:pPr>
                     <w:pStyle w:val="Compact"/>
@@ -2313,12 +2785,21 @@
                     <w:jc w:val="center"/>
                   </w:pPr>
                   <w:r>
+                    <w:rPr>
+                      <w:rFonts w:ascii="Arial" w:hAnsi="Arial" w:eastAsia="Arial" w:cs="Arial"/>
+                      <w:sz w:val="16"/>
+                      <w:szCs w:val="16"/>
+                    </w:rPr>
                     <w:t xml:space="preserve">0.223</w:t>
                   </w:r>
                 </w:p>
               </w:tc>
               <w:tc>
-                <w:tcPr/>
+                <w:tcPr>
+                  <w:tcBorders>
+                    <w:bottom w:val="single" w:sz="8" w:space="0" w:color="000000"/>
+                  </w:tcBorders>
+                </w:tcPr>
                 <w:p>
                   <w:pPr>
                     <w:pStyle w:val="Compact"/>
@@ -2326,12 +2807,21 @@
                     <w:jc w:val="center"/>
                   </w:pPr>
                   <w:r>
+                    <w:rPr>
+                      <w:rFonts w:ascii="Arial" w:hAnsi="Arial" w:eastAsia="Arial" w:cs="Arial"/>
+                      <w:sz w:val="16"/>
+                      <w:szCs w:val="16"/>
+                    </w:rPr>
                     <w:t xml:space="preserve">2.008</w:t>
                   </w:r>
                 </w:p>
               </w:tc>
               <w:tc>
-                <w:tcPr/>
+                <w:tcPr>
+                  <w:tcBorders>
+                    <w:bottom w:val="single" w:sz="8" w:space="0" w:color="000000"/>
+                  </w:tcBorders>
+                </w:tcPr>
                 <w:p>
                   <w:pPr>
                     <w:pStyle w:val="Compact"/>
@@ -2339,6 +2829,11 @@
                     <w:jc w:val="center"/>
                   </w:pPr>
                   <w:r>
+                    <w:rPr>
+                      <w:rFonts w:ascii="Arial" w:hAnsi="Arial" w:eastAsia="Arial" w:cs="Arial"/>
+                      <w:sz w:val="16"/>
+                      <w:szCs w:val="16"/>
+                    </w:rPr>
                     <w:t xml:space="preserve">0.076</w:t>
                   </w:r>
                 </w:p>
@@ -2355,6 +2850,10 @@
               <w:pStyle w:val="ImageCaption"/>
             </w:pPr>
             <w:r>
+              <w:rPr>
+                <w:rFonts w:ascii="Arial" w:hAnsi="Arial" w:eastAsia="Arial"/>
+                <w:sz w:val="16"/>
+              </w:rPr>
               <w:t xml:space="preserve">Table 3: Table of the results per phase for the perMANOVA</w:t>
             </w:r>
           </w:p>
@@ -2367,10 +2866,7 @@
         <w:pStyle w:val="BodyText"/>
       </w:pPr>
       <w:r>
-        <w:t xml:space="preserve">The perMANOVA results show that group membership explains approximately 0.196 of the variance in sign composition in the Aur-P1 phase and 0.223 in the Aur-P2 phase</w:t>
-      </w:r>
-      <w:r>
-        <w:t xml:space="preserve"> </w:t>
+        <w:t xml:space="preserve">The perMANOVA results show that group membership explains approximately 0.196 of the variance in sign composition in the Aur-P1 phase and 0.223 in the Aur-P2 phase (</w:t>
       </w:r>
       <w:hyperlink w:anchor="tbl-strength-table">
         <w:r>
@@ -2381,7 +2877,7 @@
         </w:r>
       </w:hyperlink>
       <w:r>
-        <w:t xml:space="preserve">. While R² is stable across phases, the pseudo-F statistic differs: the Aur-P1 phase shows the greater group separation (F = 4.382) than Aur-P2 (F = 2.008). The betadisper test for homogeneity of multivariate dispersions shows that group dispersion does not differ significantly between restricted and broad groups in either phase (Aur-P1: p = 0.124, Aur-P2: p = 0.771). This confirms that the perMANOVA results reflect differences in group centroids rather than differences in dispersion.</w:t>
+        <w:t xml:space="preserve">). While R² is stable across phases, the pseudo-F statistic differs: the Aur-P1 phase shows the greater group separation (F = 4.382) than Aur-P2 (F = 2.008). The betadisper test for homogeneity of multivariate dispersions shows that group dispersion does not differ significantly between restricted and broad groups in either phase (Aur-P1: p = 0.124, Aur-P2: p = 0.771). For Aur-P1, this confirms that the significant perMANOVA results reflect differences in group centroids rather than differences in dispersion.</w:t>
       </w:r>
     </w:p>
     <w:bookmarkEnd w:id="51"/>
@@ -2409,13 +2905,64 @@
         <w:pStyle w:val="FirstParagraph"/>
       </w:pPr>
       <w:r>
-        <w:t>Our first aim was to determine whether any structure in sign type composition exists within each phase, and how diversity, size, connectivity, and distribution vary between the phases. The results from Figure 2 show that each phase can be divided into two main sign-use groups, with sign type frequency and diversity serving as the major dividing factor. Group size differed between phases: in Aur-P1 the restricted-range group (9 sites) was slightly smaller than the broad-range group (11 sites), whereas in the much smaller Aur-P2 the restricted-range group (6 sites) exceeded the broad-range group (3 sites). Figure 3 shows that connectivity also differs between the phases. Aur-P1 produced the more edge-rich network with the higher mean degree (7.5°) and a hub structure centred on key sites, while Aur-P2 shows fewer edges and a lower mean degree (4.2°). Pairwise permutation tests indicate that the phases do not differ significantly in any of the tested network statistics (edge density, modularity, mean betweenness, or component count), so the Aur-P1–Aur-P2 contrast is best described as a difference in network scale rather than in overall connectedness or community structure. The perMANOVA tests confirm that the restricted- and broad-range groups are significantly separated in sign composition within Aur-P1 (R² = 0.196, p = 0.001), while the separation within Aur-P2 is not significant (R² = 0.223, p = 0.076), consistent with the smaller and weaker Aur-P2 structure reported in the Results.</w:t>
+        <w:t xml:space="preserve">Our first aim was to determine whether any structure in sign type composition exists within each phase, and how diversity, size, connectivity, and distribution vary between the phases. The results from</w:t>
+      </w:r>
+      <w:r>
+        <w:t xml:space="preserve"> </w:t>
+      </w:r>
+      <w:hyperlink w:anchor="fig-seriation">
+        <w:r>
+          <w:rPr>
+            <w:rStyle w:val="Hyperlink"/>
+          </w:rPr>
+          <w:t xml:space="preserve">Figure 2</w:t>
+        </w:r>
+      </w:hyperlink>
+      <w:r>
+        <w:t xml:space="preserve"> </w:t>
+      </w:r>
+      <w:r>
+        <w:t xml:space="preserve">show that each phase can be divided into two main sign-use groups, with sign type frequency and diversity serving as the major dividing factor. Group size differed between phases: in Aur-P1 the restricted-range group (9 sites) was slightly smaller than the broad-range group (11 sites), whereas in the much smaller Aur-P2 the restricted-range group (6 sites) exceeded the broad-range group (3 sites). Because of documented mixing at Vogelherd, we test our network models both with and without the site in our Supplementary Material item</w:t>
+      </w:r>
+      <w:r>
+        <w:t xml:space="preserve"> </w:t>
+      </w:r>
+      <w:r>
+        <w:t xml:space="preserve">“</w:t>
+      </w:r>
+      <w:r>
+        <w:t xml:space="preserve">Sensitivity Analyses</w:t>
+      </w:r>
+      <w:r>
+        <w:t xml:space="preserve">”</w:t>
+      </w:r>
+      <w:r>
+        <w:t xml:space="preserve">. The removal of Vogelherd does not change the fundamental restricted/broad group structure.</w:t>
       </w:r>
     </w:p>
     <w:p>
       <w:pPr>
         <w:pStyle w:val="BodyText"/>
       </w:pPr>
+      <w:hyperlink w:anchor="fig-neighbor-net">
+        <w:r>
+          <w:rPr>
+            <w:rStyle w:val="Hyperlink"/>
+          </w:rPr>
+          <w:t xml:space="preserve">Figure 3</w:t>
+        </w:r>
+      </w:hyperlink>
+      <w:r>
+        <w:t xml:space="preserve"> </w:t>
+      </w:r>
+      <w:r>
+        <w:t xml:space="preserve">shows that connectivity also differs between the phases. Aur-P1 produced the more edge-rich network with the higher mean degree (7.5°) and a hub structure centred on key sites, while Aur-P2 shows fewer edges and a lower mean degree (4.2°). Pairwise permutation tests indicate that the phases do not differ significantly in any of the tested network statistics (edge density, modularity, mean betweenness, or component count), so the Aur-P1–Aur-P2 contrast is best described as a difference in network scale rather than in overall connectedness or community structure. The perMANOVA tests confirm that the restricted- and broad-range groups are significantly separated in sign composition within Aur-P1 (R² = 0.196, p = 0.001), while the separation within Aur-P2 is not significant (R² = 0.223, p = 0.076), consistent with the smaller and weaker Aur-P2 structure reported in the Results.</w:t>
+      </w:r>
+    </w:p>
+    <w:p>
+      <w:pPr>
+        <w:pStyle w:val="BodyText"/>
+      </w:pPr>
       <w:r>
         <w:t xml:space="preserve">One consistent grouping dynamic throughout both phases is the restricted/broader range group divide, which may be influenced by variation in social structure. Variation in hunter-gatherer social structures is well-known from ethnographic and archaeological research</w:t>
       </w:r>
@@ -2761,23 +3308,75 @@
         <w:pStyle w:val="BodyText"/>
       </w:pPr>
       <w:r>
-        <w:t>When each site’s observed diversity is compared with the expectation for its sample size, 5 of 20 Aur-P1 sites and 4 of 9 Aur-P2 sites exceed their expected diversity (the mean simulated diversity for the equivalent count of sign types). Notably, most of these sites are not shown as having connections between groups in Figure 3. The relative diversity does not track the phase-level pool size (Aur-P1 mean excess -0.2, Aur-P2 mean excess -0.07), so the sites’ relative diversity fluctuates independently of the sign-type pool. This suggests a distinction between shorter-term information exchange (e.g. the highly interconnected sites in Figure 3) and longer-term residential movement for aggregation (e.g. the sites with higher than expected diversity in Figure 6). Supporting this distinction, diversity excess (as an indicator of aggregation candidates) showed a negative correlation with network degree after Benjamini‑Hochberg correction for six tests (ρ = -0.35, p = 0.095), indicating that aggregation candidates are less connected rather than merely decoupled from network hubs. The correlation with mean betweenness was not significant (ρ = -0.24, p = 0.246). Object count was positively correlated with degree centrality after correction (degree: ρ = 0.35, p = 0.095), indicating that hubs tend to be among the better-sampled sites. The elevated diversity identifying aggregation candidates differed significantly between the restricted and broad-range groups (Wilcoxon W = 59, p = 0.044), so this metric does track the restricted/broad grouping.</w:t>
+        <w:t xml:space="preserve">When each site’s observed diversity is compared with the expectation for its sample size, 5 of 20 Aur-P1 sites and 4 of 9 Aur-P2 sites exceed their expected diversity (the mean simulated diversity for the equivalent count of sign types). Notably, most of these sites are not shown as having connections between groups in</w:t>
+      </w:r>
+      <w:r>
+        <w:t xml:space="preserve"> </w:t>
+      </w:r>
+      <w:hyperlink w:anchor="fig-neighbor-net">
+        <w:r>
+          <w:rPr>
+            <w:rStyle w:val="Hyperlink"/>
+          </w:rPr>
+          <w:t xml:space="preserve">Figure 3</w:t>
+        </w:r>
+      </w:hyperlink>
+      <w:r>
+        <w:t xml:space="preserve">. The relative diversity does not track the phase-level pool size (Aur-P1 mean excess -0.2, Aur-P2 mean excess -0.07), so the sites’ relative diversity fluctuates independently of the sign-type pool. This suggests a distinction between shorter-term information exchange (e.g. the highly interconnected sites in</w:t>
+      </w:r>
+      <w:r>
+        <w:t xml:space="preserve"> </w:t>
+      </w:r>
+      <w:hyperlink w:anchor="fig-neighbor-net">
+        <w:r>
+          <w:rPr>
+            <w:rStyle w:val="Hyperlink"/>
+          </w:rPr>
+          <w:t xml:space="preserve">Figure 3</w:t>
+        </w:r>
+      </w:hyperlink>
+      <w:r>
+        <w:t xml:space="preserve">) and longer-term residential movement for aggregation (e.g. the sites with higher than expected diversity in</w:t>
+      </w:r>
+      <w:r>
+        <w:t xml:space="preserve"> </w:t>
+      </w:r>
+      <w:hyperlink w:anchor="fig-div-plot">
+        <w:r>
+          <w:rPr>
+            <w:rStyle w:val="Hyperlink"/>
+          </w:rPr>
+          <w:t xml:space="preserve">Figure 6</w:t>
+        </w:r>
+      </w:hyperlink>
+      <w:r>
+        <w:t xml:space="preserve">). Supporting this distinction, diversity excess (as an indicator of aggregation candidates) showed a negative correlation with network degree after Benjamini‑Hochberg correction for six tests (ρ = -0.35, p = 0.095), indicating that aggregation candidates are less connected rather than merely decoupled from network hubs. The correlation with mean betweenness was not significant (ρ = -0.24, p = 0.246). Object count was positively correlated with degree centrality after correction (degree: ρ = 0.35, p = 0.095), indicating that hubs tend to be among the better-sampled sites. The elevated diversity identifying aggregation candidates differed significantly between the restricted and broad-range groups (Wilcoxon W = 59, p = 0.044), so this metric does track the restricted/broad grouping.</w:t>
       </w:r>
     </w:p>
     <w:tbl>
       <w:tblPr>
         <w:tblStyle w:val="Table"/>
         <w:tblW w:type="pct" w:w="5000"/>
-        <w:tblLook w:firstRow="0" w:lastRow="0" w:firstColumn="0" w:lastColumn="0" w:noHBand="0" w:noVBand="0" w:val="0000"/>
+        <w:tblLook w:firstRow="1" w:lastRow="1" w:firstColumn="0" w:lastColumn="0" w:noHBand="0" w:noVBand="0" w:val="0023"/>
         <w:jc w:val="start"/>
         <w:tblLayout w:type="fixed"/>
+        <w:tblBorders>
+          <w:top w:val="single" w:sz="8" w:space="0" w:color="000000"/>
+          <w:bottom w:val="single" w:sz="8" w:space="0" w:color="000000"/>
+          <w:insideH w:val="none" w:sz="8" w:space="0" w:color="000000"/>
+        </w:tblBorders>
       </w:tblPr>
       <w:tblGrid>
         <w:gridCol w:w="7920"/>
       </w:tblGrid>
       <w:tr>
         <w:tc>
-          <w:tcPr/>
+          <w:tcPr>
+            <w:tcBorders>
+              <w:top w:val="single" w:sz="8" w:space="0" w:color="000000"/>
+              <w:bottom w:val="single" w:sz="8" w:space="0" w:color="000000"/>
+            </w:tcBorders>
+          </w:tcPr>
           <w:bookmarkStart w:id="56" w:name="fig-div-plot"/>
           <w:p>
             <w:pPr>
@@ -2785,6 +3384,10 @@
               <w:jc w:val="center"/>
             </w:pPr>
             <w:r>
+              <w:rPr>
+                <w:rFonts w:ascii="Arial" w:hAnsi="Arial" w:eastAsia="Arial"/>
+                <w:sz w:val="16"/>
+              </w:rPr>
               <w:drawing>
                 <wp:inline>
                   <wp:extent cx="3669832" cy="7339665"/>
@@ -2837,6 +3440,10 @@
               <w:pStyle w:val="ImageCaption"/>
             </w:pPr>
             <w:r>
+              <w:rPr>
+                <w:rFonts w:ascii="Arial" w:hAnsi="Arial" w:eastAsia="Arial"/>
+                <w:sz w:val="16"/>
+              </w:rPr>
               <w:t xml:space="preserve">Figure 6: Sites with elevated sign diversity, compared with randomised expectations. Observed geometric sign diversity at each site compared with expectations derived from randomised assemblages controlling for sample size. The blue expectation curve is the mean diversity index per sample size. The red lines enclose a band that is the 95% confidence interval. Sites above the blue expectation curve are candidate aggregation sites, reflecting unusually diverse sign repertoires relative to regional norms; however, elevated diversity may also reflect sample size, recovery history, research intensity, preservation or site function rather than aggregation.</w:t>
             </w:r>
           </w:p>
@@ -2970,7 +3577,40 @@
         <w:pStyle w:val="BodyText"/>
       </w:pPr>
       <w:r>
-        <w:t>Our results partially align with [20], who used eco-cultural niche modeling to show that Heinrich Stadial 4 (HS4) at the very beginning of the Early Aurignacian resulted in an expansion of people into new environmental niches, hypothesised to involve an expansion of social networks both within and between populations. Our results do not confirm this hypothesis in the two-phase comparison: mean degree is higher in Aur-P1 (7.5°) than Aur-P2 (4.2°), and edge count drops from 75 in Aur-P1 to 19 in Aur-P2. However, after accounting for network size, Aur-P2 actually shows descriptively higher edge density (though not statistically significant, p = 0.4404), and neither phase shows a significant geographic signal (Aur-P1 Mantel R = 0.046, Aur-P2 Mantel R = -0.299), suggesting that sign sharing was not primarily driven by expansion into new, spatially structured niches. Similarly, [21] developed a human-existence probability model for the Aurignacian, finding an expanded, more dispersed settlement area for the Evolved/Late Aurignacian, and [87] also identifies increased expansion marking the beginning of the Evolved Aurignacian. In our data Aur-P2’s wider spatial spread was not accompanied by stronger sign-type sharing, consistent with weaker inter-site connectivity relative to network size. These patterns of connectivity and geographic structure also have implications for understanding how geometric signs functioned as markers of group identity, which we explore next.</w:t>
+        <w:t xml:space="preserve">Our results partially align with</w:t>
+      </w:r>
+      <w:r>
+        <w:t xml:space="preserve"> </w:t>
+      </w:r>
+      <w:r>
+        <w:t xml:space="preserve">[20]</w:t>
+      </w:r>
+      <w:r>
+        <w:t xml:space="preserve">, who used eco-cultural niche modeling to show that Heinrich Stadial 4 (HS4) at the very beginning of the Early Aurignacian resulted in an expansion of people into new environmental niches, hypothesised to involve an expansion of social networks both within and between populations. Our results do not confirm this hypothesis in the two-phase comparison: mean degree is higher in Aur-P1 (7.5°) than Aur-P2 (4.2°), and edge count drops from 75 in Aur-P1 to 19 in Aur-P2. However, after accounting for network size, Aur-P2 actually shows descriptively higher edge density (though not statistically significant, p = 0.4404), and neither phase shows a significant geographic signal (Aur-P1 Mantel R = 0.046, Aur-P2 Mantel R = -0.299), suggesting that sign sharing was not primarily driven by expansion into new, spatially structured niches. Similarly,</w:t>
+      </w:r>
+      <w:r>
+        <w:t xml:space="preserve"> </w:t>
+      </w:r>
+      <w:r>
+        <w:t xml:space="preserve">[21]</w:t>
+      </w:r>
+      <w:r>
+        <w:t xml:space="preserve"> </w:t>
+      </w:r>
+      <w:r>
+        <w:t xml:space="preserve">developed a human-existence probability model for the Aurignacian, finding an expanded, more dispersed settlement area for the Evolved/Late Aurignacian, and</w:t>
+      </w:r>
+      <w:r>
+        <w:t xml:space="preserve"> </w:t>
+      </w:r>
+      <w:r>
+        <w:t xml:space="preserve">[87]</w:t>
+      </w:r>
+      <w:r>
+        <w:t xml:space="preserve"> </w:t>
+      </w:r>
+      <w:r>
+        <w:t xml:space="preserve">also identifies increased expansion marking the beginning of the Evolved Aurignacian. In our data Aur-P2’s wider spatial spread was not accompanied by stronger sign-type sharing. These patterns of connectivity and geographic structure also have implications for understanding how geometric signs functioned as markers of group identity, which we explore next.</w:t>
       </w:r>
     </w:p>
     <w:p>
@@ -3029,10 +3669,7 @@
         <w:t xml:space="preserve">[3]</w:t>
       </w:r>
       <w:r>
-        <w:t xml:space="preserve">. We might hypothesize that the distribution found in the Aur-P2 phase</w:t>
-      </w:r>
-      <w:r>
-        <w:t xml:space="preserve"> </w:t>
+        <w:t xml:space="preserve">. We might hypothesize that the distribution found in the Aur-P2 phase (</w:t>
       </w:r>
       <w:hyperlink w:anchor="fig-group-map">
         <w:r>
@@ -3043,10 +3680,7 @@
         </w:r>
       </w:hyperlink>
       <w:r>
-        <w:t xml:space="preserve"> </w:t>
-      </w:r>
-      <w:r>
-        <w:t xml:space="preserve">evolved into the clusters proposed by</w:t>
+        <w:t xml:space="preserve">) evolved into the clusters proposed by</w:t>
       </w:r>
       <w:r>
         <w:t xml:space="preserve"> </w:t>
@@ -3120,7 +3754,52 @@
         <w:pStyle w:val="BodyText"/>
       </w:pPr>
       <w:r>
-        <w:t>Our results can be interpreted through the lens of cultural transmission theory [98–100]. Smaller populations are predicted to experience greater drift and reduced capacity to maintain complex cultural repertoires [101], which is consistent with our observation that the sign-type pool is larger in the Aur-P1 phase (26 types) than in the Aur-P2 phase (15 types). Network structure also shapes cultural information flow: highly connected networks with hub structures facilitate rapid transmission and reduce drift [102,103], while more clustered networks promote localised conformist transmission and differentiation within subgroups [104]. Our Aur-P1 network, with the higher mean degree (7.5°) and hub structure centred on key sites, would be expected to show efficient sign-type transmission — consistent with the wide geographic spread of common signs. Aur-P2 shows descriptively higher relative edge density (though not statistically significant, p = 0.4404) but a lower mean degree (4.2°) and no significant geographic signal (Mantel R = -0.299, p = 0.933), suggesting more localised interactions. The reduced connectivity in Aur-P2 relative to Aur-P1 may reflect population consolidation and more localised social structures. However, the lack of significant geographic structure in either phase contradicts simple isolation-by-distance models [101,105], suggesting sign transmission may have operated through channels such as ritual gatherings or ceremonial exchange rather than routine mobility alone. These interpretations are speculative: network structure reflects sign-sharing patterns, not direct evidence of social organisation, and simpler sign types may reflect independent invention or functional constraints rather than social transmission.</w:t>
+        <w:t xml:space="preserve">Our results can be interpreted through the lens of cultural transmission theory</w:t>
+      </w:r>
+      <w:r>
+        <w:t xml:space="preserve"> </w:t>
+      </w:r>
+      <w:r>
+        <w:t xml:space="preserve">[98–100]</w:t>
+      </w:r>
+      <w:r>
+        <w:t xml:space="preserve">. Smaller populations are predicted to experience greater drift and reduced capacity to maintain complex cultural repertoires</w:t>
+      </w:r>
+      <w:r>
+        <w:t xml:space="preserve"> </w:t>
+      </w:r>
+      <w:r>
+        <w:t xml:space="preserve">[101]</w:t>
+      </w:r>
+      <w:r>
+        <w:t xml:space="preserve">, which is consistent with our observation that the sign-type pool is larger in the Aur-P1 phase (26 types) than in the Aur-P2 phase (15 types). Network structure also shapes cultural information flow: highly connected networks with hub structures facilitate rapid transmission and reduce drift</w:t>
+      </w:r>
+      <w:r>
+        <w:t xml:space="preserve"> </w:t>
+      </w:r>
+      <w:r>
+        <w:t xml:space="preserve">[102,103]</w:t>
+      </w:r>
+      <w:r>
+        <w:t xml:space="preserve">, while more clustered networks promote localised conformist transmission and differentiation within subgroups</w:t>
+      </w:r>
+      <w:r>
+        <w:t xml:space="preserve"> </w:t>
+      </w:r>
+      <w:r>
+        <w:t xml:space="preserve">[104]</w:t>
+      </w:r>
+      <w:r>
+        <w:t xml:space="preserve">. Our Aur-P1 network, with the higher mean degree (7.5°) and hub structure centred on key sites, would be expected to show efficient sign-type transmission — consistent with the wide geographic spread of common signs. Aur-P2 shows descriptively higher relative edge density (though not statistically significant, p = 0.4404) but a lower mean degree (4.2°) and no significant geographic signal (Mantel R = -0.299, p = 0.933), suggesting more localised interactions. While Aur-P2 exhibits a lower mean degree due to its smaller network size, it shows a descriptively higher edge density (though not statistically significant, p = 0.4404) and no statistically significant difference in connectivity metrics compared to Aur-P1. This suggests that relative interaction levels remained consistent across the two phases, even as populations consolidated into fewer documented sites. The lack of significant geographic structure in either phase contradicts simple isolation-by-distance models</w:t>
+      </w:r>
+      <w:r>
+        <w:t xml:space="preserve"> </w:t>
+      </w:r>
+      <w:r>
+        <w:t xml:space="preserve">[101,105]</w:t>
+      </w:r>
+      <w:r>
+        <w:t xml:space="preserve">, suggesting sign transmission may have operated through channels such as ritual gatherings or ceremonial exchange rather than routine mobility alone. These interpretations are speculative: network structure reflects sign-sharing patterns, not direct evidence of social organisation, and simpler sign types may reflect independent invention or functional constraints rather than social transmission.</w:t>
       </w:r>
     </w:p>
     <w:p>
@@ -3255,7 +3934,79 @@
         <w:pStyle w:val="FirstParagraph"/>
       </w:pPr>
       <w:r>
-        <w:t>This study adds to our knowledge of social networks within the Aurignacian period, as our results document structured patterns of social exchange and connection. Previous work [3,79,112–115] has used material culture analysis to reconstruct Upper Palaeolithic social networks, which have been argued to be a driver of cultural and evolutionary change [2,72,116–120]. Within a two-phase (Aur-P1/Aur-P2) framework grounded in specialist technological attributions, we find a robust restricted/broad two-group structure in geometric-sign use in the early phase (Aur-P1) that survives bootstrap resampling and independent model-based validation, and that is not explained by geographic distance. The two phases do not differ significantly in any tested network statistic (edge density, modularity, mean betweenness, or component count), and neither phase shows a significant isolation-by-distance signal; the Mantel relationship does not differ between phases. These results shift the interpretation of Aurignacian sign distribution away from a simple densest-network narrative toward a comparative account of how the two phases are structured and connected. We attempted to rectify the low temporal resolution that tends to affect network analysis results when analyzing older, more time-averaged data sets [121] by working with two internally coherent phases. Additionally, by comparing the phases rather than assuming a single trajectory, we are able to see social networks as fluid and dynamic, rather than static and bounded [78]. Our results do not support the conclusions drawn in [6], where Aurignacian artwork is found to be a symbolic marker of structured ethnic identity, but are supported by [97], which utilizes the same data as [6] to conclude that cultural identity by-descent with modification is a more likely explanation for the distribution of Aurignacian ornaments.</w:t>
+        <w:t xml:space="preserve">This study adds to our knowledge of social networks within the Aurignacian period, as our results document structured patterns of social exchange and connection. Previous work</w:t>
+      </w:r>
+      <w:r>
+        <w:t xml:space="preserve"> </w:t>
+      </w:r>
+      <w:r>
+        <w:t xml:space="preserve">[3,79,112–115]</w:t>
+      </w:r>
+      <w:r>
+        <w:t xml:space="preserve"> </w:t>
+      </w:r>
+      <w:r>
+        <w:t xml:space="preserve">has used material culture analysis to reconstruct Upper Palaeolithic social networks, which have been argued to be a driver of cultural and evolutionary change</w:t>
+      </w:r>
+      <w:r>
+        <w:t xml:space="preserve"> </w:t>
+      </w:r>
+      <w:r>
+        <w:t xml:space="preserve">[2,72,116–120]</w:t>
+      </w:r>
+      <w:r>
+        <w:t xml:space="preserve">. Within a two-phase (Aur-P1/Aur-P2) framework grounded in specialist technological attributions, we find a robust restricted/broad two-group structure in geometric-sign use in the early phase (Aur-P1) that survives bootstrap resampling and independent model-based validation, and that is not explained by geographic distance. The two phases do not differ significantly in any tested network statistic (edge density, modularity, mean betweenness, or component count), and neither phase shows a significant isolation-by-distance signal; the Mantel relationship does not differ between phases. These results shift the interpretation of Aurignacian sign distribution away from a simple densest-network narrative toward a comparative account of how the two phases are structured and connected. We attempted to rectify the low temporal resolution that tends to affect network analysis results when analyzing older, more time-averaged data sets</w:t>
+      </w:r>
+      <w:r>
+        <w:t xml:space="preserve"> </w:t>
+      </w:r>
+      <w:r>
+        <w:t xml:space="preserve">[121]</w:t>
+      </w:r>
+      <w:r>
+        <w:t xml:space="preserve"> </w:t>
+      </w:r>
+      <w:r>
+        <w:t xml:space="preserve">by working with two internally coherent phases. Additionally, by comparing the phases rather than assuming a single trajectory, we are able to see social networks as fluid and dynamic, rather than static and bounded</w:t>
+      </w:r>
+      <w:r>
+        <w:t xml:space="preserve"> </w:t>
+      </w:r>
+      <w:r>
+        <w:t xml:space="preserve">[78]</w:t>
+      </w:r>
+      <w:r>
+        <w:t xml:space="preserve">. Our results do not support the conclusions drawn in</w:t>
+      </w:r>
+      <w:r>
+        <w:t xml:space="preserve"> </w:t>
+      </w:r>
+      <w:r>
+        <w:t xml:space="preserve">[6]</w:t>
+      </w:r>
+      <w:r>
+        <w:t xml:space="preserve">, where Aurignacian artwork is found to be a symbolic marker of structured ethnic identity, but are supported by</w:t>
+      </w:r>
+      <w:r>
+        <w:t xml:space="preserve"> </w:t>
+      </w:r>
+      <w:r>
+        <w:t xml:space="preserve">[97]</w:t>
+      </w:r>
+      <w:r>
+        <w:t xml:space="preserve">, which utilizes the same data as</w:t>
+      </w:r>
+      <w:r>
+        <w:t xml:space="preserve"> </w:t>
+      </w:r>
+      <w:r>
+        <w:t xml:space="preserve">[6]</w:t>
+      </w:r>
+      <w:r>
+        <w:t xml:space="preserve"> </w:t>
+      </w:r>
+      <w:r>
+        <w:t xml:space="preserve">to conclude that cultural identity by-descent with modification is a more likely explanation for the distribution of Aurignacian ornaments.</w:t>
       </w:r>
     </w:p>
     <w:p>
@@ -3369,7 +4120,7 @@
         <w:t xml:space="preserve">[27]</w:t>
       </w:r>
       <w:r>
-        <w:t xml:space="preserve">. Additionally, Vogelherd Cave’s stratigraphy is severely compromised by excavation methodology and post-depositional disturbance, with documented mixing between Aurignacian, Gravettian, and Magdalenian layers</w:t>
+        <w:t xml:space="preserve">. Additionally, Vogelherd Cave’s stratigraphy is compromised by excavation methodology and post-depositional disturbance, with documented mixing between Aurignacian, Gravettian, and Magdalenian layers</w:t>
       </w:r>
       <w:r>
         <w:t xml:space="preserve"> </w:t>
@@ -9578,7 +10329,16 @@
         <w:bottom w:type="dxa" w:w="0"/>
         <w:right w:type="dxa" w:w="108"/>
       </w:tblCellMar>
+      <w:tblBorders>
+        <w:top w:color="000000" w:space="0" w:sz="8" w:val="single"/>
+        <w:bottom w:color="000000" w:space="0" w:sz="8" w:val="single"/>
+      </w:tblBorders>
     </w:tblPr>
+    <w:rPr>
+      <w:rFonts w:ascii="Arial" w:cs="Arial" w:eastAsia="Arial" w:hAnsi="Arial"/>
+      <w:sz w:val="16"/>
+      <w:szCs w:val="16"/>
+    </w:rPr>
   </w:style>
   <w:style w:default="1" w:styleId="NoList" w:type="numbering">
     <w:name w:val="No List"/>
@@ -10144,19 +10904,33 @@
     <w:basedOn w:val="TableNormal"/>
     <w:uiPriority w:val="99"/>
     <w:rPr>
-      <w:sz w:val="18"/>
-      <w:szCs w:val="18"/>
+      <w:sz w:val="16"/>
+      <w:szCs w:val="16"/>
+      <w:rFonts w:ascii="Arial" w:cs="Arial" w:eastAsia="Arial" w:hAnsi="Arial"/>
     </w:rPr>
     <w:tblPr>
       <w:tblCellMar>
         <w:left w:type="dxa" w:w="108"/>
         <w:right w:type="dxa" w:w="108"/>
       </w:tblCellMar>
+      <w:tblBorders>
+        <w:top w:color="000000" w:space="0" w:sz="8" w:val="single"/>
+        <w:bottom w:color="000000" w:space="0" w:sz="8" w:val="single"/>
+        <w:insideH w:color="000000" w:space="0" w:sz="8" w:val="none"/>
+      </w:tblBorders>
     </w:tblPr>
     <w:tblStylePr w:type="firstRow">
       <w:rPr>
         <w:b/>
       </w:rPr>
+      <w:tcBorders>
+        <w:bottom w:color="000000" w:space="0" w:sz="8" w:val="single"/>
+      </w:tcBorders>
+    </w:tblStylePr>
+    <w:tblStylePr w:type="lastRow">
+      <w:tcBorders>
+        <w:bottom w:color="000000" w:space="0" w:sz="8" w:val="single"/>
+      </w:tcBorders>
     </w:tblStylePr>
   </w:style>
 </w:styles>

</xml_diff>

<commit_message>
minor edits, table formatting
</commit_message>
<xml_diff>
--- a/paper/paper.docx
+++ b/paper/paper.docx
@@ -797,39 +797,24 @@
       <w:tblPr>
         <w:tblStyle w:val="Table"/>
         <w:tblW w:type="pct" w:w="5000"/>
-        <w:tblLook w:firstRow="1" w:lastRow="1" w:firstColumn="0" w:lastColumn="0" w:noHBand="0" w:noVBand="0" w:val="0023"/>
+        <w:tblLook w:firstRow="0" w:lastRow="0" w:firstColumn="0" w:lastColumn="0" w:noHBand="0" w:noVBand="0" w:val="0000"/>
         <w:jc w:val="start"/>
         <w:tblLayout w:type="fixed"/>
-        <w:tblBorders>
-          <w:top w:val="single" w:sz="8" w:space="0" w:color="000000"/>
-          <w:bottom w:val="single" w:sz="8" w:space="0" w:color="000000"/>
-          <w:insideH w:val="none" w:sz="8" w:space="0" w:color="000000"/>
-        </w:tblBorders>
       </w:tblPr>
       <w:tblGrid>
         <w:gridCol w:w="7920"/>
       </w:tblGrid>
       <w:tr>
         <w:tc>
-          <w:tcPr>
-            <w:tcBorders>
-              <w:top w:val="single" w:sz="8" w:space="0" w:color="000000"/>
-              <w:bottom w:val="single" w:sz="8" w:space="0" w:color="000000"/>
-            </w:tcBorders>
-          </w:tcPr>
+          <w:tcPr/>
           <w:bookmarkStart w:id="22" w:name="tbl-aur-table"/>
           <w:tbl>
             <w:tblPr>
               <w:tblStyle w:val="Table"/>
               <w:tblW w:type="pct" w:w="5000"/>
-              <w:tblLook w:firstRow="1" w:lastRow="1" w:firstColumn="0" w:lastColumn="0" w:noHBand="0" w:noVBand="0" w:val="0023"/>
+              <w:tblLook w:firstRow="1" w:lastRow="0" w:firstColumn="0" w:lastColumn="0" w:noHBand="0" w:noVBand="0" w:val="0020"/>
               <w:jc w:val="start"/>
               <w:tblLayout w:type="fixed"/>
-              <w:tblBorders>
-                <w:top w:val="single" w:sz="8" w:space="0" w:color="000000"/>
-                <w:bottom w:val="single" w:sz="8" w:space="0" w:color="000000"/>
-                <w:insideH w:val="none" w:sz="8" w:space="0" w:color="000000"/>
-              </w:tblBorders>
             </w:tblPr>
             <w:tblGrid>
               <w:gridCol w:w="205"/>
@@ -842,12 +827,7 @@
                 <w:tblHeader w:val="true"/>
               </w:trPr>
               <w:tc>
-                <w:tcPr>
-                  <w:tcBorders>
-                    <w:top w:val="single" w:sz="8" w:space="0" w:color="000000"/>
-                    <w:bottom w:val="single" w:sz="8" w:space="0" w:color="000000"/>
-                  </w:tcBorders>
-                </w:tcPr>
+                <w:tcPr/>
                 <w:p>
                   <w:pPr>
                     <w:pStyle w:val="Compact"/>
@@ -855,22 +835,12 @@
                     <w:jc w:val="center"/>
                   </w:pPr>
                   <w:r>
-                    <w:rPr>
-                      <w:rFonts w:ascii="Arial" w:hAnsi="Arial" w:eastAsia="Arial" w:cs="Arial"/>
-                      <w:sz w:val="16"/>
-                      <w:szCs w:val="16"/>
-                    </w:rPr>
                     <w:t xml:space="preserve">Time Period Name</w:t>
                   </w:r>
                 </w:p>
               </w:tc>
               <w:tc>
-                <w:tcPr>
-                  <w:tcBorders>
-                    <w:top w:val="single" w:sz="8" w:space="0" w:color="000000"/>
-                    <w:bottom w:val="single" w:sz="8" w:space="0" w:color="000000"/>
-                  </w:tcBorders>
-                </w:tcPr>
+                <w:tcPr/>
                 <w:p>
                   <w:pPr>
                     <w:pStyle w:val="Compact"/>
@@ -878,22 +848,12 @@
                     <w:jc w:val="center"/>
                   </w:pPr>
                   <w:r>
-                    <w:rPr>
-                      <w:rFonts w:ascii="Arial" w:hAnsi="Arial" w:eastAsia="Arial" w:cs="Arial"/>
-                      <w:sz w:val="16"/>
-                      <w:szCs w:val="16"/>
-                    </w:rPr>
                     <w:t xml:space="preserve">Dates (ka cal BP)</w:t>
                   </w:r>
                 </w:p>
               </w:tc>
               <w:tc>
-                <w:tcPr>
-                  <w:tcBorders>
-                    <w:top w:val="single" w:sz="8" w:space="0" w:color="000000"/>
-                    <w:bottom w:val="single" w:sz="8" w:space="0" w:color="000000"/>
-                  </w:tcBorders>
-                </w:tcPr>
+                <w:tcPr/>
                 <w:p>
                   <w:pPr>
                     <w:pStyle w:val="Compact"/>
@@ -901,22 +861,12 @@
                     <w:jc w:val="center"/>
                   </w:pPr>
                   <w:r>
-                    <w:rPr>
-                      <w:rFonts w:ascii="Arial" w:hAnsi="Arial" w:eastAsia="Arial" w:cs="Arial"/>
-                      <w:sz w:val="16"/>
-                      <w:szCs w:val="16"/>
-                    </w:rPr>
                     <w:t xml:space="preserve">Material Culture Markers</w:t>
                   </w:r>
                 </w:p>
               </w:tc>
               <w:tc>
-                <w:tcPr>
-                  <w:tcBorders>
-                    <w:top w:val="single" w:sz="8" w:space="0" w:color="000000"/>
-                    <w:bottom w:val="single" w:sz="8" w:space="0" w:color="000000"/>
-                  </w:tcBorders>
-                </w:tcPr>
+                <w:tcPr/>
                 <w:p>
                   <w:pPr>
                     <w:pStyle w:val="Compact"/>
@@ -924,11 +874,6 @@
                     <w:jc w:val="center"/>
                   </w:pPr>
                   <w:r>
-                    <w:rPr>
-                      <w:rFonts w:ascii="Arial" w:hAnsi="Arial" w:eastAsia="Arial" w:cs="Arial"/>
-                      <w:sz w:val="16"/>
-                      <w:szCs w:val="16"/>
-                    </w:rPr>
                     <w:t xml:space="preserve">Environmental Context</w:t>
                   </w:r>
                 </w:p>
@@ -944,11 +889,6 @@
                     <w:jc w:val="center"/>
                   </w:pPr>
                   <w:r>
-                    <w:rPr>
-                      <w:rFonts w:ascii="Arial" w:hAnsi="Arial" w:eastAsia="Arial" w:cs="Arial"/>
-                      <w:sz w:val="16"/>
-                      <w:szCs w:val="16"/>
-                    </w:rPr>
                     <w:t xml:space="preserve">Aur-P1 (Proto/Early)</w:t>
                   </w:r>
                 </w:p>
@@ -962,11 +902,6 @@
                     <w:jc w:val="center"/>
                   </w:pPr>
                   <w:r>
-                    <w:rPr>
-                      <w:rFonts w:ascii="Arial" w:hAnsi="Arial" w:eastAsia="Arial" w:cs="Arial"/>
-                      <w:sz w:val="16"/>
-                      <w:szCs w:val="16"/>
-                    </w:rPr>
                     <w:t xml:space="preserve">43 - 37</w:t>
                   </w:r>
                 </w:p>
@@ -980,11 +915,6 @@
                     <w:jc w:val="center"/>
                   </w:pPr>
                   <w:r>
-                    <w:rPr>
-                      <w:rFonts w:ascii="Arial" w:hAnsi="Arial" w:eastAsia="Arial" w:cs="Arial"/>
-                      <w:sz w:val="16"/>
-                      <w:szCs w:val="16"/>
-                    </w:rPr>
                     <w:t xml:space="preserve">Blades and bladelets initially produced within a single, continuous reduction sequence from the same unipolar/prismatic core, rather than from separate blade and bladelet cores; bladelets are the main target, large, straight-profiled, and turned into Dufour bladelets of the Dufour subtype via marginal direct, inverse or alternate retouch; split-based bone/antler points are initially very rare, then regionally variable. Blade and bladelet production later run as separate reduction sequences, with carinated and nosed end-scrapers systematically used as bladelet cores; thick blades with invasive, scalar Aurignacian retouch, sometimes waisted/strangled; Dufour bladelets later include the smaller Roc-de-Combe subtype alongside Dufour.</w:t>
                   </w:r>
                 </w:p>
@@ -998,11 +928,6 @@
                     <w:jc w:val="center"/>
                   </w:pPr>
                   <w:r>
-                    <w:rPr>
-                      <w:rFonts w:ascii="Arial" w:hAnsi="Arial" w:eastAsia="Arial" w:cs="Arial"/>
-                      <w:sz w:val="16"/>
-                      <w:szCs w:val="16"/>
-                    </w:rPr>
                     <w:t xml:space="preserve">Starts at Greenland Stadial 12, ends at Greenland Interstadial 8</w:t>
                   </w:r>
                 </w:p>
@@ -1010,11 +935,7 @@
             </w:tr>
             <w:tr>
               <w:tc>
-                <w:tcPr>
-                  <w:tcBorders>
-                    <w:bottom w:val="single" w:sz="8" w:space="0" w:color="000000"/>
-                  </w:tcBorders>
-                </w:tcPr>
+                <w:tcPr/>
                 <w:p>
                   <w:pPr>
                     <w:pStyle w:val="Compact"/>
@@ -1022,21 +943,12 @@
                     <w:jc w:val="center"/>
                   </w:pPr>
                   <w:r>
-                    <w:rPr>
-                      <w:rFonts w:ascii="Arial" w:hAnsi="Arial" w:eastAsia="Arial" w:cs="Arial"/>
-                      <w:sz w:val="16"/>
-                      <w:szCs w:val="16"/>
-                    </w:rPr>
                     <w:t xml:space="preserve">Aur-P2 (Evolved/Late)</w:t>
                   </w:r>
                 </w:p>
               </w:tc>
               <w:tc>
-                <w:tcPr>
-                  <w:tcBorders>
-                    <w:bottom w:val="single" w:sz="8" w:space="0" w:color="000000"/>
-                  </w:tcBorders>
-                </w:tcPr>
+                <w:tcPr/>
                 <w:p>
                   <w:pPr>
                     <w:pStyle w:val="Compact"/>
@@ -1044,21 +956,12 @@
                     <w:jc w:val="center"/>
                   </w:pPr>
                   <w:r>
-                    <w:rPr>
-                      <w:rFonts w:ascii="Arial" w:hAnsi="Arial" w:eastAsia="Arial" w:cs="Arial"/>
-                      <w:sz w:val="16"/>
-                      <w:szCs w:val="16"/>
-                    </w:rPr>
                     <w:t xml:space="preserve">37 - 32</w:t>
                   </w:r>
                 </w:p>
               </w:tc>
               <w:tc>
-                <w:tcPr>
-                  <w:tcBorders>
-                    <w:bottom w:val="single" w:sz="8" w:space="0" w:color="000000"/>
-                  </w:tcBorders>
-                </w:tcPr>
+                <w:tcPr/>
                 <w:p>
                   <w:pPr>
                     <w:pStyle w:val="Compact"/>
@@ -1066,21 +969,12 @@
                     <w:jc w:val="center"/>
                   </w:pPr>
                   <w:r>
-                    <w:rPr>
-                      <w:rFonts w:ascii="Arial" w:hAnsi="Arial" w:eastAsia="Arial" w:cs="Arial"/>
-                      <w:sz w:val="16"/>
-                      <w:szCs w:val="16"/>
-                    </w:rPr>
                     <w:t xml:space="preserve">Carinated/nosed-scraper bladelet-core technology intensifies further; busked (busqué) burins become numerous, later joined/replaced by the closely related Vachons-type burin; Dufour bladelets now dominated by the smaller, twisted Roc-de-Combe subtype; split-based points become rare, replaced first by flattened lozenge-shaped bone/antler points (with the busked burins), then oval-sectioned lozenge points (with Vachons burins), and finally biconical points</w:t>
                   </w:r>
                 </w:p>
               </w:tc>
               <w:tc>
-                <w:tcPr>
-                  <w:tcBorders>
-                    <w:bottom w:val="single" w:sz="8" w:space="0" w:color="000000"/>
-                  </w:tcBorders>
-                </w:tcPr>
+                <w:tcPr/>
                 <w:p>
                   <w:pPr>
                     <w:pStyle w:val="Compact"/>
@@ -1088,11 +982,6 @@
                     <w:jc w:val="center"/>
                   </w:pPr>
                   <w:r>
-                    <w:rPr>
-                      <w:rFonts w:ascii="Arial" w:hAnsi="Arial" w:eastAsia="Arial" w:cs="Arial"/>
-                      <w:sz w:val="16"/>
-                      <w:szCs w:val="16"/>
-                    </w:rPr>
                     <w:t xml:space="preserve">GI 8 - 6</w:t>
                   </w:r>
                 </w:p>
@@ -1109,24 +998,12 @@
               <w:pStyle w:val="ImageCaption"/>
             </w:pPr>
             <w:r>
-              <w:rPr>
-                <w:rFonts w:ascii="Arial" w:hAnsi="Arial" w:eastAsia="Arial"/>
-                <w:sz w:val="16"/>
-              </w:rPr>
               <w:t xml:space="preserve">Table 1: Summary of chronological, cultural and environmental characteristics of Aurignacian periods</w:t>
             </w:r>
             <w:r>
-              <w:rPr>
-                <w:rFonts w:ascii="Arial" w:hAnsi="Arial" w:eastAsia="Arial"/>
-                <w:sz w:val="16"/>
-              </w:rPr>
               <w:t xml:space="preserve"> </w:t>
             </w:r>
             <w:r>
-              <w:rPr>
-                <w:rFonts w:ascii="Arial" w:hAnsi="Arial" w:eastAsia="Arial"/>
-                <w:sz w:val="16"/>
-              </w:rPr>
               <w:t xml:space="preserve">[12,20,21,32]</w:t>
             </w:r>
           </w:p>
@@ -1226,26 +1103,16 @@
       <w:tblPr>
         <w:tblStyle w:val="Table"/>
         <w:tblW w:type="pct" w:w="5000"/>
-        <w:tblLook w:firstRow="1" w:lastRow="1" w:firstColumn="0" w:lastColumn="0" w:noHBand="0" w:noVBand="0" w:val="0023"/>
+        <w:tblLook w:firstRow="0" w:lastRow="0" w:firstColumn="0" w:lastColumn="0" w:noHBand="0" w:noVBand="0" w:val="0000"/>
         <w:jc w:val="start"/>
         <w:tblLayout w:type="fixed"/>
-        <w:tblBorders>
-          <w:top w:val="single" w:sz="8" w:space="0" w:color="000000"/>
-          <w:bottom w:val="single" w:sz="8" w:space="0" w:color="000000"/>
-          <w:insideH w:val="none" w:sz="8" w:space="0" w:color="000000"/>
-        </w:tblBorders>
       </w:tblPr>
       <w:tblGrid>
         <w:gridCol w:w="7920"/>
       </w:tblGrid>
       <w:tr>
         <w:tc>
-          <w:tcPr>
-            <w:tcBorders>
-              <w:top w:val="single" w:sz="8" w:space="0" w:color="000000"/>
-              <w:bottom w:val="single" w:sz="8" w:space="0" w:color="000000"/>
-            </w:tcBorders>
-          </w:tcPr>
+          <w:tcPr/>
           <w:bookmarkStart w:id="27" w:name="fig-site-map"/>
           <w:p>
             <w:pPr>
@@ -1253,10 +1120,6 @@
               <w:jc w:val="center"/>
             </w:pPr>
             <w:r>
-              <w:rPr>
-                <w:rFonts w:ascii="Arial" w:hAnsi="Arial" w:eastAsia="Arial"/>
-                <w:sz w:val="16"/>
-              </w:rPr>
               <w:drawing>
                 <wp:inline>
                   <wp:extent cx="5943600" cy="4953000"/>
@@ -1309,10 +1172,6 @@
               <w:pStyle w:val="ImageCaption"/>
             </w:pPr>
             <w:r>
-              <w:rPr>
-                <w:rFonts w:ascii="Arial" w:hAnsi="Arial" w:eastAsia="Arial"/>
-                <w:sz w:val="16"/>
-              </w:rPr>
               <w:t xml:space="preserve">Figure 1: A: Map of sites in each Aurignacian phase that contain geometric signs on mobile objects. B: Abundance of signs over time, phases indicated by colours. C. Distribution of object count by site, phases indicated by colours</w:t>
             </w:r>
           </w:p>
@@ -1514,38 +1373,23 @@
       <w:tblPr>
         <w:tblStyle w:val="Table"/>
         <w:tblW w:type="pct" w:w="5000"/>
-        <w:tblLook w:firstRow="1" w:lastRow="1" w:firstColumn="0" w:lastColumn="0" w:noHBand="0" w:noVBand="0" w:val="0023"/>
+        <w:tblLook w:firstRow="0" w:lastRow="0" w:firstColumn="0" w:lastColumn="0" w:noHBand="0" w:noVBand="0" w:val="0000"/>
         <w:jc w:val="start"/>
         <w:tblLayout w:type="fixed"/>
-        <w:tblBorders>
-          <w:top w:val="single" w:sz="8" w:space="0" w:color="000000"/>
-          <w:bottom w:val="single" w:sz="8" w:space="0" w:color="000000"/>
-          <w:insideH w:val="none" w:sz="8" w:space="0" w:color="000000"/>
-        </w:tblBorders>
       </w:tblPr>
       <w:tblGrid>
         <w:gridCol w:w="7920"/>
       </w:tblGrid>
       <w:tr>
         <w:tc>
-          <w:tcPr>
-            <w:tcBorders>
-              <w:top w:val="single" w:sz="8" w:space="0" w:color="000000"/>
-              <w:bottom w:val="single" w:sz="8" w:space="0" w:color="000000"/>
-            </w:tcBorders>
-          </w:tcPr>
+          <w:tcPr/>
           <w:bookmarkStart w:id="29" w:name="tbl-mantel-table"/>
           <w:tbl>
             <w:tblPr>
               <w:tblStyle w:val="Table"/>
               <w:tblW w:type="auto" w:w="0"/>
-              <w:tblLook w:firstRow="1" w:lastRow="1" w:firstColumn="0" w:lastColumn="0" w:noHBand="0" w:noVBand="0" w:val="0023"/>
+              <w:tblLook w:firstRow="1" w:lastRow="0" w:firstColumn="0" w:lastColumn="0" w:noHBand="0" w:noVBand="0" w:val="0020"/>
               <w:jc w:val="start"/>
-              <w:tblBorders>
-                <w:top w:val="single" w:sz="8" w:space="0" w:color="000000"/>
-                <w:bottom w:val="single" w:sz="8" w:space="0" w:color="000000"/>
-                <w:insideH w:val="none" w:sz="8" w:space="0" w:color="000000"/>
-              </w:tblBorders>
             </w:tblPr>
             <w:tblGrid>
               <w:gridCol w:w="2640"/>
@@ -1557,12 +1401,7 @@
                 <w:tblHeader w:val="true"/>
               </w:trPr>
               <w:tc>
-                <w:tcPr>
-                  <w:tcBorders>
-                    <w:top w:val="single" w:sz="8" w:space="0" w:color="000000"/>
-                    <w:bottom w:val="single" w:sz="8" w:space="0" w:color="000000"/>
-                  </w:tcBorders>
-                </w:tcPr>
+                <w:tcPr/>
                 <w:p>
                   <w:pPr>
                     <w:pStyle w:val="Compact"/>
@@ -1570,22 +1409,12 @@
                     <w:jc w:val="center"/>
                   </w:pPr>
                   <w:r>
-                    <w:rPr>
-                      <w:rFonts w:ascii="Arial" w:hAnsi="Arial" w:eastAsia="Arial" w:cs="Arial"/>
-                      <w:sz w:val="16"/>
-                      <w:szCs w:val="16"/>
-                    </w:rPr>
                     <w:t xml:space="preserve">Aurignacian phase</w:t>
                   </w:r>
                 </w:p>
               </w:tc>
               <w:tc>
-                <w:tcPr>
-                  <w:tcBorders>
-                    <w:top w:val="single" w:sz="8" w:space="0" w:color="000000"/>
-                    <w:bottom w:val="single" w:sz="8" w:space="0" w:color="000000"/>
-                  </w:tcBorders>
-                </w:tcPr>
+                <w:tcPr/>
                 <w:p>
                   <w:pPr>
                     <w:pStyle w:val="Compact"/>
@@ -1593,22 +1422,12 @@
                     <w:jc w:val="center"/>
                   </w:pPr>
                   <w:r>
-                    <w:rPr>
-                      <w:rFonts w:ascii="Arial" w:hAnsi="Arial" w:eastAsia="Arial" w:cs="Arial"/>
-                      <w:sz w:val="16"/>
-                      <w:szCs w:val="16"/>
-                    </w:rPr>
                     <w:t xml:space="preserve">Mantel R</w:t>
                   </w:r>
                 </w:p>
               </w:tc>
               <w:tc>
-                <w:tcPr>
-                  <w:tcBorders>
-                    <w:top w:val="single" w:sz="8" w:space="0" w:color="000000"/>
-                    <w:bottom w:val="single" w:sz="8" w:space="0" w:color="000000"/>
-                  </w:tcBorders>
-                </w:tcPr>
+                <w:tcPr/>
                 <w:p>
                   <w:pPr>
                     <w:pStyle w:val="Compact"/>
@@ -1616,11 +1435,6 @@
                     <w:jc w:val="center"/>
                   </w:pPr>
                   <w:r>
-                    <w:rPr>
-                      <w:rFonts w:ascii="Arial" w:hAnsi="Arial" w:eastAsia="Arial" w:cs="Arial"/>
-                      <w:sz w:val="16"/>
-                      <w:szCs w:val="16"/>
-                    </w:rPr>
                     <w:t xml:space="preserve">Mantel p</w:t>
                   </w:r>
                 </w:p>
@@ -1636,11 +1450,6 @@
                     <w:jc w:val="center"/>
                   </w:pPr>
                   <w:r>
-                    <w:rPr>
-                      <w:rFonts w:ascii="Arial" w:hAnsi="Arial" w:eastAsia="Arial" w:cs="Arial"/>
-                      <w:sz w:val="16"/>
-                      <w:szCs w:val="16"/>
-                    </w:rPr>
                     <w:t xml:space="preserve">Aur-P1</w:t>
                   </w:r>
                 </w:p>
@@ -1654,11 +1463,6 @@
                     <w:jc w:val="center"/>
                   </w:pPr>
                   <w:r>
-                    <w:rPr>
-                      <w:rFonts w:ascii="Arial" w:hAnsi="Arial" w:eastAsia="Arial" w:cs="Arial"/>
-                      <w:sz w:val="16"/>
-                      <w:szCs w:val="16"/>
-                    </w:rPr>
                     <w:t xml:space="preserve">0.046</w:t>
                   </w:r>
                 </w:p>
@@ -1672,11 +1476,6 @@
                     <w:jc w:val="center"/>
                   </w:pPr>
                   <w:r>
-                    <w:rPr>
-                      <w:rFonts w:ascii="Arial" w:hAnsi="Arial" w:eastAsia="Arial" w:cs="Arial"/>
-                      <w:sz w:val="16"/>
-                      <w:szCs w:val="16"/>
-                    </w:rPr>
                     <w:t xml:space="preserve">0.301</w:t>
                   </w:r>
                 </w:p>
@@ -1684,11 +1483,7 @@
             </w:tr>
             <w:tr>
               <w:tc>
-                <w:tcPr>
-                  <w:tcBorders>
-                    <w:bottom w:val="single" w:sz="8" w:space="0" w:color="000000"/>
-                  </w:tcBorders>
-                </w:tcPr>
+                <w:tcPr/>
                 <w:p>
                   <w:pPr>
                     <w:pStyle w:val="Compact"/>
@@ -1696,21 +1491,12 @@
                     <w:jc w:val="center"/>
                   </w:pPr>
                   <w:r>
-                    <w:rPr>
-                      <w:rFonts w:ascii="Arial" w:hAnsi="Arial" w:eastAsia="Arial" w:cs="Arial"/>
-                      <w:sz w:val="16"/>
-                      <w:szCs w:val="16"/>
-                    </w:rPr>
                     <w:t xml:space="preserve">Aur-P2</w:t>
                   </w:r>
                 </w:p>
               </w:tc>
               <w:tc>
-                <w:tcPr>
-                  <w:tcBorders>
-                    <w:bottom w:val="single" w:sz="8" w:space="0" w:color="000000"/>
-                  </w:tcBorders>
-                </w:tcPr>
+                <w:tcPr/>
                 <w:p>
                   <w:pPr>
                     <w:pStyle w:val="Compact"/>
@@ -1718,21 +1504,12 @@
                     <w:jc w:val="center"/>
                   </w:pPr>
                   <w:r>
-                    <w:rPr>
-                      <w:rFonts w:ascii="Arial" w:hAnsi="Arial" w:eastAsia="Arial" w:cs="Arial"/>
-                      <w:sz w:val="16"/>
-                      <w:szCs w:val="16"/>
-                    </w:rPr>
                     <w:t xml:space="preserve">-0.299</w:t>
                   </w:r>
                 </w:p>
               </w:tc>
               <w:tc>
-                <w:tcPr>
-                  <w:tcBorders>
-                    <w:bottom w:val="single" w:sz="8" w:space="0" w:color="000000"/>
-                  </w:tcBorders>
-                </w:tcPr>
+                <w:tcPr/>
                 <w:p>
                   <w:pPr>
                     <w:pStyle w:val="Compact"/>
@@ -1740,11 +1517,6 @@
                     <w:jc w:val="center"/>
                   </w:pPr>
                   <w:r>
-                    <w:rPr>
-                      <w:rFonts w:ascii="Arial" w:hAnsi="Arial" w:eastAsia="Arial" w:cs="Arial"/>
-                      <w:sz w:val="16"/>
-                      <w:szCs w:val="16"/>
-                    </w:rPr>
                     <w:t xml:space="preserve">0.933</w:t>
                   </w:r>
                 </w:p>
@@ -1761,10 +1533,6 @@
               <w:pStyle w:val="ImageCaption"/>
             </w:pPr>
             <w:r>
-              <w:rPr>
-                <w:rFonts w:ascii="Arial" w:hAnsi="Arial" w:eastAsia="Arial"/>
-                <w:sz w:val="16"/>
-              </w:rPr>
               <w:t xml:space="preserve">Table 2: Table of the results per phase for the Mantel test between a Jaccard matrix of sign type diversity and a geographic distance matrix</w:t>
             </w:r>
           </w:p>
@@ -1992,26 +1760,16 @@
       <w:tblPr>
         <w:tblStyle w:val="Table"/>
         <w:tblW w:type="pct" w:w="5000"/>
-        <w:tblLook w:firstRow="1" w:lastRow="1" w:firstColumn="0" w:lastColumn="0" w:noHBand="0" w:noVBand="0" w:val="0023"/>
+        <w:tblLook w:firstRow="0" w:lastRow="0" w:firstColumn="0" w:lastColumn="0" w:noHBand="0" w:noVBand="0" w:val="0000"/>
         <w:jc w:val="start"/>
         <w:tblLayout w:type="fixed"/>
-        <w:tblBorders>
-          <w:top w:val="single" w:sz="8" w:space="0" w:color="000000"/>
-          <w:bottom w:val="single" w:sz="8" w:space="0" w:color="000000"/>
-          <w:insideH w:val="none" w:sz="8" w:space="0" w:color="000000"/>
-        </w:tblBorders>
       </w:tblPr>
       <w:tblGrid>
         <w:gridCol w:w="7920"/>
       </w:tblGrid>
       <w:tr>
         <w:tc>
-          <w:tcPr>
-            <w:tcBorders>
-              <w:top w:val="single" w:sz="8" w:space="0" w:color="000000"/>
-              <w:bottom w:val="single" w:sz="8" w:space="0" w:color="000000"/>
-            </w:tcBorders>
-          </w:tcPr>
+          <w:tcPr/>
           <w:bookmarkStart w:id="36" w:name="fig-seriation"/>
           <w:p>
             <w:pPr>
@@ -2019,10 +1777,6 @@
               <w:jc w:val="center"/>
             </w:pPr>
             <w:r>
-              <w:rPr>
-                <w:rFonts w:ascii="Arial" w:hAnsi="Arial" w:eastAsia="Arial"/>
-                <w:sz w:val="16"/>
-              </w:rPr>
               <w:drawing>
                 <wp:inline>
                   <wp:extent cx="5943600" cy="7429499"/>
@@ -2075,10 +1829,6 @@
               <w:pStyle w:val="ImageCaption"/>
             </w:pPr>
             <w:r>
-              <w:rPr>
-                <w:rFonts w:ascii="Arial" w:hAnsi="Arial" w:eastAsia="Arial"/>
-                <w:sz w:val="16"/>
-              </w:rPr>
               <w:t xml:space="preserve">Figure 2: Seriation reveals recurrent group structure across Upper Palaeolithic phases. Presence–absence matrices of geometric sign types reordered using manual Brower‑Kile seriation for (A) Aur-P1 and (B) Aur-P2 phases. Rows represent sites and columns represent sign types. Blocks of co-occurring signs indicate culturally coherent groupings. Despite chronological turnover in specific sign types, two broad classes of assemblages—restricted-range and broad-range—recur across both phases, suggesting persistent structuring in symbolic signaling practices. Restricted group is in red, broader group is in blue.</w:t>
             </w:r>
           </w:p>
@@ -2132,26 +1882,16 @@
       <w:tblPr>
         <w:tblStyle w:val="Table"/>
         <w:tblW w:type="pct" w:w="5000"/>
-        <w:tblLook w:firstRow="1" w:lastRow="1" w:firstColumn="0" w:lastColumn="0" w:noHBand="0" w:noVBand="0" w:val="0023"/>
+        <w:tblLook w:firstRow="0" w:lastRow="0" w:firstColumn="0" w:lastColumn="0" w:noHBand="0" w:noVBand="0" w:val="0000"/>
         <w:jc w:val="start"/>
         <w:tblLayout w:type="fixed"/>
-        <w:tblBorders>
-          <w:top w:val="single" w:sz="8" w:space="0" w:color="000000"/>
-          <w:bottom w:val="single" w:sz="8" w:space="0" w:color="000000"/>
-          <w:insideH w:val="none" w:sz="8" w:space="0" w:color="000000"/>
-        </w:tblBorders>
       </w:tblPr>
       <w:tblGrid>
         <w:gridCol w:w="7920"/>
       </w:tblGrid>
       <w:tr>
         <w:tc>
-          <w:tcPr>
-            <w:tcBorders>
-              <w:top w:val="single" w:sz="8" w:space="0" w:color="000000"/>
-              <w:bottom w:val="single" w:sz="8" w:space="0" w:color="000000"/>
-            </w:tcBorders>
-          </w:tcPr>
+          <w:tcPr/>
           <w:bookmarkStart w:id="40" w:name="fig-neighbor-net"/>
           <w:p>
             <w:pPr>
@@ -2159,10 +1899,6 @@
               <w:jc w:val="center"/>
             </w:pPr>
             <w:r>
-              <w:rPr>
-                <w:rFonts w:ascii="Arial" w:hAnsi="Arial" w:eastAsia="Arial"/>
-                <w:sz w:val="16"/>
-              </w:rPr>
               <w:drawing>
                 <wp:inline>
                   <wp:extent cx="5943600" cy="3566160"/>
@@ -2215,10 +1951,6 @@
               <w:pStyle w:val="ImageCaption"/>
             </w:pPr>
             <w:r>
-              <w:rPr>
-                <w:rFonts w:ascii="Arial" w:hAnsi="Arial" w:eastAsia="Arial"/>
-                <w:sz w:val="16"/>
-              </w:rPr>
               <w:t xml:space="preserve">Figure 3: Networks depicting cultural similarity among sites for each phase based on Jaccard similarity of geometric sign presence/absence. Nodes represent sites and edges connect pairs whose Jaccard similarity is ≥0.2 (i.e., the intersection of their sign types is at least 20% of their union). Node size reflects degree centrality, and edge thickness corresponds to similarity strength. The Aur-P1 network shows the highest overall connectivity, whereas the Aur-P2 phase exhibits weaker and more fragmented connections. These networks illustrate phase-specific differences in the intensity and configuration of inter-site cultural links.</w:t>
             </w:r>
           </w:p>
@@ -2230,26 +1962,16 @@
       <w:tblPr>
         <w:tblStyle w:val="Table"/>
         <w:tblW w:type="pct" w:w="5000"/>
-        <w:tblLook w:firstRow="1" w:lastRow="1" w:firstColumn="0" w:lastColumn="0" w:noHBand="0" w:noVBand="0" w:val="0023"/>
+        <w:tblLook w:firstRow="0" w:lastRow="0" w:firstColumn="0" w:lastColumn="0" w:noHBand="0" w:noVBand="0" w:val="0000"/>
         <w:jc w:val="start"/>
         <w:tblLayout w:type="fixed"/>
-        <w:tblBorders>
-          <w:top w:val="single" w:sz="8" w:space="0" w:color="000000"/>
-          <w:bottom w:val="single" w:sz="8" w:space="0" w:color="000000"/>
-          <w:insideH w:val="none" w:sz="8" w:space="0" w:color="000000"/>
-        </w:tblBorders>
       </w:tblPr>
       <w:tblGrid>
         <w:gridCol w:w="7920"/>
       </w:tblGrid>
       <w:tr>
         <w:tc>
-          <w:tcPr>
-            <w:tcBorders>
-              <w:top w:val="single" w:sz="8" w:space="0" w:color="000000"/>
-              <w:bottom w:val="single" w:sz="8" w:space="0" w:color="000000"/>
-            </w:tcBorders>
-          </w:tcPr>
+          <w:tcPr/>
           <w:bookmarkStart w:id="44" w:name="fig-neighbor-net-stats"/>
           <w:p>
             <w:pPr>
@@ -2257,10 +1979,6 @@
               <w:jc w:val="center"/>
             </w:pPr>
             <w:r>
-              <w:rPr>
-                <w:rFonts w:ascii="Arial" w:hAnsi="Arial" w:eastAsia="Arial"/>
-                <w:sz w:val="16"/>
-              </w:rPr>
               <w:drawing>
                 <wp:inline>
                   <wp:extent cx="5943600" cy="4086225"/>
@@ -2313,10 +2031,6 @@
               <w:pStyle w:val="ImageCaption"/>
             </w:pPr>
             <w:r>
-              <w:rPr>
-                <w:rFonts w:ascii="Arial" w:hAnsi="Arial" w:eastAsia="Arial"/>
-                <w:sz w:val="16"/>
-              </w:rPr>
               <w:t xml:space="preserve">Figure 4: Network statistics for the two phases. The vertical black lines are the null 95% confidence interval, the observed statistic value is shown as a solid black circle (BH-adjusted p &lt; 0.05) or a hollow circle (not significantly different from a within-phase random distribution). The horizontal brackets at the top of each panel show p-values of pairwise randomisation tests for significant differences in network statistics between phases.</w:t>
             </w:r>
           </w:p>
@@ -2397,7 +2111,7 @@
         <w:t xml:space="preserve"> </w:t>
       </w:r>
       <w:r>
-        <w:t xml:space="preserve">(S5.1, S5.3, S5.9), which evaluate the observed structure net of network size. Pairwise permutation tests with Benjamini–Hochberg correction show that the phases do not differ significantly in any of the tested network statistics — edge density (p = 0.4404), modularity (p = 0.3018), mean betweenness (p = 0.6224), or component count (p = 0.5155). The Aur-P1–Aur-P2 contrast is therefore primarily one of network scale rather than a statistically distinguishable community structure.</w:t>
+        <w:t xml:space="preserve">(S5.1, S5.3, S5.9), which evaluate the observed structure net of network size. Pairwise permutation tests with Benjamini–Hochberg correction show that the phases do not differ significantly in any of the tested network statistics — edge density (p = 0.44), modularity (p = 0.302), mean betweenness (p = 0.622), or component count (p = 0.515). The Aur-P1–Aur-P2 contrast is therefore primarily one of network scale rather than a statistically distinguishable community structure.</w:t>
       </w:r>
     </w:p>
     <w:p>
@@ -2412,26 +2126,16 @@
       <w:tblPr>
         <w:tblStyle w:val="Table"/>
         <w:tblW w:type="pct" w:w="5000"/>
-        <w:tblLook w:firstRow="1" w:lastRow="1" w:firstColumn="0" w:lastColumn="0" w:noHBand="0" w:noVBand="0" w:val="0023"/>
+        <w:tblLook w:firstRow="0" w:lastRow="0" w:firstColumn="0" w:lastColumn="0" w:noHBand="0" w:noVBand="0" w:val="0000"/>
         <w:jc w:val="start"/>
         <w:tblLayout w:type="fixed"/>
-        <w:tblBorders>
-          <w:top w:val="single" w:sz="8" w:space="0" w:color="000000"/>
-          <w:bottom w:val="single" w:sz="8" w:space="0" w:color="000000"/>
-          <w:insideH w:val="none" w:sz="8" w:space="0" w:color="000000"/>
-        </w:tblBorders>
       </w:tblPr>
       <w:tblGrid>
         <w:gridCol w:w="7920"/>
       </w:tblGrid>
       <w:tr>
         <w:tc>
-          <w:tcPr>
-            <w:tcBorders>
-              <w:top w:val="single" w:sz="8" w:space="0" w:color="000000"/>
-              <w:bottom w:val="single" w:sz="8" w:space="0" w:color="000000"/>
-            </w:tcBorders>
-          </w:tcPr>
+          <w:tcPr/>
           <w:bookmarkStart w:id="48" w:name="fig-group-map"/>
           <w:p>
             <w:pPr>
@@ -2439,10 +2143,6 @@
               <w:jc w:val="center"/>
             </w:pPr>
             <w:r>
-              <w:rPr>
-                <w:rFonts w:ascii="Arial" w:hAnsi="Arial" w:eastAsia="Arial"/>
-                <w:sz w:val="16"/>
-              </w:rPr>
               <w:drawing>
                 <wp:inline>
                   <wp:extent cx="5943600" cy="4754880"/>
@@ -2495,10 +2195,6 @@
               <w:pStyle w:val="ImageCaption"/>
             </w:pPr>
             <w:r>
-              <w:rPr>
-                <w:rFonts w:ascii="Arial" w:hAnsi="Arial" w:eastAsia="Arial"/>
-                <w:sz w:val="16"/>
-              </w:rPr>
               <w:t xml:space="preserve">Figure 5: Geographic distribution of sign-use groups (Restricted-range and Broader range) in the two Aurignacian phases (Aur-P1, Aur-P2). Sites are colored according to their group membership (Restricted-range or Broader range) as identified by seriation and network analysis. The spatial arrangement shows that sites belonging to the same sign-use group are not strictly clustered geographically, consistent with the Mantel test results that did not detect a significant correlation between geographic proximity and geometric sign similarity.</w:t>
             </w:r>
           </w:p>
@@ -2539,38 +2235,23 @@
       <w:tblPr>
         <w:tblStyle w:val="Table"/>
         <w:tblW w:type="pct" w:w="5000"/>
-        <w:tblLook w:firstRow="1" w:lastRow="1" w:firstColumn="0" w:lastColumn="0" w:noHBand="0" w:noVBand="0" w:val="0023"/>
+        <w:tblLook w:firstRow="0" w:lastRow="0" w:firstColumn="0" w:lastColumn="0" w:noHBand="0" w:noVBand="0" w:val="0000"/>
         <w:jc w:val="start"/>
         <w:tblLayout w:type="fixed"/>
-        <w:tblBorders>
-          <w:top w:val="single" w:sz="8" w:space="0" w:color="000000"/>
-          <w:bottom w:val="single" w:sz="8" w:space="0" w:color="000000"/>
-          <w:insideH w:val="none" w:sz="8" w:space="0" w:color="000000"/>
-        </w:tblBorders>
       </w:tblPr>
       <w:tblGrid>
         <w:gridCol w:w="7920"/>
       </w:tblGrid>
       <w:tr>
         <w:tc>
-          <w:tcPr>
-            <w:tcBorders>
-              <w:top w:val="single" w:sz="8" w:space="0" w:color="000000"/>
-              <w:bottom w:val="single" w:sz="8" w:space="0" w:color="000000"/>
-            </w:tcBorders>
-          </w:tcPr>
+          <w:tcPr/>
           <w:bookmarkStart w:id="50" w:name="tbl-strength-table"/>
           <w:tbl>
             <w:tblPr>
               <w:tblStyle w:val="Table"/>
               <w:tblW w:type="auto" w:w="0"/>
-              <w:tblLook w:firstRow="1" w:lastRow="1" w:firstColumn="0" w:lastColumn="0" w:noHBand="0" w:noVBand="0" w:val="0023"/>
+              <w:tblLook w:firstRow="1" w:lastRow="0" w:firstColumn="0" w:lastColumn="0" w:noHBand="0" w:noVBand="0" w:val="0020"/>
               <w:jc w:val="start"/>
-              <w:tblBorders>
-                <w:top w:val="single" w:sz="8" w:space="0" w:color="000000"/>
-                <w:bottom w:val="single" w:sz="8" w:space="0" w:color="000000"/>
-                <w:insideH w:val="none" w:sz="8" w:space="0" w:color="000000"/>
-              </w:tblBorders>
             </w:tblPr>
             <w:tblGrid>
               <w:gridCol w:w="1980"/>
@@ -2583,12 +2264,7 @@
                 <w:tblHeader w:val="true"/>
               </w:trPr>
               <w:tc>
-                <w:tcPr>
-                  <w:tcBorders>
-                    <w:top w:val="single" w:sz="8" w:space="0" w:color="000000"/>
-                    <w:bottom w:val="single" w:sz="8" w:space="0" w:color="000000"/>
-                  </w:tcBorders>
-                </w:tcPr>
+                <w:tcPr/>
                 <w:p>
                   <w:pPr>
                     <w:pStyle w:val="Compact"/>
@@ -2596,22 +2272,12 @@
                     <w:jc w:val="center"/>
                   </w:pPr>
                   <w:r>
-                    <w:rPr>
-                      <w:rFonts w:ascii="Arial" w:hAnsi="Arial" w:eastAsia="Arial" w:cs="Arial"/>
-                      <w:sz w:val="16"/>
-                      <w:szCs w:val="16"/>
-                    </w:rPr>
                     <w:t xml:space="preserve">Aurignacian phase</w:t>
                   </w:r>
                 </w:p>
               </w:tc>
               <w:tc>
-                <w:tcPr>
-                  <w:tcBorders>
-                    <w:top w:val="single" w:sz="8" w:space="0" w:color="000000"/>
-                    <w:bottom w:val="single" w:sz="8" w:space="0" w:color="000000"/>
-                  </w:tcBorders>
-                </w:tcPr>
+                <w:tcPr/>
                 <w:p>
                   <w:pPr>
                     <w:pStyle w:val="Compact"/>
@@ -2619,22 +2285,12 @@
                     <w:jc w:val="center"/>
                   </w:pPr>
                   <w:r>
-                    <w:rPr>
-                      <w:rFonts w:ascii="Arial" w:hAnsi="Arial" w:eastAsia="Arial" w:cs="Arial"/>
-                      <w:sz w:val="16"/>
-                      <w:szCs w:val="16"/>
-                    </w:rPr>
                     <w:t xml:space="preserve">PerMANOVA R2</w:t>
                   </w:r>
                 </w:p>
               </w:tc>
               <w:tc>
-                <w:tcPr>
-                  <w:tcBorders>
-                    <w:top w:val="single" w:sz="8" w:space="0" w:color="000000"/>
-                    <w:bottom w:val="single" w:sz="8" w:space="0" w:color="000000"/>
-                  </w:tcBorders>
-                </w:tcPr>
+                <w:tcPr/>
                 <w:p>
                   <w:pPr>
                     <w:pStyle w:val="Compact"/>
@@ -2642,22 +2298,12 @@
                     <w:jc w:val="center"/>
                   </w:pPr>
                   <w:r>
-                    <w:rPr>
-                      <w:rFonts w:ascii="Arial" w:hAnsi="Arial" w:eastAsia="Arial" w:cs="Arial"/>
-                      <w:sz w:val="16"/>
-                      <w:szCs w:val="16"/>
-                    </w:rPr>
                     <w:t xml:space="preserve">PerMANOVA F</w:t>
                   </w:r>
                 </w:p>
               </w:tc>
               <w:tc>
-                <w:tcPr>
-                  <w:tcBorders>
-                    <w:top w:val="single" w:sz="8" w:space="0" w:color="000000"/>
-                    <w:bottom w:val="single" w:sz="8" w:space="0" w:color="000000"/>
-                  </w:tcBorders>
-                </w:tcPr>
+                <w:tcPr/>
                 <w:p>
                   <w:pPr>
                     <w:pStyle w:val="Compact"/>
@@ -2665,11 +2311,6 @@
                     <w:jc w:val="center"/>
                   </w:pPr>
                   <w:r>
-                    <w:rPr>
-                      <w:rFonts w:ascii="Arial" w:hAnsi="Arial" w:eastAsia="Arial" w:cs="Arial"/>
-                      <w:sz w:val="16"/>
-                      <w:szCs w:val="16"/>
-                    </w:rPr>
                     <w:t xml:space="preserve">PerMANOVA p</w:t>
                   </w:r>
                 </w:p>
@@ -2685,11 +2326,6 @@
                     <w:jc w:val="center"/>
                   </w:pPr>
                   <w:r>
-                    <w:rPr>
-                      <w:rFonts w:ascii="Arial" w:hAnsi="Arial" w:eastAsia="Arial" w:cs="Arial"/>
-                      <w:sz w:val="16"/>
-                      <w:szCs w:val="16"/>
-                    </w:rPr>
                     <w:t xml:space="preserve">Aur-P1</w:t>
                   </w:r>
                 </w:p>
@@ -2703,11 +2339,6 @@
                     <w:jc w:val="center"/>
                   </w:pPr>
                   <w:r>
-                    <w:rPr>
-                      <w:rFonts w:ascii="Arial" w:hAnsi="Arial" w:eastAsia="Arial" w:cs="Arial"/>
-                      <w:sz w:val="16"/>
-                      <w:szCs w:val="16"/>
-                    </w:rPr>
                     <w:t xml:space="preserve">0.196</w:t>
                   </w:r>
                 </w:p>
@@ -2721,11 +2352,6 @@
                     <w:jc w:val="center"/>
                   </w:pPr>
                   <w:r>
-                    <w:rPr>
-                      <w:rFonts w:ascii="Arial" w:hAnsi="Arial" w:eastAsia="Arial" w:cs="Arial"/>
-                      <w:sz w:val="16"/>
-                      <w:szCs w:val="16"/>
-                    </w:rPr>
                     <w:t xml:space="preserve">4.382</w:t>
                   </w:r>
                 </w:p>
@@ -2739,11 +2365,6 @@
                     <w:jc w:val="center"/>
                   </w:pPr>
                   <w:r>
-                    <w:rPr>
-                      <w:rFonts w:ascii="Arial" w:hAnsi="Arial" w:eastAsia="Arial" w:cs="Arial"/>
-                      <w:sz w:val="16"/>
-                      <w:szCs w:val="16"/>
-                    </w:rPr>
                     <w:t xml:space="preserve">0.001</w:t>
                   </w:r>
                 </w:p>
@@ -2751,11 +2372,7 @@
             </w:tr>
             <w:tr>
               <w:tc>
-                <w:tcPr>
-                  <w:tcBorders>
-                    <w:bottom w:val="single" w:sz="8" w:space="0" w:color="000000"/>
-                  </w:tcBorders>
-                </w:tcPr>
+                <w:tcPr/>
                 <w:p>
                   <w:pPr>
                     <w:pStyle w:val="Compact"/>
@@ -2763,21 +2380,12 @@
                     <w:jc w:val="center"/>
                   </w:pPr>
                   <w:r>
-                    <w:rPr>
-                      <w:rFonts w:ascii="Arial" w:hAnsi="Arial" w:eastAsia="Arial" w:cs="Arial"/>
-                      <w:sz w:val="16"/>
-                      <w:szCs w:val="16"/>
-                    </w:rPr>
                     <w:t xml:space="preserve">Aur-P2</w:t>
                   </w:r>
                 </w:p>
               </w:tc>
               <w:tc>
-                <w:tcPr>
-                  <w:tcBorders>
-                    <w:bottom w:val="single" w:sz="8" w:space="0" w:color="000000"/>
-                  </w:tcBorders>
-                </w:tcPr>
+                <w:tcPr/>
                 <w:p>
                   <w:pPr>
                     <w:pStyle w:val="Compact"/>
@@ -2785,21 +2393,12 @@
                     <w:jc w:val="center"/>
                   </w:pPr>
                   <w:r>
-                    <w:rPr>
-                      <w:rFonts w:ascii="Arial" w:hAnsi="Arial" w:eastAsia="Arial" w:cs="Arial"/>
-                      <w:sz w:val="16"/>
-                      <w:szCs w:val="16"/>
-                    </w:rPr>
                     <w:t xml:space="preserve">0.223</w:t>
                   </w:r>
                 </w:p>
               </w:tc>
               <w:tc>
-                <w:tcPr>
-                  <w:tcBorders>
-                    <w:bottom w:val="single" w:sz="8" w:space="0" w:color="000000"/>
-                  </w:tcBorders>
-                </w:tcPr>
+                <w:tcPr/>
                 <w:p>
                   <w:pPr>
                     <w:pStyle w:val="Compact"/>
@@ -2807,21 +2406,12 @@
                     <w:jc w:val="center"/>
                   </w:pPr>
                   <w:r>
-                    <w:rPr>
-                      <w:rFonts w:ascii="Arial" w:hAnsi="Arial" w:eastAsia="Arial" w:cs="Arial"/>
-                      <w:sz w:val="16"/>
-                      <w:szCs w:val="16"/>
-                    </w:rPr>
                     <w:t xml:space="preserve">2.008</w:t>
                   </w:r>
                 </w:p>
               </w:tc>
               <w:tc>
-                <w:tcPr>
-                  <w:tcBorders>
-                    <w:bottom w:val="single" w:sz="8" w:space="0" w:color="000000"/>
-                  </w:tcBorders>
-                </w:tcPr>
+                <w:tcPr/>
                 <w:p>
                   <w:pPr>
                     <w:pStyle w:val="Compact"/>
@@ -2829,11 +2419,6 @@
                     <w:jc w:val="center"/>
                   </w:pPr>
                   <w:r>
-                    <w:rPr>
-                      <w:rFonts w:ascii="Arial" w:hAnsi="Arial" w:eastAsia="Arial" w:cs="Arial"/>
-                      <w:sz w:val="16"/>
-                      <w:szCs w:val="16"/>
-                    </w:rPr>
                     <w:t xml:space="preserve">0.076</w:t>
                   </w:r>
                 </w:p>
@@ -2850,10 +2435,6 @@
               <w:pStyle w:val="ImageCaption"/>
             </w:pPr>
             <w:r>
-              <w:rPr>
-                <w:rFonts w:ascii="Arial" w:hAnsi="Arial" w:eastAsia="Arial"/>
-                <w:sz w:val="16"/>
-              </w:rPr>
               <w:t xml:space="preserve">Table 3: Table of the results per phase for the perMANOVA</w:t>
             </w:r>
           </w:p>
@@ -3357,26 +2938,16 @@
       <w:tblPr>
         <w:tblStyle w:val="Table"/>
         <w:tblW w:type="pct" w:w="5000"/>
-        <w:tblLook w:firstRow="1" w:lastRow="1" w:firstColumn="0" w:lastColumn="0" w:noHBand="0" w:noVBand="0" w:val="0023"/>
+        <w:tblLook w:firstRow="0" w:lastRow="0" w:firstColumn="0" w:lastColumn="0" w:noHBand="0" w:noVBand="0" w:val="0000"/>
         <w:jc w:val="start"/>
         <w:tblLayout w:type="fixed"/>
-        <w:tblBorders>
-          <w:top w:val="single" w:sz="8" w:space="0" w:color="000000"/>
-          <w:bottom w:val="single" w:sz="8" w:space="0" w:color="000000"/>
-          <w:insideH w:val="none" w:sz="8" w:space="0" w:color="000000"/>
-        </w:tblBorders>
       </w:tblPr>
       <w:tblGrid>
         <w:gridCol w:w="7920"/>
       </w:tblGrid>
       <w:tr>
         <w:tc>
-          <w:tcPr>
-            <w:tcBorders>
-              <w:top w:val="single" w:sz="8" w:space="0" w:color="000000"/>
-              <w:bottom w:val="single" w:sz="8" w:space="0" w:color="000000"/>
-            </w:tcBorders>
-          </w:tcPr>
+          <w:tcPr/>
           <w:bookmarkStart w:id="56" w:name="fig-div-plot"/>
           <w:p>
             <w:pPr>
@@ -3384,10 +2955,6 @@
               <w:jc w:val="center"/>
             </w:pPr>
             <w:r>
-              <w:rPr>
-                <w:rFonts w:ascii="Arial" w:hAnsi="Arial" w:eastAsia="Arial"/>
-                <w:sz w:val="16"/>
-              </w:rPr>
               <w:drawing>
                 <wp:inline>
                   <wp:extent cx="3669832" cy="7339665"/>
@@ -3440,10 +3007,6 @@
               <w:pStyle w:val="ImageCaption"/>
             </w:pPr>
             <w:r>
-              <w:rPr>
-                <w:rFonts w:ascii="Arial" w:hAnsi="Arial" w:eastAsia="Arial"/>
-                <w:sz w:val="16"/>
-              </w:rPr>
               <w:t xml:space="preserve">Figure 6: Sites with elevated sign diversity, compared with randomised expectations. Observed geometric sign diversity at each site compared with expectations derived from randomised assemblages controlling for sample size. The blue expectation curve is the mean diversity index per sample size. The red lines enclose a band that is the 95% confidence interval. Sites above the blue expectation curve are candidate aggregation sites, reflecting unusually diverse sign repertoires relative to regional norms; however, elevated diversity may also reflect sample size, recovery history, research intensity, preservation or site function rather than aggregation.</w:t>
             </w:r>
           </w:p>
@@ -3569,7 +3132,7 @@
         <w:t xml:space="preserve"> </w:t>
       </w:r>
       <w:r>
-        <w:t xml:space="preserve">of seasonal or satellite use, with Core Areas corresponding to regions where our network hubs are located — notably the Dordogne (La Ferrassie) in Aur-P1. This Core/Extended framework is consistent with our finding that the Aur-P1 network’s higher mean degree suggests aggregation-related congregation rather than demonstrates it, while the lower-connectivity periphery may represent Extended Areas visited periodically. In Aur-P2 the reduced sample and weaker community structure are consistent with more localised interaction as populations consolidated. These demographic conditions may shape how cultural information flowed through Aurignacian populations, which we explore below through the lens of cultural transmission theory.</w:t>
+        <w:t xml:space="preserve">of seasonal or satellite use, with Core Areas corresponding to regions where our network’s high-degree nodes are located — notably the Dordogne (La Ferrassie) in Aur-P1. This Core/Extended framework is consistent with our finding that the Aur-P1 network’s higher mean degree suggests aggregation-related congregation rather than demonstrates it, while the lower-connectivity periphery may represent Extended Areas visited periodically. In Aur-P2 the reduced sample and weaker community structure are consistent with more localised interaction as populations consolidated. These demographic conditions may shape how cultural information flowed through Aurignacian populations, which we explore below through the lens of cultural transmission theory.</w:t>
       </w:r>
     </w:p>
     <w:p>
@@ -3586,7 +3149,7 @@
         <w:t xml:space="preserve">[20]</w:t>
       </w:r>
       <w:r>
-        <w:t xml:space="preserve">, who used eco-cultural niche modeling to show that Heinrich Stadial 4 (HS4) at the very beginning of the Early Aurignacian resulted in an expansion of people into new environmental niches, hypothesised to involve an expansion of social networks both within and between populations. Our results do not confirm this hypothesis in the two-phase comparison: mean degree is higher in Aur-P1 (7.5°) than Aur-P2 (4.2°), and edge count drops from 75 in Aur-P1 to 19 in Aur-P2. However, after accounting for network size, Aur-P2 actually shows descriptively higher edge density (though not statistically significant, p = 0.4404), and neither phase shows a significant geographic signal (Aur-P1 Mantel R = 0.046, Aur-P2 Mantel R = -0.299), suggesting that sign sharing was not primarily driven by expansion into new, spatially structured niches. Similarly,</w:t>
+        <w:t xml:space="preserve">, who used eco-cultural niche modeling to show that Heinrich Stadial 4 (HS4) at the very beginning of the Early Aurignacian resulted in an expansion of people into new environmental niches, hypothesised to involve an expansion of social networks both within and between populations. Our results do not confirm this hypothesis in the two-phase comparison: mean degree is higher in Aur-P1 (7.5°) than Aur-P2 (4.2°), and edge count drops from 75 in Aur-P1 to 19 in Aur-P2. However, after accounting for network size, Aur-P2 actually shows descriptively higher edge density (though not statistically significant, p = 0.44), and neither phase shows a significant geographic signal (Aur-P1 Mantel R = 0.046, Aur-P2 Mantel R = -0.299), suggesting that sign sharing was not primarily driven by expansion into new, spatially structured niches. Similarly,</w:t>
       </w:r>
       <w:r>
         <w:t xml:space="preserve"> </w:t>
@@ -3772,7 +3335,7 @@
         <w:t xml:space="preserve">[101]</w:t>
       </w:r>
       <w:r>
-        <w:t xml:space="preserve">, which is consistent with our observation that the sign-type pool is larger in the Aur-P1 phase (26 types) than in the Aur-P2 phase (15 types). Network structure also shapes cultural information flow: highly connected networks with hub structures facilitate rapid transmission and reduce drift</w:t>
+        <w:t xml:space="preserve">, which is consistent with our observation that the sign-type pool is larger in the Aur-P1 phase (26 types) than in the Aur-P2 phase (15 types). Network structure also shapes cultural information flow: highly connected networks with high-degree node structures facilitate rapid transmission and reduce drift</w:t>
       </w:r>
       <w:r>
         <w:t xml:space="preserve"> </w:t>
@@ -3790,7 +3353,7 @@
         <w:t xml:space="preserve">[104]</w:t>
       </w:r>
       <w:r>
-        <w:t xml:space="preserve">. Our Aur-P1 network, with the higher mean degree (7.5°) and hub structure centred on key sites, would be expected to show efficient sign-type transmission — consistent with the wide geographic spread of common signs. Aur-P2 shows descriptively higher relative edge density (though not statistically significant, p = 0.4404) but a lower mean degree (4.2°) and no significant geographic signal (Mantel R = -0.299, p = 0.933), suggesting more localised interactions. While Aur-P2 exhibits a lower mean degree due to its smaller network size, it shows a descriptively higher edge density (though not statistically significant, p = 0.4404) and no statistically significant difference in connectivity metrics compared to Aur-P1. This suggests that relative interaction levels remained consistent across the two phases, even as populations consolidated into fewer documented sites. The lack of significant geographic structure in either phase contradicts simple isolation-by-distance models</w:t>
+        <w:t xml:space="preserve">. Our Aur-P1 network, with the higher mean degree (7.5°) and high-degree node structure centred on key sites, would be expected to show efficient sign-type transmission — consistent with the wide geographic spread of common signs. Aur-P2 shows descriptively higher relative edge density (though not statistically significant, p = 0.44) but a lower mean degree (4.2°) and no significant geographic signal (Mantel R = -0.299, p = 0.933), suggesting more localised interactions. While Aur-P2 exhibits a lower mean degree due to its smaller network size, it shows a descriptively higher edge density (though not statistically significant, p = 0.44) and no statistically significant difference in connectivity metrics compared to Aur-P1. This suggests that relative interaction levels remained consistent across the two phases, even as populations consolidated into fewer documented sites. The lack of significant geographic structure in either phase contradicts simple isolation-by-distance models</w:t>
       </w:r>
       <w:r>
         <w:t xml:space="preserve"> </w:t>
@@ -9413,11 +8976,12 @@
     <w:bookmarkEnd w:id="279"/>
     <w:bookmarkEnd w:id="280"/>
     <w:sectPr>
+      <w:footnotePr>
+        <w:numRestart w:val="eachSect"/>
+      </w:footnotePr>
       <w:pgSz w:h="15840" w:w="12240"/>
       <w:pgMar w:bottom="1440" w:footer="720" w:gutter="0" w:header="720" w:left="1440" w:right="1440" w:top="1440"/>
-      <w:lnNumType w:countBy="1" w:restart="continuous"/>
       <w:cols w:space="720"/>
-      <w:docGrid w:linePitch="326"/>
     </w:sectPr>
   </w:body>
 </w:document>
@@ -9447,112 +9011,17 @@
 </file>
 
 <file path=word/numbering.xml><?xml version="1.0" encoding="utf-8"?>
-<w:numbering xmlns:aink="http://schemas.microsoft.com/office/drawing/2016/ink" xmlns:am3d="http://schemas.microsoft.com/office/drawing/2017/model3d" xmlns:cx="http://schemas.microsoft.com/office/drawing/2014/chartex" xmlns:cx1="http://schemas.microsoft.com/office/drawing/2015/9/8/chartex" xmlns:cx2="http://schemas.microsoft.com/office/drawing/2015/10/21/chartex" xmlns:cx3="http://schemas.microsoft.com/office/drawing/2016/5/9/chartex" xmlns:cx4="http://schemas.microsoft.com/office/drawing/2016/5/10/chartex" xmlns:cx5="http://schemas.microsoft.com/office/drawing/2016/5/11/chartex" xmlns:cx6="http://schemas.microsoft.com/office/drawing/2016/5/12/chartex" xmlns:cx7="http://schemas.microsoft.com/office/drawing/2016/5/13/chartex" xmlns:cx8="http://schemas.microsoft.com/office/drawing/2016/5/14/chartex" xmlns:m="http://schemas.openxmlformats.org/officeDocument/2006/math" xmlns:mc="http://schemas.openxmlformats.org/markup-compatibility/2006" xmlns:o="urn:schemas-microsoft-com:office:office" xmlns:r="http://schemas.openxmlformats.org/officeDocument/2006/relationships" xmlns:v="urn:schemas-microsoft-com:vml" xmlns:w="http://schemas.openxmlformats.org/wordprocessingml/2006/main" xmlns:w10="urn:schemas-microsoft-com:office:word" xmlns:w14="http://schemas.microsoft.com/office/word/2010/wordml" xmlns:w15="http://schemas.microsoft.com/office/word/2012/wordml" xmlns:w16="http://schemas.microsoft.com/office/word/2018/wordml" xmlns:w16cex="http://schemas.microsoft.com/office/word/2018/wordml/cex" xmlns:w16cid="http://schemas.microsoft.com/office/word/2016/wordml/cid" xmlns:w16se="http://schemas.microsoft.com/office/word/2015/wordml/symex" xmlns:wne="http://schemas.microsoft.com/office/word/2006/wordml" xmlns:wp="http://schemas.openxmlformats.org/drawingml/2006/wordprocessingDrawing" xmlns:wp14="http://schemas.microsoft.com/office/word/2010/wordprocessingDrawing" xmlns:wpc="http://schemas.microsoft.com/office/word/2010/wordprocessingCanvas" xmlns:wpg="http://schemas.microsoft.com/office/word/2010/wordprocessingGroup" xmlns:wpi="http://schemas.microsoft.com/office/word/2010/wordprocessingInk" xmlns:wps="http://schemas.microsoft.com/office/word/2010/wordprocessingShape" mc:Ignorable="w14 w15 w16se w16cid w16 w16cex wp14">
+<w:numbering xmlns:aink="http://schemas.microsoft.com/office/drawing/2016/ink" xmlns:am3d="http://schemas.microsoft.com/office/drawing/2017/model3d" xmlns:cx="http://schemas.microsoft.com/office/drawing/2014/chartex" xmlns:cx1="http://schemas.microsoft.com/office/drawing/2015/9/8/chartex" xmlns:cx2="http://schemas.microsoft.com/office/drawing/2015/10/21/chartex" xmlns:cx3="http://schemas.microsoft.com/office/drawing/2016/5/9/chartex" xmlns:cx4="http://schemas.microsoft.com/office/drawing/2016/5/10/chartex" xmlns:cx5="http://schemas.microsoft.com/office/drawing/2016/5/11/chartex" xmlns:cx6="http://schemas.microsoft.com/office/drawing/2016/5/12/chartex" xmlns:cx7="http://schemas.microsoft.com/office/drawing/2016/5/13/chartex" xmlns:cx8="http://schemas.microsoft.com/office/drawing/2016/5/14/chartex" xmlns:m="http://schemas.openxmlformats.org/officeDocument/2006/math" xmlns:mc="http://schemas.openxmlformats.org/markup-compatibility/2006" xmlns:o="urn:schemas-microsoft-com:office:office" xmlns:oel="http://schemas.microsoft.com/office/2019/extlst" xmlns:r="http://schemas.openxmlformats.org/officeDocument/2006/relationships" xmlns:v="urn:schemas-microsoft-com:vml" xmlns:w="http://schemas.openxmlformats.org/wordprocessingml/2006/main" xmlns:w10="urn:schemas-microsoft-com:office:word" xmlns:w14="http://schemas.microsoft.com/office/word/2010/wordml" xmlns:w15="http://schemas.microsoft.com/office/word/2012/wordml" xmlns:w16="http://schemas.microsoft.com/office/word/2018/wordml" xmlns:w16cex="http://schemas.microsoft.com/office/word/2018/wordml/cex" xmlns:w16cid="http://schemas.microsoft.com/office/word/2016/wordml/cid" xmlns:w16sdtdh="http://schemas.microsoft.com/office/word/2020/wordml/sdtdatahash" xmlns:w16se="http://schemas.microsoft.com/office/word/2015/wordml/symex" xmlns:wne="http://schemas.microsoft.com/office/word/2006/wordml" xmlns:wp="http://schemas.openxmlformats.org/drawingml/2006/wordprocessingDrawing" xmlns:wp14="http://schemas.microsoft.com/office/word/2010/wordprocessingDrawing" xmlns:wpc="http://schemas.microsoft.com/office/word/2010/wordprocessingCanvas" xmlns:wpg="http://schemas.microsoft.com/office/word/2010/wordprocessingGroup" xmlns:wpi="http://schemas.microsoft.com/office/word/2010/wordprocessingInk" xmlns:wps="http://schemas.microsoft.com/office/word/2010/wordprocessingShape" mc:Ignorable="w14 w15 w16se w16cid w16 w16cex w16sdtdh wp14">
   <w:abstractNum w15:restartNumberingAfterBreak="0" w:abstractNumId="0">
-    <w:nsid w:val="95C299B2"/>
+    <w:nsid w:val="0000A990"/>
     <w:multiLevelType w:val="multilevel"/>
-    <w:tmpl w:val="4A32D3E4"/>
-    <w:lvl w:ilvl="0">
-      <w:numFmt w:val="bullet"/>
-      <w:lvlText w:val="•"/>
-      <w:lvlJc w:val="left"/>
-      <w:pPr>
-        <w:tabs>
-          <w:tab w:pos="0" w:val="num"/>
-        </w:tabs>
-        <w:ind w:hanging="480" w:left="480"/>
-      </w:pPr>
-    </w:lvl>
-    <w:lvl w:ilvl="1">
-      <w:numFmt w:val="bullet"/>
-      <w:lvlText w:val="–"/>
-      <w:lvlJc w:val="left"/>
-      <w:pPr>
-        <w:tabs>
-          <w:tab w:pos="720" w:val="num"/>
-        </w:tabs>
-        <w:ind w:hanging="480" w:left="1200"/>
-      </w:pPr>
-    </w:lvl>
-    <w:lvl w:ilvl="2">
-      <w:numFmt w:val="bullet"/>
-      <w:lvlText w:val="•"/>
-      <w:lvlJc w:val="left"/>
-      <w:pPr>
-        <w:tabs>
-          <w:tab w:pos="1440" w:val="num"/>
-        </w:tabs>
-        <w:ind w:hanging="480" w:left="1920"/>
-      </w:pPr>
-    </w:lvl>
-    <w:lvl w:ilvl="3">
-      <w:numFmt w:val="bullet"/>
-      <w:lvlText w:val="–"/>
-      <w:lvlJc w:val="left"/>
-      <w:pPr>
-        <w:tabs>
-          <w:tab w:pos="2160" w:val="num"/>
-        </w:tabs>
-        <w:ind w:hanging="480" w:left="2640"/>
-      </w:pPr>
-    </w:lvl>
-    <w:lvl w:ilvl="4">
-      <w:numFmt w:val="bullet"/>
-      <w:lvlText w:val="•"/>
-      <w:lvlJc w:val="left"/>
-      <w:pPr>
-        <w:tabs>
-          <w:tab w:pos="2880" w:val="num"/>
-        </w:tabs>
-        <w:ind w:hanging="480" w:left="3360"/>
-      </w:pPr>
-    </w:lvl>
-    <w:lvl w:ilvl="5">
-      <w:numFmt w:val="bullet"/>
-      <w:lvlText w:val="–"/>
-      <w:lvlJc w:val="left"/>
-      <w:pPr>
-        <w:tabs>
-          <w:tab w:pos="3600" w:val="num"/>
-        </w:tabs>
-        <w:ind w:hanging="480" w:left="4080"/>
-      </w:pPr>
-    </w:lvl>
-    <w:lvl w:ilvl="6">
-      <w:numFmt w:val="bullet"/>
-      <w:lvlText w:val="•"/>
-      <w:lvlJc w:val="left"/>
-      <w:pPr>
-        <w:tabs>
-          <w:tab w:pos="4320" w:val="num"/>
-        </w:tabs>
-        <w:ind w:hanging="480" w:left="4800"/>
-      </w:pPr>
-    </w:lvl>
-    <w:lvl w:ilvl="7">
-      <w:numFmt w:val="decimal"/>
-      <w:lvlText w:val=""/>
-      <w:lvlJc w:val="left"/>
-    </w:lvl>
-    <w:lvl w:ilvl="8">
-      <w:numFmt w:val="decimal"/>
-      <w:lvlText w:val=""/>
-      <w:lvlJc w:val="left"/>
-    </w:lvl>
-  </w:abstractNum>
-  <w:abstractNum w15:restartNumberingAfterBreak="0" w:abstractNumId="1">
-    <w:nsid w:val="A7FBC57F"/>
-    <w:multiLevelType w:val="multilevel"/>
-    <w:tmpl w:val="313AFBD8"/>
+    <w:tmpl w:val="BFD048D6"/>
     <w:lvl w:ilvl="0">
       <w:numFmt w:val="bullet"/>
       <w:lvlText w:val=" "/>
       <w:lvlJc w:val="left"/>
       <w:pPr>
-        <w:tabs>
-          <w:tab w:pos="0" w:val="num"/>
-        </w:tabs>
-        <w:ind w:hanging="480" w:left="480"/>
+        <w:ind w:hanging="360" w:left="720"/>
       </w:pPr>
     </w:lvl>
     <w:lvl w:ilvl="1">
@@ -9560,10 +9029,7 @@
       <w:lvlText w:val=" "/>
       <w:lvlJc w:val="left"/>
       <w:pPr>
-        <w:tabs>
-          <w:tab w:pos="720" w:val="num"/>
-        </w:tabs>
-        <w:ind w:hanging="480" w:left="1200"/>
+        <w:ind w:hanging="360" w:left="1440"/>
       </w:pPr>
     </w:lvl>
     <w:lvl w:ilvl="2">
@@ -9571,10 +9037,7 @@
       <w:lvlText w:val=" "/>
       <w:lvlJc w:val="left"/>
       <w:pPr>
-        <w:tabs>
-          <w:tab w:pos="1440" w:val="num"/>
-        </w:tabs>
-        <w:ind w:hanging="480" w:left="1920"/>
+        <w:ind w:hanging="360" w:left="2160"/>
       </w:pPr>
     </w:lvl>
     <w:lvl w:ilvl="3">
@@ -9582,10 +9045,7 @@
       <w:lvlText w:val=" "/>
       <w:lvlJc w:val="left"/>
       <w:pPr>
-        <w:tabs>
-          <w:tab w:pos="2160" w:val="num"/>
-        </w:tabs>
-        <w:ind w:hanging="480" w:left="2640"/>
+        <w:ind w:hanging="360" w:left="2880"/>
       </w:pPr>
     </w:lvl>
     <w:lvl w:ilvl="4">
@@ -9593,10 +9053,7 @@
       <w:lvlText w:val=" "/>
       <w:lvlJc w:val="left"/>
       <w:pPr>
-        <w:tabs>
-          <w:tab w:pos="2880" w:val="num"/>
-        </w:tabs>
-        <w:ind w:hanging="480" w:left="3360"/>
+        <w:ind w:hanging="360" w:left="3600"/>
       </w:pPr>
     </w:lvl>
     <w:lvl w:ilvl="5">
@@ -9604,10 +9061,7 @@
       <w:lvlText w:val=" "/>
       <w:lvlJc w:val="left"/>
       <w:pPr>
-        <w:tabs>
-          <w:tab w:pos="3600" w:val="num"/>
-        </w:tabs>
-        <w:ind w:hanging="480" w:left="4080"/>
+        <w:ind w:hanging="360" w:left="4320"/>
       </w:pPr>
     </w:lvl>
     <w:lvl w:ilvl="6">
@@ -9615,113 +9069,128 @@
       <w:lvlText w:val=" "/>
       <w:lvlJc w:val="left"/>
       <w:pPr>
-        <w:tabs>
-          <w:tab w:pos="4320" w:val="num"/>
-        </w:tabs>
-        <w:ind w:hanging="480" w:left="4800"/>
+        <w:ind w:hanging="360" w:left="5040"/>
       </w:pPr>
     </w:lvl>
     <w:lvl w:ilvl="7">
-      <w:numFmt w:val="decimal"/>
-      <w:lvlText w:val=""/>
-      <w:lvlJc w:val="left"/>
-    </w:lvl>
-    <w:lvl w:ilvl="8">
-      <w:numFmt w:val="decimal"/>
-      <w:lvlText w:val=""/>
-      <w:lvlJc w:val="left"/>
-    </w:lvl>
-  </w:abstractNum>
-  <w:abstractNum w15:restartNumberingAfterBreak="0" w:abstractNumId="2">
-    <w:nsid w:val="E17F69BA"/>
-    <w:multiLevelType w:val="multilevel"/>
-    <w:tmpl w:val="62AA6D94"/>
-    <w:lvl w:ilvl="0">
       <w:numFmt w:val="bullet"/>
       <w:lvlText w:val=" "/>
       <w:lvlJc w:val="left"/>
       <w:pPr>
-        <w:tabs>
-          <w:tab w:pos="0" w:val="num"/>
-        </w:tabs>
-        <w:ind w:hanging="480" w:left="480"/>
-      </w:pPr>
+        <w:ind w:hanging="360" w:left="5760"/>
+      </w:pPr>
+    </w:lvl>
+    <w:lvl w:ilvl="8">
+      <w:numFmt w:val="bullet"/>
+      <w:lvlText w:val=" "/>
+      <w:lvlJc w:val="left"/>
+      <w:pPr>
+        <w:ind w:hanging="360" w:left="6480"/>
+      </w:pPr>
+    </w:lvl>
+  </w:abstractNum>
+  <w:abstractNum w15:restartNumberingAfterBreak="0" w:abstractNumId="1">
+    <w:nsid w:val="0000A991"/>
+    <w:multiLevelType w:val="multilevel"/>
+    <w:tmpl w:val="E4B22674"/>
+    <w:lvl w:ilvl="0">
+      <w:numFmt w:val="bullet"/>
+      <w:lvlText w:val=""/>
+      <w:lvlJc w:val="left"/>
+      <w:pPr>
+        <w:ind w:hanging="360" w:left="720"/>
+      </w:pPr>
+      <w:rPr>
+        <w:rFonts w:ascii="Symbol" w:cs="Symbol" w:hAnsi="Symbol" w:hint="default"/>
+      </w:rPr>
     </w:lvl>
     <w:lvl w:ilvl="1">
       <w:numFmt w:val="bullet"/>
-      <w:lvlText w:val=" "/>
+      <w:lvlText w:val="o"/>
       <w:lvlJc w:val="left"/>
       <w:pPr>
-        <w:tabs>
-          <w:tab w:pos="720" w:val="num"/>
-        </w:tabs>
-        <w:ind w:hanging="480" w:left="1200"/>
-      </w:pPr>
+        <w:ind w:hanging="360" w:left="1440"/>
+      </w:pPr>
+      <w:rPr>
+        <w:rFonts w:ascii="Courier New" w:cs="Courier New" w:hAnsi="Courier New" w:hint="default"/>
+      </w:rPr>
     </w:lvl>
     <w:lvl w:ilvl="2">
       <w:numFmt w:val="bullet"/>
-      <w:lvlText w:val=" "/>
+      <w:lvlText w:val=""/>
       <w:lvlJc w:val="left"/>
       <w:pPr>
-        <w:tabs>
-          <w:tab w:pos="1440" w:val="num"/>
-        </w:tabs>
-        <w:ind w:hanging="480" w:left="1920"/>
-      </w:pPr>
+        <w:ind w:hanging="360" w:left="2160"/>
+      </w:pPr>
+      <w:rPr>
+        <w:rFonts w:ascii="Wingdings" w:cs="Wingdings" w:hAnsi="Wingdings" w:hint="default"/>
+      </w:rPr>
     </w:lvl>
     <w:lvl w:ilvl="3">
       <w:numFmt w:val="bullet"/>
-      <w:lvlText w:val=" "/>
+      <w:lvlText w:val=""/>
       <w:lvlJc w:val="left"/>
       <w:pPr>
-        <w:tabs>
-          <w:tab w:pos="2160" w:val="num"/>
-        </w:tabs>
-        <w:ind w:hanging="480" w:left="2640"/>
-      </w:pPr>
+        <w:ind w:hanging="360" w:left="2880"/>
+      </w:pPr>
+      <w:rPr>
+        <w:rFonts w:ascii="Symbol" w:cs="Symbol" w:hAnsi="Symbol" w:hint="default"/>
+      </w:rPr>
     </w:lvl>
     <w:lvl w:ilvl="4">
       <w:numFmt w:val="bullet"/>
-      <w:lvlText w:val=" "/>
+      <w:lvlText w:val="o"/>
       <w:lvlJc w:val="left"/>
       <w:pPr>
-        <w:tabs>
-          <w:tab w:pos="2880" w:val="num"/>
-        </w:tabs>
-        <w:ind w:hanging="480" w:left="3360"/>
-      </w:pPr>
+        <w:ind w:hanging="360" w:left="3600"/>
+      </w:pPr>
+      <w:rPr>
+        <w:rFonts w:ascii="Courier New" w:cs="Courier New" w:hAnsi="Courier New" w:hint="default"/>
+      </w:rPr>
     </w:lvl>
     <w:lvl w:ilvl="5">
       <w:numFmt w:val="bullet"/>
-      <w:lvlText w:val=" "/>
+      <w:lvlText w:val=""/>
       <w:lvlJc w:val="left"/>
       <w:pPr>
-        <w:tabs>
-          <w:tab w:pos="3600" w:val="num"/>
-        </w:tabs>
-        <w:ind w:hanging="480" w:left="4080"/>
-      </w:pPr>
+        <w:ind w:hanging="360" w:left="4320"/>
+      </w:pPr>
+      <w:rPr>
+        <w:rFonts w:ascii="Wingdings" w:cs="Wingdings" w:hAnsi="Wingdings" w:hint="default"/>
+      </w:rPr>
     </w:lvl>
     <w:lvl w:ilvl="6">
       <w:numFmt w:val="bullet"/>
-      <w:lvlText w:val=" "/>
+      <w:lvlText w:val=""/>
       <w:lvlJc w:val="left"/>
       <w:pPr>
-        <w:tabs>
-          <w:tab w:pos="4320" w:val="num"/>
-        </w:tabs>
-        <w:ind w:hanging="480" w:left="4800"/>
-      </w:pPr>
+        <w:ind w:hanging="360" w:left="5040"/>
+      </w:pPr>
+      <w:rPr>
+        <w:rFonts w:ascii="Symbol" w:cs="Symbol" w:hAnsi="Symbol" w:hint="default"/>
+      </w:rPr>
     </w:lvl>
     <w:lvl w:ilvl="7">
-      <w:numFmt w:val="decimal"/>
-      <w:lvlText w:val=""/>
+      <w:numFmt w:val="bullet"/>
+      <w:lvlText w:val="o"/>
       <w:lvlJc w:val="left"/>
+      <w:pPr>
+        <w:ind w:hanging="360" w:left="5760"/>
+      </w:pPr>
+      <w:rPr>
+        <w:rFonts w:ascii="Courier New" w:cs="Courier New" w:hAnsi="Courier New" w:hint="default"/>
+      </w:rPr>
     </w:lvl>
     <w:lvl w:ilvl="8">
-      <w:numFmt w:val="decimal"/>
-      <w:lvlText w:val=""/>
+      <w:numFmt w:val="bullet"/>
+      <w:lvlText w:val=""/>
       <w:lvlJc w:val="left"/>
+      <w:pPr>
+        <w:ind w:hanging="360" w:left="6480"/>
+      </w:pPr>
+      <w:rPr>
+        <w:rFonts w:ascii="Wingdings" w:cs="Wingdings" w:hAnsi="Wingdings" w:hint="default"/>
+      </w:rPr>
     </w:lvl>
   </w:abstractNum>
   <w:abstractNum w:abstractNumId="990">
@@ -9800,14 +9269,11 @@
       </w:pPr>
     </w:lvl>
   </w:abstractNum>
-  <w:num w:numId="1">
-    <w:abstractNumId w:val="2"/>
+  <w:num w16cid:durableId="1357734625" w:numId="1">
+    <w:abstractNumId w:val="0"/>
   </w:num>
-  <w:num w:numId="2">
+  <w:num w16cid:durableId="488792786" w:numId="2">
     <w:abstractNumId w:val="1"/>
-  </w:num>
-  <w:num w:numId="3">
-    <w:abstractNumId w:val="0"/>
   </w:num>
   <w:num w:numId="1000">
     <w:abstractNumId w:val="990"/>
@@ -9816,14 +9282,14 @@
 </file>
 
 <file path=word/styles.xml><?xml version="1.0" encoding="utf-8"?>
-<w:styles xmlns:mc="http://schemas.openxmlformats.org/markup-compatibility/2006" xmlns:r="http://schemas.openxmlformats.org/officeDocument/2006/relationships" xmlns:w="http://schemas.openxmlformats.org/wordprocessingml/2006/main" xmlns:w14="http://schemas.microsoft.com/office/word/2010/wordml" xmlns:w15="http://schemas.microsoft.com/office/word/2012/wordml" xmlns:w16="http://schemas.microsoft.com/office/word/2018/wordml" xmlns:w16cex="http://schemas.microsoft.com/office/word/2018/wordml/cex" xmlns:w16cid="http://schemas.microsoft.com/office/word/2016/wordml/cid" xmlns:w16se="http://schemas.microsoft.com/office/word/2015/wordml/symex" mc:Ignorable="w14 w15 w16se w16cid w16 w16cex">
+<w:styles xmlns:mc="http://schemas.openxmlformats.org/markup-compatibility/2006" xmlns:r="http://schemas.openxmlformats.org/officeDocument/2006/relationships" xmlns:w="http://schemas.openxmlformats.org/wordprocessingml/2006/main" xmlns:w14="http://schemas.microsoft.com/office/word/2010/wordml" xmlns:w15="http://schemas.microsoft.com/office/word/2012/wordml" xmlns:w16="http://schemas.microsoft.com/office/word/2018/wordml" xmlns:w16cex="http://schemas.microsoft.com/office/word/2018/wordml/cex" xmlns:w16cid="http://schemas.microsoft.com/office/word/2016/wordml/cid" xmlns:w16sdtdh="http://schemas.microsoft.com/office/word/2020/wordml/sdtdatahash" xmlns:w16se="http://schemas.microsoft.com/office/word/2015/wordml/symex" mc:Ignorable="w14 w15 w16se w16cid w16 w16cex w16sdtdh">
   <w:docDefaults>
     <w:rPrDefault>
       <w:rPr>
-        <w:rFonts w:asciiTheme="minorHAnsi" w:cstheme="minorBidi" w:eastAsiaTheme="minorHAnsi" w:hAnsiTheme="minorHAnsi"/>
+        <w:rFonts w:asciiTheme="minorHAnsi" w:cstheme="minorBidi" w:eastAsiaTheme="minorEastAsia" w:hAnsiTheme="minorHAnsi"/>
         <w:sz w:val="24"/>
         <w:szCs w:val="24"/>
-        <w:lang w:bidi="ar-SA" w:eastAsia="en-US" w:val="en-US"/>
+        <w:lang w:bidi="ar-SA" w:eastAsia="zh-CN" w:val="en-US"/>
       </w:rPr>
     </w:rPrDefault>
     <w:pPrDefault>
@@ -9833,104 +9299,7 @@
     </w:pPrDefault>
   </w:docDefaults>
   <w:latentStyles w:count="376" w:defLockedState="0" w:defQFormat="0" w:defSemiHidden="0" w:defUIPriority="0" w:defUnhideWhenUsed="0">
-    <w:lsdException w:name="heading 2" w:semiHidden="1" w:unhideWhenUsed="1"/>
-    <w:lsdException w:name="heading 3" w:semiHidden="1" w:unhideWhenUsed="1"/>
-    <w:lsdException w:name="heading 4" w:semiHidden="1" w:unhideWhenUsed="1"/>
-    <w:lsdException w:name="heading 5" w:semiHidden="1" w:unhideWhenUsed="1"/>
-    <w:lsdException w:name="heading 6" w:semiHidden="1" w:unhideWhenUsed="1"/>
-    <w:lsdException w:name="heading 7" w:semiHidden="1" w:unhideWhenUsed="1"/>
-    <w:lsdException w:name="heading 8" w:semiHidden="1" w:unhideWhenUsed="1"/>
-    <w:lsdException w:name="heading 9" w:semiHidden="1" w:unhideWhenUsed="1"/>
-    <w:lsdException w:name="index 1" w:semiHidden="1" w:unhideWhenUsed="1"/>
-    <w:lsdException w:name="index 2" w:semiHidden="1" w:unhideWhenUsed="1"/>
-    <w:lsdException w:name="index 3" w:semiHidden="1" w:unhideWhenUsed="1"/>
-    <w:lsdException w:name="index 4" w:semiHidden="1" w:unhideWhenUsed="1"/>
-    <w:lsdException w:name="index 5" w:semiHidden="1" w:unhideWhenUsed="1"/>
-    <w:lsdException w:name="index 6" w:semiHidden="1" w:unhideWhenUsed="1"/>
-    <w:lsdException w:name="index 7" w:semiHidden="1" w:unhideWhenUsed="1"/>
-    <w:lsdException w:name="index 8" w:semiHidden="1" w:unhideWhenUsed="1"/>
-    <w:lsdException w:name="index 9" w:semiHidden="1" w:unhideWhenUsed="1"/>
-    <w:lsdException w:name="toc 1" w:semiHidden="1" w:unhideWhenUsed="1"/>
-    <w:lsdException w:name="toc 2" w:semiHidden="1" w:unhideWhenUsed="1"/>
-    <w:lsdException w:name="toc 3" w:semiHidden="1" w:unhideWhenUsed="1"/>
-    <w:lsdException w:name="toc 4" w:semiHidden="1" w:unhideWhenUsed="1"/>
-    <w:lsdException w:name="toc 5" w:semiHidden="1" w:unhideWhenUsed="1"/>
-    <w:lsdException w:name="toc 6" w:semiHidden="1" w:unhideWhenUsed="1"/>
-    <w:lsdException w:name="toc 7" w:semiHidden="1" w:unhideWhenUsed="1"/>
-    <w:lsdException w:name="toc 8" w:semiHidden="1" w:unhideWhenUsed="1"/>
-    <w:lsdException w:name="toc 9" w:semiHidden="1" w:unhideWhenUsed="1"/>
-    <w:lsdException w:name="Normal Indent" w:semiHidden="1" w:unhideWhenUsed="1"/>
-    <w:lsdException w:name="footnote text" w:semiHidden="1" w:unhideWhenUsed="1"/>
-    <w:lsdException w:name="annotation text" w:semiHidden="1" w:unhideWhenUsed="1"/>
-    <w:lsdException w:name="header" w:semiHidden="1" w:unhideWhenUsed="1"/>
-    <w:lsdException w:name="footer" w:semiHidden="1" w:unhideWhenUsed="1"/>
-    <w:lsdException w:name="index heading" w:semiHidden="1" w:unhideWhenUsed="1"/>
-    <w:lsdException w:name="caption" w:semiHidden="1" w:unhideWhenUsed="1"/>
-    <w:lsdException w:name="table of figures" w:semiHidden="1" w:unhideWhenUsed="1"/>
-    <w:lsdException w:name="envelope address" w:semiHidden="1" w:unhideWhenUsed="1"/>
-    <w:lsdException w:name="envelope return" w:semiHidden="1" w:unhideWhenUsed="1"/>
-    <w:lsdException w:name="footnote reference" w:semiHidden="1" w:unhideWhenUsed="1"/>
-    <w:lsdException w:name="annotation reference" w:semiHidden="1" w:unhideWhenUsed="1"/>
-    <w:lsdException w:name="line number" w:semiHidden="1" w:unhideWhenUsed="1"/>
-    <w:lsdException w:name="page number" w:semiHidden="1" w:unhideWhenUsed="1"/>
-    <w:lsdException w:name="endnote reference" w:semiHidden="1" w:unhideWhenUsed="1"/>
-    <w:lsdException w:name="endnote text" w:semiHidden="1" w:unhideWhenUsed="1"/>
-    <w:lsdException w:name="macro" w:semiHidden="1" w:unhideWhenUsed="1"/>
-    <w:lsdException w:name="toa heading" w:semiHidden="1" w:unhideWhenUsed="1"/>
-    <w:lsdException w:name="List Number" w:semiHidden="1" w:unhideWhenUsed="1"/>
-    <w:lsdException w:name="List 2" w:semiHidden="1" w:unhideWhenUsed="1"/>
-    <w:lsdException w:name="List 3" w:semiHidden="1" w:unhideWhenUsed="1"/>
-    <w:lsdException w:name="List 4" w:semiHidden="1" w:unhideWhenUsed="1"/>
-    <w:lsdException w:name="List 5" w:semiHidden="1" w:unhideWhenUsed="1"/>
-    <w:lsdException w:name="List Bullet 2" w:semiHidden="1" w:unhideWhenUsed="1"/>
-    <w:lsdException w:name="List Bullet 3" w:semiHidden="1" w:unhideWhenUsed="1"/>
-    <w:lsdException w:name="List Bullet 4" w:semiHidden="1" w:unhideWhenUsed="1"/>
-    <w:lsdException w:name="List Bullet 5" w:semiHidden="1" w:unhideWhenUsed="1"/>
-    <w:lsdException w:name="List Number 2" w:semiHidden="1" w:unhideWhenUsed="1"/>
-    <w:lsdException w:name="List Number 3" w:semiHidden="1" w:unhideWhenUsed="1"/>
-    <w:lsdException w:name="List Number 4" w:semiHidden="1" w:unhideWhenUsed="1"/>
-    <w:lsdException w:name="List Number 5" w:semiHidden="1" w:unhideWhenUsed="1"/>
-    <w:lsdException w:name="Closing" w:semiHidden="1" w:unhideWhenUsed="1"/>
-    <w:lsdException w:name="Signature" w:semiHidden="1" w:unhideWhenUsed="1"/>
-    <w:lsdException w:name="Default Paragraph Font" w:semiHidden="1" w:unhideWhenUsed="1"/>
-    <w:lsdException w:name="Body Text" w:semiHidden="1" w:unhideWhenUsed="1"/>
-    <w:lsdException w:name="Body Text Indent" w:semiHidden="1" w:unhideWhenUsed="1"/>
-    <w:lsdException w:name="List Continue" w:semiHidden="1" w:unhideWhenUsed="1"/>
-    <w:lsdException w:name="Message Header" w:semiHidden="1" w:unhideWhenUsed="1"/>
-    <w:lsdException w:name="Salutation" w:semiHidden="1" w:unhideWhenUsed="1"/>
-    <w:lsdException w:name="Date" w:semiHidden="1" w:unhideWhenUsed="1"/>
-    <w:lsdException w:name="Body Text First Indent" w:semiHidden="1" w:unhideWhenUsed="1"/>
-    <w:lsdException w:name="Body Text First Indent 2" w:semiHidden="1" w:unhideWhenUsed="1"/>
-    <w:lsdException w:name="Note Heading" w:semiHidden="1" w:unhideWhenUsed="1"/>
-    <w:lsdException w:name="Body Text 2" w:semiHidden="1" w:unhideWhenUsed="1"/>
-    <w:lsdException w:name="Body Text 3" w:semiHidden="1" w:unhideWhenUsed="1"/>
-    <w:lsdException w:name="Body Text Indent 2" w:semiHidden="1" w:unhideWhenUsed="1"/>
-    <w:lsdException w:name="Body Text Indent 3" w:semiHidden="1" w:unhideWhenUsed="1"/>
-    <w:lsdException w:name="Block Text" w:semiHidden="1" w:unhideWhenUsed="1"/>
-    <w:lsdException w:name="Hyperlink" w:semiHidden="1" w:unhideWhenUsed="1"/>
-    <w:lsdException w:name="FollowedHyperlink" w:semiHidden="1" w:unhideWhenUsed="1"/>
-    <w:lsdException w:name="Document Map" w:semiHidden="1" w:unhideWhenUsed="1"/>
-    <w:lsdException w:name="Plain Text" w:semiHidden="1" w:unhideWhenUsed="1"/>
-    <w:lsdException w:name="E-mail Signature" w:semiHidden="1" w:unhideWhenUsed="1"/>
-    <w:lsdException w:name="HTML Top of Form" w:semiHidden="1" w:unhideWhenUsed="1"/>
-    <w:lsdException w:name="HTML Bottom of Form" w:semiHidden="1" w:unhideWhenUsed="1"/>
-    <w:lsdException w:name="Normal (Web)" w:semiHidden="1" w:unhideWhenUsed="1"/>
-    <w:lsdException w:name="HTML Acronym" w:semiHidden="1" w:unhideWhenUsed="1"/>
-    <w:lsdException w:name="HTML Address" w:semiHidden="1" w:unhideWhenUsed="1"/>
-    <w:lsdException w:name="HTML Cite" w:semiHidden="1" w:unhideWhenUsed="1"/>
-    <w:lsdException w:name="HTML Code" w:semiHidden="1" w:unhideWhenUsed="1"/>
-    <w:lsdException w:name="HTML Definition" w:semiHidden="1" w:unhideWhenUsed="1"/>
-    <w:lsdException w:name="HTML Keyboard" w:semiHidden="1" w:unhideWhenUsed="1"/>
-    <w:lsdException w:name="HTML Preformatted" w:semiHidden="1" w:unhideWhenUsed="1"/>
-    <w:lsdException w:name="HTML Sample" w:semiHidden="1" w:unhideWhenUsed="1"/>
-    <w:lsdException w:name="HTML Typewriter" w:semiHidden="1" w:unhideWhenUsed="1"/>
-    <w:lsdException w:name="HTML Variable" w:semiHidden="1" w:unhideWhenUsed="1"/>
     <w:lsdException w:name="Normal Table" w:semiHidden="1" w:unhideWhenUsed="1"/>
-    <w:lsdException w:name="annotation subject" w:semiHidden="1" w:unhideWhenUsed="1"/>
-    <w:lsdException w:name="No List" w:semiHidden="1" w:unhideWhenUsed="1"/>
-    <w:lsdException w:name="Outline List 1" w:semiHidden="1" w:unhideWhenUsed="1"/>
-    <w:lsdException w:name="Outline List 2" w:semiHidden="1" w:unhideWhenUsed="1"/>
-    <w:lsdException w:name="Outline List 3" w:semiHidden="1" w:unhideWhenUsed="1"/>
     <w:lsdException w:name="Table Simple 1" w:semiHidden="1" w:unhideWhenUsed="1"/>
     <w:lsdException w:name="Table Simple 2" w:semiHidden="1" w:unhideWhenUsed="1"/>
     <w:lsdException w:name="Table Simple 3" w:semiHidden="1" w:unhideWhenUsed="1"/>
@@ -9971,6 +9340,9 @@
     <w:lsdException w:name="Table Subtle 1" w:semiHidden="1" w:unhideWhenUsed="1"/>
     <w:lsdException w:name="Table Subtle 2" w:semiHidden="1" w:unhideWhenUsed="1"/>
     <w:lsdException w:name="Table Web 1" w:semiHidden="1" w:unhideWhenUsed="1"/>
+    <w:lsdException w:name="Table Web 2" w:semiHidden="1" w:unhideWhenUsed="1"/>
+    <w:lsdException w:name="Table Web 3" w:semiHidden="1" w:unhideWhenUsed="1"/>
+    <w:lsdException w:name="Table Theme" w:semiHidden="1" w:unhideWhenUsed="1"/>
     <w:lsdException w:name="Light Shading"/>
     <w:lsdException w:name="Light List"/>
     <w:lsdException w:name="Light Grid"/>
@@ -9991,7 +9363,6 @@
     <w:lsdException w:name="Medium Shading 1 Accent 1"/>
     <w:lsdException w:name="Medium Shading 2 Accent 1"/>
     <w:lsdException w:name="Medium List 1 Accent 1"/>
-    <w:lsdException w:name="Revision" w:semiHidden="1"/>
     <w:lsdException w:name="Medium List 2 Accent 1"/>
     <w:lsdException w:name="Medium Grid 1 Accent 1"/>
     <w:lsdException w:name="Medium Grid 2 Accent 1"/>
@@ -10070,15 +9441,6 @@
     <w:lsdException w:name="Colorful Shading Accent 6"/>
     <w:lsdException w:name="Colorful List Accent 6"/>
     <w:lsdException w:name="Colorful Grid Accent 6"/>
-    <w:lsdException w:name="Plain Table 1" w:uiPriority="41"/>
-    <w:lsdException w:name="Plain Table 2" w:uiPriority="42"/>
-    <w:lsdException w:name="Plain Table 3" w:uiPriority="43"/>
-    <w:lsdException w:name="Plain Table 4" w:uiPriority="44"/>
-    <w:lsdException w:name="Plain Table 5" w:uiPriority="45"/>
-    <w:lsdException w:name="Grid Table Light" w:uiPriority="40"/>
-    <w:lsdException w:name="Grid Table 1 Light" w:uiPriority="46"/>
-    <w:lsdException w:name="Grid Table 2" w:uiPriority="47"/>
-    <w:lsdException w:name="Grid Table 3" w:uiPriority="48"/>
     <w:lsdException w:name="Grid Table 4" w:uiPriority="49"/>
     <w:lsdException w:name="Grid Table 5 Dark" w:uiPriority="50"/>
     <w:lsdException w:name="Grid Table 6 Colorful" w:uiPriority="51"/>
@@ -10188,41 +9550,42 @@
     <w:name w:val="heading 1"/>
     <w:basedOn w:val="Normal"/>
     <w:next w:val="BodyText"/>
+    <w:link w:val="Heading1Char"/>
     <w:uiPriority w:val="9"/>
     <w:qFormat/>
+    <w:rsid w:val="00A10FD9"/>
     <w:pPr>
       <w:keepNext/>
       <w:keepLines/>
-      <w:spacing w:after="0" w:before="480"/>
+      <w:spacing w:after="80" w:before="360"/>
       <w:outlineLvl w:val="0"/>
     </w:pPr>
     <w:rPr>
       <w:rFonts w:asciiTheme="majorHAnsi" w:cstheme="majorBidi" w:eastAsiaTheme="majorEastAsia" w:hAnsiTheme="majorHAnsi"/>
-      <w:b/>
-      <w:bCs/>
-      <w:color w:themeColor="accent1" w:themeShade="B5" w:val="345A8A"/>
-      <w:sz w:val="32"/>
-      <w:szCs w:val="32"/>
+      <w:color w:themeColor="accent1" w:themeShade="BF" w:val="0F4761"/>
+      <w:sz w:val="40"/>
+      <w:szCs w:val="40"/>
     </w:rPr>
   </w:style>
   <w:style w:styleId="Heading2" w:type="paragraph">
     <w:name w:val="heading 2"/>
     <w:basedOn w:val="Normal"/>
     <w:next w:val="BodyText"/>
+    <w:link w:val="Heading2Char"/>
     <w:uiPriority w:val="9"/>
+    <w:semiHidden/>
     <w:unhideWhenUsed/>
     <w:qFormat/>
+    <w:rsid w:val="00A10FD9"/>
     <w:pPr>
       <w:keepNext/>
       <w:keepLines/>
-      <w:spacing w:after="0" w:before="200"/>
+      <w:spacing w:after="80" w:before="160"/>
       <w:outlineLvl w:val="1"/>
     </w:pPr>
     <w:rPr>
       <w:rFonts w:asciiTheme="majorHAnsi" w:cstheme="majorBidi" w:eastAsiaTheme="majorEastAsia" w:hAnsiTheme="majorHAnsi"/>
-      <w:b/>
-      <w:bCs/>
-      <w:color w:themeColor="accent1" w:val="4F81BD"/>
+      <w:color w:themeColor="accent1" w:themeShade="BF" w:val="0F4761"/>
       <w:sz w:val="32"/>
       <w:szCs w:val="32"/>
     </w:rPr>
@@ -10231,20 +9594,21 @@
     <w:name w:val="heading 3"/>
     <w:basedOn w:val="Normal"/>
     <w:next w:val="BodyText"/>
+    <w:link w:val="Heading3Char"/>
     <w:uiPriority w:val="9"/>
+    <w:semiHidden/>
     <w:unhideWhenUsed/>
     <w:qFormat/>
+    <w:rsid w:val="00A10FD9"/>
     <w:pPr>
       <w:keepNext/>
       <w:keepLines/>
-      <w:spacing w:after="0" w:before="200"/>
+      <w:spacing w:after="80" w:before="160"/>
       <w:outlineLvl w:val="2"/>
     </w:pPr>
     <w:rPr>
-      <w:rFonts w:asciiTheme="majorHAnsi" w:cstheme="majorBidi" w:eastAsiaTheme="majorEastAsia" w:hAnsiTheme="majorHAnsi"/>
-      <w:b/>
-      <w:bCs/>
-      <w:color w:themeColor="accent1" w:val="4F81BD"/>
+      <w:rFonts w:cstheme="majorBidi" w:eastAsiaTheme="majorEastAsia"/>
+      <w:color w:themeColor="accent1" w:themeShade="BF" w:val="0F4761"/>
       <w:sz w:val="28"/>
       <w:szCs w:val="28"/>
     </w:rPr>
@@ -10253,61 +9617,134 @@
     <w:name w:val="heading 4"/>
     <w:basedOn w:val="Normal"/>
     <w:next w:val="BodyText"/>
+    <w:link w:val="Heading4Char"/>
     <w:uiPriority w:val="9"/>
+    <w:semiHidden/>
     <w:unhideWhenUsed/>
     <w:qFormat/>
+    <w:rsid w:val="00A10FD9"/>
     <w:pPr>
       <w:keepNext/>
       <w:keepLines/>
-      <w:spacing w:after="0" w:before="200"/>
+      <w:spacing w:after="40" w:before="80"/>
       <w:outlineLvl w:val="3"/>
     </w:pPr>
     <w:rPr>
-      <w:rFonts w:asciiTheme="majorHAnsi" w:cstheme="majorBidi" w:eastAsiaTheme="majorEastAsia" w:hAnsiTheme="majorHAnsi"/>
-      <w:b/>
-      <w:bCs/>
-      <w:color w:themeColor="accent1" w:val="4F81BD"/>
+      <w:rFonts w:cstheme="majorBidi" w:eastAsiaTheme="majorEastAsia"/>
+      <w:i/>
+      <w:iCs/>
+      <w:color w:themeColor="accent1" w:themeShade="BF" w:val="0F4761"/>
     </w:rPr>
   </w:style>
   <w:style w:styleId="Heading5" w:type="paragraph">
     <w:name w:val="heading 5"/>
     <w:basedOn w:val="Normal"/>
     <w:next w:val="BodyText"/>
+    <w:link w:val="Heading5Char"/>
     <w:uiPriority w:val="9"/>
+    <w:semiHidden/>
     <w:unhideWhenUsed/>
     <w:qFormat/>
-    <w:rsid w:val="00884F3F"/>
+    <w:rsid w:val="009A0D53"/>
     <w:pPr>
       <w:keepNext/>
       <w:keepLines/>
       <w:pageBreakBefore/>
-      <w:spacing w:after="0" w:before="200" w:line="20" w:lineRule="exact"/>
+      <w:spacing w:after="40" w:before="80" w:line="20" w:lineRule="exact"/>
       <w:outlineLvl w:val="4"/>
     </w:pPr>
     <w:rPr>
-      <w:rFonts w:asciiTheme="majorHAnsi" w:cstheme="majorBidi" w:eastAsiaTheme="majorEastAsia" w:hAnsiTheme="majorHAnsi"/>
-      <w:i/>
-      <w:iCs/>
+      <w:rFonts w:cstheme="majorBidi" w:eastAsiaTheme="majorEastAsia"/>
       <w:color w:themeColor="background1" w:val="FFFFFF"/>
-      <w:sz w:val="16"/>
+      <w:sz w:val="10"/>
     </w:rPr>
   </w:style>
   <w:style w:styleId="Heading6" w:type="paragraph">
     <w:name w:val="heading 6"/>
     <w:basedOn w:val="Normal"/>
     <w:next w:val="BodyText"/>
+    <w:link w:val="Heading6Char"/>
     <w:uiPriority w:val="9"/>
+    <w:semiHidden/>
     <w:unhideWhenUsed/>
     <w:qFormat/>
+    <w:rsid w:val="00A10FD9"/>
     <w:pPr>
       <w:keepNext/>
       <w:keepLines/>
-      <w:spacing w:after="0" w:before="200"/>
+      <w:spacing w:after="0" w:before="40"/>
       <w:outlineLvl w:val="5"/>
     </w:pPr>
     <w:rPr>
-      <w:rFonts w:asciiTheme="majorHAnsi" w:cstheme="majorBidi" w:eastAsiaTheme="majorEastAsia" w:hAnsiTheme="majorHAnsi"/>
-      <w:color w:themeColor="accent1" w:val="4F81BD"/>
+      <w:rFonts w:cstheme="majorBidi" w:eastAsiaTheme="majorEastAsia"/>
+      <w:i/>
+      <w:iCs/>
+      <w:color w:themeColor="text1" w:themeTint="A6" w:val="595959"/>
+    </w:rPr>
+  </w:style>
+  <w:style w:styleId="Heading7" w:type="paragraph">
+    <w:name w:val="heading 7"/>
+    <w:basedOn w:val="Normal"/>
+    <w:next w:val="BodyText"/>
+    <w:link w:val="Heading7Char"/>
+    <w:uiPriority w:val="9"/>
+    <w:semiHidden/>
+    <w:unhideWhenUsed/>
+    <w:qFormat/>
+    <w:rsid w:val="00A10FD9"/>
+    <w:pPr>
+      <w:keepNext/>
+      <w:keepLines/>
+      <w:spacing w:after="0" w:before="40"/>
+      <w:outlineLvl w:val="6"/>
+    </w:pPr>
+    <w:rPr>
+      <w:rFonts w:cstheme="majorBidi" w:eastAsiaTheme="majorEastAsia"/>
+      <w:color w:themeColor="text1" w:themeTint="A6" w:val="595959"/>
+    </w:rPr>
+  </w:style>
+  <w:style w:styleId="Heading8" w:type="paragraph">
+    <w:name w:val="heading 8"/>
+    <w:basedOn w:val="Normal"/>
+    <w:next w:val="BodyText"/>
+    <w:link w:val="Heading8Char"/>
+    <w:uiPriority w:val="9"/>
+    <w:semiHidden/>
+    <w:unhideWhenUsed/>
+    <w:qFormat/>
+    <w:rsid w:val="00A10FD9"/>
+    <w:pPr>
+      <w:keepNext/>
+      <w:keepLines/>
+      <w:spacing w:after="0"/>
+      <w:outlineLvl w:val="7"/>
+    </w:pPr>
+    <w:rPr>
+      <w:rFonts w:cstheme="majorBidi" w:eastAsiaTheme="majorEastAsia"/>
+      <w:i/>
+      <w:iCs/>
+      <w:color w:themeColor="text1" w:themeTint="D8" w:val="272727"/>
+    </w:rPr>
+  </w:style>
+  <w:style w:styleId="Heading9" w:type="paragraph">
+    <w:name w:val="heading 9"/>
+    <w:basedOn w:val="Normal"/>
+    <w:next w:val="BodyText"/>
+    <w:link w:val="Heading9Char"/>
+    <w:uiPriority w:val="9"/>
+    <w:semiHidden/>
+    <w:unhideWhenUsed/>
+    <w:qFormat/>
+    <w:rsid w:val="00A10FD9"/>
+    <w:pPr>
+      <w:keepNext/>
+      <w:keepLines/>
+      <w:spacing w:after="0"/>
+      <w:outlineLvl w:val="8"/>
+    </w:pPr>
+    <w:rPr>
+      <w:rFonts w:cstheme="majorBidi" w:eastAsiaTheme="majorEastAsia"/>
+      <w:color w:themeColor="text1" w:themeTint="D8" w:val="272727"/>
     </w:rPr>
   </w:style>
   <w:style w:default="1" w:styleId="DefaultParagraphFont" w:type="character">
@@ -10329,16 +9766,7 @@
         <w:bottom w:type="dxa" w:w="0"/>
         <w:right w:type="dxa" w:w="108"/>
       </w:tblCellMar>
-      <w:tblBorders>
-        <w:top w:color="000000" w:space="0" w:sz="8" w:val="single"/>
-        <w:bottom w:color="000000" w:space="0" w:sz="8" w:val="single"/>
-      </w:tblBorders>
     </w:tblPr>
-    <w:rPr>
-      <w:rFonts w:ascii="Arial" w:cs="Arial" w:eastAsia="Arial" w:hAnsi="Arial"/>
-      <w:sz w:val="16"/>
-      <w:szCs w:val="16"/>
-    </w:rPr>
   </w:style>
   <w:style w:default="1" w:styleId="NoList" w:type="numbering">
     <w:name w:val="No List"/>
@@ -10364,66 +9792,123 @@
     <w:name w:val="Compact"/>
     <w:basedOn w:val="BodyText"/>
     <w:qFormat/>
+    <w:rsid w:val="008A21D1"/>
     <w:pPr>
       <w:spacing w:after="36" w:before="36"/>
     </w:pPr>
     <w:rPr>
-      <w:sz w:val="18"/>
-      <w:szCs w:val="18"/>
+      <w:rFonts w:ascii="Arial" w:hAnsi="Arial"/>
+      <w:sz w:val="16"/>
     </w:rPr>
   </w:style>
   <w:style w:styleId="Title" w:type="paragraph">
     <w:name w:val="Title"/>
     <w:basedOn w:val="Normal"/>
     <w:next w:val="BodyText"/>
+    <w:link w:val="TitleChar"/>
+    <w:uiPriority w:val="10"/>
     <w:qFormat/>
+    <w:rsid w:val="00A10FD9"/>
     <w:pPr>
-      <w:keepNext/>
-      <w:keepLines/>
-      <w:spacing w:after="240" w:before="480"/>
+      <w:spacing w:after="80"/>
+      <w:contextualSpacing/>
       <w:jc w:val="center"/>
     </w:pPr>
     <w:rPr>
       <w:rFonts w:asciiTheme="majorHAnsi" w:cstheme="majorBidi" w:eastAsiaTheme="majorEastAsia" w:hAnsiTheme="majorHAnsi"/>
-      <w:b/>
-      <w:bCs/>
-      <w:color w:themeColor="accent1" w:themeShade="B5" w:val="345A8A"/>
-      <w:sz w:val="36"/>
-      <w:szCs w:val="36"/>
+      <w:sz w:val="56"/>
+      <w:szCs w:val="56"/>
+    </w:rPr>
+  </w:style>
+  <w:style w:customStyle="1" w:styleId="TitleChar" w:type="character">
+    <w:name w:val="Title Char"/>
+    <w:basedOn w:val="DefaultParagraphFont"/>
+    <w:link w:val="Title"/>
+    <w:uiPriority w:val="10"/>
+    <w:rsid w:val="00A10FD9"/>
+    <w:rPr>
+      <w:rFonts w:asciiTheme="majorHAnsi" w:cstheme="majorBidi" w:eastAsiaTheme="majorEastAsia" w:hAnsiTheme="majorHAnsi"/>
+      <w:sz w:val="56"/>
+      <w:szCs w:val="56"/>
     </w:rPr>
   </w:style>
   <w:style w:styleId="Subtitle" w:type="paragraph">
     <w:name w:val="Subtitle"/>
     <w:basedOn w:val="Title"/>
     <w:next w:val="BodyText"/>
+    <w:link w:val="SubtitleChar"/>
+    <w:uiPriority w:val="11"/>
     <w:qFormat/>
+    <w:rsid w:val="00A10FD9"/>
     <w:pPr>
-      <w:spacing w:before="240"/>
+      <w:numPr>
+        <w:ilvl w:val="1"/>
+      </w:numPr>
     </w:pPr>
     <w:rPr>
-      <w:sz w:val="30"/>
-      <w:szCs w:val="30"/>
+      <w:spacing w:val="15"/>
+      <w:sz w:val="28"/>
+      <w:szCs w:val="28"/>
+    </w:rPr>
+  </w:style>
+  <w:style w:customStyle="1" w:styleId="SubtitleChar" w:type="character">
+    <w:name w:val="Subtitle Char"/>
+    <w:basedOn w:val="DefaultParagraphFont"/>
+    <w:link w:val="Subtitle"/>
+    <w:uiPriority w:val="11"/>
+    <w:rsid w:val="00A10FD9"/>
+    <w:rPr>
+      <w:rFonts w:cstheme="majorBidi" w:eastAsiaTheme="majorEastAsia"/>
+      <w:color w:themeColor="text1" w:themeTint="A6" w:val="595959"/>
+      <w:spacing w:val="15"/>
+      <w:sz w:val="28"/>
+      <w:szCs w:val="28"/>
     </w:rPr>
   </w:style>
   <w:style w:customStyle="1" w:styleId="Author" w:type="paragraph">
     <w:name w:val="Author"/>
+    <w:basedOn w:val="Title"/>
     <w:next w:val="BodyText"/>
     <w:qFormat/>
     <w:pPr>
       <w:keepNext/>
       <w:keepLines/>
-      <w:jc w:val="center"/>
     </w:pPr>
+    <w:rPr>
+      <w:sz w:val="24"/>
+      <w:szCs w:val="24"/>
+    </w:rPr>
   </w:style>
   <w:style w:styleId="Date" w:type="paragraph">
     <w:name w:val="Date"/>
+    <w:basedOn w:val="Title"/>
     <w:next w:val="BodyText"/>
     <w:qFormat/>
     <w:pPr>
       <w:keepNext/>
       <w:keepLines/>
+    </w:pPr>
+    <w:rPr>
+      <w:sz w:val="24"/>
+      <w:szCs w:val="24"/>
+    </w:rPr>
+  </w:style>
+  <w:style w:customStyle="1" w:styleId="AbstractTitle" w:type="paragraph">
+    <w:name w:val="Abstract Title"/>
+    <w:basedOn w:val="Normal"/>
+    <w:next w:val="Abstract"/>
+    <w:qFormat/>
+    <w:pPr>
+      <w:keepNext/>
+      <w:keepLines/>
+      <w:spacing w:after="0" w:before="300"/>
       <w:jc w:val="center"/>
     </w:pPr>
+    <w:rPr>
+      <w:b/>
+      <w:sz w:val="20"/>
+      <w:szCs w:val="20"/>
+    </w:rPr>
   </w:style>
   <w:style w:customStyle="1" w:styleId="Abstract" w:type="paragraph">
     <w:name w:val="Abstract"/>
@@ -10433,7 +9918,7 @@
     <w:pPr>
       <w:keepNext/>
       <w:keepLines/>
-      <w:spacing w:after="300" w:before="300"/>
+      <w:spacing w:after="300" w:before="100"/>
     </w:pPr>
     <w:rPr>
       <w:sz w:val="20"/>
@@ -10445,6 +9930,126 @@
     <w:basedOn w:val="Normal"/>
     <w:qFormat/>
   </w:style>
+  <w:style w:customStyle="1" w:styleId="Heading1Char" w:type="character">
+    <w:name w:val="Heading 1 Char"/>
+    <w:basedOn w:val="DefaultParagraphFont"/>
+    <w:link w:val="Heading1"/>
+    <w:uiPriority w:val="9"/>
+    <w:rsid w:val="00A10FD9"/>
+    <w:rPr>
+      <w:rFonts w:asciiTheme="majorHAnsi" w:cstheme="majorBidi" w:eastAsiaTheme="majorEastAsia" w:hAnsiTheme="majorHAnsi"/>
+      <w:color w:themeColor="accent1" w:themeShade="BF" w:val="0F4761"/>
+      <w:sz w:val="40"/>
+      <w:szCs w:val="40"/>
+    </w:rPr>
+  </w:style>
+  <w:style w:customStyle="1" w:styleId="Heading2Char" w:type="character">
+    <w:name w:val="Heading 2 Char"/>
+    <w:basedOn w:val="DefaultParagraphFont"/>
+    <w:link w:val="Heading2"/>
+    <w:uiPriority w:val="9"/>
+    <w:semiHidden/>
+    <w:rsid w:val="00A10FD9"/>
+    <w:rPr>
+      <w:rFonts w:asciiTheme="majorHAnsi" w:cstheme="majorBidi" w:eastAsiaTheme="majorEastAsia" w:hAnsiTheme="majorHAnsi"/>
+      <w:color w:themeColor="accent1" w:themeShade="BF" w:val="0F4761"/>
+      <w:sz w:val="32"/>
+      <w:szCs w:val="32"/>
+    </w:rPr>
+  </w:style>
+  <w:style w:customStyle="1" w:styleId="Heading3Char" w:type="character">
+    <w:name w:val="Heading 3 Char"/>
+    <w:basedOn w:val="DefaultParagraphFont"/>
+    <w:link w:val="Heading3"/>
+    <w:uiPriority w:val="9"/>
+    <w:semiHidden/>
+    <w:rsid w:val="00A10FD9"/>
+    <w:rPr>
+      <w:rFonts w:cstheme="majorBidi" w:eastAsiaTheme="majorEastAsia"/>
+      <w:color w:themeColor="accent1" w:themeShade="BF" w:val="0F4761"/>
+      <w:sz w:val="28"/>
+      <w:szCs w:val="28"/>
+    </w:rPr>
+  </w:style>
+  <w:style w:customStyle="1" w:styleId="Heading4Char" w:type="character">
+    <w:name w:val="Heading 4 Char"/>
+    <w:basedOn w:val="DefaultParagraphFont"/>
+    <w:link w:val="Heading4"/>
+    <w:uiPriority w:val="9"/>
+    <w:semiHidden/>
+    <w:rsid w:val="00A10FD9"/>
+    <w:rPr>
+      <w:rFonts w:cstheme="majorBidi" w:eastAsiaTheme="majorEastAsia"/>
+      <w:i/>
+      <w:iCs/>
+      <w:color w:themeColor="accent1" w:themeShade="BF" w:val="0F4761"/>
+    </w:rPr>
+  </w:style>
+  <w:style w:customStyle="1" w:styleId="Heading5Char" w:type="character">
+    <w:name w:val="Heading 5 Char"/>
+    <w:basedOn w:val="DefaultParagraphFont"/>
+    <w:link w:val="Heading5"/>
+    <w:uiPriority w:val="9"/>
+    <w:semiHidden/>
+    <w:rsid w:val="009A0D53"/>
+    <w:rPr>
+      <w:rFonts w:cstheme="majorBidi" w:eastAsiaTheme="majorEastAsia"/>
+      <w:color w:themeColor="background1" w:val="FFFFFF"/>
+      <w:sz w:val="10"/>
+    </w:rPr>
+  </w:style>
+  <w:style w:customStyle="1" w:styleId="Heading6Char" w:type="character">
+    <w:name w:val="Heading 6 Char"/>
+    <w:basedOn w:val="DefaultParagraphFont"/>
+    <w:link w:val="Heading6"/>
+    <w:uiPriority w:val="9"/>
+    <w:semiHidden/>
+    <w:rsid w:val="00A10FD9"/>
+    <w:rPr>
+      <w:rFonts w:cstheme="majorBidi" w:eastAsiaTheme="majorEastAsia"/>
+      <w:i/>
+      <w:iCs/>
+      <w:color w:themeColor="text1" w:themeTint="A6" w:val="595959"/>
+    </w:rPr>
+  </w:style>
+  <w:style w:customStyle="1" w:styleId="Heading7Char" w:type="character">
+    <w:name w:val="Heading 7 Char"/>
+    <w:basedOn w:val="DefaultParagraphFont"/>
+    <w:link w:val="Heading7"/>
+    <w:uiPriority w:val="9"/>
+    <w:semiHidden/>
+    <w:rsid w:val="00A10FD9"/>
+    <w:rPr>
+      <w:rFonts w:cstheme="majorBidi" w:eastAsiaTheme="majorEastAsia"/>
+      <w:color w:themeColor="text1" w:themeTint="A6" w:val="595959"/>
+    </w:rPr>
+  </w:style>
+  <w:style w:customStyle="1" w:styleId="Heading8Char" w:type="character">
+    <w:name w:val="Heading 8 Char"/>
+    <w:basedOn w:val="DefaultParagraphFont"/>
+    <w:link w:val="Heading8"/>
+    <w:uiPriority w:val="9"/>
+    <w:semiHidden/>
+    <w:rsid w:val="00A10FD9"/>
+    <w:rPr>
+      <w:rFonts w:cstheme="majorBidi" w:eastAsiaTheme="majorEastAsia"/>
+      <w:i/>
+      <w:iCs/>
+      <w:color w:themeColor="text1" w:themeTint="D8" w:val="272727"/>
+    </w:rPr>
+  </w:style>
+  <w:style w:customStyle="1" w:styleId="Heading9Char" w:type="character">
+    <w:name w:val="Heading 9 Char"/>
+    <w:basedOn w:val="DefaultParagraphFont"/>
+    <w:link w:val="Heading9"/>
+    <w:uiPriority w:val="9"/>
+    <w:semiHidden/>
+    <w:rsid w:val="00A10FD9"/>
+    <w:rPr>
+      <w:rFonts w:cstheme="majorBidi" w:eastAsiaTheme="majorEastAsia"/>
+      <w:color w:themeColor="text1" w:themeTint="D8" w:val="272727"/>
+    </w:rPr>
+  </w:style>
   <w:style w:styleId="BlockText" w:type="paragraph">
     <w:name w:val="Block Text"/>
     <w:basedOn w:val="BodyText"/>
@@ -10454,13 +10059,8 @@
     <w:qFormat/>
     <w:pPr>
       <w:spacing w:after="100" w:before="100"/>
+      <w:ind w:left="480" w:right="480"/>
     </w:pPr>
-    <w:rPr>
-      <w:rFonts w:asciiTheme="majorHAnsi" w:cstheme="majorBidi" w:eastAsiaTheme="majorEastAsia" w:hAnsiTheme="majorHAnsi"/>
-      <w:bCs/>
-      <w:sz w:val="20"/>
-      <w:szCs w:val="20"/>
-    </w:rPr>
   </w:style>
   <w:style w:styleId="FootnoteText" w:type="paragraph">
     <w:name w:val="footnote text"/>
@@ -10468,6 +10068,42 @@
     <w:uiPriority w:val="9"/>
     <w:unhideWhenUsed/>
     <w:qFormat/>
+  </w:style>
+  <w:style w:customStyle="1" w:styleId="FootnoteBlockText" w:type="paragraph">
+    <w:name w:val="Footnote Block Text"/>
+    <w:basedOn w:val="FootnoteText"/>
+    <w:next w:val="FootnoteText"/>
+    <w:uiPriority w:val="9"/>
+    <w:unhideWhenUsed/>
+    <w:qFormat/>
+    <w:pPr>
+      <w:spacing w:after="100" w:before="100"/>
+      <w:ind w:left="480" w:right="480"/>
+    </w:pPr>
+  </w:style>
+  <w:style w:customStyle="1" w:styleId="Table" w:type="table">
+    <w:name w:val="Table"/>
+    <w:semiHidden/>
+    <w:unhideWhenUsed/>
+    <w:qFormat/>
+    <w:tblPr>
+      <w:tblInd w:type="dxa" w:w="0"/>
+      <w:tblCellMar>
+        <w:top w:type="dxa" w:w="0"/>
+        <w:left w:type="dxa" w:w="108"/>
+        <w:bottom w:type="dxa" w:w="0"/>
+        <w:right w:type="dxa" w:w="108"/>
+      </w:tblCellMar>
+    </w:tblPr>
+    <w:tblStylePr w:type="firstRow">
+      <w:tblPr/>
+      <w:tcPr>
+        <w:tcBorders>
+          <w:bottom w:color="auto" w:space="0" w:sz="0" w:val="single"/>
+        </w:tcBorders>
+        <w:vAlign w:val="bottom"/>
+      </w:tcPr>
+    </w:tblStylePr>
   </w:style>
   <w:style w:customStyle="1" w:styleId="DefinitionTerm" w:type="paragraph">
     <w:name w:val="Definition Term"/>
@@ -10512,8 +10148,8 @@
     <w:name w:val="Figure"/>
     <w:basedOn w:val="Normal"/>
   </w:style>
-  <w:style w:customStyle="1" w:styleId="FigurewithCaption" w:type="paragraph">
-    <w:name w:val="Figure with Caption"/>
+  <w:style w:customStyle="1" w:styleId="CaptionedFigure" w:type="paragraph">
+    <w:name w:val="Captioned Figure"/>
     <w:basedOn w:val="Figure"/>
     <w:pPr>
       <w:keepNext/>
@@ -10533,6 +10169,10 @@
       <w:sz w:val="22"/>
     </w:rPr>
   </w:style>
+  <w:style w:customStyle="1" w:styleId="SectionNumber" w:type="character">
+    <w:name w:val="Section Number"/>
+    <w:basedOn w:val="CaptionChar"/>
+  </w:style>
   <w:style w:styleId="FootnoteReference" w:type="character">
     <w:name w:val="footnote reference"/>
     <w:basedOn w:val="CaptionChar"/>
@@ -10544,7 +10184,7 @@
     <w:name w:val="Hyperlink"/>
     <w:basedOn w:val="CaptionChar"/>
     <w:rPr>
-      <w:color w:themeColor="accent1" w:val="4F81BD"/>
+      <w:color w:themeColor="accent1" w:val="156082"/>
     </w:rPr>
   </w:style>
   <w:style w:styleId="TOCHeading" w:type="paragraph">
@@ -10558,11 +10198,6 @@
       <w:spacing w:before="240" w:line="259" w:lineRule="auto"/>
       <w:outlineLvl w:val="9"/>
     </w:pPr>
-    <w:rPr>
-      <w:b w:val="0"/>
-      <w:bCs w:val="0"/>
-      <w:color w:themeColor="accent1" w:themeShade="BF" w:val="365F91"/>
-    </w:rPr>
   </w:style>
   <w:style w:customStyle="1" w:styleId="SourceCode" w:type="paragraph">
     <w:name w:val="Source Code"/>
@@ -10629,7 +10264,7 @@
     <w:basedOn w:val="VerbatimChar"/>
     <w:rPr>
       <w:rFonts w:ascii="Consolas" w:hAnsi="Consolas"/>
-      <w:color w:val="000000"/>
+      <w:color w:val="8F5902"/>
       <w:sz w:val="22"/>
       <w:shd w:color="auto" w:fill="F8F8F8" w:val="clear"/>
     </w:rPr>
@@ -10649,7 +10284,8 @@
     <w:basedOn w:val="VerbatimChar"/>
     <w:rPr>
       <w:rFonts w:ascii="Consolas" w:hAnsi="Consolas"/>
-      <w:color w:val="000000"/>
+      <w:b/>
+      <w:color w:val="CE5C00"/>
       <w:sz w:val="22"/>
       <w:shd w:color="auto" w:fill="F8F8F8" w:val="clear"/>
     </w:rPr>
@@ -10755,7 +10391,8 @@
     <w:basedOn w:val="VerbatimChar"/>
     <w:rPr>
       <w:rFonts w:ascii="Consolas" w:hAnsi="Consolas"/>
-      <w:color w:val="000000"/>
+      <w:b/>
+      <w:color w:val="204A87"/>
       <w:sz w:val="22"/>
       <w:shd w:color="auto" w:fill="F8F8F8" w:val="clear"/>
     </w:rPr>
@@ -10826,7 +10463,7 @@
     <w:basedOn w:val="VerbatimChar"/>
     <w:rPr>
       <w:rFonts w:ascii="Consolas" w:hAnsi="Consolas"/>
-      <w:color w:val="C4A000"/>
+      <w:color w:val="204A87"/>
       <w:sz w:val="22"/>
       <w:shd w:color="auto" w:fill="F8F8F8" w:val="clear"/>
     </w:rPr>
@@ -10894,45 +10531,6 @@
       <w:shd w:color="auto" w:fill="F8F8F8" w:val="clear"/>
     </w:rPr>
   </w:style>
-  <w:style w:styleId="LineNumber" w:type="character">
-    <w:name w:val="line number"/>
-    <w:basedOn w:val="DefaultParagraphFont"/>
-    <w:rsid w:val="00014752"/>
-  </w:style>
-  <w:style w:styleId="Table" w:type="table">
-    <w:name w:val="Table"/>
-    <w:basedOn w:val="TableNormal"/>
-    <w:uiPriority w:val="99"/>
-    <w:rPr>
-      <w:sz w:val="16"/>
-      <w:szCs w:val="16"/>
-      <w:rFonts w:ascii="Arial" w:cs="Arial" w:eastAsia="Arial" w:hAnsi="Arial"/>
-    </w:rPr>
-    <w:tblPr>
-      <w:tblCellMar>
-        <w:left w:type="dxa" w:w="108"/>
-        <w:right w:type="dxa" w:w="108"/>
-      </w:tblCellMar>
-      <w:tblBorders>
-        <w:top w:color="000000" w:space="0" w:sz="8" w:val="single"/>
-        <w:bottom w:color="000000" w:space="0" w:sz="8" w:val="single"/>
-        <w:insideH w:color="000000" w:space="0" w:sz="8" w:val="none"/>
-      </w:tblBorders>
-    </w:tblPr>
-    <w:tblStylePr w:type="firstRow">
-      <w:rPr>
-        <w:b/>
-      </w:rPr>
-      <w:tcBorders>
-        <w:bottom w:color="000000" w:space="0" w:sz="8" w:val="single"/>
-      </w:tcBorders>
-    </w:tblStylePr>
-    <w:tblStylePr w:type="lastRow">
-      <w:tcBorders>
-        <w:bottom w:color="000000" w:space="0" w:sz="8" w:val="single"/>
-      </w:tcBorders>
-    </w:tblStylePr>
-  </w:style>
 </w:styles>
 </file>
 
@@ -10947,44 +10545,44 @@
         <a:sysClr val="window" lastClr="FFFFFF"/>
       </a:lt1>
       <a:dk2>
-        <a:srgbClr val="1F497D"/>
+        <a:srgbClr val="0E2841"/>
       </a:dk2>
       <a:lt2>
-        <a:srgbClr val="EEECE1"/>
+        <a:srgbClr val="E8E8E8"/>
       </a:lt2>
       <a:accent1>
-        <a:srgbClr val="4F81BD"/>
+        <a:srgbClr val="156082"/>
       </a:accent1>
       <a:accent2>
-        <a:srgbClr val="C0504D"/>
+        <a:srgbClr val="E97132"/>
       </a:accent2>
       <a:accent3>
-        <a:srgbClr val="9BBB59"/>
+        <a:srgbClr val="196B24"/>
       </a:accent3>
       <a:accent4>
-        <a:srgbClr val="8064A2"/>
+        <a:srgbClr val="0F9ED5"/>
       </a:accent4>
       <a:accent5>
-        <a:srgbClr val="4BACC6"/>
+        <a:srgbClr val="A02B93"/>
       </a:accent5>
       <a:accent6>
-        <a:srgbClr val="F79646"/>
+        <a:srgbClr val="4EA72E"/>
       </a:accent6>
       <a:hlink>
-        <a:srgbClr val="0000FF"/>
+        <a:srgbClr val="467886"/>
       </a:hlink>
       <a:folHlink>
-        <a:srgbClr val="800080"/>
+        <a:srgbClr val="96607D"/>
       </a:folHlink>
     </a:clrScheme>
     <a:fontScheme name="Office">
       <a:majorFont>
-        <a:latin typeface="Calibri"/>
+        <a:latin typeface="Aptos Display" panose="02110004020202020204"/>
         <a:ea typeface=""/>
         <a:cs typeface=""/>
-        <a:font script="Jpan" typeface="ＭＳ ゴシック"/>
+        <a:font script="Jpan" typeface="游ゴシック Light"/>
         <a:font script="Hang" typeface="맑은 고딕"/>
-        <a:font script="Hans" typeface="宋体"/>
+        <a:font script="Hans" typeface="等线 Light"/>
         <a:font script="Hant" typeface="新細明體"/>
         <a:font script="Arab" typeface="Times New Roman"/>
         <a:font script="Hebr" typeface="Times New Roman"/>
@@ -11011,14 +10609,32 @@
         <a:font script="Mong" typeface="Mongolian Baiti"/>
         <a:font script="Viet" typeface="Times New Roman"/>
         <a:font script="Uigh" typeface="Microsoft Uighur"/>
+        <a:font script="Geor" typeface="Sylfaen"/>
+        <a:font script="Armn" typeface="Arial"/>
+        <a:font script="Bugi" typeface="Leelawadee UI"/>
+        <a:font script="Bopo" typeface="Microsoft JhengHei"/>
+        <a:font script="Java" typeface="Javanese Text"/>
+        <a:font script="Lisu" typeface="Segoe UI"/>
+        <a:font script="Mymr" typeface="Myanmar Text"/>
+        <a:font script="Nkoo" typeface="Ebrima"/>
+        <a:font script="Olck" typeface="Nirmala UI"/>
+        <a:font script="Osma" typeface="Ebrima"/>
+        <a:font script="Phag" typeface="Phagspa"/>
+        <a:font script="Syrn" typeface="Estrangelo Edessa"/>
+        <a:font script="Syrj" typeface="Estrangelo Edessa"/>
+        <a:font script="Syre" typeface="Estrangelo Edessa"/>
+        <a:font script="Sora" typeface="Nirmala UI"/>
+        <a:font script="Tale" typeface="Microsoft Tai Le"/>
+        <a:font script="Talu" typeface="Microsoft New Tai Lue"/>
+        <a:font script="Tfng" typeface="Ebrima"/>
       </a:majorFont>
       <a:minorFont>
-        <a:latin typeface="Cambria"/>
+        <a:latin typeface="Aptos" panose="02110004020202020204"/>
         <a:ea typeface=""/>
         <a:cs typeface=""/>
-        <a:font script="Jpan" typeface="ＭＳ 明朝"/>
+        <a:font script="Jpan" typeface="游明朝"/>
         <a:font script="Hang" typeface="맑은 고딕"/>
-        <a:font script="Hans" typeface="宋体"/>
+        <a:font script="Hans" typeface="等线"/>
         <a:font script="Hant" typeface="新細明體"/>
         <a:font script="Arab" typeface="Arial"/>
         <a:font script="Hebr" typeface="Arial"/>
@@ -11045,6 +10661,24 @@
         <a:font script="Mong" typeface="Mongolian Baiti"/>
         <a:font script="Viet" typeface="Arial"/>
         <a:font script="Uigh" typeface="Microsoft Uighur"/>
+        <a:font script="Geor" typeface="Sylfaen"/>
+        <a:font script="Armn" typeface="Arial"/>
+        <a:font script="Bugi" typeface="Leelawadee UI"/>
+        <a:font script="Bopo" typeface="Microsoft JhengHei"/>
+        <a:font script="Java" typeface="Javanese Text"/>
+        <a:font script="Lisu" typeface="Segoe UI"/>
+        <a:font script="Mymr" typeface="Myanmar Text"/>
+        <a:font script="Nkoo" typeface="Ebrima"/>
+        <a:font script="Olck" typeface="Nirmala UI"/>
+        <a:font script="Osma" typeface="Ebrima"/>
+        <a:font script="Phag" typeface="Phagspa"/>
+        <a:font script="Syrn" typeface="Estrangelo Edessa"/>
+        <a:font script="Syrj" typeface="Estrangelo Edessa"/>
+        <a:font script="Syre" typeface="Estrangelo Edessa"/>
+        <a:font script="Sora" typeface="Nirmala UI"/>
+        <a:font script="Tale" typeface="Microsoft Tai Le"/>
+        <a:font script="Talu" typeface="Microsoft New Tai Lue"/>
+        <a:font script="Tfng" typeface="Ebrima"/>
       </a:minorFont>
     </a:fontScheme>
     <a:fmtScheme name="Office">
@@ -11056,200 +10690,141 @@
           <a:gsLst>
             <a:gs pos="0">
               <a:schemeClr val="phClr">
-                <a:tint val="50000"/>
-                <a:satMod val="300000"/>
+                <a:lumMod val="110000"/>
+                <a:satMod val="105000"/>
+                <a:tint val="67000"/>
               </a:schemeClr>
             </a:gs>
-            <a:gs pos="35000">
+            <a:gs pos="50000">
               <a:schemeClr val="phClr">
-                <a:tint val="37000"/>
-                <a:satMod val="300000"/>
+                <a:lumMod val="105000"/>
+                <a:satMod val="103000"/>
+                <a:tint val="73000"/>
               </a:schemeClr>
             </a:gs>
             <a:gs pos="100000">
               <a:schemeClr val="phClr">
-                <a:tint val="15000"/>
-                <a:satMod val="350000"/>
+                <a:lumMod val="105000"/>
+                <a:satMod val="109000"/>
+                <a:tint val="81000"/>
               </a:schemeClr>
             </a:gs>
           </a:gsLst>
-          <a:lin ang="16200000" scaled="1"/>
+          <a:lin ang="5400000" scaled="0"/>
         </a:gradFill>
         <a:gradFill rotWithShape="1">
           <a:gsLst>
             <a:gs pos="0">
               <a:schemeClr val="phClr">
-                <a:tint val="100000"/>
+                <a:satMod val="103000"/>
+                <a:lumMod val="102000"/>
+                <a:tint val="94000"/>
+              </a:schemeClr>
+            </a:gs>
+            <a:gs pos="50000">
+              <a:schemeClr val="phClr">
+                <a:satMod val="110000"/>
+                <a:lumMod val="100000"/>
                 <a:shade val="100000"/>
-                <a:satMod val="130000"/>
               </a:schemeClr>
             </a:gs>
             <a:gs pos="100000">
               <a:schemeClr val="phClr">
-                <a:tint val="50000"/>
-                <a:shade val="100000"/>
-                <a:satMod val="350000"/>
+                <a:lumMod val="99000"/>
+                <a:satMod val="120000"/>
+                <a:shade val="78000"/>
               </a:schemeClr>
             </a:gs>
           </a:gsLst>
-          <a:lin ang="16200000" scaled="0"/>
+          <a:lin ang="5400000" scaled="0"/>
         </a:gradFill>
       </a:fillStyleLst>
       <a:lnStyleLst>
-        <a:ln w="9525" cap="flat" cmpd="sng" algn="ctr">
-          <a:solidFill>
-            <a:schemeClr val="phClr">
-              <a:shade val="95000"/>
-              <a:satMod val="105000"/>
-            </a:schemeClr>
-          </a:solidFill>
-          <a:prstDash val="solid"/>
-        </a:ln>
-        <a:ln w="25400" cap="flat" cmpd="sng" algn="ctr">
+        <a:ln w="6350" cap="flat" cmpd="sng" algn="ctr">
           <a:solidFill>
             <a:schemeClr val="phClr"/>
           </a:solidFill>
           <a:prstDash val="solid"/>
+          <a:miter lim="800000"/>
         </a:ln>
-        <a:ln w="38100" cap="flat" cmpd="sng" algn="ctr">
+        <a:ln w="12700" cap="flat" cmpd="sng" algn="ctr">
           <a:solidFill>
             <a:schemeClr val="phClr"/>
           </a:solidFill>
           <a:prstDash val="solid"/>
+          <a:miter lim="800000"/>
+        </a:ln>
+        <a:ln w="19050" cap="flat" cmpd="sng" algn="ctr">
+          <a:solidFill>
+            <a:schemeClr val="phClr"/>
+          </a:solidFill>
+          <a:prstDash val="solid"/>
+          <a:miter lim="800000"/>
         </a:ln>
       </a:lnStyleLst>
       <a:effectStyleLst>
         <a:effectStyle>
+          <a:effectLst/>
+        </a:effectStyle>
+        <a:effectStyle>
+          <a:effectLst/>
+        </a:effectStyle>
+        <a:effectStyle>
           <a:effectLst>
-            <a:outerShdw blurRad="40000" dist="20000" dir="5400000" rotWithShape="0">
+            <a:outerShdw blurRad="57150" dist="19050" dir="5400000" algn="ctr" rotWithShape="0">
               <a:srgbClr val="000000">
-                <a:alpha val="38000"/>
+                <a:alpha val="63000"/>
               </a:srgbClr>
             </a:outerShdw>
           </a:effectLst>
-        </a:effectStyle>
-        <a:effectStyle>
-          <a:effectLst>
-            <a:outerShdw blurRad="40000" dist="23000" dir="5400000" rotWithShape="0">
-              <a:srgbClr val="000000">
-                <a:alpha val="35000"/>
-              </a:srgbClr>
-            </a:outerShdw>
-          </a:effectLst>
-        </a:effectStyle>
-        <a:effectStyle>
-          <a:effectLst>
-            <a:outerShdw blurRad="40000" dist="23000" dir="5400000" rotWithShape="0">
-              <a:srgbClr val="000000">
-                <a:alpha val="35000"/>
-              </a:srgbClr>
-            </a:outerShdw>
-          </a:effectLst>
-          <a:scene3d>
-            <a:camera prst="orthographicFront">
-              <a:rot lat="0" lon="0" rev="0"/>
-            </a:camera>
-            <a:lightRig rig="threePt" dir="t">
-              <a:rot lat="0" lon="0" rev="1200000"/>
-            </a:lightRig>
-          </a:scene3d>
-          <a:sp3d>
-            <a:bevelT w="63500" h="25400"/>
-          </a:sp3d>
         </a:effectStyle>
       </a:effectStyleLst>
       <a:bgFillStyleLst>
         <a:solidFill>
           <a:schemeClr val="phClr"/>
         </a:solidFill>
+        <a:solidFill>
+          <a:schemeClr val="phClr">
+            <a:tint val="95000"/>
+            <a:satMod val="170000"/>
+          </a:schemeClr>
+        </a:solidFill>
         <a:gradFill rotWithShape="1">
           <a:gsLst>
             <a:gs pos="0">
               <a:schemeClr val="phClr">
-                <a:tint val="40000"/>
-                <a:satMod val="350000"/>
+                <a:tint val="93000"/>
+                <a:satMod val="150000"/>
+                <a:shade val="98000"/>
+                <a:lumMod val="102000"/>
               </a:schemeClr>
             </a:gs>
-            <a:gs pos="40000">
+            <a:gs pos="50000">
               <a:schemeClr val="phClr">
-                <a:tint val="45000"/>
-                <a:shade val="99000"/>
-                <a:satMod val="350000"/>
+                <a:tint val="98000"/>
+                <a:satMod val="130000"/>
+                <a:shade val="90000"/>
+                <a:lumMod val="103000"/>
               </a:schemeClr>
             </a:gs>
             <a:gs pos="100000">
               <a:schemeClr val="phClr">
-                <a:shade val="20000"/>
-                <a:satMod val="255000"/>
+                <a:shade val="63000"/>
+                <a:satMod val="120000"/>
               </a:schemeClr>
             </a:gs>
           </a:gsLst>
-          <a:path path="circle">
-            <a:fillToRect l="50000" t="-80000" r="50000" b="180000"/>
-          </a:path>
-        </a:gradFill>
-        <a:gradFill rotWithShape="1">
-          <a:gsLst>
-            <a:gs pos="0">
-              <a:schemeClr val="phClr">
-                <a:tint val="80000"/>
-                <a:satMod val="300000"/>
-              </a:schemeClr>
-            </a:gs>
-            <a:gs pos="100000">
-              <a:schemeClr val="phClr">
-                <a:shade val="30000"/>
-                <a:satMod val="200000"/>
-              </a:schemeClr>
-            </a:gs>
-          </a:gsLst>
-          <a:path path="circle">
-            <a:fillToRect l="50000" t="50000" r="50000" b="50000"/>
-          </a:path>
+          <a:lin ang="5400000" scaled="0"/>
         </a:gradFill>
       </a:bgFillStyleLst>
     </a:fmtScheme>
   </a:themeElements>
-  <a:objectDefaults>
-    <a:spDef>
-      <a:spPr/>
-      <a:bodyPr/>
-      <a:lstStyle/>
-      <a:style>
-        <a:lnRef idx="1">
-          <a:schemeClr val="accent1"/>
-        </a:lnRef>
-        <a:fillRef idx="3">
-          <a:schemeClr val="accent1"/>
-        </a:fillRef>
-        <a:effectRef idx="2">
-          <a:schemeClr val="accent1"/>
-        </a:effectRef>
-        <a:fontRef idx="minor">
-          <a:schemeClr val="lt1"/>
-        </a:fontRef>
-      </a:style>
-    </a:spDef>
-    <a:lnDef>
-      <a:spPr/>
-      <a:bodyPr/>
-      <a:lstStyle/>
-      <a:style>
-        <a:lnRef idx="2">
-          <a:schemeClr val="accent1"/>
-        </a:lnRef>
-        <a:fillRef idx="0">
-          <a:schemeClr val="accent1"/>
-        </a:fillRef>
-        <a:effectRef idx="1">
-          <a:schemeClr val="accent1"/>
-        </a:effectRef>
-        <a:fontRef idx="minor">
-          <a:schemeClr val="tx1"/>
-        </a:fontRef>
-      </a:style>
-    </a:lnDef>
-  </a:objectDefaults>
+  <a:objectDefaults/>
   <a:extraClrSchemeLst/>
+  <a:extLst>
+    <a:ext uri="{05A4C25C-085E-4340-85A3-A5531E510DB2}">
+      <thm15:themeFamily xmlns:thm15="http://schemas.microsoft.com/office/thememl/2012/main" name="Office Theme" id="{2E142A2C-CD16-42D6-873A-C26D2A0506FA}" vid="{1BDDFF52-6CD6-40A5-AB3C-68EB2F1E4D0A}"/>
+    </a:ext>
+  </a:extLst>
 </a:theme>
 </file>
</xml_diff>

<commit_message>
prepare to shift some content from S1 to paper
</commit_message>
<xml_diff>
--- a/paper/paper.docx
+++ b/paper/paper.docx
@@ -179,7 +179,7 @@
         <w:t xml:space="preserve"> </w:t>
       </w:r>
       <w:r>
-        <w:t xml:space="preserve">22,</w:t>
+        <w:t xml:space="preserve">23,</w:t>
       </w:r>
       <w:r>
         <w:t xml:space="preserve"> </w:t>
@@ -1940,7 +1940,30 @@
         <w:pStyle w:val="BodyText"/>
       </w:pPr>
       <w:r>
-        <w:t xml:space="preserve">For each of the two phases, our seriation analysis identifies two groups. One group has a restricted range of sign types (1-3 types), which tend to be visually simpler signs. A second group has a broader range (up to 17 types), which include more complex signs. Simpler signs composed of fewer components, like line and notch, are the most prevalent across both phases. In Aur-P1 the restricted-range group (9 sites) is slightly smaller than the broad-range group (11 sites); in Aur-P2 the restricted-range group (6 sites) is larger than the broad-range group (3 sites). Bootstrap resampling of sites confirms that the Aur-P1 two-group structure is stable to sampling variation; the stochastic block model independently selects a three-block structure for Aur-P1, reproducing the manual restricted/broad split for all but one site, and a single-block structure for the small Aur-P2 sample, providing no model-based support for a two-group split there (S1</w:t>
+        <w:t xml:space="preserve">For each of the two phases, we infer two groups from visual inspection of our seriation results. One group has a restricted range of sign types (1-3 types), which tend to be visually simpler signs. A second group has a broader range (up to 17 types), which include more complex signs. Simpler signs composed of fewer components, like line and notch, are the most prevalent across both phases. In Aur-P1 the restricted-range group (9 sites) is slightly smaller than the broad-range group (11 sites); in Aur-P2 the restricted-range group (6 sites) is larger than the broad-range group (3 sites).</w:t>
+      </w:r>
+    </w:p>
+    <w:p>
+      <w:pPr>
+        <w:pStyle w:val="BodyText"/>
+      </w:pPr>
+      <w:r>
+        <w:t xml:space="preserve">To quantitatively explore the robustness of the two-group structure inferred from the seriation analysis, we used bootstrap resampling and stochastic block models, which we describe in detail in S1</w:t>
+      </w:r>
+      <w:r>
+        <w:t xml:space="preserve"> </w:t>
+      </w:r>
+      <w:r>
+        <w:t xml:space="preserve">“</w:t>
+      </w:r>
+      <w:r>
+        <w:t xml:space="preserve">Sensitivity Analyses</w:t>
+      </w:r>
+      <w:r>
+        <w:t xml:space="preserve">”</w:t>
+      </w:r>
+      <w:r>
+        <w:t xml:space="preserve">. Bootstrap resampling of sites within each phase generated consensus co-clustering probabilities . produced a consensus co-clustering matrix of sites confirms that the Aur-P1 two-group structure is stable to sampling variation; the stochastic block model independently selects a three-block structure for Aur-P1, reproducing the manual restricted/broad split for all but one site, and a single-block structure for the small Aur-P2 sample, providing no model-based support for a two-group split there (S1</w:t>
       </w:r>
       <w:r>
         <w:t xml:space="preserve"> </w:t>
@@ -3148,7 +3171,7 @@
         </w:r>
       </w:hyperlink>
       <w:r>
-        <w:t xml:space="preserve">), and no significant geographic signal was detected in either phase (Aur-P2: R = -0.299). A permutation test of the difference between these Mantel correlations (D = 0.34, p = 0.153; sites permuted between phases 1,000 times) shows that the isolation-by-distance relationship does not differ significantly between the phases, so the spatial-proximity explanation is not supported by this analysis.</w:t>
+        <w:t xml:space="preserve">), and no significant geographic signal was detected in either phase (/Aur-P2: R = -0.299). A permutation test of the difference between these Mantel correlations (D = 0.34, p = 0.153; sites permuted between phases 1,000 times) shows that the isolation-by-distance relationship does not differ significantly between the phases, so the spatial-proximity explanation is not supported by this analysis.</w:t>
       </w:r>
     </w:p>
     <w:p>
@@ -3819,7 +3842,7 @@
       </w:r>
     </w:p>
     <w:bookmarkEnd w:id="61"/>
-    <w:bookmarkStart w:id="297" w:name="references"/>
+    <w:bookmarkStart w:id="299" w:name="references"/>
     <w:p>
       <w:pPr>
         <w:pStyle w:val="Heading1"/>
@@ -3828,7 +3851,7 @@
         <w:t xml:space="preserve">References</w:t>
       </w:r>
     </w:p>
-    <w:bookmarkStart w:id="296" w:name="refs"/>
+    <w:bookmarkStart w:id="298" w:name="refs"/>
     <w:bookmarkStart w:id="63" w:name="ref-Boyd_Silk_2020"/>
     <w:p>
       <w:pPr>
@@ -5704,7 +5727,7 @@
         <w:t xml:space="preserve">Europe</w:t>
       </w:r>
       <w:r>
-        <w:t xml:space="preserve">, vol. 7, Paleothnology, Toulouse; 2015, p. 57–75.</w:t>
+        <w:t xml:space="preserve">, vol. 7, Palethnology, Toulouse; 2015, p. 57–75.</w:t>
       </w:r>
       <w:r>
         <w:t xml:space="preserve"> </w:t>
@@ -6202,7 +6225,7 @@
         <w:t xml:space="preserve">	</w:t>
       </w:r>
       <w:r>
-        <w:t xml:space="preserve">Pavel N. Krivitsky MSH, Hunter DR, Butts CT, Bojanowski M, Klumb C, Goodreau SM, et al.</w:t>
+        <w:t xml:space="preserve">Handcock MS, Hunter DR, Butts CT, Goodreau SM, Krivitsky PN, Bender-deMoll S, et al.</w:t>
       </w:r>
       <w:r>
         <w:t xml:space="preserve"> </w:t>
@@ -6212,14 +6235,14 @@
           <w:rPr>
             <w:rStyle w:val="Hyperlink"/>
           </w:rPr>
-          <w:t xml:space="preserve">Statnet: Tools for the statistical modeling of network data</w:t>
-        </w:r>
-      </w:hyperlink>
-      <w:r>
-        <w:t xml:space="preserve"> </w:t>
-      </w:r>
-      <w:r>
-        <w:t xml:space="preserve">2024.</w:t>
+          <w:t xml:space="preserve">Statnet: Software tools for the statistical analysis of network data</w:t>
+        </w:r>
+      </w:hyperlink>
+      <w:r>
+        <w:t xml:space="preserve"> </w:t>
+      </w:r>
+      <w:r>
+        <w:t xml:space="preserve">2019.</w:t>
       </w:r>
     </w:p>
     <w:bookmarkEnd w:id="144"/>
@@ -7390,7 +7413,7 @@
         <w:t xml:space="preserve">Kuril Islands</w:t>
       </w:r>
       <w:r>
-        <w:t xml:space="preserve">. Information and its role in hunter-gatherer bands, Cotsen Institute of Archaeology Press at UCLA; 2011, p. 89–115.</w:t>
+        <w:t xml:space="preserve">. In: Whallon R, Lovis WA, Hitchcock RK, editors. Information and its role in hunter-gatherer bands, Cotsen Institute of Archaeology Press at UCLA; 2011, p. 85–116.</w:t>
       </w:r>
     </w:p>
     <w:bookmarkEnd w:id="195"/>
@@ -8425,7 +8448,7 @@
       </w:r>
     </w:p>
     <w:bookmarkEnd w:id="233"/>
-    <w:bookmarkStart w:id="234" w:name="ref-McDonald_Veth_Lilley_2006"/>
+    <w:bookmarkStart w:id="235" w:name="ref-McDonald_Veth_Lilley_2006"/>
     <w:p>
       <w:pPr>
         <w:pStyle w:val="Bibliography"/>
@@ -8484,9 +8507,23 @@
       <w:r>
         <w:t xml:space="preserve">, Malden, Mass: Blackwell Publishing; 2006, p. 96–115.</w:t>
       </w:r>
-    </w:p>
-    <w:bookmarkEnd w:id="234"/>
-    <w:bookmarkStart w:id="236" w:name="ref-Lourandos_1985"/>
+      <w:r>
+        <w:t xml:space="preserve"> </w:t>
+      </w:r>
+      <w:hyperlink r:id="rId234">
+        <w:r>
+          <w:rPr>
+            <w:rStyle w:val="Hyperlink"/>
+          </w:rPr>
+          <w:t xml:space="preserve">https://doi.org/10.1002/9780470773475.ch5</w:t>
+        </w:r>
+      </w:hyperlink>
+      <w:r>
+        <w:t xml:space="preserve">.</w:t>
+      </w:r>
+    </w:p>
+    <w:bookmarkEnd w:id="235"/>
+    <w:bookmarkStart w:id="237" w:name="ref-Lourandos_1985"/>
     <w:p>
       <w:pPr>
         <w:pStyle w:val="Bibliography"/>
@@ -8518,7 +8555,7 @@
       <w:r>
         <w:t xml:space="preserve"> </w:t>
       </w:r>
-      <w:hyperlink r:id="rId235">
+      <w:hyperlink r:id="rId236">
         <w:r>
           <w:rPr>
             <w:rStyle w:val="Hyperlink"/>
@@ -8530,8 +8567,8 @@
         <w:t xml:space="preserve">.</w:t>
       </w:r>
     </w:p>
-    <w:bookmarkEnd w:id="236"/>
-    <w:bookmarkStart w:id="238" w:name="ref-barton_clark_cohen1994"/>
+    <w:bookmarkEnd w:id="237"/>
+    <w:bookmarkStart w:id="239" w:name="ref-barton_clark_cohen1994"/>
     <w:p>
       <w:pPr>
         <w:pStyle w:val="Bibliography"/>
@@ -8572,7 +8609,7 @@
       <w:r>
         <w:t xml:space="preserve"> </w:t>
       </w:r>
-      <w:hyperlink r:id="rId237">
+      <w:hyperlink r:id="rId238">
         <w:r>
           <w:rPr>
             <w:rStyle w:val="Hyperlink"/>
@@ -8584,8 +8621,8 @@
         <w:t xml:space="preserve">.</w:t>
       </w:r>
     </w:p>
-    <w:bookmarkEnd w:id="238"/>
-    <w:bookmarkStart w:id="239" w:name="ref-mcdonald2012social"/>
+    <w:bookmarkEnd w:id="239"/>
+    <w:bookmarkStart w:id="241" w:name="ref-mcdonald2012social"/>
     <w:p>
       <w:pPr>
         <w:pStyle w:val="Bibliography"/>
@@ -8609,11 +8646,25 @@
         <w:t xml:space="preserve">Western Desert</w:t>
       </w:r>
       <w:r>
-        <w:t xml:space="preserve">. In: McDonald J, Veth P, editors. A companion to rock art, Chichester: Wiley-Blackwell; 2012, p. 90–102.</w:t>
-      </w:r>
-    </w:p>
-    <w:bookmarkEnd w:id="239"/>
-    <w:bookmarkStart w:id="241" w:name="ref-bernardini2005reconsidering"/>
+        <w:t xml:space="preserve">. In: McDonald J, Veth P, editors. A companion to rock art, Oxford: Wiley-Blackwell; 2012, p. 90–102.</w:t>
+      </w:r>
+      <w:r>
+        <w:t xml:space="preserve"> </w:t>
+      </w:r>
+      <w:hyperlink r:id="rId240">
+        <w:r>
+          <w:rPr>
+            <w:rStyle w:val="Hyperlink"/>
+          </w:rPr>
+          <w:t xml:space="preserve">https://doi.org/10.1002/9781118253892.ch6</w:t>
+        </w:r>
+      </w:hyperlink>
+      <w:r>
+        <w:t xml:space="preserve">.</w:t>
+      </w:r>
+    </w:p>
+    <w:bookmarkEnd w:id="241"/>
+    <w:bookmarkStart w:id="243" w:name="ref-bernardini2005reconsidering"/>
     <w:p>
       <w:pPr>
         <w:pStyle w:val="Bibliography"/>
@@ -8642,7 +8693,7 @@
       <w:r>
         <w:t xml:space="preserve"> </w:t>
       </w:r>
-      <w:hyperlink r:id="rId240">
+      <w:hyperlink r:id="rId242">
         <w:r>
           <w:rPr>
             <w:rStyle w:val="Hyperlink"/>
@@ -8654,8 +8705,8 @@
         <w:t xml:space="preserve">.</w:t>
       </w:r>
     </w:p>
-    <w:bookmarkEnd w:id="241"/>
-    <w:bookmarkStart w:id="242" w:name="ref-wiessner1984reconsidering"/>
+    <w:bookmarkEnd w:id="243"/>
+    <w:bookmarkStart w:id="244" w:name="ref-wiessner1984reconsidering"/>
     <w:p>
       <w:pPr>
         <w:pStyle w:val="Bibliography"/>
@@ -8682,8 +8733,8 @@
         <w:t xml:space="preserve">. Journal of Anthropological Archaeology 1984;3:190–234.</w:t>
       </w:r>
     </w:p>
-    <w:bookmarkEnd w:id="242"/>
-    <w:bookmarkStart w:id="244" w:name="ref-smith1992"/>
+    <w:bookmarkEnd w:id="244"/>
+    <w:bookmarkStart w:id="246" w:name="ref-smith1992"/>
     <w:p>
       <w:pPr>
         <w:pStyle w:val="Bibliography"/>
@@ -8719,12 +8770,12 @@
         <w:t xml:space="preserve">Sahul</w:t>
       </w:r>
       <w:r>
-        <w:t xml:space="preserve">. Australian Archaeology 1992:34–42.</w:t>
-      </w:r>
-      <w:r>
-        <w:t xml:space="preserve"> </w:t>
-      </w:r>
-      <w:hyperlink r:id="rId243">
+        <w:t xml:space="preserve">. Australian Archaeology 1992;34:34–42.</w:t>
+      </w:r>
+      <w:r>
+        <w:t xml:space="preserve"> </w:t>
+      </w:r>
+      <w:hyperlink r:id="rId245">
         <w:r>
           <w:rPr>
             <w:rStyle w:val="Hyperlink"/>
@@ -8736,8 +8787,8 @@
         <w:t xml:space="preserve">.</w:t>
       </w:r>
     </w:p>
-    <w:bookmarkEnd w:id="244"/>
-    <w:bookmarkStart w:id="246" w:name="X4fed35d53d406ce17aea32f9d6f163fcb563519"/>
+    <w:bookmarkEnd w:id="246"/>
+    <w:bookmarkStart w:id="248" w:name="X4fed35d53d406ce17aea32f9d6f163fcb563519"/>
     <w:p>
       <w:pPr>
         <w:pStyle w:val="Bibliography"/>
@@ -8778,7 +8829,7 @@
       <w:r>
         <w:t xml:space="preserve"> </w:t>
       </w:r>
-      <w:hyperlink r:id="rId245">
+      <w:hyperlink r:id="rId247">
         <w:r>
           <w:rPr>
             <w:rStyle w:val="Hyperlink"/>
@@ -8790,8 +8841,8 @@
         <w:t xml:space="preserve">.</w:t>
       </w:r>
     </w:p>
-    <w:bookmarkEnd w:id="246"/>
-    <w:bookmarkStart w:id="247" w:name="ref-Cavalli_Sforza_Feldman_1981"/>
+    <w:bookmarkEnd w:id="248"/>
+    <w:bookmarkStart w:id="249" w:name="ref-Cavalli_Sforza_Feldman_1981"/>
     <w:p>
       <w:pPr>
         <w:pStyle w:val="Bibliography"/>
@@ -8809,8 +8860,8 @@
         <w:t xml:space="preserve">Cavalli-Sforza L, Feldman MW. Cultural transmission and evolution: A quantitative approach. Princeton University Press; 1981.</w:t>
       </w:r>
     </w:p>
-    <w:bookmarkEnd w:id="247"/>
-    <w:bookmarkStart w:id="248" w:name="ref-Boyd_Richerson_1985"/>
+    <w:bookmarkEnd w:id="249"/>
+    <w:bookmarkStart w:id="250" w:name="ref-Boyd_Richerson_1985"/>
     <w:p>
       <w:pPr>
         <w:pStyle w:val="Bibliography"/>
@@ -8828,8 +8879,8 @@
         <w:t xml:space="preserve">Boyd R, Richerson PJ. Culture and the evolutionary process. University of Chicago Press; 1985.</w:t>
       </w:r>
     </w:p>
-    <w:bookmarkEnd w:id="248"/>
-    <w:bookmarkStart w:id="249" w:name="ref-Richerson_Boyd_2005"/>
+    <w:bookmarkEnd w:id="250"/>
+    <w:bookmarkStart w:id="251" w:name="ref-Richerson_Boyd_2005"/>
     <w:p>
       <w:pPr>
         <w:pStyle w:val="Bibliography"/>
@@ -8847,8 +8898,8 @@
         <w:t xml:space="preserve">Richerson PJ, Boyd R. Not by genes alone: How culture transformed human evolution. University of Chicago Press; 2005.</w:t>
       </w:r>
     </w:p>
-    <w:bookmarkEnd w:id="249"/>
-    <w:bookmarkStart w:id="251" w:name="ref-Henrich_2004"/>
+    <w:bookmarkEnd w:id="251"/>
+    <w:bookmarkStart w:id="253" w:name="ref-Henrich_2004"/>
     <w:p>
       <w:pPr>
         <w:pStyle w:val="Bibliography"/>
@@ -8874,7 +8925,7 @@
       <w:r>
         <w:t xml:space="preserve"> </w:t>
       </w:r>
-      <w:hyperlink r:id="rId250">
+      <w:hyperlink r:id="rId252">
         <w:r>
           <w:rPr>
             <w:rStyle w:val="Hyperlink"/>
@@ -8886,8 +8937,8 @@
         <w:t xml:space="preserve">.</w:t>
       </w:r>
     </w:p>
-    <w:bookmarkEnd w:id="251"/>
-    <w:bookmarkStart w:id="253" w:name="ref-Migliano_2020"/>
+    <w:bookmarkEnd w:id="253"/>
+    <w:bookmarkStart w:id="255" w:name="ref-Migliano_2020"/>
     <w:p>
       <w:pPr>
         <w:pStyle w:val="Bibliography"/>
@@ -8907,7 +8958,7 @@
       <w:r>
         <w:t xml:space="preserve"> </w:t>
       </w:r>
-      <w:hyperlink r:id="rId252">
+      <w:hyperlink r:id="rId254">
         <w:r>
           <w:rPr>
             <w:rStyle w:val="Hyperlink"/>
@@ -8919,8 +8970,8 @@
         <w:t xml:space="preserve">.</w:t>
       </w:r>
     </w:p>
-    <w:bookmarkEnd w:id="253"/>
-    <w:bookmarkStart w:id="255" w:name="ref-Romano_Lozano_2020"/>
+    <w:bookmarkEnd w:id="255"/>
+    <w:bookmarkStart w:id="257" w:name="ref-Romano_Lozano_2020"/>
     <w:p>
       <w:pPr>
         <w:pStyle w:val="Bibliography"/>
@@ -8940,7 +8991,7 @@
       <w:r>
         <w:t xml:space="preserve"> </w:t>
       </w:r>
-      <w:hyperlink r:id="rId254">
+      <w:hyperlink r:id="rId256">
         <w:r>
           <w:rPr>
             <w:rStyle w:val="Hyperlink"/>
@@ -8952,8 +9003,8 @@
         <w:t xml:space="preserve">.</w:t>
       </w:r>
     </w:p>
-    <w:bookmarkEnd w:id="255"/>
-    <w:bookmarkStart w:id="257" w:name="ref-Buchanan_Hamilton_2023"/>
+    <w:bookmarkEnd w:id="257"/>
+    <w:bookmarkStart w:id="259" w:name="ref-Buchanan_Hamilton_2023"/>
     <w:p>
       <w:pPr>
         <w:pStyle w:val="Bibliography"/>
@@ -8973,7 +9024,7 @@
       <w:r>
         <w:t xml:space="preserve"> </w:t>
       </w:r>
-      <w:hyperlink r:id="rId256">
+      <w:hyperlink r:id="rId258">
         <w:r>
           <w:rPr>
             <w:rStyle w:val="Hyperlink"/>
@@ -8985,8 +9036,8 @@
         <w:t xml:space="preserve">.</w:t>
       </w:r>
     </w:p>
-    <w:bookmarkEnd w:id="257"/>
-    <w:bookmarkStart w:id="259" w:name="ref-Eerkens_Lipo_2005"/>
+    <w:bookmarkEnd w:id="259"/>
+    <w:bookmarkStart w:id="261" w:name="ref-Eerkens_Lipo_2005"/>
     <w:p>
       <w:pPr>
         <w:pStyle w:val="Bibliography"/>
@@ -9006,7 +9057,7 @@
       <w:r>
         <w:t xml:space="preserve"> </w:t>
       </w:r>
-      <w:hyperlink r:id="rId258">
+      <w:hyperlink r:id="rId260">
         <w:r>
           <w:rPr>
             <w:rStyle w:val="Hyperlink"/>
@@ -9018,8 +9069,8 @@
         <w:t xml:space="preserve">.</w:t>
       </w:r>
     </w:p>
-    <w:bookmarkEnd w:id="259"/>
-    <w:bookmarkStart w:id="261" w:name="ref-Bentz_Dutkiewicz_2026"/>
+    <w:bookmarkEnd w:id="261"/>
+    <w:bookmarkStart w:id="263" w:name="ref-Bentz_Dutkiewicz_2026"/>
     <w:p>
       <w:pPr>
         <w:pStyle w:val="Bibliography"/>
@@ -9039,7 +9090,7 @@
       <w:r>
         <w:t xml:space="preserve"> </w:t>
       </w:r>
-      <w:hyperlink r:id="rId260">
+      <w:hyperlink r:id="rId262">
         <w:r>
           <w:rPr>
             <w:rStyle w:val="Hyperlink"/>
@@ -9051,8 +9102,8 @@
         <w:t xml:space="preserve">.</w:t>
       </w:r>
     </w:p>
-    <w:bookmarkEnd w:id="261"/>
-    <w:bookmarkStart w:id="263" w:name="ref-Bacon_2023"/>
+    <w:bookmarkEnd w:id="263"/>
+    <w:bookmarkStart w:id="265" w:name="ref-Bacon_2023"/>
     <w:p>
       <w:pPr>
         <w:pStyle w:val="Bibliography"/>
@@ -9084,7 +9135,7 @@
       <w:r>
         <w:t xml:space="preserve"> </w:t>
       </w:r>
-      <w:hyperlink r:id="rId262">
+      <w:hyperlink r:id="rId264">
         <w:r>
           <w:rPr>
             <w:rStyle w:val="Hyperlink"/>
@@ -9096,8 +9147,8 @@
         <w:t xml:space="preserve">.</w:t>
       </w:r>
     </w:p>
-    <w:bookmarkEnd w:id="263"/>
-    <w:bookmarkStart w:id="265" w:name="Xa4990169aeb885a690070ab4fd90972c31994f8"/>
+    <w:bookmarkEnd w:id="265"/>
+    <w:bookmarkStart w:id="267" w:name="Xa4990169aeb885a690070ab4fd90972c31994f8"/>
     <w:p>
       <w:pPr>
         <w:pStyle w:val="Bibliography"/>
@@ -9129,7 +9180,7 @@
       <w:r>
         <w:t xml:space="preserve"> </w:t>
       </w:r>
-      <w:hyperlink r:id="rId264">
+      <w:hyperlink r:id="rId266">
         <w:r>
           <w:rPr>
             <w:rStyle w:val="Hyperlink"/>
@@ -9141,8 +9192,8 @@
         <w:t xml:space="preserve">.</w:t>
       </w:r>
     </w:p>
-    <w:bookmarkEnd w:id="265"/>
-    <w:bookmarkStart w:id="267" w:name="X8ea620419c64d551554c48b7075c9934881930b"/>
+    <w:bookmarkEnd w:id="267"/>
+    <w:bookmarkStart w:id="269" w:name="X8ea620419c64d551554c48b7075c9934881930b"/>
     <w:p>
       <w:pPr>
         <w:pStyle w:val="Bibliography"/>
@@ -9198,7 +9249,7 @@
       <w:r>
         <w:t xml:space="preserve"> </w:t>
       </w:r>
-      <w:hyperlink r:id="rId266">
+      <w:hyperlink r:id="rId268">
         <w:r>
           <w:rPr>
             <w:rStyle w:val="Hyperlink"/>
@@ -9210,8 +9261,8 @@
         <w:t xml:space="preserve">.</w:t>
       </w:r>
     </w:p>
-    <w:bookmarkEnd w:id="267"/>
-    <w:bookmarkStart w:id="269" w:name="ref-Magli_2024"/>
+    <w:bookmarkEnd w:id="269"/>
+    <w:bookmarkStart w:id="271" w:name="ref-Magli_2024"/>
     <w:p>
       <w:pPr>
         <w:pStyle w:val="Bibliography"/>
@@ -9243,7 +9294,7 @@
       <w:r>
         <w:t xml:space="preserve"> </w:t>
       </w:r>
-      <w:hyperlink r:id="rId268">
+      <w:hyperlink r:id="rId270">
         <w:r>
           <w:rPr>
             <w:rStyle w:val="Hyperlink"/>
@@ -9255,8 +9306,8 @@
         <w:t xml:space="preserve">.</w:t>
       </w:r>
     </w:p>
-    <w:bookmarkEnd w:id="269"/>
-    <w:bookmarkStart w:id="271" w:name="ref-Nowell_2024_evidence"/>
+    <w:bookmarkEnd w:id="271"/>
+    <w:bookmarkStart w:id="273" w:name="ref-Nowell_2024_evidence"/>
     <w:p>
       <w:pPr>
         <w:pStyle w:val="Bibliography"/>
@@ -9288,7 +9339,7 @@
       <w:r>
         <w:t xml:space="preserve"> </w:t>
       </w:r>
-      <w:hyperlink r:id="rId270">
+      <w:hyperlink r:id="rId272">
         <w:r>
           <w:rPr>
             <w:rStyle w:val="Hyperlink"/>
@@ -9300,8 +9351,8 @@
         <w:t xml:space="preserve">.</w:t>
       </w:r>
     </w:p>
-    <w:bookmarkEnd w:id="271"/>
-    <w:bookmarkStart w:id="273" w:name="ref-Horiuchi_Takakura_2019"/>
+    <w:bookmarkEnd w:id="273"/>
+    <w:bookmarkStart w:id="275" w:name="ref-Horiuchi_Takakura_2019"/>
     <w:p>
       <w:pPr>
         <w:pStyle w:val="Bibliography"/>
@@ -9360,7 +9411,7 @@
       <w:r>
         <w:t xml:space="preserve"> </w:t>
       </w:r>
-      <w:hyperlink r:id="rId272">
+      <w:hyperlink r:id="rId274">
         <w:r>
           <w:rPr>
             <w:rStyle w:val="Hyperlink"/>
@@ -9372,8 +9423,8 @@
         <w:t xml:space="preserve">.</w:t>
       </w:r>
     </w:p>
-    <w:bookmarkEnd w:id="273"/>
-    <w:bookmarkStart w:id="274" w:name="ref-Rogers_2018"/>
+    <w:bookmarkEnd w:id="275"/>
+    <w:bookmarkStart w:id="276" w:name="ref-Rogers_2018"/>
     <w:p>
       <w:pPr>
         <w:pStyle w:val="Bibliography"/>
@@ -9421,8 +9472,8 @@
         <w:t xml:space="preserve">: An analysis of marine shell ornament distribution. Master’s thesis. University of Victoria, 2018.</w:t>
       </w:r>
     </w:p>
-    <w:bookmarkEnd w:id="274"/>
-    <w:bookmarkStart w:id="276" w:name="X94f875be1b7e5d23641daff5d53857bec24e739"/>
+    <w:bookmarkEnd w:id="276"/>
+    <w:bookmarkStart w:id="278" w:name="X94f875be1b7e5d23641daff5d53857bec24e739"/>
     <w:p>
       <w:pPr>
         <w:pStyle w:val="Bibliography"/>
@@ -9484,7 +9535,7 @@
       <w:r>
         <w:t xml:space="preserve"> </w:t>
       </w:r>
-      <w:hyperlink r:id="rId275">
+      <w:hyperlink r:id="rId277">
         <w:r>
           <w:rPr>
             <w:rStyle w:val="Hyperlink"/>
@@ -9496,8 +9547,8 @@
         <w:t xml:space="preserve">.</w:t>
       </w:r>
     </w:p>
-    <w:bookmarkEnd w:id="276"/>
-    <w:bookmarkStart w:id="278" w:name="ref-Gamble_1982"/>
+    <w:bookmarkEnd w:id="278"/>
+    <w:bookmarkStart w:id="280" w:name="ref-Gamble_1982"/>
     <w:p>
       <w:pPr>
         <w:pStyle w:val="Bibliography"/>
@@ -9529,7 +9580,7 @@
       <w:r>
         <w:t xml:space="preserve"> </w:t>
       </w:r>
-      <w:hyperlink r:id="rId277">
+      <w:hyperlink r:id="rId279">
         <w:r>
           <w:rPr>
             <w:rStyle w:val="Hyperlink"/>
@@ -9541,8 +9592,8 @@
         <w:t xml:space="preserve">.</w:t>
       </w:r>
     </w:p>
-    <w:bookmarkEnd w:id="278"/>
-    <w:bookmarkStart w:id="280" w:name="Xba346573845225b1b1d5ef358e2fea0d893a789"/>
+    <w:bookmarkEnd w:id="280"/>
+    <w:bookmarkStart w:id="282" w:name="Xba346573845225b1b1d5ef358e2fea0d893a789"/>
     <w:p>
       <w:pPr>
         <w:pStyle w:val="Bibliography"/>
@@ -9586,7 +9637,7 @@
       <w:r>
         <w:t xml:space="preserve"> </w:t>
       </w:r>
-      <w:hyperlink r:id="rId279">
+      <w:hyperlink r:id="rId281">
         <w:r>
           <w:rPr>
             <w:rStyle w:val="Hyperlink"/>
@@ -9598,8 +9649,8 @@
         <w:t xml:space="preserve">.</w:t>
       </w:r>
     </w:p>
-    <w:bookmarkEnd w:id="280"/>
-    <w:bookmarkStart w:id="282" w:name="ref-Creanza_Kolodny_Feldman_2017"/>
+    <w:bookmarkEnd w:id="282"/>
+    <w:bookmarkStart w:id="284" w:name="ref-Creanza_Kolodny_Feldman_2017"/>
     <w:p>
       <w:pPr>
         <w:pStyle w:val="Bibliography"/>
@@ -9619,7 +9670,7 @@
       <w:r>
         <w:t xml:space="preserve"> </w:t>
       </w:r>
-      <w:hyperlink r:id="rId281">
+      <w:hyperlink r:id="rId283">
         <w:r>
           <w:rPr>
             <w:rStyle w:val="Hyperlink"/>
@@ -9631,8 +9682,8 @@
         <w:t xml:space="preserve">.</w:t>
       </w:r>
     </w:p>
-    <w:bookmarkEnd w:id="282"/>
-    <w:bookmarkStart w:id="284" w:name="ref-Cullen_1996"/>
+    <w:bookmarkEnd w:id="284"/>
+    <w:bookmarkStart w:id="286" w:name="ref-Cullen_1996"/>
     <w:p>
       <w:pPr>
         <w:pStyle w:val="Bibliography"/>
@@ -9652,7 +9703,7 @@
       <w:r>
         <w:t xml:space="preserve"> </w:t>
       </w:r>
-      <w:hyperlink r:id="rId283">
+      <w:hyperlink r:id="rId285">
         <w:r>
           <w:rPr>
             <w:rStyle w:val="Hyperlink"/>
@@ -9664,8 +9715,8 @@
         <w:t xml:space="preserve">.</w:t>
       </w:r>
     </w:p>
-    <w:bookmarkEnd w:id="284"/>
-    <w:bookmarkStart w:id="286" w:name="ref-Hill_Wood_Baggio_Hurtado_Boyd_2014"/>
+    <w:bookmarkEnd w:id="286"/>
+    <w:bookmarkStart w:id="288" w:name="ref-Hill_Wood_Baggio_Hurtado_Boyd_2014"/>
     <w:p>
       <w:pPr>
         <w:pStyle w:val="Bibliography"/>
@@ -9685,7 +9736,7 @@
       <w:r>
         <w:t xml:space="preserve"> </w:t>
       </w:r>
-      <w:hyperlink r:id="rId285">
+      <w:hyperlink r:id="rId287">
         <w:r>
           <w:rPr>
             <w:rStyle w:val="Hyperlink"/>
@@ -9697,8 +9748,8 @@
         <w:t xml:space="preserve">.</w:t>
       </w:r>
     </w:p>
-    <w:bookmarkEnd w:id="286"/>
-    <w:bookmarkStart w:id="288" w:name="ref-Derex_Boyd_2016"/>
+    <w:bookmarkEnd w:id="288"/>
+    <w:bookmarkStart w:id="290" w:name="ref-Derex_Boyd_2016"/>
     <w:p>
       <w:pPr>
         <w:pStyle w:val="Bibliography"/>
@@ -9718,7 +9769,7 @@
       <w:r>
         <w:t xml:space="preserve"> </w:t>
       </w:r>
-      <w:hyperlink r:id="rId287">
+      <w:hyperlink r:id="rId289">
         <w:r>
           <w:rPr>
             <w:rStyle w:val="Hyperlink"/>
@@ -9730,8 +9781,8 @@
         <w:t xml:space="preserve">.</w:t>
       </w:r>
     </w:p>
-    <w:bookmarkEnd w:id="288"/>
-    <w:bookmarkStart w:id="290" w:name="ref-Gravel-Miguel_Coward_2023"/>
+    <w:bookmarkEnd w:id="290"/>
+    <w:bookmarkStart w:id="292" w:name="ref-Gravel-Miguel_Coward_2023"/>
     <w:p>
       <w:pPr>
         <w:pStyle w:val="Bibliography"/>
@@ -9763,7 +9814,7 @@
       <w:r>
         <w:t xml:space="preserve"> </w:t>
       </w:r>
-      <w:hyperlink r:id="rId289">
+      <w:hyperlink r:id="rId291">
         <w:r>
           <w:rPr>
             <w:rStyle w:val="Hyperlink"/>
@@ -9775,8 +9826,8 @@
         <w:t xml:space="preserve">.</w:t>
       </w:r>
     </w:p>
-    <w:bookmarkEnd w:id="290"/>
-    <w:bookmarkStart w:id="291" w:name="ref-Von_Petzinger_2009"/>
+    <w:bookmarkEnd w:id="292"/>
+    <w:bookmarkStart w:id="293" w:name="ref-Von_Petzinger_2009"/>
     <w:p>
       <w:pPr>
         <w:pStyle w:val="Bibliography"/>
@@ -9812,8 +9863,8 @@
         <w:t xml:space="preserve">parietal art. Master’s thesis. University of Victoria, 2009.</w:t>
       </w:r>
     </w:p>
-    <w:bookmarkEnd w:id="291"/>
-    <w:bookmarkStart w:id="293" w:name="ref-Herskind2023"/>
+    <w:bookmarkEnd w:id="293"/>
+    <w:bookmarkStart w:id="295" w:name="ref-Herskind2023"/>
     <w:p>
       <w:pPr>
         <w:pStyle w:val="Bibliography"/>
@@ -9833,7 +9884,7 @@
       <w:r>
         <w:t xml:space="preserve"> </w:t>
       </w:r>
-      <w:hyperlink r:id="rId292">
+      <w:hyperlink r:id="rId294">
         <w:r>
           <w:rPr>
             <w:rStyle w:val="Hyperlink"/>
@@ -9845,8 +9896,8 @@
         <w:t xml:space="preserve">.</w:t>
       </w:r>
     </w:p>
-    <w:bookmarkEnd w:id="293"/>
-    <w:bookmarkStart w:id="295" w:name="X42e36537dda68556aeacf852410efd6ac3bb1ca"/>
+    <w:bookmarkEnd w:id="295"/>
+    <w:bookmarkStart w:id="297" w:name="X42e36537dda68556aeacf852410efd6ac3bb1ca"/>
     <w:p>
       <w:pPr>
         <w:pStyle w:val="Bibliography"/>
@@ -9866,7 +9917,7 @@
       <w:r>
         <w:t xml:space="preserve"> </w:t>
       </w:r>
-      <w:hyperlink r:id="rId294">
+      <w:hyperlink r:id="rId296">
         <w:r>
           <w:rPr>
             <w:rStyle w:val="Hyperlink"/>
@@ -9878,9 +9929,9 @@
         <w:t xml:space="preserve">.</w:t>
       </w:r>
     </w:p>
-    <w:bookmarkEnd w:id="295"/>
-    <w:bookmarkEnd w:id="296"/>
     <w:bookmarkEnd w:id="297"/>
+    <w:bookmarkEnd w:id="298"/>
+    <w:bookmarkEnd w:id="299"/>
     <w:sectPr>
       <w:footnotePr>
         <w:numRestart w:val="eachSect"/>

</xml_diff>

<commit_message>
minor edits of time series mantel
</commit_message>
<xml_diff>
--- a/paper/paper.docx
+++ b/paper/paper.docx
@@ -345,7 +345,16 @@
         <w:t xml:space="preserve">[11]</w:t>
       </w:r>
       <w:r>
-        <w:t xml:space="preserve">, provide direct evidence of symbolic behavior and connectivity in sign repertoires during this period. We investigated human social organization dynamics implied by the distribution and variation of geometric sign types found on mobile objects in Europe within a two-phase framework (Aur-P1/Aur-P2; Shao et al. 2021).</w:t>
+        <w:t xml:space="preserve">, provide direct evidence of symbolic behavior and connectivity in sign repertoires during this period. We investigated human social organization dynamics implied by the distribution and variation of geometric sign types found on mobile objects in Europe within a two-phase framework [Aur-P1/Aur-P2;</w:t>
+      </w:r>
+      <w:r>
+        <w:t xml:space="preserve"> </w:t>
+      </w:r>
+      <w:r>
+        <w:t xml:space="preserve">[12]</w:t>
+      </w:r>
+      <w:r>
+        <w:t xml:space="preserve">].</w:t>
       </w:r>
     </w:p>
     <w:bookmarkStart w:id="21" w:name="X06869f42bdedda871dbae178d8ab917db5544af"/>
@@ -501,67 +510,120 @@
         <w:t xml:space="preserve"> </w:t>
       </w:r>
       <w:r>
+        <w:t xml:space="preserve">[13]</w:t>
+      </w:r>
+      <w:r>
+        <w:t xml:space="preserve">. Periodization of the Aurignacian is complicated by regional variation with phases starting and ending at different times</w:t>
+      </w:r>
+      <w:r>
+        <w:t xml:space="preserve"> </w:t>
+      </w:r>
+      <w:r>
+        <w:t xml:space="preserve">[14,15]</w:t>
+      </w:r>
+      <w:r>
+        <w:t xml:space="preserve">, and a lack of compositional integrity over time</w:t>
+      </w:r>
+      <w:r>
+        <w:t xml:space="preserve"> </w:t>
+      </w:r>
+      <w:r>
+        <w:t xml:space="preserve">[16]</w:t>
+      </w:r>
+      <w:r>
+        <w:t xml:space="preserve">, with supposed index fossils persisting through multiple phases</w:t>
+      </w:r>
+      <w:r>
+        <w:t xml:space="preserve"> </w:t>
+      </w:r>
+      <w:r>
+        <w:t xml:space="preserve">[17]</w:t>
+      </w:r>
+      <w:r>
+        <w:t xml:space="preserve">. While earlier work on the Aquitaine/Périgord sequences proposed as many as five phases</w:t>
+      </w:r>
+      <w:r>
+        <w:t xml:space="preserve"> </w:t>
+      </w:r>
+      <w:r>
+        <w:t xml:space="preserve">[18]</w:t>
+      </w:r>
+      <w:r>
+        <w:t xml:space="preserve">, recent work generally rejects notions of sharply-bounded, universally-portable cultures separated by neat horizons in favour of heterogeneous representations of diagnostic traits across and within temporal classes of assemblages</w:t>
+      </w:r>
+      <w:r>
+        <w:t xml:space="preserve"> </w:t>
+      </w:r>
+      <w:r>
+        <w:t xml:space="preserve">[19]</w:t>
+      </w:r>
+      <w:r>
+        <w:t xml:space="preserve">. For example,</w:t>
+      </w:r>
+      <w:r>
+        <w:t xml:space="preserve"> </w:t>
+      </w:r>
+      <w:r>
+        <w:t xml:space="preserve">[20]</w:t>
+      </w:r>
+      <w:r>
+        <w:t xml:space="preserve"> </w:t>
+      </w:r>
+      <w:r>
+        <w:t xml:space="preserve">divided the Aurignacian into two main phases, Aur-P1 (Proto/Early, 43–37 ka cal BP), and Aur-P2 (Evolved/Late, 37–32 ka cal BP), noting that the technological and chronological differences between the Proto and Early Aurignacian are difficult to distinguish.</w:t>
+      </w:r>
+      <w:r>
+        <w:t xml:space="preserve"> </w:t>
+      </w:r>
+      <w:r>
+        <w:t xml:space="preserve">[21]</w:t>
+      </w:r>
+      <w:r>
+        <w:t xml:space="preserve"> </w:t>
+      </w:r>
+      <w:r>
+        <w:t xml:space="preserve">used Bayesian modeling methods to estimate the timing of the transition between the Proto and Early Aurignacian, placing the Proto-Aurignacian at 41.5–39.9 ka cal BP, and the early Aurignacian at 39.8–37.8 ka cal BP. They found that the Proto-Aurignacian occurs during the Greenland Interstadials (GI) 9 and 10, periods of climatic amelioration, while the Early Aurignacian began with the Heinrich Stadial, which is characterized by dry and arid conditions, and ends with GI 8.</w:t>
+      </w:r>
+    </w:p>
+    <w:p>
+      <w:pPr>
+        <w:pStyle w:val="BodyText"/>
+      </w:pPr>
+      <w:r>
+        <w:t xml:space="preserve">We adopt the two-phase framework (Aur-P1/Aur-P2) of</w:t>
+      </w:r>
+      <w:r>
+        <w:t xml:space="preserve"> </w:t>
+      </w:r>
+      <w:r>
+        <w:t xml:space="preserve">[20]</w:t>
+      </w:r>
+      <w:r>
+        <w:t xml:space="preserve"> </w:t>
+      </w:r>
+      <w:r>
+        <w:t xml:space="preserve">and</w:t>
+      </w:r>
+      <w:r>
+        <w:t xml:space="preserve"> </w:t>
+      </w:r>
+      <w:r>
         <w:t xml:space="preserve">[12]</w:t>
       </w:r>
       <w:r>
-        <w:t xml:space="preserve">. Periodization of the Aurignacian is complicated by regional variation with phases starting and ending at different times</w:t>
-      </w:r>
-      <w:r>
-        <w:t xml:space="preserve"> </w:t>
-      </w:r>
-      <w:r>
-        <w:t xml:space="preserve">[13,14]</w:t>
-      </w:r>
-      <w:r>
-        <w:t xml:space="preserve">, and a lack of compositional integrity over time</w:t>
-      </w:r>
-      <w:r>
-        <w:t xml:space="preserve"> </w:t>
-      </w:r>
-      <w:r>
-        <w:t xml:space="preserve">[15]</w:t>
-      </w:r>
-      <w:r>
-        <w:t xml:space="preserve">, with supposed index fossils persisting through multiple phases</w:t>
-      </w:r>
-      <w:r>
-        <w:t xml:space="preserve"> </w:t>
-      </w:r>
-      <w:r>
-        <w:t xml:space="preserve">[16]</w:t>
-      </w:r>
-      <w:r>
-        <w:t xml:space="preserve">. While earlier work on the Aquitaine/Périgord sequences proposed as many as five phases</w:t>
-      </w:r>
-      <w:r>
-        <w:t xml:space="preserve"> </w:t>
-      </w:r>
-      <w:r>
-        <w:t xml:space="preserve">[17]</w:t>
-      </w:r>
-      <w:r>
-        <w:t xml:space="preserve">, recent work generally rejects notions of sharply-bounded, universally-portable cultures separated by neat horizons in favour of heterogeneous representations of diagnostic traits across and within temporal classes of assemblages</w:t>
-      </w:r>
-      <w:r>
-        <w:t xml:space="preserve"> </w:t>
-      </w:r>
-      <w:r>
-        <w:t xml:space="preserve">[18]</w:t>
-      </w:r>
-      <w:r>
-        <w:t xml:space="preserve">. For example,</w:t>
-      </w:r>
-      <w:r>
-        <w:t xml:space="preserve"> </w:t>
-      </w:r>
-      <w:r>
-        <w:t xml:space="preserve">[19]</w:t>
-      </w:r>
-      <w:r>
-        <w:t xml:space="preserve"> </w:t>
-      </w:r>
-      <w:r>
-        <w:t xml:space="preserve">divided the Aurignacian into two main phases, Aur-P1 (Proto/Early, 43–37 ka cal BP), and Aur-P2 (Evolved/Late, 37–32 ka cal BP), noting that the technological and chronological differences between the Proto and Early Aurignacian are difficult to distinguish .</w:t>
+        <w:t xml:space="preserve"> </w:t>
+      </w:r>
+      <w:r>
+        <w:t xml:space="preserve">as a first-order chronological scaffold, acknowledging that phases are analytical conveniences rather than discrete cultural entities</w:t>
+      </w:r>
+      <w:r>
+        <w:t xml:space="preserve"> </w:t>
+      </w:r>
+      <w:r>
+        <w:t xml:space="preserve">[16,19]</w:t>
+      </w:r>
+      <w:r>
+        <w:t xml:space="preserve">. The chronological and technological distinctness of the Proto- and Early Aurignacian is difficult to sustain</w:t>
       </w:r>
       <w:r>
         <w:t xml:space="preserve"> </w:t>
@@ -570,10 +632,34 @@
         <w:t xml:space="preserve">[20]</w:t>
       </w:r>
       <w:r>
-        <w:t xml:space="preserve"> </w:t>
-      </w:r>
-      <w:r>
-        <w:t xml:space="preserve">used Bayesian modeling methods to estimate the timing of the transition between the Proto and Early Aurignacian, placing the Proto-Aurignacian at 41.5–39.9 ka cal BP, and the early Aurignacian at 39.8–37.8 ka cal BP. They found that the Proto-Aurignacian occurs during the Greenland Interstadials (GI) 9 and 10, periods of climatic amelioration, while the Early Aurignacian began with the Heinrich Stadial, which is characterized by dry and arid conditions, and ends with GI 8.</w:t>
+        <w:t xml:space="preserve">, and some analyses suggest these represent coexisting facies rather than successive phases</w:t>
+      </w:r>
+      <w:r>
+        <w:t xml:space="preserve"> </w:t>
+      </w:r>
+      <w:r>
+        <w:t xml:space="preserve">[22]</w:t>
+      </w:r>
+      <w:r>
+        <w:t xml:space="preserve">. We therefore pool the Proto- and Early Aurignacian into Aur-P1 (43–37 ka cal BP) and treat the Evolved/Late Aurignacian as Aur-P2 (37–32 ka cal BP), following the two-phase scheme of</w:t>
+      </w:r>
+      <w:r>
+        <w:t xml:space="preserve"> </w:t>
+      </w:r>
+      <w:r>
+        <w:t xml:space="preserve">[12]</w:t>
+      </w:r>
+      <w:r>
+        <w:t xml:space="preserve">. This merger is also chronologically warranted: South-west German sites whose lithic technology is assigned to the Early Aurignacian commonly overlap in calibrated age with Mediterranean assemblages attributed to the Proto-Aurignacian. Thus the Proto/Early boundary functions as a coeval boundary</w:t>
+      </w:r>
+      <w:r>
+        <w:t xml:space="preserve"> </w:t>
+      </w:r>
+      <w:r>
+        <w:t xml:space="preserve">[20,22,e.g. 23]</w:t>
+      </w:r>
+      <w:r>
+        <w:t xml:space="preserve">.</w:t>
       </w:r>
     </w:p>
     <w:p>
@@ -581,101 +667,6 @@
         <w:pStyle w:val="BodyText"/>
       </w:pPr>
       <w:r>
-        <w:t xml:space="preserve">We adopt the two-phase framework (Aur-P1/Aur-P2) of</w:t>
-      </w:r>
-      <w:r>
-        <w:t xml:space="preserve"> </w:t>
-      </w:r>
-      <w:r>
-        <w:t xml:space="preserve">[19]</w:t>
-      </w:r>
-      <w:r>
-        <w:t xml:space="preserve"> </w:t>
-      </w:r>
-      <w:r>
-        <w:t xml:space="preserve">and</w:t>
-      </w:r>
-      <w:r>
-        <w:t xml:space="preserve"> </w:t>
-      </w:r>
-      <w:r>
-        <w:t xml:space="preserve">[21]</w:t>
-      </w:r>
-      <w:r>
-        <w:t xml:space="preserve"> </w:t>
-      </w:r>
-      <w:r>
-        <w:t xml:space="preserve">as a first-order chronological scaffold, acknowledging that phases are analytical conveniences rather than discrete cultural entities</w:t>
-      </w:r>
-      <w:r>
-        <w:t xml:space="preserve"> </w:t>
-      </w:r>
-      <w:r>
-        <w:t xml:space="preserve">[15,18]</w:t>
-      </w:r>
-      <w:r>
-        <w:t xml:space="preserve">. The chronological and technological distinctness of the Proto- and Early Aurignacian is difficult to sustain</w:t>
-      </w:r>
-      <w:r>
-        <w:t xml:space="preserve"> </w:t>
-      </w:r>
-      <w:r>
-        <w:t xml:space="preserve">[19]</w:t>
-      </w:r>
-      <w:r>
-        <w:t xml:space="preserve">, and some analyses suggest these represent coexisting facies rather than successive phases</w:t>
-      </w:r>
-      <w:r>
-        <w:t xml:space="preserve"> </w:t>
-      </w:r>
-      <w:r>
-        <w:t xml:space="preserve">[22]</w:t>
-      </w:r>
-      <w:r>
-        <w:t xml:space="preserve">. We therefore pool the Proto- and Early Aurignacian into Aur-P1 (43–37 ka cal BP) and treat the Evolved/Late Aurignacian as Aur-P2 (37–32 ka cal BP), following the two-phase scheme of</w:t>
-      </w:r>
-      <w:r>
-        <w:t xml:space="preserve"> </w:t>
-      </w:r>
-      <w:r>
-        <w:t xml:space="preserve">[21]</w:t>
-      </w:r>
-      <w:r>
-        <w:t xml:space="preserve">. This merger is also chronologically warranted: South-west German sites whose lithic technology is assigned to the Early Aurignacian commonly overlap in calibrated age with Mediterranean assemblages attributed to the Proto-Aurignacian, so the Proto/Early boundary functions as a coeval boundary rather than a continental succession (e.g.</w:t>
-      </w:r>
-      <w:r>
-        <w:t xml:space="preserve"> </w:t>
-      </w:r>
-      <w:r>
-        <w:t xml:space="preserve">[23]</w:t>
-      </w:r>
-      <w:r>
-        <w:t xml:space="preserve">;</w:t>
-      </w:r>
-      <w:r>
-        <w:t xml:space="preserve"> </w:t>
-      </w:r>
-      <w:r>
-        <w:t xml:space="preserve">[19]</w:t>
-      </w:r>
-      <w:r>
-        <w:t xml:space="preserve">;</w:t>
-      </w:r>
-      <w:r>
-        <w:t xml:space="preserve"> </w:t>
-      </w:r>
-      <w:r>
-        <w:t xml:space="preserve">[22]</w:t>
-      </w:r>
-      <w:r>
-        <w:t xml:space="preserve">).</w:t>
-      </w:r>
-    </w:p>
-    <w:p>
-      <w:pPr>
-        <w:pStyle w:val="BodyText"/>
-      </w:pPr>
-      <w:r>
         <w:t xml:space="preserve">Our phase assignments follow specialist technological attributions from the published literature rather than radiocarbon dates alone, which can conflict with the archaeological content of a layer. Recent reassessments are therefore incorporated directly into our main analysis: Abri Pataud is placed in the Early Aurignacian (Aur-P1) on the basis of its lithic technology</w:t>
       </w:r>
       <w:r>
@@ -718,7 +709,7 @@
         <w:t xml:space="preserve"> </w:t>
       </w:r>
       <w:r>
-        <w:t xml:space="preserve">[13,23,28]</w:t>
+        <w:t xml:space="preserve">[14,23,28]</w:t>
       </w:r>
       <w:r>
         <w:t xml:space="preserve">. Two sites are excluded from the analysis because their assemblages are too mixed to assign to a single phase reliably: Spy</w:t>
@@ -1001,7 +992,7 @@
               <w:t xml:space="preserve"> </w:t>
             </w:r>
             <w:r>
-              <w:t xml:space="preserve">[12,20,21,32]</w:t>
+              <w:t xml:space="preserve">[12,13,21,32]</w:t>
             </w:r>
           </w:p>
           <w:bookmarkEnd w:id="22"/>
@@ -1067,7 +1058,7 @@
         <w:t xml:space="preserve">”</w:t>
       </w:r>
       <w:r>
-        <w:t xml:space="preserve">. To improve the quality of our data we excluded eight sites from the sample: Willendorf (one sign present); Riparo di Fontana Nuova, Muralovka, Shanidar Cave, and Hayonim Cave (extreme geographic distance from the other sites); El Salitre (lacking a reliable chronological context); and Grotte De La Princesse Pauline and Šandalja II (dated much later than the rest of the assemblages). A full accounting of how we assign archaeological sites to Aurignacian phases is presented in our S1</w:t>
+        <w:t xml:space="preserve">. To improve the quality of our data we excluded eight sites from the sample: Willendorf (one sign present); Riparo di Fontana Nuova, Muralovka, Shanidar Cave, and Hayonim Cave (extreme geographic distance from the other sites); El Salitre (lacking a reliable chronological context); and Grotte De La Princesse Pauline and Šandalja II (dated much later than the rest of the assemblages). A full accounting of how we assign archaeological sites to Aurignacian phases is presented in our S2</w:t>
       </w:r>
       <w:r>
         <w:t xml:space="preserve"> </w:t>
@@ -1169,7 +1160,7 @@
               <w:pStyle w:val="ImageCaption"/>
             </w:pPr>
             <w:r>
-              <w:t xml:space="preserve">Figure 1: A: Map of sites in each Aurignacian phase that contain geometric signs on mobile objects. B: Abundance of signs over time, phases indicated by colours. C. Distribution of object count by site, phases indicated by colours. Map data from naturalearthdata.com and</w:t>
+              <w:t xml:space="preserve">Figure 1: A: Map of sites in each Aurignacian phase that contain geometric signs on mobile objects. B: Abundance of signs over time, phases indicated by colours. C: Distribution of object count by site, phases indicated by colours. Map data from naturalearthdata.com and</w:t>
             </w:r>
             <w:r>
               <w:t xml:space="preserve"> </w:t>
@@ -1293,7 +1284,7 @@
         <w:t xml:space="preserve"> </w:t>
       </w:r>
       <w:r>
-        <w:t xml:space="preserve">S9). We used Mantel tests with a Euclidean object abundance distance matrix and a Jaccard dissimilarity matrix of sign types. The test seeks to determine the level of correspondence between the matrices through permutational evaluation of the null distribution</w:t>
+        <w:t xml:space="preserve">S9). We used Mantel tests with a Euclidean object abundance distance matrix and a Jaccard dissimilarity matrix of sign types. The test seeks to determine the level of correspondence between the matrices through permutational evaluation (here 1000 permutations) of the null distribution</w:t>
       </w:r>
       <w:r>
         <w:t xml:space="preserve"> </w:t>
@@ -1302,7 +1293,7 @@
         <w:t xml:space="preserve">[36]</w:t>
       </w:r>
       <w:r>
-        <w:t xml:space="preserve">, (here 1000 permutations), producing a Mantel R statistic and a p-value. The R statistic falls between -1, meaning a strong negative correlation, and 1, meaning a strong positive correlation, while a value of 0 means no correlation. The p-value estimates the probability of obtaining the observed correlation if the null hypothesis of no correlation were true (we use an alpha value of 0.05 for the threshold of statistical significance). The Mantel tests were performed using the vegan package</w:t>
+        <w:t xml:space="preserve">, producing a Mantel R statistic and a p-value. The R statistic falls between -1, meaning a strong negative correlation, and 1, meaning a strong positive correlation, while a value of 0 means no correlation. The p-value estimates the probability of obtaining the observed correlation if the null hypothesis of no correlation were true (we use an alpha value of 0.05 for the threshold of statistical significance). The Mantel tests were performed using the vegan package</w:t>
       </w:r>
       <w:r>
         <w:t xml:space="preserve"> </w:t>
@@ -2036,7 +2027,7 @@
         <w:pStyle w:val="BodyText"/>
       </w:pPr>
       <w:r>
-        <w:t xml:space="preserve">In Aur-P2 the restricted-range group consists of Les Rois, Sirgenstein Cave, La Viña, Mladeč, Gargas, and Vindija Cave, carrying few sign types, while the broad-range group consists of Trou Magrite, Bockstein-Törle, and Hohle Fels, which share a wider repertoire (including hatching and oblique notch, obnotch; Hohle Fels additionally contributes dashline, dot, cross, zigzag, v, and circumspiral). While inferring a two-member structure from the Aur-P1 seriation results seems straightforward, this is less clear for Aur-P2 where the partition rests on only 9 sites.</w:t>
+        <w:t xml:space="preserve">In Aur-P2 the restricted-range group consists of Les Rois, Sirgenstein Cave, La Viña, Mladeč, Gargas, and Vindija Cave, carrying few sign types, while the broad-range group consists of Trou Magrite, Bockstein-Törle, and Hohle Fels, which share a wider repertoire (including hatching and oblique notch, obnotch; Hohle Fels additionally contributes dashline, dot, cross, zigzag, v, and circumspiral). While inferring a two-group structure from the Aur-P1 seriation results seems straightforward, this is less clear for Aur-P2 where the partition rests on only 9 sites.</w:t>
       </w:r>
     </w:p>
     <w:p>
@@ -2059,7 +2050,7 @@
         <w:t xml:space="preserve">”</w:t>
       </w:r>
       <w:r>
-        <w:t xml:space="preserve">. In Aur-P1, mean within-block co-clustering is 0.79 for the restricted-range block and 0.9 for the broader-range block, against 0.26 across the two blocks. The within-block values substantially exceed the across-block value, which is a strong signal that both groups are internally coherent and sharply separated. The strength of this signal is much lower for Aur-P2, where the pattern is 0.57 within the restricted block and 0.83 within the broader block, against 0.37 across the blocks. However the two-group pattern is not the supported by the results of the stochastic block model analysis. A single-block structure is found for both Aur-P1 and Aur-P2 sample, providing no model-based support for a two-group pattern inferred from the seriation (S1</w:t>
+        <w:t xml:space="preserve">. In Aur-P1, mean within-block co-clustering is 0.79 for the restricted-range block and 0.9 for the broader-range block, against 0.26 across the two blocks. The within-block values substantially exceed the across-block value, which is a strong signal that both groups are internally coherent and sharply separated. The strength of this signal is much lower for Aur-P2, where the pattern is 0.57 within the restricted block and 0.83 within the broader block, against 0.37 across the blocks. However the two-group pattern is not supported by the results of the stochastic block model analysis. A single-block structure is found for both the Aur-P1 and Aur-P2 samples, providing no model-based support for a two-group pattern inferred from the seriation (S1</w:t>
       </w:r>
       <w:r>
         <w:t xml:space="preserve"> </w:t>
@@ -2737,7 +2728,7 @@
         <w:t xml:space="preserve"> </w:t>
       </w:r>
       <w:r>
-        <w:t xml:space="preserve">show that each phase initially suggests two main sign-use groups, with sign type frequency and diversity serving as the major dividing factor. However, quantitative investigation of these groups indicates the contrast is a recoverable gradual axis rather than a sharp partition, so this must be taken as a descriptive pattern rather than a robust structure. Group size differed between phases: in Aur-P1 the restricted-range group (9 sites) was slightly smaller than the broad-range group (11 sites), whereas in the much smaller Aur-P2 the restricted-range group (6 sites) exceeded the broad-range group (3 sites). Because of documented mixing at Vogelherd, we test our network models both with and without the site in our S1 item</w:t>
+        <w:t xml:space="preserve">show that each phase initially suggests two main sign-use groups, with sign type frequency and diversity serving as the major dividing factor. However, quantitative investigation of these groups indicates the contrast is a recoverable gradual axis rather than a sharp partition, so this must be taken as a descriptive pattern rather than a robust structure. Group size differed between phases: in Aur-P1 the restricted-range group (9 sites) was slightly smaller than the broad-range group (11 sites), whereas in the much smaller Aur-P2 the restricted-range group (6 sites) exceeded the broad-range group (3 sites). Because of documented mixing at Vogelherd, we test our network models both with and without the site in our S1</w:t>
       </w:r>
       <w:r>
         <w:t xml:space="preserve"> </w:t>
@@ -3313,7 +3304,7 @@
         </w:r>
       </w:hyperlink>
       <w:r>
-        <w:t xml:space="preserve">), and no significant geographic signal was detected in either phase (/Aur-P2: R = -0.299). A permutation test of the difference between these Mantel correlations (D = 0.34, p = 0.153; sites permuted between phases 1,000 times) shows that the isolation-by-distance relationship does not differ significantly between the phases, so the spatial-proximity explanation is not supported by this analysis. This null result reflects limited statistical power at these sample sizes rather than positive evidence that geography is irrelevant, as quantified by bootstrap confidence intervals on the Mantel R (S1</w:t>
+        <w:t xml:space="preserve">), and no significant geographic signal was detected in either phase (Aur-P2: R = -0.299). A permutation test of the difference between these Mantel correlations (D = 0.34, p = 0.153; sites permuted between phases 1,000 times) shows that the isolation-by-distance relationship does not differ significantly between the phases, so the spatial-proximity explanation is not supported by this analysis. This null result reflects limited statistical power at these sample sizes rather than positive evidence that geography is irrelevant, as quantified by bootstrap confidence intervals on the Mantel R (S1</w:t>
       </w:r>
       <w:r>
         <w:t xml:space="preserve"> </w:t>
@@ -3351,7 +3342,7 @@
         <w:t xml:space="preserve">. This was followed by rapid expansion from 43.25–41 ka cal BP, with the maximum extent of early Aurignacian (Aur-P1) settlement being reached around 41 ka cal BP (</w:t>
       </w:r>
       <w:r>
-        <w:t xml:space="preserve">[19]</w:t>
+        <w:t xml:space="preserve">[20]</w:t>
       </w:r>
       <w:r>
         <w:t xml:space="preserve">). Although population growth is the condition under which sign systems typically gain a communicative function, the causal link between demographic expansion and the emergence of geometric signs as a group-membership marker cannot be established from the sign-sharing data alone and should be treated as a contextual correlate rather than a demonstrated driver. Other studies have also found similar associations in other regions and time periods between increases in quantity and diversity of art, and increases in population density</w:t>
@@ -3369,7 +3360,7 @@
         <w:t xml:space="preserve"> </w:t>
       </w:r>
       <w:r>
-        <w:t xml:space="preserve">[19]</w:t>
+        <w:t xml:space="preserve">[20]</w:t>
       </w:r>
       <w:r>
         <w:t xml:space="preserve">, a relatively small number that may partly explain why our networks remain small and sparsely connected across both phases.</w:t>
@@ -3378,7 +3369,7 @@
         <w:t xml:space="preserve"> </w:t>
       </w:r>
       <w:r>
-        <w:t xml:space="preserve">[19]</w:t>
+        <w:t xml:space="preserve">[20]</w:t>
       </w:r>
       <w:r>
         <w:t xml:space="preserve"> </w:t>
@@ -3434,16 +3425,16 @@
         <w:t xml:space="preserve"> </w:t>
       </w:r>
       <w:r>
-        <w:t xml:space="preserve">[20]</w:t>
-      </w:r>
-      <w:r>
-        <w:t xml:space="preserve">, who used eco-cultural niche modeling to show that Heinrich Stadial 4 (HS4) at the very beginning of the Early Aurignacian resulted in an expansion of people into new environmental niches, hypothesised to involve an expansion of social networks both within and between populations. Our finding of no significant changes in networks over time suggest that if</w:t>
-      </w:r>
-      <w:r>
-        <w:t xml:space="preserve"> </w:t>
-      </w:r>
-      <w:r>
-        <w:t xml:space="preserve">[20]</w:t>
+        <w:t xml:space="preserve">[21]</w:t>
+      </w:r>
+      <w:r>
+        <w:t xml:space="preserve">, who used eco-cultural niche modeling to show that Heinrich Stadial 4 (HS4) at the very beginning of the Early Aurignacian resulted in an expansion of people into new environmental niches, hypothesised to involve an expansion of social networks both within and between populations. Our finding of no significant changes in networks over time suggests that if</w:t>
+      </w:r>
+      <w:r>
+        <w:t xml:space="preserve"> </w:t>
+      </w:r>
+      <w:r>
+        <w:t xml:space="preserve">[21]</w:t>
       </w:r>
       <w:r>
         <w:t xml:space="preserve">’s model is accurate, we do not see a signal of it in the geometric sign data. Neither phase shows a significant geographic signal (Aur-P1 Mantel R = 0.046, Aur-P2 Mantel R = -0.299), suggesting that sign sharing was not primarily driven by expansion into new, spatially structured niches. Similarly,</w:t>
@@ -3452,7 +3443,7 @@
         <w:t xml:space="preserve"> </w:t>
       </w:r>
       <w:r>
-        <w:t xml:space="preserve">[21]</w:t>
+        <w:t xml:space="preserve">[12]</w:t>
       </w:r>
       <w:r>
         <w:t xml:space="preserve"> </w:t>
@@ -3650,7 +3641,7 @@
         <w:t xml:space="preserve">[107]</w:t>
       </w:r>
       <w:r>
-        <w:t xml:space="preserve">. Our finding of no statistically significant difference in connectivity metrics accross the two phases suggests that relative interaction levels remained consistent over time, even as populations consolidated into fewer sites. The lack of significant geographic structure in either phase contradicts simple isolation-by-distance models</w:t>
+        <w:t xml:space="preserve">. Our finding of no statistically significant difference in connectivity metrics across the two phases suggests that relative interaction levels remained consistent over time, even as populations consolidated into fewer sites. The lack of significant geographic structure in either phase contradicts simple isolation-by-distance models</w:t>
       </w:r>
       <w:r>
         <w:t xml:space="preserve"> </w:t>
@@ -3667,7 +3658,16 @@
         <w:pStyle w:val="BodyText"/>
       </w:pPr>
       <w:r>
-        <w:t xml:space="preserve">The contrast with personal ornaments is informative.</w:t>
+        <w:t xml:space="preserve">The contrast with personal ornaments, such as the decorated ivory pendant from Stajnia Cave</w:t>
+      </w:r>
+      <w:r>
+        <w:t xml:space="preserve"> </w:t>
+      </w:r>
+      <w:r>
+        <w:t xml:space="preserve">[11]</w:t>
+      </w:r>
+      <w:r>
+        <w:t xml:space="preserve">, is informative.</w:t>
       </w:r>
       <w:r>
         <w:t xml:space="preserve"> </w:t>
@@ -3691,19 +3691,7 @@
         <w:t xml:space="preserve"> </w:t>
       </w:r>
       <w:r>
-        <w:t xml:space="preserve">found similar Gravettian clusters. Our Mantel tests show no significant geographic correlation for geometric signs (Aur-P1: R = 0.046, p = 0.301; Aur-P2: R = -0.299, p = 0.933). This null result does not by itself establish the signs’ function. One speculative possibility is that different material classes encode different identity dimensions, for example, ornaments may signal ethnic affiliation, while geometric signs could serve functions such as notation, calendrical recording, or information storage, but these remain untested hypotheses. The decorated ivory pendant from Stajnia Cave</w:t>
-      </w:r>
-      <w:r>
-        <w:t xml:space="preserve"> </w:t>
-      </w:r>
-      <w:r>
-        <w:t xml:space="preserve">[11]</w:t>
-      </w:r>
-      <w:r>
-        <w:t xml:space="preserve"> </w:t>
-      </w:r>
-      <w:r>
-        <w:t xml:space="preserve">exemplifies the rich personal ornament tradition that contrasts with our geometric sign patterns. This aligns with work by</w:t>
+        <w:t xml:space="preserve">found similar Gravettian clusters. Our Mantel tests show no significant geographic correlation for geometric signs (Aur-P1: R = 0.046, p = 0.301; Aur-P2: R = -0.299, p = 0.933). This null result does not by itself establish the signs’ function. One speculative possibility is that different material classes encode different identity dimensions, for example, ornaments may signal ethnic affiliation, while geometric signs could serve functions such as notation, calendrical recording, or information storage. But these remain untested hypotheses. This aligns with work by</w:t>
       </w:r>
       <w:r>
         <w:t xml:space="preserve"> </w:t>
@@ -3998,7 +3986,7 @@
         <w:t xml:space="preserve">“</w:t>
       </w:r>
       <w:r>
-        <w:t xml:space="preserve">Sensitivity Analysis</w:t>
+        <w:t xml:space="preserve">Sensitivity Analyses</w:t>
       </w:r>
       <w:r>
         <w:t xml:space="preserve">”</w:t>
@@ -4007,7 +3995,7 @@
         <w:t xml:space="preserve"> </w:t>
       </w:r>
       <w:r>
-        <w:t xml:space="preserve">S8 and find that the main structures are generally robust.</w:t>
+        <w:t xml:space="preserve">and find that the main structures are generally robust.</w:t>
       </w:r>
     </w:p>
     <w:p>
@@ -4605,7 +4593,7 @@
       </w:r>
     </w:p>
     <w:bookmarkEnd w:id="83"/>
-    <w:bookmarkStart w:id="85" w:name="ref-Chu_Richter_2020"/>
+    <w:bookmarkStart w:id="85" w:name="X68cdd7ba62fc5dd3e1e9b497937717305f7b9a0"/>
     <w:p>
       <w:pPr>
         <w:pStyle w:val="Bibliography"/>
@@ -4620,6 +4608,51 @@
         <w:t xml:space="preserve">	</w:t>
       </w:r>
       <w:r>
+        <w:t xml:space="preserve">Shao Y, Limberg H, Klein K, Wegener C, Schmidt I, Weniger G-C, et al. Human-existence probability of the</w:t>
+      </w:r>
+      <w:r>
+        <w:t xml:space="preserve"> </w:t>
+      </w:r>
+      <w:r>
+        <w:t xml:space="preserve">Aurignacian</w:t>
+      </w:r>
+      <w:r>
+        <w:t xml:space="preserve"> </w:t>
+      </w:r>
+      <w:r>
+        <w:t xml:space="preserve">techno-complex under extreme climate conditions. Quaternary Science Reviews 2021;263:106995.</w:t>
+      </w:r>
+      <w:r>
+        <w:t xml:space="preserve"> </w:t>
+      </w:r>
+      <w:hyperlink r:id="rId84">
+        <w:r>
+          <w:rPr>
+            <w:rStyle w:val="Hyperlink"/>
+          </w:rPr>
+          <w:t xml:space="preserve">https://doi.org/10.1016/j.quascirev.2021.106995</w:t>
+        </w:r>
+      </w:hyperlink>
+      <w:r>
+        <w:t xml:space="preserve">.</w:t>
+      </w:r>
+    </w:p>
+    <w:bookmarkEnd w:id="85"/>
+    <w:bookmarkStart w:id="87" w:name="ref-Chu_Richter_2020"/>
+    <w:p>
+      <w:pPr>
+        <w:pStyle w:val="Bibliography"/>
+      </w:pPr>
+      <w:r>
+        <w:t xml:space="preserve">[13]</w:t>
+      </w:r>
+      <w:r>
+        <w:t xml:space="preserve"> </w:t>
+      </w:r>
+      <w:r>
+        <w:t xml:space="preserve">	</w:t>
+      </w:r>
+      <w:r>
         <w:t xml:space="preserve">Chu W, Richter J.</w:t>
       </w:r>
       <w:r>
@@ -4637,7 +4670,7 @@
       <w:r>
         <w:t xml:space="preserve"> </w:t>
       </w:r>
-      <w:hyperlink r:id="rId84">
+      <w:hyperlink r:id="rId86">
         <w:r>
           <w:rPr>
             <w:rStyle w:val="Hyperlink"/>
@@ -4649,14 +4682,14 @@
         <w:t xml:space="preserve">.</w:t>
       </w:r>
     </w:p>
-    <w:bookmarkEnd w:id="85"/>
-    <w:bookmarkStart w:id="87" w:name="ref-Dinnis_et_al_2019"/>
-    <w:p>
-      <w:pPr>
-        <w:pStyle w:val="Bibliography"/>
-      </w:pPr>
-      <w:r>
-        <w:t xml:space="preserve">[13]</w:t>
+    <w:bookmarkEnd w:id="87"/>
+    <w:bookmarkStart w:id="89" w:name="ref-Dinnis_et_al_2019"/>
+    <w:p>
+      <w:pPr>
+        <w:pStyle w:val="Bibliography"/>
+      </w:pPr>
+      <w:r>
+        <w:t xml:space="preserve">[14]</w:t>
       </w:r>
       <w:r>
         <w:t xml:space="preserve"> </w:t>
@@ -4694,7 +4727,7 @@
       <w:r>
         <w:t xml:space="preserve"> </w:t>
       </w:r>
-      <w:hyperlink r:id="rId86">
+      <w:hyperlink r:id="rId88">
         <w:r>
           <w:rPr>
             <w:rStyle w:val="Hyperlink"/>
@@ -4706,14 +4739,14 @@
         <w:t xml:space="preserve">.</w:t>
       </w:r>
     </w:p>
-    <w:bookmarkEnd w:id="87"/>
-    <w:bookmarkStart w:id="89" w:name="ref-falcucci2020breaking"/>
-    <w:p>
-      <w:pPr>
-        <w:pStyle w:val="Bibliography"/>
-      </w:pPr>
-      <w:r>
-        <w:t xml:space="preserve">[14]</w:t>
+    <w:bookmarkEnd w:id="89"/>
+    <w:bookmarkStart w:id="91" w:name="ref-falcucci2020breaking"/>
+    <w:p>
+      <w:pPr>
+        <w:pStyle w:val="Bibliography"/>
+      </w:pPr>
+      <w:r>
+        <w:t xml:space="preserve">[15]</w:t>
       </w:r>
       <w:r>
         <w:t xml:space="preserve"> </w:t>
@@ -4760,7 +4793,7 @@
       <w:r>
         <w:t xml:space="preserve"> </w:t>
       </w:r>
-      <w:hyperlink r:id="rId88">
+      <w:hyperlink r:id="rId90">
         <w:r>
           <w:rPr>
             <w:rStyle w:val="Hyperlink"/>
@@ -4772,14 +4805,14 @@
         <w:t xml:space="preserve">.</w:t>
       </w:r>
     </w:p>
-    <w:bookmarkEnd w:id="89"/>
-    <w:bookmarkStart w:id="90" w:name="ref-clark200917"/>
-    <w:p>
-      <w:pPr>
-        <w:pStyle w:val="Bibliography"/>
-      </w:pPr>
-      <w:r>
-        <w:t xml:space="preserve">[15]</w:t>
+    <w:bookmarkEnd w:id="91"/>
+    <w:bookmarkStart w:id="92" w:name="ref-clark200917"/>
+    <w:p>
+      <w:pPr>
+        <w:pStyle w:val="Bibliography"/>
+      </w:pPr>
+      <w:r>
+        <w:t xml:space="preserve">[16]</w:t>
       </w:r>
       <w:r>
         <w:t xml:space="preserve"> </w:t>
@@ -4821,14 +4854,14 @@
         <w:t xml:space="preserve">: Turning points and new directions, Oxford: Oxbow Books; 2009, p. 323–38.</w:t>
       </w:r>
     </w:p>
-    <w:bookmarkEnd w:id="90"/>
-    <w:bookmarkStart w:id="92" w:name="ref-zilhao2024data"/>
-    <w:p>
-      <w:pPr>
-        <w:pStyle w:val="Bibliography"/>
-      </w:pPr>
-      <w:r>
-        <w:t xml:space="preserve">[16]</w:t>
+    <w:bookmarkEnd w:id="92"/>
+    <w:bookmarkStart w:id="94" w:name="ref-zilhao2024data"/>
+    <w:p>
+      <w:pPr>
+        <w:pStyle w:val="Bibliography"/>
+      </w:pPr>
+      <w:r>
+        <w:t xml:space="preserve">[17]</w:t>
       </w:r>
       <w:r>
         <w:t xml:space="preserve"> </w:t>
@@ -4866,7 +4899,7 @@
       <w:r>
         <w:t xml:space="preserve"> </w:t>
       </w:r>
-      <w:hyperlink r:id="rId91">
+      <w:hyperlink r:id="rId93">
         <w:r>
           <w:rPr>
             <w:rStyle w:val="Hyperlink"/>
@@ -4878,14 +4911,14 @@
         <w:t xml:space="preserve">.</w:t>
       </w:r>
     </w:p>
-    <w:bookmarkEnd w:id="92"/>
-    <w:bookmarkStart w:id="93" w:name="ref-bordes2006news"/>
-    <w:p>
-      <w:pPr>
-        <w:pStyle w:val="Bibliography"/>
-      </w:pPr>
-      <w:r>
-        <w:t xml:space="preserve">[17]</w:t>
+    <w:bookmarkEnd w:id="94"/>
+    <w:bookmarkStart w:id="95" w:name="ref-bordes2006news"/>
+    <w:p>
+      <w:pPr>
+        <w:pStyle w:val="Bibliography"/>
+      </w:pPr>
+      <w:r>
+        <w:t xml:space="preserve">[18]</w:t>
       </w:r>
       <w:r>
         <w:t xml:space="preserve"> </w:t>
@@ -4948,14 +4981,14 @@
         <w:t xml:space="preserve">s de Arqueologia Lisbon; 2006, p. 147–71.</w:t>
       </w:r>
     </w:p>
-    <w:bookmarkEnd w:id="93"/>
-    <w:bookmarkStart w:id="95" w:name="ref-canessa2026unpacking"/>
-    <w:p>
-      <w:pPr>
-        <w:pStyle w:val="Bibliography"/>
-      </w:pPr>
-      <w:r>
-        <w:t xml:space="preserve">[18]</w:t>
+    <w:bookmarkEnd w:id="95"/>
+    <w:bookmarkStart w:id="97" w:name="ref-canessa2026unpacking"/>
+    <w:p>
+      <w:pPr>
+        <w:pStyle w:val="Bibliography"/>
+      </w:pPr>
+      <w:r>
+        <w:t xml:space="preserve">[19]</w:t>
       </w:r>
       <w:r>
         <w:t xml:space="preserve"> </w:t>
@@ -4993,7 +5026,7 @@
       <w:r>
         <w:t xml:space="preserve"> </w:t>
       </w:r>
-      <w:hyperlink r:id="rId94">
+      <w:hyperlink r:id="rId96">
         <w:r>
           <w:rPr>
             <w:rStyle w:val="Hyperlink"/>
@@ -5005,14 +5038,14 @@
         <w:t xml:space="preserve">.</w:t>
       </w:r>
     </w:p>
-    <w:bookmarkEnd w:id="95"/>
-    <w:bookmarkStart w:id="97" w:name="ref-Schmidt_Zimmermann_2019"/>
-    <w:p>
-      <w:pPr>
-        <w:pStyle w:val="Bibliography"/>
-      </w:pPr>
-      <w:r>
-        <w:t xml:space="preserve">[19]</w:t>
+    <w:bookmarkEnd w:id="97"/>
+    <w:bookmarkStart w:id="99" w:name="ref-Schmidt_Zimmermann_2019"/>
+    <w:p>
+      <w:pPr>
+        <w:pStyle w:val="Bibliography"/>
+      </w:pPr>
+      <w:r>
+        <w:t xml:space="preserve">[20]</w:t>
       </w:r>
       <w:r>
         <w:t xml:space="preserve"> </w:t>
@@ -5044,7 +5077,7 @@
       <w:r>
         <w:t xml:space="preserve"> </w:t>
       </w:r>
-      <w:hyperlink r:id="rId96">
+      <w:hyperlink r:id="rId98">
         <w:r>
           <w:rPr>
             <w:rStyle w:val="Hyperlink"/>
@@ -5056,14 +5089,14 @@
         <w:t xml:space="preserve">.</w:t>
       </w:r>
     </w:p>
-    <w:bookmarkEnd w:id="97"/>
-    <w:bookmarkStart w:id="99" w:name="ref-Banks_dErrico_Zilhao_2013"/>
-    <w:p>
-      <w:pPr>
-        <w:pStyle w:val="Bibliography"/>
-      </w:pPr>
-      <w:r>
-        <w:t xml:space="preserve">[20]</w:t>
+    <w:bookmarkEnd w:id="99"/>
+    <w:bookmarkStart w:id="101" w:name="ref-Banks_dErrico_Zilhao_2013"/>
+    <w:p>
+      <w:pPr>
+        <w:pStyle w:val="Bibliography"/>
+      </w:pPr>
+      <w:r>
+        <w:t xml:space="preserve">[21]</w:t>
       </w:r>
       <w:r>
         <w:t xml:space="preserve"> </w:t>
@@ -5107,57 +5140,12 @@
       <w:r>
         <w:t xml:space="preserve"> </w:t>
       </w:r>
-      <w:hyperlink r:id="rId98">
+      <w:hyperlink r:id="rId100">
         <w:r>
           <w:rPr>
             <w:rStyle w:val="Hyperlink"/>
           </w:rPr>
           <w:t xml:space="preserve">https://doi.org/10.1016/j.jhevol.2012.10.001</w:t>
-        </w:r>
-      </w:hyperlink>
-      <w:r>
-        <w:t xml:space="preserve">.</w:t>
-      </w:r>
-    </w:p>
-    <w:bookmarkEnd w:id="99"/>
-    <w:bookmarkStart w:id="101" w:name="X68cdd7ba62fc5dd3e1e9b497937717305f7b9a0"/>
-    <w:p>
-      <w:pPr>
-        <w:pStyle w:val="Bibliography"/>
-      </w:pPr>
-      <w:r>
-        <w:t xml:space="preserve">[21]</w:t>
-      </w:r>
-      <w:r>
-        <w:t xml:space="preserve"> </w:t>
-      </w:r>
-      <w:r>
-        <w:t xml:space="preserve">	</w:t>
-      </w:r>
-      <w:r>
-        <w:t xml:space="preserve">Shao Y, Limberg H, Klein K, Wegener C, Schmidt I, Weniger G-C, et al. Human-existence probability of the</w:t>
-      </w:r>
-      <w:r>
-        <w:t xml:space="preserve"> </w:t>
-      </w:r>
-      <w:r>
-        <w:t xml:space="preserve">Aurignacian</w:t>
-      </w:r>
-      <w:r>
-        <w:t xml:space="preserve"> </w:t>
-      </w:r>
-      <w:r>
-        <w:t xml:space="preserve">techno-complex under extreme climate conditions. Quaternary Science Reviews 2021;263:106995.</w:t>
-      </w:r>
-      <w:r>
-        <w:t xml:space="preserve"> </w:t>
-      </w:r>
-      <w:hyperlink r:id="rId100">
-        <w:r>
-          <w:rPr>
-            <w:rStyle w:val="Hyperlink"/>
-          </w:rPr>
-          <w:t xml:space="preserve">https://doi.org/10.1016/j.quascirev.2021.106995</w:t>
         </w:r>
       </w:hyperlink>
       <w:r>

</xml_diff>

<commit_message>
editing abstract and conclusion
</commit_message>
<xml_diff>
--- a/paper/paper.docx
+++ b/paper/paper.docx
@@ -179,7 +179,7 @@
         <w:t xml:space="preserve"> </w:t>
       </w:r>
       <w:r>
-        <w:t xml:space="preserve">26,</w:t>
+        <w:t xml:space="preserve">31,</w:t>
       </w:r>
       <w:r>
         <w:t xml:space="preserve"> </w:t>
@@ -269,7 +269,7 @@
         <w:t xml:space="preserve"> </w:t>
       </w:r>
       <w:r>
-        <w:t xml:space="preserve">into Western Eurasia, yet the evolution of social organization during this transition remains debated. Here we investigate social dynamics through the analysis of geometric signs on mobile objects within a two-phase framework that respects specialist technological attributions in site assignment. Using seriation and network analysis, we examine whether sign distribution reflects sign-use grouping within each phase, and whether the sign-sharing network differs between the Early and Late Aurignacian. Within the early phase (Aur-P1; 20 sites) we propose and evaluate a two-group structure of restricted versus broad geometric-sign repertoires. The small late phase (Aur-P2; 9 sites) shows a weaker, less resolved structure. The early phase supports a larger network centred on key sites, but formal permutation tests indicate that the phases do not differ significantly in edge density, modularity, mean betweenness, or component count, so the observed differences in connectivity track the larger size of the early phase rather than a statistically distinguishable community structure. Mantel tests did not detect a significant correlation between geographic distance and sign distribution in either phase, and the isolation-by-distance relationship does not differ between them, although this null result should be interpreted cautiously given the small sample sizes. These results indicate that the restricted/broad separation is a descriptive pattern evident only in the early phase of Aurignacian symbolic culture, however an object-level sensitivity analysis shows this pattern is partly confounded with sampling effort for the smallest sites. The absence of a significant geographic correlation is consistent with this interpretation but does not establish it, and the connectivity dynamics of the two phases should be compared net of network size rather than through a simple densest-hub narrative.</w:t>
+        <w:t xml:space="preserve">into Western Eurasia, yet the evolution of social organization during this transition remains debated. Here we investigate social dynamics through the analysis of geometric signs on mobile objects within a two-phase framework based on specialist technological attributions in site assignment. Using seriation and network analyses, we examine patterns of sign production in each phase, and investigate how the sign-sharing network differs between the Early and Late Aurignacian. Within the early phase (Aur-P1; 20 sites) we infer and evaluate a two-group structure of restricted versus broad geometric-sign repertoires. However, stochastic block modelling fails to confirm this two-group structure (single-block for both phases), and the richness gap between groups is largely explained by sampling effort. The early phase supports a larger network centred on key sites, but permutation tests indicate that the phases do not differ significantly in edge density, modularity, mean betweenness, or component count, so the observed differences in connectivity track the larger size of the early phase, not a statistically distinguishable community structure. The late phase (Aur-P2; 9 sites) shows a weaker, less resolved structure. Mantel tests did not detect a significant correlation between geographic distance and sign distribution in either phase, and the isolation-by-distance relationship does not differ between them, but bootstrap confidence intervals indicate these tests are underpowered at these sample sizes. Geometric signs do not show the geographically distinct clusters found in personal ornaments; their function (notation, calendrical, identity) remains unresolved.</w:t>
       </w:r>
     </w:p>
     <w:p>
@@ -3836,25 +3836,70 @@
         <w:t xml:space="preserve">[2,75,119–123]</w:t>
       </w:r>
       <w:r>
-        <w:t xml:space="preserve">. Within a two-phase (Aur-P1/Aur-P2) framework grounded in specialist technological attributions, we infer a restricted/broad two-group structure in geometric-sign use that is partially supported by bootstrap resampling (but not by stochastic block modelling), and that is not explained by geographic distance. The two phases do not differ significantly in any tested network statistic (edge density, modularity, mean betweenness, or component count), and neither phase shows a significant isolation-by-distance signal; the Mantel relationship does not differ between phases. These null results should be read as a lack of evidence rather than evidence of absence, given the limited power of the Mantel test at these sample sizes (S1</w:t>
-      </w:r>
-      <w:r>
-        <w:t xml:space="preserve"> </w:t>
-      </w:r>
-      <w:r>
-        <w:t xml:space="preserve">“</w:t>
-      </w:r>
-      <w:r>
-        <w:t xml:space="preserve">Sensitivity Analyses</w:t>
-      </w:r>
-      <w:r>
-        <w:t xml:space="preserve">”</w:t>
-      </w:r>
-      <w:r>
-        <w:t xml:space="preserve"> </w:t>
-      </w:r>
-      <w:r>
-        <w:t xml:space="preserve">S5.11). These results shift the interpretation of Aurignacian sign distribution away from a simple densest-network narrative toward a comparative account of how the two phases are structured and connected. We attempted to rectify the low temporal resolution that tends to affect network analysis results when analyzing older, more time-averaged data sets</w:t>
+        <w:t xml:space="preserve">. Our most robust finding is that the geometric sign-type pool contracts from Aur-P1 (26 types) to Aur-P2 (15 types), consistent with cultural drift in small populations (1500 individuals;</w:t>
+      </w:r>
+      <w:r>
+        <w:t xml:space="preserve"> </w:t>
+      </w:r>
+      <w:r>
+        <w:t xml:space="preserve">[20]</w:t>
+      </w:r>
+      <w:r>
+        <w:t xml:space="preserve">). Permutation tests (n = 10,000) show no significant difference between phases in any size-adjusted network statistic — edge density (p = 0.44), modularity (p = 0.302), mean betweenness (p = 0.622), or component count (p = 0.515) — so the Aur-P1–Aur-P2 contrast is one of network scale, not community structure.</w:t>
+      </w:r>
+    </w:p>
+    <w:p>
+      <w:pPr>
+        <w:pStyle w:val="BodyText"/>
+      </w:pPr>
+      <w:r>
+        <w:t xml:space="preserve">A restricted/broad repertoire axis is visually evident in seriation and supported by bootstrap co-clustering (Aur-P1: within-block 0.79/0.9 vs. across-block 0.26; Aur-P2: 0.57/0.83 vs. 0.37). However, stochastic block models reject a two-group partition for both phases (S6.3). Cross-validation (leave-one-out, object-half holdout, gradient PerMANOVA) recovers the axis, yet the most conservative test (re-deriving the optimal split under permutation) does not reach significance. Critically, a negative-binomial model with object-count offset finds no group effect on sign-type richness (rate ratio 0.72, p = 0.292; S9), so the raw richness gap is largely a sampling-effort artifact. The restricted/broad division should be read only as a descriptive gradient whose independence from sampling effort is not demonstrated for sites with small numbers of signs.</w:t>
+      </w:r>
+    </w:p>
+    <w:p>
+      <w:pPr>
+        <w:pStyle w:val="BodyText"/>
+      </w:pPr>
+      <w:r>
+        <w:t xml:space="preserve">No significant isolation-by-distance signal is detected in either phase (Mantel R = 0.046, p = 0.301; R = -0.299, p = 0.933), but bootstrap confidence intervals (S5.11) show the tests are underpowered at n = 20 and 9 sites — these are null results reflecting limited power, not evidence of geographic irrelevance. Geometric signs do not exhibit the geographically distinct clusters reported for personal ornaments</w:t>
+      </w:r>
+      <w:r>
+        <w:t xml:space="preserve"> </w:t>
+      </w:r>
+      <w:r>
+        <w:t xml:space="preserve">[3,6]</w:t>
+      </w:r>
+      <w:r>
+        <w:t xml:space="preserve">; whether they encode different identity dimensions (notation, calendrical recording, information storage) remains speculative and untested</w:t>
+      </w:r>
+      <w:r>
+        <w:t xml:space="preserve"> </w:t>
+      </w:r>
+      <w:r>
+        <w:t xml:space="preserve">[109–114]</w:t>
+      </w:r>
+      <w:r>
+        <w:t xml:space="preserve">. Our findings are consistent with the conclusions of</w:t>
+      </w:r>
+      <w:r>
+        <w:t xml:space="preserve"> </w:t>
+      </w:r>
+      <w:r>
+        <w:t xml:space="preserve">[100]</w:t>
+      </w:r>
+      <w:r>
+        <w:t xml:space="preserve"> </w:t>
+      </w:r>
+      <w:r>
+        <w:t xml:space="preserve">that cultural identity by-descent with modification is a likely explanation for the distribution of Aurignacian ornaments.</w:t>
+      </w:r>
+    </w:p>
+    <w:p>
+      <w:pPr>
+        <w:pStyle w:val="BodyText"/>
+      </w:pPr>
+      <w:r>
+        <w:t xml:space="preserve">Our study has four important limitations. First is the potential ambiguity that arises with some of the sign types. While</w:t>
       </w:r>
       <w:r>
         <w:t xml:space="preserve"> </w:t>
@@ -3866,54 +3911,7 @@
         <w:t xml:space="preserve"> </w:t>
       </w:r>
       <w:r>
-        <w:t xml:space="preserve">by working with two internally coherent phases. Additionally, by comparing the phases rather than assuming a single trajectory, we are able to see social networks as fluid and dynamic, rather than static and bounded</w:t>
-      </w:r>
-      <w:r>
-        <w:t xml:space="preserve"> </w:t>
-      </w:r>
-      <w:r>
-        <w:t xml:space="preserve">[81]</w:t>
-      </w:r>
-      <w:r>
-        <w:t xml:space="preserve">. Our results do not support the conclusions drawn in</w:t>
-      </w:r>
-      <w:r>
-        <w:t xml:space="preserve"> </w:t>
-      </w:r>
-      <w:r>
-        <w:t xml:space="preserve">[6]</w:t>
-      </w:r>
-      <w:r>
-        <w:t xml:space="preserve">, where Aurignacian artwork is found to be a symbolic marker of structured ethnic identity, but do support</w:t>
-      </w:r>
-      <w:r>
-        <w:t xml:space="preserve"> </w:t>
-      </w:r>
-      <w:r>
-        <w:t xml:space="preserve">[100]</w:t>
-      </w:r>
-      <w:r>
-        <w:t xml:space="preserve">, which utilizes the same data as</w:t>
-      </w:r>
-      <w:r>
-        <w:t xml:space="preserve"> </w:t>
-      </w:r>
-      <w:r>
-        <w:t xml:space="preserve">[6]</w:t>
-      </w:r>
-      <w:r>
-        <w:t xml:space="preserve"> </w:t>
-      </w:r>
-      <w:r>
-        <w:t xml:space="preserve">to conclude that cultural identity by-descent with modification is a more likely explanation for the distribution of Aurignacian ornaments.</w:t>
-      </w:r>
-    </w:p>
-    <w:p>
-      <w:pPr>
-        <w:pStyle w:val="BodyText"/>
-      </w:pPr>
-      <w:r>
-        <w:t xml:space="preserve">Our study has four important limitations. First is the potential ambiguity that arises with some of the sign types. While</w:t>
+        <w:t xml:space="preserve">argues in favor of Aurignacian geometric signs as symbolic expression, potential ambiguity still remains over whether function is consistent across all sign type occurrences, particularly in regards to the simpler sign types composed from fewer elements. We included the more ambiguous sign types because similar sign occurrence may still serve as evidence of connectivity in sign repertoires regardless of function, even if it is random copying</w:t>
       </w:r>
       <w:r>
         <w:t xml:space="preserve"> </w:t>
@@ -3922,25 +3920,13 @@
         <w:t xml:space="preserve">[125]</w:t>
       </w:r>
       <w:r>
-        <w:t xml:space="preserve"> </w:t>
-      </w:r>
-      <w:r>
-        <w:t xml:space="preserve">argues in favor of Aurignacian geometric signs as symbolic expression, potential ambiguity still remains over whether function is consistent across all sign type occurrences, particularly in regards to the simpler sign types composed from fewer elements. We included the more ambiguous sign types because similar sign occurrence may still serve as evidence of connectivity in sign repertoires regardless of function, even if it is random copying</w:t>
+        <w:t xml:space="preserve">, and additionally, greater quantities of included sign types serve to establish stronger connections</w:t>
       </w:r>
       <w:r>
         <w:t xml:space="preserve"> </w:t>
       </w:r>
       <w:r>
         <w:t xml:space="preserve">[126]</w:t>
-      </w:r>
-      <w:r>
-        <w:t xml:space="preserve">, and additionally, greater quantities of included sign types serve to establish stronger connections</w:t>
-      </w:r>
-      <w:r>
-        <w:t xml:space="preserve"> </w:t>
-      </w:r>
-      <w:r>
-        <w:t xml:space="preserve">[124]</w:t>
       </w:r>
       <w:r>
         <w:t xml:space="preserve">. This ambiguity may be addressed in the future through the usage of the data recently released in SignBase 2.0 covering sites in Germany, which contains more detailed information on the specific order and patterns in which signs occurred on individual objects</w:t>
@@ -10031,7 +10017,7 @@
       </w:r>
     </w:p>
     <w:bookmarkEnd w:id="293"/>
-    <w:bookmarkStart w:id="295" w:name="ref-Gravel-Miguel_Coward_2023"/>
+    <w:bookmarkStart w:id="294" w:name="ref-Von_Petzinger_2009"/>
     <w:p>
       <w:pPr>
         <w:pStyle w:val="Bibliography"/>
@@ -10046,6 +10032,76 @@
         <w:t xml:space="preserve">	</w:t>
       </w:r>
       <w:r>
+        <w:t xml:space="preserve">Von Petzinger G. Making the abstract concrete: The place of geometric signs in</w:t>
+      </w:r>
+      <w:r>
+        <w:t xml:space="preserve"> </w:t>
+      </w:r>
+      <w:r>
+        <w:t xml:space="preserve">French</w:t>
+      </w:r>
+      <w:r>
+        <w:t xml:space="preserve"> </w:t>
+      </w:r>
+      <w:r>
+        <w:t xml:space="preserve">Upper Paleolithic</w:t>
+      </w:r>
+      <w:r>
+        <w:t xml:space="preserve"> </w:t>
+      </w:r>
+      <w:r>
+        <w:t xml:space="preserve">parietal art. Master’s thesis. University of Victoria, 2009.</w:t>
+      </w:r>
+    </w:p>
+    <w:bookmarkEnd w:id="294"/>
+    <w:bookmarkStart w:id="296" w:name="ref-Herskind2023"/>
+    <w:p>
+      <w:pPr>
+        <w:pStyle w:val="Bibliography"/>
+      </w:pPr>
+      <w:r>
+        <w:t xml:space="preserve">[125]</w:t>
+      </w:r>
+      <w:r>
+        <w:t xml:space="preserve"> </w:t>
+      </w:r>
+      <w:r>
+        <w:t xml:space="preserve">	</w:t>
+      </w:r>
+      <w:r>
+        <w:t xml:space="preserve">Herskind LLP. A case for idle graffiti: Challenging the semiotic resurgence within prehistoric art research. Hunter Gatherer Research 2023;9:59–93.</w:t>
+      </w:r>
+      <w:r>
+        <w:t xml:space="preserve"> </w:t>
+      </w:r>
+      <w:hyperlink r:id="rId295">
+        <w:r>
+          <w:rPr>
+            <w:rStyle w:val="Hyperlink"/>
+          </w:rPr>
+          <w:t xml:space="preserve">https://doi.org/10.3828/hgr.2023.12</w:t>
+        </w:r>
+      </w:hyperlink>
+      <w:r>
+        <w:t xml:space="preserve">.</w:t>
+      </w:r>
+    </w:p>
+    <w:bookmarkEnd w:id="296"/>
+    <w:bookmarkStart w:id="298" w:name="ref-Gravel-Miguel_Coward_2023"/>
+    <w:p>
+      <w:pPr>
+        <w:pStyle w:val="Bibliography"/>
+      </w:pPr>
+      <w:r>
+        <w:t xml:space="preserve">[126]</w:t>
+      </w:r>
+      <w:r>
+        <w:t xml:space="preserve"> </w:t>
+      </w:r>
+      <w:r>
+        <w:t xml:space="preserve">	</w:t>
+      </w:r>
+      <w:r>
         <w:t xml:space="preserve">Gravel-Miguel C, Coward F.</w:t>
       </w:r>
       <w:r>
@@ -10063,82 +10119,12 @@
       <w:r>
         <w:t xml:space="preserve"> </w:t>
       </w:r>
-      <w:hyperlink r:id="rId294">
+      <w:hyperlink r:id="rId297">
         <w:r>
           <w:rPr>
             <w:rStyle w:val="Hyperlink"/>
           </w:rPr>
           <w:t xml:space="preserve">https://doi.org/10.1093/oxfordhb/9780198854265.013.31</w:t>
-        </w:r>
-      </w:hyperlink>
-      <w:r>
-        <w:t xml:space="preserve">.</w:t>
-      </w:r>
-    </w:p>
-    <w:bookmarkEnd w:id="295"/>
-    <w:bookmarkStart w:id="296" w:name="ref-Von_Petzinger_2009"/>
-    <w:p>
-      <w:pPr>
-        <w:pStyle w:val="Bibliography"/>
-      </w:pPr>
-      <w:r>
-        <w:t xml:space="preserve">[125]</w:t>
-      </w:r>
-      <w:r>
-        <w:t xml:space="preserve"> </w:t>
-      </w:r>
-      <w:r>
-        <w:t xml:space="preserve">	</w:t>
-      </w:r>
-      <w:r>
-        <w:t xml:space="preserve">Von Petzinger G. Making the abstract concrete: The place of geometric signs in</w:t>
-      </w:r>
-      <w:r>
-        <w:t xml:space="preserve"> </w:t>
-      </w:r>
-      <w:r>
-        <w:t xml:space="preserve">French</w:t>
-      </w:r>
-      <w:r>
-        <w:t xml:space="preserve"> </w:t>
-      </w:r>
-      <w:r>
-        <w:t xml:space="preserve">Upper Paleolithic</w:t>
-      </w:r>
-      <w:r>
-        <w:t xml:space="preserve"> </w:t>
-      </w:r>
-      <w:r>
-        <w:t xml:space="preserve">parietal art. Master’s thesis. University of Victoria, 2009.</w:t>
-      </w:r>
-    </w:p>
-    <w:bookmarkEnd w:id="296"/>
-    <w:bookmarkStart w:id="298" w:name="ref-Herskind2023"/>
-    <w:p>
-      <w:pPr>
-        <w:pStyle w:val="Bibliography"/>
-      </w:pPr>
-      <w:r>
-        <w:t xml:space="preserve">[126]</w:t>
-      </w:r>
-      <w:r>
-        <w:t xml:space="preserve"> </w:t>
-      </w:r>
-      <w:r>
-        <w:t xml:space="preserve">	</w:t>
-      </w:r>
-      <w:r>
-        <w:t xml:space="preserve">Herskind LLP. A case for idle graffiti: Challenging the semiotic resurgence within prehistoric art research. Hunter Gatherer Research 2023;9:59–93.</w:t>
-      </w:r>
-      <w:r>
-        <w:t xml:space="preserve"> </w:t>
-      </w:r>
-      <w:hyperlink r:id="rId297">
-        <w:r>
-          <w:rPr>
-            <w:rStyle w:val="Hyperlink"/>
-          </w:rPr>
-          <w:t xml:space="preserve">https://doi.org/10.3828/hgr.2023.12</w:t>
         </w:r>
       </w:hyperlink>
       <w:r>

</xml_diff>

<commit_message>
get the number of types consistent
</commit_message>
<xml_diff>
--- a/paper/paper.docx
+++ b/paper/paper.docx
@@ -1031,7 +1031,7 @@
         <w:t xml:space="preserve">[10]</w:t>
       </w:r>
       <w:r>
-        <w:t xml:space="preserve">. The data set consists of 531 objects found at 65 sites in 13 countries, and records 55 geometric sign types. We excluded signs classified by</w:t>
+        <w:t xml:space="preserve">. The data set consists of 531 objects found at 65 sites in 13 countries, and records 30 geometric sign types. We excluded signs classified by</w:t>
       </w:r>
       <w:r>
         <w:t xml:space="preserve"> </w:t>
@@ -1073,7 +1073,7 @@
         <w:t xml:space="preserve">”</w:t>
       </w:r>
       <w:r>
-        <w:t xml:space="preserve">. Our sample for analysis includes 409 objects found at 28 unique geographic sites, yielding 29 site-phase assemblages in 7 countries, and 54 sign types (</w:t>
+        <w:t xml:space="preserve">. Our sample for analysis includes 409 objects found at 28 unique geographic sites, yielding 29 site-phase assemblages in 7 countries, and 29 sign types (</w:t>
       </w:r>
       <w:hyperlink w:anchor="fig-site-map">
         <w:r>
@@ -3444,7 +3444,16 @@
         <w:t xml:space="preserve"> </w:t>
       </w:r>
       <w:r>
-        <w:t xml:space="preserve">of seasonal or satellite use, with Core Areas corresponding to regions where our network’s high-degree nodes are located — notably the Dordogne (La Ferrassie) in Aur-P1. This Core/Extended framework is consistent with our finding from the larger Aur-P1 network, with the lower-connectivity periphery potentially representing periodically visited Extended Areas. In Aur-P2 the reduced network is consistent with more localised interaction as populations consolidated. These demographic conditions may shape how cultural information flowed through Aurignacian populations, which we explore below through the lens of cultural transmission theory.</w:t>
+        <w:t xml:space="preserve">of seasonal or satellite use, with Core Areas corresponding to regions where our network’s high-degree nodes are located — notably the Dordogne (La Ferrassie) in Aur-P1. This Core/Extended framework is consistent with our finding from the larger Aur-P1 network, with the lower-connectivity periphery potentially representing periodically visited Extended Areas. In Aur-P2 the reduced network is consistent with more localised interaction as populations consolidated. That said, the contraction of the geometric sign-type pool from Aur-P1 (26 types) to Aur-P2 (15 types), consistent with cultural drift in small populations (1500 individuals;</w:t>
+      </w:r>
+      <w:r>
+        <w:t xml:space="preserve"> </w:t>
+      </w:r>
+      <w:r>
+        <w:t xml:space="preserve">[20]</w:t>
+      </w:r>
+      <w:r>
+        <w:t xml:space="preserve">), does not survive testing. At equal sampling effort with incidence-frequency rarefaction to 63 objects (S1 S9.5, all types and shared object types only), the rarefied Aur-P1 pool overlaps the Aur-P2 pool, so the raw difference in the number of sign types is not distinguishable from sampling variation. Neither the networks or sign diversity can be clearly linked to demographic dynamics with the current sample.</w:t>
       </w:r>
     </w:p>
     <w:p>
@@ -3836,16 +3845,7 @@
         <w:t xml:space="preserve">[2,76,120–124]</w:t>
       </w:r>
       <w:r>
-        <w:t xml:space="preserve">. Our most robust finding is that the geometric sign-type pool contracts from Aur-P1 (26 types) to Aur-P2 (15 types), consistent with cultural drift in small populations (1500 individuals;</w:t>
-      </w:r>
-      <w:r>
-        <w:t xml:space="preserve"> </w:t>
-      </w:r>
-      <w:r>
-        <w:t xml:space="preserve">[20]</w:t>
-      </w:r>
-      <w:r>
-        <w:t xml:space="preserve">). Permutation tests (n = 10,000) show no significant difference between phases in any size-adjusted network statistic — edge density (p = 0.44), modularity (p = 0.302), mean betweenness (p = 0.622), or component count (p = 0.515) — so the Aur-P1–Aur-P2 contrast is one of network scale, not community structure.</w:t>
+        <w:t xml:space="preserve">. Permutation tests (n = 10,000) show no significant difference between phases in any size-adjusted network statistic — edge density (p = 0.44), modularity (p = 0.302), mean betweenness (p = 0.622), or component count (p = 0.515) — so the Aur-P1–Aur-P2 contrast is one of network scale, not community structure.</w:t>
       </w:r>
     </w:p>
     <w:p>

</xml_diff>

<commit_message>
fix the problem of the sampling-effort conclusion resting on a mis-specified model with Simpson-dissimilarity group test
</commit_message>
<xml_diff>
--- a/paper/paper.docx
+++ b/paper/paper.docx
@@ -179,7 +179,7 @@
         <w:t xml:space="preserve"> </w:t>
       </w:r>
       <w:r>
-        <w:t xml:space="preserve">2,</w:t>
+        <w:t xml:space="preserve">3,</w:t>
       </w:r>
       <w:r>
         <w:t xml:space="preserve"> </w:t>
@@ -269,7 +269,7 @@
         <w:t xml:space="preserve"> </w:t>
       </w:r>
       <w:r>
-        <w:t xml:space="preserve">into Western Eurasia, yet the evolution of social organization during this transition remains debated. Here we investigate social dynamics through the analysis of geometric signs on mobile objects within a two-phase framework based on specialist technological attributions in site assignment. Using seriation and network analyses, we examine patterns of sign production in each phase, and investigate how the sign-sharing network differs between the Early and Late Aurignacian. Within the early phase (Aur-P1; 20 sites) we infer and evaluate a two-group structure of restricted versus broad geometric-sign repertoires. However, stochastic block models do not recover this two-group structure (single-block selected for both phases under both Bernoulli and Gaussian emission models, a result expected below the detectability limit for sparse networks of this size), and the richness gap between groups is largely explained by sampling effort. The early phase supports a larger network centred on key sites, but permutation tests indicate that the phases do not differ significantly in edge density, modularity, mean betweenness, or component count, so the observed differences in connectivity track the larger size of the early phase, not a statistically distinguishable community structure. The late phase (Aur-P2; 9 sites) shows a weaker, less resolved structure. Mantel tests did not detect a significant correlation between geographic distance and sign distribution in either phase, and the isolation-by-distance relationship does not differ between them, but bootstrap confidence intervals indicate these tests are underpowered at these sample sizes. Geometric signs do not show the geographically distinct clusters found in personal ornaments; their function (notation, calendrical, identity) remains unresolved.</w:t>
+        <w:t xml:space="preserve">into Western Eurasia, yet the evolution of social organization during this transition remains debated. Here we investigate social dynamics through the analysis of geometric signs on mobile objects within a two-phase framework based on specialist technological attributions in site assignment. Using seriation and network analyses, we examine patterns of sign production in each phase, and investigate how the sign-sharing network differs between the Early and Late Aurignacian. Within the early phase (Aur-P1; 20 sites) we infer and evaluate a two-group structure of restricted versus broad geometric-sign repertoires. However, stochastic block models do not recover this two-group structure (single-block selected for both phases under both Bernoulli and Gaussian emission models, a result expected below the detectability limit for sparse networks of this size), and the richness gap between groups is not distinguishable from a genuine group difference once the saturating richness–effort relationship is modelled, though its separation from sampling effort is not demonstrated for small-object sites. The early phase supports a larger network centred on key sites, but permutation tests indicate that the phases do not differ significantly in edge density, modularity, mean betweenness, or component count, so the observed differences in connectivity track the larger size of the early phase, not a statistically distinguishable community structure. The late phase (Aur-P2; 9 sites) shows a weaker, less resolved structure. Mantel tests did not detect a significant correlation between geographic distance and sign distribution in either phase, and the isolation-by-distance relationship does not differ between them, but bootstrap confidence intervals indicate these tests are underpowered at these sample sizes. Geometric signs do not show the geographically distinct clusters found in personal ornaments; their function (notation, calendrical, identity) remains unresolved.</w:t>
       </w:r>
     </w:p>
     <w:p>
@@ -1284,7 +1284,7 @@
         <w:t xml:space="preserve"> </w:t>
       </w:r>
       <w:r>
-        <w:t xml:space="preserve">in using presence/absence data for each sign at each site, reducing the effect of variation in object count between sites. Beyond presence/absence coding, we additionally tested the residual object-count confound directly at the object level via downsampling, coverage-based rarefaction, and a mixed model with an object-count offset (see our S1</w:t>
+        <w:t xml:space="preserve">in using presence/absence data for each sign at each site, reducing the effect of variation in object count between sites. Beyond presence/absence coding, we additionally tested the residual object-count confound directly at the object level via downsampling, coverage-based rarefaction, and a negative-binomial regression with log object count as a covariate (see our S1</w:t>
       </w:r>
       <w:r>
         <w:t xml:space="preserve"> </w:t>
@@ -2876,7 +2876,7 @@
         <w:t xml:space="preserve"> </w:t>
       </w:r>
       <w:r>
-        <w:t xml:space="preserve">S9) supports this caution: resampling each site to a common object count leaves only the best-sampled sites with stable group assignments, and a negative-binomial model of sign-type richness that includes object count as an offset finds no significant group effect (rate ratio 0.72, p = 0.292), so the raw richness gap between groups is largely explained by how many objects were recovered. A single larger community could have both of these groups as sub-sets, rather than the restricted/broader‑range groups being distinct, non‑overlapping groups of similar sign repertoires.</w:t>
+        <w:t xml:space="preserve">S9) supports this caution: resampling each site to a common object count leaves only the best-sampled sites with stable group assignments, and a negative-binomial regression of sign-type richness with log object count as an estimated covariate (richness–effort exponent 0.38, 95% CI 0.23–0.53) finds broad-range sites richer at equal object count (rate ratio 2.31, p = 0.003), so the raw richness gap is not distinguishable from a genuine group difference once saturating effort is modelled. A single larger community could have both of these groups as sub-sets, rather than the restricted/broader‑range groups being distinct, non‑overlapping groups of similar sign repertoires.</w:t>
       </w:r>
     </w:p>
     <w:p>
@@ -3853,7 +3853,7 @@
         <w:pStyle w:val="BodyText"/>
       </w:pPr>
       <w:r>
-        <w:t xml:space="preserve">A restricted/broad repertoire axis is visually evident in seriation and supported by bootstrap co-clustering (Aur-P1: within-block 0.79/0.9 vs. across-block 0.26; Aur-P2: 0.57/0.83 vs. 0.37). However, stochastic block models do not recover a two-group partition for either phase (single block selected under both Bernoulli and Gaussian emission models; S6.3). Cross-validation (leave-one-out, object-half holdout, gradient PerMANOVA) recovers the axis, yet the maximally-selected split test under a fixed-fixed (Curveball) null is not significant in either phase (Aur-P1 p = 0.106; Aur-P2 p = 0.984). Critically, a negative-binomial model with object-count offset finds no group effect on sign-type richness (rate ratio 0.72, p = 0.292; S9), so the raw richness gap is largely a sampling-effort artifact. The restricted/broad division should be read only as a descriptive gradient whose independence from sampling effort is not demonstrated for sites with small numbers of signs.</w:t>
+        <w:t xml:space="preserve">A restricted/broad repertoire axis is visually evident in seriation and supported by bootstrap co-clustering (Aur-P1: within-block 0.79/0.9 vs. across-block 0.26; Aur-P2: 0.57/0.83 vs. 0.37). However, stochastic block models do not recover a two-group partition for either phase (single block selected under both Bernoulli and Gaussian emission models; S6.3). Cross-validation (leave-one-out, object-half holdout, gradient PerMANOVA) recovers the axis, yet the maximally-selected split test under a fixed-fixed (Curveball) null is not significant in either phase (Aur-P1 p = 0.106; Aur-P2 p = 0.984). Critically, a negative-binomial regression with an estimated richness–effort exponent finds the group contrast persists at equal object count (rate ratio 2.31, p = 0.003; S9.4). Richness-preserving nulls bound this reading both ways: the Jaccard separation falls within richness structure alone under fixed margins, exceeds object-sampling expectation in Aur-P1 only, and vanishes entirely on Simpson turnover dissimilarity, which shows no group separation in either phase (S9.7). The raw richness gap is therefore not distinguishable from a genuine group difference carried by the nestedness component. The restricted/broad division should be read only as a descriptive gradient whose independence from sampling effort is not demonstrated for sites with small numbers of signs.</w:t>
       </w:r>
     </w:p>
     <w:p>
@@ -4040,7 +4040,7 @@
         <w:pStyle w:val="BodyText"/>
       </w:pPr>
       <w:r>
-        <w:t xml:space="preserve">Fourth, the restricted/broad division may not be independent from sampling intensity. Object-level resampling shows that only the best-sampled sites retain stable group assignments when compared at a common object count. A negative-binomial model that enters object count as an offset finds no significant group effect on sign-type richness (rate ratio 0.72, p = 0.292; S1 S9). The raw richness gap between groups is therefore largely a sampling-effort artefact, and for sites represented by only a few objects the restricted/broad membership is only provisional. The division should accordingly be read as a descriptive axis of variation whose separation from sampling effort is not demonstrated for small-object sites.</w:t>
+        <w:t xml:space="preserve">Fourth, the restricted/broad division may not be independent from sampling intensity. Object-level resampling shows that only the best-sampled sites retain stable group assignments when compared at a common object count. A negative-binomial regression with an estimated richness–effort exponent finds the group contrast persists at equal object count (rate ratio 2.31, p = 0.003; S1 S9.4); the offset specification that found no effect fixed the exponent at 1, which the data reject. The raw richness gap is therefore not distinguishable from a genuine group difference, and for sites represented by only a few objects the restricted/broad membership remains provisional. The division should accordingly be read as a descriptive axis of variation whose separation from sampling effort is not demonstrated for small-object sites.</w:t>
       </w:r>
     </w:p>
     <w:bookmarkEnd w:id="61"/>

</xml_diff>

<commit_message>
updating SBM and cross-refs
</commit_message>
<xml_diff>
--- a/paper/paper.docx
+++ b/paper/paper.docx
@@ -269,7 +269,7 @@
         <w:t xml:space="preserve"> </w:t>
       </w:r>
       <w:r>
-        <w:t xml:space="preserve">into Western Eurasia, yet the evolution of social organization during this transition remains debated. Here we investigate social dynamics through the analysis of geometric signs on mobile objects within a two-phase framework based on specialist technological attributions in site assignment. Using seriation and network analyses, we examine patterns of sign production in each phase, and investigate how the sign-sharing network differs between the Early and Late Aurignacian. Within the early phase (Aur-P1; 20 sites) we hypothesize a two-group structure of restricted versus broad geometric-sign repertoires. Stochastic block modelling does not support hypothesis, with the richness gap between the groups not distinguishable from a group difference once the saturating richness–effort relationship is modelled. The early phase has a larger site network, but permutation tests indicate that the phases do not differ significantly in edge density, modularity, mean betweenness, or component count. The observed differences in network connectivity track the larger size of the early phase, not a statistically distinguishable community structure. The late phase (Aur-P2; 9 sites) shows a weaker, less resolved structure. Mantel tests did not detect a significant correlation between geographic distance and sign distribution in either phase, and the isolation-by-distance relationship does not differ between them, but bootstrap confidence intervals indicate these tests are underpowered at these sample sizes. This sample of geometric signs does not show the geographically distinct clusters found in personal ornaments; their function (notation, calendrical, identity) remains unresolved.</w:t>
+        <w:t xml:space="preserve">into Western Eurasia, yet the evolution of social organization during this transition remains debated. Here we investigate social dynamics through the analysis of geometric signs on mobile objects within a two-phase framework based on specialist technological attributions in site assignment. Using seriation and network analyses, we examine patterns of sign production in each phase, and investigate how the sign-sharing network differs between the Early and Late Aurignacian. Within the early phase (Aur-P1; 20 sites) we hypothesize a two-group structure of restricted versus broad geometric-sign repertoires. Stochastic block modelling recovers the restricted/broad split as its two largest blocks in Aur-P1, with an additional small block (Labeko Koba, Les Cottés, Trou al’Wesse), while selecting a single block in Aur-P2; the richness gap between the groups is not distinguishable from a group difference once the saturating richness–effort relationship is modelled. The early phase has a larger site network, but permutation tests indicate that the phases do not differ significantly in edge density, modularity, mean betweenness, or component count. The observed differences in network connectivity track the larger size of the early phase, not a statistically distinguishable community structure. The late phase (Aur-P2; 9 sites) shows a weaker, less resolved structure. Mantel tests did not detect a significant correlation between geographic distance and sign distribution in either phase, and the isolation-by-distance relationship does not differ between them, but bootstrap confidence intervals indicate these tests are underpowered at these sample sizes. This sample of geometric signs does not show the geographically distinct clusters found in personal ornaments; their function (notation, calendrical, identity) remains unresolved.</w:t>
       </w:r>
     </w:p>
     <w:p>
@@ -1898,7 +1898,7 @@
         <w:t xml:space="preserve">”</w:t>
       </w:r>
       <w:r>
-        <w:t xml:space="preserve">. Bootstrap resampling tests the stability of the two groups as an imposed partition. It shows that for Aur-P1, mean within-block co-clustering is 0.75 for the restricted-range block and 0.97 for the broader-range block, against 0.2 across the two blocks. The within-block values substantially exceed the across-block value, which is a signal that both groups are internally coherent and sharply separated. The strength of this signal is much lower for Aur-P2, where the pattern is 0.49 within the restricted block and 0.92 within the broader block, against 0.4 across the blocks. However the two-group hypothesis is not supported by the results of the stochastic block model analysis, this tests whether the proposed groups emerge as latent network communities without being supplied to the model in advance. All three emission models (Bernoulli, Gaussian, and Poisson) provide no model-based support for the two-group pattern inferred from the seriation (S1</w:t>
+        <w:t xml:space="preserve">. Bootstrap resampling tests the stability of the two groups as an imposed partition. It shows that for Aur-P1, mean within-block co-clustering is 0.75 for the restricted-range block and 0.97 for the broader-range block, against 0.2 across the two blocks. The within-block values substantially exceed the across-block value, which is a signal that both groups are internally coherent and sharply separated. The strength of this signal is much lower for Aur-P2, where the pattern is 0.49 within the restricted block and 0.92 within the broader block, against 0.4 across the blocks. The stochastic block model analysis, which tests whether the proposed groups emerge as latent network communities without being supplied to the model in advance, partly supports the two-group hypothesis in Aur-P1: all three emission models (Bernoulli K = 3, Gaussian K = 4, Poisson K = 3) recover the restricted/broad split as their two largest blocks; Bernoulli and Gaussian additionally isolate Labeko Koba, Les Cottés, and Trou al’Wesse as a small third block, while under Poisson the same two broad sites pair off and Grotte du Renne joins the large mixed block (S1</w:t>
       </w:r>
       <w:r>
         <w:t xml:space="preserve"> </w:t>
@@ -1913,7 +1913,7 @@
         <w:t xml:space="preserve">”</w:t>
       </w:r>
       <w:r>
-        <w:t xml:space="preserve">). Because stochastic block modelling does not consistently recover a multi-block structure, we reject the restricted/broad group hypothesis and instead hypothesize a dominant axis of sign type composition variation (rich vs. poor sign repertoires), rather than an exact partition that emerges from compositional similarity through an unsupervised model. Network analysis allows us to evaluate how these sites may have been connected along this axis.</w:t>
+        <w:t xml:space="preserve">). In Aur-P2 the Bernoulli and Poisson models select a single block and only the Gaussian model selects two, by 0.90 ICL points. We therefore retain the restricted/broad division as a dominant axis of sign type composition variation (rich vs. poor sign repertoires) with a stable small-block refinement in Aur-P1, rather than an exact two-group partition, and treat the Aur-P2 grouping as provisional. Network analysis allows us to evaluate how these sites may have been connected along this axis.</w:t>
       </w:r>
     </w:p>
     <w:tbl>
@@ -2632,7 +2632,7 @@
         <w:pStyle w:val="BodyText"/>
       </w:pPr>
       <w:r>
-        <w:t xml:space="preserve">Sampling effort is a major qualification on this social structure interpretation: object count and sign-type richness are strongly correlated, and the absence of a detectable association between node degree and richness does not establish that the restricted/broad assignments are independent of sampling effort. Object-level downsampling shows that assignments are retained mainly by the best-sampled sites, whereas small-site assignments often approach chance. Among the subset of sites that attain comparable coverage, broad-range sites remain richer, and a negative-binomial model with an estimated, rather than fixed, richness–effort exponent is consistent with a residual group difference at equal object count; however, this estimate is imprecise because the sample is small and group membership is strongly collinear with object count (S1 S12.2–S12.4). At the phase level, the Jaccard separation is not greater than expected under a fixed-margin null preserving site richness and sign-type frequencies, and no separation remains on Simpson turnover, which removes the nestedness component of Jaccard (S1 S10.1). The restricted/broad pattern is therefore best treated as a descriptive richness gradient that is most credible for well-sampled assemblages; assignments for small assemblages remain provisional. The analyses do not provide strong support for discrete social structures in the sign data.</w:t>
+        <w:t xml:space="preserve">Sampling effort is a major qualification on this social structure interpretation: object count and sign-type richness are strongly correlated, and the absence of a detectable association between node degree and richness does not establish that the restricted/broad assignments are independent of sampling effort. Object-level downsampling shows that assignments are retained mainly by the best-sampled sites, whereas small-site assignments often approach chance. Among the subset of sites that attain comparable coverage, broad-range sites remain richer, and a negative-binomial model with an estimated, rather than fixed, richness–effort exponent is consistent with a residual group difference at equal object count; however, this estimate is imprecise because the sample is small and group membership is strongly collinear with object count (S1). At the phase level, the Jaccard separation is not greater than expected under a fixed-margin null preserving site richness and sign-type frequencies, and no separation remains on Simpson turnover, which removes the nestedness component of Jaccard (S1 S10.1). The restricted/broad pattern is therefore best treated as a descriptive richness gradient that is most credible for well-sampled assemblages; assignments for small assemblages remain provisional. The analyses do not provide strong support for discrete social structures in the sign data.</w:t>
       </w:r>
     </w:p>
     <w:p>
@@ -3252,7 +3252,7 @@
         <w:t xml:space="preserve">[3]</w:t>
       </w:r>
       <w:r>
-        <w:t xml:space="preserve">, our results do not identify geographically distinct groups differentiated by sign repertoire. Geographic distance had little influence on sign distribution in either phase (Aur-P1: R = 0.046; Aur-P2: R = -0.299). Further analysis of sign composition differences across sites grouped by geography alone (Partioning Around Medoids on geodesic distances, k=2 to 5, with Jaccard dissimilarity and PERMANOVA) found no significant differences across geographic groups (S1 S5.13). Thus our findings contrast with previous work such as</w:t>
+        <w:t xml:space="preserve">, our results did not identify geographically distinct groups differentiated by sign repertoire. Geographic distance had little influence on sign distribution in either phase (Aur-P1: R = 0.046; Aur-P2: R = -0.299). Further analysis of sign composition differences across sites grouped by geography alone (Partioning Around Medoids on geodesic distances, k=2 to 5, with Jaccard dissimilarity and PerMANOVA) found no significant differences across geographic groups (S1). Thus our findings contrast with previous work such as</w:t>
       </w:r>
       <w:r>
         <w:t xml:space="preserve"> </w:t>
@@ -3285,7 +3285,7 @@
         <w:t xml:space="preserve">[6]</w:t>
       </w:r>
       <w:r>
-        <w:t xml:space="preserve">. Another explanation may be that a distinguishing factor between the Aurignacian and Gravettian is the appearance of geographically distinct cultural groups in the Gravettian, as reported by</w:t>
+        <w:t xml:space="preserve">. Another explanation may be that a distinguishing factor between the Aurignacian and Gravettian is the appearance of readily identifiable geographically distinct cultural groups in the Gravettian, as reported by</w:t>
       </w:r>
       <w:r>
         <w:t xml:space="preserve"> </w:t>
@@ -3294,7 +3294,7 @@
         <w:t xml:space="preserve">[3]</w:t>
       </w:r>
       <w:r>
-        <w:t xml:space="preserve">. We might hypothesize that the distribution found in the Aur-P2 phase (</w:t>
+        <w:t xml:space="preserve">. Future work could explore the hypothesis that the distribution found in Aur-P2 (</w:t>
       </w:r>
       <w:hyperlink w:anchor="fig-group-map">
         <w:r>
@@ -3305,7 +3305,7 @@
         </w:r>
       </w:hyperlink>
       <w:r>
-        <w:t xml:space="preserve">) evolved into the clusters proposed by</w:t>
+        <w:t xml:space="preserve">) eventually evolved into the clusters proposed by</w:t>
       </w:r>
       <w:r>
         <w:t xml:space="preserve"> </w:t>
@@ -3317,16 +3317,15 @@
         <w:t xml:space="preserve"> </w:t>
       </w:r>
       <w:r>
-        <w:t xml:space="preserve">for the Gravettian period. This transition is consistent with recent evidence for cultural continuity in personal ornaments between these technocomplexes</w:t>
-      </w:r>
-      <w:r>
-        <w:t xml:space="preserve"> </w:t>
-      </w:r>
-      <w:r>
-        <w:t xml:space="preserve">[2]</w:t>
-      </w:r>
-      <w:r>
-        <w:t xml:space="preserve">, though our geometric sign data do not show the same pattern. The data used by</w:t>
+        <w:t xml:space="preserve">for the Gravettian period.</w:t>
+      </w:r>
+    </w:p>
+    <w:p>
+      <w:pPr>
+        <w:pStyle w:val="BodyText"/>
+      </w:pPr>
+      <w:r>
+        <w:t xml:space="preserve">The data used by</w:t>
       </w:r>
       <w:r>
         <w:t xml:space="preserve"> </w:t>
@@ -3347,7 +3346,7 @@
         <w:t xml:space="preserve">[94]</w:t>
       </w:r>
       <w:r>
-        <w:t xml:space="preserve">, who used Approximate Bayesian Computation to simulate and compare Aurignacian personal ornament distribution as a result of structured ethnic identity versus as a result of cultural identity by-descent with modification and isolation-by-distance. Their results show the latter was best supported by the data. Cultural identity by-descent with modification is defined as group difference generated by unconscious cultural mutation and drift, and largely influenced by spatial proximity to other groups. These results from</w:t>
+        <w:t xml:space="preserve">, who used Approximate Bayesian Computation to simulate and compare Aurignacian personal ornament distribution as a result of structured ethnic identity versus cultural identity by-descent with modification and isolation-by-distance. Their results show the latter was best supported by the data. Cultural identity by-descent with modification is defined as group difference generated by unconscious cultural mutation and drift, and largely influenced by spatial proximity to other groups. These results from</w:t>
       </w:r>
       <w:r>
         <w:t xml:space="preserve"> </w:t>
@@ -3371,7 +3370,7 @@
         <w:t xml:space="preserve"> </w:t>
       </w:r>
       <w:r>
-        <w:t xml:space="preserve">for geographically distinct cultural groups in the Aurignacian, and like our data, does not establish the absence of geographically structured identity; both our analyses are underpowered for that claim (see S1 S5.11). To understand how these patterns of sign sharing might have been produced, we now turn to cultural transmission theory.</w:t>
+        <w:t xml:space="preserve">for geographically distinct cultural groups in the Aurignacian. Like our data, it does not establish the absence of geographically structured identity because our analyses are underpowered for that claim (S1).</w:t>
       </w:r>
     </w:p>
     <w:p>
@@ -3397,7 +3396,15 @@
         <w:t xml:space="preserve">[98]</w:t>
       </w:r>
       <w:r>
-        <w:t xml:space="preserve">, which is consistent with our observation that the sign-type pool is larger in the Aur-P1 phase (26 types) than in the Aur-P2 phase (15 types). Network structure also shapes cultural information flow: highly connected networks with high-degree node structures facilitate rapid transmission and reduce drift</w:t>
+        <w:t xml:space="preserve">. We can hypothesize this as the underlying process behind the larger the sign-type pool in the Aur-P1 phase (26 types) compared to the Aur-P2 phase (15 types). However, our equal-effort sensitivity analysis shows the sign-type pool sizes overlap once sample size is standardized (S1). So the differences are not distinguishable from sampling variation at equal effort, and the hypothesis is not supported with the current data.</w:t>
+      </w:r>
+    </w:p>
+    <w:p>
+      <w:pPr>
+        <w:pStyle w:val="BodyText"/>
+      </w:pPr>
+      <w:r>
+        <w:t xml:space="preserve">Previous work has argued that network structure also shapes cultural information flow: highly connected networks with high-degree node structures facilitate rapid transmission and reduce drift</w:t>
       </w:r>
       <w:r>
         <w:t xml:space="preserve"> </w:t>
@@ -3415,7 +3422,7 @@
         <w:t xml:space="preserve">[101]</w:t>
       </w:r>
       <w:r>
-        <w:t xml:space="preserve">. Our finding of no statistically significant difference in connectivity metrics across the two phases suggests that relative interaction levels remained consistent over time, even as populations consolidated into fewer sites. The lack of significant geographic structure in either phase contradicts simple isolation-by-distance models</w:t>
+        <w:t xml:space="preserve">. Our finding of no statistically significant differences in connectivity metrics across the two phases suggests that relative interaction levels remained consistent over time, even as populations consolidated into fewer sites. The lack of significant geographic structure in either phase contradicts simple isolation-by-distance models</w:t>
       </w:r>
       <w:r>
         <w:t xml:space="preserve"> </w:t>
@@ -3424,7 +3431,7 @@
         <w:t xml:space="preserve">[98,102]</w:t>
       </w:r>
       <w:r>
-        <w:t xml:space="preserve">. A non-significant Mantel result cannot establish which social process generated the pattern; ritual gatherings or ceremonial exchange remain speculative possibilities, not demonstrated mechanisms. These interpretations are speculative: network structure reflects sign-sharing patterns, not direct evidence of social organisation, and simpler sign types may reflect independent invention or functional constraints rather than social transmission. Our caution matches</w:t>
+        <w:t xml:space="preserve">. Our non-significant Mantel result cannot establish which social process generated the pattern; ritual gatherings or ceremonial exchange remain speculative possibilities. The network structures reported here reflect sign-sharing patterns, not direct evidence of social organisation, and sign types may reflect independent invention or functional constraints rather than social transmission. Our caution matches</w:t>
       </w:r>
       <w:r>
         <w:t xml:space="preserve"> </w:t>
@@ -3474,7 +3481,7 @@
         <w:t xml:space="preserve"> </w:t>
       </w:r>
       <w:r>
-        <w:t xml:space="preserve">found similar Gravettian clusters. Our Mantel tests show no significant geographic correlation for geometric signs (Aur-P1: R = 0.046, p = 0.301; Aur-P2: R = -0.299, p = 0.933). This null result does not by itself establish the signs’ function. One speculative possibility is that different material classes encode different identity dimensions, for example, ornaments may signal ethnic affiliation, while geometric signs could serve functions such as notation, calendrical recording, or information storage. But these remain untested hypotheses. This aligns with work by</w:t>
+        <w:t xml:space="preserve">found similar Gravettian clusters. Our Mantel tests show no significant geographic correlation for geometric signs (Aur-P1: R = 0.046, p = 0.301; Aur-P2: R = -0.299, p = 0.933). Future work should explore whether these different material classes encode different identity dimensions, for example, ornaments may signal ethnic affiliation, while geometric signs could serve functions such as notation, calendrical recording, or information storage. For example, following</w:t>
       </w:r>
       <w:r>
         <w:t xml:space="preserve"> </w:t>
@@ -3483,10 +3490,7 @@
         <w:t xml:space="preserve">[104]</w:t>
       </w:r>
       <w:r>
-        <w:t xml:space="preserve"> </w:t>
-      </w:r>
-      <w:r>
-        <w:t xml:space="preserve">(sign sequences having protocuneiform-like information density, suggesting notational function) and</w:t>
+        <w:t xml:space="preserve">’s proposal that sign sequences having protocuneiform-like information density, suggesting notational function, or</w:t>
       </w:r>
       <w:r>
         <w:t xml:space="preserve"> </w:t>
@@ -3495,10 +3499,7 @@
         <w:t xml:space="preserve">[105]</w:t>
       </w:r>
       <w:r>
-        <w:t xml:space="preserve"> </w:t>
-      </w:r>
-      <w:r>
-        <w:t xml:space="preserve">(some signs recording seasonal prey information). However, both hypotheses are contested:</w:t>
+        <w:t xml:space="preserve">’s claim that some sign recording seasonal prey information. However, these hypotheses are contested:</w:t>
       </w:r>
       <w:r>
         <w:t xml:space="preserve"> </w:t>
@@ -3546,7 +3547,7 @@
         <w:t xml:space="preserve"> </w:t>
       </w:r>
       <w:r>
-        <w:t xml:space="preserve">finds multiple theoretical weaknesses. Our results neither confirm nor rule out these hypotheses, and sign-type ambiguity remains a limitation.</w:t>
+        <w:t xml:space="preserve">finds multiple theoretical weaknesses. Our results neither confirm nor rule out these hypotheses, and sign-type ambiguity remains a limitation on their potential future contributions.</w:t>
       </w:r>
     </w:p>
     <w:bookmarkEnd w:id="59"/>
@@ -3594,7 +3595,7 @@
         <w:pStyle w:val="BodyText"/>
       </w:pPr>
       <w:r>
-        <w:t xml:space="preserve">A restricted/broad repertoire axis is visually evident in seriation and supported by bootstrap co-clustering (Aur-P1: within-block 0.75/0.97 vs. across-block 0.2; Aur-P2: 0.49/0.92 vs. 0.4). However, stochastic block models do not recover a two-group partition for either phase (single block selected under both Bernoulli and Gaussian emission models; S6.3). Cross-validation (leave-one-out, object-half holdout, gradient PerMANOVA) recovers the axis, yet the maximally-selected split test under a fixed-fixed (Curveball) null is not significant in either phase (Aur-P1 p = 0.106; Aur-P2 p = 0.984). Critically, a negative-binomial regression with an estimated richness–effort exponent finds the group contrast persists at equal object count (rate ratio 2.31, p = 0.003; S9.4). Richness-preserving nulls bound this reading both ways: the Jaccard separation falls within richness structure alone under fixed margins, exceeds object-sampling expectation in Aur-P1 only, and vanishes entirely on Simpson turnover dissimilarity, which shows no group separation in either phase (S9.7). The raw richness gap is therefore not distinguishable from a real group difference carried by the nestedness component. The restricted/broad division should be read only as a descriptive gradient whose independence from sampling effort is not demonstrated for sites with small numbers of signs.</w:t>
+        <w:t xml:space="preserve">A restricted/broad repertoire axis is visually evident in seriation and supported by bootstrap co-clustering (Aur-P1: within-block 0.75/0.97 vs. across-block 0.2; Aur-P2: 0.49/0.92 vs. 0.4). A negative-binomial regression with an estimated richness–effort exponent finds the group contrast persists at equal object count (rate ratio 2.31, p = 0.003). Stochastic block models recover the two-group partition as their two largest blocks in Aur-P1 under all three emission models (Bernoulli K = 3, Gaussian K = 4, Poisson K = 3; S1 §S9.3), with Labeko Koba, Les Cottés, and Trou al’Wesse forming a stable third block under Bernoulli and Gaussian models (under Poisson the same two broad sites pair off while Grotte du Renne joins the large mixed block), while in Aur-P2 the Bernoulli and Poisson models select a single block. Cross-validation (leave-one-out, object-half holdout, gradient PerMANOVA) recovers the axis, yet the maximally-selected split test under a fixed-fixed (Curveball) null is not significant in either phase (Aur-P1 p = 0.106; Aur-P2 p = 0.984). The restricted/broad division should be read only as a descriptive gradient whose independence from sampling effort is not demonstrated for sites with small numbers of signs.</w:t>
       </w:r>
     </w:p>
     <w:p>
@@ -3602,7 +3603,7 @@
         <w:pStyle w:val="BodyText"/>
       </w:pPr>
       <w:r>
-        <w:t xml:space="preserve">No significant isolation-by-distance signal is detected in either phase (Mantel R = 0.046, p = 0.301; R = -0.299, p = 0.933), but bootstrap confidence intervals (S5.11) show the tests are underpowered at n = 20 and 9 sites — these are null results reflecting limited power, not evidence of geographic irrelevance. Geometric signs do not exhibit the geographically distinct clusters reported for personal ornaments</w:t>
+        <w:t xml:space="preserve">No significant isolation-by-distance signal is detected in either phase (Mantel R = 0.046, p = 0.301; R = -0.299, p = 0.933). However, bootstrap confidence intervals (S1) show the tests are underpowered, so these are null results reflecting limited power, not evidence of geographic irrelevance. Geometric signs do not exhibit the geographically distinct clusters reported for personal ornaments</w:t>
       </w:r>
       <w:r>
         <w:t xml:space="preserve"> </w:t>
@@ -3781,7 +3782,7 @@
         <w:pStyle w:val="BodyText"/>
       </w:pPr>
       <w:r>
-        <w:t xml:space="preserve">Fourth, the restricted/broad division may not be independent from sampling intensity. Object-level resampling shows that only the best-sampled sites retain stable group assignments when compared at a common object count. A negative-binomial regression with an estimated richness–effort exponent finds the group contrast persists at equal object count (rate ratio 2.31, p = 0.003; S1 S9.4); the offset specification that found no effect fixed the exponent at 1, which the data reject. The raw richness gap is therefore not distinguishable from a genuine group difference, and for sites represented by only a few objects the restricted/broad membership remains provisional. The division should accordingly be read as a descriptive axis of variation whose separation from sampling effort is not demonstrated for small-object sites.</w:t>
+        <w:t xml:space="preserve">Fourth, the restricted/broad gradient may not be independent from sampling intensity. Object-level resampling shows that only the best-sampled sites retain stable group assignments when compared at a common object count. A negative-binomial regression with an estimated richness–effort exponent finds the group contrast persists at equal object count (rate ratio 2.31, p = 0.003; S1 S9.4); the offset specification that found no effect fixed the exponent at 1, which the data reject. The raw richness gap is therefore not distinguishable from a genuine group difference, and for sites represented by only a few objects the restricted/broad membership remains provisional. The division should accordingly be read as a descriptive axis of variation whose separation from sampling effort is not demonstrated for small-object sites.</w:t>
       </w:r>
     </w:p>
     <w:bookmarkEnd w:id="61"/>

</xml_diff>

<commit_message>
Add MDE to S1
</commit_message>
<xml_diff>
--- a/paper/paper.docx
+++ b/paper/paper.docx
@@ -1307,7 +1307,19 @@
         <w:t xml:space="preserve"> </w:t>
       </w:r>
       <w:r>
-        <w:t xml:space="preserve">S5.11).</w:t>
+        <w:t xml:space="preserve">S5.11). As a non-Mantel check that fits an explanatory model rather than correlating two distance matrices, we additionally ran a distance-based redundancy analysis</w:t>
+      </w:r>
+      <w:r>
+        <w:t xml:space="preserve"> </w:t>
+      </w:r>
+      <w:r>
+        <w:t xml:space="preserve">[33]</w:t>
+      </w:r>
+      <w:r>
+        <w:t xml:space="preserve"> </w:t>
+      </w:r>
+      <w:r>
+        <w:t xml:space="preserve">of the site Jaccard dissimilarity matrix on a linear geographic trend surface (longitude + latitude, identical specification in both phases; S1). It detects a weak linear geographic trend in Aur-P1 (R² = 0.156, adjusted R² = 0.057, p = 0.038) but no signal in Aur-P2 (R² = 0.191, adjusted R² = -0.078, p = 0.85). The Aur-P1 trend explains only about six percent of the adjusted variation, so it qualifies rather than overturns the Mantel null: at most a faint geographic gradient is distinguishable, not discrete geographic groups.</w:t>
       </w:r>
     </w:p>
     <w:tbl>
@@ -1541,7 +1553,7 @@
         <w:t xml:space="preserve"> </w:t>
       </w:r>
       <w:r>
-        <w:t xml:space="preserve">[33]</w:t>
+        <w:t xml:space="preserve">[34]</w:t>
       </w:r>
       <w:r>
         <w:t xml:space="preserve">. We used the Brower-Kile</w:t>
@@ -1550,7 +1562,7 @@
         <w:t xml:space="preserve"> </w:t>
       </w:r>
       <w:r>
-        <w:t xml:space="preserve">[34]</w:t>
+        <w:t xml:space="preserve">[35]</w:t>
       </w:r>
       <w:r>
         <w:t xml:space="preserve"> </w:t>
@@ -1570,7 +1582,7 @@
         <w:t xml:space="preserve"> </w:t>
       </w:r>
       <w:r>
-        <w:t xml:space="preserve">[35]</w:t>
+        <w:t xml:space="preserve">[36]</w:t>
       </w:r>
       <w:r>
         <w:t xml:space="preserve">. Each node is a site, and each edge weight is the Jaccard similarity between the two sites’ sign-type presence/absence vectors, computed as 1 − Jaccard(dissimilarity) so that higher values mean more shared sign types. To avoid cluttering the graph, all edges below the value of 0.2 were removed: an edge is only drawn if two sites share ≥ 20% Jaccard similarity, i.e., the intersection of their sign types is at least 20% of their union. We justify this threshold and demonstrate its robustness through sensitivity analyses at alternative thresholds (0.1 and 0.3), alternative similarity metrics (Sørensen-Dice, Simpson), a continuous threshold sweep from 0.05 to 0.50, and quantitative edge-set and adjacency-matrix agreement metrics across thresholds (see our S1</w:t>
@@ -1597,7 +1609,7 @@
         <w:t xml:space="preserve"> </w:t>
       </w:r>
       <w:r>
-        <w:t xml:space="preserve">[36]</w:t>
+        <w:t xml:space="preserve">[37]</w:t>
       </w:r>
       <w:r>
         <w:t xml:space="preserve">, a force-directed graph layout for uniform edge lengths, and network analysis was performed using the vegan</w:t>
@@ -1615,7 +1627,7 @@
         <w:t xml:space="preserve"> </w:t>
       </w:r>
       <w:r>
-        <w:t xml:space="preserve">[37]</w:t>
+        <w:t xml:space="preserve">[38]</w:t>
       </w:r>
       <w:r>
         <w:t xml:space="preserve"> </w:t>
@@ -1627,7 +1639,7 @@
         <w:t xml:space="preserve"> </w:t>
       </w:r>
       <w:r>
-        <w:t xml:space="preserve">[38]</w:t>
+        <w:t xml:space="preserve">[39]</w:t>
       </w:r>
       <w:r>
         <w:t xml:space="preserve"> </w:t>
@@ -1657,7 +1669,7 @@
         <w:t xml:space="preserve"> </w:t>
       </w:r>
       <w:r>
-        <w:t xml:space="preserve">[39,40]</w:t>
+        <w:t xml:space="preserve">[40,41]</w:t>
       </w:r>
       <w:r>
         <w:t xml:space="preserve"> </w:t>
@@ -1786,7 +1798,7 @@
         <w:t xml:space="preserve"> </w:t>
       </w:r>
       <w:r>
-        <w:t xml:space="preserve">[41,42]</w:t>
+        <w:t xml:space="preserve">[42,43]</w:t>
       </w:r>
       <w:r>
         <w:t xml:space="preserve">.</w:t>
@@ -2149,7 +2161,7 @@
         <w:t xml:space="preserve"> </w:t>
       </w:r>
       <w:r>
-        <w:t xml:space="preserve">shows the results of permutation tests (n = 10,000) assessing whether the observed statistics differ from a phase-randomized null distribution, and pairwise randomisation tests comparing the two phases. Under phase randomization, none of the network statistics, edge density, modularity (Louvain), mean betweenness, or component count, differs significantly from its null distribution in either phase. All observed values fall within the null 95% confidence intervals and all Benjamini–Hochberg-adjusted p-values are ≥ 0.05. The Aur-P1–Aur-P2 contrast is therefore primarily one of network scale rather than a statistically distinguishable community structure.</w:t>
+        <w:t xml:space="preserve">shows the results of permutation tests (n = 10,000) assessing whether the observed statistics differ from a phase-randomized null distribution, and pairwise randomisation tests comparing the two phases. Under phase randomization, none of the network statistics, edge density, modularity (Louvain), mean betweenness, or component count, differs significantly from its null distribution in either phase. All observed values fall within the null 95% confidence intervals and all Benjamini–Hochberg-adjusted p-values are ≥ 0.05. The Aur-P1–Aur-P2 contrast is therefore primarily one of network scale rather than a statistically distinguishable community structure. Object-within-site bootstrap stability bands likewise overlap between phases (S1), so the phase contrast could be produced by within-site object sampling alone.</w:t>
       </w:r>
     </w:p>
     <w:p>
@@ -2550,7 +2562,7 @@
               <w:pStyle w:val="ImageCaption"/>
             </w:pPr>
             <w:r>
-              <w:t xml:space="preserve">Table 3: Table of the results per phase for the perMANOVA. The R² 95% confidence interval comes from an object-within-site bootstrap (B = 1,000).</w:t>
+              <w:t xml:space="preserve">Table 3: Table of the results per phase for the perMANOVA. The R² 95% confidence interval comes from an object-within-site bootstrap (B = 1,000). The bootstrap interval measures R² stability under object resampling with fixed labels, they are not a null-hypothesis test</w:t>
             </w:r>
           </w:p>
           <w:bookmarkEnd w:id="51"/>
@@ -2690,7 +2702,7 @@
         <w:t xml:space="preserve"> </w:t>
       </w:r>
       <w:r>
-        <w:t xml:space="preserve">[43–50]</w:t>
+        <w:t xml:space="preserve">[44–51]</w:t>
       </w:r>
       <w:r>
         <w:t xml:space="preserve">. Studies have established how variation in ornamentation and other forms of material culture can be used to communicate information about the numbers and types of social roles and statuses within groups</w:t>
@@ -2699,7 +2711,7 @@
         <w:t xml:space="preserve"> </w:t>
       </w:r>
       <w:r>
-        <w:t xml:space="preserve">[4,50–61]</w:t>
+        <w:t xml:space="preserve">[4,51–62]</w:t>
       </w:r>
       <w:r>
         <w:t xml:space="preserve">. Drawing on this work, we might speculate that the broader/restricted gradient in the geometric sign data may be consistent with variation in social structure. For example, the broader range groups, with a higher variety of signs and visually complex signs, may indicate communities with a greater variety of formalized social roles, whereas the sites with a restricted range of signs may indicate communities with fewer formalized social roles.</w:t>
@@ -2741,7 +2753,7 @@
         <w:t xml:space="preserve"> </w:t>
       </w:r>
       <w:r>
-        <w:t xml:space="preserve">[62]</w:t>
+        <w:t xml:space="preserve">[63]</w:t>
       </w:r>
       <w:r>
         <w:t xml:space="preserve">;</w:t>
@@ -2750,7 +2762,7 @@
         <w:t xml:space="preserve"> </w:t>
       </w:r>
       <w:r>
-        <w:t xml:space="preserve">[63]</w:t>
+        <w:t xml:space="preserve">[64]</w:t>
       </w:r>
       <w:r>
         <w:t xml:space="preserve">;</w:t>
@@ -2759,7 +2771,7 @@
         <w:t xml:space="preserve"> </w:t>
       </w:r>
       <w:r>
-        <w:t xml:space="preserve">[48]</w:t>
+        <w:t xml:space="preserve">[49]</w:t>
       </w:r>
       <w:r>
         <w:t xml:space="preserve">;</w:t>
@@ -2768,7 +2780,7 @@
         <w:t xml:space="preserve"> </w:t>
       </w:r>
       <w:r>
-        <w:t xml:space="preserve">[64]</w:t>
+        <w:t xml:space="preserve">[65]</w:t>
       </w:r>
       <w:r>
         <w:t xml:space="preserve">;</w:t>
@@ -2777,7 +2789,7 @@
         <w:t xml:space="preserve"> </w:t>
       </w:r>
       <w:r>
-        <w:t xml:space="preserve">[49]</w:t>
+        <w:t xml:space="preserve">[50]</w:t>
       </w:r>
       <w:r>
         <w:t xml:space="preserve">. Non-utilitarian mobility establishes regional social networks which facilitate the spread of information and the survival of hunter-gatherers in uncertain environments</w:t>
@@ -2786,7 +2798,7 @@
         <w:t xml:space="preserve"> </w:t>
       </w:r>
       <w:r>
-        <w:t xml:space="preserve">[65]</w:t>
+        <w:t xml:space="preserve">[66]</w:t>
       </w:r>
       <w:r>
         <w:t xml:space="preserve">;</w:t>
@@ -2795,6 +2807,42 @@
         <w:t xml:space="preserve"> </w:t>
       </w:r>
       <w:r>
+        <w:t xml:space="preserve">[67]</w:t>
+      </w:r>
+      <w:r>
+        <w:t xml:space="preserve">;</w:t>
+      </w:r>
+      <w:r>
+        <w:t xml:space="preserve"> </w:t>
+      </w:r>
+      <w:r>
+        <w:t xml:space="preserve">[68]</w:t>
+      </w:r>
+      <w:r>
+        <w:t xml:space="preserve">;</w:t>
+      </w:r>
+      <w:r>
+        <w:t xml:space="preserve"> </w:t>
+      </w:r>
+      <w:r>
+        <w:t xml:space="preserve">[69]</w:t>
+      </w:r>
+      <w:r>
+        <w:t xml:space="preserve">;</w:t>
+      </w:r>
+      <w:r>
+        <w:t xml:space="preserve"> </w:t>
+      </w:r>
+      <w:r>
+        <w:t xml:space="preserve">[70]</w:t>
+      </w:r>
+      <w:r>
+        <w:t xml:space="preserve">. The exchange and production of decorative items, such as objects with geometric signs, has been associated with non-utilitarian mobility and recognized as an indicator of social contact</w:t>
+      </w:r>
+      <w:r>
+        <w:t xml:space="preserve"> </w:t>
+      </w:r>
+      <w:r>
         <w:t xml:space="preserve">[66]</w:t>
       </w:r>
       <w:r>
@@ -2804,7 +2852,7 @@
         <w:t xml:space="preserve"> </w:t>
       </w:r>
       <w:r>
-        <w:t xml:space="preserve">[67]</w:t>
+        <w:t xml:space="preserve">[71]</w:t>
       </w:r>
       <w:r>
         <w:t xml:space="preserve">;</w:t>
@@ -2813,7 +2861,7 @@
         <w:t xml:space="preserve"> </w:t>
       </w:r>
       <w:r>
-        <w:t xml:space="preserve">[68]</w:t>
+        <w:t xml:space="preserve">[72]</w:t>
       </w:r>
       <w:r>
         <w:t xml:space="preserve">;</w:t>
@@ -2822,16 +2870,7 @@
         <w:t xml:space="preserve"> </w:t>
       </w:r>
       <w:r>
-        <w:t xml:space="preserve">[69]</w:t>
-      </w:r>
-      <w:r>
-        <w:t xml:space="preserve">. The exchange and production of decorative items, such as objects with geometric signs, has been associated with non-utilitarian mobility and recognized as an indicator of social contact</w:t>
-      </w:r>
-      <w:r>
-        <w:t xml:space="preserve"> </w:t>
-      </w:r>
-      <w:r>
-        <w:t xml:space="preserve">[65]</w:t>
+        <w:t xml:space="preserve">[73]</w:t>
       </w:r>
       <w:r>
         <w:t xml:space="preserve">;</w:t>
@@ -2840,34 +2879,7 @@
         <w:t xml:space="preserve"> </w:t>
       </w:r>
       <w:r>
-        <w:t xml:space="preserve">[70]</w:t>
-      </w:r>
-      <w:r>
-        <w:t xml:space="preserve">;</w:t>
-      </w:r>
-      <w:r>
-        <w:t xml:space="preserve"> </w:t>
-      </w:r>
-      <w:r>
-        <w:t xml:space="preserve">[71]</w:t>
-      </w:r>
-      <w:r>
-        <w:t xml:space="preserve">;</w:t>
-      </w:r>
-      <w:r>
-        <w:t xml:space="preserve"> </w:t>
-      </w:r>
-      <w:r>
-        <w:t xml:space="preserve">[72]</w:t>
-      </w:r>
-      <w:r>
-        <w:t xml:space="preserve">;</w:t>
-      </w:r>
-      <w:r>
-        <w:t xml:space="preserve"> </w:t>
-      </w:r>
-      <w:r>
-        <w:t xml:space="preserve">[73]</w:t>
+        <w:t xml:space="preserve">[74]</w:t>
       </w:r>
       <w:r>
         <w:t xml:space="preserve">. Our Mantel tests did not detect a significant correlation between sign-type distribution and geographic distance in any phase (</w:t>
@@ -2928,7 +2940,7 @@
         <w:t xml:space="preserve"> </w:t>
       </w:r>
       <w:r>
-        <w:t xml:space="preserve">[74]</w:t>
+        <w:t xml:space="preserve">[75]</w:t>
       </w:r>
       <w:r>
         <w:t xml:space="preserve">. Aggregation sites are the places where group fragments or individuals congregate. In the archaeological literature, aggregation sites are often associated with high degrees of social connectivity and identified by indicators including proximity to certain environmental resources and a more diverse artifact assemblage, including, in some cases, decorative objects</w:t>
@@ -2937,7 +2949,7 @@
         <w:t xml:space="preserve"> </w:t>
       </w:r>
       <w:r>
-        <w:t xml:space="preserve">[2,70,75–81]</w:t>
+        <w:t xml:space="preserve">[2,71,76–82]</w:t>
       </w:r>
       <w:r>
         <w:t xml:space="preserve">. Of these indicators, only assemblage diversity is testable in our data. Notably, our results complicate the association between aggregation and high connectivity: the sites whose diversity lies above the simulated mean (a possible indicator of aggregation) are, with one exception, not the highly connected hubs in</w:t>
@@ -2985,7 +2997,7 @@
         <w:t xml:space="preserve"> </w:t>
       </w:r>
       <w:r>
-        <w:t xml:space="preserve">[82,83]</w:t>
+        <w:t xml:space="preserve">[83,84]</w:t>
       </w:r>
       <w:r>
         <w:t xml:space="preserve">. The sign-type pool — the number of distinct geometric signs recovered in each phase — was 26 in Aur-P1 and 15 in Aur-P2.</w:t>
@@ -3191,7 +3203,7 @@
         <w:t xml:space="preserve"> </w:t>
       </w:r>
       <w:r>
-        <w:t xml:space="preserve">[84]</w:t>
+        <w:t xml:space="preserve">[85]</w:t>
       </w:r>
       <w:r>
         <w:t xml:space="preserve">. This was followed by rapid expansion from 43.25–41 ka cal BP, with the maximum extent of early Aurignacian (Aur-P1) settlement being reached around 41 ka cal BP (</w:t>
@@ -3206,7 +3218,7 @@
         <w:t xml:space="preserve"> </w:t>
       </w:r>
       <w:r>
-        <w:t xml:space="preserve">[85–93]</w:t>
+        <w:t xml:space="preserve">[86–94]</w:t>
       </w:r>
       <w:r>
         <w:t xml:space="preserve">. Although population growth is one condition under which sign systems typically gain a communicative function, our results do not establish a causal link between demographic expansion and the emergence of geometric signs as a group-membership marker in the Aurignacian. Quantitative demographic reconstructions suggest that western and central European Aurignacian populations numbered approximately 1500 individuals</w:t>
@@ -3307,7 +3319,7 @@
         <w:t xml:space="preserve"> </w:t>
       </w:r>
       <w:r>
-        <w:t xml:space="preserve">[84]</w:t>
+        <w:t xml:space="preserve">[85]</w:t>
       </w:r>
       <w:r>
         <w:t xml:space="preserve"> </w:t>
@@ -3421,7 +3433,7 @@
         <w:t xml:space="preserve"> </w:t>
       </w:r>
       <w:r>
-        <w:t xml:space="preserve">[94]</w:t>
+        <w:t xml:space="preserve">[95]</w:t>
       </w:r>
       <w:r>
         <w:t xml:space="preserve">, who used Approximate Bayesian Computation to simulate and compare Aurignacian personal ornament distribution as a result of structured ethnic identity versus cultural identity by-descent with modification and isolation-by-distance. Their results show the latter was best supported by the data. Cultural identity by-descent with modification is defined as group difference generated by unconscious cultural mutation and drift, and largely influenced by spatial proximity to other groups. These results from</w:t>
@@ -3430,7 +3442,7 @@
         <w:t xml:space="preserve"> </w:t>
       </w:r>
       <w:r>
-        <w:t xml:space="preserve">[94]</w:t>
+        <w:t xml:space="preserve">[95]</w:t>
       </w:r>
       <w:r>
         <w:t xml:space="preserve"> </w:t>
@@ -3462,7 +3474,7 @@
         <w:t xml:space="preserve"> </w:t>
       </w:r>
       <w:r>
-        <w:t xml:space="preserve">[95–97]</w:t>
+        <w:t xml:space="preserve">[96–98]</w:t>
       </w:r>
       <w:r>
         <w:t xml:space="preserve">. Smaller populations are predicted to experience greater drift and reduced capacity to maintain complex cultural repertoires</w:t>
@@ -3471,7 +3483,7 @@
         <w:t xml:space="preserve"> </w:t>
       </w:r>
       <w:r>
-        <w:t xml:space="preserve">[98]</w:t>
+        <w:t xml:space="preserve">[99]</w:t>
       </w:r>
       <w:r>
         <w:t xml:space="preserve">. We can hypothesize this as the underlying process behind the larger the sign-type pool in the Aur-P1 phase (26 types) compared to the Aur-P2 phase (15 types). However, our equal-effort sensitivity analysis shows the sign-type pool sizes overlap once sample size is standardized (S1). So the differences are not distinguishable from sampling variation at equal effort, and the hypothesis is not supported with the current data.</w:t>
@@ -3488,7 +3500,7 @@
         <w:t xml:space="preserve"> </w:t>
       </w:r>
       <w:r>
-        <w:t xml:space="preserve">[99,100]</w:t>
+        <w:t xml:space="preserve">[100,101]</w:t>
       </w:r>
       <w:r>
         <w:t xml:space="preserve">, while more clustered networks promote localised conformist transmission and differentiation within subgroups</w:t>
@@ -3497,7 +3509,7 @@
         <w:t xml:space="preserve"> </w:t>
       </w:r>
       <w:r>
-        <w:t xml:space="preserve">[101]</w:t>
+        <w:t xml:space="preserve">[102]</w:t>
       </w:r>
       <w:r>
         <w:t xml:space="preserve">. Our finding of no statistically significant differences in connectivity metrics across the two phases suggests that relative interaction levels remained consistent over time, even as populations consolidated into fewer sites. The lack of significant geographic structure in either phase contradicts simple isolation-by-distance models</w:t>
@@ -3506,7 +3518,7 @@
         <w:t xml:space="preserve"> </w:t>
       </w:r>
       <w:r>
-        <w:t xml:space="preserve">[98,102]</w:t>
+        <w:t xml:space="preserve">[99,103]</w:t>
       </w:r>
       <w:r>
         <w:t xml:space="preserve">. Our non-significant Mantel result cannot establish which social process generated the pattern; ritual gatherings or ceremonial exchange remain speculative possibilities. The network structures reported here reflect sign-sharing patterns, not direct evidence of social organisation, and sign types may reflect independent invention or functional constraints rather than social transmission. Our caution matches</w:t>
@@ -3515,7 +3527,7 @@
         <w:t xml:space="preserve"> </w:t>
       </w:r>
       <w:r>
-        <w:t xml:space="preserve">[103]</w:t>
+        <w:t xml:space="preserve">[104]</w:t>
       </w:r>
       <w:r>
         <w:t xml:space="preserve">, who treats stable bison-horse-ibex centrality in Magdalenian parietal art along the Bay of Biscayas an organisational grammar and refrains from claims about symbolic meaning, narrative content, or cultural meaning.</w:t>
@@ -3565,7 +3577,7 @@
         <w:t xml:space="preserve"> </w:t>
       </w:r>
       <w:r>
-        <w:t xml:space="preserve">[104]</w:t>
+        <w:t xml:space="preserve">[105]</w:t>
       </w:r>
       <w:r>
         <w:t xml:space="preserve">’s proposal that sign sequences having protocuneiform-like information density, suggesting notational function, or</w:t>
@@ -3574,7 +3586,7 @@
         <w:t xml:space="preserve"> </w:t>
       </w:r>
       <w:r>
-        <w:t xml:space="preserve">[105]</w:t>
+        <w:t xml:space="preserve">[106]</w:t>
       </w:r>
       <w:r>
         <w:t xml:space="preserve">’s claim that some sign recording seasonal prey information. However, these hypotheses are contested:</w:t>
@@ -3583,7 +3595,7 @@
         <w:t xml:space="preserve"> </w:t>
       </w:r>
       <w:r>
-        <w:t xml:space="preserve">[106]</w:t>
+        <w:t xml:space="preserve">[107]</w:t>
       </w:r>
       <w:r>
         <w:t xml:space="preserve"> </w:t>
@@ -3595,7 +3607,7 @@
         <w:t xml:space="preserve"> </w:t>
       </w:r>
       <w:r>
-        <w:t xml:space="preserve">[107]</w:t>
+        <w:t xml:space="preserve">[108]</w:t>
       </w:r>
       <w:r>
         <w:t xml:space="preserve"> </w:t>
@@ -3607,7 +3619,7 @@
         <w:t xml:space="preserve"> </w:t>
       </w:r>
       <w:r>
-        <w:t xml:space="preserve">[108]</w:t>
+        <w:t xml:space="preserve">[109]</w:t>
       </w:r>
       <w:r>
         <w:t xml:space="preserve"> </w:t>
@@ -3619,7 +3631,7 @@
         <w:t xml:space="preserve"> </w:t>
       </w:r>
       <w:r>
-        <w:t xml:space="preserve">[109]</w:t>
+        <w:t xml:space="preserve">[110]</w:t>
       </w:r>
       <w:r>
         <w:t xml:space="preserve"> </w:t>
@@ -3650,7 +3662,7 @@
         <w:t xml:space="preserve"> </w:t>
       </w:r>
       <w:r>
-        <w:t xml:space="preserve">[3,76,110–113]</w:t>
+        <w:t xml:space="preserve">[3,77,111–114]</w:t>
       </w:r>
       <w:r>
         <w:t xml:space="preserve"> </w:t>
@@ -3662,7 +3674,7 @@
         <w:t xml:space="preserve"> </w:t>
       </w:r>
       <w:r>
-        <w:t xml:space="preserve">[2,69,114–118]</w:t>
+        <w:t xml:space="preserve">[2,70,115–119]</w:t>
       </w:r>
       <w:r>
         <w:t xml:space="preserve">. Our results show that the current sample of geometric signs does not support any significant change over the Aurignacian.</w:t>
@@ -3696,7 +3708,7 @@
         <w:t xml:space="preserve"> </w:t>
       </w:r>
       <w:r>
-        <w:t xml:space="preserve">[104–109]</w:t>
+        <w:t xml:space="preserve">[105–110]</w:t>
       </w:r>
       <w:r>
         <w:t xml:space="preserve">. Our findings are consistent with the conclusions of</w:t>
@@ -3705,7 +3717,7 @@
         <w:t xml:space="preserve"> </w:t>
       </w:r>
       <w:r>
-        <w:t xml:space="preserve">[94]</w:t>
+        <w:t xml:space="preserve">[95]</w:t>
       </w:r>
       <w:r>
         <w:t xml:space="preserve"> </w:t>
@@ -3725,7 +3737,7 @@
         <w:t xml:space="preserve"> </w:t>
       </w:r>
       <w:r>
-        <w:t xml:space="preserve">[119]</w:t>
+        <w:t xml:space="preserve">[120]</w:t>
       </w:r>
       <w:r>
         <w:t xml:space="preserve"> </w:t>
@@ -3737,7 +3749,7 @@
         <w:t xml:space="preserve"> </w:t>
       </w:r>
       <w:r>
-        <w:t xml:space="preserve">[120]</w:t>
+        <w:t xml:space="preserve">[121]</w:t>
       </w:r>
       <w:r>
         <w:t xml:space="preserve">, and additionally, greater quantities of included sign types serve to establish stronger connections</w:t>
@@ -3746,7 +3758,7 @@
         <w:t xml:space="preserve"> </w:t>
       </w:r>
       <w:r>
-        <w:t xml:space="preserve">[121]</w:t>
+        <w:t xml:space="preserve">[122]</w:t>
       </w:r>
       <w:r>
         <w:t xml:space="preserve">. This ambiguity may be addressed in the future through the usage of the data recently released in SignBase 2.0 covering sites in Germany, which contains more detailed information on the specific order and patterns in which signs occurred on individual objects</w:t>
@@ -3755,7 +3767,7 @@
         <w:t xml:space="preserve"> </w:t>
       </w:r>
       <w:r>
-        <w:t xml:space="preserve">[104]</w:t>
+        <w:t xml:space="preserve">[105]</w:t>
       </w:r>
       <w:r>
         <w:t xml:space="preserve">.</w:t>
@@ -3772,7 +3784,7 @@
         <w:t xml:space="preserve"> </w:t>
       </w:r>
       <w:r>
-        <w:t xml:space="preserve">[122]</w:t>
+        <w:t xml:space="preserve">[123]</w:t>
       </w:r>
       <w:r>
         <w:t xml:space="preserve"> </w:t>
@@ -3784,7 +3796,7 @@
         <w:t xml:space="preserve"> </w:t>
       </w:r>
       <w:r>
-        <w:t xml:space="preserve">[64]</w:t>
+        <w:t xml:space="preserve">[65]</w:t>
       </w:r>
       <w:r>
         <w:t xml:space="preserve"> </w:t>
@@ -3804,7 +3816,7 @@
         <w:t xml:space="preserve"> </w:t>
       </w:r>
       <w:r>
-        <w:t xml:space="preserve">[123,124]</w:t>
+        <w:t xml:space="preserve">[124,125]</w:t>
       </w:r>
       <w:r>
         <w:t xml:space="preserve">, La Ferrassie’s Aurignacian begins with the Early Aurignacian directly above the Châtelperronian</w:t>
@@ -3813,7 +3825,7 @@
         <w:t xml:space="preserve"> </w:t>
       </w:r>
       <w:r>
-        <w:t xml:space="preserve">[125]</w:t>
+        <w:t xml:space="preserve">[126]</w:t>
       </w:r>
       <w:r>
         <w:t xml:space="preserve">, and Mladeč’s massive-base bone points and ~31 ka ¹⁴C BP (~35–36 ka cal BP) dates indicate an Evolved (Aur-P2) attribution</w:t>
@@ -3822,7 +3834,7 @@
         <w:t xml:space="preserve"> </w:t>
       </w:r>
       <w:r>
-        <w:t xml:space="preserve">[126]</w:t>
+        <w:t xml:space="preserve">[127]</w:t>
       </w:r>
       <w:r>
         <w:t xml:space="preserve">. Additionally, Vogelherd Cave’s stratigraphy is compromised by excavation methodology and post-depositional disturbance, with documented mixing between Aurignacian, Gravettian, and Magdalenian layers</w:t>
@@ -3831,7 +3843,7 @@
         <w:t xml:space="preserve"> </w:t>
       </w:r>
       <w:r>
-        <w:t xml:space="preserve">[127]</w:t>
+        <w:t xml:space="preserve">[128]</w:t>
       </w:r>
       <w:r>
         <w:t xml:space="preserve">. After exclusions, Aur-P2 rests on only 9 sites and 63 objects, so its two-group structure and network statistics have limited power. To manage this limitation we tested the sensitivity of our assignments to reverting to purely date-based criteria in S1</w:t>
@@ -3864,7 +3876,7 @@
       </w:r>
     </w:p>
     <w:bookmarkEnd w:id="61"/>
-    <w:bookmarkStart w:id="303" w:name="references"/>
+    <w:bookmarkStart w:id="305" w:name="references"/>
     <w:p>
       <w:pPr>
         <w:pStyle w:val="Heading1"/>
@@ -3873,7 +3885,7 @@
         <w:t xml:space="preserve">References</w:t>
       </w:r>
     </w:p>
-    <w:bookmarkStart w:id="302" w:name="refs"/>
+    <w:bookmarkStart w:id="304" w:name="refs"/>
     <w:bookmarkStart w:id="63" w:name="ref-Boyd_Silk_2020"/>
     <w:p>
       <w:pPr>
@@ -5547,7 +5559,7 @@
       </w:r>
     </w:p>
     <w:bookmarkEnd w:id="123"/>
-    <w:bookmarkStart w:id="125" w:name="ref-seriation_pckge"/>
+    <w:bookmarkStart w:id="125" w:name="ref-Legendre_Anderson_1999"/>
     <w:p>
       <w:pPr>
         <w:pStyle w:val="Bibliography"/>
@@ -5562,6 +5574,39 @@
         <w:t xml:space="preserve">	</w:t>
       </w:r>
       <w:r>
+        <w:t xml:space="preserve">Legendre P, Anderson MJ. Distance-based redundancy analysis: Testing multispecies responses in multifactorial ecological experiments. Ecological Monographs 1999;69:1–24.</w:t>
+      </w:r>
+      <w:r>
+        <w:t xml:space="preserve"> </w:t>
+      </w:r>
+      <w:hyperlink r:id="rId124">
+        <w:r>
+          <w:rPr>
+            <w:rStyle w:val="Hyperlink"/>
+          </w:rPr>
+          <w:t xml:space="preserve">https://doi.org/10.1890/0012-9615(1999)069[0001:DBRDAO]2.0.CO;2</w:t>
+        </w:r>
+      </w:hyperlink>
+      <w:r>
+        <w:t xml:space="preserve">.</w:t>
+      </w:r>
+    </w:p>
+    <w:bookmarkEnd w:id="125"/>
+    <w:bookmarkStart w:id="127" w:name="ref-seriation_pckge"/>
+    <w:p>
+      <w:pPr>
+        <w:pStyle w:val="Bibliography"/>
+      </w:pPr>
+      <w:r>
+        <w:t xml:space="preserve">[34]</w:t>
+      </w:r>
+      <w:r>
+        <w:t xml:space="preserve"> </w:t>
+      </w:r>
+      <w:r>
+        <w:t xml:space="preserve">	</w:t>
+      </w:r>
+      <w:r>
         <w:t xml:space="preserve">Hahsler M, Hornik K, Buchta C. Getting things in order: An introduction to the</w:t>
       </w:r>
       <w:r>
@@ -5579,7 +5624,7 @@
       <w:r>
         <w:t xml:space="preserve"> </w:t>
       </w:r>
-      <w:hyperlink r:id="rId124">
+      <w:hyperlink r:id="rId126">
         <w:r>
           <w:rPr>
             <w:rStyle w:val="Hyperlink"/>
@@ -5591,14 +5636,14 @@
         <w:t xml:space="preserve">.</w:t>
       </w:r>
     </w:p>
-    <w:bookmarkEnd w:id="125"/>
-    <w:bookmarkStart w:id="127" w:name="ref-Brower_Kile_1988"/>
-    <w:p>
-      <w:pPr>
-        <w:pStyle w:val="Bibliography"/>
-      </w:pPr>
-      <w:r>
-        <w:t xml:space="preserve">[34]</w:t>
+    <w:bookmarkEnd w:id="127"/>
+    <w:bookmarkStart w:id="129" w:name="ref-Brower_Kile_1988"/>
+    <w:p>
+      <w:pPr>
+        <w:pStyle w:val="Bibliography"/>
+      </w:pPr>
+      <w:r>
+        <w:t xml:space="preserve">[35]</w:t>
       </w:r>
       <w:r>
         <w:t xml:space="preserve"> </w:t>
@@ -5612,7 +5657,7 @@
       <w:r>
         <w:t xml:space="preserve"> </w:t>
       </w:r>
-      <w:hyperlink r:id="rId126">
+      <w:hyperlink r:id="rId128">
         <w:r>
           <w:rPr>
             <w:rStyle w:val="Hyperlink"/>
@@ -5624,14 +5669,14 @@
         <w:t xml:space="preserve">.</w:t>
       </w:r>
     </w:p>
-    <w:bookmarkEnd w:id="127"/>
-    <w:bookmarkStart w:id="129" w:name="ref-Mills_2017"/>
-    <w:p>
-      <w:pPr>
-        <w:pStyle w:val="Bibliography"/>
-      </w:pPr>
-      <w:r>
-        <w:t xml:space="preserve">[35]</w:t>
+    <w:bookmarkEnd w:id="129"/>
+    <w:bookmarkStart w:id="131" w:name="ref-Mills_2017"/>
+    <w:p>
+      <w:pPr>
+        <w:pStyle w:val="Bibliography"/>
+      </w:pPr>
+      <w:r>
+        <w:t xml:space="preserve">[36]</w:t>
       </w:r>
       <w:r>
         <w:t xml:space="preserve"> </w:t>
@@ -5645,7 +5690,7 @@
       <w:r>
         <w:t xml:space="preserve"> </w:t>
       </w:r>
-      <w:hyperlink r:id="rId128">
+      <w:hyperlink r:id="rId130">
         <w:r>
           <w:rPr>
             <w:rStyle w:val="Hyperlink"/>
@@ -5657,14 +5702,14 @@
         <w:t xml:space="preserve">.</w:t>
       </w:r>
     </w:p>
-    <w:bookmarkEnd w:id="129"/>
-    <w:bookmarkStart w:id="131" w:name="ref-Fruchterman_Reingold_1991"/>
-    <w:p>
-      <w:pPr>
-        <w:pStyle w:val="Bibliography"/>
-      </w:pPr>
-      <w:r>
-        <w:t xml:space="preserve">[36]</w:t>
+    <w:bookmarkEnd w:id="131"/>
+    <w:bookmarkStart w:id="133" w:name="ref-Fruchterman_Reingold_1991"/>
+    <w:p>
+      <w:pPr>
+        <w:pStyle w:val="Bibliography"/>
+      </w:pPr>
+      <w:r>
+        <w:t xml:space="preserve">[37]</w:t>
       </w:r>
       <w:r>
         <w:t xml:space="preserve"> </w:t>
@@ -5678,7 +5723,7 @@
       <w:r>
         <w:t xml:space="preserve"> </w:t>
       </w:r>
-      <w:hyperlink r:id="rId130">
+      <w:hyperlink r:id="rId132">
         <w:r>
           <w:rPr>
             <w:rStyle w:val="Hyperlink"/>
@@ -5690,14 +5735,14 @@
         <w:t xml:space="preserve">.</w:t>
       </w:r>
     </w:p>
-    <w:bookmarkEnd w:id="131"/>
-    <w:bookmarkStart w:id="133" w:name="ref-statnet_package"/>
-    <w:p>
-      <w:pPr>
-        <w:pStyle w:val="Bibliography"/>
-      </w:pPr>
-      <w:r>
-        <w:t xml:space="preserve">[37]</w:t>
+    <w:bookmarkEnd w:id="133"/>
+    <w:bookmarkStart w:id="135" w:name="ref-statnet_package"/>
+    <w:p>
+      <w:pPr>
+        <w:pStyle w:val="Bibliography"/>
+      </w:pPr>
+      <w:r>
+        <w:t xml:space="preserve">[38]</w:t>
       </w:r>
       <w:r>
         <w:t xml:space="preserve"> </w:t>
@@ -5711,7 +5756,7 @@
       <w:r>
         <w:t xml:space="preserve"> </w:t>
       </w:r>
-      <w:hyperlink r:id="rId132">
+      <w:hyperlink r:id="rId134">
         <w:r>
           <w:rPr>
             <w:rStyle w:val="Hyperlink"/>
@@ -5726,14 +5771,14 @@
         <w:t xml:space="preserve">2019.</w:t>
       </w:r>
     </w:p>
-    <w:bookmarkEnd w:id="133"/>
-    <w:bookmarkStart w:id="135" w:name="ref-igraph_package"/>
-    <w:p>
-      <w:pPr>
-        <w:pStyle w:val="Bibliography"/>
-      </w:pPr>
-      <w:r>
-        <w:t xml:space="preserve">[38]</w:t>
+    <w:bookmarkEnd w:id="135"/>
+    <w:bookmarkStart w:id="137" w:name="ref-igraph_package"/>
+    <w:p>
+      <w:pPr>
+        <w:pStyle w:val="Bibliography"/>
+      </w:pPr>
+      <w:r>
+        <w:t xml:space="preserve">[39]</w:t>
       </w:r>
       <w:r>
         <w:t xml:space="preserve"> </w:t>
@@ -5747,7 +5792,7 @@
       <w:r>
         <w:t xml:space="preserve"> </w:t>
       </w:r>
-      <w:hyperlink r:id="rId134">
+      <w:hyperlink r:id="rId136">
         <w:r>
           <w:rPr>
             <w:rStyle w:val="Hyperlink"/>
@@ -5759,14 +5804,14 @@
         <w:t xml:space="preserve">. InterJournal 2006;Complex Systems:1695.</w:t>
       </w:r>
     </w:p>
-    <w:bookmarkEnd w:id="135"/>
-    <w:bookmarkStart w:id="137" w:name="ref-Anderson_2017"/>
-    <w:p>
-      <w:pPr>
-        <w:pStyle w:val="Bibliography"/>
-      </w:pPr>
-      <w:r>
-        <w:t xml:space="preserve">[39]</w:t>
+    <w:bookmarkEnd w:id="137"/>
+    <w:bookmarkStart w:id="139" w:name="ref-Anderson_2017"/>
+    <w:p>
+      <w:pPr>
+        <w:pStyle w:val="Bibliography"/>
+      </w:pPr>
+      <w:r>
+        <w:t xml:space="preserve">[40]</w:t>
       </w:r>
       <w:r>
         <w:t xml:space="preserve"> </w:t>
@@ -5786,7 +5831,7 @@
       <w:r>
         <w:t xml:space="preserve"> </w:t>
       </w:r>
-      <w:hyperlink r:id="rId136">
+      <w:hyperlink r:id="rId138">
         <w:r>
           <w:rPr>
             <w:rStyle w:val="Hyperlink"/>
@@ -5798,14 +5843,14 @@
         <w:t xml:space="preserve">.</w:t>
       </w:r>
     </w:p>
-    <w:bookmarkEnd w:id="137"/>
-    <w:bookmarkStart w:id="139" w:name="ref-Shennan_Crema_Kerig_2015"/>
-    <w:p>
-      <w:pPr>
-        <w:pStyle w:val="Bibliography"/>
-      </w:pPr>
-      <w:r>
-        <w:t xml:space="preserve">[40]</w:t>
+    <w:bookmarkEnd w:id="139"/>
+    <w:bookmarkStart w:id="141" w:name="ref-Shennan_Crema_Kerig_2015"/>
+    <w:p>
+      <w:pPr>
+        <w:pStyle w:val="Bibliography"/>
+      </w:pPr>
+      <w:r>
+        <w:t xml:space="preserve">[41]</w:t>
       </w:r>
       <w:r>
         <w:t xml:space="preserve"> </w:t>
@@ -5858,7 +5903,7 @@
       <w:r>
         <w:t xml:space="preserve"> </w:t>
       </w:r>
-      <w:hyperlink r:id="rId138">
+      <w:hyperlink r:id="rId140">
         <w:r>
           <w:rPr>
             <w:rStyle w:val="Hyperlink"/>
@@ -5870,14 +5915,14 @@
         <w:t xml:space="preserve">.</w:t>
       </w:r>
     </w:p>
-    <w:bookmarkEnd w:id="139"/>
-    <w:bookmarkStart w:id="141" w:name="ref-Marwick2017"/>
-    <w:p>
-      <w:pPr>
-        <w:pStyle w:val="Bibliography"/>
-      </w:pPr>
-      <w:r>
-        <w:t xml:space="preserve">[41]</w:t>
+    <w:bookmarkEnd w:id="141"/>
+    <w:bookmarkStart w:id="143" w:name="ref-Marwick2017"/>
+    <w:p>
+      <w:pPr>
+        <w:pStyle w:val="Bibliography"/>
+      </w:pPr>
+      <w:r>
+        <w:t xml:space="preserve">[42]</w:t>
       </w:r>
       <w:r>
         <w:t xml:space="preserve"> </w:t>
@@ -5891,7 +5936,7 @@
       <w:r>
         <w:t xml:space="preserve"> </w:t>
       </w:r>
-      <w:hyperlink r:id="rId140">
+      <w:hyperlink r:id="rId142">
         <w:r>
           <w:rPr>
             <w:rStyle w:val="Hyperlink"/>
@@ -5903,14 +5948,14 @@
         <w:t xml:space="preserve">.</w:t>
       </w:r>
     </w:p>
-    <w:bookmarkEnd w:id="141"/>
-    <w:bookmarkStart w:id="143" w:name="ref-Marwick_2025"/>
-    <w:p>
-      <w:pPr>
-        <w:pStyle w:val="Bibliography"/>
-      </w:pPr>
-      <w:r>
-        <w:t xml:space="preserve">[42]</w:t>
+    <w:bookmarkEnd w:id="143"/>
+    <w:bookmarkStart w:id="145" w:name="ref-Marwick_2025"/>
+    <w:p>
+      <w:pPr>
+        <w:pStyle w:val="Bibliography"/>
+      </w:pPr>
+      <w:r>
+        <w:t xml:space="preserve">[43]</w:t>
       </w:r>
       <w:r>
         <w:t xml:space="preserve"> </w:t>
@@ -5924,7 +5969,7 @@
       <w:r>
         <w:t xml:space="preserve"> </w:t>
       </w:r>
-      <w:hyperlink r:id="rId142">
+      <w:hyperlink r:id="rId144">
         <w:r>
           <w:rPr>
             <w:rStyle w:val="Hyperlink"/>
@@ -5936,14 +5981,14 @@
         <w:t xml:space="preserve">.</w:t>
       </w:r>
     </w:p>
-    <w:bookmarkEnd w:id="143"/>
-    <w:bookmarkStart w:id="145" w:name="ref-Finlayson_Warren_2017"/>
-    <w:p>
-      <w:pPr>
-        <w:pStyle w:val="Bibliography"/>
-      </w:pPr>
-      <w:r>
-        <w:t xml:space="preserve">[43]</w:t>
+    <w:bookmarkEnd w:id="145"/>
+    <w:bookmarkStart w:id="147" w:name="ref-Finlayson_Warren_2017"/>
+    <w:p>
+      <w:pPr>
+        <w:pStyle w:val="Bibliography"/>
+      </w:pPr>
+      <w:r>
+        <w:t xml:space="preserve">[44]</w:t>
       </w:r>
       <w:r>
         <w:t xml:space="preserve"> </w:t>
@@ -5957,7 +6002,7 @@
       <w:r>
         <w:t xml:space="preserve"> </w:t>
       </w:r>
-      <w:hyperlink r:id="rId144">
+      <w:hyperlink r:id="rId146">
         <w:r>
           <w:rPr>
             <w:rStyle w:val="Hyperlink"/>
@@ -5969,14 +6014,14 @@
         <w:t xml:space="preserve">. In: Finlayson B, Warren G, editors. The diversity of hunter gatherer pasts. 1st ed., Oxbow Books; 2017, p. 1–14.</w:t>
       </w:r>
     </w:p>
-    <w:bookmarkEnd w:id="145"/>
-    <w:bookmarkStart w:id="147" w:name="ref-Riches_1995"/>
-    <w:p>
-      <w:pPr>
-        <w:pStyle w:val="Bibliography"/>
-      </w:pPr>
-      <w:r>
-        <w:t xml:space="preserve">[44]</w:t>
+    <w:bookmarkEnd w:id="147"/>
+    <w:bookmarkStart w:id="149" w:name="ref-Riches_1995"/>
+    <w:p>
+      <w:pPr>
+        <w:pStyle w:val="Bibliography"/>
+      </w:pPr>
+      <w:r>
+        <w:t xml:space="preserve">[45]</w:t>
       </w:r>
       <w:r>
         <w:t xml:space="preserve"> </w:t>
@@ -5990,7 +6035,7 @@
       <w:r>
         <w:t xml:space="preserve"> </w:t>
       </w:r>
-      <w:hyperlink r:id="rId146">
+      <w:hyperlink r:id="rId148">
         <w:r>
           <w:rPr>
             <w:rStyle w:val="Hyperlink"/>
@@ -6002,14 +6047,14 @@
         <w:t xml:space="preserve">.</w:t>
       </w:r>
     </w:p>
-    <w:bookmarkEnd w:id="147"/>
-    <w:bookmarkStart w:id="149" w:name="ref-Price_Brown_1985"/>
-    <w:p>
-      <w:pPr>
-        <w:pStyle w:val="Bibliography"/>
-      </w:pPr>
-      <w:r>
-        <w:t xml:space="preserve">[45]</w:t>
+    <w:bookmarkEnd w:id="149"/>
+    <w:bookmarkStart w:id="151" w:name="ref-Price_Brown_1985"/>
+    <w:p>
+      <w:pPr>
+        <w:pStyle w:val="Bibliography"/>
+      </w:pPr>
+      <w:r>
+        <w:t xml:space="preserve">[46]</w:t>
       </w:r>
       <w:r>
         <w:t xml:space="preserve"> </w:t>
@@ -6023,7 +6068,7 @@
       <w:r>
         <w:t xml:space="preserve"> </w:t>
       </w:r>
-      <w:hyperlink r:id="rId148">
+      <w:hyperlink r:id="rId150">
         <w:r>
           <w:rPr>
             <w:rStyle w:val="Hyperlink"/>
@@ -6035,14 +6080,14 @@
         <w:t xml:space="preserve">.</w:t>
       </w:r>
     </w:p>
-    <w:bookmarkEnd w:id="149"/>
-    <w:bookmarkStart w:id="151" w:name="ref-Lane_2017"/>
-    <w:p>
-      <w:pPr>
-        <w:pStyle w:val="Bibliography"/>
-      </w:pPr>
-      <w:r>
-        <w:t xml:space="preserve">[46]</w:t>
+    <w:bookmarkEnd w:id="151"/>
+    <w:bookmarkStart w:id="153" w:name="ref-Lane_2017"/>
+    <w:p>
+      <w:pPr>
+        <w:pStyle w:val="Bibliography"/>
+      </w:pPr>
+      <w:r>
+        <w:t xml:space="preserve">[47]</w:t>
       </w:r>
       <w:r>
         <w:t xml:space="preserve"> </w:t>
@@ -6056,7 +6101,7 @@
       <w:r>
         <w:t xml:space="preserve"> </w:t>
       </w:r>
-      <w:hyperlink r:id="rId150">
+      <w:hyperlink r:id="rId152">
         <w:r>
           <w:rPr>
             <w:rStyle w:val="Hyperlink"/>
@@ -6068,14 +6113,14 @@
         <w:t xml:space="preserve">. In: Finlayson B, Warren G, editors. The diversity of hunter gatherer pasts. 1st ed., Oxbow Books; 2017, p. 185–96.</w:t>
       </w:r>
     </w:p>
-    <w:bookmarkEnd w:id="151"/>
-    <w:bookmarkStart w:id="152" w:name="ref-Pate_2006"/>
-    <w:p>
-      <w:pPr>
-        <w:pStyle w:val="Bibliography"/>
-      </w:pPr>
-      <w:r>
-        <w:t xml:space="preserve">[47]</w:t>
+    <w:bookmarkEnd w:id="153"/>
+    <w:bookmarkStart w:id="154" w:name="ref-Pate_2006"/>
+    <w:p>
+      <w:pPr>
+        <w:pStyle w:val="Bibliography"/>
+      </w:pPr>
+      <w:r>
+        <w:t xml:space="preserve">[48]</w:t>
       </w:r>
       <w:r>
         <w:t xml:space="preserve"> </w:t>
@@ -6123,14 +6168,14 @@
         <w:t xml:space="preserve">societies, Aboriginal Studies Press; 2006, p. 226–41.</w:t>
       </w:r>
     </w:p>
-    <w:bookmarkEnd w:id="152"/>
-    <w:bookmarkStart w:id="154" w:name="ref-Johnson_2014"/>
-    <w:p>
-      <w:pPr>
-        <w:pStyle w:val="Bibliography"/>
-      </w:pPr>
-      <w:r>
-        <w:t xml:space="preserve">[48]</w:t>
+    <w:bookmarkEnd w:id="154"/>
+    <w:bookmarkStart w:id="156" w:name="ref-Johnson_2014"/>
+    <w:p>
+      <w:pPr>
+        <w:pStyle w:val="Bibliography"/>
+      </w:pPr>
+      <w:r>
+        <w:t xml:space="preserve">[49]</w:t>
       </w:r>
       <w:r>
         <w:t xml:space="preserve"> </w:t>
@@ -6153,7 +6198,7 @@
       <w:r>
         <w:t xml:space="preserve"> </w:t>
       </w:r>
-      <w:hyperlink r:id="rId153">
+      <w:hyperlink r:id="rId155">
         <w:r>
           <w:rPr>
             <w:rStyle w:val="Hyperlink"/>
@@ -6165,14 +6210,14 @@
         <w:t xml:space="preserve">.</w:t>
       </w:r>
     </w:p>
-    <w:bookmarkEnd w:id="154"/>
-    <w:bookmarkStart w:id="156" w:name="ref-Singh_Glowacki_2022"/>
-    <w:p>
-      <w:pPr>
-        <w:pStyle w:val="Bibliography"/>
-      </w:pPr>
-      <w:r>
-        <w:t xml:space="preserve">[49]</w:t>
+    <w:bookmarkEnd w:id="156"/>
+    <w:bookmarkStart w:id="158" w:name="ref-Singh_Glowacki_2022"/>
+    <w:p>
+      <w:pPr>
+        <w:pStyle w:val="Bibliography"/>
+      </w:pPr>
+      <w:r>
+        <w:t xml:space="preserve">[50]</w:t>
       </w:r>
       <w:r>
         <w:t xml:space="preserve"> </w:t>
@@ -6195,7 +6240,7 @@
       <w:r>
         <w:t xml:space="preserve"> </w:t>
       </w:r>
-      <w:hyperlink r:id="rId155">
+      <w:hyperlink r:id="rId157">
         <w:r>
           <w:rPr>
             <w:rStyle w:val="Hyperlink"/>
@@ -6207,14 +6252,14 @@
         <w:t xml:space="preserve">.</w:t>
       </w:r>
     </w:p>
-    <w:bookmarkEnd w:id="156"/>
-    <w:bookmarkStart w:id="158" w:name="ref-Schwendler_2012"/>
-    <w:p>
-      <w:pPr>
-        <w:pStyle w:val="Bibliography"/>
-      </w:pPr>
-      <w:r>
-        <w:t xml:space="preserve">[50]</w:t>
+    <w:bookmarkEnd w:id="158"/>
+    <w:bookmarkStart w:id="160" w:name="ref-Schwendler_2012"/>
+    <w:p>
+      <w:pPr>
+        <w:pStyle w:val="Bibliography"/>
+      </w:pPr>
+      <w:r>
+        <w:t xml:space="preserve">[51]</w:t>
       </w:r>
       <w:r>
         <w:t xml:space="preserve"> </w:t>
@@ -6255,7 +6300,7 @@
       <w:r>
         <w:t xml:space="preserve"> </w:t>
       </w:r>
-      <w:hyperlink r:id="rId157">
+      <w:hyperlink r:id="rId159">
         <w:r>
           <w:rPr>
             <w:rStyle w:val="Hyperlink"/>
@@ -6267,14 +6312,14 @@
         <w:t xml:space="preserve">.</w:t>
       </w:r>
     </w:p>
-    <w:bookmarkEnd w:id="158"/>
-    <w:bookmarkStart w:id="160" w:name="ref-Morwood_1987"/>
-    <w:p>
-      <w:pPr>
-        <w:pStyle w:val="Bibliography"/>
-      </w:pPr>
-      <w:r>
-        <w:t xml:space="preserve">[51]</w:t>
+    <w:bookmarkEnd w:id="160"/>
+    <w:bookmarkStart w:id="162" w:name="ref-Morwood_1987"/>
+    <w:p>
+      <w:pPr>
+        <w:pStyle w:val="Bibliography"/>
+      </w:pPr>
+      <w:r>
+        <w:t xml:space="preserve">[52]</w:t>
       </w:r>
       <w:r>
         <w:t xml:space="preserve"> </w:t>
@@ -6306,7 +6351,7 @@
       <w:r>
         <w:t xml:space="preserve"> </w:t>
       </w:r>
-      <w:hyperlink r:id="rId159">
+      <w:hyperlink r:id="rId161">
         <w:r>
           <w:rPr>
             <w:rStyle w:val="Hyperlink"/>
@@ -6318,14 +6363,14 @@
         <w:t xml:space="preserve">.</w:t>
       </w:r>
     </w:p>
-    <w:bookmarkEnd w:id="160"/>
-    <w:bookmarkStart w:id="162" w:name="ref-Mattson_2021"/>
-    <w:p>
-      <w:pPr>
-        <w:pStyle w:val="Bibliography"/>
-      </w:pPr>
-      <w:r>
-        <w:t xml:space="preserve">[52]</w:t>
+    <w:bookmarkEnd w:id="162"/>
+    <w:bookmarkStart w:id="164" w:name="ref-Mattson_2021"/>
+    <w:p>
+      <w:pPr>
+        <w:pStyle w:val="Bibliography"/>
+      </w:pPr>
+      <w:r>
+        <w:t xml:space="preserve">[53]</w:t>
       </w:r>
       <w:r>
         <w:t xml:space="preserve"> </w:t>
@@ -6339,7 +6384,7 @@
       <w:r>
         <w:t xml:space="preserve"> </w:t>
       </w:r>
-      <w:hyperlink r:id="rId161">
+      <w:hyperlink r:id="rId163">
         <w:r>
           <w:rPr>
             <w:rStyle w:val="Hyperlink"/>
@@ -6351,14 +6396,14 @@
         <w:t xml:space="preserve">.</w:t>
       </w:r>
     </w:p>
-    <w:bookmarkEnd w:id="162"/>
-    <w:bookmarkStart w:id="163" w:name="ref-Larsson_2006"/>
-    <w:p>
-      <w:pPr>
-        <w:pStyle w:val="Bibliography"/>
-      </w:pPr>
-      <w:r>
-        <w:t xml:space="preserve">[53]</w:t>
+    <w:bookmarkEnd w:id="164"/>
+    <w:bookmarkStart w:id="165" w:name="ref-Larsson_2006"/>
+    <w:p>
+      <w:pPr>
+        <w:pStyle w:val="Bibliography"/>
+      </w:pPr>
+      <w:r>
+        <w:t xml:space="preserve">[54]</w:t>
       </w:r>
       <w:r>
         <w:t xml:space="preserve"> </w:t>
@@ -6412,14 +6457,14 @@
         <w:t xml:space="preserve">, vol. 52, Almqvist &amp; Wiksell International; 2006, p. 253–87.</w:t>
       </w:r>
     </w:p>
-    <w:bookmarkEnd w:id="163"/>
-    <w:bookmarkStart w:id="165" w:name="ref-Moore_2010"/>
-    <w:p>
-      <w:pPr>
-        <w:pStyle w:val="Bibliography"/>
-      </w:pPr>
-      <w:r>
-        <w:t xml:space="preserve">[54]</w:t>
+    <w:bookmarkEnd w:id="165"/>
+    <w:bookmarkStart w:id="167" w:name="ref-Moore_2010"/>
+    <w:p>
+      <w:pPr>
+        <w:pStyle w:val="Bibliography"/>
+      </w:pPr>
+      <w:r>
+        <w:t xml:space="preserve">[55]</w:t>
       </w:r>
       <w:r>
         <w:t xml:space="preserve"> </w:t>
@@ -6484,7 +6529,7 @@
       <w:r>
         <w:t xml:space="preserve"> </w:t>
       </w:r>
-      <w:hyperlink r:id="rId164">
+      <w:hyperlink r:id="rId166">
         <w:r>
           <w:rPr>
             <w:rStyle w:val="Hyperlink"/>
@@ -6496,14 +6541,14 @@
         <w:t xml:space="preserve">.</w:t>
       </w:r>
     </w:p>
-    <w:bookmarkEnd w:id="165"/>
-    <w:bookmarkStart w:id="167" w:name="ref-Alfonso-Durrruty_Giles_Misarti2015"/>
-    <w:p>
-      <w:pPr>
-        <w:pStyle w:val="Bibliography"/>
-      </w:pPr>
-      <w:r>
-        <w:t xml:space="preserve">[55]</w:t>
+    <w:bookmarkEnd w:id="167"/>
+    <w:bookmarkStart w:id="169" w:name="ref-Alfonso-Durrruty_Giles_Misarti2015"/>
+    <w:p>
+      <w:pPr>
+        <w:pStyle w:val="Bibliography"/>
+      </w:pPr>
+      <w:r>
+        <w:t xml:space="preserve">[56]</w:t>
       </w:r>
       <w:r>
         <w:t xml:space="preserve"> </w:t>
@@ -6535,7 +6580,7 @@
       <w:r>
         <w:t xml:space="preserve"> </w:t>
       </w:r>
-      <w:hyperlink r:id="rId166">
+      <w:hyperlink r:id="rId168">
         <w:r>
           <w:rPr>
             <w:rStyle w:val="Hyperlink"/>
@@ -6547,14 +6592,14 @@
         <w:t xml:space="preserve">.</w:t>
       </w:r>
     </w:p>
-    <w:bookmarkEnd w:id="167"/>
-    <w:bookmarkStart w:id="168" w:name="ref-Vanhaeren_2005"/>
-    <w:p>
-      <w:pPr>
-        <w:pStyle w:val="Bibliography"/>
-      </w:pPr>
-      <w:r>
-        <w:t xml:space="preserve">[56]</w:t>
+    <w:bookmarkEnd w:id="169"/>
+    <w:bookmarkStart w:id="170" w:name="ref-Vanhaeren_2005"/>
+    <w:p>
+      <w:pPr>
+        <w:pStyle w:val="Bibliography"/>
+      </w:pPr>
+      <w:r>
+        <w:t xml:space="preserve">[57]</w:t>
       </w:r>
       <w:r>
         <w:t xml:space="preserve"> </w:t>
@@ -6566,14 +6611,14 @@
         <w:t xml:space="preserve">Vanhaeren M. Speaking with beads: The evolutionary significance of personal ornaments. In: d’Errico F, Backwell L, editors. From tools to symbols: From early hominids to modern humans, Wits University Press; 2005, p. 525–54.</w:t>
       </w:r>
     </w:p>
-    <w:bookmarkEnd w:id="168"/>
-    <w:bookmarkStart w:id="170" w:name="ref-Conkey_1985"/>
-    <w:p>
-      <w:pPr>
-        <w:pStyle w:val="Bibliography"/>
-      </w:pPr>
-      <w:r>
-        <w:t xml:space="preserve">[57]</w:t>
+    <w:bookmarkEnd w:id="170"/>
+    <w:bookmarkStart w:id="172" w:name="ref-Conkey_1985"/>
+    <w:p>
+      <w:pPr>
+        <w:pStyle w:val="Bibliography"/>
+      </w:pPr>
+      <w:r>
+        <w:t xml:space="preserve">[58]</w:t>
       </w:r>
       <w:r>
         <w:t xml:space="preserve"> </w:t>
@@ -6599,7 +6644,7 @@
       <w:r>
         <w:t xml:space="preserve"> </w:t>
       </w:r>
-      <w:hyperlink r:id="rId169">
+      <w:hyperlink r:id="rId171">
         <w:r>
           <w:rPr>
             <w:rStyle w:val="Hyperlink"/>
@@ -6611,14 +6656,14 @@
         <w:t xml:space="preserve">.</w:t>
       </w:r>
     </w:p>
-    <w:bookmarkEnd w:id="170"/>
-    <w:bookmarkStart w:id="171" w:name="ref-Conkey_1978"/>
-    <w:p>
-      <w:pPr>
-        <w:pStyle w:val="Bibliography"/>
-      </w:pPr>
-      <w:r>
-        <w:t xml:space="preserve">[58]</w:t>
+    <w:bookmarkEnd w:id="172"/>
+    <w:bookmarkStart w:id="173" w:name="ref-Conkey_1978"/>
+    <w:p>
+      <w:pPr>
+        <w:pStyle w:val="Bibliography"/>
+      </w:pPr>
+      <w:r>
+        <w:t xml:space="preserve">[59]</w:t>
       </w:r>
       <w:r>
         <w:t xml:space="preserve"> </w:t>
@@ -6639,14 +6684,14 @@
         <w:t xml:space="preserve">. In: Redman CL, Berman MJ, Curtin EV, Langhorne Jr William T., Versaggi NM, Wanser JC, editors. Social archaeology: Beyond subsistence and dating, New York: Academic Press; 1978, p. 61–85.</w:t>
       </w:r>
     </w:p>
-    <w:bookmarkEnd w:id="171"/>
-    <w:bookmarkStart w:id="173" w:name="ref-Tilley_1982"/>
-    <w:p>
-      <w:pPr>
-        <w:pStyle w:val="Bibliography"/>
-      </w:pPr>
-      <w:r>
-        <w:t xml:space="preserve">[59]</w:t>
+    <w:bookmarkEnd w:id="173"/>
+    <w:bookmarkStart w:id="175" w:name="ref-Tilley_1982"/>
+    <w:p>
+      <w:pPr>
+        <w:pStyle w:val="Bibliography"/>
+      </w:pPr>
+      <w:r>
+        <w:t xml:space="preserve">[60]</w:t>
       </w:r>
       <w:r>
         <w:t xml:space="preserve"> </w:t>
@@ -6660,7 +6705,7 @@
       <w:r>
         <w:t xml:space="preserve"> </w:t>
       </w:r>
-      <w:hyperlink r:id="rId172">
+      <w:hyperlink r:id="rId174">
         <w:r>
           <w:rPr>
             <w:rStyle w:val="Hyperlink"/>
@@ -6672,14 +6717,14 @@
         <w:t xml:space="preserve">.</w:t>
       </w:r>
     </w:p>
-    <w:bookmarkEnd w:id="173"/>
-    <w:bookmarkStart w:id="175" w:name="ref-Hodder1979"/>
-    <w:p>
-      <w:pPr>
-        <w:pStyle w:val="Bibliography"/>
-      </w:pPr>
-      <w:r>
-        <w:t xml:space="preserve">[60]</w:t>
+    <w:bookmarkEnd w:id="175"/>
+    <w:bookmarkStart w:id="177" w:name="ref-Hodder1979"/>
+    <w:p>
+      <w:pPr>
+        <w:pStyle w:val="Bibliography"/>
+      </w:pPr>
+      <w:r>
+        <w:t xml:space="preserve">[61]</w:t>
       </w:r>
       <w:r>
         <w:t xml:space="preserve"> </w:t>
@@ -6693,7 +6738,7 @@
       <w:r>
         <w:t xml:space="preserve"> </w:t>
       </w:r>
-      <w:hyperlink r:id="rId174">
+      <w:hyperlink r:id="rId176">
         <w:r>
           <w:rPr>
             <w:rStyle w:val="Hyperlink"/>
@@ -6705,14 +6750,14 @@
         <w:t xml:space="preserve">.</w:t>
       </w:r>
     </w:p>
-    <w:bookmarkEnd w:id="175"/>
-    <w:bookmarkStart w:id="177" w:name="ref-Hodder1977"/>
-    <w:p>
-      <w:pPr>
-        <w:pStyle w:val="Bibliography"/>
-      </w:pPr>
-      <w:r>
-        <w:t xml:space="preserve">[61]</w:t>
+    <w:bookmarkEnd w:id="177"/>
+    <w:bookmarkStart w:id="179" w:name="ref-Hodder1977"/>
+    <w:p>
+      <w:pPr>
+        <w:pStyle w:val="Bibliography"/>
+      </w:pPr>
+      <w:r>
+        <w:t xml:space="preserve">[62]</w:t>
       </w:r>
       <w:r>
         <w:t xml:space="preserve"> </w:t>
@@ -6744,7 +6789,7 @@
       <w:r>
         <w:t xml:space="preserve"> </w:t>
       </w:r>
-      <w:hyperlink r:id="rId176">
+      <w:hyperlink r:id="rId178">
         <w:r>
           <w:rPr>
             <w:rStyle w:val="Hyperlink"/>
@@ -6756,14 +6801,14 @@
         <w:t xml:space="preserve">.</w:t>
       </w:r>
     </w:p>
-    <w:bookmarkEnd w:id="177"/>
-    <w:bookmarkStart w:id="179" w:name="ref-Binford_1990"/>
-    <w:p>
-      <w:pPr>
-        <w:pStyle w:val="Bibliography"/>
-      </w:pPr>
-      <w:r>
-        <w:t xml:space="preserve">[62]</w:t>
+    <w:bookmarkEnd w:id="179"/>
+    <w:bookmarkStart w:id="181" w:name="ref-Binford_1990"/>
+    <w:p>
+      <w:pPr>
+        <w:pStyle w:val="Bibliography"/>
+      </w:pPr>
+      <w:r>
+        <w:t xml:space="preserve">[63]</w:t>
       </w:r>
       <w:r>
         <w:t xml:space="preserve"> </w:t>
@@ -6777,7 +6822,7 @@
       <w:r>
         <w:t xml:space="preserve"> </w:t>
       </w:r>
-      <w:hyperlink r:id="rId178">
+      <w:hyperlink r:id="rId180">
         <w:r>
           <w:rPr>
             <w:rStyle w:val="Hyperlink"/>
@@ -6789,14 +6834,14 @@
         <w:t xml:space="preserve">.</w:t>
       </w:r>
     </w:p>
-    <w:bookmarkEnd w:id="179"/>
-    <w:bookmarkStart w:id="181" w:name="ref-Kelly_1983"/>
-    <w:p>
-      <w:pPr>
-        <w:pStyle w:val="Bibliography"/>
-      </w:pPr>
-      <w:r>
-        <w:t xml:space="preserve">[63]</w:t>
+    <w:bookmarkEnd w:id="181"/>
+    <w:bookmarkStart w:id="183" w:name="ref-Kelly_1983"/>
+    <w:p>
+      <w:pPr>
+        <w:pStyle w:val="Bibliography"/>
+      </w:pPr>
+      <w:r>
+        <w:t xml:space="preserve">[64]</w:t>
       </w:r>
       <w:r>
         <w:t xml:space="preserve"> </w:t>
@@ -6810,7 +6855,7 @@
       <w:r>
         <w:t xml:space="preserve"> </w:t>
       </w:r>
-      <w:hyperlink r:id="rId180">
+      <w:hyperlink r:id="rId182">
         <w:r>
           <w:rPr>
             <w:rStyle w:val="Hyperlink"/>
@@ -6822,14 +6867,14 @@
         <w:t xml:space="preserve">.</w:t>
       </w:r>
     </w:p>
-    <w:bookmarkEnd w:id="181"/>
-    <w:bookmarkStart w:id="183" w:name="ref-Padilla-Iglesias_Bischoff_2024"/>
-    <w:p>
-      <w:pPr>
-        <w:pStyle w:val="Bibliography"/>
-      </w:pPr>
-      <w:r>
-        <w:t xml:space="preserve">[64]</w:t>
+    <w:bookmarkEnd w:id="183"/>
+    <w:bookmarkStart w:id="185" w:name="ref-Padilla-Iglesias_Bischoff_2024"/>
+    <w:p>
+      <w:pPr>
+        <w:pStyle w:val="Bibliography"/>
+      </w:pPr>
+      <w:r>
+        <w:t xml:space="preserve">[65]</w:t>
       </w:r>
       <w:r>
         <w:t xml:space="preserve"> </w:t>
@@ -6843,7 +6888,7 @@
       <w:r>
         <w:t xml:space="preserve"> </w:t>
       </w:r>
-      <w:hyperlink r:id="rId182">
+      <w:hyperlink r:id="rId184">
         <w:r>
           <w:rPr>
             <w:rStyle w:val="Hyperlink"/>
@@ -6855,14 +6900,14 @@
         <w:t xml:space="preserve">.</w:t>
       </w:r>
     </w:p>
-    <w:bookmarkEnd w:id="183"/>
-    <w:bookmarkStart w:id="185" w:name="ref-Whallon_2006"/>
-    <w:p>
-      <w:pPr>
-        <w:pStyle w:val="Bibliography"/>
-      </w:pPr>
-      <w:r>
-        <w:t xml:space="preserve">[65]</w:t>
+    <w:bookmarkEnd w:id="185"/>
+    <w:bookmarkStart w:id="187" w:name="ref-Whallon_2006"/>
+    <w:p>
+      <w:pPr>
+        <w:pStyle w:val="Bibliography"/>
+      </w:pPr>
+      <w:r>
+        <w:t xml:space="preserve">[66]</w:t>
       </w:r>
       <w:r>
         <w:t xml:space="preserve"> </w:t>
@@ -6885,7 +6930,7 @@
       <w:r>
         <w:t xml:space="preserve"> </w:t>
       </w:r>
-      <w:hyperlink r:id="rId184">
+      <w:hyperlink r:id="rId186">
         <w:r>
           <w:rPr>
             <w:rStyle w:val="Hyperlink"/>
@@ -6897,14 +6942,14 @@
         <w:t xml:space="preserve">.</w:t>
       </w:r>
     </w:p>
-    <w:bookmarkEnd w:id="185"/>
-    <w:bookmarkStart w:id="186" w:name="ref-Fitzhugh_Phillips_Gjesfeld_2011"/>
-    <w:p>
-      <w:pPr>
-        <w:pStyle w:val="Bibliography"/>
-      </w:pPr>
-      <w:r>
-        <w:t xml:space="preserve">[66]</w:t>
+    <w:bookmarkEnd w:id="187"/>
+    <w:bookmarkStart w:id="188" w:name="ref-Fitzhugh_Phillips_Gjesfeld_2011"/>
+    <w:p>
+      <w:pPr>
+        <w:pStyle w:val="Bibliography"/>
+      </w:pPr>
+      <w:r>
+        <w:t xml:space="preserve">[67]</w:t>
       </w:r>
       <w:r>
         <w:t xml:space="preserve"> </w:t>
@@ -6925,14 +6970,14 @@
         <w:t xml:space="preserve">. In: Whallon R, Lovis WA, Hitchcock RK, editors. Information and its role in hunter-gatherer bands, Cotsen Institute of Archaeology Press at UCLA; 2011, p. 85–116.</w:t>
       </w:r>
     </w:p>
-    <w:bookmarkEnd w:id="186"/>
-    <w:bookmarkStart w:id="188" w:name="ref-Lovis_Donahue_2011"/>
-    <w:p>
-      <w:pPr>
-        <w:pStyle w:val="Bibliography"/>
-      </w:pPr>
-      <w:r>
-        <w:t xml:space="preserve">[67]</w:t>
+    <w:bookmarkEnd w:id="188"/>
+    <w:bookmarkStart w:id="190" w:name="ref-Lovis_Donahue_2011"/>
+    <w:p>
+      <w:pPr>
+        <w:pStyle w:val="Bibliography"/>
+      </w:pPr>
+      <w:r>
+        <w:t xml:space="preserve">[68]</w:t>
       </w:r>
       <w:r>
         <w:t xml:space="preserve"> </w:t>
@@ -6964,7 +7009,7 @@
       <w:r>
         <w:t xml:space="preserve"> </w:t>
       </w:r>
-      <w:hyperlink r:id="rId187">
+      <w:hyperlink r:id="rId189">
         <w:r>
           <w:rPr>
             <w:rStyle w:val="Hyperlink"/>
@@ -6976,14 +7021,14 @@
         <w:t xml:space="preserve">.</w:t>
       </w:r>
     </w:p>
-    <w:bookmarkEnd w:id="188"/>
-    <w:bookmarkStart w:id="190" w:name="ref-Hitchcock_Ebert_2011"/>
-    <w:p>
-      <w:pPr>
-        <w:pStyle w:val="Bibliography"/>
-      </w:pPr>
-      <w:r>
-        <w:t xml:space="preserve">[68]</w:t>
+    <w:bookmarkEnd w:id="190"/>
+    <w:bookmarkStart w:id="192" w:name="ref-Hitchcock_Ebert_2011"/>
+    <w:p>
+      <w:pPr>
+        <w:pStyle w:val="Bibliography"/>
+      </w:pPr>
+      <w:r>
+        <w:t xml:space="preserve">[69]</w:t>
       </w:r>
       <w:r>
         <w:t xml:space="preserve"> </w:t>
@@ -7015,7 +7060,7 @@
       <w:r>
         <w:t xml:space="preserve"> </w:t>
       </w:r>
-      <w:hyperlink r:id="rId189">
+      <w:hyperlink r:id="rId191">
         <w:r>
           <w:rPr>
             <w:rStyle w:val="Hyperlink"/>
@@ -7027,14 +7072,14 @@
         <w:t xml:space="preserve">.</w:t>
       </w:r>
     </w:p>
-    <w:bookmarkEnd w:id="190"/>
-    <w:bookmarkStart w:id="192" w:name="ref-Romano_Lozano_Fern2022"/>
-    <w:p>
-      <w:pPr>
-        <w:pStyle w:val="Bibliography"/>
-      </w:pPr>
-      <w:r>
-        <w:t xml:space="preserve">[69]</w:t>
+    <w:bookmarkEnd w:id="192"/>
+    <w:bookmarkStart w:id="194" w:name="ref-Romano_Lozano_Fern2022"/>
+    <w:p>
+      <w:pPr>
+        <w:pStyle w:val="Bibliography"/>
+      </w:pPr>
+      <w:r>
+        <w:t xml:space="preserve">[70]</w:t>
       </w:r>
       <w:r>
         <w:t xml:space="preserve"> </w:t>
@@ -7072,7 +7117,7 @@
       <w:r>
         <w:t xml:space="preserve"> </w:t>
       </w:r>
-      <w:hyperlink r:id="rId191">
+      <w:hyperlink r:id="rId193">
         <w:r>
           <w:rPr>
             <w:rStyle w:val="Hyperlink"/>
@@ -7084,14 +7129,14 @@
         <w:t xml:space="preserve">.</w:t>
       </w:r>
     </w:p>
-    <w:bookmarkEnd w:id="192"/>
-    <w:bookmarkStart w:id="194" w:name="ref-Kelly_2024"/>
-    <w:p>
-      <w:pPr>
-        <w:pStyle w:val="Bibliography"/>
-      </w:pPr>
-      <w:r>
-        <w:t xml:space="preserve">[70]</w:t>
+    <w:bookmarkEnd w:id="194"/>
+    <w:bookmarkStart w:id="196" w:name="ref-Kelly_2024"/>
+    <w:p>
+      <w:pPr>
+        <w:pStyle w:val="Bibliography"/>
+      </w:pPr>
+      <w:r>
+        <w:t xml:space="preserve">[71]</w:t>
       </w:r>
       <w:r>
         <w:t xml:space="preserve"> </w:t>
@@ -7126,7 +7171,7 @@
       <w:r>
         <w:t xml:space="preserve"> </w:t>
       </w:r>
-      <w:hyperlink r:id="rId193">
+      <w:hyperlink r:id="rId195">
         <w:r>
           <w:rPr>
             <w:rStyle w:val="Hyperlink"/>
@@ -7138,14 +7183,14 @@
         <w:t xml:space="preserve">.</w:t>
       </w:r>
     </w:p>
-    <w:bookmarkEnd w:id="194"/>
-    <w:bookmarkStart w:id="196" w:name="ref-Kinahan_2013"/>
-    <w:p>
-      <w:pPr>
-        <w:pStyle w:val="Bibliography"/>
-      </w:pPr>
-      <w:r>
-        <w:t xml:space="preserve">[71]</w:t>
+    <w:bookmarkEnd w:id="196"/>
+    <w:bookmarkStart w:id="198" w:name="ref-Kinahan_2013"/>
+    <w:p>
+      <w:pPr>
+        <w:pStyle w:val="Bibliography"/>
+      </w:pPr>
+      <w:r>
+        <w:t xml:space="preserve">[72]</w:t>
       </w:r>
       <w:r>
         <w:t xml:space="preserve"> </w:t>
@@ -7180,7 +7225,7 @@
       <w:r>
         <w:t xml:space="preserve"> </w:t>
       </w:r>
-      <w:hyperlink r:id="rId195">
+      <w:hyperlink r:id="rId197">
         <w:r>
           <w:rPr>
             <w:rStyle w:val="Hyperlink"/>
@@ -7192,14 +7237,14 @@
         <w:t xml:space="preserve">.</w:t>
       </w:r>
     </w:p>
-    <w:bookmarkEnd w:id="196"/>
-    <w:bookmarkStart w:id="198" w:name="ref-Newlander_2012"/>
-    <w:p>
-      <w:pPr>
-        <w:pStyle w:val="Bibliography"/>
-      </w:pPr>
-      <w:r>
-        <w:t xml:space="preserve">[72]</w:t>
+    <w:bookmarkEnd w:id="198"/>
+    <w:bookmarkStart w:id="200" w:name="ref-Newlander_2012"/>
+    <w:p>
+      <w:pPr>
+        <w:pStyle w:val="Bibliography"/>
+      </w:pPr>
+      <w:r>
+        <w:t xml:space="preserve">[73]</w:t>
       </w:r>
       <w:r>
         <w:t xml:space="preserve"> </w:t>
@@ -7213,7 +7258,7 @@
       <w:r>
         <w:t xml:space="preserve"> </w:t>
       </w:r>
-      <w:hyperlink r:id="rId197">
+      <w:hyperlink r:id="rId199">
         <w:r>
           <w:rPr>
             <w:rStyle w:val="Hyperlink"/>
@@ -7273,14 +7318,14 @@
         <w:t xml:space="preserve">. Ph.D. University of Michigan, 2012.</w:t>
       </w:r>
     </w:p>
-    <w:bookmarkEnd w:id="198"/>
-    <w:bookmarkStart w:id="200" w:name="ref-Iizuka_Ferguson_Izuho_2022"/>
-    <w:p>
-      <w:pPr>
-        <w:pStyle w:val="Bibliography"/>
-      </w:pPr>
-      <w:r>
-        <w:t xml:space="preserve">[73]</w:t>
+    <w:bookmarkEnd w:id="200"/>
+    <w:bookmarkStart w:id="202" w:name="ref-Iizuka_Ferguson_Izuho_2022"/>
+    <w:p>
+      <w:pPr>
+        <w:pStyle w:val="Bibliography"/>
+      </w:pPr>
+      <w:r>
+        <w:t xml:space="preserve">[74]</w:t>
       </w:r>
       <w:r>
         <w:t xml:space="preserve"> </w:t>
@@ -7327,7 +7372,7 @@
       <w:r>
         <w:t xml:space="preserve"> </w:t>
       </w:r>
-      <w:hyperlink r:id="rId199">
+      <w:hyperlink r:id="rId201">
         <w:r>
           <w:rPr>
             <w:rStyle w:val="Hyperlink"/>
@@ -7339,14 +7384,14 @@
         <w:t xml:space="preserve">.</w:t>
       </w:r>
     </w:p>
-    <w:bookmarkEnd w:id="200"/>
-    <w:bookmarkStart w:id="202" w:name="ref-conkey_agg"/>
-    <w:p>
-      <w:pPr>
-        <w:pStyle w:val="Bibliography"/>
-      </w:pPr>
-      <w:r>
-        <w:t xml:space="preserve">[74]</w:t>
+    <w:bookmarkEnd w:id="202"/>
+    <w:bookmarkStart w:id="204" w:name="ref-conkey_agg"/>
+    <w:p>
+      <w:pPr>
+        <w:pStyle w:val="Bibliography"/>
+      </w:pPr>
+      <w:r>
+        <w:t xml:space="preserve">[75]</w:t>
       </w:r>
       <w:r>
         <w:t xml:space="preserve"> </w:t>
@@ -7372,7 +7417,7 @@
       <w:r>
         <w:t xml:space="preserve"> </w:t>
       </w:r>
-      <w:hyperlink r:id="rId201">
+      <w:hyperlink r:id="rId203">
         <w:r>
           <w:rPr>
             <w:rStyle w:val="Hyperlink"/>
@@ -7384,14 +7429,14 @@
         <w:t xml:space="preserve">.</w:t>
       </w:r>
     </w:p>
-    <w:bookmarkEnd w:id="202"/>
-    <w:bookmarkStart w:id="204" w:name="ref-Maher_Conkey_2019"/>
-    <w:p>
-      <w:pPr>
-        <w:pStyle w:val="Bibliography"/>
-      </w:pPr>
-      <w:r>
-        <w:t xml:space="preserve">[75]</w:t>
+    <w:bookmarkEnd w:id="204"/>
+    <w:bookmarkStart w:id="206" w:name="ref-Maher_Conkey_2019"/>
+    <w:p>
+      <w:pPr>
+        <w:pStyle w:val="Bibliography"/>
+      </w:pPr>
+      <w:r>
+        <w:t xml:space="preserve">[76]</w:t>
       </w:r>
       <w:r>
         <w:t xml:space="preserve"> </w:t>
@@ -7438,7 +7483,7 @@
       <w:r>
         <w:t xml:space="preserve"> </w:t>
       </w:r>
-      <w:hyperlink r:id="rId203">
+      <w:hyperlink r:id="rId205">
         <w:r>
           <w:rPr>
             <w:rStyle w:val="Hyperlink"/>
@@ -7450,14 +7495,14 @@
         <w:t xml:space="preserve">.</w:t>
       </w:r>
     </w:p>
-    <w:bookmarkEnd w:id="204"/>
-    <w:bookmarkStart w:id="206" w:name="ref-bahn1982inter"/>
-    <w:p>
-      <w:pPr>
-        <w:pStyle w:val="Bibliography"/>
-      </w:pPr>
-      <w:r>
-        <w:t xml:space="preserve">[76]</w:t>
+    <w:bookmarkEnd w:id="206"/>
+    <w:bookmarkStart w:id="208" w:name="ref-bahn1982inter"/>
+    <w:p>
+      <w:pPr>
+        <w:pStyle w:val="Bibliography"/>
+      </w:pPr>
+      <w:r>
+        <w:t xml:space="preserve">[77]</w:t>
       </w:r>
       <w:r>
         <w:t xml:space="preserve"> </w:t>
@@ -7492,7 +7537,7 @@
       <w:r>
         <w:t xml:space="preserve"> </w:t>
       </w:r>
-      <w:hyperlink r:id="rId205">
+      <w:hyperlink r:id="rId207">
         <w:r>
           <w:rPr>
             <w:rStyle w:val="Hyperlink"/>
@@ -7504,14 +7549,14 @@
         <w:t xml:space="preserve">.</w:t>
       </w:r>
     </w:p>
-    <w:bookmarkEnd w:id="206"/>
-    <w:bookmarkStart w:id="208" w:name="ref-Bourdier_2013"/>
-    <w:p>
-      <w:pPr>
-        <w:pStyle w:val="Bibliography"/>
-      </w:pPr>
-      <w:r>
-        <w:t xml:space="preserve">[77]</w:t>
+    <w:bookmarkEnd w:id="208"/>
+    <w:bookmarkStart w:id="210" w:name="ref-Bourdier_2013"/>
+    <w:p>
+      <w:pPr>
+        <w:pStyle w:val="Bibliography"/>
+      </w:pPr>
+      <w:r>
+        <w:t xml:space="preserve">[78]</w:t>
       </w:r>
       <w:r>
         <w:t xml:space="preserve"> </w:t>
@@ -7561,7 +7606,7 @@
       <w:r>
         <w:t xml:space="preserve"> </w:t>
       </w:r>
-      <w:hyperlink r:id="rId207">
+      <w:hyperlink r:id="rId209">
         <w:r>
           <w:rPr>
             <w:rStyle w:val="Hyperlink"/>
@@ -7573,14 +7618,14 @@
         <w:t xml:space="preserve">.</w:t>
       </w:r>
     </w:p>
-    <w:bookmarkEnd w:id="208"/>
-    <w:bookmarkStart w:id="210" w:name="ref-Svoboda_2013"/>
-    <w:p>
-      <w:pPr>
-        <w:pStyle w:val="Bibliography"/>
-      </w:pPr>
-      <w:r>
-        <w:t xml:space="preserve">[78]</w:t>
+    <w:bookmarkEnd w:id="210"/>
+    <w:bookmarkStart w:id="212" w:name="ref-Svoboda_2013"/>
+    <w:p>
+      <w:pPr>
+        <w:pStyle w:val="Bibliography"/>
+      </w:pPr>
+      <w:r>
+        <w:t xml:space="preserve">[79]</w:t>
       </w:r>
       <w:r>
         <w:t xml:space="preserve"> </w:t>
@@ -7606,7 +7651,7 @@
       <w:r>
         <w:t xml:space="preserve"> </w:t>
       </w:r>
-      <w:hyperlink r:id="rId209">
+      <w:hyperlink r:id="rId211">
         <w:r>
           <w:rPr>
             <w:rStyle w:val="Hyperlink"/>
@@ -7618,14 +7663,14 @@
         <w:t xml:space="preserve">.</w:t>
       </w:r>
     </w:p>
-    <w:bookmarkEnd w:id="210"/>
-    <w:bookmarkStart w:id="212" w:name="ref-white1992rethinking"/>
-    <w:p>
-      <w:pPr>
-        <w:pStyle w:val="Bibliography"/>
-      </w:pPr>
-      <w:r>
-        <w:t xml:space="preserve">[79]</w:t>
+    <w:bookmarkEnd w:id="212"/>
+    <w:bookmarkStart w:id="214" w:name="ref-white1992rethinking"/>
+    <w:p>
+      <w:pPr>
+        <w:pStyle w:val="Bibliography"/>
+      </w:pPr>
+      <w:r>
+        <w:t xml:space="preserve">[80]</w:t>
       </w:r>
       <w:r>
         <w:t xml:space="preserve"> </w:t>
@@ -7651,7 +7696,7 @@
       <w:r>
         <w:t xml:space="preserve"> </w:t>
       </w:r>
-      <w:hyperlink r:id="rId211">
+      <w:hyperlink r:id="rId213">
         <w:r>
           <w:rPr>
             <w:rStyle w:val="Hyperlink"/>
@@ -7663,14 +7708,14 @@
         <w:t xml:space="preserve">.</w:t>
       </w:r>
     </w:p>
-    <w:bookmarkEnd w:id="212"/>
-    <w:bookmarkStart w:id="213" w:name="X79d7c52b9cdbe72fc1b94e51c6ee6057d0c4a50"/>
-    <w:p>
-      <w:pPr>
-        <w:pStyle w:val="Bibliography"/>
-      </w:pPr>
-      <w:r>
-        <w:t xml:space="preserve">[80]</w:t>
+    <w:bookmarkEnd w:id="214"/>
+    <w:bookmarkStart w:id="215" w:name="X79d7c52b9cdbe72fc1b94e51c6ee6057d0c4a50"/>
+    <w:p>
+      <w:pPr>
+        <w:pStyle w:val="Bibliography"/>
+      </w:pPr>
+      <w:r>
+        <w:t xml:space="preserve">[81]</w:t>
       </w:r>
       <w:r>
         <w:t xml:space="preserve"> </w:t>
@@ -7706,14 +7751,14 @@
         <w:t xml:space="preserve">household, SUNY Press; 2010, p. 235–44.</w:t>
       </w:r>
     </w:p>
-    <w:bookmarkEnd w:id="213"/>
-    <w:bookmarkStart w:id="215" w:name="ref-montet-white1994"/>
-    <w:p>
-      <w:pPr>
-        <w:pStyle w:val="Bibliography"/>
-      </w:pPr>
-      <w:r>
-        <w:t xml:space="preserve">[81]</w:t>
+    <w:bookmarkEnd w:id="215"/>
+    <w:bookmarkStart w:id="217" w:name="ref-montet-white1994"/>
+    <w:p>
+      <w:pPr>
+        <w:pStyle w:val="Bibliography"/>
+      </w:pPr>
+      <w:r>
+        <w:t xml:space="preserve">[82]</w:t>
       </w:r>
       <w:r>
         <w:t xml:space="preserve"> </w:t>
@@ -7748,7 +7793,7 @@
       <w:r>
         <w:t xml:space="preserve"> </w:t>
       </w:r>
-      <w:hyperlink r:id="rId214">
+      <w:hyperlink r:id="rId216">
         <w:r>
           <w:rPr>
             <w:rStyle w:val="Hyperlink"/>
@@ -7760,14 +7805,14 @@
         <w:t xml:space="preserve">.</w:t>
       </w:r>
     </w:p>
-    <w:bookmarkEnd w:id="215"/>
-    <w:bookmarkStart w:id="217" w:name="ref-Frerebeau_2025"/>
-    <w:p>
-      <w:pPr>
-        <w:pStyle w:val="Bibliography"/>
-      </w:pPr>
-      <w:r>
-        <w:t xml:space="preserve">[82]</w:t>
+    <w:bookmarkEnd w:id="217"/>
+    <w:bookmarkStart w:id="219" w:name="ref-Frerebeau_2025"/>
+    <w:p>
+      <w:pPr>
+        <w:pStyle w:val="Bibliography"/>
+      </w:pPr>
+      <w:r>
+        <w:t xml:space="preserve">[83]</w:t>
       </w:r>
       <w:r>
         <w:t xml:space="preserve"> </w:t>
@@ -7781,7 +7826,7 @@
       <w:r>
         <w:t xml:space="preserve"> </w:t>
       </w:r>
-      <w:hyperlink r:id="rId216">
+      <w:hyperlink r:id="rId218">
         <w:r>
           <w:rPr>
             <w:rStyle w:val="Hyperlink"/>
@@ -7793,14 +7838,14 @@
         <w:t xml:space="preserve">.</w:t>
       </w:r>
     </w:p>
-    <w:bookmarkEnd w:id="217"/>
-    <w:bookmarkStart w:id="219" w:name="ref-Kintigh_1984"/>
-    <w:p>
-      <w:pPr>
-        <w:pStyle w:val="Bibliography"/>
-      </w:pPr>
-      <w:r>
-        <w:t xml:space="preserve">[83]</w:t>
+    <w:bookmarkEnd w:id="219"/>
+    <w:bookmarkStart w:id="221" w:name="ref-Kintigh_1984"/>
+    <w:p>
+      <w:pPr>
+        <w:pStyle w:val="Bibliography"/>
+      </w:pPr>
+      <w:r>
+        <w:t xml:space="preserve">[84]</w:t>
       </w:r>
       <w:r>
         <w:t xml:space="preserve"> </w:t>
@@ -7814,7 +7859,7 @@
       <w:r>
         <w:t xml:space="preserve"> </w:t>
       </w:r>
-      <w:hyperlink r:id="rId218">
+      <w:hyperlink r:id="rId220">
         <w:r>
           <w:rPr>
             <w:rStyle w:val="Hyperlink"/>
@@ -7826,14 +7871,14 @@
         <w:t xml:space="preserve">.</w:t>
       </w:r>
     </w:p>
-    <w:bookmarkEnd w:id="219"/>
-    <w:bookmarkStart w:id="221" w:name="X8c17deb08b87fbfa26556dda630532ff62c8bd1"/>
-    <w:p>
-      <w:pPr>
-        <w:pStyle w:val="Bibliography"/>
-      </w:pPr>
-      <w:r>
-        <w:t xml:space="preserve">[84]</w:t>
+    <w:bookmarkEnd w:id="221"/>
+    <w:bookmarkStart w:id="223" w:name="X8c17deb08b87fbfa26556dda630532ff62c8bd1"/>
+    <w:p>
+      <w:pPr>
+        <w:pStyle w:val="Bibliography"/>
+      </w:pPr>
+      <w:r>
+        <w:t xml:space="preserve">[85]</w:t>
       </w:r>
       <w:r>
         <w:t xml:space="preserve"> </w:t>
@@ -7868,7 +7913,7 @@
       <w:r>
         <w:t xml:space="preserve"> </w:t>
       </w:r>
-      <w:hyperlink r:id="rId220">
+      <w:hyperlink r:id="rId222">
         <w:r>
           <w:rPr>
             <w:rStyle w:val="Hyperlink"/>
@@ -7880,14 +7925,14 @@
         <w:t xml:space="preserve">.</w:t>
       </w:r>
     </w:p>
-    <w:bookmarkEnd w:id="221"/>
-    <w:bookmarkStart w:id="223" w:name="ref-smith1992Design"/>
-    <w:p>
-      <w:pPr>
-        <w:pStyle w:val="Bibliography"/>
-      </w:pPr>
-      <w:r>
-        <w:t xml:space="preserve">[85]</w:t>
+    <w:bookmarkEnd w:id="223"/>
+    <w:bookmarkStart w:id="225" w:name="ref-smith1992Design"/>
+    <w:p>
+      <w:pPr>
+        <w:pStyle w:val="Bibliography"/>
+      </w:pPr>
+      <w:r>
+        <w:t xml:space="preserve">[86]</w:t>
       </w:r>
       <w:r>
         <w:t xml:space="preserve"> </w:t>
@@ -7916,7 +7961,7 @@
       <w:r>
         <w:t xml:space="preserve"> </w:t>
       </w:r>
-      <w:hyperlink r:id="rId222">
+      <w:hyperlink r:id="rId224">
         <w:r>
           <w:rPr>
             <w:rStyle w:val="Hyperlink"/>
@@ -7928,14 +7973,14 @@
         <w:t xml:space="preserve">.</w:t>
       </w:r>
     </w:p>
-    <w:bookmarkEnd w:id="223"/>
-    <w:bookmarkStart w:id="224" w:name="ref-hays1993symbol"/>
-    <w:p>
-      <w:pPr>
-        <w:pStyle w:val="Bibliography"/>
-      </w:pPr>
-      <w:r>
-        <w:t xml:space="preserve">[86]</w:t>
+    <w:bookmarkEnd w:id="225"/>
+    <w:bookmarkStart w:id="226" w:name="ref-hays1993symbol"/>
+    <w:p>
+      <w:pPr>
+        <w:pStyle w:val="Bibliography"/>
+      </w:pPr>
+      <w:r>
+        <w:t xml:space="preserve">[87]</w:t>
       </w:r>
       <w:r>
         <w:t xml:space="preserve"> </w:t>
@@ -7947,14 +7992,14 @@
         <w:t xml:space="preserve">Hays KA. When is a symbol archaeologically meaningful? Meaning, function, and prehistoric visual arts. In: Yoffee N, Sherratt A, editors. Archaeological theory: Who sets the agenda?, Cambridge University Press; 1993, p. 81–92.</w:t>
       </w:r>
     </w:p>
-    <w:bookmarkEnd w:id="224"/>
-    <w:bookmarkStart w:id="226" w:name="ref-McDonald_Veth_Lilley_2006"/>
-    <w:p>
-      <w:pPr>
-        <w:pStyle w:val="Bibliography"/>
-      </w:pPr>
-      <w:r>
-        <w:t xml:space="preserve">[87]</w:t>
+    <w:bookmarkEnd w:id="226"/>
+    <w:bookmarkStart w:id="228" w:name="ref-McDonald_Veth_Lilley_2006"/>
+    <w:p>
+      <w:pPr>
+        <w:pStyle w:val="Bibliography"/>
+      </w:pPr>
+      <w:r>
+        <w:t xml:space="preserve">[88]</w:t>
       </w:r>
       <w:r>
         <w:t xml:space="preserve"> </w:t>
@@ -8010,7 +8055,7 @@
       <w:r>
         <w:t xml:space="preserve"> </w:t>
       </w:r>
-      <w:hyperlink r:id="rId225">
+      <w:hyperlink r:id="rId227">
         <w:r>
           <w:rPr>
             <w:rStyle w:val="Hyperlink"/>
@@ -8022,14 +8067,14 @@
         <w:t xml:space="preserve">.</w:t>
       </w:r>
     </w:p>
-    <w:bookmarkEnd w:id="226"/>
-    <w:bookmarkStart w:id="228" w:name="ref-Lourandos_1985"/>
-    <w:p>
-      <w:pPr>
-        <w:pStyle w:val="Bibliography"/>
-      </w:pPr>
-      <w:r>
-        <w:t xml:space="preserve">[88]</w:t>
+    <w:bookmarkEnd w:id="228"/>
+    <w:bookmarkStart w:id="230" w:name="ref-Lourandos_1985"/>
+    <w:p>
+      <w:pPr>
+        <w:pStyle w:val="Bibliography"/>
+      </w:pPr>
+      <w:r>
+        <w:t xml:space="preserve">[89]</w:t>
       </w:r>
       <w:r>
         <w:t xml:space="preserve"> </w:t>
@@ -8055,7 +8100,7 @@
       <w:r>
         <w:t xml:space="preserve"> </w:t>
       </w:r>
-      <w:hyperlink r:id="rId227">
+      <w:hyperlink r:id="rId229">
         <w:r>
           <w:rPr>
             <w:rStyle w:val="Hyperlink"/>
@@ -8067,14 +8112,14 @@
         <w:t xml:space="preserve">.</w:t>
       </w:r>
     </w:p>
-    <w:bookmarkEnd w:id="228"/>
-    <w:bookmarkStart w:id="230" w:name="ref-barton_clark_cohen1994"/>
-    <w:p>
-      <w:pPr>
-        <w:pStyle w:val="Bibliography"/>
-      </w:pPr>
-      <w:r>
-        <w:t xml:space="preserve">[89]</w:t>
+    <w:bookmarkEnd w:id="230"/>
+    <w:bookmarkStart w:id="232" w:name="ref-barton_clark_cohen1994"/>
+    <w:p>
+      <w:pPr>
+        <w:pStyle w:val="Bibliography"/>
+      </w:pPr>
+      <w:r>
+        <w:t xml:space="preserve">[90]</w:t>
       </w:r>
       <w:r>
         <w:t xml:space="preserve"> </w:t>
@@ -8109,7 +8154,7 @@
       <w:r>
         <w:t xml:space="preserve"> </w:t>
       </w:r>
-      <w:hyperlink r:id="rId229">
+      <w:hyperlink r:id="rId231">
         <w:r>
           <w:rPr>
             <w:rStyle w:val="Hyperlink"/>
@@ -8121,14 +8166,14 @@
         <w:t xml:space="preserve">.</w:t>
       </w:r>
     </w:p>
-    <w:bookmarkEnd w:id="230"/>
-    <w:bookmarkStart w:id="232" w:name="ref-mcdonald2012social"/>
-    <w:p>
-      <w:pPr>
-        <w:pStyle w:val="Bibliography"/>
-      </w:pPr>
-      <w:r>
-        <w:t xml:space="preserve">[90]</w:t>
+    <w:bookmarkEnd w:id="232"/>
+    <w:bookmarkStart w:id="234" w:name="ref-mcdonald2012social"/>
+    <w:p>
+      <w:pPr>
+        <w:pStyle w:val="Bibliography"/>
+      </w:pPr>
+      <w:r>
+        <w:t xml:space="preserve">[91]</w:t>
       </w:r>
       <w:r>
         <w:t xml:space="preserve"> </w:t>
@@ -8151,7 +8196,7 @@
       <w:r>
         <w:t xml:space="preserve"> </w:t>
       </w:r>
-      <w:hyperlink r:id="rId231">
+      <w:hyperlink r:id="rId233">
         <w:r>
           <w:rPr>
             <w:rStyle w:val="Hyperlink"/>
@@ -8163,14 +8208,14 @@
         <w:t xml:space="preserve">.</w:t>
       </w:r>
     </w:p>
-    <w:bookmarkEnd w:id="232"/>
-    <w:bookmarkStart w:id="234" w:name="ref-bernardini2005reconsidering"/>
-    <w:p>
-      <w:pPr>
-        <w:pStyle w:val="Bibliography"/>
-      </w:pPr>
-      <w:r>
-        <w:t xml:space="preserve">[91]</w:t>
+    <w:bookmarkEnd w:id="234"/>
+    <w:bookmarkStart w:id="236" w:name="ref-bernardini2005reconsidering"/>
+    <w:p>
+      <w:pPr>
+        <w:pStyle w:val="Bibliography"/>
+      </w:pPr>
+      <w:r>
+        <w:t xml:space="preserve">[92]</w:t>
       </w:r>
       <w:r>
         <w:t xml:space="preserve"> </w:t>
@@ -8193,7 +8238,7 @@
       <w:r>
         <w:t xml:space="preserve"> </w:t>
       </w:r>
-      <w:hyperlink r:id="rId233">
+      <w:hyperlink r:id="rId235">
         <w:r>
           <w:rPr>
             <w:rStyle w:val="Hyperlink"/>
@@ -8205,14 +8250,14 @@
         <w:t xml:space="preserve">.</w:t>
       </w:r>
     </w:p>
-    <w:bookmarkEnd w:id="234"/>
-    <w:bookmarkStart w:id="236" w:name="ref-wiessner1984reconsidering"/>
-    <w:p>
-      <w:pPr>
-        <w:pStyle w:val="Bibliography"/>
-      </w:pPr>
-      <w:r>
-        <w:t xml:space="preserve">[92]</w:t>
+    <w:bookmarkEnd w:id="236"/>
+    <w:bookmarkStart w:id="238" w:name="ref-wiessner1984reconsidering"/>
+    <w:p>
+      <w:pPr>
+        <w:pStyle w:val="Bibliography"/>
+      </w:pPr>
+      <w:r>
+        <w:t xml:space="preserve">[93]</w:t>
       </w:r>
       <w:r>
         <w:t xml:space="preserve"> </w:t>
@@ -8235,7 +8280,7 @@
       <w:r>
         <w:t xml:space="preserve"> </w:t>
       </w:r>
-      <w:hyperlink r:id="rId235">
+      <w:hyperlink r:id="rId237">
         <w:r>
           <w:rPr>
             <w:rStyle w:val="Hyperlink"/>
@@ -8247,14 +8292,14 @@
         <w:t xml:space="preserve">.</w:t>
       </w:r>
     </w:p>
-    <w:bookmarkEnd w:id="236"/>
-    <w:bookmarkStart w:id="238" w:name="ref-smith1992"/>
-    <w:p>
-      <w:pPr>
-        <w:pStyle w:val="Bibliography"/>
-      </w:pPr>
-      <w:r>
-        <w:t xml:space="preserve">[93]</w:t>
+    <w:bookmarkEnd w:id="238"/>
+    <w:bookmarkStart w:id="240" w:name="ref-smith1992"/>
+    <w:p>
+      <w:pPr>
+        <w:pStyle w:val="Bibliography"/>
+      </w:pPr>
+      <w:r>
+        <w:t xml:space="preserve">[94]</w:t>
       </w:r>
       <w:r>
         <w:t xml:space="preserve"> </w:t>
@@ -8289,7 +8334,7 @@
       <w:r>
         <w:t xml:space="preserve"> </w:t>
       </w:r>
-      <w:hyperlink r:id="rId237">
+      <w:hyperlink r:id="rId239">
         <w:r>
           <w:rPr>
             <w:rStyle w:val="Hyperlink"/>
@@ -8301,14 +8346,14 @@
         <w:t xml:space="preserve">.</w:t>
       </w:r>
     </w:p>
-    <w:bookmarkEnd w:id="238"/>
-    <w:bookmarkStart w:id="240" w:name="X4fed35d53d406ce17aea32f9d6f163fcb563519"/>
-    <w:p>
-      <w:pPr>
-        <w:pStyle w:val="Bibliography"/>
-      </w:pPr>
-      <w:r>
-        <w:t xml:space="preserve">[94]</w:t>
+    <w:bookmarkEnd w:id="240"/>
+    <w:bookmarkStart w:id="242" w:name="X4fed35d53d406ce17aea32f9d6f163fcb563519"/>
+    <w:p>
+      <w:pPr>
+        <w:pStyle w:val="Bibliography"/>
+      </w:pPr>
+      <w:r>
+        <w:t xml:space="preserve">[95]</w:t>
       </w:r>
       <w:r>
         <w:t xml:space="preserve"> </w:t>
@@ -8343,7 +8388,7 @@
       <w:r>
         <w:t xml:space="preserve"> </w:t>
       </w:r>
-      <w:hyperlink r:id="rId239">
+      <w:hyperlink r:id="rId241">
         <w:r>
           <w:rPr>
             <w:rStyle w:val="Hyperlink"/>
@@ -8355,14 +8400,14 @@
         <w:t xml:space="preserve">.</w:t>
       </w:r>
     </w:p>
-    <w:bookmarkEnd w:id="240"/>
-    <w:bookmarkStart w:id="241" w:name="ref-Cavalli_Sforza_Feldman_1981"/>
-    <w:p>
-      <w:pPr>
-        <w:pStyle w:val="Bibliography"/>
-      </w:pPr>
-      <w:r>
-        <w:t xml:space="preserve">[95]</w:t>
+    <w:bookmarkEnd w:id="242"/>
+    <w:bookmarkStart w:id="243" w:name="ref-Cavalli_Sforza_Feldman_1981"/>
+    <w:p>
+      <w:pPr>
+        <w:pStyle w:val="Bibliography"/>
+      </w:pPr>
+      <w:r>
+        <w:t xml:space="preserve">[96]</w:t>
       </w:r>
       <w:r>
         <w:t xml:space="preserve"> </w:t>
@@ -8374,14 +8419,14 @@
         <w:t xml:space="preserve">Cavalli-Sforza L, Feldman MW. Cultural transmission and evolution: A quantitative approach. Princeton University Press; 1981.</w:t>
       </w:r>
     </w:p>
-    <w:bookmarkEnd w:id="241"/>
-    <w:bookmarkStart w:id="242" w:name="ref-Boyd_Richerson_1985"/>
-    <w:p>
-      <w:pPr>
-        <w:pStyle w:val="Bibliography"/>
-      </w:pPr>
-      <w:r>
-        <w:t xml:space="preserve">[96]</w:t>
+    <w:bookmarkEnd w:id="243"/>
+    <w:bookmarkStart w:id="244" w:name="ref-Boyd_Richerson_1985"/>
+    <w:p>
+      <w:pPr>
+        <w:pStyle w:val="Bibliography"/>
+      </w:pPr>
+      <w:r>
+        <w:t xml:space="preserve">[97]</w:t>
       </w:r>
       <w:r>
         <w:t xml:space="preserve"> </w:t>
@@ -8393,14 +8438,14 @@
         <w:t xml:space="preserve">Boyd R, Richerson PJ. Culture and the evolutionary process. University of Chicago Press; 1985.</w:t>
       </w:r>
     </w:p>
-    <w:bookmarkEnd w:id="242"/>
-    <w:bookmarkStart w:id="243" w:name="ref-Richerson_Boyd_2005"/>
-    <w:p>
-      <w:pPr>
-        <w:pStyle w:val="Bibliography"/>
-      </w:pPr>
-      <w:r>
-        <w:t xml:space="preserve">[97]</w:t>
+    <w:bookmarkEnd w:id="244"/>
+    <w:bookmarkStart w:id="245" w:name="ref-Richerson_Boyd_2005"/>
+    <w:p>
+      <w:pPr>
+        <w:pStyle w:val="Bibliography"/>
+      </w:pPr>
+      <w:r>
+        <w:t xml:space="preserve">[98]</w:t>
       </w:r>
       <w:r>
         <w:t xml:space="preserve"> </w:t>
@@ -8412,14 +8457,14 @@
         <w:t xml:space="preserve">Richerson PJ, Boyd R. Not by genes alone: How culture transformed human evolution. University of Chicago Press; 2005.</w:t>
       </w:r>
     </w:p>
-    <w:bookmarkEnd w:id="243"/>
-    <w:bookmarkStart w:id="245" w:name="ref-Henrich_2004"/>
-    <w:p>
-      <w:pPr>
-        <w:pStyle w:val="Bibliography"/>
-      </w:pPr>
-      <w:r>
-        <w:t xml:space="preserve">[98]</w:t>
+    <w:bookmarkEnd w:id="245"/>
+    <w:bookmarkStart w:id="247" w:name="ref-Henrich_2004"/>
+    <w:p>
+      <w:pPr>
+        <w:pStyle w:val="Bibliography"/>
+      </w:pPr>
+      <w:r>
+        <w:t xml:space="preserve">[99]</w:t>
       </w:r>
       <w:r>
         <w:t xml:space="preserve"> </w:t>
@@ -8439,7 +8484,7 @@
       <w:r>
         <w:t xml:space="preserve"> </w:t>
       </w:r>
-      <w:hyperlink r:id="rId244">
+      <w:hyperlink r:id="rId246">
         <w:r>
           <w:rPr>
             <w:rStyle w:val="Hyperlink"/>
@@ -8451,14 +8496,14 @@
         <w:t xml:space="preserve">.</w:t>
       </w:r>
     </w:p>
-    <w:bookmarkEnd w:id="245"/>
-    <w:bookmarkStart w:id="247" w:name="ref-Migliano_2020"/>
-    <w:p>
-      <w:pPr>
-        <w:pStyle w:val="Bibliography"/>
-      </w:pPr>
-      <w:r>
-        <w:t xml:space="preserve">[99]</w:t>
+    <w:bookmarkEnd w:id="247"/>
+    <w:bookmarkStart w:id="249" w:name="ref-Migliano_2020"/>
+    <w:p>
+      <w:pPr>
+        <w:pStyle w:val="Bibliography"/>
+      </w:pPr>
+      <w:r>
+        <w:t xml:space="preserve">[100]</w:t>
       </w:r>
       <w:r>
         <w:t xml:space="preserve"> </w:t>
@@ -8472,7 +8517,7 @@
       <w:r>
         <w:t xml:space="preserve"> </w:t>
       </w:r>
-      <w:hyperlink r:id="rId246">
+      <w:hyperlink r:id="rId248">
         <w:r>
           <w:rPr>
             <w:rStyle w:val="Hyperlink"/>
@@ -8484,14 +8529,14 @@
         <w:t xml:space="preserve">.</w:t>
       </w:r>
     </w:p>
-    <w:bookmarkEnd w:id="247"/>
-    <w:bookmarkStart w:id="249" w:name="ref-Romano_Lozano_2020"/>
-    <w:p>
-      <w:pPr>
-        <w:pStyle w:val="Bibliography"/>
-      </w:pPr>
-      <w:r>
-        <w:t xml:space="preserve">[100]</w:t>
+    <w:bookmarkEnd w:id="249"/>
+    <w:bookmarkStart w:id="251" w:name="ref-Romano_Lozano_2020"/>
+    <w:p>
+      <w:pPr>
+        <w:pStyle w:val="Bibliography"/>
+      </w:pPr>
+      <w:r>
+        <w:t xml:space="preserve">[101]</w:t>
       </w:r>
       <w:r>
         <w:t xml:space="preserve"> </w:t>
@@ -8505,7 +8550,7 @@
       <w:r>
         <w:t xml:space="preserve"> </w:t>
       </w:r>
-      <w:hyperlink r:id="rId248">
+      <w:hyperlink r:id="rId250">
         <w:r>
           <w:rPr>
             <w:rStyle w:val="Hyperlink"/>
@@ -8517,14 +8562,14 @@
         <w:t xml:space="preserve">.</w:t>
       </w:r>
     </w:p>
-    <w:bookmarkEnd w:id="249"/>
-    <w:bookmarkStart w:id="251" w:name="ref-Buchanan_Hamilton_2023"/>
-    <w:p>
-      <w:pPr>
-        <w:pStyle w:val="Bibliography"/>
-      </w:pPr>
-      <w:r>
-        <w:t xml:space="preserve">[101]</w:t>
+    <w:bookmarkEnd w:id="251"/>
+    <w:bookmarkStart w:id="253" w:name="ref-Buchanan_Hamilton_2023"/>
+    <w:p>
+      <w:pPr>
+        <w:pStyle w:val="Bibliography"/>
+      </w:pPr>
+      <w:r>
+        <w:t xml:space="preserve">[102]</w:t>
       </w:r>
       <w:r>
         <w:t xml:space="preserve"> </w:t>
@@ -8538,7 +8583,7 @@
       <w:r>
         <w:t xml:space="preserve"> </w:t>
       </w:r>
-      <w:hyperlink r:id="rId250">
+      <w:hyperlink r:id="rId252">
         <w:r>
           <w:rPr>
             <w:rStyle w:val="Hyperlink"/>
@@ -8550,14 +8595,14 @@
         <w:t xml:space="preserve">.</w:t>
       </w:r>
     </w:p>
-    <w:bookmarkEnd w:id="251"/>
-    <w:bookmarkStart w:id="253" w:name="ref-Eerkens_Lipo_2005"/>
-    <w:p>
-      <w:pPr>
-        <w:pStyle w:val="Bibliography"/>
-      </w:pPr>
-      <w:r>
-        <w:t xml:space="preserve">[102]</w:t>
+    <w:bookmarkEnd w:id="253"/>
+    <w:bookmarkStart w:id="255" w:name="ref-Eerkens_Lipo_2005"/>
+    <w:p>
+      <w:pPr>
+        <w:pStyle w:val="Bibliography"/>
+      </w:pPr>
+      <w:r>
+        <w:t xml:space="preserve">[103]</w:t>
       </w:r>
       <w:r>
         <w:t xml:space="preserve"> </w:t>
@@ -8571,7 +8616,7 @@
       <w:r>
         <w:t xml:space="preserve"> </w:t>
       </w:r>
-      <w:hyperlink r:id="rId252">
+      <w:hyperlink r:id="rId254">
         <w:r>
           <w:rPr>
             <w:rStyle w:val="Hyperlink"/>
@@ -8583,14 +8628,14 @@
         <w:t xml:space="preserve">.</w:t>
       </w:r>
     </w:p>
-    <w:bookmarkEnd w:id="253"/>
-    <w:bookmarkStart w:id="255" w:name="ref-Intxaurbe_2026"/>
-    <w:p>
-      <w:pPr>
-        <w:pStyle w:val="Bibliography"/>
-      </w:pPr>
-      <w:r>
-        <w:t xml:space="preserve">[103]</w:t>
+    <w:bookmarkEnd w:id="255"/>
+    <w:bookmarkStart w:id="257" w:name="ref-Intxaurbe_2026"/>
+    <w:p>
+      <w:pPr>
+        <w:pStyle w:val="Bibliography"/>
+      </w:pPr>
+      <w:r>
+        <w:t xml:space="preserve">[104]</w:t>
       </w:r>
       <w:r>
         <w:t xml:space="preserve"> </w:t>
@@ -8622,7 +8667,7 @@
       <w:r>
         <w:t xml:space="preserve"> </w:t>
       </w:r>
-      <w:hyperlink r:id="rId254">
+      <w:hyperlink r:id="rId256">
         <w:r>
           <w:rPr>
             <w:rStyle w:val="Hyperlink"/>
@@ -8634,14 +8679,14 @@
         <w:t xml:space="preserve">.</w:t>
       </w:r>
     </w:p>
-    <w:bookmarkEnd w:id="255"/>
-    <w:bookmarkStart w:id="257" w:name="ref-Bentz_Dutkiewicz_2026"/>
-    <w:p>
-      <w:pPr>
-        <w:pStyle w:val="Bibliography"/>
-      </w:pPr>
-      <w:r>
-        <w:t xml:space="preserve">[104]</w:t>
+    <w:bookmarkEnd w:id="257"/>
+    <w:bookmarkStart w:id="259" w:name="ref-Bentz_Dutkiewicz_2026"/>
+    <w:p>
+      <w:pPr>
+        <w:pStyle w:val="Bibliography"/>
+      </w:pPr>
+      <w:r>
+        <w:t xml:space="preserve">[105]</w:t>
       </w:r>
       <w:r>
         <w:t xml:space="preserve"> </w:t>
@@ -8655,7 +8700,7 @@
       <w:r>
         <w:t xml:space="preserve"> </w:t>
       </w:r>
-      <w:hyperlink r:id="rId256">
+      <w:hyperlink r:id="rId258">
         <w:r>
           <w:rPr>
             <w:rStyle w:val="Hyperlink"/>
@@ -8667,14 +8712,14 @@
         <w:t xml:space="preserve">.</w:t>
       </w:r>
     </w:p>
-    <w:bookmarkEnd w:id="257"/>
-    <w:bookmarkStart w:id="259" w:name="ref-Bacon_2023"/>
-    <w:p>
-      <w:pPr>
-        <w:pStyle w:val="Bibliography"/>
-      </w:pPr>
-      <w:r>
-        <w:t xml:space="preserve">[105]</w:t>
+    <w:bookmarkEnd w:id="259"/>
+    <w:bookmarkStart w:id="261" w:name="ref-Bacon_2023"/>
+    <w:p>
+      <w:pPr>
+        <w:pStyle w:val="Bibliography"/>
+      </w:pPr>
+      <w:r>
+        <w:t xml:space="preserve">[106]</w:t>
       </w:r>
       <w:r>
         <w:t xml:space="preserve"> </w:t>
@@ -8700,7 +8745,7 @@
       <w:r>
         <w:t xml:space="preserve"> </w:t>
       </w:r>
-      <w:hyperlink r:id="rId258">
+      <w:hyperlink r:id="rId260">
         <w:r>
           <w:rPr>
             <w:rStyle w:val="Hyperlink"/>
@@ -8712,14 +8757,14 @@
         <w:t xml:space="preserve">.</w:t>
       </w:r>
     </w:p>
-    <w:bookmarkEnd w:id="259"/>
-    <w:bookmarkStart w:id="261" w:name="Xa4990169aeb885a690070ab4fd90972c31994f8"/>
-    <w:p>
-      <w:pPr>
-        <w:pStyle w:val="Bibliography"/>
-      </w:pPr>
-      <w:r>
-        <w:t xml:space="preserve">[106]</w:t>
+    <w:bookmarkEnd w:id="261"/>
+    <w:bookmarkStart w:id="263" w:name="Xa4990169aeb885a690070ab4fd90972c31994f8"/>
+    <w:p>
+      <w:pPr>
+        <w:pStyle w:val="Bibliography"/>
+      </w:pPr>
+      <w:r>
+        <w:t xml:space="preserve">[107]</w:t>
       </w:r>
       <w:r>
         <w:t xml:space="preserve"> </w:t>
@@ -8745,7 +8790,7 @@
       <w:r>
         <w:t xml:space="preserve"> </w:t>
       </w:r>
-      <w:hyperlink r:id="rId260">
+      <w:hyperlink r:id="rId262">
         <w:r>
           <w:rPr>
             <w:rStyle w:val="Hyperlink"/>
@@ -8757,14 +8802,14 @@
         <w:t xml:space="preserve">.</w:t>
       </w:r>
     </w:p>
-    <w:bookmarkEnd w:id="261"/>
-    <w:bookmarkStart w:id="263" w:name="X8ea620419c64d551554c48b7075c9934881930b"/>
-    <w:p>
-      <w:pPr>
-        <w:pStyle w:val="Bibliography"/>
-      </w:pPr>
-      <w:r>
-        <w:t xml:space="preserve">[107]</w:t>
+    <w:bookmarkEnd w:id="263"/>
+    <w:bookmarkStart w:id="265" w:name="X8ea620419c64d551554c48b7075c9934881930b"/>
+    <w:p>
+      <w:pPr>
+        <w:pStyle w:val="Bibliography"/>
+      </w:pPr>
+      <w:r>
+        <w:t xml:space="preserve">[108]</w:t>
       </w:r>
       <w:r>
         <w:t xml:space="preserve"> </w:t>
@@ -8814,7 +8859,7 @@
       <w:r>
         <w:t xml:space="preserve"> </w:t>
       </w:r>
-      <w:hyperlink r:id="rId262">
+      <w:hyperlink r:id="rId264">
         <w:r>
           <w:rPr>
             <w:rStyle w:val="Hyperlink"/>
@@ -8826,14 +8871,14 @@
         <w:t xml:space="preserve">.</w:t>
       </w:r>
     </w:p>
-    <w:bookmarkEnd w:id="263"/>
-    <w:bookmarkStart w:id="265" w:name="ref-Magli_2024"/>
-    <w:p>
-      <w:pPr>
-        <w:pStyle w:val="Bibliography"/>
-      </w:pPr>
-      <w:r>
-        <w:t xml:space="preserve">[108]</w:t>
+    <w:bookmarkEnd w:id="265"/>
+    <w:bookmarkStart w:id="267" w:name="ref-Magli_2024"/>
+    <w:p>
+      <w:pPr>
+        <w:pStyle w:val="Bibliography"/>
+      </w:pPr>
+      <w:r>
+        <w:t xml:space="preserve">[109]</w:t>
       </w:r>
       <w:r>
         <w:t xml:space="preserve"> </w:t>
@@ -8859,7 +8904,7 @@
       <w:r>
         <w:t xml:space="preserve"> </w:t>
       </w:r>
-      <w:hyperlink r:id="rId264">
+      <w:hyperlink r:id="rId266">
         <w:r>
           <w:rPr>
             <w:rStyle w:val="Hyperlink"/>
@@ -8871,14 +8916,14 @@
         <w:t xml:space="preserve">.</w:t>
       </w:r>
     </w:p>
-    <w:bookmarkEnd w:id="265"/>
-    <w:bookmarkStart w:id="267" w:name="ref-Nowell_2024_evidence"/>
-    <w:p>
-      <w:pPr>
-        <w:pStyle w:val="Bibliography"/>
-      </w:pPr>
-      <w:r>
-        <w:t xml:space="preserve">[109]</w:t>
+    <w:bookmarkEnd w:id="267"/>
+    <w:bookmarkStart w:id="269" w:name="ref-Nowell_2024_evidence"/>
+    <w:p>
+      <w:pPr>
+        <w:pStyle w:val="Bibliography"/>
+      </w:pPr>
+      <w:r>
+        <w:t xml:space="preserve">[110]</w:t>
       </w:r>
       <w:r>
         <w:t xml:space="preserve"> </w:t>
@@ -8904,7 +8949,7 @@
       <w:r>
         <w:t xml:space="preserve"> </w:t>
       </w:r>
-      <w:hyperlink r:id="rId266">
+      <w:hyperlink r:id="rId268">
         <w:r>
           <w:rPr>
             <w:rStyle w:val="Hyperlink"/>
@@ -8916,14 +8961,14 @@
         <w:t xml:space="preserve">.</w:t>
       </w:r>
     </w:p>
-    <w:bookmarkEnd w:id="267"/>
-    <w:bookmarkStart w:id="269" w:name="ref-Horiuchi_Takakura_2019"/>
-    <w:p>
-      <w:pPr>
-        <w:pStyle w:val="Bibliography"/>
-      </w:pPr>
-      <w:r>
-        <w:t xml:space="preserve">[110]</w:t>
+    <w:bookmarkEnd w:id="269"/>
+    <w:bookmarkStart w:id="271" w:name="ref-Horiuchi_Takakura_2019"/>
+    <w:p>
+      <w:pPr>
+        <w:pStyle w:val="Bibliography"/>
+      </w:pPr>
+      <w:r>
+        <w:t xml:space="preserve">[111]</w:t>
       </w:r>
       <w:r>
         <w:t xml:space="preserve"> </w:t>
@@ -8976,7 +9021,7 @@
       <w:r>
         <w:t xml:space="preserve"> </w:t>
       </w:r>
-      <w:hyperlink r:id="rId268">
+      <w:hyperlink r:id="rId270">
         <w:r>
           <w:rPr>
             <w:rStyle w:val="Hyperlink"/>
@@ -8988,14 +9033,14 @@
         <w:t xml:space="preserve">.</w:t>
       </w:r>
     </w:p>
-    <w:bookmarkEnd w:id="269"/>
-    <w:bookmarkStart w:id="270" w:name="ref-Rogers_2018"/>
-    <w:p>
-      <w:pPr>
-        <w:pStyle w:val="Bibliography"/>
-      </w:pPr>
-      <w:r>
-        <w:t xml:space="preserve">[111]</w:t>
+    <w:bookmarkEnd w:id="271"/>
+    <w:bookmarkStart w:id="272" w:name="ref-Rogers_2018"/>
+    <w:p>
+      <w:pPr>
+        <w:pStyle w:val="Bibliography"/>
+      </w:pPr>
+      <w:r>
+        <w:t xml:space="preserve">[112]</w:t>
       </w:r>
       <w:r>
         <w:t xml:space="preserve"> </w:t>
@@ -9037,14 +9082,14 @@
         <w:t xml:space="preserve">: An analysis of marine shell ornament distribution. Master’s thesis. University of Victoria, 2018.</w:t>
       </w:r>
     </w:p>
-    <w:bookmarkEnd w:id="270"/>
-    <w:bookmarkStart w:id="272" w:name="X94f875be1b7e5d23641daff5d53857bec24e739"/>
-    <w:p>
-      <w:pPr>
-        <w:pStyle w:val="Bibliography"/>
-      </w:pPr>
-      <w:r>
-        <w:t xml:space="preserve">[112]</w:t>
+    <w:bookmarkEnd w:id="272"/>
+    <w:bookmarkStart w:id="274" w:name="X94f875be1b7e5d23641daff5d53857bec24e739"/>
+    <w:p>
+      <w:pPr>
+        <w:pStyle w:val="Bibliography"/>
+      </w:pPr>
+      <w:r>
+        <w:t xml:space="preserve">[113]</w:t>
       </w:r>
       <w:r>
         <w:t xml:space="preserve"> </w:t>
@@ -9100,7 +9145,7 @@
       <w:r>
         <w:t xml:space="preserve"> </w:t>
       </w:r>
-      <w:hyperlink r:id="rId271">
+      <w:hyperlink r:id="rId273">
         <w:r>
           <w:rPr>
             <w:rStyle w:val="Hyperlink"/>
@@ -9112,14 +9157,14 @@
         <w:t xml:space="preserve">.</w:t>
       </w:r>
     </w:p>
-    <w:bookmarkEnd w:id="272"/>
-    <w:bookmarkStart w:id="274" w:name="ref-Gamble_1982"/>
-    <w:p>
-      <w:pPr>
-        <w:pStyle w:val="Bibliography"/>
-      </w:pPr>
-      <w:r>
-        <w:t xml:space="preserve">[113]</w:t>
+    <w:bookmarkEnd w:id="274"/>
+    <w:bookmarkStart w:id="276" w:name="ref-Gamble_1982"/>
+    <w:p>
+      <w:pPr>
+        <w:pStyle w:val="Bibliography"/>
+      </w:pPr>
+      <w:r>
+        <w:t xml:space="preserve">[114]</w:t>
       </w:r>
       <w:r>
         <w:t xml:space="preserve"> </w:t>
@@ -9145,7 +9190,7 @@
       <w:r>
         <w:t xml:space="preserve"> </w:t>
       </w:r>
-      <w:hyperlink r:id="rId273">
+      <w:hyperlink r:id="rId275">
         <w:r>
           <w:rPr>
             <w:rStyle w:val="Hyperlink"/>
@@ -9157,14 +9202,14 @@
         <w:t xml:space="preserve">.</w:t>
       </w:r>
     </w:p>
-    <w:bookmarkEnd w:id="274"/>
-    <w:bookmarkStart w:id="276" w:name="Xba346573845225b1b1d5ef358e2fea0d893a789"/>
-    <w:p>
-      <w:pPr>
-        <w:pStyle w:val="Bibliography"/>
-      </w:pPr>
-      <w:r>
-        <w:t xml:space="preserve">[114]</w:t>
+    <w:bookmarkEnd w:id="276"/>
+    <w:bookmarkStart w:id="278" w:name="Xba346573845225b1b1d5ef358e2fea0d893a789"/>
+    <w:p>
+      <w:pPr>
+        <w:pStyle w:val="Bibliography"/>
+      </w:pPr>
+      <w:r>
+        <w:t xml:space="preserve">[115]</w:t>
       </w:r>
       <w:r>
         <w:t xml:space="preserve"> </w:t>
@@ -9202,7 +9247,7 @@
       <w:r>
         <w:t xml:space="preserve"> </w:t>
       </w:r>
-      <w:hyperlink r:id="rId275">
+      <w:hyperlink r:id="rId277">
         <w:r>
           <w:rPr>
             <w:rStyle w:val="Hyperlink"/>
@@ -9214,14 +9259,14 @@
         <w:t xml:space="preserve">.</w:t>
       </w:r>
     </w:p>
-    <w:bookmarkEnd w:id="276"/>
-    <w:bookmarkStart w:id="278" w:name="ref-Creanza_Kolodny_Feldman_2017"/>
-    <w:p>
-      <w:pPr>
-        <w:pStyle w:val="Bibliography"/>
-      </w:pPr>
-      <w:r>
-        <w:t xml:space="preserve">[115]</w:t>
+    <w:bookmarkEnd w:id="278"/>
+    <w:bookmarkStart w:id="280" w:name="ref-Creanza_Kolodny_Feldman_2017"/>
+    <w:p>
+      <w:pPr>
+        <w:pStyle w:val="Bibliography"/>
+      </w:pPr>
+      <w:r>
+        <w:t xml:space="preserve">[116]</w:t>
       </w:r>
       <w:r>
         <w:t xml:space="preserve"> </w:t>
@@ -9235,7 +9280,7 @@
       <w:r>
         <w:t xml:space="preserve"> </w:t>
       </w:r>
-      <w:hyperlink r:id="rId277">
+      <w:hyperlink r:id="rId279">
         <w:r>
           <w:rPr>
             <w:rStyle w:val="Hyperlink"/>
@@ -9247,14 +9292,14 @@
         <w:t xml:space="preserve">.</w:t>
       </w:r>
     </w:p>
-    <w:bookmarkEnd w:id="278"/>
-    <w:bookmarkStart w:id="280" w:name="ref-Cullen_1996"/>
-    <w:p>
-      <w:pPr>
-        <w:pStyle w:val="Bibliography"/>
-      </w:pPr>
-      <w:r>
-        <w:t xml:space="preserve">[116]</w:t>
+    <w:bookmarkEnd w:id="280"/>
+    <w:bookmarkStart w:id="282" w:name="ref-Cullen_1996"/>
+    <w:p>
+      <w:pPr>
+        <w:pStyle w:val="Bibliography"/>
+      </w:pPr>
+      <w:r>
+        <w:t xml:space="preserve">[117]</w:t>
       </w:r>
       <w:r>
         <w:t xml:space="preserve"> </w:t>
@@ -9268,7 +9313,7 @@
       <w:r>
         <w:t xml:space="preserve"> </w:t>
       </w:r>
-      <w:hyperlink r:id="rId279">
+      <w:hyperlink r:id="rId281">
         <w:r>
           <w:rPr>
             <w:rStyle w:val="Hyperlink"/>
@@ -9280,14 +9325,14 @@
         <w:t xml:space="preserve">.</w:t>
       </w:r>
     </w:p>
-    <w:bookmarkEnd w:id="280"/>
-    <w:bookmarkStart w:id="282" w:name="ref-Hill_Wood_Baggio_Hurtado_Boyd_2014"/>
-    <w:p>
-      <w:pPr>
-        <w:pStyle w:val="Bibliography"/>
-      </w:pPr>
-      <w:r>
-        <w:t xml:space="preserve">[117]</w:t>
+    <w:bookmarkEnd w:id="282"/>
+    <w:bookmarkStart w:id="284" w:name="ref-Hill_Wood_Baggio_Hurtado_Boyd_2014"/>
+    <w:p>
+      <w:pPr>
+        <w:pStyle w:val="Bibliography"/>
+      </w:pPr>
+      <w:r>
+        <w:t xml:space="preserve">[118]</w:t>
       </w:r>
       <w:r>
         <w:t xml:space="preserve"> </w:t>
@@ -9301,7 +9346,7 @@
       <w:r>
         <w:t xml:space="preserve"> </w:t>
       </w:r>
-      <w:hyperlink r:id="rId281">
+      <w:hyperlink r:id="rId283">
         <w:r>
           <w:rPr>
             <w:rStyle w:val="Hyperlink"/>
@@ -9313,14 +9358,14 @@
         <w:t xml:space="preserve">.</w:t>
       </w:r>
     </w:p>
-    <w:bookmarkEnd w:id="282"/>
-    <w:bookmarkStart w:id="284" w:name="ref-Derex_Boyd_2016"/>
-    <w:p>
-      <w:pPr>
-        <w:pStyle w:val="Bibliography"/>
-      </w:pPr>
-      <w:r>
-        <w:t xml:space="preserve">[118]</w:t>
+    <w:bookmarkEnd w:id="284"/>
+    <w:bookmarkStart w:id="286" w:name="ref-Derex_Boyd_2016"/>
+    <w:p>
+      <w:pPr>
+        <w:pStyle w:val="Bibliography"/>
+      </w:pPr>
+      <w:r>
+        <w:t xml:space="preserve">[119]</w:t>
       </w:r>
       <w:r>
         <w:t xml:space="preserve"> </w:t>
@@ -9334,7 +9379,7 @@
       <w:r>
         <w:t xml:space="preserve"> </w:t>
       </w:r>
-      <w:hyperlink r:id="rId283">
+      <w:hyperlink r:id="rId285">
         <w:r>
           <w:rPr>
             <w:rStyle w:val="Hyperlink"/>
@@ -9346,14 +9391,14 @@
         <w:t xml:space="preserve">.</w:t>
       </w:r>
     </w:p>
-    <w:bookmarkEnd w:id="284"/>
-    <w:bookmarkStart w:id="285" w:name="ref-Von_Petzinger_2009"/>
-    <w:p>
-      <w:pPr>
-        <w:pStyle w:val="Bibliography"/>
-      </w:pPr>
-      <w:r>
-        <w:t xml:space="preserve">[119]</w:t>
+    <w:bookmarkEnd w:id="286"/>
+    <w:bookmarkStart w:id="287" w:name="ref-Von_Petzinger_2009"/>
+    <w:p>
+      <w:pPr>
+        <w:pStyle w:val="Bibliography"/>
+      </w:pPr>
+      <w:r>
+        <w:t xml:space="preserve">[120]</w:t>
       </w:r>
       <w:r>
         <w:t xml:space="preserve"> </w:t>
@@ -9383,14 +9428,14 @@
         <w:t xml:space="preserve">parietal art. Master’s thesis. University of Victoria, 2009.</w:t>
       </w:r>
     </w:p>
-    <w:bookmarkEnd w:id="285"/>
-    <w:bookmarkStart w:id="287" w:name="ref-Herskind2023"/>
-    <w:p>
-      <w:pPr>
-        <w:pStyle w:val="Bibliography"/>
-      </w:pPr>
-      <w:r>
-        <w:t xml:space="preserve">[120]</w:t>
+    <w:bookmarkEnd w:id="287"/>
+    <w:bookmarkStart w:id="289" w:name="ref-Herskind2023"/>
+    <w:p>
+      <w:pPr>
+        <w:pStyle w:val="Bibliography"/>
+      </w:pPr>
+      <w:r>
+        <w:t xml:space="preserve">[121]</w:t>
       </w:r>
       <w:r>
         <w:t xml:space="preserve"> </w:t>
@@ -9404,7 +9449,7 @@
       <w:r>
         <w:t xml:space="preserve"> </w:t>
       </w:r>
-      <w:hyperlink r:id="rId286">
+      <w:hyperlink r:id="rId288">
         <w:r>
           <w:rPr>
             <w:rStyle w:val="Hyperlink"/>
@@ -9416,14 +9461,14 @@
         <w:t xml:space="preserve">.</w:t>
       </w:r>
     </w:p>
-    <w:bookmarkEnd w:id="287"/>
-    <w:bookmarkStart w:id="289" w:name="ref-Gravel-Miguel_Coward_2023"/>
-    <w:p>
-      <w:pPr>
-        <w:pStyle w:val="Bibliography"/>
-      </w:pPr>
-      <w:r>
-        <w:t xml:space="preserve">[121]</w:t>
+    <w:bookmarkEnd w:id="289"/>
+    <w:bookmarkStart w:id="291" w:name="ref-Gravel-Miguel_Coward_2023"/>
+    <w:p>
+      <w:pPr>
+        <w:pStyle w:val="Bibliography"/>
+      </w:pPr>
+      <w:r>
+        <w:t xml:space="preserve">[122]</w:t>
       </w:r>
       <w:r>
         <w:t xml:space="preserve"> </w:t>
@@ -9449,7 +9494,7 @@
       <w:r>
         <w:t xml:space="preserve"> </w:t>
       </w:r>
-      <w:hyperlink r:id="rId288">
+      <w:hyperlink r:id="rId290">
         <w:r>
           <w:rPr>
             <w:rStyle w:val="Hyperlink"/>
@@ -9461,14 +9506,14 @@
         <w:t xml:space="preserve">.</w:t>
       </w:r>
     </w:p>
-    <w:bookmarkEnd w:id="289"/>
-    <w:bookmarkStart w:id="291" w:name="X42e36537dda68556aeacf852410efd6ac3bb1ca"/>
-    <w:p>
-      <w:pPr>
-        <w:pStyle w:val="Bibliography"/>
-      </w:pPr>
-      <w:r>
-        <w:t xml:space="preserve">[122]</w:t>
+    <w:bookmarkEnd w:id="291"/>
+    <w:bookmarkStart w:id="293" w:name="X42e36537dda68556aeacf852410efd6ac3bb1ca"/>
+    <w:p>
+      <w:pPr>
+        <w:pStyle w:val="Bibliography"/>
+      </w:pPr>
+      <w:r>
+        <w:t xml:space="preserve">[123]</w:t>
       </w:r>
       <w:r>
         <w:t xml:space="preserve"> </w:t>
@@ -9482,7 +9527,7 @@
       <w:r>
         <w:t xml:space="preserve"> </w:t>
       </w:r>
-      <w:hyperlink r:id="rId290">
+      <w:hyperlink r:id="rId292">
         <w:r>
           <w:rPr>
             <w:rStyle w:val="Hyperlink"/>
@@ -9494,14 +9539,14 @@
         <w:t xml:space="preserve">.</w:t>
       </w:r>
     </w:p>
-    <w:bookmarkEnd w:id="291"/>
-    <w:bookmarkStart w:id="293" w:name="ref-Chiotti_2005"/>
-    <w:p>
-      <w:pPr>
-        <w:pStyle w:val="Bibliography"/>
-      </w:pPr>
-      <w:r>
-        <w:t xml:space="preserve">[123]</w:t>
+    <w:bookmarkEnd w:id="293"/>
+    <w:bookmarkStart w:id="295" w:name="ref-Chiotti_2005"/>
+    <w:p>
+      <w:pPr>
+        <w:pStyle w:val="Bibliography"/>
+      </w:pPr>
+      <w:r>
+        <w:t xml:space="preserve">[124]</w:t>
       </w:r>
       <w:r>
         <w:t xml:space="preserve"> </w:t>
@@ -9542,7 +9587,7 @@
       <w:r>
         <w:t xml:space="preserve"> </w:t>
       </w:r>
-      <w:hyperlink r:id="rId292">
+      <w:hyperlink r:id="rId294">
         <w:r>
           <w:rPr>
             <w:rStyle w:val="Hyperlink"/>
@@ -9554,14 +9599,14 @@
         <w:t xml:space="preserve">.</w:t>
       </w:r>
     </w:p>
-    <w:bookmarkEnd w:id="293"/>
-    <w:bookmarkStart w:id="295" w:name="ref-Higham_Abri_Pataud_2011"/>
-    <w:p>
-      <w:pPr>
-        <w:pStyle w:val="Bibliography"/>
-      </w:pPr>
-      <w:r>
-        <w:t xml:space="preserve">[124]</w:t>
+    <w:bookmarkEnd w:id="295"/>
+    <w:bookmarkStart w:id="297" w:name="ref-Higham_Abri_Pataud_2011"/>
+    <w:p>
+      <w:pPr>
+        <w:pStyle w:val="Bibliography"/>
+      </w:pPr>
+      <w:r>
+        <w:t xml:space="preserve">[125]</w:t>
       </w:r>
       <w:r>
         <w:t xml:space="preserve"> </w:t>
@@ -9614,7 +9659,7 @@
       <w:r>
         <w:t xml:space="preserve"> </w:t>
       </w:r>
-      <w:hyperlink r:id="rId294">
+      <w:hyperlink r:id="rId296">
         <w:r>
           <w:rPr>
             <w:rStyle w:val="Hyperlink"/>
@@ -9626,14 +9671,14 @@
         <w:t xml:space="preserve">.</w:t>
       </w:r>
     </w:p>
-    <w:bookmarkEnd w:id="295"/>
-    <w:bookmarkStart w:id="297" w:name="ref-Talamo_La_Ferrassie_2020"/>
-    <w:p>
-      <w:pPr>
-        <w:pStyle w:val="Bibliography"/>
-      </w:pPr>
-      <w:r>
-        <w:t xml:space="preserve">[125]</w:t>
+    <w:bookmarkEnd w:id="297"/>
+    <w:bookmarkStart w:id="299" w:name="ref-Talamo_La_Ferrassie_2020"/>
+    <w:p>
+      <w:pPr>
+        <w:pStyle w:val="Bibliography"/>
+      </w:pPr>
+      <w:r>
+        <w:t xml:space="preserve">[126]</w:t>
       </w:r>
       <w:r>
         <w:t xml:space="preserve"> </w:t>
@@ -9728,7 +9773,7 @@
       <w:r>
         <w:t xml:space="preserve"> </w:t>
       </w:r>
-      <w:hyperlink r:id="rId296">
+      <w:hyperlink r:id="rId298">
         <w:r>
           <w:rPr>
             <w:rStyle w:val="Hyperlink"/>
@@ -9740,14 +9785,14 @@
         <w:t xml:space="preserve">.</w:t>
       </w:r>
     </w:p>
-    <w:bookmarkEnd w:id="297"/>
-    <w:bookmarkStart w:id="299" w:name="ref-Wild_et_al_2005"/>
-    <w:p>
-      <w:pPr>
-        <w:pStyle w:val="Bibliography"/>
-      </w:pPr>
-      <w:r>
-        <w:t xml:space="preserve">[126]</w:t>
+    <w:bookmarkEnd w:id="299"/>
+    <w:bookmarkStart w:id="301" w:name="ref-Wild_et_al_2005"/>
+    <w:p>
+      <w:pPr>
+        <w:pStyle w:val="Bibliography"/>
+      </w:pPr>
+      <w:r>
+        <w:t xml:space="preserve">[127]</w:t>
       </w:r>
       <w:r>
         <w:t xml:space="preserve"> </w:t>
@@ -9797,7 +9842,7 @@
       <w:r>
         <w:t xml:space="preserve"> </w:t>
       </w:r>
-      <w:hyperlink r:id="rId298">
+      <w:hyperlink r:id="rId300">
         <w:r>
           <w:rPr>
             <w:rStyle w:val="Hyperlink"/>
@@ -9809,14 +9854,14 @@
         <w:t xml:space="preserve">.</w:t>
       </w:r>
     </w:p>
-    <w:bookmarkEnd w:id="299"/>
-    <w:bookmarkStart w:id="301" w:name="ref-Schurch_Conard_2026_reassess"/>
-    <w:p>
-      <w:pPr>
-        <w:pStyle w:val="Bibliography"/>
-      </w:pPr>
-      <w:r>
-        <w:t xml:space="preserve">[127]</w:t>
+    <w:bookmarkEnd w:id="301"/>
+    <w:bookmarkStart w:id="303" w:name="ref-Schurch_Conard_2026_reassess"/>
+    <w:p>
+      <w:pPr>
+        <w:pStyle w:val="Bibliography"/>
+      </w:pPr>
+      <w:r>
+        <w:t xml:space="preserve">[128]</w:t>
       </w:r>
       <w:r>
         <w:t xml:space="preserve"> </w:t>
@@ -9845,7 +9890,7 @@
       <w:r>
         <w:t xml:space="preserve"> </w:t>
       </w:r>
-      <w:hyperlink r:id="rId300">
+      <w:hyperlink r:id="rId302">
         <w:r>
           <w:rPr>
             <w:rStyle w:val="Hyperlink"/>
@@ -9857,9 +9902,9 @@
         <w:t xml:space="preserve">.</w:t>
       </w:r>
     </w:p>
-    <w:bookmarkEnd w:id="301"/>
-    <w:bookmarkEnd w:id="302"/>
     <w:bookmarkEnd w:id="303"/>
+    <w:bookmarkEnd w:id="304"/>
+    <w:bookmarkEnd w:id="305"/>
     <w:sectPr>
       <w:footnotePr>
         <w:numRestart w:val="eachSect"/>

</xml_diff>

<commit_message>
make S1 sections more systematically structured
</commit_message>
<xml_diff>
--- a/paper/paper.docx
+++ b/paper/paper.docx
@@ -1289,7 +1289,7 @@
         <w:t xml:space="preserve"> </w:t>
       </w:r>
       <w:r>
-        <w:t xml:space="preserve">S5.10). This reveals no candidate is significant, so the null Mantel does not identify any specific alternative process. A Mantel correlogram likewise shows no significant spatial structure at any distance lag, and bootstrap confidence intervals on the Mantel R indicate the test is underpowered at these sample sizes, so the non-significant result is best read as a lack of evidence rather than evidence of absence (S1</w:t>
+        <w:t xml:space="preserve">S5.10). This reveals no candidate is significant, so the null Mantel does not identify any specific alternative process. A Mantel correlogram likewise did not detect spatial structure at any distance lag, and bootstrap confidence intervals on the Mantel R indicate the test is underpowered at these sample sizes, so the non-significant result is best read as a lack of evidence rather than evidence of absence (S1</w:t>
       </w:r>
       <w:r>
         <w:t xml:space="preserve"> </w:t>
@@ -1304,10 +1304,7 @@
         <w:t xml:space="preserve">”</w:t>
       </w:r>
       <w:r>
-        <w:t xml:space="preserve"> </w:t>
-      </w:r>
-      <w:r>
-        <w:t xml:space="preserve">S5.11). As a non-Mantel check that fits an explanatory model rather than correlating two distance matrices, we additionally ran a distance-based redundancy analysis</w:t>
+        <w:t xml:space="preserve">). As a non-Mantel check that fits an explanatory model rather than correlating two distance matrices, we additionally ran a distance-based redundancy analysis</w:t>
       </w:r>
       <w:r>
         <w:t xml:space="preserve"> </w:t>
@@ -2753,43 +2750,7 @@
         <w:t xml:space="preserve"> </w:t>
       </w:r>
       <w:r>
-        <w:t xml:space="preserve">[63]</w:t>
-      </w:r>
-      <w:r>
-        <w:t xml:space="preserve">;</w:t>
-      </w:r>
-      <w:r>
-        <w:t xml:space="preserve"> </w:t>
-      </w:r>
-      <w:r>
-        <w:t xml:space="preserve">[64]</w:t>
-      </w:r>
-      <w:r>
-        <w:t xml:space="preserve">;</w:t>
-      </w:r>
-      <w:r>
-        <w:t xml:space="preserve"> </w:t>
-      </w:r>
-      <w:r>
-        <w:t xml:space="preserve">[49]</w:t>
-      </w:r>
-      <w:r>
-        <w:t xml:space="preserve">;</w:t>
-      </w:r>
-      <w:r>
-        <w:t xml:space="preserve"> </w:t>
-      </w:r>
-      <w:r>
-        <w:t xml:space="preserve">[65]</w:t>
-      </w:r>
-      <w:r>
-        <w:t xml:space="preserve">;</w:t>
-      </w:r>
-      <w:r>
-        <w:t xml:space="preserve"> </w:t>
-      </w:r>
-      <w:r>
-        <w:t xml:space="preserve">[50]</w:t>
+        <w:t xml:space="preserve">[49,50,63–65]</w:t>
       </w:r>
       <w:r>
         <w:t xml:space="preserve">. Non-utilitarian mobility establishes regional social networks which facilitate the spread of information and the survival of hunter-gatherers in uncertain environments</w:t>
@@ -2798,43 +2759,7 @@
         <w:t xml:space="preserve"> </w:t>
       </w:r>
       <w:r>
-        <w:t xml:space="preserve">[66]</w:t>
-      </w:r>
-      <w:r>
-        <w:t xml:space="preserve">;</w:t>
-      </w:r>
-      <w:r>
-        <w:t xml:space="preserve"> </w:t>
-      </w:r>
-      <w:r>
-        <w:t xml:space="preserve">[67]</w:t>
-      </w:r>
-      <w:r>
-        <w:t xml:space="preserve">;</w:t>
-      </w:r>
-      <w:r>
-        <w:t xml:space="preserve"> </w:t>
-      </w:r>
-      <w:r>
-        <w:t xml:space="preserve">[68]</w:t>
-      </w:r>
-      <w:r>
-        <w:t xml:space="preserve">;</w:t>
-      </w:r>
-      <w:r>
-        <w:t xml:space="preserve"> </w:t>
-      </w:r>
-      <w:r>
-        <w:t xml:space="preserve">[69]</w:t>
-      </w:r>
-      <w:r>
-        <w:t xml:space="preserve">;</w:t>
-      </w:r>
-      <w:r>
-        <w:t xml:space="preserve"> </w:t>
-      </w:r>
-      <w:r>
-        <w:t xml:space="preserve">[70]</w:t>
+        <w:t xml:space="preserve">[66–70]</w:t>
       </w:r>
       <w:r>
         <w:t xml:space="preserve">. The exchange and production of decorative items, such as objects with geometric signs, has been associated with non-utilitarian mobility and recognized as an indicator of social contact</w:t>
@@ -2843,43 +2768,7 @@
         <w:t xml:space="preserve"> </w:t>
       </w:r>
       <w:r>
-        <w:t xml:space="preserve">[66]</w:t>
-      </w:r>
-      <w:r>
-        <w:t xml:space="preserve">;</w:t>
-      </w:r>
-      <w:r>
-        <w:t xml:space="preserve"> </w:t>
-      </w:r>
-      <w:r>
-        <w:t xml:space="preserve">[71]</w:t>
-      </w:r>
-      <w:r>
-        <w:t xml:space="preserve">;</w:t>
-      </w:r>
-      <w:r>
-        <w:t xml:space="preserve"> </w:t>
-      </w:r>
-      <w:r>
-        <w:t xml:space="preserve">[72]</w:t>
-      </w:r>
-      <w:r>
-        <w:t xml:space="preserve">;</w:t>
-      </w:r>
-      <w:r>
-        <w:t xml:space="preserve"> </w:t>
-      </w:r>
-      <w:r>
-        <w:t xml:space="preserve">[73]</w:t>
-      </w:r>
-      <w:r>
-        <w:t xml:space="preserve">;</w:t>
-      </w:r>
-      <w:r>
-        <w:t xml:space="preserve"> </w:t>
-      </w:r>
-      <w:r>
-        <w:t xml:space="preserve">[74]</w:t>
+        <w:t xml:space="preserve">[71–74]</w:t>
       </w:r>
       <w:r>
         <w:t xml:space="preserve">. Our Mantel tests did not detect a significant correlation between sign-type distribution and geographic distance in any phase (</w:t>
@@ -3148,7 +3037,7 @@
         <w:pStyle w:val="FirstParagraph"/>
       </w:pPr>
       <w:r>
-        <w:t xml:space="preserve">Our second aim was to determine what these patterns reveal about the dynamics of social organization throughout the Aurignacian. The results suggest that the phases do not differ significantly in size-adjusted network statistics and that raw differences in inter-site connectivity mainly reflect the early Aurignacian (Aur-P1) having more sites. Geographic distance had little influence on sign distribution in Aur-P1 (Mantel R = 0.046;</w:t>
+        <w:t xml:space="preserve">Our second aim was to determine what these patterns reveal about the dynamics of social organization throughout the Aurignacian. The results suggest that the phases do not have detectable differences in size-adjusted network statistics. Raw differences in inter-site connectivity mainly reflect the early Aurignacian (Aur-P1) having more sites. Geographic distance had little influence on sign distribution in Aur-P1 (Mantel R = 0.046;</w:t>
       </w:r>
       <w:r>
         <w:t xml:space="preserve"> </w:t>
@@ -3512,13 +3401,22 @@
         <w:t xml:space="preserve">[102]</w:t>
       </w:r>
       <w:r>
-        <w:t xml:space="preserve">. Our finding of no statistically significant differences in connectivity metrics across the two phases suggests that relative interaction levels remained consistent over time, even as populations consolidated into fewer sites. The lack of significant geographic structure in either phase contradicts simple isolation-by-distance models</w:t>
-      </w:r>
-      <w:r>
-        <w:t xml:space="preserve"> </w:t>
-      </w:r>
-      <w:r>
-        <w:t xml:space="preserve">[99,103]</w:t>
+        <w:t xml:space="preserve">. Our finding of no statistically significant differences in connectivity metrics across the two phases suggests that relative interaction levels remained consistent over time, even as populations consolidated into fewer sites. This maintenance of interaction level through demographic consolidation parallels the Iberian Mesolithic, where peninsular-scale ornament networks persisted without topological change from the Early to Late Mesolithic despite population growth and technocomplex replacement</w:t>
+      </w:r>
+      <w:r>
+        <w:t xml:space="preserve"> </w:t>
+      </w:r>
+      <w:r>
+        <w:t xml:space="preserve">[103]</w:t>
+      </w:r>
+      <w:r>
+        <w:t xml:space="preserve">. The lack of significant geographic structure in either phase contradicts simple isolation-by-distance models</w:t>
+      </w:r>
+      <w:r>
+        <w:t xml:space="preserve"> </w:t>
+      </w:r>
+      <w:r>
+        <w:t xml:space="preserve">[99,104]</w:t>
       </w:r>
       <w:r>
         <w:t xml:space="preserve">. Our non-significant Mantel result cannot establish which social process generated the pattern; ritual gatherings or ceremonial exchange remain speculative possibilities. The network structures reported here reflect sign-sharing patterns, not direct evidence of social organisation, and sign types may reflect independent invention or functional constraints rather than social transmission. Our caution matches</w:t>
@@ -3527,7 +3425,7 @@
         <w:t xml:space="preserve"> </w:t>
       </w:r>
       <w:r>
-        <w:t xml:space="preserve">[104]</w:t>
+        <w:t xml:space="preserve">[105]</w:t>
       </w:r>
       <w:r>
         <w:t xml:space="preserve">, who treats stable bison-horse-ibex centrality in Magdalenian parietal art along the Bay of Biscayas an organisational grammar and refrains from claims about symbolic meaning, narrative content, or cultural meaning.</w:t>
@@ -3577,7 +3475,7 @@
         <w:t xml:space="preserve"> </w:t>
       </w:r>
       <w:r>
-        <w:t xml:space="preserve">[105]</w:t>
+        <w:t xml:space="preserve">[106]</w:t>
       </w:r>
       <w:r>
         <w:t xml:space="preserve">’s proposal that sign sequences having protocuneiform-like information density, suggesting notational function, or</w:t>
@@ -3586,7 +3484,7 @@
         <w:t xml:space="preserve"> </w:t>
       </w:r>
       <w:r>
-        <w:t xml:space="preserve">[106]</w:t>
+        <w:t xml:space="preserve">[107]</w:t>
       </w:r>
       <w:r>
         <w:t xml:space="preserve">’s claim that some sign recording seasonal prey information. However, these hypotheses are contested:</w:t>
@@ -3595,7 +3493,7 @@
         <w:t xml:space="preserve"> </w:t>
       </w:r>
       <w:r>
-        <w:t xml:space="preserve">[107]</w:t>
+        <w:t xml:space="preserve">[108]</w:t>
       </w:r>
       <w:r>
         <w:t xml:space="preserve"> </w:t>
@@ -3607,7 +3505,7 @@
         <w:t xml:space="preserve"> </w:t>
       </w:r>
       <w:r>
-        <w:t xml:space="preserve">[108]</w:t>
+        <w:t xml:space="preserve">[109]</w:t>
       </w:r>
       <w:r>
         <w:t xml:space="preserve"> </w:t>
@@ -3619,7 +3517,7 @@
         <w:t xml:space="preserve"> </w:t>
       </w:r>
       <w:r>
-        <w:t xml:space="preserve">[109]</w:t>
+        <w:t xml:space="preserve">[110]</w:t>
       </w:r>
       <w:r>
         <w:t xml:space="preserve"> </w:t>
@@ -3631,7 +3529,7 @@
         <w:t xml:space="preserve"> </w:t>
       </w:r>
       <w:r>
-        <w:t xml:space="preserve">[110]</w:t>
+        <w:t xml:space="preserve">[111]</w:t>
       </w:r>
       <w:r>
         <w:t xml:space="preserve"> </w:t>
@@ -3662,7 +3560,7 @@
         <w:t xml:space="preserve"> </w:t>
       </w:r>
       <w:r>
-        <w:t xml:space="preserve">[3,77,111–114]</w:t>
+        <w:t xml:space="preserve">[3,77,112–115]</w:t>
       </w:r>
       <w:r>
         <w:t xml:space="preserve"> </w:t>
@@ -3674,7 +3572,7 @@
         <w:t xml:space="preserve"> </w:t>
       </w:r>
       <w:r>
-        <w:t xml:space="preserve">[2,70,115–119]</w:t>
+        <w:t xml:space="preserve">[2,70,116–120]</w:t>
       </w:r>
       <w:r>
         <w:t xml:space="preserve">. Our results show that the current sample of geometric signs does not support any significant change over the Aurignacian.</w:t>
@@ -3708,7 +3606,7 @@
         <w:t xml:space="preserve"> </w:t>
       </w:r>
       <w:r>
-        <w:t xml:space="preserve">[105–110]</w:t>
+        <w:t xml:space="preserve">[106–111]</w:t>
       </w:r>
       <w:r>
         <w:t xml:space="preserve">. Our findings are consistent with the conclusions of</w:t>
@@ -3737,7 +3635,7 @@
         <w:t xml:space="preserve"> </w:t>
       </w:r>
       <w:r>
-        <w:t xml:space="preserve">[120]</w:t>
+        <w:t xml:space="preserve">[121]</w:t>
       </w:r>
       <w:r>
         <w:t xml:space="preserve"> </w:t>
@@ -3749,7 +3647,7 @@
         <w:t xml:space="preserve"> </w:t>
       </w:r>
       <w:r>
-        <w:t xml:space="preserve">[121]</w:t>
+        <w:t xml:space="preserve">[122]</w:t>
       </w:r>
       <w:r>
         <w:t xml:space="preserve">, and additionally, greater quantities of included sign types serve to establish stronger connections</w:t>
@@ -3758,7 +3656,7 @@
         <w:t xml:space="preserve"> </w:t>
       </w:r>
       <w:r>
-        <w:t xml:space="preserve">[122]</w:t>
+        <w:t xml:space="preserve">[123]</w:t>
       </w:r>
       <w:r>
         <w:t xml:space="preserve">. This ambiguity may be addressed in the future through the usage of the data recently released in SignBase 2.0 covering sites in Germany, which contains more detailed information on the specific order and patterns in which signs occurred on individual objects</w:t>
@@ -3767,7 +3665,7 @@
         <w:t xml:space="preserve"> </w:t>
       </w:r>
       <w:r>
-        <w:t xml:space="preserve">[105]</w:t>
+        <w:t xml:space="preserve">[106]</w:t>
       </w:r>
       <w:r>
         <w:t xml:space="preserve">.</w:t>
@@ -3784,7 +3682,7 @@
         <w:t xml:space="preserve"> </w:t>
       </w:r>
       <w:r>
-        <w:t xml:space="preserve">[123]</w:t>
+        <w:t xml:space="preserve">[124]</w:t>
       </w:r>
       <w:r>
         <w:t xml:space="preserve"> </w:t>
@@ -3816,7 +3714,7 @@
         <w:t xml:space="preserve"> </w:t>
       </w:r>
       <w:r>
-        <w:t xml:space="preserve">[124,125]</w:t>
+        <w:t xml:space="preserve">[125,126]</w:t>
       </w:r>
       <w:r>
         <w:t xml:space="preserve">, La Ferrassie’s Aurignacian begins with the Early Aurignacian directly above the Châtelperronian</w:t>
@@ -3825,7 +3723,7 @@
         <w:t xml:space="preserve"> </w:t>
       </w:r>
       <w:r>
-        <w:t xml:space="preserve">[126]</w:t>
+        <w:t xml:space="preserve">[127]</w:t>
       </w:r>
       <w:r>
         <w:t xml:space="preserve">, and Mladeč’s massive-base bone points and ~31 ka ¹⁴C BP (~35–36 ka cal BP) dates indicate an Evolved (Aur-P2) attribution</w:t>
@@ -3834,7 +3732,7 @@
         <w:t xml:space="preserve"> </w:t>
       </w:r>
       <w:r>
-        <w:t xml:space="preserve">[127]</w:t>
+        <w:t xml:space="preserve">[128]</w:t>
       </w:r>
       <w:r>
         <w:t xml:space="preserve">. Additionally, Vogelherd Cave’s stratigraphy is compromised by excavation methodology and post-depositional disturbance, with documented mixing between Aurignacian, Gravettian, and Magdalenian layers</w:t>
@@ -3843,7 +3741,7 @@
         <w:t xml:space="preserve"> </w:t>
       </w:r>
       <w:r>
-        <w:t xml:space="preserve">[128]</w:t>
+        <w:t xml:space="preserve">[129]</w:t>
       </w:r>
       <w:r>
         <w:t xml:space="preserve">. After exclusions, Aur-P2 rests on only 9 sites and 63 objects, so its two-group structure and network statistics have limited power. To manage this limitation we tested the sensitivity of our assignments to reverting to purely date-based criteria in S1</w:t>
@@ -3876,7 +3774,7 @@
       </w:r>
     </w:p>
     <w:bookmarkEnd w:id="61"/>
-    <w:bookmarkStart w:id="305" w:name="references"/>
+    <w:bookmarkStart w:id="307" w:name="references"/>
     <w:p>
       <w:pPr>
         <w:pStyle w:val="Heading1"/>
@@ -3885,7 +3783,7 @@
         <w:t xml:space="preserve">References</w:t>
       </w:r>
     </w:p>
-    <w:bookmarkStart w:id="304" w:name="refs"/>
+    <w:bookmarkStart w:id="306" w:name="refs"/>
     <w:bookmarkStart w:id="63" w:name="ref-Boyd_Silk_2020"/>
     <w:p>
       <w:pPr>
@@ -8596,7 +8494,7 @@
       </w:r>
     </w:p>
     <w:bookmarkEnd w:id="253"/>
-    <w:bookmarkStart w:id="255" w:name="ref-Eerkens_Lipo_2005"/>
+    <w:bookmarkStart w:id="255" w:name="ref-CucartMora_2022"/>
     <w:p>
       <w:pPr>
         <w:pStyle w:val="Bibliography"/>
@@ -8611,12 +8509,75 @@
         <w:t xml:space="preserve">	</w:t>
       </w:r>
       <w:r>
+        <w:t xml:space="preserve">Cucart-Mora C, Gómez-Puche M, Romano V, Fernández-López de Pablo J, Lozano S. Reconstructing</w:t>
+      </w:r>
+      <w:r>
+        <w:t xml:space="preserve"> </w:t>
+      </w:r>
+      <w:r>
+        <w:t xml:space="preserve">Mesolithic</w:t>
+      </w:r>
+      <w:r>
+        <w:t xml:space="preserve"> </w:t>
+      </w:r>
+      <w:r>
+        <w:t xml:space="preserve">social networks on the</w:t>
+      </w:r>
+      <w:r>
+        <w:t xml:space="preserve"> </w:t>
+      </w:r>
+      <w:r>
+        <w:t xml:space="preserve">Iberian</w:t>
+      </w:r>
+      <w:r>
+        <w:t xml:space="preserve"> </w:t>
+      </w:r>
+      <w:r>
+        <w:t xml:space="preserve">Peninsula</w:t>
+      </w:r>
+      <w:r>
+        <w:t xml:space="preserve"> </w:t>
+      </w:r>
+      <w:r>
+        <w:t xml:space="preserve">using ornaments. Archaeological and Anthropological Sciences 2022;14.</w:t>
+      </w:r>
+      <w:r>
+        <w:t xml:space="preserve"> </w:t>
+      </w:r>
+      <w:hyperlink r:id="rId254">
+        <w:r>
+          <w:rPr>
+            <w:rStyle w:val="Hyperlink"/>
+          </w:rPr>
+          <w:t xml:space="preserve">https://doi.org/10.1007/s12520-022-01641-z</w:t>
+        </w:r>
+      </w:hyperlink>
+      <w:r>
+        <w:t xml:space="preserve">.</w:t>
+      </w:r>
+    </w:p>
+    <w:bookmarkEnd w:id="255"/>
+    <w:bookmarkStart w:id="257" w:name="ref-Eerkens_Lipo_2005"/>
+    <w:p>
+      <w:pPr>
+        <w:pStyle w:val="Bibliography"/>
+      </w:pPr>
+      <w:r>
+        <w:t xml:space="preserve">[104]</w:t>
+      </w:r>
+      <w:r>
+        <w:t xml:space="preserve"> </w:t>
+      </w:r>
+      <w:r>
+        <w:t xml:space="preserve">	</w:t>
+      </w:r>
+      <w:r>
         <w:t xml:space="preserve">Eerkens JW, Lipo CP. Cultural transmission, copying errors, and the generation of variation in material culture and the archaeological record. Journal of Anthropological Archaeology 2005;24:316–34.</w:t>
       </w:r>
       <w:r>
         <w:t xml:space="preserve"> </w:t>
       </w:r>
-      <w:hyperlink r:id="rId254">
+      <w:hyperlink r:id="rId256">
         <w:r>
           <w:rPr>
             <w:rStyle w:val="Hyperlink"/>
@@ -8628,14 +8589,14 @@
         <w:t xml:space="preserve">.</w:t>
       </w:r>
     </w:p>
-    <w:bookmarkEnd w:id="255"/>
-    <w:bookmarkStart w:id="257" w:name="ref-Intxaurbe_2026"/>
-    <w:p>
-      <w:pPr>
-        <w:pStyle w:val="Bibliography"/>
-      </w:pPr>
-      <w:r>
-        <w:t xml:space="preserve">[104]</w:t>
+    <w:bookmarkEnd w:id="257"/>
+    <w:bookmarkStart w:id="259" w:name="ref-Intxaurbe_2026"/>
+    <w:p>
+      <w:pPr>
+        <w:pStyle w:val="Bibliography"/>
+      </w:pPr>
+      <w:r>
+        <w:t xml:space="preserve">[105]</w:t>
       </w:r>
       <w:r>
         <w:t xml:space="preserve"> </w:t>
@@ -8667,7 +8628,7 @@
       <w:r>
         <w:t xml:space="preserve"> </w:t>
       </w:r>
-      <w:hyperlink r:id="rId256">
+      <w:hyperlink r:id="rId258">
         <w:r>
           <w:rPr>
             <w:rStyle w:val="Hyperlink"/>
@@ -8679,14 +8640,14 @@
         <w:t xml:space="preserve">.</w:t>
       </w:r>
     </w:p>
-    <w:bookmarkEnd w:id="257"/>
-    <w:bookmarkStart w:id="259" w:name="ref-Bentz_Dutkiewicz_2026"/>
-    <w:p>
-      <w:pPr>
-        <w:pStyle w:val="Bibliography"/>
-      </w:pPr>
-      <w:r>
-        <w:t xml:space="preserve">[105]</w:t>
+    <w:bookmarkEnd w:id="259"/>
+    <w:bookmarkStart w:id="261" w:name="ref-Bentz_Dutkiewicz_2026"/>
+    <w:p>
+      <w:pPr>
+        <w:pStyle w:val="Bibliography"/>
+      </w:pPr>
+      <w:r>
+        <w:t xml:space="preserve">[106]</w:t>
       </w:r>
       <w:r>
         <w:t xml:space="preserve"> </w:t>
@@ -8700,7 +8661,7 @@
       <w:r>
         <w:t xml:space="preserve"> </w:t>
       </w:r>
-      <w:hyperlink r:id="rId258">
+      <w:hyperlink r:id="rId260">
         <w:r>
           <w:rPr>
             <w:rStyle w:val="Hyperlink"/>
@@ -8712,14 +8673,14 @@
         <w:t xml:space="preserve">.</w:t>
       </w:r>
     </w:p>
-    <w:bookmarkEnd w:id="259"/>
-    <w:bookmarkStart w:id="261" w:name="ref-Bacon_2023"/>
-    <w:p>
-      <w:pPr>
-        <w:pStyle w:val="Bibliography"/>
-      </w:pPr>
-      <w:r>
-        <w:t xml:space="preserve">[106]</w:t>
+    <w:bookmarkEnd w:id="261"/>
+    <w:bookmarkStart w:id="263" w:name="ref-Bacon_2023"/>
+    <w:p>
+      <w:pPr>
+        <w:pStyle w:val="Bibliography"/>
+      </w:pPr>
+      <w:r>
+        <w:t xml:space="preserve">[107]</w:t>
       </w:r>
       <w:r>
         <w:t xml:space="preserve"> </w:t>
@@ -8745,7 +8706,7 @@
       <w:r>
         <w:t xml:space="preserve"> </w:t>
       </w:r>
-      <w:hyperlink r:id="rId260">
+      <w:hyperlink r:id="rId262">
         <w:r>
           <w:rPr>
             <w:rStyle w:val="Hyperlink"/>
@@ -8757,14 +8718,14 @@
         <w:t xml:space="preserve">.</w:t>
       </w:r>
     </w:p>
-    <w:bookmarkEnd w:id="261"/>
-    <w:bookmarkStart w:id="263" w:name="Xa4990169aeb885a690070ab4fd90972c31994f8"/>
-    <w:p>
-      <w:pPr>
-        <w:pStyle w:val="Bibliography"/>
-      </w:pPr>
-      <w:r>
-        <w:t xml:space="preserve">[107]</w:t>
+    <w:bookmarkEnd w:id="263"/>
+    <w:bookmarkStart w:id="265" w:name="Xa4990169aeb885a690070ab4fd90972c31994f8"/>
+    <w:p>
+      <w:pPr>
+        <w:pStyle w:val="Bibliography"/>
+      </w:pPr>
+      <w:r>
+        <w:t xml:space="preserve">[108]</w:t>
       </w:r>
       <w:r>
         <w:t xml:space="preserve"> </w:t>
@@ -8790,7 +8751,7 @@
       <w:r>
         <w:t xml:space="preserve"> </w:t>
       </w:r>
-      <w:hyperlink r:id="rId262">
+      <w:hyperlink r:id="rId264">
         <w:r>
           <w:rPr>
             <w:rStyle w:val="Hyperlink"/>
@@ -8802,14 +8763,14 @@
         <w:t xml:space="preserve">.</w:t>
       </w:r>
     </w:p>
-    <w:bookmarkEnd w:id="263"/>
-    <w:bookmarkStart w:id="265" w:name="X8ea620419c64d551554c48b7075c9934881930b"/>
-    <w:p>
-      <w:pPr>
-        <w:pStyle w:val="Bibliography"/>
-      </w:pPr>
-      <w:r>
-        <w:t xml:space="preserve">[108]</w:t>
+    <w:bookmarkEnd w:id="265"/>
+    <w:bookmarkStart w:id="267" w:name="X8ea620419c64d551554c48b7075c9934881930b"/>
+    <w:p>
+      <w:pPr>
+        <w:pStyle w:val="Bibliography"/>
+      </w:pPr>
+      <w:r>
+        <w:t xml:space="preserve">[109]</w:t>
       </w:r>
       <w:r>
         <w:t xml:space="preserve"> </w:t>
@@ -8859,7 +8820,7 @@
       <w:r>
         <w:t xml:space="preserve"> </w:t>
       </w:r>
-      <w:hyperlink r:id="rId264">
+      <w:hyperlink r:id="rId266">
         <w:r>
           <w:rPr>
             <w:rStyle w:val="Hyperlink"/>
@@ -8871,14 +8832,14 @@
         <w:t xml:space="preserve">.</w:t>
       </w:r>
     </w:p>
-    <w:bookmarkEnd w:id="265"/>
-    <w:bookmarkStart w:id="267" w:name="ref-Magli_2024"/>
-    <w:p>
-      <w:pPr>
-        <w:pStyle w:val="Bibliography"/>
-      </w:pPr>
-      <w:r>
-        <w:t xml:space="preserve">[109]</w:t>
+    <w:bookmarkEnd w:id="267"/>
+    <w:bookmarkStart w:id="269" w:name="ref-Magli_2024"/>
+    <w:p>
+      <w:pPr>
+        <w:pStyle w:val="Bibliography"/>
+      </w:pPr>
+      <w:r>
+        <w:t xml:space="preserve">[110]</w:t>
       </w:r>
       <w:r>
         <w:t xml:space="preserve"> </w:t>
@@ -8904,7 +8865,7 @@
       <w:r>
         <w:t xml:space="preserve"> </w:t>
       </w:r>
-      <w:hyperlink r:id="rId266">
+      <w:hyperlink r:id="rId268">
         <w:r>
           <w:rPr>
             <w:rStyle w:val="Hyperlink"/>
@@ -8916,14 +8877,14 @@
         <w:t xml:space="preserve">.</w:t>
       </w:r>
     </w:p>
-    <w:bookmarkEnd w:id="267"/>
-    <w:bookmarkStart w:id="269" w:name="ref-Nowell_2024_evidence"/>
-    <w:p>
-      <w:pPr>
-        <w:pStyle w:val="Bibliography"/>
-      </w:pPr>
-      <w:r>
-        <w:t xml:space="preserve">[110]</w:t>
+    <w:bookmarkEnd w:id="269"/>
+    <w:bookmarkStart w:id="271" w:name="ref-Nowell_2024_evidence"/>
+    <w:p>
+      <w:pPr>
+        <w:pStyle w:val="Bibliography"/>
+      </w:pPr>
+      <w:r>
+        <w:t xml:space="preserve">[111]</w:t>
       </w:r>
       <w:r>
         <w:t xml:space="preserve"> </w:t>
@@ -8949,7 +8910,7 @@
       <w:r>
         <w:t xml:space="preserve"> </w:t>
       </w:r>
-      <w:hyperlink r:id="rId268">
+      <w:hyperlink r:id="rId270">
         <w:r>
           <w:rPr>
             <w:rStyle w:val="Hyperlink"/>
@@ -8961,14 +8922,14 @@
         <w:t xml:space="preserve">.</w:t>
       </w:r>
     </w:p>
-    <w:bookmarkEnd w:id="269"/>
-    <w:bookmarkStart w:id="271" w:name="ref-Horiuchi_Takakura_2019"/>
-    <w:p>
-      <w:pPr>
-        <w:pStyle w:val="Bibliography"/>
-      </w:pPr>
-      <w:r>
-        <w:t xml:space="preserve">[111]</w:t>
+    <w:bookmarkEnd w:id="271"/>
+    <w:bookmarkStart w:id="273" w:name="ref-Horiuchi_Takakura_2019"/>
+    <w:p>
+      <w:pPr>
+        <w:pStyle w:val="Bibliography"/>
+      </w:pPr>
+      <w:r>
+        <w:t xml:space="preserve">[112]</w:t>
       </w:r>
       <w:r>
         <w:t xml:space="preserve"> </w:t>
@@ -9021,7 +8982,7 @@
       <w:r>
         <w:t xml:space="preserve"> </w:t>
       </w:r>
-      <w:hyperlink r:id="rId270">
+      <w:hyperlink r:id="rId272">
         <w:r>
           <w:rPr>
             <w:rStyle w:val="Hyperlink"/>
@@ -9033,14 +8994,14 @@
         <w:t xml:space="preserve">.</w:t>
       </w:r>
     </w:p>
-    <w:bookmarkEnd w:id="271"/>
-    <w:bookmarkStart w:id="272" w:name="ref-Rogers_2018"/>
-    <w:p>
-      <w:pPr>
-        <w:pStyle w:val="Bibliography"/>
-      </w:pPr>
-      <w:r>
-        <w:t xml:space="preserve">[112]</w:t>
+    <w:bookmarkEnd w:id="273"/>
+    <w:bookmarkStart w:id="274" w:name="ref-Rogers_2018"/>
+    <w:p>
+      <w:pPr>
+        <w:pStyle w:val="Bibliography"/>
+      </w:pPr>
+      <w:r>
+        <w:t xml:space="preserve">[113]</w:t>
       </w:r>
       <w:r>
         <w:t xml:space="preserve"> </w:t>
@@ -9082,14 +9043,14 @@
         <w:t xml:space="preserve">: An analysis of marine shell ornament distribution. Master’s thesis. University of Victoria, 2018.</w:t>
       </w:r>
     </w:p>
-    <w:bookmarkEnd w:id="272"/>
-    <w:bookmarkStart w:id="274" w:name="X94f875be1b7e5d23641daff5d53857bec24e739"/>
-    <w:p>
-      <w:pPr>
-        <w:pStyle w:val="Bibliography"/>
-      </w:pPr>
-      <w:r>
-        <w:t xml:space="preserve">[113]</w:t>
+    <w:bookmarkEnd w:id="274"/>
+    <w:bookmarkStart w:id="276" w:name="X94f875be1b7e5d23641daff5d53857bec24e739"/>
+    <w:p>
+      <w:pPr>
+        <w:pStyle w:val="Bibliography"/>
+      </w:pPr>
+      <w:r>
+        <w:t xml:space="preserve">[114]</w:t>
       </w:r>
       <w:r>
         <w:t xml:space="preserve"> </w:t>
@@ -9145,7 +9106,7 @@
       <w:r>
         <w:t xml:space="preserve"> </w:t>
       </w:r>
-      <w:hyperlink r:id="rId273">
+      <w:hyperlink r:id="rId275">
         <w:r>
           <w:rPr>
             <w:rStyle w:val="Hyperlink"/>
@@ -9157,14 +9118,14 @@
         <w:t xml:space="preserve">.</w:t>
       </w:r>
     </w:p>
-    <w:bookmarkEnd w:id="274"/>
-    <w:bookmarkStart w:id="276" w:name="ref-Gamble_1982"/>
-    <w:p>
-      <w:pPr>
-        <w:pStyle w:val="Bibliography"/>
-      </w:pPr>
-      <w:r>
-        <w:t xml:space="preserve">[114]</w:t>
+    <w:bookmarkEnd w:id="276"/>
+    <w:bookmarkStart w:id="278" w:name="ref-Gamble_1982"/>
+    <w:p>
+      <w:pPr>
+        <w:pStyle w:val="Bibliography"/>
+      </w:pPr>
+      <w:r>
+        <w:t xml:space="preserve">[115]</w:t>
       </w:r>
       <w:r>
         <w:t xml:space="preserve"> </w:t>
@@ -9190,7 +9151,7 @@
       <w:r>
         <w:t xml:space="preserve"> </w:t>
       </w:r>
-      <w:hyperlink r:id="rId275">
+      <w:hyperlink r:id="rId277">
         <w:r>
           <w:rPr>
             <w:rStyle w:val="Hyperlink"/>
@@ -9202,14 +9163,14 @@
         <w:t xml:space="preserve">.</w:t>
       </w:r>
     </w:p>
-    <w:bookmarkEnd w:id="276"/>
-    <w:bookmarkStart w:id="278" w:name="Xba346573845225b1b1d5ef358e2fea0d893a789"/>
-    <w:p>
-      <w:pPr>
-        <w:pStyle w:val="Bibliography"/>
-      </w:pPr>
-      <w:r>
-        <w:t xml:space="preserve">[115]</w:t>
+    <w:bookmarkEnd w:id="278"/>
+    <w:bookmarkStart w:id="280" w:name="Xba346573845225b1b1d5ef358e2fea0d893a789"/>
+    <w:p>
+      <w:pPr>
+        <w:pStyle w:val="Bibliography"/>
+      </w:pPr>
+      <w:r>
+        <w:t xml:space="preserve">[116]</w:t>
       </w:r>
       <w:r>
         <w:t xml:space="preserve"> </w:t>
@@ -9247,7 +9208,7 @@
       <w:r>
         <w:t xml:space="preserve"> </w:t>
       </w:r>
-      <w:hyperlink r:id="rId277">
+      <w:hyperlink r:id="rId279">
         <w:r>
           <w:rPr>
             <w:rStyle w:val="Hyperlink"/>
@@ -9259,14 +9220,14 @@
         <w:t xml:space="preserve">.</w:t>
       </w:r>
     </w:p>
-    <w:bookmarkEnd w:id="278"/>
-    <w:bookmarkStart w:id="280" w:name="ref-Creanza_Kolodny_Feldman_2017"/>
-    <w:p>
-      <w:pPr>
-        <w:pStyle w:val="Bibliography"/>
-      </w:pPr>
-      <w:r>
-        <w:t xml:space="preserve">[116]</w:t>
+    <w:bookmarkEnd w:id="280"/>
+    <w:bookmarkStart w:id="282" w:name="ref-Creanza_Kolodny_Feldman_2017"/>
+    <w:p>
+      <w:pPr>
+        <w:pStyle w:val="Bibliography"/>
+      </w:pPr>
+      <w:r>
+        <w:t xml:space="preserve">[117]</w:t>
       </w:r>
       <w:r>
         <w:t xml:space="preserve"> </w:t>
@@ -9280,7 +9241,7 @@
       <w:r>
         <w:t xml:space="preserve"> </w:t>
       </w:r>
-      <w:hyperlink r:id="rId279">
+      <w:hyperlink r:id="rId281">
         <w:r>
           <w:rPr>
             <w:rStyle w:val="Hyperlink"/>
@@ -9292,14 +9253,14 @@
         <w:t xml:space="preserve">.</w:t>
       </w:r>
     </w:p>
-    <w:bookmarkEnd w:id="280"/>
-    <w:bookmarkStart w:id="282" w:name="ref-Cullen_1996"/>
-    <w:p>
-      <w:pPr>
-        <w:pStyle w:val="Bibliography"/>
-      </w:pPr>
-      <w:r>
-        <w:t xml:space="preserve">[117]</w:t>
+    <w:bookmarkEnd w:id="282"/>
+    <w:bookmarkStart w:id="284" w:name="ref-Cullen_1996"/>
+    <w:p>
+      <w:pPr>
+        <w:pStyle w:val="Bibliography"/>
+      </w:pPr>
+      <w:r>
+        <w:t xml:space="preserve">[118]</w:t>
       </w:r>
       <w:r>
         <w:t xml:space="preserve"> </w:t>
@@ -9313,7 +9274,7 @@
       <w:r>
         <w:t xml:space="preserve"> </w:t>
       </w:r>
-      <w:hyperlink r:id="rId281">
+      <w:hyperlink r:id="rId283">
         <w:r>
           <w:rPr>
             <w:rStyle w:val="Hyperlink"/>
@@ -9325,14 +9286,14 @@
         <w:t xml:space="preserve">.</w:t>
       </w:r>
     </w:p>
-    <w:bookmarkEnd w:id="282"/>
-    <w:bookmarkStart w:id="284" w:name="ref-Hill_Wood_Baggio_Hurtado_Boyd_2014"/>
-    <w:p>
-      <w:pPr>
-        <w:pStyle w:val="Bibliography"/>
-      </w:pPr>
-      <w:r>
-        <w:t xml:space="preserve">[118]</w:t>
+    <w:bookmarkEnd w:id="284"/>
+    <w:bookmarkStart w:id="286" w:name="ref-Hill_Wood_Baggio_Hurtado_Boyd_2014"/>
+    <w:p>
+      <w:pPr>
+        <w:pStyle w:val="Bibliography"/>
+      </w:pPr>
+      <w:r>
+        <w:t xml:space="preserve">[119]</w:t>
       </w:r>
       <w:r>
         <w:t xml:space="preserve"> </w:t>
@@ -9346,7 +9307,7 @@
       <w:r>
         <w:t xml:space="preserve"> </w:t>
       </w:r>
-      <w:hyperlink r:id="rId283">
+      <w:hyperlink r:id="rId285">
         <w:r>
           <w:rPr>
             <w:rStyle w:val="Hyperlink"/>
@@ -9358,14 +9319,14 @@
         <w:t xml:space="preserve">.</w:t>
       </w:r>
     </w:p>
-    <w:bookmarkEnd w:id="284"/>
-    <w:bookmarkStart w:id="286" w:name="ref-Derex_Boyd_2016"/>
-    <w:p>
-      <w:pPr>
-        <w:pStyle w:val="Bibliography"/>
-      </w:pPr>
-      <w:r>
-        <w:t xml:space="preserve">[119]</w:t>
+    <w:bookmarkEnd w:id="286"/>
+    <w:bookmarkStart w:id="288" w:name="ref-Derex_Boyd_2016"/>
+    <w:p>
+      <w:pPr>
+        <w:pStyle w:val="Bibliography"/>
+      </w:pPr>
+      <w:r>
+        <w:t xml:space="preserve">[120]</w:t>
       </w:r>
       <w:r>
         <w:t xml:space="preserve"> </w:t>
@@ -9379,7 +9340,7 @@
       <w:r>
         <w:t xml:space="preserve"> </w:t>
       </w:r>
-      <w:hyperlink r:id="rId285">
+      <w:hyperlink r:id="rId287">
         <w:r>
           <w:rPr>
             <w:rStyle w:val="Hyperlink"/>
@@ -9391,14 +9352,14 @@
         <w:t xml:space="preserve">.</w:t>
       </w:r>
     </w:p>
-    <w:bookmarkEnd w:id="286"/>
-    <w:bookmarkStart w:id="287" w:name="ref-Von_Petzinger_2009"/>
-    <w:p>
-      <w:pPr>
-        <w:pStyle w:val="Bibliography"/>
-      </w:pPr>
-      <w:r>
-        <w:t xml:space="preserve">[120]</w:t>
+    <w:bookmarkEnd w:id="288"/>
+    <w:bookmarkStart w:id="289" w:name="ref-Von_Petzinger_2009"/>
+    <w:p>
+      <w:pPr>
+        <w:pStyle w:val="Bibliography"/>
+      </w:pPr>
+      <w:r>
+        <w:t xml:space="preserve">[121]</w:t>
       </w:r>
       <w:r>
         <w:t xml:space="preserve"> </w:t>
@@ -9428,14 +9389,14 @@
         <w:t xml:space="preserve">parietal art. Master’s thesis. University of Victoria, 2009.</w:t>
       </w:r>
     </w:p>
-    <w:bookmarkEnd w:id="287"/>
-    <w:bookmarkStart w:id="289" w:name="ref-Herskind2023"/>
-    <w:p>
-      <w:pPr>
-        <w:pStyle w:val="Bibliography"/>
-      </w:pPr>
-      <w:r>
-        <w:t xml:space="preserve">[121]</w:t>
+    <w:bookmarkEnd w:id="289"/>
+    <w:bookmarkStart w:id="291" w:name="ref-Herskind2023"/>
+    <w:p>
+      <w:pPr>
+        <w:pStyle w:val="Bibliography"/>
+      </w:pPr>
+      <w:r>
+        <w:t xml:space="preserve">[122]</w:t>
       </w:r>
       <w:r>
         <w:t xml:space="preserve"> </w:t>
@@ -9449,7 +9410,7 @@
       <w:r>
         <w:t xml:space="preserve"> </w:t>
       </w:r>
-      <w:hyperlink r:id="rId288">
+      <w:hyperlink r:id="rId290">
         <w:r>
           <w:rPr>
             <w:rStyle w:val="Hyperlink"/>
@@ -9461,14 +9422,14 @@
         <w:t xml:space="preserve">.</w:t>
       </w:r>
     </w:p>
-    <w:bookmarkEnd w:id="289"/>
-    <w:bookmarkStart w:id="291" w:name="ref-Gravel-Miguel_Coward_2023"/>
-    <w:p>
-      <w:pPr>
-        <w:pStyle w:val="Bibliography"/>
-      </w:pPr>
-      <w:r>
-        <w:t xml:space="preserve">[122]</w:t>
+    <w:bookmarkEnd w:id="291"/>
+    <w:bookmarkStart w:id="293" w:name="ref-Gravel-Miguel_Coward_2023"/>
+    <w:p>
+      <w:pPr>
+        <w:pStyle w:val="Bibliography"/>
+      </w:pPr>
+      <w:r>
+        <w:t xml:space="preserve">[123]</w:t>
       </w:r>
       <w:r>
         <w:t xml:space="preserve"> </w:t>
@@ -9494,7 +9455,7 @@
       <w:r>
         <w:t xml:space="preserve"> </w:t>
       </w:r>
-      <w:hyperlink r:id="rId290">
+      <w:hyperlink r:id="rId292">
         <w:r>
           <w:rPr>
             <w:rStyle w:val="Hyperlink"/>
@@ -9506,14 +9467,14 @@
         <w:t xml:space="preserve">.</w:t>
       </w:r>
     </w:p>
-    <w:bookmarkEnd w:id="291"/>
-    <w:bookmarkStart w:id="293" w:name="X42e36537dda68556aeacf852410efd6ac3bb1ca"/>
-    <w:p>
-      <w:pPr>
-        <w:pStyle w:val="Bibliography"/>
-      </w:pPr>
-      <w:r>
-        <w:t xml:space="preserve">[123]</w:t>
+    <w:bookmarkEnd w:id="293"/>
+    <w:bookmarkStart w:id="295" w:name="X42e36537dda68556aeacf852410efd6ac3bb1ca"/>
+    <w:p>
+      <w:pPr>
+        <w:pStyle w:val="Bibliography"/>
+      </w:pPr>
+      <w:r>
+        <w:t xml:space="preserve">[124]</w:t>
       </w:r>
       <w:r>
         <w:t xml:space="preserve"> </w:t>
@@ -9527,7 +9488,7 @@
       <w:r>
         <w:t xml:space="preserve"> </w:t>
       </w:r>
-      <w:hyperlink r:id="rId292">
+      <w:hyperlink r:id="rId294">
         <w:r>
           <w:rPr>
             <w:rStyle w:val="Hyperlink"/>
@@ -9539,14 +9500,14 @@
         <w:t xml:space="preserve">.</w:t>
       </w:r>
     </w:p>
-    <w:bookmarkEnd w:id="293"/>
-    <w:bookmarkStart w:id="295" w:name="ref-Chiotti_2005"/>
-    <w:p>
-      <w:pPr>
-        <w:pStyle w:val="Bibliography"/>
-      </w:pPr>
-      <w:r>
-        <w:t xml:space="preserve">[124]</w:t>
+    <w:bookmarkEnd w:id="295"/>
+    <w:bookmarkStart w:id="297" w:name="ref-Chiotti_2005"/>
+    <w:p>
+      <w:pPr>
+        <w:pStyle w:val="Bibliography"/>
+      </w:pPr>
+      <w:r>
+        <w:t xml:space="preserve">[125]</w:t>
       </w:r>
       <w:r>
         <w:t xml:space="preserve"> </w:t>
@@ -9587,7 +9548,7 @@
       <w:r>
         <w:t xml:space="preserve"> </w:t>
       </w:r>
-      <w:hyperlink r:id="rId294">
+      <w:hyperlink r:id="rId296">
         <w:r>
           <w:rPr>
             <w:rStyle w:val="Hyperlink"/>
@@ -9599,14 +9560,14 @@
         <w:t xml:space="preserve">.</w:t>
       </w:r>
     </w:p>
-    <w:bookmarkEnd w:id="295"/>
-    <w:bookmarkStart w:id="297" w:name="ref-Higham_Abri_Pataud_2011"/>
-    <w:p>
-      <w:pPr>
-        <w:pStyle w:val="Bibliography"/>
-      </w:pPr>
-      <w:r>
-        <w:t xml:space="preserve">[125]</w:t>
+    <w:bookmarkEnd w:id="297"/>
+    <w:bookmarkStart w:id="299" w:name="ref-Higham_Abri_Pataud_2011"/>
+    <w:p>
+      <w:pPr>
+        <w:pStyle w:val="Bibliography"/>
+      </w:pPr>
+      <w:r>
+        <w:t xml:space="preserve">[126]</w:t>
       </w:r>
       <w:r>
         <w:t xml:space="preserve"> </w:t>
@@ -9659,7 +9620,7 @@
       <w:r>
         <w:t xml:space="preserve"> </w:t>
       </w:r>
-      <w:hyperlink r:id="rId296">
+      <w:hyperlink r:id="rId298">
         <w:r>
           <w:rPr>
             <w:rStyle w:val="Hyperlink"/>
@@ -9671,14 +9632,14 @@
         <w:t xml:space="preserve">.</w:t>
       </w:r>
     </w:p>
-    <w:bookmarkEnd w:id="297"/>
-    <w:bookmarkStart w:id="299" w:name="ref-Talamo_La_Ferrassie_2020"/>
-    <w:p>
-      <w:pPr>
-        <w:pStyle w:val="Bibliography"/>
-      </w:pPr>
-      <w:r>
-        <w:t xml:space="preserve">[126]</w:t>
+    <w:bookmarkEnd w:id="299"/>
+    <w:bookmarkStart w:id="301" w:name="ref-Talamo_La_Ferrassie_2020"/>
+    <w:p>
+      <w:pPr>
+        <w:pStyle w:val="Bibliography"/>
+      </w:pPr>
+      <w:r>
+        <w:t xml:space="preserve">[127]</w:t>
       </w:r>
       <w:r>
         <w:t xml:space="preserve"> </w:t>
@@ -9773,7 +9734,7 @@
       <w:r>
         <w:t xml:space="preserve"> </w:t>
       </w:r>
-      <w:hyperlink r:id="rId298">
+      <w:hyperlink r:id="rId300">
         <w:r>
           <w:rPr>
             <w:rStyle w:val="Hyperlink"/>
@@ -9785,14 +9746,14 @@
         <w:t xml:space="preserve">.</w:t>
       </w:r>
     </w:p>
-    <w:bookmarkEnd w:id="299"/>
-    <w:bookmarkStart w:id="301" w:name="ref-Wild_et_al_2005"/>
-    <w:p>
-      <w:pPr>
-        <w:pStyle w:val="Bibliography"/>
-      </w:pPr>
-      <w:r>
-        <w:t xml:space="preserve">[127]</w:t>
+    <w:bookmarkEnd w:id="301"/>
+    <w:bookmarkStart w:id="303" w:name="ref-Wild_et_al_2005"/>
+    <w:p>
+      <w:pPr>
+        <w:pStyle w:val="Bibliography"/>
+      </w:pPr>
+      <w:r>
+        <w:t xml:space="preserve">[128]</w:t>
       </w:r>
       <w:r>
         <w:t xml:space="preserve"> </w:t>
@@ -9842,7 +9803,7 @@
       <w:r>
         <w:t xml:space="preserve"> </w:t>
       </w:r>
-      <w:hyperlink r:id="rId300">
+      <w:hyperlink r:id="rId302">
         <w:r>
           <w:rPr>
             <w:rStyle w:val="Hyperlink"/>
@@ -9854,14 +9815,14 @@
         <w:t xml:space="preserve">.</w:t>
       </w:r>
     </w:p>
-    <w:bookmarkEnd w:id="301"/>
-    <w:bookmarkStart w:id="303" w:name="ref-Schurch_Conard_2026_reassess"/>
-    <w:p>
-      <w:pPr>
-        <w:pStyle w:val="Bibliography"/>
-      </w:pPr>
-      <w:r>
-        <w:t xml:space="preserve">[128]</w:t>
+    <w:bookmarkEnd w:id="303"/>
+    <w:bookmarkStart w:id="305" w:name="ref-Schurch_Conard_2026_reassess"/>
+    <w:p>
+      <w:pPr>
+        <w:pStyle w:val="Bibliography"/>
+      </w:pPr>
+      <w:r>
+        <w:t xml:space="preserve">[129]</w:t>
       </w:r>
       <w:r>
         <w:t xml:space="preserve"> </w:t>
@@ -9890,7 +9851,7 @@
       <w:r>
         <w:t xml:space="preserve"> </w:t>
       </w:r>
-      <w:hyperlink r:id="rId302">
+      <w:hyperlink r:id="rId304">
         <w:r>
           <w:rPr>
             <w:rStyle w:val="Hyperlink"/>
@@ -9902,9 +9863,9 @@
         <w:t xml:space="preserve">.</w:t>
       </w:r>
     </w:p>
-    <w:bookmarkEnd w:id="303"/>
-    <w:bookmarkEnd w:id="304"/>
     <w:bookmarkEnd w:id="305"/>
+    <w:bookmarkEnd w:id="306"/>
+    <w:bookmarkEnd w:id="307"/>
     <w:sectPr>
       <w:footnotePr>
         <w:numRestart w:val="eachSect"/>

</xml_diff>

<commit_message>
update inline values with r code for S1
</commit_message>
<xml_diff>
--- a/paper/paper.docx
+++ b/paper/paper.docx
@@ -275,7 +275,7 @@
         <w:t xml:space="preserve"> </w:t>
       </w:r>
       <w:r>
-        <w:t xml:space="preserve">into Western Eurasia, yet the evolution of social organization during this transition remains debated. Here we investigate social dynamics through the analysis of geometric signs on mobile objects within a two-phase framework based on specialist technological attributions in site assignment. Using seriation and network analyses, we examine patterns of sign production in each phase, and investigate how the sign-sharing network differs between the Early and Late Aurignacian. Within the early phase (Aur-P1; 20 sites) we hypothesize a two-group structure of restricted versus broad geometric-sign repertoires. Stochastic block modelling recovers the restricted/broad split as its two largest blocks in Aur-P1, while selecting a single block in Aur-P2; but the richness gap between the groups is not distinguishable from a group difference once the saturating richness–effort relationship is modelled. Despite differences in network size between phases, permutation tests show no evidence for meaningful differences in overall connectivity, community structure, or centrality patterns. Mantel tests did not detect a significant correlation between geographic distance and sign distribution in either phase, and the isolation-by-distance relationship does not differ between them, but bootstrap confidence intervals indicate these tests are underpowered at these sample sizes. We find no convincing evidence in the SignBase sample for discrete geographically structured groups of Aurignacian geometric signs analogous to those claimed for personal ornaments.</w:t>
+        <w:t xml:space="preserve">into Western Eurasia, yet the evolution of social organization during this transition remains debated. Here we investigate social dynamics through the analysis of geometric signs on mobile objects within a two-phase framework based on specialist technological attributions in site assignment. Using seriation and network analyses, we examine patterns of sign production in each phase, and investigate how the sign-sharing network differs between the Early and Late Aurignacian. Within the early phase (Aur-P1; 20 sites) we hypothesize a two-group structure of restricted versus broad geometric-sign repertoires. Stochastic block modelling recovers the restricted/broad split as its two largest blocks in Aur-P1, while selecting a single block in Aur-P2; but the richness gap between the groups is not distinguishable from a group difference once the saturating richness–effort relationship is modelled. Despite differences in network size between phases, permutation tests show no evidence for meaningful differences in overall connectivity, community structure, or centrality patterns. Mantel tests did not detect a significant correlation between geographic distance and sign distribution in either phase, and the isolation-by-distance relationship does not differ between them, but bootstrap confidence intervals indicate these tests are underpowered at these sample sizes. We find no statistically significant evidence in the SignBase sample for discrete geographically structured groups of Aurignacian geometric signs analogous to those claimed for personal ornaments.</w:t>
       </w:r>
     </w:p>
     <w:p>
@@ -1513,7 +1513,7 @@
               <w:pStyle w:val="ImageCaption"/>
             </w:pPr>
             <w:r>
-              <w:t xml:space="preserve">Table 2: Table of the results per phase for the Mantel test between a Jaccard dissimilarity matrix of sign type diversity and a geographic distance matrix. The 95% confidence interval comes from an object-within-site bootstrap (B = 1,000; same procedure as S1 S5.11).</w:t>
+              <w:t xml:space="preserve">Table 2: Table of the results per phase for the Mantel test between a Jaccard dissimilarity matrix of sign type diversity and a geographic distance matrix. The 95% confidence interval comes from an object-within-site bootstrap (B = 1,000).</w:t>
             </w:r>
           </w:p>
           <w:bookmarkEnd w:id="29"/>
@@ -1919,37 +1919,7 @@
         <w:pStyle w:val="BodyText"/>
       </w:pPr>
       <w:r>
-        <w:t xml:space="preserve">To quantitatively explore the robustness of the two-group hypothesis inferred from the seriation analysis, we used bootstrap resampling and stochastic block models, which we describe in detail in S1</w:t>
-      </w:r>
-      <w:r>
-        <w:t xml:space="preserve"> </w:t>
-      </w:r>
-      <w:r>
-        <w:t xml:space="preserve">“</w:t>
-      </w:r>
-      <w:r>
-        <w:t xml:space="preserve">Sensitivity Analyses</w:t>
-      </w:r>
-      <w:r>
-        <w:t xml:space="preserve">”</w:t>
-      </w:r>
-      <w:r>
-        <w:t xml:space="preserve">. Bootstrap resampling tests the stability of the two groups as an imposed partition. It shows that for Aur-P1, mean within-block co-clustering is 0.75 for the restricted-range block and 0.97 for the broader-range block, against 0.2 across the two blocks. The within-block values substantially exceed the across-block value, which is a signal that both groups are internally coherent and sharply separated. The strength of this signal is much lower for Aur-P2, where the pattern is 0.49 within the restricted block and 0.92 within the broader block, against 0.4 across the blocks. The stochastic block model analysis, which tests whether the proposed groups emerge as latent network communities without being supplied to the model in advance, partly supports the two-group hypothesis in Aur-P1: all three emission models (Bernoulli K = 3, Gaussian K = 4, Poisson K = 3) recover the restricted/broad split as their two largest blocks; Bernoulli and Gaussian additionally isolate Labeko Koba, Les Cottés, and Trou al’Wesse as a small third block, while under Poisson the same two broad sites pair off and Grotte du Renne joins the large mixed block (S1</w:t>
-      </w:r>
-      <w:r>
-        <w:t xml:space="preserve"> </w:t>
-      </w:r>
-      <w:r>
-        <w:t xml:space="preserve">“</w:t>
-      </w:r>
-      <w:r>
-        <w:t xml:space="preserve">Sensitivity Analyses</w:t>
-      </w:r>
-      <w:r>
-        <w:t xml:space="preserve">”</w:t>
-      </w:r>
-      <w:r>
-        <w:t xml:space="preserve">). In Aur-P2 the Bernoulli and Poisson models select a single block and only the Gaussian model selects two, by 0.90 ICL points. We therefore retain the restricted/broad division as a dominant axis of sign type composition variation (rich vs. poor sign repertoires) with a stable small-block refinement in Aur-P1, rather than an exact two-group partition, and treat the Aur-P2 grouping as provisional. Network analysis allows us to evaluate how these sites may have been connected along this axis.</w:t>
+        <w:t xml:space="preserve">To quantitatively evaluate the two-group hypothesis inferred from the seriation analysis, we used bootstrap resampling and stochastic block models, which we describe in detail in S1. Bootstrap resampling tests the stability of the two groups as an imposed partition. It shows that for Aur-P1, mean within-block co-clustering is 0.75 for the restricted-range block and 0.97 for the broader-range block, against 0.2 across the two blocks. The within-block values substantially exceed the across-block value, which is a signal that both groups are internally coherent and sharply separated. The strength of this signal is much lower for Aur-P2, where the pattern is 0.49 within the restricted block and 0.92 within the broader block, against 0.4 across the blocks. The stochastic block model analysis, which tests whether the proposed groups emerge as latent network communities without being supplied to the model in advance, shows that all three emission models select more than two blocks as optimal in Aur-P1: Bernoulli K = 3 (ICL = -110.1), Gaussian K = 4 (ICL = 73.5), Poisson K = 3 (ICL = -263.3). In each model the restricted/broad split is recovered as the two largest blocks; Bernoulli and Gaussian additionally isolate Labeko Koba, Les Cottés, and Trou al’Wesse as a small third block, while under Poisson the same two broad sites pair off and Grotte du Renne joins the large mixed block (S1 §S9.3). In Aur-P2 the Bernoulli and Poisson models select a single block and only the Gaussian model selects two blocks, by a marginal 0.9 ICL points. We therefore consider the restricted/broad division as a dominant axis of sign type composition variation (rich vs. poor sign repertoires) with a stable small-block refinement in Aur-P1, rather than an exact two-group partition.</w:t>
       </w:r>
     </w:p>
     <w:tbl>
@@ -2148,7 +2118,7 @@
         <w:t xml:space="preserve"> </w:t>
       </w:r>
       <w:r>
-        <w:t xml:space="preserve">shows the results of permutation tests (n = 10,000) assessing whether the observed statistics differ from a phase-randomized null distribution, and pairwise randomisation tests comparing the two phases. Under phase randomization, none of the network statistics, edge density, modularity (Louvain), mean betweenness, or component count, differs significantly from its null distribution in either phase. All observed values fall within the null 95% confidence intervals and all Benjamini–Hochberg-adjusted p-values are ≥ 0.05. The Aur-P1–Aur-P2 contrast is therefore primarily one of network scale rather than a statistically distinguishable community structure. Object-within-site bootstrap stability bands likewise overlap between phases (S1), so the phase contrast could be produced by within-site object sampling alone.</w:t>
+        <w:t xml:space="preserve">shows the results of permutation tests (n = 10,000) assessing whether the observed statistics differ from a phase-randomized null distribution, and pairwise randomisation tests comparing the two phases. Under phase randomization, none of the network statistics, edge density, modularity (Louvain), mean betweenness, or component count, differs significantly from its null distribution in either phase. All observed values fall within the null 95% confidence intervals and all Benjamini–Hochberg-adjusted p-values are ≥ 0.05. A separate null-benchmarked modularity test (S1) shows that Aur-P1’s observed modularity (0.336 at threshold 0.2) significantly exceeds the random expectation (p = 0.000), while Aur-P2’s observed modularity (0.161) does not (p = 0.078), consistent with Aur-P2’s small sample size. The Aur-P1–Aur-P2 contrast is therefore primarily one of network scale rather than a statistically distinguishable community structure. Object-within-site bootstrap stability bands likewise overlap between phases for both mean degree and modularity (S1), so the phase contrast could be produced by within-site object sampling alone.</w:t>
       </w:r>
     </w:p>
     <w:p>
@@ -2572,22 +2542,7 @@
         </w:r>
       </w:hyperlink>
       <w:r>
-        <w:t xml:space="preserve">). Betadisper did not detect a significant difference in within-group dispersion in either phase; this does not establish equal dispersions, so the PerMANOVA results should be interpreted cautiously. Complementary analyses provide mixed evidence (see our S1</w:t>
-      </w:r>
-      <w:r>
-        <w:t xml:space="preserve"> </w:t>
-      </w:r>
-      <w:r>
-        <w:t xml:space="preserve">“</w:t>
-      </w:r>
-      <w:r>
-        <w:t xml:space="preserve">Sensitivity Analyses</w:t>
-      </w:r>
-      <w:r>
-        <w:t xml:space="preserve">”</w:t>
-      </w:r>
-      <w:r>
-        <w:t xml:space="preserve">). Object-half holdout shows that a richness-based contrast can be recovered from disjoint objects, but the contrast is weaker when Jaccard’s nestedness component is removed using Simpson turnover. Leave-one-out classification indicates that the labels vary smoothly across the Jaccard composition space rather than independently confirming a discrete partition, and the fixed-fixed Curveball test does not show that the optimised split exceeds richness-preserving expectations. Taken together, these results support the hypothesis of the restricted/broad pattern as a descriptive richness gradient that is strongest for well-sampled sites, and do not support the hypothesis of a discrete two-group structure.</w:t>
+        <w:t xml:space="preserve">). However, this separation vanishes under Simpson turnover dissimilarity (which removes the nestedness/richness component), indicating the Jaccard signal comes from the nestedness component—rich versus poor repertoires—rather than by compositional turnover between the groups (S1). Beta disperion analysis did not detect a significant difference in within-group dispersion in either phase; this does not establish equal dispersions, so the PerMANOVA results should be interpreted cautiously. Leave-one-out classification indicates that the labels vary smoothly across the Jaccard composition space rather than independently confirming a discrete partition, and the fixed-fixed Curveball test does not show that the optimised split exceeds richness-preserving expectations. Taken together, these results support the hypothesis of the restricted/broad pattern as a descriptive richness gradient that is strongest for well-sampled sites, and do not support the hypothesis of a discrete two-group structure.</w:t>
       </w:r>
     </w:p>
     <w:bookmarkEnd w:id="52"/>
@@ -2709,7 +2664,7 @@
         <w:pStyle w:val="BodyText"/>
       </w:pPr>
       <w:r>
-        <w:t xml:space="preserve">Sampling effort is a major qualification on this social structure interpretation: object count and sign-type richness are strongly correlated, and the absence of a detectable association between node degree and richness does not establish that the restricted/broad assignments are independent of sampling effort. Object-level downsampling shows that assignments are retained mainly by the best-sampled sites, whereas small-site assignments often approach chance. Among the subset of sites that attain comparable coverage, broad-range sites remain richer, and a negative-binomial model with an estimated exponent finds that the richness–effort exponent is consistent with a residual group difference at equal object count. Note, this estimate is imprecise because the sample is small and group membership is strongly collinear with object count, and a negative-binomial model with an fixed exponent shows no effect (S1). At the phase level, the Jaccard separation is not greater than expected under a fixed-margin null preserving site richness and sign-type frequencies, and no separation remains on Simpson turnover, which removes the nestedness component of Jaccard (S1 S10.1). The restricted/broad pattern is therefore best treated as a descriptive richness gradient that is most credible for well-sampled assemblages; assignments for small assemblages remain provisional. The analyses do not provide strong support for discrete social structures in the sign data.</w:t>
+        <w:t xml:space="preserve">Sampling effort is a major qualification on this social structure interpretation: object count and sign-type richness are strongly correlated, and the absence of a detectable association between node degree and richness does not establish that the restricted/broad assignments are independent of sampling effort. Object-level downsampling shows that assignments are retained mainly by the best-sampled sites, whereas small-site assignments often approach chance, demonstrating that the division is, at least in part, a sampling-intensity effect rather than a fully stable cultural partition (S1). Among the subset of sites that attain comparable coverage, broad-range sites remain richer, and a negative-binomial model with an estimated exponent finds the group contrast persists at equal object count (rate ratio = 2.31, p = 0.003; S1). However, this estimate is imprecise because the sample is small and group membership is strongly collinear with object count, and a negative-binomial model with a fixed exponent (offset) shows no effect (rate ratio = 0.72, p = 0.292). At the phase level, the Jaccard separation is not greater than expected under a fixed-margin null preserving site richness and sign-type frequencies, and no separation remains on Simpson turnover, which removes the nestedness component of Jaccard (S1). The restricted/broad pattern is therefore best treated as a descriptive richness gradient that is most credible for well-sampled assemblages. Assignments for small assemblages remain provisional. The analyses do not provide strong support for discrete social structures in the sign data.</w:t>
       </w:r>
     </w:p>
     <w:p>
@@ -3573,7 +3528,7 @@
         <w:pStyle w:val="BodyText"/>
       </w:pPr>
       <w:r>
-        <w:t xml:space="preserve">A restricted/broad repertoire axis is visually evident in seriation and supported by bootstrap co-clustering (Aur-P1: within-block 0.75/0.97 vs. across-block 0.2; Aur-P2: 0.49/0.92 vs. 0.4). A negative-binomial regression with the exponent estimated at 0.38 95% CI 0.23–0.53, shows broad-range sites with higher richness at equal object count (rate ratio 2.31, p = 0.003; see S1). With the exponent fixed at 1, the difference is not statistically significant (rate ratio 0.72, p = 0.292), but 1 lies outside the estimated interval and the free-slope estimate remains imprecise because group tracks object count. Stochastic block models recover the two-group partition as their two largest blocks in Aur-P1 under all three emission models (Bernoulli K = 3, Gaussian K = 4, Poisson K = 3; S1 §S9.3), with Labeko Koba, Les Cottés, and Trou al’Wesse forming a stable third block under Bernoulli and Gaussian models (under Poisson the same two broad sites pair off while Grotte du Renne joins the large mixed block), while in Aur-P2 the Bernoulli and Poisson models select a single block. Cross-validation (leave-one-out, object-half holdout, gradient PerMANOVA) recovers the axis, yet the maximally-selected split test under a fixed-fixed (Curveball) null is not significant in either phase (Aur-P1 p = 0.106; Aur-P2 p = 0.984). The restricted/broad division should be read only as a descriptive gradient whose independence from sampling effort is not demonstrated for sites with small numbers of signs.</w:t>
+        <w:t xml:space="preserve">A restricted/broad repertoire axis is visually evident in seriation and supported by bootstrap co-clustering. A negative-binomial regression shows broad-range sites with higher richness at equal object count. With the exponent fixed at 1, the difference is not statistically significant, but 1 lies outside the estimated interval and the free-slope estimate remains imprecise because group tracks object count. Stochastic block models select three (Bernoulli and Poisson) or four blocks (Gaussian) as optimal in Aur-P1, recovering the restricted/broad split as their two largest blocks with a stable small-block refinement (Labeko Koba, Les Cottés, Trou al’Wesse under Bernoulli and Gaussian; S1), while in Aur-P2 the Bernoulli and Poisson models select a single block and only the Gaussian model selects two blocks by a marginal 0.9 ICL points. Cross-validation (leave-one-out, object-half holdout, gradient PerMANOVA) recovers the axis, yet the maximally-selected split test under a fixed-fixed (Curveball) null is not significant in either phase (Aur-P1 p = 0.106; Aur-P2 p = 0.984). The restricted/broad division should be read only as a descriptive gradient whose independence from sampling effort is not demonstrated for sites with small numbers of signs.</w:t>
       </w:r>
     </w:p>
     <w:p>
@@ -3607,7 +3562,7 @@
         <w:pStyle w:val="BodyText"/>
       </w:pPr>
       <w:r>
-        <w:t xml:space="preserve">Our study has four limitations. First is the ambiguity of some of the sign types. While</w:t>
+        <w:t xml:space="preserve">Our study has three limitations. First is the ambiguity of some of the sign types. While</w:t>
       </w:r>
       <w:r>
         <w:t xml:space="preserve"> </w:t>
@@ -3722,33 +3677,7 @@
         <w:t xml:space="preserve">[129]</w:t>
       </w:r>
       <w:r>
-        <w:t xml:space="preserve">. After exclusions, Aur-P2 rests on only 9 sites and 63 objects, so its two-group structure and network statistics have limited power. To manage this limitation we tested the sensitivity of our assignments to reverting to purely date-based criteria in S1</w:t>
-      </w:r>
-      <w:r>
-        <w:t xml:space="preserve"> </w:t>
-      </w:r>
-      <w:r>
-        <w:t xml:space="preserve">“</w:t>
-      </w:r>
-      <w:r>
-        <w:t xml:space="preserve">Sensitivity Analyses</w:t>
-      </w:r>
-      <w:r>
-        <w:t xml:space="preserve">”</w:t>
-      </w:r>
-      <w:r>
-        <w:t xml:space="preserve"> </w:t>
-      </w:r>
-      <w:r>
-        <w:t xml:space="preserve">and find that the main structures are generally robust. Date parsing itself removes assemblages whose reported dates lack uncertainties, including a large assemblage that would otherwise fall late, so the small Aur-P2 sample partly reflects dating-quality filtering rather than only archaeology (S1). Alternative calibrations move a few boundary sites between phases without changing the phase ordering (S1).</w:t>
-      </w:r>
-    </w:p>
-    <w:p>
-      <w:pPr>
-        <w:pStyle w:val="BodyText"/>
-      </w:pPr>
-      <w:r>
-        <w:t xml:space="preserve">Fourth, the restricted/broad gradient may not be independent from sampling intensity. Object-level resampling shows that only the best-sampled sites retain stable group assignments when compared at a common object count. A negative-binomial regression with an estimated richness–effort exponent finds the group contrast persists at equal object count (rate ratio 2.31, p = 0.003; S1 S9.4); the offset specification that found no effect fixed the exponent at 1, which the data reject. The richness gap can reflect either richer repertoires or more objects; the data cannot separate the two for sites with few objects. For sites represented by only a few objects the restricted/broad membership remains provisional. The division should accordingly be read as a descriptive axis of variation whose separation from sampling effort is not demonstrated for small-object sites.</w:t>
+        <w:t xml:space="preserve">. After exclusions, Aur-P2 rests on only 9 sites and 63 objects, so its two-group structure and network statistics have limited power. Date parsing itself removes assemblages whose reported dates lack uncertainties, including a large assemblage that would otherwise fall late, so the small Aur-P2 sample partly reflects dating-quality filtering rather than only archaeology (S1). Alternative calibrations move a few boundary sites between phases without changing the phase ordering (S1).</w:t>
       </w:r>
     </w:p>
     <w:bookmarkEnd w:id="61"/>

</xml_diff>

<commit_message>
invalidate cache if fucntions.R changes
</commit_message>
<xml_diff>
--- a/paper/paper.docx
+++ b/paper/paper.docx
@@ -185,7 +185,7 @@
         <w:t xml:space="preserve"> </w:t>
       </w:r>
       <w:r>
-        <w:t xml:space="preserve">6,</w:t>
+        <w:t xml:space="preserve">7,</w:t>
       </w:r>
       <w:r>
         <w:t xml:space="preserve"> </w:t>
@@ -1792,7 +1792,7 @@
       </w:r>
     </w:p>
     <w:bookmarkEnd w:id="33"/>
-    <w:bookmarkStart w:id="49" w:name="results"/>
+    <w:bookmarkStart w:id="53" w:name="results"/>
     <w:p>
       <w:pPr>
         <w:pStyle w:val="Heading1"/>
@@ -1801,7 +1801,7 @@
         <w:t xml:space="preserve">Results</w:t>
       </w:r>
     </w:p>
-    <w:bookmarkStart w:id="46" w:name="X139fdd43ada6f49bb2732b513cbf3cc22c88790"/>
+    <w:bookmarkStart w:id="50" w:name="X139fdd43ada6f49bb2732b513cbf3cc22c88790"/>
     <w:p>
       <w:pPr>
         <w:pStyle w:val="Heading2"/>
@@ -2002,67 +2002,6 @@
         </w:tc>
       </w:tr>
     </w:tbl>
-    <w:p>
-      <w:pPr>
-        <w:pStyle w:val="BodyText"/>
-      </w:pPr>
-      <w:r>
-        <w:t xml:space="preserve">Distinct groups of sites are not evident in</w:t>
-      </w:r>
-      <w:r>
-        <w:t xml:space="preserve"> </w:t>
-      </w:r>
-      <w:hyperlink w:anchor="fig-neighbor-net">
-        <w:r>
-          <w:rPr>
-            <w:rStyle w:val="Hyperlink"/>
-          </w:rPr>
-          <w:t xml:space="preserve">Figure 3</w:t>
-        </w:r>
-      </w:hyperlink>
-      <w:r>
-        <w:t xml:space="preserve">, supporting the hypothesis of a gradient of sign type composition variation.</w:t>
-      </w:r>
-      <w:r>
-        <w:t xml:space="preserve"> </w:t>
-      </w:r>
-      <w:r>
-        <w:rPr>
-          <w:bCs/>
-          <w:b/>
-        </w:rPr>
-        <w:t xml:space="preserve">?@fig-neighbor-net-stats</w:t>
-      </w:r>
-      <w:r>
-        <w:t xml:space="preserve"> </w:t>
-      </w:r>
-      <w:r>
-        <w:t xml:space="preserve">shows the results of permutation tests (n = 10,000) assessing whether the observed statistics differ from a phase-randomized null distribution, and pairwise randomisation tests comparing the two phases. Under phase randomization, none of the network statistics, edge density, modularity (Louvain), mean betweenness, or component count, differs significantly from its null distribution in either phase. All observed values fall within the null 95% confidence intervals and all Benjamini–Hochberg-adjusted p-values are ≥ 0.05. A separate null-benchmarked modularity test (S1) shows that Aur-P1’s observed modularity (0.336 at threshold 0.2) significantly exceeds the random expectation (p = 0.000), while Aur-P2’s observed modularity (0.161) does not (p = 0.078), consistent with Aur-P2’s small sample size. The Aur-P1–Aur-P2 contrast is therefore primarily one of network scale rather than a statistically distinguishable community structure. Object-within-site bootstrap stability bands likewise overlap between phases for both mean degree and modularity (S1), so the phase contrast could be produced by within-site object sampling alone.</w:t>
-      </w:r>
-    </w:p>
-    <w:p>
-      <w:pPr>
-        <w:pStyle w:val="BodyText"/>
-      </w:pPr>
-      <w:r>
-        <w:t xml:space="preserve">We assessed the sensitivity of our network analysis to site assignment criteria in three ways: (1) reverting to purely date-based assignment; (2) excluding Vogelherd entirely, as a site with an unusually large sign assemblage; (3) excluding figurines concentrated at Vogelherd (S1</w:t>
-      </w:r>
-      <w:r>
-        <w:t xml:space="preserve"> </w:t>
-      </w:r>
-      <w:r>
-        <w:t xml:space="preserve">“</w:t>
-      </w:r>
-      <w:r>
-        <w:t xml:space="preserve">Sensitivity Analyses</w:t>
-      </w:r>
-      <w:r>
-        <w:t xml:space="preserve">”</w:t>
-      </w:r>
-      <w:r>
-        <w:t xml:space="preserve">). Under all conditions, the Aur-P1 &gt; Aur-P2 connectivity ordering is preserved (Aur-P1 mean degree: 7.50 baseline, 7.26 no Vogelherd, 7.40 no figurines; Aur-P2: 4.22). Excluding Vogelherd reduces Aur-P1 edges by 8% and mean degree by 3.2%, but does not alter the phase contrast or the within-phase two-group pattern. Because the principal results are unchanged when Vogelherd is excluded entirely, our conclusions do not depend on its inclusion or on its precise archaeological attribution. That said, this connectivity ordering reflects Aur-P1’s larger site sample, not higher intrinsic connectivity (size-normalized MD ratios are ~1.0 for both phases, see S1).</w:t>
-      </w:r>
-    </w:p>
     <w:tbl>
       <w:tblPr>
         <w:tblStyle w:val="Table"/>
@@ -2077,7 +2016,149 @@
       <w:tr>
         <w:tc>
           <w:tcPr/>
-          <w:bookmarkStart w:id="45" w:name="fig-group-map"/>
+          <w:bookmarkStart w:id="45" w:name="fig-neighbor-net-stats"/>
+          <w:p>
+            <w:pPr>
+              <w:pStyle w:val="Compact"/>
+              <w:jc w:val="center"/>
+            </w:pPr>
+            <w:r>
+              <w:drawing>
+                <wp:inline>
+                  <wp:extent cx="5943600" cy="4086225"/>
+                  <wp:effectExtent b="0" l="0" r="0" t="0"/>
+                  <wp:docPr descr="" title="" id="43" name="Picture"/>
+                  <a:graphic>
+                    <a:graphicData uri="http://schemas.openxmlformats.org/drawingml/2006/picture">
+                      <pic:pic>
+                        <pic:nvPicPr>
+                          <pic:cNvPr descr="../figures/network-stats-plot.png" id="44" name="Picture"/>
+                          <pic:cNvPicPr>
+                            <a:picLocks noChangeArrowheads="1" noChangeAspect="1"/>
+                          </pic:cNvPicPr>
+                        </pic:nvPicPr>
+                        <pic:blipFill>
+                          <a:blip r:embed="rId42"/>
+                          <a:stretch>
+                            <a:fillRect/>
+                          </a:stretch>
+                        </pic:blipFill>
+                        <pic:spPr bwMode="auto">
+                          <a:xfrm>
+                            <a:off x="0" y="0"/>
+                            <a:ext cx="5943600" cy="4086225"/>
+                          </a:xfrm>
+                          <a:prstGeom prst="rect">
+                            <a:avLst/>
+                          </a:prstGeom>
+                          <a:noFill/>
+                          <a:ln w="9525">
+                            <a:noFill/>
+                            <a:headEnd/>
+                            <a:tailEnd/>
+                          </a:ln>
+                        </pic:spPr>
+                      </pic:pic>
+                    </a:graphicData>
+                  </a:graphic>
+                </wp:inline>
+              </w:drawing>
+            </w:r>
+          </w:p>
+          <w:p>
+            <w:pPr>
+              <w:jc w:val="center"/>
+            </w:pPr>
+            <w:pPr>
+              <w:jc w:val="start"/>
+              <w:spacing w:before="200"/>
+              <w:pStyle w:val="ImageCaption"/>
+            </w:pPr>
+            <w:r>
+              <w:t xml:space="preserve">Figure 4: Network statistics for the two phases. The vertical black lines are the null 95% confidence interval, the observed statistic value is shown as a solid black circle (BH-adjusted p &lt; 0.05) or a hollow circle (not significantly different from a phase-randomized null distribution). The horizontal brackets at the top of each panel show p-values of pairwise randomisation tests for significant differences in network statistics between phases.</w:t>
+            </w:r>
+          </w:p>
+          <w:bookmarkEnd w:id="45"/>
+        </w:tc>
+      </w:tr>
+    </w:tbl>
+    <w:p>
+      <w:pPr>
+        <w:pStyle w:val="BodyText"/>
+      </w:pPr>
+      <w:r>
+        <w:t xml:space="preserve">Distinct groups of sites are not evident in</w:t>
+      </w:r>
+      <w:r>
+        <w:t xml:space="preserve"> </w:t>
+      </w:r>
+      <w:hyperlink w:anchor="fig-neighbor-net">
+        <w:r>
+          <w:rPr>
+            <w:rStyle w:val="Hyperlink"/>
+          </w:rPr>
+          <w:t xml:space="preserve">Figure 3</w:t>
+        </w:r>
+      </w:hyperlink>
+      <w:r>
+        <w:t xml:space="preserve">, supporting the hypothesis of a gradient of sign type composition variation.</w:t>
+      </w:r>
+      <w:r>
+        <w:t xml:space="preserve"> </w:t>
+      </w:r>
+      <w:hyperlink w:anchor="fig-neighbor-net-stats">
+        <w:r>
+          <w:rPr>
+            <w:rStyle w:val="Hyperlink"/>
+          </w:rPr>
+          <w:t xml:space="preserve">Figure 4</w:t>
+        </w:r>
+      </w:hyperlink>
+      <w:r>
+        <w:t xml:space="preserve"> </w:t>
+      </w:r>
+      <w:r>
+        <w:t xml:space="preserve">shows the results of permutation tests (n = 10,000) assessing whether the observed statistics differ from a phase-randomized null distribution, and pairwise randomisation tests comparing the two phases. Under phase randomization, none of the network statistics, edge density, modularity (Louvain), mean betweenness, or component count, differs significantly from its null distribution in either phase. All observed values fall within the null 95% confidence intervals and all Benjamini–Hochberg-adjusted p-values are ≥ 0.05. A separate null-benchmarked modularity test (S1) shows that Aur-P1’s observed modularity (0.336 at threshold 0.2) significantly exceeds the random expectation (p = 0.000), while Aur-P2’s observed modularity (0.161) does not (p = 0.078), consistent with Aur-P2’s small sample size. The Aur-P1–Aur-P2 contrast is therefore primarily one of network scale rather than a statistically distinguishable community structure. Object-within-site bootstrap stability bands likewise overlap between phases for both mean degree and modularity (S1), so the phase contrast could be produced by within-site object sampling alone.</w:t>
+      </w:r>
+    </w:p>
+    <w:p>
+      <w:pPr>
+        <w:pStyle w:val="BodyText"/>
+      </w:pPr>
+      <w:r>
+        <w:t xml:space="preserve">We assessed the sensitivity of our network analysis to site assignment criteria in three ways: (1) reverting to purely date-based assignment; (2) excluding Vogelherd entirely, as a site with an unusually large sign assemblage; (3) excluding figurines concentrated at Vogelherd (S1</w:t>
+      </w:r>
+      <w:r>
+        <w:t xml:space="preserve"> </w:t>
+      </w:r>
+      <w:r>
+        <w:t xml:space="preserve">“</w:t>
+      </w:r>
+      <w:r>
+        <w:t xml:space="preserve">Sensitivity Analyses</w:t>
+      </w:r>
+      <w:r>
+        <w:t xml:space="preserve">”</w:t>
+      </w:r>
+      <w:r>
+        <w:t xml:space="preserve">). Under all conditions, the Aur-P1 &gt; Aur-P2 connectivity ordering is preserved (Aur-P1 mean degree: 7.50 baseline, 7.26 no Vogelherd, 7.40 no figurines; Aur-P2: 4.22). Excluding Vogelherd reduces Aur-P1 edges by 8% and mean degree by 3.2%, but does not alter the phase contrast or the within-phase two-group pattern. Because the principal results are unchanged when Vogelherd is excluded entirely, our conclusions do not depend on its inclusion or on its precise archaeological attribution. That said, this connectivity ordering reflects Aur-P1’s larger site sample, not higher intrinsic connectivity (size-normalized MD ratios are ~1.0 for both phases, see S1).</w:t>
+      </w:r>
+    </w:p>
+    <w:tbl>
+      <w:tblPr>
+        <w:tblStyle w:val="Table"/>
+        <w:tblW w:type="pct" w:w="5000"/>
+        <w:tblLook w:firstRow="0" w:lastRow="0" w:firstColumn="0" w:lastColumn="0" w:noHBand="0" w:noVBand="0" w:val="0000"/>
+        <w:jc w:val="start"/>
+        <w:tblLayout w:type="fixed"/>
+      </w:tblPr>
+      <w:tblGrid>
+        <w:gridCol w:w="7920"/>
+      </w:tblGrid>
+      <w:tr>
+        <w:tc>
+          <w:tcPr/>
+          <w:bookmarkStart w:id="49" w:name="fig-group-map"/>
           <w:p>
             <w:pPr>
               <w:pStyle w:val="Compact"/>
@@ -2088,18 +2169,18 @@
                 <wp:inline>
                   <wp:extent cx="5943600" cy="4754880"/>
                   <wp:effectExtent b="0" l="0" r="0" t="0"/>
-                  <wp:docPr descr="" title="" id="43" name="Picture"/>
+                  <wp:docPr descr="" title="" id="47" name="Picture"/>
                   <a:graphic>
                     <a:graphicData uri="http://schemas.openxmlformats.org/drawingml/2006/picture">
                       <pic:pic>
                         <pic:nvPicPr>
-                          <pic:cNvPr descr="paper_files/figure-docx/fig-group-map-1.png" id="44" name="Picture"/>
+                          <pic:cNvPr descr="paper_files/figure-docx/fig-group-map-1.png" id="48" name="Picture"/>
                           <pic:cNvPicPr>
                             <a:picLocks noChangeArrowheads="1" noChangeAspect="1"/>
                           </pic:cNvPicPr>
                         </pic:nvPicPr>
                         <pic:blipFill>
-                          <a:blip r:embed="rId42"/>
+                          <a:blip r:embed="rId46"/>
                           <a:stretch>
                             <a:fillRect/>
                           </a:stretch>
@@ -2136,7 +2217,7 @@
               <w:pStyle w:val="ImageCaption"/>
             </w:pPr>
             <w:r>
-              <w:t xml:space="preserve">Figure 4: Geographic distribution of sites with signs in the two Aurignacian phases (Aur-P1, Aur-P2). Sites are colored according to their hypothesized group membership (Restricted-range or Broader range) as inferred from the seriation. The spatial arrangement shows that sites belonging to the same sign-use group are not strictly clustered geographically, consistent with the Mantel test results that did not detect a significant correlation between geographic proximity and geometric sign similarity. Map data from naturalearthdata.com and</w:t>
+              <w:t xml:space="preserve">Figure 5: Geographic distribution of sites with signs in the two Aurignacian phases (Aur-P1, Aur-P2). Sites are colored according to their hypothesized group membership (Restricted-range or Broader range) as inferred from the seriation. The spatial arrangement shows that sites belonging to the same sign-use group are not strictly clustered geographically, consistent with the Mantel test results that did not detect a significant correlation between geographic proximity and geometric sign similarity. Map data from naturalearthdata.com and</w:t>
             </w:r>
             <w:r>
               <w:t xml:space="preserve"> </w:t>
@@ -2145,7 +2226,7 @@
               <w:t xml:space="preserve">[27]</w:t>
             </w:r>
           </w:p>
-          <w:bookmarkEnd w:id="45"/>
+          <w:bookmarkEnd w:id="49"/>
         </w:tc>
       </w:tr>
     </w:tbl>
@@ -2161,7 +2242,7 @@
           <w:rPr>
             <w:rStyle w:val="Hyperlink"/>
           </w:rPr>
-          <w:t xml:space="preserve">Figure 4</w:t>
+          <w:t xml:space="preserve">Figure 5</w:t>
         </w:r>
       </w:hyperlink>
       <w:r>
@@ -2183,8 +2264,8 @@
         <w:t xml:space="preserve">). These two groups are roughly West versus Central Europe, separating the Dordogne bloc tradition from the Swabian ivory tradition, and likely reflective research effort history rather than past cultural groups.</w:t>
       </w:r>
     </w:p>
-    <w:bookmarkEnd w:id="46"/>
-    <w:bookmarkStart w:id="48" w:name="Xe37851f0b0c22898e5f832a67b7154932fb4d35"/>
+    <w:bookmarkEnd w:id="50"/>
+    <w:bookmarkStart w:id="52" w:name="Xe37851f0b0c22898e5f832a67b7154932fb4d35"/>
     <w:p>
       <w:pPr>
         <w:pStyle w:val="Heading2"/>
@@ -2207,7 +2288,7 @@
       <w:tr>
         <w:tc>
           <w:tcPr/>
-          <w:bookmarkStart w:id="47" w:name="tbl-strength-table"/>
+          <w:bookmarkStart w:id="51" w:name="tbl-strength-table"/>
           <w:tbl>
             <w:tblPr>
               <w:tblStyle w:val="Table"/>
@@ -2441,7 +2522,7 @@
               <w:t xml:space="preserve">Table 3: Table of the results per phase for the perMANOVA. The R² 95% confidence interval comes from an object-within-site bootstrap (B = 1,000). The bootstrap interval measures R² stability under object resampling with fixed labels, they are not a null-hypothesis test</w:t>
             </w:r>
           </w:p>
-          <w:bookmarkEnd w:id="47"/>
+          <w:bookmarkEnd w:id="51"/>
         </w:tc>
       </w:tr>
     </w:tbl>
@@ -2464,9 +2545,9 @@
         <w:t xml:space="preserve">). However, this separation vanishes under Simpson turnover dissimilarity (which removes the nestedness/richness component), indicating the Jaccard signal comes from the nestedness component—rich versus poor repertoires—rather than by compositional turnover between the groups (S1). Beta dispersion analysis did not detect a significant difference in within-group dispersion in either phase; this does not establish equal dispersions, so the PerMANOVA results should be interpreted cautiously. Leave-one-out classification indicates that the labels vary smoothly across the Jaccard composition space rather than independently confirming a discrete partition, and the fixed-fixed Curveball test does not show that the optimised split exceeds richness-preserving expectations. Taken together, these results support the hypothesis of the restricted/broad pattern as a descriptive richness gradient that is strongest for well-sampled sites, and do not support the hypothesis of a discrete two-group structure.</w:t>
       </w:r>
     </w:p>
-    <w:bookmarkEnd w:id="48"/>
-    <w:bookmarkEnd w:id="49"/>
-    <w:bookmarkStart w:id="56" w:name="discussion"/>
+    <w:bookmarkEnd w:id="52"/>
+    <w:bookmarkEnd w:id="53"/>
+    <w:bookmarkStart w:id="60" w:name="discussion"/>
     <w:p>
       <w:pPr>
         <w:pStyle w:val="Heading1"/>
@@ -2475,7 +2556,7 @@
         <w:t xml:space="preserve">Discussion</w:t>
       </w:r>
     </w:p>
-    <w:bookmarkStart w:id="54" w:name="Xafef6faeacafea72fa60e49cb13139f797d1b47"/>
+    <w:bookmarkStart w:id="58" w:name="Xafef6faeacafea72fa60e49cb13139f797d1b47"/>
     <w:p>
       <w:pPr>
         <w:pStyle w:val="Heading2"/>
@@ -2737,7 +2818,7 @@
           <w:rPr>
             <w:rStyle w:val="Hyperlink"/>
           </w:rPr>
-          <w:t xml:space="preserve">Figure 5</w:t>
+          <w:t xml:space="preserve">Figure 6</w:t>
         </w:r>
       </w:hyperlink>
       <w:r>
@@ -2799,7 +2880,7 @@
           <w:rPr>
             <w:rStyle w:val="Hyperlink"/>
           </w:rPr>
-          <w:t xml:space="preserve">Figure 5</w:t>
+          <w:t xml:space="preserve">Figure 6</w:t>
         </w:r>
       </w:hyperlink>
       <w:r>
@@ -2820,7 +2901,7 @@
       <w:tr>
         <w:tc>
           <w:tcPr/>
-          <w:bookmarkStart w:id="53" w:name="fig-div-plot"/>
+          <w:bookmarkStart w:id="57" w:name="fig-div-plot"/>
           <w:p>
             <w:pPr>
               <w:pStyle w:val="Compact"/>
@@ -2831,18 +2912,18 @@
                 <wp:inline>
                   <wp:extent cx="3669832" cy="7339665"/>
                   <wp:effectExtent b="0" l="0" r="0" t="0"/>
-                  <wp:docPr descr="" title="" id="51" name="Picture"/>
+                  <wp:docPr descr="" title="" id="55" name="Picture"/>
                   <a:graphic>
                     <a:graphicData uri="http://schemas.openxmlformats.org/drawingml/2006/picture">
                       <pic:pic>
                         <pic:nvPicPr>
-                          <pic:cNvPr descr="../figures/diversity-plot.png" id="52" name="Picture"/>
+                          <pic:cNvPr descr="../figures/diversity-plot.png" id="56" name="Picture"/>
                           <pic:cNvPicPr>
                             <a:picLocks noChangeArrowheads="1" noChangeAspect="1"/>
                           </pic:cNvPicPr>
                         </pic:nvPicPr>
                         <pic:blipFill>
-                          <a:blip r:embed="rId50"/>
+                          <a:blip r:embed="rId54"/>
                           <a:stretch>
                             <a:fillRect/>
                           </a:stretch>
@@ -2879,15 +2960,15 @@
               <w:pStyle w:val="ImageCaption"/>
             </w:pPr>
             <w:r>
-              <w:t xml:space="preserve">Figure 5: Observed geometric sign diversity at each site compared with expectations derived from randomised assemblages controlling for sample size. The blue expectation curve is the mean simulated diversity index per sample size. The red lines enclose a band that is the 95% confidence interval of the null distribution (no sites exceed this interval). Sites above the blue expectation curve have higher than average diversity, given their sample size.</w:t>
+              <w:t xml:space="preserve">Figure 6: Observed geometric sign diversity at each site compared with expectations derived from randomised assemblages controlling for sample size. The blue expectation curve is the mean simulated diversity index per sample size. The red lines enclose a band that is the 95% confidence interval of the null distribution (no sites exceed this interval). Sites above the blue expectation curve have higher than average diversity, given their sample size.</w:t>
             </w:r>
           </w:p>
-          <w:bookmarkEnd w:id="53"/>
+          <w:bookmarkEnd w:id="57"/>
         </w:tc>
       </w:tr>
     </w:tbl>
-    <w:bookmarkEnd w:id="54"/>
-    <w:bookmarkStart w:id="55" w:name="Xebf6942352f41a988f05700517178ca340da310"/>
+    <w:bookmarkEnd w:id="58"/>
+    <w:bookmarkStart w:id="59" w:name="Xebf6942352f41a988f05700517178ca340da310"/>
     <w:p>
       <w:pPr>
         <w:pStyle w:val="Heading2"/>
@@ -3144,7 +3225,7 @@
           <w:rPr>
             <w:rStyle w:val="Hyperlink"/>
           </w:rPr>
-          <w:t xml:space="preserve">Figure 4</w:t>
+          <w:t xml:space="preserve">Figure 5</w:t>
         </w:r>
       </w:hyperlink>
       <w:r>
@@ -3402,9 +3483,9 @@
         <w:t xml:space="preserve">finds multiple theoretical weaknesses. Our results neither confirm nor rule out these hypotheses, and sign-type ambiguity remains a limitation on their potential future contributions.</w:t>
       </w:r>
     </w:p>
-    <w:bookmarkEnd w:id="55"/>
-    <w:bookmarkEnd w:id="56"/>
-    <w:bookmarkStart w:id="57" w:name="conclusion"/>
+    <w:bookmarkEnd w:id="59"/>
+    <w:bookmarkEnd w:id="60"/>
+    <w:bookmarkStart w:id="61" w:name="conclusion"/>
     <w:p>
       <w:pPr>
         <w:pStyle w:val="Heading1"/>
@@ -3599,8 +3680,8 @@
         <w:t xml:space="preserve">. After exclusions, Aur-P2 rests on only 9 sites and 63 objects, so its two-group structure and network statistics have limited power. Date parsing itself removes assemblages whose reported dates lack uncertainties, including a large assemblage that would otherwise fall late, so the small Aur-P2 sample partly reflects dating-quality filtering rather than only archaeology (S1). Alternative calibrations move a few boundary sites between phases without changing the phase ordering (S1).</w:t>
       </w:r>
     </w:p>
-    <w:bookmarkEnd w:id="57"/>
-    <w:bookmarkStart w:id="303" w:name="references"/>
+    <w:bookmarkEnd w:id="61"/>
+    <w:bookmarkStart w:id="307" w:name="references"/>
     <w:p>
       <w:pPr>
         <w:pStyle w:val="Heading1"/>
@@ -3609,8 +3690,8 @@
         <w:t xml:space="preserve">References</w:t>
       </w:r>
     </w:p>
-    <w:bookmarkStart w:id="302" w:name="refs"/>
-    <w:bookmarkStart w:id="59" w:name="ref-Boyd_Silk_2020"/>
+    <w:bookmarkStart w:id="306" w:name="refs"/>
+    <w:bookmarkStart w:id="63" w:name="ref-Boyd_Silk_2020"/>
     <w:p>
       <w:pPr>
         <w:pStyle w:val="Bibliography"/>
@@ -3630,7 +3711,7 @@
       <w:r>
         <w:t xml:space="preserve"> </w:t>
       </w:r>
-      <w:hyperlink r:id="rId58">
+      <w:hyperlink r:id="rId62">
         <w:r>
           <w:rPr>
             <w:rStyle w:val="Hyperlink"/>
@@ -3642,8 +3723,8 @@
         <w:t xml:space="preserve">. W.W. Norton; 2020.</w:t>
       </w:r>
     </w:p>
-    <w:bookmarkEnd w:id="59"/>
-    <w:bookmarkStart w:id="61" w:name="ref-dErrico_Baker_Rigaud_2025"/>
+    <w:bookmarkEnd w:id="63"/>
+    <w:bookmarkStart w:id="65" w:name="ref-dErrico_Baker_Rigaud_2025"/>
     <w:p>
       <w:pPr>
         <w:pStyle w:val="Bibliography"/>
@@ -3696,7 +3777,7 @@
       <w:r>
         <w:t xml:space="preserve"> </w:t>
       </w:r>
-      <w:hyperlink r:id="rId60">
+      <w:hyperlink r:id="rId64">
         <w:r>
           <w:rPr>
             <w:rStyle w:val="Hyperlink"/>
@@ -3708,8 +3789,8 @@
         <w:t xml:space="preserve">.</w:t>
       </w:r>
     </w:p>
-    <w:bookmarkEnd w:id="61"/>
-    <w:bookmarkStart w:id="63" w:name="ref-baker2024evidence"/>
+    <w:bookmarkEnd w:id="65"/>
+    <w:bookmarkStart w:id="67" w:name="ref-baker2024evidence"/>
     <w:p>
       <w:pPr>
         <w:pStyle w:val="Bibliography"/>
@@ -3738,7 +3819,7 @@
       <w:r>
         <w:t xml:space="preserve"> </w:t>
       </w:r>
-      <w:hyperlink r:id="rId62">
+      <w:hyperlink r:id="rId66">
         <w:r>
           <w:rPr>
             <w:rStyle w:val="Hyperlink"/>
@@ -3750,8 +3831,8 @@
         <w:t xml:space="preserve">.</w:t>
       </w:r>
     </w:p>
-    <w:bookmarkEnd w:id="63"/>
-    <w:bookmarkStart w:id="65" w:name="ref-Sauvet_2018"/>
+    <w:bookmarkEnd w:id="67"/>
+    <w:bookmarkStart w:id="69" w:name="ref-Sauvet_2018"/>
     <w:p>
       <w:pPr>
         <w:pStyle w:val="Bibliography"/>
@@ -3783,7 +3864,7 @@
       <w:r>
         <w:t xml:space="preserve"> </w:t>
       </w:r>
-      <w:hyperlink r:id="rId64">
+      <w:hyperlink r:id="rId68">
         <w:r>
           <w:rPr>
             <w:rStyle w:val="Hyperlink"/>
@@ -3795,8 +3876,8 @@
         <w:t xml:space="preserve">.</w:t>
       </w:r>
     </w:p>
-    <w:bookmarkEnd w:id="65"/>
-    <w:bookmarkStart w:id="67" w:name="ref-Kuhn_Stiner_2007"/>
+    <w:bookmarkEnd w:id="69"/>
+    <w:bookmarkStart w:id="71" w:name="ref-Kuhn_Stiner_2007"/>
     <w:p>
       <w:pPr>
         <w:pStyle w:val="Bibliography"/>
@@ -3828,7 +3909,7 @@
       <w:r>
         <w:t xml:space="preserve"> </w:t>
       </w:r>
-      <w:hyperlink r:id="rId66">
+      <w:hyperlink r:id="rId70">
         <w:r>
           <w:rPr>
             <w:rStyle w:val="Hyperlink"/>
@@ -3840,8 +3921,8 @@
         <w:t xml:space="preserve">.</w:t>
       </w:r>
     </w:p>
-    <w:bookmarkEnd w:id="67"/>
-    <w:bookmarkStart w:id="69" w:name="ref-Vanhaeren_d"/>
+    <w:bookmarkEnd w:id="71"/>
+    <w:bookmarkStart w:id="73" w:name="ref-Vanhaeren_d"/>
     <w:p>
       <w:pPr>
         <w:pStyle w:val="Bibliography"/>
@@ -3885,7 +3966,7 @@
       <w:r>
         <w:t xml:space="preserve"> </w:t>
       </w:r>
-      <w:hyperlink r:id="rId68">
+      <w:hyperlink r:id="rId72">
         <w:r>
           <w:rPr>
             <w:rStyle w:val="Hyperlink"/>
@@ -3897,8 +3978,8 @@
         <w:t xml:space="preserve">.</w:t>
       </w:r>
     </w:p>
-    <w:bookmarkEnd w:id="69"/>
-    <w:bookmarkStart w:id="71" w:name="ref-Fuentes_Lucas_Robert_2019"/>
+    <w:bookmarkEnd w:id="73"/>
+    <w:bookmarkStart w:id="75" w:name="ref-Fuentes_Lucas_Robert_2019"/>
     <w:p>
       <w:pPr>
         <w:pStyle w:val="Bibliography"/>
@@ -3942,7 +4023,7 @@
       <w:r>
         <w:t xml:space="preserve"> </w:t>
       </w:r>
-      <w:hyperlink r:id="rId70">
+      <w:hyperlink r:id="rId74">
         <w:r>
           <w:rPr>
             <w:rStyle w:val="Hyperlink"/>
@@ -3954,8 +4035,8 @@
         <w:t xml:space="preserve">.</w:t>
       </w:r>
     </w:p>
-    <w:bookmarkEnd w:id="71"/>
-    <w:bookmarkStart w:id="73" w:name="ref-Tejero_Grimaldi_2015"/>
+    <w:bookmarkEnd w:id="75"/>
+    <w:bookmarkStart w:id="77" w:name="ref-Tejero_Grimaldi_2015"/>
     <w:p>
       <w:pPr>
         <w:pStyle w:val="Bibliography"/>
@@ -4011,7 +4092,7 @@
       <w:r>
         <w:t xml:space="preserve"> </w:t>
       </w:r>
-      <w:hyperlink r:id="rId72">
+      <w:hyperlink r:id="rId76">
         <w:r>
           <w:rPr>
             <w:rStyle w:val="Hyperlink"/>
@@ -4023,8 +4104,8 @@
         <w:t xml:space="preserve">.</w:t>
       </w:r>
     </w:p>
-    <w:bookmarkEnd w:id="73"/>
-    <w:bookmarkStart w:id="75" w:name="ref-Tartar_2012"/>
+    <w:bookmarkEnd w:id="77"/>
+    <w:bookmarkStart w:id="79" w:name="ref-Tartar_2012"/>
     <w:p>
       <w:pPr>
         <w:pStyle w:val="Bibliography"/>
@@ -4065,7 +4146,7 @@
       <w:r>
         <w:t xml:space="preserve"> </w:t>
       </w:r>
-      <w:hyperlink r:id="rId74">
+      <w:hyperlink r:id="rId78">
         <w:r>
           <w:rPr>
             <w:rStyle w:val="Hyperlink"/>
@@ -4077,8 +4158,8 @@
         <w:t xml:space="preserve">.</w:t>
       </w:r>
     </w:p>
-    <w:bookmarkEnd w:id="75"/>
-    <w:bookmarkStart w:id="77" w:name="ref-dutkiewicz2020"/>
+    <w:bookmarkEnd w:id="79"/>
+    <w:bookmarkStart w:id="81" w:name="ref-dutkiewicz2020"/>
     <w:p>
       <w:pPr>
         <w:pStyle w:val="Bibliography"/>
@@ -4116,7 +4197,7 @@
       <w:r>
         <w:t xml:space="preserve"> </w:t>
       </w:r>
-      <w:hyperlink r:id="rId76">
+      <w:hyperlink r:id="rId80">
         <w:r>
           <w:rPr>
             <w:rStyle w:val="Hyperlink"/>
@@ -4128,8 +4209,8 @@
         <w:t xml:space="preserve">.</w:t>
       </w:r>
     </w:p>
-    <w:bookmarkEnd w:id="77"/>
-    <w:bookmarkStart w:id="79" w:name="ref-Talamo_2022"/>
+    <w:bookmarkEnd w:id="81"/>
+    <w:bookmarkStart w:id="83" w:name="ref-Talamo_2022"/>
     <w:p>
       <w:pPr>
         <w:pStyle w:val="Bibliography"/>
@@ -4173,7 +4254,7 @@
       <w:r>
         <w:t xml:space="preserve"> </w:t>
       </w:r>
-      <w:hyperlink r:id="rId78">
+      <w:hyperlink r:id="rId82">
         <w:r>
           <w:rPr>
             <w:rStyle w:val="Hyperlink"/>
@@ -4185,8 +4266,8 @@
         <w:t xml:space="preserve">.</w:t>
       </w:r>
     </w:p>
-    <w:bookmarkEnd w:id="79"/>
-    <w:bookmarkStart w:id="81" w:name="X68cdd7ba62fc5dd3e1e9b497937717305f7b9a0"/>
+    <w:bookmarkEnd w:id="83"/>
+    <w:bookmarkStart w:id="85" w:name="X68cdd7ba62fc5dd3e1e9b497937717305f7b9a0"/>
     <w:p>
       <w:pPr>
         <w:pStyle w:val="Bibliography"/>
@@ -4218,7 +4299,7 @@
       <w:r>
         <w:t xml:space="preserve"> </w:t>
       </w:r>
-      <w:hyperlink r:id="rId80">
+      <w:hyperlink r:id="rId84">
         <w:r>
           <w:rPr>
             <w:rStyle w:val="Hyperlink"/>
@@ -4230,8 +4311,8 @@
         <w:t xml:space="preserve">.</w:t>
       </w:r>
     </w:p>
-    <w:bookmarkEnd w:id="81"/>
-    <w:bookmarkStart w:id="83" w:name="ref-doyon2022"/>
+    <w:bookmarkEnd w:id="85"/>
+    <w:bookmarkStart w:id="87" w:name="ref-doyon2022"/>
     <w:p>
       <w:pPr>
         <w:pStyle w:val="Bibliography"/>
@@ -4251,7 +4332,7 @@
       <w:r>
         <w:t xml:space="preserve"> </w:t>
       </w:r>
-      <w:hyperlink r:id="rId82">
+      <w:hyperlink r:id="rId86">
         <w:r>
           <w:rPr>
             <w:rStyle w:val="Hyperlink"/>
@@ -4299,8 +4380,8 @@
         <w:t xml:space="preserve">historique de Monaco 2022.</w:t>
       </w:r>
     </w:p>
-    <w:bookmarkEnd w:id="83"/>
-    <w:bookmarkStart w:id="85" w:name="ref-Chu_Richter_2020"/>
+    <w:bookmarkEnd w:id="87"/>
+    <w:bookmarkStart w:id="89" w:name="ref-Chu_Richter_2020"/>
     <w:p>
       <w:pPr>
         <w:pStyle w:val="Bibliography"/>
@@ -4332,7 +4413,7 @@
       <w:r>
         <w:t xml:space="preserve"> </w:t>
       </w:r>
-      <w:hyperlink r:id="rId84">
+      <w:hyperlink r:id="rId88">
         <w:r>
           <w:rPr>
             <w:rStyle w:val="Hyperlink"/>
@@ -4344,8 +4425,8 @@
         <w:t xml:space="preserve">.</w:t>
       </w:r>
     </w:p>
-    <w:bookmarkEnd w:id="85"/>
-    <w:bookmarkStart w:id="87" w:name="ref-Dinnis_et_al_2019"/>
+    <w:bookmarkEnd w:id="89"/>
+    <w:bookmarkStart w:id="91" w:name="ref-Dinnis_et_al_2019"/>
     <w:p>
       <w:pPr>
         <w:pStyle w:val="Bibliography"/>
@@ -4389,7 +4470,7 @@
       <w:r>
         <w:t xml:space="preserve"> </w:t>
       </w:r>
-      <w:hyperlink r:id="rId86">
+      <w:hyperlink r:id="rId90">
         <w:r>
           <w:rPr>
             <w:rStyle w:val="Hyperlink"/>
@@ -4401,8 +4482,8 @@
         <w:t xml:space="preserve">.</w:t>
       </w:r>
     </w:p>
-    <w:bookmarkEnd w:id="87"/>
-    <w:bookmarkStart w:id="89" w:name="ref-falcucci2020breaking"/>
+    <w:bookmarkEnd w:id="91"/>
+    <w:bookmarkStart w:id="93" w:name="ref-falcucci2020breaking"/>
     <w:p>
       <w:pPr>
         <w:pStyle w:val="Bibliography"/>
@@ -4455,7 +4536,7 @@
       <w:r>
         <w:t xml:space="preserve"> </w:t>
       </w:r>
-      <w:hyperlink r:id="rId88">
+      <w:hyperlink r:id="rId92">
         <w:r>
           <w:rPr>
             <w:rStyle w:val="Hyperlink"/>
@@ -4467,8 +4548,8 @@
         <w:t xml:space="preserve">.</w:t>
       </w:r>
     </w:p>
-    <w:bookmarkEnd w:id="89"/>
-    <w:bookmarkStart w:id="90" w:name="ref-clark200917"/>
+    <w:bookmarkEnd w:id="93"/>
+    <w:bookmarkStart w:id="94" w:name="ref-clark200917"/>
     <w:p>
       <w:pPr>
         <w:pStyle w:val="Bibliography"/>
@@ -4516,8 +4597,8 @@
         <w:t xml:space="preserve">: Turning points and new directions, Oxford: Oxbow Books; 2009, p. 323–38.</w:t>
       </w:r>
     </w:p>
-    <w:bookmarkEnd w:id="90"/>
-    <w:bookmarkStart w:id="92" w:name="ref-zilhao2024data"/>
+    <w:bookmarkEnd w:id="94"/>
+    <w:bookmarkStart w:id="96" w:name="ref-zilhao2024data"/>
     <w:p>
       <w:pPr>
         <w:pStyle w:val="Bibliography"/>
@@ -4561,7 +4642,7 @@
       <w:r>
         <w:t xml:space="preserve"> </w:t>
       </w:r>
-      <w:hyperlink r:id="rId91">
+      <w:hyperlink r:id="rId95">
         <w:r>
           <w:rPr>
             <w:rStyle w:val="Hyperlink"/>
@@ -4573,8 +4654,8 @@
         <w:t xml:space="preserve">.</w:t>
       </w:r>
     </w:p>
-    <w:bookmarkEnd w:id="92"/>
-    <w:bookmarkStart w:id="93" w:name="ref-bordes2006news"/>
+    <w:bookmarkEnd w:id="96"/>
+    <w:bookmarkStart w:id="97" w:name="ref-bordes2006news"/>
     <w:p>
       <w:pPr>
         <w:pStyle w:val="Bibliography"/>
@@ -4643,8 +4724,8 @@
         <w:t xml:space="preserve">s de Arqueologia Lisbon; 2006, p. 147–71.</w:t>
       </w:r>
     </w:p>
-    <w:bookmarkEnd w:id="93"/>
-    <w:bookmarkStart w:id="95" w:name="ref-canessa2026unpacking"/>
+    <w:bookmarkEnd w:id="97"/>
+    <w:bookmarkStart w:id="99" w:name="ref-canessa2026unpacking"/>
     <w:p>
       <w:pPr>
         <w:pStyle w:val="Bibliography"/>
@@ -4688,7 +4769,7 @@
       <w:r>
         <w:t xml:space="preserve"> </w:t>
       </w:r>
-      <w:hyperlink r:id="rId94">
+      <w:hyperlink r:id="rId98">
         <w:r>
           <w:rPr>
             <w:rStyle w:val="Hyperlink"/>
@@ -4700,8 +4781,8 @@
         <w:t xml:space="preserve">.</w:t>
       </w:r>
     </w:p>
-    <w:bookmarkEnd w:id="95"/>
-    <w:bookmarkStart w:id="97" w:name="ref-Schmidt_Zimmermann_2019"/>
+    <w:bookmarkEnd w:id="99"/>
+    <w:bookmarkStart w:id="101" w:name="ref-Schmidt_Zimmermann_2019"/>
     <w:p>
       <w:pPr>
         <w:pStyle w:val="Bibliography"/>
@@ -4739,7 +4820,7 @@
       <w:r>
         <w:t xml:space="preserve"> </w:t>
       </w:r>
-      <w:hyperlink r:id="rId96">
+      <w:hyperlink r:id="rId100">
         <w:r>
           <w:rPr>
             <w:rStyle w:val="Hyperlink"/>
@@ -4751,8 +4832,8 @@
         <w:t xml:space="preserve">.</w:t>
       </w:r>
     </w:p>
-    <w:bookmarkEnd w:id="97"/>
-    <w:bookmarkStart w:id="99" w:name="ref-Banks_dErrico_Zilhao_2013"/>
+    <w:bookmarkEnd w:id="101"/>
+    <w:bookmarkStart w:id="103" w:name="ref-Banks_dErrico_Zilhao_2013"/>
     <w:p>
       <w:pPr>
         <w:pStyle w:val="Bibliography"/>
@@ -4802,7 +4883,7 @@
       <w:r>
         <w:t xml:space="preserve"> </w:t>
       </w:r>
-      <w:hyperlink r:id="rId98">
+      <w:hyperlink r:id="rId102">
         <w:r>
           <w:rPr>
             <w:rStyle w:val="Hyperlink"/>
@@ -4814,8 +4895,8 @@
         <w:t xml:space="preserve">.</w:t>
       </w:r>
     </w:p>
-    <w:bookmarkEnd w:id="99"/>
-    <w:bookmarkStart w:id="101" w:name="ref-Falcucci_Peresani_2017"/>
+    <w:bookmarkEnd w:id="103"/>
+    <w:bookmarkStart w:id="105" w:name="ref-Falcucci_Peresani_2017"/>
     <w:p>
       <w:pPr>
         <w:pStyle w:val="Bibliography"/>
@@ -4868,7 +4949,7 @@
       <w:r>
         <w:t xml:space="preserve"> </w:t>
       </w:r>
-      <w:hyperlink r:id="rId100">
+      <w:hyperlink r:id="rId104">
         <w:r>
           <w:rPr>
             <w:rStyle w:val="Hyperlink"/>
@@ -4880,8 +4961,8 @@
         <w:t xml:space="preserve">.</w:t>
       </w:r>
     </w:p>
-    <w:bookmarkEnd w:id="101"/>
-    <w:bookmarkStart w:id="103" w:name="ref-Bataille_Conard_2019"/>
+    <w:bookmarkEnd w:id="105"/>
+    <w:bookmarkStart w:id="107" w:name="ref-Bataille_Conard_2019"/>
     <w:p>
       <w:pPr>
         <w:pStyle w:val="Bibliography"/>
@@ -4955,7 +5036,7 @@
       <w:r>
         <w:t xml:space="preserve"> </w:t>
       </w:r>
-      <w:hyperlink r:id="rId102">
+      <w:hyperlink r:id="rId106">
         <w:r>
           <w:rPr>
             <w:rStyle w:val="Hyperlink"/>
@@ -4967,8 +5048,8 @@
         <w:t xml:space="preserve">.</w:t>
       </w:r>
     </w:p>
-    <w:bookmarkEnd w:id="103"/>
-    <w:bookmarkStart w:id="105" w:name="ref-Fletcher_Sánchez"/>
+    <w:bookmarkEnd w:id="107"/>
+    <w:bookmarkStart w:id="109" w:name="ref-Fletcher_Sánchez"/>
     <w:p>
       <w:pPr>
         <w:pStyle w:val="Bibliography"/>
@@ -4997,7 +5078,7 @@
       <w:r>
         <w:t xml:space="preserve"> </w:t>
       </w:r>
-      <w:hyperlink r:id="rId104">
+      <w:hyperlink r:id="rId108">
         <w:r>
           <w:rPr>
             <w:rStyle w:val="Hyperlink"/>
@@ -5009,8 +5090,8 @@
         <w:t xml:space="preserve">.</w:t>
       </w:r>
     </w:p>
-    <w:bookmarkEnd w:id="105"/>
-    <w:bookmarkStart w:id="107" w:name="ref-Pebesma_2018"/>
+    <w:bookmarkEnd w:id="109"/>
+    <w:bookmarkStart w:id="111" w:name="ref-Pebesma_2018"/>
     <w:p>
       <w:pPr>
         <w:pStyle w:val="Bibliography"/>
@@ -5039,7 +5120,7 @@
       <w:r>
         <w:t xml:space="preserve"> </w:t>
       </w:r>
-      <w:hyperlink r:id="rId106">
+      <w:hyperlink r:id="rId110">
         <w:r>
           <w:rPr>
             <w:rStyle w:val="Hyperlink"/>
@@ -5051,8 +5132,8 @@
         <w:t xml:space="preserve">.</w:t>
       </w:r>
     </w:p>
-    <w:bookmarkEnd w:id="107"/>
-    <w:bookmarkStart w:id="109" w:name="ref-rnaturalearth"/>
+    <w:bookmarkEnd w:id="111"/>
+    <w:bookmarkStart w:id="113" w:name="ref-rnaturalearth"/>
     <w:p>
       <w:pPr>
         <w:pStyle w:val="Bibliography"/>
@@ -5072,7 +5153,7 @@
       <w:r>
         <w:t xml:space="preserve"> </w:t>
       </w:r>
-      <w:hyperlink r:id="rId108">
+      <w:hyperlink r:id="rId112">
         <w:r>
           <w:rPr>
             <w:rStyle w:val="Hyperlink"/>
@@ -5096,8 +5177,8 @@
         <w:t xml:space="preserve">. 2026.</w:t>
       </w:r>
     </w:p>
-    <w:bookmarkEnd w:id="109"/>
-    <w:bookmarkStart w:id="111" w:name="ref-Crema_Bevan_2021"/>
+    <w:bookmarkEnd w:id="113"/>
+    <w:bookmarkStart w:id="115" w:name="ref-Crema_Bevan_2021"/>
     <w:p>
       <w:pPr>
         <w:pStyle w:val="Bibliography"/>
@@ -5117,7 +5198,7 @@
       <w:r>
         <w:t xml:space="preserve"> </w:t>
       </w:r>
-      <w:hyperlink r:id="rId110">
+      <w:hyperlink r:id="rId114">
         <w:r>
           <w:rPr>
             <w:rStyle w:val="Hyperlink"/>
@@ -5129,8 +5210,8 @@
         <w:t xml:space="preserve">.</w:t>
       </w:r>
     </w:p>
-    <w:bookmarkEnd w:id="111"/>
-    <w:bookmarkStart w:id="113" w:name="ref-Lycett_2019"/>
+    <w:bookmarkEnd w:id="115"/>
+    <w:bookmarkStart w:id="117" w:name="ref-Lycett_2019"/>
     <w:p>
       <w:pPr>
         <w:pStyle w:val="Bibliography"/>
@@ -5159,7 +5240,7 @@
       <w:r>
         <w:t xml:space="preserve"> </w:t>
       </w:r>
-      <w:hyperlink r:id="rId112">
+      <w:hyperlink r:id="rId116">
         <w:r>
           <w:rPr>
             <w:rStyle w:val="Hyperlink"/>
@@ -5171,8 +5252,8 @@
         <w:t xml:space="preserve">.</w:t>
       </w:r>
     </w:p>
-    <w:bookmarkEnd w:id="113"/>
-    <w:bookmarkStart w:id="115" w:name="ref-Mantel_Smouse"/>
+    <w:bookmarkEnd w:id="117"/>
+    <w:bookmarkStart w:id="119" w:name="ref-Mantel_Smouse"/>
     <w:p>
       <w:pPr>
         <w:pStyle w:val="Bibliography"/>
@@ -5192,7 +5273,7 @@
       <w:r>
         <w:t xml:space="preserve"> </w:t>
       </w:r>
-      <w:hyperlink r:id="rId114">
+      <w:hyperlink r:id="rId118">
         <w:r>
           <w:rPr>
             <w:rStyle w:val="Hyperlink"/>
@@ -5204,8 +5285,8 @@
         <w:t xml:space="preserve">.</w:t>
       </w:r>
     </w:p>
-    <w:bookmarkEnd w:id="115"/>
-    <w:bookmarkStart w:id="117" w:name="ref-Vegan2001"/>
+    <w:bookmarkEnd w:id="119"/>
+    <w:bookmarkStart w:id="121" w:name="ref-Vegan2001"/>
     <w:p>
       <w:pPr>
         <w:pStyle w:val="Bibliography"/>
@@ -5225,7 +5306,7 @@
       <w:r>
         <w:t xml:space="preserve"> </w:t>
       </w:r>
-      <w:hyperlink r:id="rId116">
+      <w:hyperlink r:id="rId120">
         <w:r>
           <w:rPr>
             <w:rStyle w:val="Hyperlink"/>
@@ -5237,8 +5318,8 @@
         <w:t xml:space="preserve">.</w:t>
       </w:r>
     </w:p>
-    <w:bookmarkEnd w:id="117"/>
-    <w:bookmarkStart w:id="119" w:name="ref-Rigaud_dErrico_Vanhaeren_2015"/>
+    <w:bookmarkEnd w:id="121"/>
+    <w:bookmarkStart w:id="123" w:name="ref-Rigaud_dErrico_Vanhaeren_2015"/>
     <w:p>
       <w:pPr>
         <w:pStyle w:val="Bibliography"/>
@@ -5270,7 +5351,7 @@
       <w:r>
         <w:t xml:space="preserve"> </w:t>
       </w:r>
-      <w:hyperlink r:id="rId118">
+      <w:hyperlink r:id="rId122">
         <w:r>
           <w:rPr>
             <w:rStyle w:val="Hyperlink"/>
@@ -5282,8 +5363,8 @@
         <w:t xml:space="preserve">.</w:t>
       </w:r>
     </w:p>
-    <w:bookmarkEnd w:id="119"/>
-    <w:bookmarkStart w:id="121" w:name="ref-Legendre_Anderson_1999"/>
+    <w:bookmarkEnd w:id="123"/>
+    <w:bookmarkStart w:id="125" w:name="ref-Legendre_Anderson_1999"/>
     <w:p>
       <w:pPr>
         <w:pStyle w:val="Bibliography"/>
@@ -5303,7 +5384,7 @@
       <w:r>
         <w:t xml:space="preserve"> </w:t>
       </w:r>
-      <w:hyperlink r:id="rId120">
+      <w:hyperlink r:id="rId124">
         <w:r>
           <w:rPr>
             <w:rStyle w:val="Hyperlink"/>
@@ -5315,8 +5396,8 @@
         <w:t xml:space="preserve">.</w:t>
       </w:r>
     </w:p>
-    <w:bookmarkEnd w:id="121"/>
-    <w:bookmarkStart w:id="123" w:name="ref-seriation_pckge"/>
+    <w:bookmarkEnd w:id="125"/>
+    <w:bookmarkStart w:id="127" w:name="ref-seriation_pckge"/>
     <w:p>
       <w:pPr>
         <w:pStyle w:val="Bibliography"/>
@@ -5348,7 +5429,7 @@
       <w:r>
         <w:t xml:space="preserve"> </w:t>
       </w:r>
-      <w:hyperlink r:id="rId122">
+      <w:hyperlink r:id="rId126">
         <w:r>
           <w:rPr>
             <w:rStyle w:val="Hyperlink"/>
@@ -5360,8 +5441,8 @@
         <w:t xml:space="preserve">.</w:t>
       </w:r>
     </w:p>
-    <w:bookmarkEnd w:id="123"/>
-    <w:bookmarkStart w:id="125" w:name="ref-Brower_Kile_1988"/>
+    <w:bookmarkEnd w:id="127"/>
+    <w:bookmarkStart w:id="129" w:name="ref-Brower_Kile_1988"/>
     <w:p>
       <w:pPr>
         <w:pStyle w:val="Bibliography"/>
@@ -5381,7 +5462,7 @@
       <w:r>
         <w:t xml:space="preserve"> </w:t>
       </w:r>
-      <w:hyperlink r:id="rId124">
+      <w:hyperlink r:id="rId128">
         <w:r>
           <w:rPr>
             <w:rStyle w:val="Hyperlink"/>
@@ -5393,8 +5474,8 @@
         <w:t xml:space="preserve">.</w:t>
       </w:r>
     </w:p>
-    <w:bookmarkEnd w:id="125"/>
-    <w:bookmarkStart w:id="127" w:name="ref-Mills_2017"/>
+    <w:bookmarkEnd w:id="129"/>
+    <w:bookmarkStart w:id="131" w:name="ref-Mills_2017"/>
     <w:p>
       <w:pPr>
         <w:pStyle w:val="Bibliography"/>
@@ -5414,7 +5495,7 @@
       <w:r>
         <w:t xml:space="preserve"> </w:t>
       </w:r>
-      <w:hyperlink r:id="rId126">
+      <w:hyperlink r:id="rId130">
         <w:r>
           <w:rPr>
             <w:rStyle w:val="Hyperlink"/>
@@ -5426,8 +5507,8 @@
         <w:t xml:space="preserve">.</w:t>
       </w:r>
     </w:p>
-    <w:bookmarkEnd w:id="127"/>
-    <w:bookmarkStart w:id="129" w:name="ref-Fruchterman_Reingold_1991"/>
+    <w:bookmarkEnd w:id="131"/>
+    <w:bookmarkStart w:id="133" w:name="ref-Fruchterman_Reingold_1991"/>
     <w:p>
       <w:pPr>
         <w:pStyle w:val="Bibliography"/>
@@ -5447,7 +5528,7 @@
       <w:r>
         <w:t xml:space="preserve"> </w:t>
       </w:r>
-      <w:hyperlink r:id="rId128">
+      <w:hyperlink r:id="rId132">
         <w:r>
           <w:rPr>
             <w:rStyle w:val="Hyperlink"/>
@@ -5459,8 +5540,8 @@
         <w:t xml:space="preserve">.</w:t>
       </w:r>
     </w:p>
-    <w:bookmarkEnd w:id="129"/>
-    <w:bookmarkStart w:id="131" w:name="ref-statnet_package"/>
+    <w:bookmarkEnd w:id="133"/>
+    <w:bookmarkStart w:id="135" w:name="ref-statnet_package"/>
     <w:p>
       <w:pPr>
         <w:pStyle w:val="Bibliography"/>
@@ -5480,7 +5561,7 @@
       <w:r>
         <w:t xml:space="preserve"> </w:t>
       </w:r>
-      <w:hyperlink r:id="rId130">
+      <w:hyperlink r:id="rId134">
         <w:r>
           <w:rPr>
             <w:rStyle w:val="Hyperlink"/>
@@ -5495,8 +5576,8 @@
         <w:t xml:space="preserve">2019.</w:t>
       </w:r>
     </w:p>
-    <w:bookmarkEnd w:id="131"/>
-    <w:bookmarkStart w:id="133" w:name="ref-igraph_package"/>
+    <w:bookmarkEnd w:id="135"/>
+    <w:bookmarkStart w:id="137" w:name="ref-igraph_package"/>
     <w:p>
       <w:pPr>
         <w:pStyle w:val="Bibliography"/>
@@ -5516,7 +5597,7 @@
       <w:r>
         <w:t xml:space="preserve"> </w:t>
       </w:r>
-      <w:hyperlink r:id="rId132">
+      <w:hyperlink r:id="rId136">
         <w:r>
           <w:rPr>
             <w:rStyle w:val="Hyperlink"/>
@@ -5528,8 +5609,8 @@
         <w:t xml:space="preserve">. InterJournal 2006;Complex Systems:1695.</w:t>
       </w:r>
     </w:p>
-    <w:bookmarkEnd w:id="133"/>
-    <w:bookmarkStart w:id="135" w:name="ref-Anderson_2017"/>
+    <w:bookmarkEnd w:id="137"/>
+    <w:bookmarkStart w:id="139" w:name="ref-Anderson_2017"/>
     <w:p>
       <w:pPr>
         <w:pStyle w:val="Bibliography"/>
@@ -5555,7 +5636,7 @@
       <w:r>
         <w:t xml:space="preserve"> </w:t>
       </w:r>
-      <w:hyperlink r:id="rId134">
+      <w:hyperlink r:id="rId138">
         <w:r>
           <w:rPr>
             <w:rStyle w:val="Hyperlink"/>
@@ -5567,8 +5648,8 @@
         <w:t xml:space="preserve">.</w:t>
       </w:r>
     </w:p>
-    <w:bookmarkEnd w:id="135"/>
-    <w:bookmarkStart w:id="137" w:name="ref-Shennan_Crema_Kerig_2015"/>
+    <w:bookmarkEnd w:id="139"/>
+    <w:bookmarkStart w:id="141" w:name="ref-Shennan_Crema_Kerig_2015"/>
     <w:p>
       <w:pPr>
         <w:pStyle w:val="Bibliography"/>
@@ -5627,7 +5708,7 @@
       <w:r>
         <w:t xml:space="preserve"> </w:t>
       </w:r>
-      <w:hyperlink r:id="rId136">
+      <w:hyperlink r:id="rId140">
         <w:r>
           <w:rPr>
             <w:rStyle w:val="Hyperlink"/>
@@ -5639,8 +5720,8 @@
         <w:t xml:space="preserve">.</w:t>
       </w:r>
     </w:p>
-    <w:bookmarkEnd w:id="137"/>
-    <w:bookmarkStart w:id="139" w:name="ref-Marwick2017"/>
+    <w:bookmarkEnd w:id="141"/>
+    <w:bookmarkStart w:id="143" w:name="ref-Marwick2017"/>
     <w:p>
       <w:pPr>
         <w:pStyle w:val="Bibliography"/>
@@ -5660,7 +5741,7 @@
       <w:r>
         <w:t xml:space="preserve"> </w:t>
       </w:r>
-      <w:hyperlink r:id="rId138">
+      <w:hyperlink r:id="rId142">
         <w:r>
           <w:rPr>
             <w:rStyle w:val="Hyperlink"/>
@@ -5672,8 +5753,8 @@
         <w:t xml:space="preserve">.</w:t>
       </w:r>
     </w:p>
-    <w:bookmarkEnd w:id="139"/>
-    <w:bookmarkStart w:id="141" w:name="ref-Marwick_2025"/>
+    <w:bookmarkEnd w:id="143"/>
+    <w:bookmarkStart w:id="145" w:name="ref-Marwick_2025"/>
     <w:p>
       <w:pPr>
         <w:pStyle w:val="Bibliography"/>
@@ -5693,7 +5774,7 @@
       <w:r>
         <w:t xml:space="preserve"> </w:t>
       </w:r>
-      <w:hyperlink r:id="rId140">
+      <w:hyperlink r:id="rId144">
         <w:r>
           <w:rPr>
             <w:rStyle w:val="Hyperlink"/>
@@ -5705,8 +5786,8 @@
         <w:t xml:space="preserve">.</w:t>
       </w:r>
     </w:p>
-    <w:bookmarkEnd w:id="141"/>
-    <w:bookmarkStart w:id="143" w:name="ref-Finlayson_Warren_2017"/>
+    <w:bookmarkEnd w:id="145"/>
+    <w:bookmarkStart w:id="147" w:name="ref-Finlayson_Warren_2017"/>
     <w:p>
       <w:pPr>
         <w:pStyle w:val="Bibliography"/>
@@ -5726,7 +5807,7 @@
       <w:r>
         <w:t xml:space="preserve"> </w:t>
       </w:r>
-      <w:hyperlink r:id="rId142">
+      <w:hyperlink r:id="rId146">
         <w:r>
           <w:rPr>
             <w:rStyle w:val="Hyperlink"/>
@@ -5738,8 +5819,8 @@
         <w:t xml:space="preserve">. In: Finlayson B, Warren G, editors. The diversity of hunter gatherer pasts. 1st ed., Oxbow Books; 2017, p. 1–14.</w:t>
       </w:r>
     </w:p>
-    <w:bookmarkEnd w:id="143"/>
-    <w:bookmarkStart w:id="145" w:name="ref-Riches_1995"/>
+    <w:bookmarkEnd w:id="147"/>
+    <w:bookmarkStart w:id="149" w:name="ref-Riches_1995"/>
     <w:p>
       <w:pPr>
         <w:pStyle w:val="Bibliography"/>
@@ -5759,7 +5840,7 @@
       <w:r>
         <w:t xml:space="preserve"> </w:t>
       </w:r>
-      <w:hyperlink r:id="rId144">
+      <w:hyperlink r:id="rId148">
         <w:r>
           <w:rPr>
             <w:rStyle w:val="Hyperlink"/>
@@ -5771,8 +5852,8 @@
         <w:t xml:space="preserve">.</w:t>
       </w:r>
     </w:p>
-    <w:bookmarkEnd w:id="145"/>
-    <w:bookmarkStart w:id="147" w:name="ref-Price_Brown_1985"/>
+    <w:bookmarkEnd w:id="149"/>
+    <w:bookmarkStart w:id="151" w:name="ref-Price_Brown_1985"/>
     <w:p>
       <w:pPr>
         <w:pStyle w:val="Bibliography"/>
@@ -5792,7 +5873,7 @@
       <w:r>
         <w:t xml:space="preserve"> </w:t>
       </w:r>
-      <w:hyperlink r:id="rId146">
+      <w:hyperlink r:id="rId150">
         <w:r>
           <w:rPr>
             <w:rStyle w:val="Hyperlink"/>
@@ -5804,8 +5885,8 @@
         <w:t xml:space="preserve">.</w:t>
       </w:r>
     </w:p>
-    <w:bookmarkEnd w:id="147"/>
-    <w:bookmarkStart w:id="149" w:name="ref-Lane_2017"/>
+    <w:bookmarkEnd w:id="151"/>
+    <w:bookmarkStart w:id="153" w:name="ref-Lane_2017"/>
     <w:p>
       <w:pPr>
         <w:pStyle w:val="Bibliography"/>
@@ -5825,7 +5906,7 @@
       <w:r>
         <w:t xml:space="preserve"> </w:t>
       </w:r>
-      <w:hyperlink r:id="rId148">
+      <w:hyperlink r:id="rId152">
         <w:r>
           <w:rPr>
             <w:rStyle w:val="Hyperlink"/>
@@ -5837,8 +5918,8 @@
         <w:t xml:space="preserve">. In: Finlayson B, Warren G, editors. The diversity of hunter gatherer pasts. 1st ed., Oxbow Books; 2017, p. 185–96.</w:t>
       </w:r>
     </w:p>
-    <w:bookmarkEnd w:id="149"/>
-    <w:bookmarkStart w:id="150" w:name="ref-Pate_2006"/>
+    <w:bookmarkEnd w:id="153"/>
+    <w:bookmarkStart w:id="154" w:name="ref-Pate_2006"/>
     <w:p>
       <w:pPr>
         <w:pStyle w:val="Bibliography"/>
@@ -5892,8 +5973,8 @@
         <w:t xml:space="preserve">societies, Aboriginal Studies Press; 2006, p. 226–41.</w:t>
       </w:r>
     </w:p>
-    <w:bookmarkEnd w:id="150"/>
-    <w:bookmarkStart w:id="152" w:name="ref-Johnson_2014"/>
+    <w:bookmarkEnd w:id="154"/>
+    <w:bookmarkStart w:id="156" w:name="ref-Johnson_2014"/>
     <w:p>
       <w:pPr>
         <w:pStyle w:val="Bibliography"/>
@@ -5922,7 +6003,7 @@
       <w:r>
         <w:t xml:space="preserve"> </w:t>
       </w:r>
-      <w:hyperlink r:id="rId151">
+      <w:hyperlink r:id="rId155">
         <w:r>
           <w:rPr>
             <w:rStyle w:val="Hyperlink"/>
@@ -5934,8 +6015,8 @@
         <w:t xml:space="preserve">.</w:t>
       </w:r>
     </w:p>
-    <w:bookmarkEnd w:id="152"/>
-    <w:bookmarkStart w:id="154" w:name="ref-Singh_Glowacki_2022"/>
+    <w:bookmarkEnd w:id="156"/>
+    <w:bookmarkStart w:id="158" w:name="ref-Singh_Glowacki_2022"/>
     <w:p>
       <w:pPr>
         <w:pStyle w:val="Bibliography"/>
@@ -5964,7 +6045,7 @@
       <w:r>
         <w:t xml:space="preserve"> </w:t>
       </w:r>
-      <w:hyperlink r:id="rId153">
+      <w:hyperlink r:id="rId157">
         <w:r>
           <w:rPr>
             <w:rStyle w:val="Hyperlink"/>
@@ -5976,8 +6057,8 @@
         <w:t xml:space="preserve">.</w:t>
       </w:r>
     </w:p>
-    <w:bookmarkEnd w:id="154"/>
-    <w:bookmarkStart w:id="156" w:name="ref-Schwendler_2012"/>
+    <w:bookmarkEnd w:id="158"/>
+    <w:bookmarkStart w:id="160" w:name="ref-Schwendler_2012"/>
     <w:p>
       <w:pPr>
         <w:pStyle w:val="Bibliography"/>
@@ -6024,7 +6105,7 @@
       <w:r>
         <w:t xml:space="preserve"> </w:t>
       </w:r>
-      <w:hyperlink r:id="rId155">
+      <w:hyperlink r:id="rId159">
         <w:r>
           <w:rPr>
             <w:rStyle w:val="Hyperlink"/>
@@ -6036,8 +6117,8 @@
         <w:t xml:space="preserve">.</w:t>
       </w:r>
     </w:p>
-    <w:bookmarkEnd w:id="156"/>
-    <w:bookmarkStart w:id="158" w:name="ref-Morwood_1987"/>
+    <w:bookmarkEnd w:id="160"/>
+    <w:bookmarkStart w:id="162" w:name="ref-Morwood_1987"/>
     <w:p>
       <w:pPr>
         <w:pStyle w:val="Bibliography"/>
@@ -6075,7 +6156,7 @@
       <w:r>
         <w:t xml:space="preserve"> </w:t>
       </w:r>
-      <w:hyperlink r:id="rId157">
+      <w:hyperlink r:id="rId161">
         <w:r>
           <w:rPr>
             <w:rStyle w:val="Hyperlink"/>
@@ -6087,8 +6168,8 @@
         <w:t xml:space="preserve">.</w:t>
       </w:r>
     </w:p>
-    <w:bookmarkEnd w:id="158"/>
-    <w:bookmarkStart w:id="160" w:name="ref-Mattson_2021"/>
+    <w:bookmarkEnd w:id="162"/>
+    <w:bookmarkStart w:id="164" w:name="ref-Mattson_2021"/>
     <w:p>
       <w:pPr>
         <w:pStyle w:val="Bibliography"/>
@@ -6108,7 +6189,7 @@
       <w:r>
         <w:t xml:space="preserve"> </w:t>
       </w:r>
-      <w:hyperlink r:id="rId159">
+      <w:hyperlink r:id="rId163">
         <w:r>
           <w:rPr>
             <w:rStyle w:val="Hyperlink"/>
@@ -6120,8 +6201,8 @@
         <w:t xml:space="preserve">.</w:t>
       </w:r>
     </w:p>
-    <w:bookmarkEnd w:id="160"/>
-    <w:bookmarkStart w:id="161" w:name="ref-Larsson_2006"/>
+    <w:bookmarkEnd w:id="164"/>
+    <w:bookmarkStart w:id="165" w:name="ref-Larsson_2006"/>
     <w:p>
       <w:pPr>
         <w:pStyle w:val="Bibliography"/>
@@ -6181,8 +6262,8 @@
         <w:t xml:space="preserve">, vol. 52, Almqvist &amp; Wiksell International; 2006, p. 253–87.</w:t>
       </w:r>
     </w:p>
-    <w:bookmarkEnd w:id="161"/>
-    <w:bookmarkStart w:id="163" w:name="ref-Moore_2010"/>
+    <w:bookmarkEnd w:id="165"/>
+    <w:bookmarkStart w:id="167" w:name="ref-Moore_2010"/>
     <w:p>
       <w:pPr>
         <w:pStyle w:val="Bibliography"/>
@@ -6253,7 +6334,7 @@
       <w:r>
         <w:t xml:space="preserve"> </w:t>
       </w:r>
-      <w:hyperlink r:id="rId162">
+      <w:hyperlink r:id="rId166">
         <w:r>
           <w:rPr>
             <w:rStyle w:val="Hyperlink"/>
@@ -6265,8 +6346,8 @@
         <w:t xml:space="preserve">.</w:t>
       </w:r>
     </w:p>
-    <w:bookmarkEnd w:id="163"/>
-    <w:bookmarkStart w:id="165" w:name="ref-Alfonso-Durrruty_Giles_Misarti2015"/>
+    <w:bookmarkEnd w:id="167"/>
+    <w:bookmarkStart w:id="169" w:name="ref-Alfonso-Durrruty_Giles_Misarti2015"/>
     <w:p>
       <w:pPr>
         <w:pStyle w:val="Bibliography"/>
@@ -6304,7 +6385,7 @@
       <w:r>
         <w:t xml:space="preserve"> </w:t>
       </w:r>
-      <w:hyperlink r:id="rId164">
+      <w:hyperlink r:id="rId168">
         <w:r>
           <w:rPr>
             <w:rStyle w:val="Hyperlink"/>
@@ -6316,8 +6397,8 @@
         <w:t xml:space="preserve">.</w:t>
       </w:r>
     </w:p>
-    <w:bookmarkEnd w:id="165"/>
-    <w:bookmarkStart w:id="166" w:name="ref-Vanhaeren_2005"/>
+    <w:bookmarkEnd w:id="169"/>
+    <w:bookmarkStart w:id="170" w:name="ref-Vanhaeren_2005"/>
     <w:p>
       <w:pPr>
         <w:pStyle w:val="Bibliography"/>
@@ -6335,8 +6416,8 @@
         <w:t xml:space="preserve">Vanhaeren M. Speaking with beads: The evolutionary significance of personal ornaments. In: d’Errico F, Backwell L, editors. From tools to symbols: From early hominids to modern humans, Wits University Press; 2005, p. 525–54.</w:t>
       </w:r>
     </w:p>
-    <w:bookmarkEnd w:id="166"/>
-    <w:bookmarkStart w:id="168" w:name="ref-Conkey_1985"/>
+    <w:bookmarkEnd w:id="170"/>
+    <w:bookmarkStart w:id="172" w:name="ref-Conkey_1985"/>
     <w:p>
       <w:pPr>
         <w:pStyle w:val="Bibliography"/>
@@ -6368,7 +6449,7 @@
       <w:r>
         <w:t xml:space="preserve"> </w:t>
       </w:r>
-      <w:hyperlink r:id="rId167">
+      <w:hyperlink r:id="rId171">
         <w:r>
           <w:rPr>
             <w:rStyle w:val="Hyperlink"/>
@@ -6380,8 +6461,8 @@
         <w:t xml:space="preserve">.</w:t>
       </w:r>
     </w:p>
-    <w:bookmarkEnd w:id="168"/>
-    <w:bookmarkStart w:id="169" w:name="ref-Conkey_1978"/>
+    <w:bookmarkEnd w:id="172"/>
+    <w:bookmarkStart w:id="173" w:name="ref-Conkey_1978"/>
     <w:p>
       <w:pPr>
         <w:pStyle w:val="Bibliography"/>
@@ -6408,8 +6489,8 @@
         <w:t xml:space="preserve">. In: Redman CL, Berman MJ, Curtin EV, Langhorne Jr William T., Versaggi NM, Wanser JC, editors. Social archaeology: Beyond subsistence and dating, New York: Academic Press; 1978, p. 61–85.</w:t>
       </w:r>
     </w:p>
-    <w:bookmarkEnd w:id="169"/>
-    <w:bookmarkStart w:id="171" w:name="ref-Tilley_1982"/>
+    <w:bookmarkEnd w:id="173"/>
+    <w:bookmarkStart w:id="175" w:name="ref-Tilley_1982"/>
     <w:p>
       <w:pPr>
         <w:pStyle w:val="Bibliography"/>
@@ -6429,7 +6510,7 @@
       <w:r>
         <w:t xml:space="preserve"> </w:t>
       </w:r>
-      <w:hyperlink r:id="rId170">
+      <w:hyperlink r:id="rId174">
         <w:r>
           <w:rPr>
             <w:rStyle w:val="Hyperlink"/>
@@ -6441,8 +6522,8 @@
         <w:t xml:space="preserve">.</w:t>
       </w:r>
     </w:p>
-    <w:bookmarkEnd w:id="171"/>
-    <w:bookmarkStart w:id="173" w:name="ref-Hodder1979"/>
+    <w:bookmarkEnd w:id="175"/>
+    <w:bookmarkStart w:id="177" w:name="ref-Hodder1979"/>
     <w:p>
       <w:pPr>
         <w:pStyle w:val="Bibliography"/>
@@ -6462,7 +6543,7 @@
       <w:r>
         <w:t xml:space="preserve"> </w:t>
       </w:r>
-      <w:hyperlink r:id="rId172">
+      <w:hyperlink r:id="rId176">
         <w:r>
           <w:rPr>
             <w:rStyle w:val="Hyperlink"/>
@@ -6474,8 +6555,8 @@
         <w:t xml:space="preserve">.</w:t>
       </w:r>
     </w:p>
-    <w:bookmarkEnd w:id="173"/>
-    <w:bookmarkStart w:id="175" w:name="ref-Hodder1977"/>
+    <w:bookmarkEnd w:id="177"/>
+    <w:bookmarkStart w:id="179" w:name="ref-Hodder1977"/>
     <w:p>
       <w:pPr>
         <w:pStyle w:val="Bibliography"/>
@@ -6513,7 +6594,7 @@
       <w:r>
         <w:t xml:space="preserve"> </w:t>
       </w:r>
-      <w:hyperlink r:id="rId174">
+      <w:hyperlink r:id="rId178">
         <w:r>
           <w:rPr>
             <w:rStyle w:val="Hyperlink"/>
@@ -6525,8 +6606,8 @@
         <w:t xml:space="preserve">.</w:t>
       </w:r>
     </w:p>
-    <w:bookmarkEnd w:id="175"/>
-    <w:bookmarkStart w:id="177" w:name="ref-Binford_1990"/>
+    <w:bookmarkEnd w:id="179"/>
+    <w:bookmarkStart w:id="181" w:name="ref-Binford_1990"/>
     <w:p>
       <w:pPr>
         <w:pStyle w:val="Bibliography"/>
@@ -6546,7 +6627,7 @@
       <w:r>
         <w:t xml:space="preserve"> </w:t>
       </w:r>
-      <w:hyperlink r:id="rId176">
+      <w:hyperlink r:id="rId180">
         <w:r>
           <w:rPr>
             <w:rStyle w:val="Hyperlink"/>
@@ -6558,8 +6639,8 @@
         <w:t xml:space="preserve">.</w:t>
       </w:r>
     </w:p>
-    <w:bookmarkEnd w:id="177"/>
-    <w:bookmarkStart w:id="179" w:name="ref-Kelly_1983"/>
+    <w:bookmarkEnd w:id="181"/>
+    <w:bookmarkStart w:id="183" w:name="ref-Kelly_1983"/>
     <w:p>
       <w:pPr>
         <w:pStyle w:val="Bibliography"/>
@@ -6579,7 +6660,7 @@
       <w:r>
         <w:t xml:space="preserve"> </w:t>
       </w:r>
-      <w:hyperlink r:id="rId178">
+      <w:hyperlink r:id="rId182">
         <w:r>
           <w:rPr>
             <w:rStyle w:val="Hyperlink"/>
@@ -6591,8 +6672,8 @@
         <w:t xml:space="preserve">.</w:t>
       </w:r>
     </w:p>
-    <w:bookmarkEnd w:id="179"/>
-    <w:bookmarkStart w:id="181" w:name="ref-Padilla-Iglesias_Bischoff_2024"/>
+    <w:bookmarkEnd w:id="183"/>
+    <w:bookmarkStart w:id="185" w:name="ref-Padilla-Iglesias_Bischoff_2024"/>
     <w:p>
       <w:pPr>
         <w:pStyle w:val="Bibliography"/>
@@ -6612,7 +6693,7 @@
       <w:r>
         <w:t xml:space="preserve"> </w:t>
       </w:r>
-      <w:hyperlink r:id="rId180">
+      <w:hyperlink r:id="rId184">
         <w:r>
           <w:rPr>
             <w:rStyle w:val="Hyperlink"/>
@@ -6624,8 +6705,8 @@
         <w:t xml:space="preserve">.</w:t>
       </w:r>
     </w:p>
-    <w:bookmarkEnd w:id="181"/>
-    <w:bookmarkStart w:id="183" w:name="ref-Whallon_2006"/>
+    <w:bookmarkEnd w:id="185"/>
+    <w:bookmarkStart w:id="187" w:name="ref-Whallon_2006"/>
     <w:p>
       <w:pPr>
         <w:pStyle w:val="Bibliography"/>
@@ -6654,7 +6735,7 @@
       <w:r>
         <w:t xml:space="preserve"> </w:t>
       </w:r>
-      <w:hyperlink r:id="rId182">
+      <w:hyperlink r:id="rId186">
         <w:r>
           <w:rPr>
             <w:rStyle w:val="Hyperlink"/>
@@ -6666,8 +6747,8 @@
         <w:t xml:space="preserve">.</w:t>
       </w:r>
     </w:p>
-    <w:bookmarkEnd w:id="183"/>
-    <w:bookmarkStart w:id="184" w:name="ref-Fitzhugh_Phillips_Gjesfeld_2011"/>
+    <w:bookmarkEnd w:id="187"/>
+    <w:bookmarkStart w:id="188" w:name="ref-Fitzhugh_Phillips_Gjesfeld_2011"/>
     <w:p>
       <w:pPr>
         <w:pStyle w:val="Bibliography"/>
@@ -6694,8 +6775,8 @@
         <w:t xml:space="preserve">. In: Whallon R, Lovis WA, Hitchcock RK, editors. Information and its role in hunter-gatherer bands, Cotsen Institute of Archaeology Press at UCLA; 2011, p. 85–116.</w:t>
       </w:r>
     </w:p>
-    <w:bookmarkEnd w:id="184"/>
-    <w:bookmarkStart w:id="186" w:name="ref-Lovis_Donahue_2011"/>
+    <w:bookmarkEnd w:id="188"/>
+    <w:bookmarkStart w:id="190" w:name="ref-Lovis_Donahue_2011"/>
     <w:p>
       <w:pPr>
         <w:pStyle w:val="Bibliography"/>
@@ -6733,7 +6814,7 @@
       <w:r>
         <w:t xml:space="preserve"> </w:t>
       </w:r>
-      <w:hyperlink r:id="rId185">
+      <w:hyperlink r:id="rId189">
         <w:r>
           <w:rPr>
             <w:rStyle w:val="Hyperlink"/>
@@ -6745,8 +6826,8 @@
         <w:t xml:space="preserve">.</w:t>
       </w:r>
     </w:p>
-    <w:bookmarkEnd w:id="186"/>
-    <w:bookmarkStart w:id="188" w:name="ref-Hitchcock_Ebert_2011"/>
+    <w:bookmarkEnd w:id="190"/>
+    <w:bookmarkStart w:id="192" w:name="ref-Hitchcock_Ebert_2011"/>
     <w:p>
       <w:pPr>
         <w:pStyle w:val="Bibliography"/>
@@ -6784,7 +6865,7 @@
       <w:r>
         <w:t xml:space="preserve"> </w:t>
       </w:r>
-      <w:hyperlink r:id="rId187">
+      <w:hyperlink r:id="rId191">
         <w:r>
           <w:rPr>
             <w:rStyle w:val="Hyperlink"/>
@@ -6796,8 +6877,8 @@
         <w:t xml:space="preserve">.</w:t>
       </w:r>
     </w:p>
-    <w:bookmarkEnd w:id="188"/>
-    <w:bookmarkStart w:id="190" w:name="ref-Romano_Lozano_Fern2022"/>
+    <w:bookmarkEnd w:id="192"/>
+    <w:bookmarkStart w:id="194" w:name="ref-Romano_Lozano_Fern2022"/>
     <w:p>
       <w:pPr>
         <w:pStyle w:val="Bibliography"/>
@@ -6841,7 +6922,7 @@
       <w:r>
         <w:t xml:space="preserve"> </w:t>
       </w:r>
-      <w:hyperlink r:id="rId189">
+      <w:hyperlink r:id="rId193">
         <w:r>
           <w:rPr>
             <w:rStyle w:val="Hyperlink"/>
@@ -6853,8 +6934,8 @@
         <w:t xml:space="preserve">.</w:t>
       </w:r>
     </w:p>
-    <w:bookmarkEnd w:id="190"/>
-    <w:bookmarkStart w:id="192" w:name="ref-Kelly_2024"/>
+    <w:bookmarkEnd w:id="194"/>
+    <w:bookmarkStart w:id="196" w:name="ref-Kelly_2024"/>
     <w:p>
       <w:pPr>
         <w:pStyle w:val="Bibliography"/>
@@ -6895,7 +6976,7 @@
       <w:r>
         <w:t xml:space="preserve"> </w:t>
       </w:r>
-      <w:hyperlink r:id="rId191">
+      <w:hyperlink r:id="rId195">
         <w:r>
           <w:rPr>
             <w:rStyle w:val="Hyperlink"/>
@@ -6907,8 +6988,8 @@
         <w:t xml:space="preserve">.</w:t>
       </w:r>
     </w:p>
-    <w:bookmarkEnd w:id="192"/>
-    <w:bookmarkStart w:id="194" w:name="ref-Kinahan_2013"/>
+    <w:bookmarkEnd w:id="196"/>
+    <w:bookmarkStart w:id="198" w:name="ref-Kinahan_2013"/>
     <w:p>
       <w:pPr>
         <w:pStyle w:val="Bibliography"/>
@@ -6949,7 +7030,7 @@
       <w:r>
         <w:t xml:space="preserve"> </w:t>
       </w:r>
-      <w:hyperlink r:id="rId193">
+      <w:hyperlink r:id="rId197">
         <w:r>
           <w:rPr>
             <w:rStyle w:val="Hyperlink"/>
@@ -6961,8 +7042,8 @@
         <w:t xml:space="preserve">.</w:t>
       </w:r>
     </w:p>
-    <w:bookmarkEnd w:id="194"/>
-    <w:bookmarkStart w:id="196" w:name="ref-Newlander_2012"/>
+    <w:bookmarkEnd w:id="198"/>
+    <w:bookmarkStart w:id="200" w:name="ref-Newlander_2012"/>
     <w:p>
       <w:pPr>
         <w:pStyle w:val="Bibliography"/>
@@ -6982,7 +7063,7 @@
       <w:r>
         <w:t xml:space="preserve"> </w:t>
       </w:r>
-      <w:hyperlink r:id="rId195">
+      <w:hyperlink r:id="rId199">
         <w:r>
           <w:rPr>
             <w:rStyle w:val="Hyperlink"/>
@@ -7042,8 +7123,8 @@
         <w:t xml:space="preserve">. Ph.D. University of Michigan, 2012.</w:t>
       </w:r>
     </w:p>
-    <w:bookmarkEnd w:id="196"/>
-    <w:bookmarkStart w:id="198" w:name="ref-Iizuka_Ferguson_Izuho_2022"/>
+    <w:bookmarkEnd w:id="200"/>
+    <w:bookmarkStart w:id="202" w:name="ref-Iizuka_Ferguson_Izuho_2022"/>
     <w:p>
       <w:pPr>
         <w:pStyle w:val="Bibliography"/>
@@ -7096,7 +7177,7 @@
       <w:r>
         <w:t xml:space="preserve"> </w:t>
       </w:r>
-      <w:hyperlink r:id="rId197">
+      <w:hyperlink r:id="rId201">
         <w:r>
           <w:rPr>
             <w:rStyle w:val="Hyperlink"/>
@@ -7108,8 +7189,8 @@
         <w:t xml:space="preserve">.</w:t>
       </w:r>
     </w:p>
-    <w:bookmarkEnd w:id="198"/>
-    <w:bookmarkStart w:id="200" w:name="ref-conkey_agg"/>
+    <w:bookmarkEnd w:id="202"/>
+    <w:bookmarkStart w:id="204" w:name="ref-conkey_agg"/>
     <w:p>
       <w:pPr>
         <w:pStyle w:val="Bibliography"/>
@@ -7141,7 +7222,7 @@
       <w:r>
         <w:t xml:space="preserve"> </w:t>
       </w:r>
-      <w:hyperlink r:id="rId199">
+      <w:hyperlink r:id="rId203">
         <w:r>
           <w:rPr>
             <w:rStyle w:val="Hyperlink"/>
@@ -7153,8 +7234,8 @@
         <w:t xml:space="preserve">.</w:t>
       </w:r>
     </w:p>
-    <w:bookmarkEnd w:id="200"/>
-    <w:bookmarkStart w:id="202" w:name="ref-Maher_Conkey_2019"/>
+    <w:bookmarkEnd w:id="204"/>
+    <w:bookmarkStart w:id="206" w:name="ref-Maher_Conkey_2019"/>
     <w:p>
       <w:pPr>
         <w:pStyle w:val="Bibliography"/>
@@ -7207,7 +7288,7 @@
       <w:r>
         <w:t xml:space="preserve"> </w:t>
       </w:r>
-      <w:hyperlink r:id="rId201">
+      <w:hyperlink r:id="rId205">
         <w:r>
           <w:rPr>
             <w:rStyle w:val="Hyperlink"/>
@@ -7219,8 +7300,8 @@
         <w:t xml:space="preserve">.</w:t>
       </w:r>
     </w:p>
-    <w:bookmarkEnd w:id="202"/>
-    <w:bookmarkStart w:id="204" w:name="ref-bahn1982inter"/>
+    <w:bookmarkEnd w:id="206"/>
+    <w:bookmarkStart w:id="208" w:name="ref-bahn1982inter"/>
     <w:p>
       <w:pPr>
         <w:pStyle w:val="Bibliography"/>
@@ -7261,7 +7342,7 @@
       <w:r>
         <w:t xml:space="preserve"> </w:t>
       </w:r>
-      <w:hyperlink r:id="rId203">
+      <w:hyperlink r:id="rId207">
         <w:r>
           <w:rPr>
             <w:rStyle w:val="Hyperlink"/>
@@ -7273,8 +7354,8 @@
         <w:t xml:space="preserve">.</w:t>
       </w:r>
     </w:p>
-    <w:bookmarkEnd w:id="204"/>
-    <w:bookmarkStart w:id="206" w:name="ref-Bourdier_2013"/>
+    <w:bookmarkEnd w:id="208"/>
+    <w:bookmarkStart w:id="210" w:name="ref-Bourdier_2013"/>
     <w:p>
       <w:pPr>
         <w:pStyle w:val="Bibliography"/>
@@ -7330,7 +7411,7 @@
       <w:r>
         <w:t xml:space="preserve"> </w:t>
       </w:r>
-      <w:hyperlink r:id="rId205">
+      <w:hyperlink r:id="rId209">
         <w:r>
           <w:rPr>
             <w:rStyle w:val="Hyperlink"/>
@@ -7342,8 +7423,8 @@
         <w:t xml:space="preserve">.</w:t>
       </w:r>
     </w:p>
-    <w:bookmarkEnd w:id="206"/>
-    <w:bookmarkStart w:id="208" w:name="ref-Svoboda_2013"/>
+    <w:bookmarkEnd w:id="210"/>
+    <w:bookmarkStart w:id="212" w:name="ref-Svoboda_2013"/>
     <w:p>
       <w:pPr>
         <w:pStyle w:val="Bibliography"/>
@@ -7375,7 +7456,7 @@
       <w:r>
         <w:t xml:space="preserve"> </w:t>
       </w:r>
-      <w:hyperlink r:id="rId207">
+      <w:hyperlink r:id="rId211">
         <w:r>
           <w:rPr>
             <w:rStyle w:val="Hyperlink"/>
@@ -7387,8 +7468,8 @@
         <w:t xml:space="preserve">.</w:t>
       </w:r>
     </w:p>
-    <w:bookmarkEnd w:id="208"/>
-    <w:bookmarkStart w:id="210" w:name="ref-white1992rethinking"/>
+    <w:bookmarkEnd w:id="212"/>
+    <w:bookmarkStart w:id="214" w:name="ref-white1992rethinking"/>
     <w:p>
       <w:pPr>
         <w:pStyle w:val="Bibliography"/>
@@ -7420,7 +7501,7 @@
       <w:r>
         <w:t xml:space="preserve"> </w:t>
       </w:r>
-      <w:hyperlink r:id="rId209">
+      <w:hyperlink r:id="rId213">
         <w:r>
           <w:rPr>
             <w:rStyle w:val="Hyperlink"/>
@@ -7432,8 +7513,8 @@
         <w:t xml:space="preserve">.</w:t>
       </w:r>
     </w:p>
-    <w:bookmarkEnd w:id="210"/>
-    <w:bookmarkStart w:id="211" w:name="X79d7c52b9cdbe72fc1b94e51c6ee6057d0c4a50"/>
+    <w:bookmarkEnd w:id="214"/>
+    <w:bookmarkStart w:id="215" w:name="X79d7c52b9cdbe72fc1b94e51c6ee6057d0c4a50"/>
     <w:p>
       <w:pPr>
         <w:pStyle w:val="Bibliography"/>
@@ -7475,8 +7556,8 @@
         <w:t xml:space="preserve">household, SUNY Press; 2010, p. 235–44.</w:t>
       </w:r>
     </w:p>
-    <w:bookmarkEnd w:id="211"/>
-    <w:bookmarkStart w:id="213" w:name="ref-montet-white1994"/>
+    <w:bookmarkEnd w:id="215"/>
+    <w:bookmarkStart w:id="217" w:name="ref-montet-white1994"/>
     <w:p>
       <w:pPr>
         <w:pStyle w:val="Bibliography"/>
@@ -7517,7 +7598,7 @@
       <w:r>
         <w:t xml:space="preserve"> </w:t>
       </w:r>
-      <w:hyperlink r:id="rId212">
+      <w:hyperlink r:id="rId216">
         <w:r>
           <w:rPr>
             <w:rStyle w:val="Hyperlink"/>
@@ -7529,8 +7610,8 @@
         <w:t xml:space="preserve">.</w:t>
       </w:r>
     </w:p>
-    <w:bookmarkEnd w:id="213"/>
-    <w:bookmarkStart w:id="215" w:name="ref-Frerebeau_2025"/>
+    <w:bookmarkEnd w:id="217"/>
+    <w:bookmarkStart w:id="219" w:name="ref-Frerebeau_2025"/>
     <w:p>
       <w:pPr>
         <w:pStyle w:val="Bibliography"/>
@@ -7550,7 +7631,7 @@
       <w:r>
         <w:t xml:space="preserve"> </w:t>
       </w:r>
-      <w:hyperlink r:id="rId214">
+      <w:hyperlink r:id="rId218">
         <w:r>
           <w:rPr>
             <w:rStyle w:val="Hyperlink"/>
@@ -7562,8 +7643,8 @@
         <w:t xml:space="preserve">.</w:t>
       </w:r>
     </w:p>
-    <w:bookmarkEnd w:id="215"/>
-    <w:bookmarkStart w:id="217" w:name="ref-Kintigh_1984"/>
+    <w:bookmarkEnd w:id="219"/>
+    <w:bookmarkStart w:id="221" w:name="ref-Kintigh_1984"/>
     <w:p>
       <w:pPr>
         <w:pStyle w:val="Bibliography"/>
@@ -7583,7 +7664,7 @@
       <w:r>
         <w:t xml:space="preserve"> </w:t>
       </w:r>
-      <w:hyperlink r:id="rId216">
+      <w:hyperlink r:id="rId220">
         <w:r>
           <w:rPr>
             <w:rStyle w:val="Hyperlink"/>
@@ -7595,8 +7676,8 @@
         <w:t xml:space="preserve">.</w:t>
       </w:r>
     </w:p>
-    <w:bookmarkEnd w:id="217"/>
-    <w:bookmarkStart w:id="219" w:name="X8c17deb08b87fbfa26556dda630532ff62c8bd1"/>
+    <w:bookmarkEnd w:id="221"/>
+    <w:bookmarkStart w:id="223" w:name="X8c17deb08b87fbfa26556dda630532ff62c8bd1"/>
     <w:p>
       <w:pPr>
         <w:pStyle w:val="Bibliography"/>
@@ -7637,7 +7718,7 @@
       <w:r>
         <w:t xml:space="preserve"> </w:t>
       </w:r>
-      <w:hyperlink r:id="rId218">
+      <w:hyperlink r:id="rId222">
         <w:r>
           <w:rPr>
             <w:rStyle w:val="Hyperlink"/>
@@ -7649,8 +7730,8 @@
         <w:t xml:space="preserve">.</w:t>
       </w:r>
     </w:p>
-    <w:bookmarkEnd w:id="219"/>
-    <w:bookmarkStart w:id="221" w:name="ref-smith1992Design"/>
+    <w:bookmarkEnd w:id="223"/>
+    <w:bookmarkStart w:id="225" w:name="ref-smith1992Design"/>
     <w:p>
       <w:pPr>
         <w:pStyle w:val="Bibliography"/>
@@ -7685,7 +7766,7 @@
       <w:r>
         <w:t xml:space="preserve"> </w:t>
       </w:r>
-      <w:hyperlink r:id="rId220">
+      <w:hyperlink r:id="rId224">
         <w:r>
           <w:rPr>
             <w:rStyle w:val="Hyperlink"/>
@@ -7697,8 +7778,8 @@
         <w:t xml:space="preserve">.</w:t>
       </w:r>
     </w:p>
-    <w:bookmarkEnd w:id="221"/>
-    <w:bookmarkStart w:id="222" w:name="ref-hays1993symbol"/>
+    <w:bookmarkEnd w:id="225"/>
+    <w:bookmarkStart w:id="226" w:name="ref-hays1993symbol"/>
     <w:p>
       <w:pPr>
         <w:pStyle w:val="Bibliography"/>
@@ -7716,8 +7797,8 @@
         <w:t xml:space="preserve">Hays KA. When is a symbol archaeologically meaningful? Meaning, function, and prehistoric visual arts. In: Yoffee N, Sherratt A, editors. Archaeological theory: Who sets the agenda?, Cambridge University Press; 1993, p. 81–92.</w:t>
       </w:r>
     </w:p>
-    <w:bookmarkEnd w:id="222"/>
-    <w:bookmarkStart w:id="224" w:name="ref-McDonald_Veth_Lilley_2006"/>
+    <w:bookmarkEnd w:id="226"/>
+    <w:bookmarkStart w:id="228" w:name="ref-McDonald_Veth_Lilley_2006"/>
     <w:p>
       <w:pPr>
         <w:pStyle w:val="Bibliography"/>
@@ -7779,7 +7860,7 @@
       <w:r>
         <w:t xml:space="preserve"> </w:t>
       </w:r>
-      <w:hyperlink r:id="rId223">
+      <w:hyperlink r:id="rId227">
         <w:r>
           <w:rPr>
             <w:rStyle w:val="Hyperlink"/>
@@ -7791,8 +7872,8 @@
         <w:t xml:space="preserve">.</w:t>
       </w:r>
     </w:p>
-    <w:bookmarkEnd w:id="224"/>
-    <w:bookmarkStart w:id="226" w:name="ref-Lourandos_1985"/>
+    <w:bookmarkEnd w:id="228"/>
+    <w:bookmarkStart w:id="230" w:name="ref-Lourandos_1985"/>
     <w:p>
       <w:pPr>
         <w:pStyle w:val="Bibliography"/>
@@ -7824,7 +7905,7 @@
       <w:r>
         <w:t xml:space="preserve"> </w:t>
       </w:r>
-      <w:hyperlink r:id="rId225">
+      <w:hyperlink r:id="rId229">
         <w:r>
           <w:rPr>
             <w:rStyle w:val="Hyperlink"/>
@@ -7836,8 +7917,8 @@
         <w:t xml:space="preserve">.</w:t>
       </w:r>
     </w:p>
-    <w:bookmarkEnd w:id="226"/>
-    <w:bookmarkStart w:id="228" w:name="ref-barton_clark_cohen1994"/>
+    <w:bookmarkEnd w:id="230"/>
+    <w:bookmarkStart w:id="232" w:name="ref-barton_clark_cohen1994"/>
     <w:p>
       <w:pPr>
         <w:pStyle w:val="Bibliography"/>
@@ -7878,7 +7959,7 @@
       <w:r>
         <w:t xml:space="preserve"> </w:t>
       </w:r>
-      <w:hyperlink r:id="rId227">
+      <w:hyperlink r:id="rId231">
         <w:r>
           <w:rPr>
             <w:rStyle w:val="Hyperlink"/>
@@ -7890,8 +7971,8 @@
         <w:t xml:space="preserve">.</w:t>
       </w:r>
     </w:p>
-    <w:bookmarkEnd w:id="228"/>
-    <w:bookmarkStart w:id="230" w:name="ref-mcdonald2012social"/>
+    <w:bookmarkEnd w:id="232"/>
+    <w:bookmarkStart w:id="234" w:name="ref-mcdonald2012social"/>
     <w:p>
       <w:pPr>
         <w:pStyle w:val="Bibliography"/>
@@ -7920,7 +8001,7 @@
       <w:r>
         <w:t xml:space="preserve"> </w:t>
       </w:r>
-      <w:hyperlink r:id="rId229">
+      <w:hyperlink r:id="rId233">
         <w:r>
           <w:rPr>
             <w:rStyle w:val="Hyperlink"/>
@@ -7932,8 +8013,8 @@
         <w:t xml:space="preserve">.</w:t>
       </w:r>
     </w:p>
-    <w:bookmarkEnd w:id="230"/>
-    <w:bookmarkStart w:id="232" w:name="ref-bernardini2005reconsidering"/>
+    <w:bookmarkEnd w:id="234"/>
+    <w:bookmarkStart w:id="236" w:name="ref-bernardini2005reconsidering"/>
     <w:p>
       <w:pPr>
         <w:pStyle w:val="Bibliography"/>
@@ -7962,7 +8043,7 @@
       <w:r>
         <w:t xml:space="preserve"> </w:t>
       </w:r>
-      <w:hyperlink r:id="rId231">
+      <w:hyperlink r:id="rId235">
         <w:r>
           <w:rPr>
             <w:rStyle w:val="Hyperlink"/>
@@ -7974,8 +8055,8 @@
         <w:t xml:space="preserve">.</w:t>
       </w:r>
     </w:p>
-    <w:bookmarkEnd w:id="232"/>
-    <w:bookmarkStart w:id="234" w:name="ref-wiessner1984reconsidering"/>
+    <w:bookmarkEnd w:id="236"/>
+    <w:bookmarkStart w:id="238" w:name="ref-wiessner1984reconsidering"/>
     <w:p>
       <w:pPr>
         <w:pStyle w:val="Bibliography"/>
@@ -8004,7 +8085,7 @@
       <w:r>
         <w:t xml:space="preserve"> </w:t>
       </w:r>
-      <w:hyperlink r:id="rId233">
+      <w:hyperlink r:id="rId237">
         <w:r>
           <w:rPr>
             <w:rStyle w:val="Hyperlink"/>
@@ -8016,8 +8097,8 @@
         <w:t xml:space="preserve">.</w:t>
       </w:r>
     </w:p>
-    <w:bookmarkEnd w:id="234"/>
-    <w:bookmarkStart w:id="236" w:name="ref-smith1992"/>
+    <w:bookmarkEnd w:id="238"/>
+    <w:bookmarkStart w:id="240" w:name="ref-smith1992"/>
     <w:p>
       <w:pPr>
         <w:pStyle w:val="Bibliography"/>
@@ -8058,7 +8139,7 @@
       <w:r>
         <w:t xml:space="preserve"> </w:t>
       </w:r>
-      <w:hyperlink r:id="rId235">
+      <w:hyperlink r:id="rId239">
         <w:r>
           <w:rPr>
             <w:rStyle w:val="Hyperlink"/>
@@ -8070,8 +8151,8 @@
         <w:t xml:space="preserve">.</w:t>
       </w:r>
     </w:p>
-    <w:bookmarkEnd w:id="236"/>
-    <w:bookmarkStart w:id="238" w:name="X4fed35d53d406ce17aea32f9d6f163fcb563519"/>
+    <w:bookmarkEnd w:id="240"/>
+    <w:bookmarkStart w:id="242" w:name="X4fed35d53d406ce17aea32f9d6f163fcb563519"/>
     <w:p>
       <w:pPr>
         <w:pStyle w:val="Bibliography"/>
@@ -8112,7 +8193,7 @@
       <w:r>
         <w:t xml:space="preserve"> </w:t>
       </w:r>
-      <w:hyperlink r:id="rId237">
+      <w:hyperlink r:id="rId241">
         <w:r>
           <w:rPr>
             <w:rStyle w:val="Hyperlink"/>
@@ -8124,8 +8205,8 @@
         <w:t xml:space="preserve">.</w:t>
       </w:r>
     </w:p>
-    <w:bookmarkEnd w:id="238"/>
-    <w:bookmarkStart w:id="239" w:name="ref-Cavalli_Sforza_Feldman_1981"/>
+    <w:bookmarkEnd w:id="242"/>
+    <w:bookmarkStart w:id="243" w:name="ref-Cavalli_Sforza_Feldman_1981"/>
     <w:p>
       <w:pPr>
         <w:pStyle w:val="Bibliography"/>
@@ -8143,8 +8224,8 @@
         <w:t xml:space="preserve">Cavalli-Sforza L, Feldman MW. Cultural transmission and evolution: A quantitative approach. Princeton University Press; 1981.</w:t>
       </w:r>
     </w:p>
-    <w:bookmarkEnd w:id="239"/>
-    <w:bookmarkStart w:id="240" w:name="ref-Boyd_Richerson_1985"/>
+    <w:bookmarkEnd w:id="243"/>
+    <w:bookmarkStart w:id="244" w:name="ref-Boyd_Richerson_1985"/>
     <w:p>
       <w:pPr>
         <w:pStyle w:val="Bibliography"/>
@@ -8162,8 +8243,8 @@
         <w:t xml:space="preserve">Boyd R, Richerson PJ. Culture and the evolutionary process. University of Chicago Press; 1985.</w:t>
       </w:r>
     </w:p>
-    <w:bookmarkEnd w:id="240"/>
-    <w:bookmarkStart w:id="241" w:name="ref-Richerson_Boyd_2005"/>
+    <w:bookmarkEnd w:id="244"/>
+    <w:bookmarkStart w:id="245" w:name="ref-Richerson_Boyd_2005"/>
     <w:p>
       <w:pPr>
         <w:pStyle w:val="Bibliography"/>
@@ -8181,8 +8262,8 @@
         <w:t xml:space="preserve">Richerson PJ, Boyd R. Not by genes alone: How culture transformed human evolution. University of Chicago Press; 2005.</w:t>
       </w:r>
     </w:p>
-    <w:bookmarkEnd w:id="241"/>
-    <w:bookmarkStart w:id="243" w:name="ref-Henrich_2004"/>
+    <w:bookmarkEnd w:id="245"/>
+    <w:bookmarkStart w:id="247" w:name="ref-Henrich_2004"/>
     <w:p>
       <w:pPr>
         <w:pStyle w:val="Bibliography"/>
@@ -8208,7 +8289,7 @@
       <w:r>
         <w:t xml:space="preserve"> </w:t>
       </w:r>
-      <w:hyperlink r:id="rId242">
+      <w:hyperlink r:id="rId246">
         <w:r>
           <w:rPr>
             <w:rStyle w:val="Hyperlink"/>
@@ -8220,8 +8301,8 @@
         <w:t xml:space="preserve">.</w:t>
       </w:r>
     </w:p>
-    <w:bookmarkEnd w:id="243"/>
-    <w:bookmarkStart w:id="245" w:name="ref-Migliano_2020"/>
+    <w:bookmarkEnd w:id="247"/>
+    <w:bookmarkStart w:id="249" w:name="ref-Migliano_2020"/>
     <w:p>
       <w:pPr>
         <w:pStyle w:val="Bibliography"/>
@@ -8241,7 +8322,7 @@
       <w:r>
         <w:t xml:space="preserve"> </w:t>
       </w:r>
-      <w:hyperlink r:id="rId244">
+      <w:hyperlink r:id="rId248">
         <w:r>
           <w:rPr>
             <w:rStyle w:val="Hyperlink"/>
@@ -8253,8 +8334,8 @@
         <w:t xml:space="preserve">.</w:t>
       </w:r>
     </w:p>
-    <w:bookmarkEnd w:id="245"/>
-    <w:bookmarkStart w:id="247" w:name="ref-Romano_Lozano_2020"/>
+    <w:bookmarkEnd w:id="249"/>
+    <w:bookmarkStart w:id="251" w:name="ref-Romano_Lozano_2020"/>
     <w:p>
       <w:pPr>
         <w:pStyle w:val="Bibliography"/>
@@ -8274,7 +8355,7 @@
       <w:r>
         <w:t xml:space="preserve"> </w:t>
       </w:r>
-      <w:hyperlink r:id="rId246">
+      <w:hyperlink r:id="rId250">
         <w:r>
           <w:rPr>
             <w:rStyle w:val="Hyperlink"/>
@@ -8286,8 +8367,8 @@
         <w:t xml:space="preserve">.</w:t>
       </w:r>
     </w:p>
-    <w:bookmarkEnd w:id="247"/>
-    <w:bookmarkStart w:id="249" w:name="ref-Buchanan_Hamilton_2023"/>
+    <w:bookmarkEnd w:id="251"/>
+    <w:bookmarkStart w:id="253" w:name="ref-Buchanan_Hamilton_2023"/>
     <w:p>
       <w:pPr>
         <w:pStyle w:val="Bibliography"/>
@@ -8307,7 +8388,7 @@
       <w:r>
         <w:t xml:space="preserve"> </w:t>
       </w:r>
-      <w:hyperlink r:id="rId248">
+      <w:hyperlink r:id="rId252">
         <w:r>
           <w:rPr>
             <w:rStyle w:val="Hyperlink"/>
@@ -8319,8 +8400,8 @@
         <w:t xml:space="preserve">.</w:t>
       </w:r>
     </w:p>
-    <w:bookmarkEnd w:id="249"/>
-    <w:bookmarkStart w:id="251" w:name="ref-CucartMora_2022"/>
+    <w:bookmarkEnd w:id="253"/>
+    <w:bookmarkStart w:id="255" w:name="ref-CucartMora_2022"/>
     <w:p>
       <w:pPr>
         <w:pStyle w:val="Bibliography"/>
@@ -8370,7 +8451,7 @@
       <w:r>
         <w:t xml:space="preserve"> </w:t>
       </w:r>
-      <w:hyperlink r:id="rId250">
+      <w:hyperlink r:id="rId254">
         <w:r>
           <w:rPr>
             <w:rStyle w:val="Hyperlink"/>
@@ -8382,8 +8463,8 @@
         <w:t xml:space="preserve">.</w:t>
       </w:r>
     </w:p>
-    <w:bookmarkEnd w:id="251"/>
-    <w:bookmarkStart w:id="253" w:name="ref-Eerkens_Lipo_2005"/>
+    <w:bookmarkEnd w:id="255"/>
+    <w:bookmarkStart w:id="257" w:name="ref-Eerkens_Lipo_2005"/>
     <w:p>
       <w:pPr>
         <w:pStyle w:val="Bibliography"/>
@@ -8403,7 +8484,7 @@
       <w:r>
         <w:t xml:space="preserve"> </w:t>
       </w:r>
-      <w:hyperlink r:id="rId252">
+      <w:hyperlink r:id="rId256">
         <w:r>
           <w:rPr>
             <w:rStyle w:val="Hyperlink"/>
@@ -8415,8 +8496,8 @@
         <w:t xml:space="preserve">.</w:t>
       </w:r>
     </w:p>
-    <w:bookmarkEnd w:id="253"/>
-    <w:bookmarkStart w:id="255" w:name="ref-Intxaurbe_2026"/>
+    <w:bookmarkEnd w:id="257"/>
+    <w:bookmarkStart w:id="259" w:name="ref-Intxaurbe_2026"/>
     <w:p>
       <w:pPr>
         <w:pStyle w:val="Bibliography"/>
@@ -8454,7 +8535,7 @@
       <w:r>
         <w:t xml:space="preserve"> </w:t>
       </w:r>
-      <w:hyperlink r:id="rId254">
+      <w:hyperlink r:id="rId258">
         <w:r>
           <w:rPr>
             <w:rStyle w:val="Hyperlink"/>
@@ -8466,8 +8547,8 @@
         <w:t xml:space="preserve">.</w:t>
       </w:r>
     </w:p>
-    <w:bookmarkEnd w:id="255"/>
-    <w:bookmarkStart w:id="257" w:name="ref-Bentz_Dutkiewicz_2026"/>
+    <w:bookmarkEnd w:id="259"/>
+    <w:bookmarkStart w:id="261" w:name="ref-Bentz_Dutkiewicz_2026"/>
     <w:p>
       <w:pPr>
         <w:pStyle w:val="Bibliography"/>
@@ -8487,7 +8568,7 @@
       <w:r>
         <w:t xml:space="preserve"> </w:t>
       </w:r>
-      <w:hyperlink r:id="rId256">
+      <w:hyperlink r:id="rId260">
         <w:r>
           <w:rPr>
             <w:rStyle w:val="Hyperlink"/>
@@ -8499,8 +8580,8 @@
         <w:t xml:space="preserve">.</w:t>
       </w:r>
     </w:p>
-    <w:bookmarkEnd w:id="257"/>
-    <w:bookmarkStart w:id="259" w:name="ref-Bacon_2023"/>
+    <w:bookmarkEnd w:id="261"/>
+    <w:bookmarkStart w:id="263" w:name="ref-Bacon_2023"/>
     <w:p>
       <w:pPr>
         <w:pStyle w:val="Bibliography"/>
@@ -8532,7 +8613,7 @@
       <w:r>
         <w:t xml:space="preserve"> </w:t>
       </w:r>
-      <w:hyperlink r:id="rId258">
+      <w:hyperlink r:id="rId262">
         <w:r>
           <w:rPr>
             <w:rStyle w:val="Hyperlink"/>
@@ -8544,8 +8625,8 @@
         <w:t xml:space="preserve">.</w:t>
       </w:r>
     </w:p>
-    <w:bookmarkEnd w:id="259"/>
-    <w:bookmarkStart w:id="261" w:name="Xa4990169aeb885a690070ab4fd90972c31994f8"/>
+    <w:bookmarkEnd w:id="263"/>
+    <w:bookmarkStart w:id="265" w:name="Xa4990169aeb885a690070ab4fd90972c31994f8"/>
     <w:p>
       <w:pPr>
         <w:pStyle w:val="Bibliography"/>
@@ -8577,7 +8658,7 @@
       <w:r>
         <w:t xml:space="preserve"> </w:t>
       </w:r>
-      <w:hyperlink r:id="rId260">
+      <w:hyperlink r:id="rId264">
         <w:r>
           <w:rPr>
             <w:rStyle w:val="Hyperlink"/>
@@ -8589,8 +8670,8 @@
         <w:t xml:space="preserve">.</w:t>
       </w:r>
     </w:p>
-    <w:bookmarkEnd w:id="261"/>
-    <w:bookmarkStart w:id="263" w:name="X8ea620419c64d551554c48b7075c9934881930b"/>
+    <w:bookmarkEnd w:id="265"/>
+    <w:bookmarkStart w:id="267" w:name="X8ea620419c64d551554c48b7075c9934881930b"/>
     <w:p>
       <w:pPr>
         <w:pStyle w:val="Bibliography"/>
@@ -8646,7 +8727,7 @@
       <w:r>
         <w:t xml:space="preserve"> </w:t>
       </w:r>
-      <w:hyperlink r:id="rId262">
+      <w:hyperlink r:id="rId266">
         <w:r>
           <w:rPr>
             <w:rStyle w:val="Hyperlink"/>
@@ -8658,8 +8739,8 @@
         <w:t xml:space="preserve">.</w:t>
       </w:r>
     </w:p>
-    <w:bookmarkEnd w:id="263"/>
-    <w:bookmarkStart w:id="265" w:name="ref-Magli_2024"/>
+    <w:bookmarkEnd w:id="267"/>
+    <w:bookmarkStart w:id="269" w:name="ref-Magli_2024"/>
     <w:p>
       <w:pPr>
         <w:pStyle w:val="Bibliography"/>
@@ -8691,7 +8772,7 @@
       <w:r>
         <w:t xml:space="preserve"> </w:t>
       </w:r>
-      <w:hyperlink r:id="rId264">
+      <w:hyperlink r:id="rId268">
         <w:r>
           <w:rPr>
             <w:rStyle w:val="Hyperlink"/>
@@ -8703,8 +8784,8 @@
         <w:t xml:space="preserve">.</w:t>
       </w:r>
     </w:p>
-    <w:bookmarkEnd w:id="265"/>
-    <w:bookmarkStart w:id="267" w:name="ref-Nowell_2024_evidence"/>
+    <w:bookmarkEnd w:id="269"/>
+    <w:bookmarkStart w:id="271" w:name="ref-Nowell_2024_evidence"/>
     <w:p>
       <w:pPr>
         <w:pStyle w:val="Bibliography"/>
@@ -8736,7 +8817,7 @@
       <w:r>
         <w:t xml:space="preserve"> </w:t>
       </w:r>
-      <w:hyperlink r:id="rId266">
+      <w:hyperlink r:id="rId270">
         <w:r>
           <w:rPr>
             <w:rStyle w:val="Hyperlink"/>
@@ -8748,8 +8829,8 @@
         <w:t xml:space="preserve">.</w:t>
       </w:r>
     </w:p>
-    <w:bookmarkEnd w:id="267"/>
-    <w:bookmarkStart w:id="269" w:name="ref-Horiuchi_Takakura_2019"/>
+    <w:bookmarkEnd w:id="271"/>
+    <w:bookmarkStart w:id="273" w:name="ref-Horiuchi_Takakura_2019"/>
     <w:p>
       <w:pPr>
         <w:pStyle w:val="Bibliography"/>
@@ -8808,7 +8889,7 @@
       <w:r>
         <w:t xml:space="preserve"> </w:t>
       </w:r>
-      <w:hyperlink r:id="rId268">
+      <w:hyperlink r:id="rId272">
         <w:r>
           <w:rPr>
             <w:rStyle w:val="Hyperlink"/>
@@ -8820,8 +8901,8 @@
         <w:t xml:space="preserve">.</w:t>
       </w:r>
     </w:p>
-    <w:bookmarkEnd w:id="269"/>
-    <w:bookmarkStart w:id="270" w:name="ref-Rogers_2018"/>
+    <w:bookmarkEnd w:id="273"/>
+    <w:bookmarkStart w:id="274" w:name="ref-Rogers_2018"/>
     <w:p>
       <w:pPr>
         <w:pStyle w:val="Bibliography"/>
@@ -8869,8 +8950,8 @@
         <w:t xml:space="preserve">: An analysis of marine shell ornament distribution. Master’s thesis. University of Victoria, 2018.</w:t>
       </w:r>
     </w:p>
-    <w:bookmarkEnd w:id="270"/>
-    <w:bookmarkStart w:id="272" w:name="X94f875be1b7e5d23641daff5d53857bec24e739"/>
+    <w:bookmarkEnd w:id="274"/>
+    <w:bookmarkStart w:id="276" w:name="X94f875be1b7e5d23641daff5d53857bec24e739"/>
     <w:p>
       <w:pPr>
         <w:pStyle w:val="Bibliography"/>
@@ -8932,7 +9013,7 @@
       <w:r>
         <w:t xml:space="preserve"> </w:t>
       </w:r>
-      <w:hyperlink r:id="rId271">
+      <w:hyperlink r:id="rId275">
         <w:r>
           <w:rPr>
             <w:rStyle w:val="Hyperlink"/>
@@ -8944,8 +9025,8 @@
         <w:t xml:space="preserve">.</w:t>
       </w:r>
     </w:p>
-    <w:bookmarkEnd w:id="272"/>
-    <w:bookmarkStart w:id="274" w:name="ref-Gamble_1982"/>
+    <w:bookmarkEnd w:id="276"/>
+    <w:bookmarkStart w:id="278" w:name="ref-Gamble_1982"/>
     <w:p>
       <w:pPr>
         <w:pStyle w:val="Bibliography"/>
@@ -8977,7 +9058,7 @@
       <w:r>
         <w:t xml:space="preserve"> </w:t>
       </w:r>
-      <w:hyperlink r:id="rId273">
+      <w:hyperlink r:id="rId277">
         <w:r>
           <w:rPr>
             <w:rStyle w:val="Hyperlink"/>
@@ -8989,8 +9070,8 @@
         <w:t xml:space="preserve">.</w:t>
       </w:r>
     </w:p>
-    <w:bookmarkEnd w:id="274"/>
-    <w:bookmarkStart w:id="276" w:name="Xba346573845225b1b1d5ef358e2fea0d893a789"/>
+    <w:bookmarkEnd w:id="278"/>
+    <w:bookmarkStart w:id="280" w:name="Xba346573845225b1b1d5ef358e2fea0d893a789"/>
     <w:p>
       <w:pPr>
         <w:pStyle w:val="Bibliography"/>
@@ -9034,7 +9115,7 @@
       <w:r>
         <w:t xml:space="preserve"> </w:t>
       </w:r>
-      <w:hyperlink r:id="rId275">
+      <w:hyperlink r:id="rId279">
         <w:r>
           <w:rPr>
             <w:rStyle w:val="Hyperlink"/>
@@ -9046,8 +9127,8 @@
         <w:t xml:space="preserve">.</w:t>
       </w:r>
     </w:p>
-    <w:bookmarkEnd w:id="276"/>
-    <w:bookmarkStart w:id="278" w:name="ref-Creanza_Kolodny_Feldman_2017"/>
+    <w:bookmarkEnd w:id="280"/>
+    <w:bookmarkStart w:id="282" w:name="ref-Creanza_Kolodny_Feldman_2017"/>
     <w:p>
       <w:pPr>
         <w:pStyle w:val="Bibliography"/>
@@ -9067,7 +9148,7 @@
       <w:r>
         <w:t xml:space="preserve"> </w:t>
       </w:r>
-      <w:hyperlink r:id="rId277">
+      <w:hyperlink r:id="rId281">
         <w:r>
           <w:rPr>
             <w:rStyle w:val="Hyperlink"/>
@@ -9079,8 +9160,8 @@
         <w:t xml:space="preserve">.</w:t>
       </w:r>
     </w:p>
-    <w:bookmarkEnd w:id="278"/>
-    <w:bookmarkStart w:id="280" w:name="ref-Cullen_1996"/>
+    <w:bookmarkEnd w:id="282"/>
+    <w:bookmarkStart w:id="284" w:name="ref-Cullen_1996"/>
     <w:p>
       <w:pPr>
         <w:pStyle w:val="Bibliography"/>
@@ -9100,7 +9181,7 @@
       <w:r>
         <w:t xml:space="preserve"> </w:t>
       </w:r>
-      <w:hyperlink r:id="rId279">
+      <w:hyperlink r:id="rId283">
         <w:r>
           <w:rPr>
             <w:rStyle w:val="Hyperlink"/>
@@ -9112,8 +9193,8 @@
         <w:t xml:space="preserve">.</w:t>
       </w:r>
     </w:p>
-    <w:bookmarkEnd w:id="280"/>
-    <w:bookmarkStart w:id="282" w:name="ref-Hill_Wood_Baggio_Hurtado_Boyd_2014"/>
+    <w:bookmarkEnd w:id="284"/>
+    <w:bookmarkStart w:id="286" w:name="ref-Hill_Wood_Baggio_Hurtado_Boyd_2014"/>
     <w:p>
       <w:pPr>
         <w:pStyle w:val="Bibliography"/>
@@ -9133,7 +9214,7 @@
       <w:r>
         <w:t xml:space="preserve"> </w:t>
       </w:r>
-      <w:hyperlink r:id="rId281">
+      <w:hyperlink r:id="rId285">
         <w:r>
           <w:rPr>
             <w:rStyle w:val="Hyperlink"/>
@@ -9145,8 +9226,8 @@
         <w:t xml:space="preserve">.</w:t>
       </w:r>
     </w:p>
-    <w:bookmarkEnd w:id="282"/>
-    <w:bookmarkStart w:id="284" w:name="ref-Derex_Boyd_2016"/>
+    <w:bookmarkEnd w:id="286"/>
+    <w:bookmarkStart w:id="288" w:name="ref-Derex_Boyd_2016"/>
     <w:p>
       <w:pPr>
         <w:pStyle w:val="Bibliography"/>
@@ -9166,7 +9247,7 @@
       <w:r>
         <w:t xml:space="preserve"> </w:t>
       </w:r>
-      <w:hyperlink r:id="rId283">
+      <w:hyperlink r:id="rId287">
         <w:r>
           <w:rPr>
             <w:rStyle w:val="Hyperlink"/>
@@ -9178,8 +9259,8 @@
         <w:t xml:space="preserve">.</w:t>
       </w:r>
     </w:p>
-    <w:bookmarkEnd w:id="284"/>
-    <w:bookmarkStart w:id="285" w:name="ref-Von_Petzinger_2009"/>
+    <w:bookmarkEnd w:id="288"/>
+    <w:bookmarkStart w:id="289" w:name="ref-Von_Petzinger_2009"/>
     <w:p>
       <w:pPr>
         <w:pStyle w:val="Bibliography"/>
@@ -9215,8 +9296,8 @@
         <w:t xml:space="preserve">parietal art. Master’s thesis. University of Victoria, 2009.</w:t>
       </w:r>
     </w:p>
-    <w:bookmarkEnd w:id="285"/>
-    <w:bookmarkStart w:id="287" w:name="ref-Herskind2023"/>
+    <w:bookmarkEnd w:id="289"/>
+    <w:bookmarkStart w:id="291" w:name="ref-Herskind2023"/>
     <w:p>
       <w:pPr>
         <w:pStyle w:val="Bibliography"/>
@@ -9236,7 +9317,7 @@
       <w:r>
         <w:t xml:space="preserve"> </w:t>
       </w:r>
-      <w:hyperlink r:id="rId286">
+      <w:hyperlink r:id="rId290">
         <w:r>
           <w:rPr>
             <w:rStyle w:val="Hyperlink"/>
@@ -9248,8 +9329,8 @@
         <w:t xml:space="preserve">.</w:t>
       </w:r>
     </w:p>
-    <w:bookmarkEnd w:id="287"/>
-    <w:bookmarkStart w:id="289" w:name="ref-Gravel-Miguel_Coward_2023"/>
+    <w:bookmarkEnd w:id="291"/>
+    <w:bookmarkStart w:id="293" w:name="ref-Gravel-Miguel_Coward_2023"/>
     <w:p>
       <w:pPr>
         <w:pStyle w:val="Bibliography"/>
@@ -9281,7 +9362,7 @@
       <w:r>
         <w:t xml:space="preserve"> </w:t>
       </w:r>
-      <w:hyperlink r:id="rId288">
+      <w:hyperlink r:id="rId292">
         <w:r>
           <w:rPr>
             <w:rStyle w:val="Hyperlink"/>
@@ -9293,8 +9374,8 @@
         <w:t xml:space="preserve">.</w:t>
       </w:r>
     </w:p>
-    <w:bookmarkEnd w:id="289"/>
-    <w:bookmarkStart w:id="291" w:name="X42e36537dda68556aeacf852410efd6ac3bb1ca"/>
+    <w:bookmarkEnd w:id="293"/>
+    <w:bookmarkStart w:id="295" w:name="X42e36537dda68556aeacf852410efd6ac3bb1ca"/>
     <w:p>
       <w:pPr>
         <w:pStyle w:val="Bibliography"/>
@@ -9314,7 +9395,7 @@
       <w:r>
         <w:t xml:space="preserve"> </w:t>
       </w:r>
-      <w:hyperlink r:id="rId290">
+      <w:hyperlink r:id="rId294">
         <w:r>
           <w:rPr>
             <w:rStyle w:val="Hyperlink"/>
@@ -9326,8 +9407,8 @@
         <w:t xml:space="preserve">.</w:t>
       </w:r>
     </w:p>
-    <w:bookmarkEnd w:id="291"/>
-    <w:bookmarkStart w:id="293" w:name="ref-Chiotti_2005"/>
+    <w:bookmarkEnd w:id="295"/>
+    <w:bookmarkStart w:id="297" w:name="ref-Chiotti_2005"/>
     <w:p>
       <w:pPr>
         <w:pStyle w:val="Bibliography"/>
@@ -9374,7 +9455,7 @@
       <w:r>
         <w:t xml:space="preserve"> </w:t>
       </w:r>
-      <w:hyperlink r:id="rId292">
+      <w:hyperlink r:id="rId296">
         <w:r>
           <w:rPr>
             <w:rStyle w:val="Hyperlink"/>
@@ -9386,8 +9467,8 @@
         <w:t xml:space="preserve">.</w:t>
       </w:r>
     </w:p>
-    <w:bookmarkEnd w:id="293"/>
-    <w:bookmarkStart w:id="295" w:name="ref-Higham_Abri_Pataud_2011"/>
+    <w:bookmarkEnd w:id="297"/>
+    <w:bookmarkStart w:id="299" w:name="ref-Higham_Abri_Pataud_2011"/>
     <w:p>
       <w:pPr>
         <w:pStyle w:val="Bibliography"/>
@@ -9446,7 +9527,7 @@
       <w:r>
         <w:t xml:space="preserve"> </w:t>
       </w:r>
-      <w:hyperlink r:id="rId294">
+      <w:hyperlink r:id="rId298">
         <w:r>
           <w:rPr>
             <w:rStyle w:val="Hyperlink"/>
@@ -9458,8 +9539,8 @@
         <w:t xml:space="preserve">.</w:t>
       </w:r>
     </w:p>
-    <w:bookmarkEnd w:id="295"/>
-    <w:bookmarkStart w:id="297" w:name="ref-Talamo_La_Ferrassie_2020"/>
+    <w:bookmarkEnd w:id="299"/>
+    <w:bookmarkStart w:id="301" w:name="ref-Talamo_La_Ferrassie_2020"/>
     <w:p>
       <w:pPr>
         <w:pStyle w:val="Bibliography"/>
@@ -9560,7 +9641,7 @@
       <w:r>
         <w:t xml:space="preserve"> </w:t>
       </w:r>
-      <w:hyperlink r:id="rId296">
+      <w:hyperlink r:id="rId300">
         <w:r>
           <w:rPr>
             <w:rStyle w:val="Hyperlink"/>
@@ -9572,8 +9653,8 @@
         <w:t xml:space="preserve">.</w:t>
       </w:r>
     </w:p>
-    <w:bookmarkEnd w:id="297"/>
-    <w:bookmarkStart w:id="299" w:name="ref-Wild_et_al_2005"/>
+    <w:bookmarkEnd w:id="301"/>
+    <w:bookmarkStart w:id="303" w:name="ref-Wild_et_al_2005"/>
     <w:p>
       <w:pPr>
         <w:pStyle w:val="Bibliography"/>
@@ -9629,7 +9710,7 @@
       <w:r>
         <w:t xml:space="preserve"> </w:t>
       </w:r>
-      <w:hyperlink r:id="rId298">
+      <w:hyperlink r:id="rId302">
         <w:r>
           <w:rPr>
             <w:rStyle w:val="Hyperlink"/>
@@ -9641,8 +9722,8 @@
         <w:t xml:space="preserve">.</w:t>
       </w:r>
     </w:p>
-    <w:bookmarkEnd w:id="299"/>
-    <w:bookmarkStart w:id="301" w:name="ref-Schurch_Conard_2026_reassess"/>
+    <w:bookmarkEnd w:id="303"/>
+    <w:bookmarkStart w:id="305" w:name="ref-Schurch_Conard_2026_reassess"/>
     <w:p>
       <w:pPr>
         <w:pStyle w:val="Bibliography"/>
@@ -9677,7 +9758,7 @@
       <w:r>
         <w:t xml:space="preserve"> </w:t>
       </w:r>
-      <w:hyperlink r:id="rId300">
+      <w:hyperlink r:id="rId304">
         <w:r>
           <w:rPr>
             <w:rStyle w:val="Hyperlink"/>
@@ -9689,9 +9770,9 @@
         <w:t xml:space="preserve">.</w:t>
       </w:r>
     </w:p>
-    <w:bookmarkEnd w:id="301"/>
-    <w:bookmarkEnd w:id="302"/>
-    <w:bookmarkEnd w:id="303"/>
+    <w:bookmarkEnd w:id="305"/>
+    <w:bookmarkEnd w:id="306"/>
+    <w:bookmarkEnd w:id="307"/>
     <w:sectPr>
       <w:footnotePr>
         <w:numRestart w:val="eachSect"/>

</xml_diff>

<commit_message>
try quarto cross-refs across multiple files so we can use quart to manage S1 and S2 cross-refs in paper.qmd
</commit_message>
<xml_diff>
--- a/paper/paper.docx
+++ b/paper/paper.docx
@@ -275,7 +275,7 @@
         <w:t xml:space="preserve"> </w:t>
       </w:r>
       <w:r>
-        <w:t xml:space="preserve">into Western Eurasia, yet the evolution of social organization during this transition remains debated. Here we investigate social dynamics through the analysis of geometric signs on mobile objects within a two-phase framework based on specialist technological attributions in site assignment. Using seriation and network analyses, we examine patterns of sign production in each phase, and investigate how the sign-sharing network differs between the Early and Late Aurignacian. Within the early phase (Aur-P1; 20 sites) we hypothesize a two-group structure of restricted versus broad geometric-sign repertoires. Stochastic block modelling recovers the restricted/broad split as its two largest blocks in Aur-P1, while selecting a single block in Aur-P2; but the richness gap between the groups is not distinguishable from a group difference once the saturating richness–effort relationship is modelled. Despite differences in network size between phases, permutation tests show no evidence for meaningful differences in overall connectivity, community structure, or centrality patterns. Mantel tests did not detect a significant correlation between geographic distance and sign distribution in either phase, and the isolation-by-distance relationship does not differ between them, but bootstrap confidence intervals indicate these tests are underpowered at these sample sizes. We find no statistically significant evidence in the SignBase sample for discrete geographically structured groups of Aurignacian geometric signs analogous to those claimed for personal ornaments.</w:t>
+        <w:t xml:space="preserve">into Western Eurasia, yet the evolution of social organization during this transition remains debated. Here we investigate social dynamics through the analysis of geometric signs on mobile objects within a two-phase framework based on specialist technological attributions in site assignment. Using seriation and network analyses, we examine patterns of sign production in each phase, and investigate how the sign-sharing network differs between the Early and Late Aurignacian. Within the early phase (Aur-P1; 20 sites) we hypothesize a two-group structure of restricted versus broad geometric-sign repertoires. Stochastic block modelling finds that the richness gap between the groups is not distinguishable from a group difference, considering the saturating richness–effort relationship. Despite differences in network size between phases, permutation tests show no evidence for meaningful differences in overall connectivity, community structure, or centrality patterns. Mantel tests did not detect a significant correlation between geographic distance and sign distribution in either phase, and the isolation-by-distance relationship does not differ between them, but bootstrap confidence intervals indicate these tests are underpowered at these sample sizes. We find no statistically significant evidence in the SignBase sample for discrete geographically structured groups of Aurignacian geometric signs analogous to those claimed for personal ornaments.</w:t>
       </w:r>
     </w:p>
     <w:p>
@@ -1105,25 +1105,13 @@
         <w:t xml:space="preserve"> </w:t>
       </w:r>
       <w:r>
-        <w:t xml:space="preserve">with the IntCal20 calibration curve. The calibrated radiocarbon dates of the sampled data range from approximately 33 to 45 ka cal BP, spanning an overall time range of 12 ka. The Aur-P1 phase has 20 sites and 26 sign types, and the Aur-P2 phase has 9 sites and 15 sign types. A Mantel test to evaluate the correlation between distance in time and distribution of sign types found a weak but nominally statistically significant correlation (R = 0.062, p = 0.004). The very small effect size (R ≈ 0.06) indicates that temporal distance explains only a small fraction of the variation in sign-type distribution. This weak association shows only that time has little explanatory power for sign composition; it does not demonstrate whether substantial change in sign types did or did not occur through time. We tested this inference more directly with a time-lag analysis (S1</w:t>
-      </w:r>
-      <w:r>
-        <w:t xml:space="preserve"> </w:t>
-      </w:r>
-      <w:r>
-        <w:t xml:space="preserve">“</w:t>
-      </w:r>
-      <w:r>
-        <w:t xml:space="preserve">Sensitivity Analyses</w:t>
-      </w:r>
-      <w:r>
-        <w:t xml:space="preserve">”</w:t>
-      </w:r>
-      <w:r>
-        <w:t xml:space="preserve"> </w:t>
-      </w:r>
-      <w:r>
-        <w:t xml:space="preserve">§S1.8.3): we binned all 28 sites (378 site pairs) by their absolute temporal separation (|ΔMedianBP|) to see if Jaccard sign dissimilarity rises with lag. It does not: the Spearman correlation between temporal lag and dissimilarity is -0.04 (p = 0.39) overall and -0.04 (p = 0.58) within phase. Sites in different phases are no more dissimilar (mean Jaccard 0.73) than sites within the same phase (0.76). As with the temporal Mantel, this flat trend is a lack of evidence for time-structured change in sign repertoires, not evidence that change was absent.</w:t>
+        <w:t xml:space="preserve">with the IntCal20 calibration curve. The calibrated radiocarbon dates of the sampled data range from approximately 33 to 45 ka cal BP, spanning an overall time range of 12 ka. The Aur-P1 phase has 20 sites and 26 sign types, and the Aur-P2 phase has 9 sites and 15 sign types. A Mantel test to evaluate the correlation between distance in time and distribution of sign types found a weak but nominally statistically significant correlation (R = 0.062, p = 0.004). The very small effect size (R ≈ 0.06) indicates that temporal distance explains only a small fraction of the variation in sign-type distribution. This weak association shows only that time has little explanatory power for sign composition; it does not demonstrate whether substantial change in sign types did or did not occur through time. We tested this inference more directly with a time-lag analysis (S1 §</w:t>
+      </w:r>
+      <w:r>
+        <w:t xml:space="preserve">S1.8.3</w:t>
+      </w:r>
+      <w:r>
+        <w:t xml:space="preserve">): we binned all 28 sites (378 site pairs) by their absolute temporal separation (|ΔMedianBP|) to see if Jaccard sign dissimilarity rises with lag. It does not: the Spearman correlation between temporal lag and dissimilarity is -0.04 (p = 0.39) overall and -0.04 (p = 0.58) within phase. Sites in different phases are no more dissimilar (mean Jaccard 0.73) than sites within the same phase (0.76). As with the temporal Mantel, this flat trend is a lack of evidence for time-structured change in sign repertoires, not evidence that change was absent.</w:t>
       </w:r>
     </w:p>
     <w:bookmarkEnd w:id="28"/>
@@ -1188,22 +1176,7 @@
         <w:t xml:space="preserve">[31]</w:t>
       </w:r>
       <w:r>
-        <w:t xml:space="preserve">. The test showed no significant correlation between object abundance and sign type distribution (R = 0.151, p = 0.071), supporting our decision to use presence/absence data. Beyond presence/absence coding, we additionally tested the residual object-count confound directly at the object level via downsampling, coverage-based rarefaction, and a negative-binomial regression with log object count as a covariate (see our S1</w:t>
-      </w:r>
-      <w:r>
-        <w:t xml:space="preserve"> </w:t>
-      </w:r>
-      <w:r>
-        <w:t xml:space="preserve">“</w:t>
-      </w:r>
-      <w:r>
-        <w:t xml:space="preserve">Sensitivity Analyses</w:t>
-      </w:r>
-      <w:r>
-        <w:t xml:space="preserve">”</w:t>
-      </w:r>
-      <w:r>
-        <w:t xml:space="preserve">).</w:t>
+        <w:t xml:space="preserve">. The test showed no significant correlation between object abundance and sign type distribution (R = 0.151, p = 0.071), supporting our decision to use presence/absence data. Beyond presence/absence coding, we additionally tested the residual object-count confound directly at the object level via downsampling, coverage-based rarefaction, and a negative-binomial regression with log object count as a covariate (see our S1 ).</w:t>
       </w:r>
     </w:p>
     <w:p>
@@ -1243,58 +1216,19 @@
         </w:r>
       </w:hyperlink>
       <w:r>
-        <w:t xml:space="preserve">. None of the phases have a statistically significant correlation between sign type distribution and geographical distance, suggesting that isolation-by-distance alone does not fully account for the observed patterns, although this null result should be interpreted cautiously given the small sample sizes (see our S1</w:t>
-      </w:r>
-      <w:r>
-        <w:t xml:space="preserve"> </w:t>
-      </w:r>
-      <w:r>
-        <w:t xml:space="preserve">“</w:t>
-      </w:r>
-      <w:r>
-        <w:t xml:space="preserve">Sensitivity Analyses</w:t>
-      </w:r>
-      <w:r>
-        <w:t xml:space="preserve">”</w:t>
-      </w:r>
-      <w:r>
-        <w:t xml:space="preserve"> </w:t>
-      </w:r>
-      <w:r>
-        <w:t xml:space="preserve">§S1.7.5). To test whether the non-significant Mantel result reflects a particular alternative process, we additionally fit a multiple regression on distance matrices with sign dissimilarity as the response and geographic, temporal, and object-count distances as predictors (see our S1</w:t>
-      </w:r>
-      <w:r>
-        <w:t xml:space="preserve"> </w:t>
-      </w:r>
-      <w:r>
-        <w:t xml:space="preserve">“</w:t>
-      </w:r>
-      <w:r>
-        <w:t xml:space="preserve">Sensitivity Analyses</w:t>
-      </w:r>
-      <w:r>
-        <w:t xml:space="preserve">”</w:t>
-      </w:r>
-      <w:r>
-        <w:t xml:space="preserve"> </w:t>
-      </w:r>
-      <w:r>
-        <w:t xml:space="preserve">§S1.8.2). This reveals no candidate is significant, so the null Mantel does not identify any specific alternative process. A Mantel correlogram likewise did not detect spatial structure at any distance lag, and bootstrap confidence intervals on the Mantel R indicate the test is underpowered at these sample sizes, so the non-significant result is best read as a lack of evidence rather than evidence of absence (S1</w:t>
-      </w:r>
-      <w:r>
-        <w:t xml:space="preserve"> </w:t>
-      </w:r>
-      <w:r>
-        <w:t xml:space="preserve">“</w:t>
-      </w:r>
-      <w:r>
-        <w:t xml:space="preserve">Sensitivity Analyses</w:t>
-      </w:r>
-      <w:r>
-        <w:t xml:space="preserve">”</w:t>
-      </w:r>
-      <w:r>
-        <w:t xml:space="preserve">). As a non-Mantel check that fits an explanatory model rather than correlating two distance matrices, we additionally ran a distance-based redundancy analysis</w:t>
+        <w:t xml:space="preserve">. None of the phases have a statistically significant correlation between sign type distribution and geographical distance, suggesting that isolation-by-distance alone does not fully account for the observed patterns, although this null result should be interpreted cautiously given the small sample sizes (see our S1 §</w:t>
+      </w:r>
+      <w:r>
+        <w:t xml:space="preserve">S1.4.3</w:t>
+      </w:r>
+      <w:r>
+        <w:t xml:space="preserve">). To test whether the non-significant Mantel result reflects a particular alternative process, we additionally fit a multiple regression on distance matrices with sign dissimilarity as the response and geographic, temporal, and object-count distances as predictors (see our S1 §</w:t>
+      </w:r>
+      <w:r>
+        <w:t xml:space="preserve">S1.8.2</w:t>
+      </w:r>
+      <w:r>
+        <w:t xml:space="preserve">). This reveals no candidate is significant, so the null Mantel does not identify any specific alternative process. A Mantel correlogram likewise did not detect spatial structure at any distance lag, and bootstrap confidence intervals on the Mantel R indicate the test is underpowered at these sample sizes, so the non-significant result is best read as a lack of evidence rather than evidence of absence (S1 ). As a non-Mantel check that fits an explanatory model rather than correlating two distance matrices, we additionally ran a distance-based redundancy analysis</w:t>
       </w:r>
       <w:r>
         <w:t xml:space="preserve"> </w:t>
@@ -1572,25 +1506,22 @@
         <w:t xml:space="preserve">[36]</w:t>
       </w:r>
       <w:r>
-        <w:t xml:space="preserve">. Each node is a site, and each edge weight is the Jaccard similarity between the two sites’ sign-type presence/absence vectors, computed as 1 − Jaccard(dissimilarity) so that higher values mean more shared sign types. To avoid cluttering the graph, all edges below the value of 0.2 were removed: an edge is only drawn if two sites share ≥ 20% Jaccard similarity, i.e., the intersection of their sign types is at least 20% of their union. We justify this threshold and demonstrate its robustness through sensitivity analyses at alternative thresholds (0.1 and 0.3), alternative similarity metrics (Sørensen-Dice, Simpson), a continuous threshold sweep from 0.05 to 0.50, and quantitative edge-set and adjacency-matrix agreement metrics across thresholds (see our S1</w:t>
-      </w:r>
-      <w:r>
-        <w:t xml:space="preserve"> </w:t>
-      </w:r>
-      <w:r>
-        <w:t xml:space="preserve">“</w:t>
-      </w:r>
-      <w:r>
-        <w:t xml:space="preserve">Sensitivity Analyses</w:t>
-      </w:r>
-      <w:r>
-        <w:t xml:space="preserve">”</w:t>
-      </w:r>
-      <w:r>
-        <w:t xml:space="preserve"> </w:t>
-      </w:r>
-      <w:r>
-        <w:t xml:space="preserve">§S1.2 and §S1.3). Results were plotted with the Fruchterman-Reingold layout</w:t>
+        <w:t xml:space="preserve">. Each node is a site, and each edge weight is the Jaccard similarity between the two sites’ sign-type presence/absence vectors, computed as 1 − Jaccard(dissimilarity) so that higher values mean more shared sign types. To avoid cluttering the graph, all edges below the value of 0.2 were removed: an edge is only drawn if two sites share ≥ 20% Jaccard similarity, i.e., the intersection of their sign types is at least 20% of their union. We justify this threshold and demonstrate its robustness through sensitivity analyses at alternative thresholds (0.1 and 0.3), alternative similarity metrics (Sørensen-Dice, Simpson), a continuous threshold sweep from 0.05 to 0.50, and quantitative edge-set and adjacency-matrix agreement metrics across thresholds (see our S1 §</w:t>
+      </w:r>
+      <w:r>
+        <w:t xml:space="preserve">S1.2</w:t>
+      </w:r>
+      <w:r>
+        <w:t xml:space="preserve"> </w:t>
+      </w:r>
+      <w:r>
+        <w:t xml:space="preserve">and §</w:t>
+      </w:r>
+      <w:r>
+        <w:t xml:space="preserve">S1.3</w:t>
+      </w:r>
+      <w:r>
+        <w:t xml:space="preserve">). Results were plotted with the Fruchterman-Reingold layout</w:t>
       </w:r>
       <w:r>
         <w:t xml:space="preserve"> </w:t>
@@ -1694,25 +1625,7 @@
         <w:pStyle w:val="BodyText"/>
       </w:pPr>
       <w:r>
-        <w:t xml:space="preserve">Because the restricted/broad group assignments were derived from visual inspection of the seriation results using the same sign data tested here, the PerMANOVA p-values therefore cannot be presented as independent confirmation that the groups differ. Thus we interrogate these assignments with several additional cross-validation and permutation methods. These are described in our S1</w:t>
-      </w:r>
-      <w:r>
-        <w:t xml:space="preserve"> </w:t>
-      </w:r>
-      <w:r>
-        <w:t xml:space="preserve">“</w:t>
-      </w:r>
-      <w:r>
-        <w:t xml:space="preserve">Sensitivity Analyses</w:t>
-      </w:r>
-      <w:r>
-        <w:t xml:space="preserve">”</w:t>
-      </w:r>
-      <w:r>
-        <w:t xml:space="preserve"> </w:t>
-      </w:r>
-      <w:r>
-        <w:t xml:space="preserve">and reported briefly below.</w:t>
+        <w:t xml:space="preserve">Because the restricted/broad group assignments were derived from visual inspection of the seriation results using the same sign data tested here, the PerMANOVA p-values therefore cannot be presented as independent confirmation that the groups differ. Thus we interrogate these assignments with several additional cross-validation and permutation methods. These are described in our S1 and reported briefly below.</w:t>
       </w:r>
     </w:p>
     <w:bookmarkEnd w:id="31"/>
@@ -1919,7 +1832,13 @@
         <w:pStyle w:val="BodyText"/>
       </w:pPr>
       <w:r>
-        <w:t xml:space="preserve">To quantitatively evaluate the two-group hypothesis inferred from the seriation analysis, we used bootstrap resampling and stochastic block models, which we describe in detail in S1. Bootstrap resampling tests the stability of the two groups as an imposed partition. It shows that for Aur-P1, mean within-block co-clustering is 0.75 for the restricted-range block and 0.97 for the broader-range block, against 0.2 across the two blocks. The within-block values substantially exceed the across-block value, which is a signal that both groups are internally coherent and sharply separated. The strength of this signal is much lower for Aur-P2, where the pattern is 0.49 within the restricted block and 0.92 within the broader block, against 0.4 across the blocks. The stochastic block model analysis, which tests whether the proposed groups emerge as latent network communities without being supplied to the model in advance, shows that all three emission models select more than two blocks as optimal in Aur-P1: Bernoulli K = 3 (ICL = -110.1), Gaussian K = 4 (ICL = 73.5), Poisson K = 3 (ICL = -263.3). In each model the restricted/broad split is recovered as the two largest blocks; Bernoulli and Gaussian additionally isolate Labeko Koba, Les Cottés, and Trou al’Wesse as a small third block, while under Poisson the same two broad sites pair off and Grotte du Renne joins the large mixed block (S1 §S1.9.3). In Aur-P2 the Bernoulli and Poisson models select a single block and only the Gaussian model selects two blocks, by a marginal 0.9 ICL points. We therefore consider the restricted/broad division as a dominant axis of sign type composition variation (rich vs. poor sign repertoires) with a stable small-block refinement in Aur-P1, rather than an exact two-group partition.</w:t>
+        <w:t xml:space="preserve">To quantitatively evaluate the two-group hypothesis inferred from the seriation analysis, we used bootstrap resampling and stochastic block models, which we describe in detail in S1. Bootstrap resampling tests the stability of the two groups as an imposed partition. It shows that for Aur-P1, mean within-block co-clustering is 0.75 for the restricted-range block and 0.97 for the broader-range block, against 0.2 across the two blocks. The within-block values substantially exceed the across-block value, which is a signal that both groups are internally coherent and sharply separated. The strength of this signal is much lower for Aur-P2, where the pattern is 0.49 within the restricted block and 0.92 within the broader block, against 0.4 across the blocks. The stochastic block model analysis, which tests whether the proposed groups emerge as latent network communities without being supplied to the model in advance, shows that all three emission models select more than two blocks as optimal in Aur-P1: Bernoulli K = 3 (ICL = -110.1), Gaussian K = 4 (ICL = 73.5), Poisson K = 3 (ICL = -263.3). In each model the restricted/broad split is recovered as the two largest blocks; Bernoulli and Gaussian additionally isolate Labeko Koba, Les Cottés, and Trou al’Wesse as a small third block, while under Poisson the same two broad sites pair off and Grotte du Renne joins the large mixed block (S1 §</w:t>
+      </w:r>
+      <w:r>
+        <w:t xml:space="preserve">S1.9.3</w:t>
+      </w:r>
+      <w:r>
+        <w:t xml:space="preserve">). In Aur-P2 the Bernoulli and Poisson models select a single block and only the Gaussian model selects two blocks, by a marginal 0.9 ICL points. We therefore consider the restricted/broad division as a dominant axis of sign type composition variation (rich vs. poor sign repertoires) with a stable small-block refinement in Aur-P1, rather than an exact two-group partition.</w:t>
       </w:r>
     </w:p>
     <w:tbl>
@@ -2126,22 +2045,7 @@
         <w:pStyle w:val="BodyText"/>
       </w:pPr>
       <w:r>
-        <w:t xml:space="preserve">We assessed the sensitivity of our network analysis to site assignment criteria in three ways: (1) reverting to purely date-based assignment; (2) excluding Vogelherd entirely, as a site with an unusually large sign assemblage; (3) excluding figurines concentrated at Vogelherd (S1</w:t>
-      </w:r>
-      <w:r>
-        <w:t xml:space="preserve"> </w:t>
-      </w:r>
-      <w:r>
-        <w:t xml:space="preserve">“</w:t>
-      </w:r>
-      <w:r>
-        <w:t xml:space="preserve">Sensitivity Analyses</w:t>
-      </w:r>
-      <w:r>
-        <w:t xml:space="preserve">”</w:t>
-      </w:r>
-      <w:r>
-        <w:t xml:space="preserve">). Under all conditions, the Aur-P1 &gt; Aur-P2 connectivity ordering is preserved (Aur-P1 mean degree: 7.50 baseline, 7.26 no Vogelherd, 7.40 no figurines; Aur-P2: 4.22). Excluding Vogelherd reduces Aur-P1 edges by 8% and mean degree by 3.2%, but does not alter the phase contrast or the within-phase two-group pattern. Because the principal results are unchanged when Vogelherd is excluded entirely, our conclusions do not depend on its inclusion or on its precise archaeological attribution. That said, this connectivity ordering reflects Aur-P1’s larger site sample, not higher intrinsic connectivity (size-normalized MD ratios are ~1.0 for both phases, see S1).</w:t>
+        <w:t xml:space="preserve">We assessed the sensitivity of our network analysis to site assignment criteria in three ways: (1) reverting to purely date-based assignment; (2) excluding Vogelherd entirely, as a site with an unusually large sign assemblage; (3) excluding figurines concentrated at Vogelherd (S1 ). Under all conditions, the Aur-P1 &gt; Aur-P2 connectivity ordering is preserved (Aur-P1 mean degree: 7.50 baseline, 7.26 no Vogelherd, 7.40 no figurines; Aur-P2: 4.22). Excluding Vogelherd reduces Aur-P1 edges by 8% and mean degree by 3.2%, but does not alter the phase contrast or the within-phase two-group pattern. Because the principal results are unchanged when Vogelherd is excluded entirely, our conclusions do not depend on its inclusion or on its precise archaeological attribution. That said, this connectivity ordering reflects Aur-P1’s larger site sample, not higher intrinsic connectivity (size-normalized MD ratios are ~1.0 for both phases, see S1).</w:t>
       </w:r>
     </w:p>
     <w:tbl>
@@ -2246,19 +2150,10 @@
         </w:r>
       </w:hyperlink>
       <w:r>
-        <w:t xml:space="preserve">), perhaps due to the small numbers of sites in each phase . In Aur-P1, sites are distributed widely across Western and Central Europe, with some geographical overlapping between the restricted- and broad-range groups, consistent with the connectivity between sign-use groups evident in the network analysis. In Aur-P2, the surviving sites are more widely dispersed, though this reflects the much smaller sample of this phase. Partitions Around Medoids on geodesic distances between sites finds two groups as a parsimonious grouping for Aur-P1 only (S1</w:t>
-      </w:r>
-      <w:r>
-        <w:t xml:space="preserve"> </w:t>
-      </w:r>
-      <w:r>
-        <w:t xml:space="preserve">“</w:t>
-      </w:r>
-      <w:r>
-        <w:t xml:space="preserve">Sensitivity Analyses</w:t>
-      </w:r>
-      <w:r>
-        <w:t xml:space="preserve">”</w:t>
+        <w:t xml:space="preserve">), perhaps due to the small numbers of sites in each phase . In Aur-P1, sites are distributed widely across Western and Central Europe, with some geographical overlapping between the restricted- and broad-range groups, consistent with the connectivity between sign-use groups evident in the network analysis. In Aur-P2, the surviving sites are more widely dispersed, though this reflects the much smaller sample of this phase. Partitions Around Medoids on geodesic distances between sites finds two groups as a parsimonious grouping for Aur-P1 only (S1 §</w:t>
+      </w:r>
+      <w:r>
+        <w:t xml:space="preserve">S1.8.4</w:t>
       </w:r>
       <w:r>
         <w:t xml:space="preserve">). These two groups are roughly West versus Central Europe, separating the Dordogne bloc tradition from the Swabian ivory tradition, and likely reflective research effort history rather than past cultural groups.</w:t>
@@ -2542,7 +2437,25 @@
         </w:r>
       </w:hyperlink>
       <w:r>
-        <w:t xml:space="preserve">). However, this separation vanishes under Simpson turnover dissimilarity (which removes the nestedness/richness component), indicating the Jaccard signal comes from the nestedness component—rich versus poor repertoires—rather than by compositional turnover between the groups (S1). Beta dispersion analysis did not detect a significant difference in within-group dispersion in either phase; this does not establish equal dispersions, so the PerMANOVA results should be interpreted cautiously. Leave-one-out classification indicates that the labels vary smoothly across the Jaccard composition space rather than independently confirming a discrete partition, and the fixed-fixed Curveball test does not show that the optimised split exceeds richness-preserving expectations. Taken together, these results support the hypothesis of the restricted/broad pattern as a descriptive richness gradient that is strongest for well-sampled sites, and do not support the hypothesis of a discrete two-group structure.</w:t>
+        <w:t xml:space="preserve">). However, this separation vanishes under Simpson turnover dissimilarity (which removes the nestedness/richness component), indicating the Jaccard signal comes from the nestedness component—rich versus poor repertoires—rather than by compositional turnover between the groups (S1 §</w:t>
+      </w:r>
+      <w:r>
+        <w:t xml:space="preserve">S1.10.3</w:t>
+      </w:r>
+      <w:r>
+        <w:t xml:space="preserve">). Beta dispersion analysis did not detect a significant difference in within-group dispersion in either phase; this does not establish equal dispersions, so the PerMANOVA results should be interpreted cautiously. Leave-one-out classification indicates that the labels vary smoothly across the Jaccard composition space rather than independently confirming a discrete partition (S1 §</w:t>
+      </w:r>
+      <w:r>
+        <w:t xml:space="preserve">S1.10</w:t>
+      </w:r>
+      <w:r>
+        <w:t xml:space="preserve">), and the fixed-fixed Curveball test does not show that the optimised split exceeds richness-preserving expectations (S1 §</w:t>
+      </w:r>
+      <w:r>
+        <w:t xml:space="preserve">S1.10</w:t>
+      </w:r>
+      <w:r>
+        <w:t xml:space="preserve">). Taken together, these results support the hypothesis of the restricted/broad pattern as a descriptive richness gradient that is strongest for well-sampled sites, and do not support the hypothesis of a discrete two-group structure.</w:t>
       </w:r>
     </w:p>
     <w:bookmarkEnd w:id="52"/>
@@ -2615,22 +2528,13 @@
         <w:t xml:space="preserve"> </w:t>
       </w:r>
       <w:r>
-        <w:t xml:space="preserve">suggests apparent differences in connectivity between the phases. At first glance, Aur-P1 appears the more edge-rich network with the higher mean degree (7.50) and a hub structure centred on key sites, while Aur-P2 shows fewer edges and a lower mean degree (4.22). However, pairwise permutation tests indicate no significant phase differences in any network statistic (edge density, modularity, mean betweenness, or component count), and size-normalized mean degree ratios are equivalent (~1.0 for both phases; S1), indicating the Aur-P1–Aur-P2 contrast is a difference in network scale rather than in overall connectedness or community structure. An exploratory PerMANOVA returns a nominal separation of the restricted- and broad-range groups in Aur-P1 sign composition (R² = 0.196, p = 0.001) but not in Aur-P2 (R² = 0.223, p = 0.076), consistent with the smaller Aur-P2 sample. That said, our sensitivity analyses show that this result is best taken as a gradual axis of variation (see our S1</w:t>
-      </w:r>
-      <w:r>
-        <w:t xml:space="preserve"> </w:t>
-      </w:r>
-      <w:r>
-        <w:t xml:space="preserve">“</w:t>
-      </w:r>
-      <w:r>
-        <w:t xml:space="preserve">Sensitivity Analyses</w:t>
-      </w:r>
-      <w:r>
-        <w:t xml:space="preserve">”</w:t>
-      </w:r>
-      <w:r>
-        <w:t xml:space="preserve">).</w:t>
+        <w:t xml:space="preserve">suggests apparent differences in connectivity between the phases. At first glance, Aur-P1 appears the more edge-rich network with the higher mean degree (7.50) and a hub structure centred on key sites, while Aur-P2 shows fewer edges and a lower mean degree (4.22). However, pairwise permutation tests indicate no significant phase differences in any network statistic (edge density, modularity, mean betweenness, or component count), and size-normalized mean degree ratios are equivalent (~1.0 for both phases; S1 §</w:t>
+      </w:r>
+      <w:r>
+        <w:t xml:space="preserve">S1.7.6</w:t>
+      </w:r>
+      <w:r>
+        <w:t xml:space="preserve">), indicating the Aur-P1–Aur-P2 contrast is a difference in network scale rather than in overall connectedness or community structure. An exploratory PerMANOVA returns a nominal separation of the restricted- and broad-range groups in Aur-P1 sign composition (R² = 0.196, p = 0.001) but not in Aur-P2 (R² = 0.223, p = 0.076), consistent with the smaller Aur-P2 sample. That said, our sensitivity analyses show that this result is best taken as a gradual axis of variation (see our S1 ).</w:t>
       </w:r>
     </w:p>
     <w:p>
@@ -2664,7 +2568,37 @@
         <w:pStyle w:val="BodyText"/>
       </w:pPr>
       <w:r>
-        <w:t xml:space="preserve">Sampling effort is a major qualification on this social structure interpretation: object count and sign-type richness are strongly correlated, and the absence of a detectable association between node degree and richness does not establish that the restricted/broad assignments are independent of sampling effort. Object-level downsampling shows that assignments are retained mainly by the best-sampled sites, whereas small-site assignments often approach chance, demonstrating that the division is, at least in part, a sampling-intensity effect rather than a fully stable cultural partition (S1). Among the subset of sites that attain comparable coverage, broad-range sites remain richer, and a negative-binomial model with an estimated exponent finds the group contrast persists at equal object count (rate ratio = 2.31, p = 0.003; S1). However, this estimate is imprecise because the sample is small and group membership is strongly collinear with object count, and a negative-binomial model with a fixed exponent (offset) shows no effect (rate ratio = 0.72, p = 0.292). At the phase level, the Jaccard separation is not greater than expected under a fixed-margin null preserving site richness and sign-type frequencies, and no separation remains on Simpson turnover, which removes the nestedness component of Jaccard (S1). The restricted/broad pattern is therefore best treated as a descriptive richness gradient that is most credible for well-sampled assemblages. Assignments for small assemblages remain provisional. The analyses do not provide strong support for discrete social structures in the sign data.</w:t>
+        <w:t xml:space="preserve">Sampling effort is a major qualification on this social structure interpretation: object count and sign-type richness are strongly correlated, and the absence of a detectable association between node degree and richness does not establish that the restricted/broad assignments are independent of sampling effort. Object-level downsampling shows that assignments are retained mainly by the best-sampled sites, whereas small-site assignments often approach chance, demonstrating that the division is, at least in part, a sampling-intensity effect rather than a fully stable cultural partition (S1 §</w:t>
+      </w:r>
+      <w:r>
+        <w:t xml:space="preserve">S1.12.3</w:t>
+      </w:r>
+      <w:r>
+        <w:t xml:space="preserve">). Among the subset of sites that attain comparable coverage (S1 §</w:t>
+      </w:r>
+      <w:r>
+        <w:t xml:space="preserve">S1.12.4</w:t>
+      </w:r>
+      <w:r>
+        <w:t xml:space="preserve">), broad-range sites remain richer, and a negative-binomial model with an estimated exponent finds the group contrast persists at equal object count (rate ratio = 2.31, p = 0.003; S1 §</w:t>
+      </w:r>
+      <w:r>
+        <w:t xml:space="preserve">S1.12.5</w:t>
+      </w:r>
+      <w:r>
+        <w:t xml:space="preserve">). However, this estimate is imprecise because the sample is small and group membership is strongly collinear with object count, and a negative-binomial model with a fixed exponent (offset) shows no effect (rate ratio = 0.72, p = 0.292; S1 §</w:t>
+      </w:r>
+      <w:r>
+        <w:t xml:space="preserve">S1.12.5</w:t>
+      </w:r>
+      <w:r>
+        <w:t xml:space="preserve">). At the phase level, the Jaccard separation is not greater than expected under a fixed-margin null preserving site richness and sign-type frequencies, and no separation remains on Simpson turnover, which removes the nestedness component of Jaccard (S1 §</w:t>
+      </w:r>
+      <w:r>
+        <w:t xml:space="preserve">S1.10.3</w:t>
+      </w:r>
+      <w:r>
+        <w:t xml:space="preserve">). The restricted/broad pattern is therefore best treated as a descriptive richness gradient that is most credible for well-sampled assemblages. Assignments for small assemblages remain provisional. The analyses do not provide strong support for discrete social structures in the sign data.</w:t>
       </w:r>
     </w:p>
     <w:p>
@@ -2727,40 +2661,13 @@
         </w:r>
       </w:hyperlink>
       <w:r>
-        <w:t xml:space="preserve">), although this null result should be interpreted cautiously given the small sample sizes and limited statistical power (see our S1</w:t>
-      </w:r>
-      <w:r>
-        <w:t xml:space="preserve"> </w:t>
-      </w:r>
-      <w:r>
-        <w:t xml:space="preserve">“</w:t>
-      </w:r>
-      <w:r>
-        <w:t xml:space="preserve">Sensitivity Analyses</w:t>
-      </w:r>
-      <w:r>
-        <w:t xml:space="preserve">”</w:t>
-      </w:r>
-      <w:r>
-        <w:t xml:space="preserve">), and bootstrap confidence intervals on the Mantel R show that a moderate geographic correlation could not be excluded at these sample sizes (S1</w:t>
-      </w:r>
-      <w:r>
-        <w:t xml:space="preserve"> </w:t>
-      </w:r>
-      <w:r>
-        <w:t xml:space="preserve">“</w:t>
-      </w:r>
-      <w:r>
-        <w:t xml:space="preserve">Sensitivity Analyses</w:t>
-      </w:r>
-      <w:r>
-        <w:t xml:space="preserve">”</w:t>
-      </w:r>
-      <w:r>
-        <w:t xml:space="preserve"> </w:t>
-      </w:r>
-      <w:r>
-        <w:t xml:space="preserve">§S1.4.3). A non-significant Mantel result cannot establish any particular social process: it indicates only that isolation-by-distance was not detected. Non-utilitarian mobility thus remains a possible interpretation of the network structure, but it is not specifically demonstrated by this analysis.</w:t>
+        <w:t xml:space="preserve">), although this null result should be interpreted cautiously given the small sample sizes and limited statistical power (see our S1 ), and bootstrap confidence intervals on the Mantel R show that a moderate geographic correlation could not be excluded at these sample sizes (S1 §</w:t>
+      </w:r>
+      <w:r>
+        <w:t xml:space="preserve">S1.4.3</w:t>
+      </w:r>
+      <w:r>
+        <w:t xml:space="preserve">). A non-significant Mantel result cannot establish any particular social process: it indicates only that isolation-by-distance was not detected. Non-utilitarian mobility thus remains a possible interpretation of the network structure, but it is not specifically demonstrated by this analysis.</w:t>
       </w:r>
     </w:p>
     <w:p>
@@ -2996,7 +2903,72 @@
         </w:r>
       </w:hyperlink>
       <w:r>
-        <w:t xml:space="preserve">), and no significant geographic signal was detected in either phase (Aur-P2: R = -0.299). A permutation test of the difference between these Mantel correlations (D = 0.34, p = 0.153; sites permuted between phases 1,000 times) shows that the isolation-by-distance relationship does not differ significantly between the phases, so the spatial-proximity explanation is not supported by this analysis. This null result reflects limited statistical power at these sample sizes rather than positive evidence that geography is irrelevant, as quantified by bootstrap confidence intervals on the Mantel R (S1</w:t>
+        <w:t xml:space="preserve">), and no significant geographic signal was detected in either phase (Aur-P2: R = -0.299). A permutation test of the difference between these Mantel correlations (D = 0.34, p = 0.153; sites permuted between phases 1,000 times) shows that the isolation-by-distance relationship does not differ significantly between the phases, so the spatial-proximity explanation is not supported by this analysis. This null result reflects limited statistical power at these sample sizes rather than positive evidence that geography is irrelevant, as quantified by bootstrap confidence intervals on the Mantel R (S1 ).</w:t>
+      </w:r>
+      <w:r>
+        <w:t xml:space="preserve"> </w:t>
+      </w:r>
+      <w:r>
+        <w:t xml:space="preserve">[2]</w:t>
+      </w:r>
+      <w:r>
+        <w:t xml:space="preserve"> </w:t>
+      </w:r>
+      <w:r>
+        <w:t xml:space="preserve">report a similar pattern for ornaments, a non-significant, near-zero global Mantel with spatial structure only in correlograms at short lags (≤~300 km). We did not find structure in correlograms at short lags.</w:t>
+      </w:r>
+    </w:p>
+    <w:p>
+      <w:pPr>
+        <w:pStyle w:val="BodyText"/>
+      </w:pPr>
+      <w:r>
+        <w:t xml:space="preserve">How do our results align with previous work on the environmental and population change during these phases? From 45–43.25 ka cal BP, the population density in Europe was extremely low, due to the unfavorable environmental conditions of Greenland Stadial 12 (44 ka cal BP) and the slow westward expansion of early modern humans</w:t>
+      </w:r>
+      <w:r>
+        <w:t xml:space="preserve"> </w:t>
+      </w:r>
+      <w:r>
+        <w:t xml:space="preserve">[85]</w:t>
+      </w:r>
+      <w:r>
+        <w:t xml:space="preserve">. This was followed by rapid expansion from 43.25–41 ka cal BP, with the maximum extent of early Aurignacian (Aur-P1) settlement being reached around 41 ka cal BP (</w:t>
+      </w:r>
+      <w:r>
+        <w:t xml:space="preserve">[21]</w:t>
+      </w:r>
+      <w:r>
+        <w:t xml:space="preserve">). Other studies have also found similar associations in other regions and time periods between increases in quantity and diversity of art, and increases in population density</w:t>
+      </w:r>
+      <w:r>
+        <w:t xml:space="preserve"> </w:t>
+      </w:r>
+      <w:r>
+        <w:t xml:space="preserve">[86–94]</w:t>
+      </w:r>
+      <w:r>
+        <w:t xml:space="preserve">. Although population growth is one condition under which sign systems typically gain a communicative function, our results do not establish a causal link between demographic expansion and the emergence of geometric signs as a group-membership marker in the Aurignacian. Quantitative demographic reconstructions suggest that western and central European Aurignacian populations numbered approximately 1500 individuals</w:t>
+      </w:r>
+      <w:r>
+        <w:t xml:space="preserve"> </w:t>
+      </w:r>
+      <w:r>
+        <w:t xml:space="preserve">[21]</w:t>
+      </w:r>
+      <w:r>
+        <w:t xml:space="preserve">, a relatively small number that may partly explain why our networks remain small and sparsely connected across both phases.</w:t>
+      </w:r>
+      <w:r>
+        <w:t xml:space="preserve"> </w:t>
+      </w:r>
+      <w:r>
+        <w:t xml:space="preserve">[21]</w:t>
+      </w:r>
+      <w:r>
+        <w:t xml:space="preserve"> </w:t>
+      </w:r>
+      <w:r>
+        <w:t xml:space="preserve">distinguish</w:t>
       </w:r>
       <w:r>
         <w:t xml:space="preserve"> </w:t>
@@ -3005,303 +2977,235 @@
         <w:t xml:space="preserve">“</w:t>
       </w:r>
       <w:r>
-        <w:t xml:space="preserve">Sensitivity Analyses</w:t>
+        <w:t xml:space="preserve">Core Areas</w:t>
       </w:r>
       <w:r>
         <w:t xml:space="preserve">”</w:t>
       </w:r>
       <w:r>
+        <w:t xml:space="preserve"> </w:t>
+      </w:r>
+      <w:r>
+        <w:t xml:space="preserve">of viable, year-round occupation from</w:t>
+      </w:r>
+      <w:r>
+        <w:t xml:space="preserve"> </w:t>
+      </w:r>
+      <w:r>
+        <w:t xml:space="preserve">“</w:t>
+      </w:r>
+      <w:r>
+        <w:t xml:space="preserve">Extended Areas</w:t>
+      </w:r>
+      <w:r>
+        <w:t xml:space="preserve">”</w:t>
+      </w:r>
+      <w:r>
+        <w:t xml:space="preserve"> </w:t>
+      </w:r>
+      <w:r>
+        <w:t xml:space="preserve">of seasonal or satellite use, with Core Areas corresponding to regions such as the Dordogne. This Core/Extended framework is consistent with our finding from the larger Aur-P1 network, with the lower-connectivity periphery potentially representing periodically visited Extended Areas. In Aur-P2 the reduced network is consistent with more localised interaction as populations consolidated. That said, the contraction of the geometric sign-type pool from Aur-P1 (26 types) to Aur-P2 (15 types) does not survive sensitivity testing. At equal sampling effort with incidence-frequency rarefaction to 63 objects (all types and shared object types only), the rarefied Aur-P1 pool overlaps the Aur-P2 pool, so the raw difference in the number of sign types is not distinguishable from sampling variation. Neither the networks or sign diversity patterns can be clearly linked to demographic dynamics with the current sample.</w:t>
+      </w:r>
+    </w:p>
+    <w:p>
+      <w:pPr>
+        <w:pStyle w:val="BodyText"/>
+      </w:pPr>
+      <w:r>
+        <w:t xml:space="preserve">[22]</w:t>
+      </w:r>
+      <w:r>
+        <w:t xml:space="preserve"> </w:t>
+      </w:r>
+      <w:r>
+        <w:t xml:space="preserve">used eco-cultural niche modeling to show that Heinrich Stadial 4 (HS4) at the very beginning of the Early Aurignacian resulted in an expansion of people into new environmental niches, hypothesised to involve an expansion of social networks both within and between populations. Our finding of no significant changes in networks over time suggests that if</w:t>
+      </w:r>
+      <w:r>
+        <w:t xml:space="preserve"> </w:t>
+      </w:r>
+      <w:r>
+        <w:t xml:space="preserve">[22]</w:t>
+      </w:r>
+      <w:r>
+        <w:t xml:space="preserve">’s model is accurate, we do not see a signal of it in the geometric sign data. Neither phase shows a significant geographic signal (Aur-P1 Mantel R = 0.046, Aur-P2 Mantel R = -0.299), suggesting that sign sharing was not primarily driven by expansion into new, spatially structured niches. Similarly,</w:t>
+      </w:r>
+      <w:r>
+        <w:t xml:space="preserve"> </w:t>
+      </w:r>
+      <w:r>
+        <w:t xml:space="preserve">[12]</w:t>
+      </w:r>
+      <w:r>
+        <w:t xml:space="preserve"> </w:t>
+      </w:r>
+      <w:r>
+        <w:t xml:space="preserve">developed a human-existence probability model for the Aurignacian, finding an expanded, more dispersed settlement area for the Evolved/Late Aurignacian, and</w:t>
+      </w:r>
+      <w:r>
+        <w:t xml:space="preserve"> </w:t>
+      </w:r>
+      <w:r>
+        <w:t xml:space="preserve">[85]</w:t>
+      </w:r>
+      <w:r>
+        <w:t xml:space="preserve"> </w:t>
+      </w:r>
+      <w:r>
+        <w:t xml:space="preserve">also identifies increased expansion marking the beginning of the Evolved Aurignacian. In our data Aur-P2’s wider spatial spread was not accompanied by stronger sign-type sharing. These patterns of connectivity and geographic structure also have implications for understanding how geometric signs functioned as markers of group identity.</w:t>
+      </w:r>
+    </w:p>
+    <w:p>
+      <w:pPr>
+        <w:pStyle w:val="BodyText"/>
+      </w:pPr>
+      <w:r>
+        <w:t xml:space="preserve">Although previous work has argued for geometric signs as a form of cultural identification and communication during the Palaeolithic</w:t>
+      </w:r>
+      <w:r>
+        <w:t xml:space="preserve"> </w:t>
+      </w:r>
+      <w:r>
+        <w:t xml:space="preserve">[3]</w:t>
+      </w:r>
+      <w:r>
+        <w:t xml:space="preserve">, our results did not identify geographically distinct groups differentiated by sign repertoire. Geographic distance had little influence on sign distribution in either phase (Aur-P1: R = 0.046; Aur-P2: R = -0.299). Further analysis of sign composition differences across sites grouped by geography alone (Partitioning Around Medoids on geodesic distances, k=2 to 5, with Jaccard dissimilarity and PerMANOVA) found no significant differences across geographic groups (S1 §</w:t>
+      </w:r>
+      <w:r>
+        <w:t xml:space="preserve">S1.8.4</w:t>
+      </w:r>
+      <w:r>
+        <w:t xml:space="preserve">). Thus our findings contrast with previous work such as</w:t>
+      </w:r>
+      <w:r>
+        <w:t xml:space="preserve"> </w:t>
+      </w:r>
+      <w:r>
+        <w:t xml:space="preserve">[6]</w:t>
+      </w:r>
+      <w:r>
+        <w:t xml:space="preserve"> </w:t>
+      </w:r>
+      <w:r>
+        <w:t xml:space="preserve">and</w:t>
+      </w:r>
+      <w:r>
+        <w:t xml:space="preserve"> </w:t>
+      </w:r>
+      <w:r>
+        <w:t xml:space="preserve">[3]</w:t>
+      </w:r>
+      <w:r>
+        <w:t xml:space="preserve"> </w:t>
+      </w:r>
+      <w:r>
+        <w:t xml:space="preserve">who found distinct cultural clusters in their analysis of personal ornaments. One possible explanation for this contrast is that the geometric signs studied here encode different kinds of group information compared to the personal ornament objects studied by</w:t>
+      </w:r>
+      <w:r>
+        <w:t xml:space="preserve"> </w:t>
+      </w:r>
+      <w:r>
+        <w:t xml:space="preserve">[6]</w:t>
+      </w:r>
+      <w:r>
+        <w:t xml:space="preserve">. Another explanation may be that a distinguishing factor between the Aurignacian and Gravettian is the appearance of readily identifiable geographically distinct cultural groups in the Gravettian, as reported by</w:t>
+      </w:r>
+      <w:r>
+        <w:t xml:space="preserve"> </w:t>
+      </w:r>
+      <w:r>
+        <w:t xml:space="preserve">[3]</w:t>
+      </w:r>
+      <w:r>
+        <w:t xml:space="preserve">. Future work could explore the hypothesis that the distribution found in Aur-P2 (</w:t>
+      </w:r>
+      <w:hyperlink w:anchor="fig-group-map">
+        <w:r>
+          <w:rPr>
+            <w:rStyle w:val="Hyperlink"/>
+          </w:rPr>
+          <w:t xml:space="preserve">Figure 5</w:t>
+        </w:r>
+      </w:hyperlink>
+      <w:r>
+        <w:t xml:space="preserve">) eventually evolved into the clusters proposed by</w:t>
+      </w:r>
+      <w:r>
+        <w:t xml:space="preserve"> </w:t>
+      </w:r>
+      <w:r>
+        <w:t xml:space="preserve">[3]</w:t>
+      </w:r>
+      <w:r>
+        <w:t xml:space="preserve"> </w:t>
+      </w:r>
+      <w:r>
+        <w:t xml:space="preserve">for the Gravettian period.</w:t>
+      </w:r>
+    </w:p>
+    <w:p>
+      <w:pPr>
+        <w:pStyle w:val="BodyText"/>
+      </w:pPr>
+      <w:r>
+        <w:t xml:space="preserve">The data used by</w:t>
+      </w:r>
+      <w:r>
+        <w:t xml:space="preserve"> </w:t>
+      </w:r>
+      <w:r>
+        <w:t xml:space="preserve">[6]</w:t>
+      </w:r>
+      <w:r>
+        <w:t xml:space="preserve"> </w:t>
+      </w:r>
+      <w:r>
+        <w:t xml:space="preserve">was also analyzed by</w:t>
+      </w:r>
+      <w:r>
+        <w:t xml:space="preserve"> </w:t>
+      </w:r>
+      <w:r>
+        <w:t xml:space="preserve">[95]</w:t>
+      </w:r>
+      <w:r>
+        <w:t xml:space="preserve">, who used Approximate Bayesian Computation to simulate and compare Aurignacian personal ornament distribution as a result of structured ethnic identity versus cultural identity by-descent with modification and isolation-by-distance. Their results show the latter was best supported by the data. Cultural identity by-descent with modification is defined as group difference generated by unconscious cultural mutation and drift, and largely influenced by spatial proximity to other groups. These results from</w:t>
+      </w:r>
+      <w:r>
+        <w:t xml:space="preserve"> </w:t>
+      </w:r>
+      <w:r>
+        <w:t xml:space="preserve">[95]</w:t>
+      </w:r>
+      <w:r>
+        <w:t xml:space="preserve"> </w:t>
+      </w:r>
+      <w:r>
+        <w:t xml:space="preserve">complicate claims by</w:t>
+      </w:r>
+      <w:r>
+        <w:t xml:space="preserve"> </w:t>
+      </w:r>
+      <w:r>
+        <w:t xml:space="preserve">[6]</w:t>
+      </w:r>
+      <w:r>
+        <w:t xml:space="preserve"> </w:t>
+      </w:r>
+      <w:r>
+        <w:t xml:space="preserve">for geographically distinct cultural groups in the Aurignacian. Like our data, it does not establish the absence of geographically structured identity because our analyses are underpowered for that claim (S1 §</w:t>
+      </w:r>
+      <w:r>
+        <w:t xml:space="preserve">S1.4.3</w:t>
+      </w:r>
+      <w:r>
         <w:t xml:space="preserve">).</w:t>
       </w:r>
-      <w:r>
-        <w:t xml:space="preserve"> </w:t>
-      </w:r>
-      <w:r>
-        <w:t xml:space="preserve">[2]</w:t>
-      </w:r>
-      <w:r>
-        <w:t xml:space="preserve"> </w:t>
-      </w:r>
-      <w:r>
-        <w:t xml:space="preserve">report a similar pattern for ornaments, a non-significant, near-zero global Mantel with spatial structure only in correlograms at short lags (≤~300 km). We did not find structure in correlograms at short lags.</w:t>
-      </w:r>
     </w:p>
     <w:p>
       <w:pPr>
         <w:pStyle w:val="BodyText"/>
       </w:pPr>
       <w:r>
-        <w:t xml:space="preserve">How do our results align with previous work on the environmental and population change during these phases? From 45–43.25 ka cal BP, the population density in Europe was extremely low, due to the unfavorable environmental conditions of Greenland Stadial 12 (44 ka cal BP) and the slow westward expansion of early modern humans</w:t>
-      </w:r>
-      <w:r>
-        <w:t xml:space="preserve"> </w:t>
-      </w:r>
-      <w:r>
-        <w:t xml:space="preserve">[85]</w:t>
-      </w:r>
-      <w:r>
-        <w:t xml:space="preserve">. This was followed by rapid expansion from 43.25–41 ka cal BP, with the maximum extent of early Aurignacian (Aur-P1) settlement being reached around 41 ka cal BP (</w:t>
-      </w:r>
-      <w:r>
-        <w:t xml:space="preserve">[21]</w:t>
-      </w:r>
-      <w:r>
-        <w:t xml:space="preserve">). Other studies have also found similar associations in other regions and time periods between increases in quantity and diversity of art, and increases in population density</w:t>
-      </w:r>
-      <w:r>
-        <w:t xml:space="preserve"> </w:t>
-      </w:r>
-      <w:r>
-        <w:t xml:space="preserve">[86–94]</w:t>
-      </w:r>
-      <w:r>
-        <w:t xml:space="preserve">. Although population growth is one condition under which sign systems typically gain a communicative function, our results do not establish a causal link between demographic expansion and the emergence of geometric signs as a group-membership marker in the Aurignacian. Quantitative demographic reconstructions suggest that western and central European Aurignacian populations numbered approximately 1500 individuals</w:t>
-      </w:r>
-      <w:r>
-        <w:t xml:space="preserve"> </w:t>
-      </w:r>
-      <w:r>
-        <w:t xml:space="preserve">[21]</w:t>
-      </w:r>
-      <w:r>
-        <w:t xml:space="preserve">, a relatively small number that may partly explain why our networks remain small and sparsely connected across both phases.</w:t>
-      </w:r>
-      <w:r>
-        <w:t xml:space="preserve"> </w:t>
-      </w:r>
-      <w:r>
-        <w:t xml:space="preserve">[21]</w:t>
-      </w:r>
-      <w:r>
-        <w:t xml:space="preserve"> </w:t>
-      </w:r>
-      <w:r>
-        <w:t xml:space="preserve">distinguish</w:t>
-      </w:r>
-      <w:r>
-        <w:t xml:space="preserve"> </w:t>
-      </w:r>
-      <w:r>
-        <w:t xml:space="preserve">“</w:t>
-      </w:r>
-      <w:r>
-        <w:t xml:space="preserve">Core Areas</w:t>
-      </w:r>
-      <w:r>
-        <w:t xml:space="preserve">”</w:t>
-      </w:r>
-      <w:r>
-        <w:t xml:space="preserve"> </w:t>
-      </w:r>
-      <w:r>
-        <w:t xml:space="preserve">of viable, year-round occupation from</w:t>
-      </w:r>
-      <w:r>
-        <w:t xml:space="preserve"> </w:t>
-      </w:r>
-      <w:r>
-        <w:t xml:space="preserve">“</w:t>
-      </w:r>
-      <w:r>
-        <w:t xml:space="preserve">Extended Areas</w:t>
-      </w:r>
-      <w:r>
-        <w:t xml:space="preserve">”</w:t>
-      </w:r>
-      <w:r>
-        <w:t xml:space="preserve"> </w:t>
-      </w:r>
-      <w:r>
-        <w:t xml:space="preserve">of seasonal or satellite use, with Core Areas corresponding to regions such as the Dordogne. This Core/Extended framework is consistent with our finding from the larger Aur-P1 network, with the lower-connectivity periphery potentially representing periodically visited Extended Areas. In Aur-P2 the reduced network is consistent with more localised interaction as populations consolidated. That said, the contraction of the geometric sign-type pool from Aur-P1 (26 types) to Aur-P2 (15 types) does not survive sensitivity testing. At equal sampling effort with incidence-frequency rarefaction to 63 objects (all types and shared object types only), the rarefied Aur-P1 pool overlaps the Aur-P2 pool, so the raw difference in the number of sign types is not distinguishable from sampling variation. Neither the networks or sign diversity patterns can be clearly linked to demographic dynamics with the current sample.</w:t>
-      </w:r>
-    </w:p>
-    <w:p>
-      <w:pPr>
-        <w:pStyle w:val="BodyText"/>
-      </w:pPr>
-      <w:r>
-        <w:t xml:space="preserve">[22]</w:t>
-      </w:r>
-      <w:r>
-        <w:t xml:space="preserve"> </w:t>
-      </w:r>
-      <w:r>
-        <w:t xml:space="preserve">used eco-cultural niche modeling to show that Heinrich Stadial 4 (HS4) at the very beginning of the Early Aurignacian resulted in an expansion of people into new environmental niches, hypothesised to involve an expansion of social networks both within and between populations. Our finding of no significant changes in networks over time suggests that if</w:t>
-      </w:r>
-      <w:r>
-        <w:t xml:space="preserve"> </w:t>
-      </w:r>
-      <w:r>
-        <w:t xml:space="preserve">[22]</w:t>
-      </w:r>
-      <w:r>
-        <w:t xml:space="preserve">’s model is accurate, we do not see a signal of it in the geometric sign data. Neither phase shows a significant geographic signal (Aur-P1 Mantel R = 0.046, Aur-P2 Mantel R = -0.299), suggesting that sign sharing was not primarily driven by expansion into new, spatially structured niches. Similarly,</w:t>
-      </w:r>
-      <w:r>
-        <w:t xml:space="preserve"> </w:t>
-      </w:r>
-      <w:r>
-        <w:t xml:space="preserve">[12]</w:t>
-      </w:r>
-      <w:r>
-        <w:t xml:space="preserve"> </w:t>
-      </w:r>
-      <w:r>
-        <w:t xml:space="preserve">developed a human-existence probability model for the Aurignacian, finding an expanded, more dispersed settlement area for the Evolved/Late Aurignacian, and</w:t>
-      </w:r>
-      <w:r>
-        <w:t xml:space="preserve"> </w:t>
-      </w:r>
-      <w:r>
-        <w:t xml:space="preserve">[85]</w:t>
-      </w:r>
-      <w:r>
-        <w:t xml:space="preserve"> </w:t>
-      </w:r>
-      <w:r>
-        <w:t xml:space="preserve">also identifies increased expansion marking the beginning of the Evolved Aurignacian. In our data Aur-P2’s wider spatial spread was not accompanied by stronger sign-type sharing. These patterns of connectivity and geographic structure also have implications for understanding how geometric signs functioned as markers of group identity.</w:t>
-      </w:r>
-    </w:p>
-    <w:p>
-      <w:pPr>
-        <w:pStyle w:val="BodyText"/>
-      </w:pPr>
-      <w:r>
-        <w:t xml:space="preserve">Although previous work has argued for geometric signs as a form of cultural identification and communication during the Palaeolithic</w:t>
-      </w:r>
-      <w:r>
-        <w:t xml:space="preserve"> </w:t>
-      </w:r>
-      <w:r>
-        <w:t xml:space="preserve">[3]</w:t>
-      </w:r>
-      <w:r>
-        <w:t xml:space="preserve">, our results did not identify geographically distinct groups differentiated by sign repertoire. Geographic distance had little influence on sign distribution in either phase (Aur-P1: R = 0.046; Aur-P2: R = -0.299). Further analysis of sign composition differences across sites grouped by geography alone (Partitioning Around Medoids on geodesic distances, k=2 to 5, with Jaccard dissimilarity and PerMANOVA) found no significant differences across geographic groups (S1). Thus our findings contrast with previous work such as</w:t>
-      </w:r>
-      <w:r>
-        <w:t xml:space="preserve"> </w:t>
-      </w:r>
-      <w:r>
-        <w:t xml:space="preserve">[6]</w:t>
-      </w:r>
-      <w:r>
-        <w:t xml:space="preserve"> </w:t>
-      </w:r>
-      <w:r>
-        <w:t xml:space="preserve">and</w:t>
-      </w:r>
-      <w:r>
-        <w:t xml:space="preserve"> </w:t>
-      </w:r>
-      <w:r>
-        <w:t xml:space="preserve">[3]</w:t>
-      </w:r>
-      <w:r>
-        <w:t xml:space="preserve"> </w:t>
-      </w:r>
-      <w:r>
-        <w:t xml:space="preserve">who found distinct cultural clusters in their analysis of personal ornaments. One possible explanation for this contrast is that the geometric signs studied here encode different kinds of group information compared to the personal ornament objects studied by</w:t>
-      </w:r>
-      <w:r>
-        <w:t xml:space="preserve"> </w:t>
-      </w:r>
-      <w:r>
-        <w:t xml:space="preserve">[6]</w:t>
-      </w:r>
-      <w:r>
-        <w:t xml:space="preserve">. Another explanation may be that a distinguishing factor between the Aurignacian and Gravettian is the appearance of readily identifiable geographically distinct cultural groups in the Gravettian, as reported by</w:t>
-      </w:r>
-      <w:r>
-        <w:t xml:space="preserve"> </w:t>
-      </w:r>
-      <w:r>
-        <w:t xml:space="preserve">[3]</w:t>
-      </w:r>
-      <w:r>
-        <w:t xml:space="preserve">. Future work could explore the hypothesis that the distribution found in Aur-P2 (</w:t>
-      </w:r>
-      <w:hyperlink w:anchor="fig-group-map">
-        <w:r>
-          <w:rPr>
-            <w:rStyle w:val="Hyperlink"/>
-          </w:rPr>
-          <w:t xml:space="preserve">Figure 5</w:t>
-        </w:r>
-      </w:hyperlink>
-      <w:r>
-        <w:t xml:space="preserve">) eventually evolved into the clusters proposed by</w:t>
-      </w:r>
-      <w:r>
-        <w:t xml:space="preserve"> </w:t>
-      </w:r>
-      <w:r>
-        <w:t xml:space="preserve">[3]</w:t>
-      </w:r>
-      <w:r>
-        <w:t xml:space="preserve"> </w:t>
-      </w:r>
-      <w:r>
-        <w:t xml:space="preserve">for the Gravettian period.</w:t>
-      </w:r>
-    </w:p>
-    <w:p>
-      <w:pPr>
-        <w:pStyle w:val="BodyText"/>
-      </w:pPr>
-      <w:r>
-        <w:t xml:space="preserve">The data used by</w:t>
-      </w:r>
-      <w:r>
-        <w:t xml:space="preserve"> </w:t>
-      </w:r>
-      <w:r>
-        <w:t xml:space="preserve">[6]</w:t>
-      </w:r>
-      <w:r>
-        <w:t xml:space="preserve"> </w:t>
-      </w:r>
-      <w:r>
-        <w:t xml:space="preserve">was also analyzed by</w:t>
-      </w:r>
-      <w:r>
-        <w:t xml:space="preserve"> </w:t>
-      </w:r>
-      <w:r>
-        <w:t xml:space="preserve">[95]</w:t>
-      </w:r>
-      <w:r>
-        <w:t xml:space="preserve">, who used Approximate Bayesian Computation to simulate and compare Aurignacian personal ornament distribution as a result of structured ethnic identity versus cultural identity by-descent with modification and isolation-by-distance. Their results show the latter was best supported by the data. Cultural identity by-descent with modification is defined as group difference generated by unconscious cultural mutation and drift, and largely influenced by spatial proximity to other groups. These results from</w:t>
-      </w:r>
-      <w:r>
-        <w:t xml:space="preserve"> </w:t>
-      </w:r>
-      <w:r>
-        <w:t xml:space="preserve">[95]</w:t>
-      </w:r>
-      <w:r>
-        <w:t xml:space="preserve"> </w:t>
-      </w:r>
-      <w:r>
-        <w:t xml:space="preserve">complicate claims by</w:t>
-      </w:r>
-      <w:r>
-        <w:t xml:space="preserve"> </w:t>
-      </w:r>
-      <w:r>
-        <w:t xml:space="preserve">[6]</w:t>
-      </w:r>
-      <w:r>
-        <w:t xml:space="preserve"> </w:t>
-      </w:r>
-      <w:r>
-        <w:t xml:space="preserve">for geographically distinct cultural groups in the Aurignacian. Like our data, it does not establish the absence of geographically structured identity because our analyses are underpowered for that claim (S1).</w:t>
-      </w:r>
-    </w:p>
-    <w:p>
-      <w:pPr>
-        <w:pStyle w:val="BodyText"/>
-      </w:pPr>
-      <w:r>
         <w:t xml:space="preserve">Our results can be interpreted through the lens of cultural transmission theory</w:t>
       </w:r>
       <w:r>
@@ -3320,7 +3224,13 @@
         <w:t xml:space="preserve">[99]</w:t>
       </w:r>
       <w:r>
-        <w:t xml:space="preserve">. We can hypothesize this as the underlying process behind the larger the sign-type pool in the Aur-P1 phase (26 types) compared to the Aur-P2 phase (15 types). However, our equal-effort sensitivity analysis shows the sign-type pool sizes overlap once sample size is standardized (S1). So the differences are not distinguishable from sampling variation at equal effort, and the hypothesis is not supported with the current data.</w:t>
+        <w:t xml:space="preserve">. We can hypothesize this as the underlying process behind the larger the sign-type pool in the Aur-P1 phase (26 types) compared to the Aur-P2 phase (15 types). However, our equal-effort sensitivity analysis shows the sign-type pool sizes overlap once sample size is standardized (S1 §</w:t>
+      </w:r>
+      <w:r>
+        <w:t xml:space="preserve">S1.12.6</w:t>
+      </w:r>
+      <w:r>
+        <w:t xml:space="preserve">). So the differences are not distinguishable from sampling variation at equal effort, and the hypothesis is not supported with the current data.</w:t>
       </w:r>
     </w:p>
     <w:p>
@@ -3528,7 +3438,25 @@
         <w:pStyle w:val="BodyText"/>
       </w:pPr>
       <w:r>
-        <w:t xml:space="preserve">A restricted/broad repertoire axis is visually evident in seriation and supported by bootstrap co-clustering. A negative-binomial regression shows broad-range sites with higher richness at equal object count. With the exponent fixed at 1, the difference is not statistically significant, but 1 lies outside the estimated interval and the free-slope estimate remains imprecise because group tracks object count. Stochastic block models select three (Bernoulli and Poisson) or four blocks (Gaussian) as optimal in Aur-P1, recovering the restricted/broad split as their two largest blocks with a stable small-block refinement (Labeko Koba, Les Cottés, Trou al’Wesse under Bernoulli and Gaussian; S1), while in Aur-P2 the Bernoulli and Poisson models select a single block and only the Gaussian model selects two blocks by a marginal 0.9 ICL points. Cross-validation (leave-one-out, object-half holdout, gradient PerMANOVA) recovers the axis, yet the maximally-selected split test under a fixed-fixed (Curveball) null is not significant in either phase (Aur-P1 p = 0.139; Aur-P2 p = 1). The seriation ordering itself also does not exceed the Curveball null (S1 §S1.9.6). The restricted/broad division should be read only as a descriptive gradient whose independence from sampling effort is not demonstrated for sites with small numbers of signs.</w:t>
+        <w:t xml:space="preserve">A restricted/broad repertoire axis is visually evident in seriation and supported by bootstrap co-clustering. A negative-binomial regression shows broad-range sites with higher richness at equal object count. With the exponent fixed at 1, the difference is not statistically significant, but 1 lies outside the estimated interval and the free-slope estimate remains imprecise because group tracks object count. Stochastic block models select three (Bernoulli and Poisson) or four blocks (Gaussian) as optimal in Aur-P1, recovering the restricted/broad split as their two largest blocks with a stable small-block refinement (Labeko Koba, Les Cottés, Trou al’Wesse under Bernoulli and Gaussian; S1 §</w:t>
+      </w:r>
+      <w:r>
+        <w:t xml:space="preserve">S1.9.3</w:t>
+      </w:r>
+      <w:r>
+        <w:t xml:space="preserve">), while in Aur-P2 the Bernoulli and Poisson models select a single block and only the Gaussian model selects two blocks by a marginal 0.9 ICL points. Cross-validation (leave-one-out, object-half holdout, gradient PerMANOVA) recovers the axis (S1 §</w:t>
+      </w:r>
+      <w:r>
+        <w:t xml:space="preserve">S1.10</w:t>
+      </w:r>
+      <w:r>
+        <w:t xml:space="preserve">), yet the maximally-selected split test under a fixed-fixed (Curveball) null is not significant in either phase (Aur-P1 p = 0.139; Aur-P2 p = 1). The seriation ordering itself also does not exceed the Curveball null (S1 §</w:t>
+      </w:r>
+      <w:r>
+        <w:t xml:space="preserve">S1.9.5</w:t>
+      </w:r>
+      <w:r>
+        <w:t xml:space="preserve">). The restricted/broad division should be read only as a descriptive gradient whose independence from sampling effort is not demonstrated for sites with small numbers of signs.</w:t>
       </w:r>
     </w:p>
     <w:p>
@@ -3536,7 +3464,13 @@
         <w:pStyle w:val="BodyText"/>
       </w:pPr>
       <w:r>
-        <w:t xml:space="preserve">No significant isolation-by-distance signal is detected in either phase (Mantel R = 0.046, p = 0.301; R = -0.299, p = 0.933). However, bootstrap confidence intervals (S1) show the tests are underpowered, so these are null results reflecting limited power, not evidence of geographic irrelevance. There is weak evidence for a broad geographic gradient in Aur-P1, but insufficient evidence for discrete geographic clustering analogous to those reported for personal ornaments</w:t>
+        <w:t xml:space="preserve">No significant isolation-by-distance signal is detected in either phase (Mantel R = 0.046, p = 0.301; R = -0.299, p = 0.933). However, bootstrap confidence intervals (S1 §</w:t>
+      </w:r>
+      <w:r>
+        <w:t xml:space="preserve">S1.4.3</w:t>
+      </w:r>
+      <w:r>
+        <w:t xml:space="preserve">) show the tests are underpowered, so these are null results reflecting limited power, not evidence of geographic irrelevance. There is weak evidence for a broad geographic gradient in Aur-P1, but insufficient evidence for discrete geographic clustering analogous to those reported for personal ornaments</w:t>
       </w:r>
       <w:r>
         <w:t xml:space="preserve"> </w:t>
@@ -3677,7 +3611,19 @@
         <w:t xml:space="preserve">[129]</w:t>
       </w:r>
       <w:r>
-        <w:t xml:space="preserve">. After exclusions, Aur-P2 rests on only 9 sites and 63 objects, so its two-group structure and network statistics have limited power. Date parsing itself removes assemblages whose reported dates lack uncertainties, including a large assemblage that would otherwise fall late, so the small Aur-P2 sample partly reflects dating-quality filtering rather than only archaeology (S1). Alternative calibrations move a few boundary sites between phases without changing the phase ordering (S1).</w:t>
+        <w:t xml:space="preserve">. After exclusions, Aur-P2 rests on only 9 sites and 63 objects, so its two-group structure and network statistics have limited power. Date parsing itself removes assemblages whose reported dates lack uncertainties, including a large assemblage that would otherwise fall late, so the small Aur-P2 sample partly reflects dating-quality filtering rather than only archaeology (S1 §</w:t>
+      </w:r>
+      <w:r>
+        <w:t xml:space="preserve">S1.1</w:t>
+      </w:r>
+      <w:r>
+        <w:t xml:space="preserve">). Alternative calibrations move a few boundary sites between phases without changing the phase ordering (S1 §</w:t>
+      </w:r>
+      <w:r>
+        <w:t xml:space="preserve">S1.5.3</w:t>
+      </w:r>
+      <w:r>
+        <w:t xml:space="preserve">).</w:t>
       </w:r>
     </w:p>
     <w:bookmarkEnd w:id="61"/>

</xml_diff>

<commit_message>
text edits for consistency
</commit_message>
<xml_diff>
--- a/paper/paper.docx
+++ b/paper/paper.docx
@@ -259,7 +259,7 @@
         <w:pStyle w:val="BodyText"/>
       </w:pPr>
       <w:r>
-        <w:t xml:space="preserve">Abstract: The Aurignacian technocomplex (ca. 43–30 ka cal BP) marks a pivotal expansion of</w:t>
+        <w:t xml:space="preserve">Abstract: The Aurignacian technocomplex (ca. 43–30 ka cal BP) accompanied the expansion of</w:t>
       </w:r>
       <w:r>
         <w:t xml:space="preserve"> </w:t>
@@ -275,7 +275,7 @@
         <w:t xml:space="preserve"> </w:t>
       </w:r>
       <w:r>
-        <w:t xml:space="preserve">into Western Eurasia, yet the evolution of social organization during this transition remains debated. Here we investigate social dynamics through the analysis of geometric signs on mobile objects within a two-phase framework based on specialist technological attributions in site assignment. Using seriation and network analyses, we examine patterns of sign production in each phase, and investigate how the sign-sharing network differs between the Early and Late Aurignacian. Within the early phase (Aur-P1; 20 sites) we hypothesize a two-group structure of restricted versus broad geometric-sign repertoires. Stochastic block modelling finds that the richness gap between the groups is not distinguishable from a group difference, considering the saturating richness–effort relationship. Despite differences in network size between phases, permutation tests show no evidence for meaningful differences in overall connectivity, community structure, or centrality patterns. Mantel tests did not detect a significant correlation between geographic distance and sign distribution in either phase, and the isolation-by-distance relationship does not differ between them, but bootstrap confidence intervals indicate these tests are underpowered at these sample sizes. We find no statistically significant evidence in the SignBase sample for discrete geographically structured groups of Aurignacian geometric signs analogous to those claimed for personal ornaments.</w:t>
+        <w:t xml:space="preserve">across western Eurasia. Geometric signs on mobile objects may have communicated information about identity or social connections, but it remains unclear whether their distribution records geographically structured groups. We assessed this question using SignBase 1.0, an open dataset of geometric signs from Upper Palaeolithic European sites. We assigned signs to two analytically defined Aurignacian phases and then analysed presence-absence data using seriation, stochastic block models, sign-sharing networks, and distance-based tests, and evaluated apparent group structure against randomization tests that preserved site richness and sign-type frequencies. Seriation revealed an apparent contrast between sites with restricted and broad sign repertoires, but neither the ordering nor the preference for multiple stochastic blocks exceeded the corresponding richness-preserving null models. The contrast was therefore better described as a gradient in repertoire richness than as a discrete partition, particularly in the smaller later-phase sample. Although the earlier phase produced a larger network, size-aware permutation tests found no significant phase difference in connectivity, community structure, or centrality. Geographic distance was not significantly associated with sign dissimilarity in either phase, although the small samples limit the ability to exclude moderate geographic effects. These results provide no evidence in this sample for discrete geographically structured sign groups analogous to those reported for personal ornaments. They also show that richness and sampling intensity must be separated from group structure when geometric signs are used to infer past social organization.</w:t>
       </w:r>
     </w:p>
     <w:p>
@@ -1835,11 +1835,7 @@
         <w:t xml:space="preserve">To quantitatively evaluate the two-group hypothesis inferred from the seriation analysis, we used bootstrap resampling and stochastic block models, which we describe in detail in S1. Bootstrap resampling tests the stability of the two groups as an imposed partition. It shows that for Aur-P1, mean within-block co-clustering is 0.75 for the restricted-range block and 0.97 for the broader-range block, against 0.2 across the two blocks. The within-block values substantially exceed the across-block value, which is a signal that both groups are internally coherent and sharply separated. The strength of this signal is much lower for Aur-P2, where the pattern is 0.49 within the restricted block and 0.92 within the broader block, against 0.4 across the blocks. We also reran the Brower–Kile seriation on 999 Curveball matrices, this preserves site richness and sign frequency while randomising associations (S1 §</w:t>
       </w:r>
       <w:r>
-        <w:rPr>
-          <w:bCs/>
-          <w:b/>
-        </w:rPr>
-        <w:t xml:space="preserve">?@sec-s9-6</w:t>
+        <w:t xml:space="preserve">S1.9.5</w:t>
       </w:r>
       <w:r>
         <w:t xml:space="preserve">). Neither diagonal concentration nor path length exceeded the richness-preserving null in either phase, so the visually compelling diagonal pattern in both phases is not statistically distinguishable from what the fixed-fixed Curveball null generates. These results support interpreting the seriation patterns as a descriptive richness-related trend rather than evidence for a discrete group structure.</w:t>
@@ -1859,11 +1855,7 @@
         <w:t xml:space="preserve">). In Aur-P2 the Bernoulli and Poisson models select a single block and only the Gaussian model selects two blocks, by a marginal 0.9 ICL points. We additionally compared the SBM preference for multiple blocks with a fixed-fixed Curveball null, across 499 null replicates and six phase-by-emission-model tests, no observed ICL improvement over the one-block model remained significant after Benjamini–Hochberg correction (S1 §</w:t>
       </w:r>
       <w:r>
-        <w:rPr>
-          <w:bCs/>
-          <w:b/>
-        </w:rPr>
-        <w:t xml:space="preserve">?@sec-s9-4</w:t>
+        <w:t xml:space="preserve">S1.9.4</w:t>
       </w:r>
       <w:r>
         <w:t xml:space="preserve">). We therefore consider the restricted/broad division as a dominant axis of sign type composition variation (rich vs. poor sign repertoires), rather than a well-defined two-group partition.</w:t>

</xml_diff>

<commit_message>
adding into paper many cross-refs to S1
</commit_message>
<xml_diff>
--- a/paper/paper.docx
+++ b/paper/paper.docx
@@ -956,6 +956,12 @@
         <w:t xml:space="preserve">”</w:t>
       </w:r>
       <w:r>
+        <w:t xml:space="preserve">; date-parsing attrition counts are in S1 §</w:t>
+      </w:r>
+      <w:r>
+        <w:t xml:space="preserve">S1.1</w:t>
+      </w:r>
+      <w:r>
         <w:t xml:space="preserve">. Our sample for analysis includes 409 objects found at 28 unique geographic sites, yielding 29 site-phase assemblages (Hohle Fels has objects in both phases) in 7 countries, and 29 sign types (</w:t>
       </w:r>
       <w:hyperlink w:anchor="fig-site-map">
@@ -1176,7 +1182,49 @@
         <w:t xml:space="preserve">[31]</w:t>
       </w:r>
       <w:r>
-        <w:t xml:space="preserve">. The test showed no significant correlation between object abundance distance and Jaccard sign composition dissimilarity (R = 0.151, p = 0.071). This result concerns pairwise composition only. It does not remove the separate correlation between object count and sign-type richness per site. We test that richness confound directly at the object level (see our S1). The Mantel result supports presence/absence coding without implying independence from sampling effort. Beyond presence/absence coding, we additionally tested the residual object-count confound directly at the object level via downsampling, coverage-based rarefaction, and a negative-binomial regression with log object count as a covariate (see our S1 ).</w:t>
+        <w:t xml:space="preserve">. The test showed no significant correlation between object abundance distance and Jaccard sign composition dissimilarity (R = 0.151, p = 0.071). This result concerns pairwise composition only. It does not remove the separate correlation between object count and sign-type richness per site. We test that richness confound directly at the object level (see our S1 §</w:t>
+      </w:r>
+      <w:r>
+        <w:t xml:space="preserve">S1.12.3</w:t>
+      </w:r>
+      <w:r>
+        <w:t xml:space="preserve">, §</w:t>
+      </w:r>
+      <w:r>
+        <w:t xml:space="preserve">S1.12.4</w:t>
+      </w:r>
+      <w:r>
+        <w:t xml:space="preserve"> </w:t>
+      </w:r>
+      <w:r>
+        <w:t xml:space="preserve">and §</w:t>
+      </w:r>
+      <w:r>
+        <w:t xml:space="preserve">S1.12.5</w:t>
+      </w:r>
+      <w:r>
+        <w:t xml:space="preserve">). The Mantel result supports presence/absence coding without implying independence from sampling effort. Beyond presence/absence coding, we additionally tested the residual object-count confound directly at the object level via downsampling, coverage-based rarefaction, and a negative-binomial regression with log object count as a covariate (S1 §</w:t>
+      </w:r>
+      <w:r>
+        <w:t xml:space="preserve">S1.12.3</w:t>
+      </w:r>
+      <w:r>
+        <w:t xml:space="preserve">, §</w:t>
+      </w:r>
+      <w:r>
+        <w:t xml:space="preserve">S1.12.4</w:t>
+      </w:r>
+      <w:r>
+        <w:t xml:space="preserve"> </w:t>
+      </w:r>
+      <w:r>
+        <w:t xml:space="preserve">and §</w:t>
+      </w:r>
+      <w:r>
+        <w:t xml:space="preserve">S1.12.5</w:t>
+      </w:r>
+      <w:r>
+        <w:t xml:space="preserve">).</w:t>
       </w:r>
     </w:p>
     <w:p>
@@ -1249,7 +1297,13 @@
         <w:t xml:space="preserve"> </w:t>
       </w:r>
       <w:r>
-        <w:t xml:space="preserve">of the site Jaccard dissimilarity matrix on a linear geographic trend surface (longitude + latitude, identical specification in both phases; S1). It detects a weak linear geographic trend in Aur-P1 (R² = 0.156, adjusted R² = 0.057, p = 0.038) but no signal in Aur-P2 (R² = 0.191, adjusted R² = -0.078, p = 0.85). The Aur-P1 trend explains only about six percent of the adjusted variation, we interpret this, at most, a faint geographic gradient, not discrete geographic groups.</w:t>
+        <w:t xml:space="preserve">of the site Jaccard dissimilarity matrix on a linear geographic trend surface (longitude + latitude, identical specification in both phases; S1 §</w:t>
+      </w:r>
+      <w:r>
+        <w:t xml:space="preserve">S1.4.4</w:t>
+      </w:r>
+      <w:r>
+        <w:t xml:space="preserve">). It detects a weak linear geographic trend in Aur-P1 (R² = 0.156, adjusted R² = 0.057, p = 0.038) but no signal in Aur-P2 (R² = 0.191, adjusted R² = -0.078, p = 0.85). The Aur-P1 trend explains only about six percent of the adjusted variation, we interpret this, at most, a faint geographic gradient, not discrete geographic groups.</w:t>
       </w:r>
     </w:p>
     <w:tbl>
@@ -1634,7 +1688,25 @@
         <w:pStyle w:val="BodyText"/>
       </w:pPr>
       <w:r>
-        <w:t xml:space="preserve">Because the restricted/broad group assignments were derived from visual inspection of the seriation results using the same sign data tested here, the PerMANOVA p-values therefore cannot be presented as independent confirmation that the groups differ. Thus we interrogate these assignments with several additional cross-validation and permutation methods. These are described in our S1 and reported briefly below.</w:t>
+        <w:t xml:space="preserve">Because the restricted/broad group assignments were derived from visual inspection of the seriation results using the same sign data tested here, the PerMANOVA p-values therefore cannot be presented as independent confirmation that the groups differ. Thus we interrogate these assignments with several additional cross-validation and permutation methods. These are described in our S1 §</w:t>
+      </w:r>
+      <w:r>
+        <w:t xml:space="preserve">S1.10</w:t>
+      </w:r>
+      <w:r>
+        <w:t xml:space="preserve"> </w:t>
+      </w:r>
+      <w:r>
+        <w:t xml:space="preserve">and §</w:t>
+      </w:r>
+      <w:r>
+        <w:t xml:space="preserve">S1.10.3</w:t>
+      </w:r>
+      <w:r>
+        <w:t xml:space="preserve"> </w:t>
+      </w:r>
+      <w:r>
+        <w:t xml:space="preserve">and reported briefly below.</w:t>
       </w:r>
     </w:p>
     <w:bookmarkEnd w:id="31"/>
@@ -1833,7 +1905,13 @@
         <w:pStyle w:val="BodyText"/>
       </w:pPr>
       <w:r>
-        <w:t xml:space="preserve">In Aur-P2 the restricted-range group consists of Les Rois, Sirgenstein Cave, La Viña, Mladeč, Gargas, and Vindija Cave, carrying few sign types, while the broad-range group consists of Trou Magrite, Bockstein-Törle, and Hohle Fels, which share a wider repertoire (including hatching and oblique notch, obnotch; Hohle Fels additionally contributes dashline, dot, cross, zigzag, v, and circumspiral). While inferring a two-group structure from the Aur-P1 seriation results seems straightforward, this is less clear for Aur-P2 where the partition rests on only 9 sites.</w:t>
+        <w:t xml:space="preserve">In Aur-P2 the restricted-range group consists of Les Rois, Sirgenstein Cave, La Viña, Mladeč, Gargas, and Vindija Cave, carrying few sign types, while the broad-range group consists of Trou Magrite, Bockstein-Törle, and Hohle Fels, which share a wider repertoire (including hatching and oblique notch, obnotch; Hohle Fels additionally contributes dashline, dot, cross, zigzag, v, and circumspiral). While inferring a two-group structure from the Aur-P1 seriation results seems straightforward, this is less clear for Aur-P2 where the partition rests on only 9 sites (S1 §</w:t>
+      </w:r>
+      <w:r>
+        <w:t xml:space="preserve">S1.13</w:t>
+      </w:r>
+      <w:r>
+        <w:t xml:space="preserve">).</w:t>
       </w:r>
     </w:p>
     <w:p>
@@ -1841,7 +1919,22 @@
         <w:pStyle w:val="BodyText"/>
       </w:pPr>
       <w:r>
-        <w:t xml:space="preserve">To quantitatively evaluate the two-group hypothesis inferred from the seriation analysis, we used bootstrap resampling and stochastic block models, which we describe in detail in S1. Bootstrap resampling tests the stability of the two groups as an imposed partition. It shows that for Aur-P1, mean within-block co-clustering is 0.75 for the restricted-range block and 0.97 for the broader-range block, against 0.2 across the two blocks. The within-block values substantially exceed the across-block value. This pattern shows that the imposed restricted/broad labels remain stable under object-within-site resampling. It does not test whether two discrete groups exist beyond richness differences. The strength of this signal is much lower for Aur-P2, where the pattern is 0.49 within the restricted block and 0.92 within the broader block, against 0.4 across the blocks. We also reran the Brower–Kile seriation on 999 Curveball matrices, this preserves site richness and sign frequency while randomising associations (S1 §</w:t>
+        <w:t xml:space="preserve">To quantitatively evaluate the two-group hypothesis inferred from the seriation analysis, we used bootstrap resampling and stochastic block models, which we describe in detail in S1 §</w:t>
+      </w:r>
+      <w:r>
+        <w:t xml:space="preserve">S1.9.2</w:t>
+      </w:r>
+      <w:r>
+        <w:t xml:space="preserve"> </w:t>
+      </w:r>
+      <w:r>
+        <w:t xml:space="preserve">and §</w:t>
+      </w:r>
+      <w:r>
+        <w:t xml:space="preserve">S1.9.3</w:t>
+      </w:r>
+      <w:r>
+        <w:t xml:space="preserve">. Bootstrap resampling tests the stability of the two groups as an imposed partition. It shows that for Aur-P1, mean within-block co-clustering is 0.75 for the restricted-range block and 0.97 for the broader-range block, against 0.2 across the two blocks. The within-block values substantially exceed the across-block value. This pattern shows that the imposed restricted/broad labels remain stable under object-within-site resampling. It does not test whether two discrete groups exist beyond richness differences. The strength of this signal is much lower for Aur-P2, where the pattern is 0.49 within the restricted block and 0.92 within the broader block, against 0.4 across the blocks. We also reran the Brower–Kile seriation on 999 Curveball matrices, this preserves site richness and sign frequency while randomising associations (S1 §</w:t>
       </w:r>
       <w:r>
         <w:t xml:space="preserve">S1.9.5</w:t>
@@ -2066,7 +2159,19 @@
         <w:t xml:space="preserve"> </w:t>
       </w:r>
       <w:r>
-        <w:t xml:space="preserve">shows the results of permutation tests (n = 10,000) assessing whether the observed statistics differ from a phase-randomized null distribution, and pairwise randomisation tests comparing the two phases. Under phase-label permutation, which shuffles site phase assignments while preserving phase sizes, none of the network statistics, edge density, modularity (Louvain), mean betweenness, or component count, differs significantly from its null distribution in either phase. All observed values fall within the null 95% confidence intervals and all Benjamini–Hochberg-adjusted p-values are ≥ 0.05. A separate topology-randomized modularity test (S1), which randomizes edges while preserving the observed degree sequence, shows that Aur-P1’s observed modularity (0.336 at threshold 0.2) significantly exceeds that degree-preserving expectation (p = 0.000), while Aur-P2’s observed modularity (0.161) does not (p = 0.078), consistent with Aur-P2’s small sample size. The Aur-P1–Aur-P2 contrast is therefore primarily one of network scale rather than a statistically distinguishable community structure. Object-within-site bootstrap stability bands likewise overlap between phases for both mean degree and modularity (S1), so the phase contrast could be produced by within-site object sampling alone.</w:t>
+        <w:t xml:space="preserve">shows the results of permutation tests (n = 10,000) assessing whether the observed statistics differ from a phase-randomized null distribution, and pairwise randomisation tests comparing the two phases. Under phase-label permutation, which shuffles site phase assignments while preserving phase sizes, none of the network statistics, edge density, modularity (Louvain), mean betweenness, or component count, differs significantly from its null distribution in either phase. All observed values fall within the null 95% confidence intervals and all Benjamini–Hochberg-adjusted p-values are ≥ 0.05. A separate assemblage-permutation modularity test (S1 §</w:t>
+      </w:r>
+      <w:r>
+        <w:t xml:space="preserve">S1.7.2</w:t>
+      </w:r>
+      <w:r>
+        <w:t xml:space="preserve">), which permutes site-level sign vectors among phases while preserving phase sizes, shows that Aur-P1’s observed modularity (0.336 at threshold 0.2) significantly exceeds that null expectation (p = 0.000), while Aur-P2’s observed modularity (0.161) does not (p = 0.078), consistent with Aur-P2’s small sample size. The Aur-P1–Aur-P2 contrast is therefore primarily one of network scale rather than a statistically distinguishable community structure. Object-within-site bootstrap stability bands likewise overlap between phases for both mean degree and modularity (S1 §</w:t>
+      </w:r>
+      <w:r>
+        <w:t xml:space="preserve">S1.7.4</w:t>
+      </w:r>
+      <w:r>
+        <w:t xml:space="preserve">), so the phase contrast could be produced by within-site object sampling alone.</w:t>
       </w:r>
     </w:p>
     <w:p>
@@ -2074,7 +2179,28 @@
         <w:pStyle w:val="BodyText"/>
       </w:pPr>
       <w:r>
-        <w:t xml:space="preserve">We assessed the sensitivity of our network analysis to site assignment criteria in three ways: (1) reverting to purely date-based assignment; (2) excluding Vogelherd entirely, as a site with an unusually large sign assemblage; (3) excluding figurines concentrated at Vogelherd (S1 ). Under all conditions, the Aur-P1 &gt; Aur-P2 connectivity ordering is preserved (Aur-P1 mean degree: 7.50 baseline, 7.26 no Vogelherd, 7.40 no figurines; Aur-P2: 4.22). Excluding Vogelherd reduces Aur-P1 edges by 8% and mean degree by 3.2%, but does not alter the phase contrast or the within-phase two-group pattern. Because the principal results are unchanged when Vogelherd is excluded entirely, our conclusions do not depend on its inclusion or on its precise archaeological attribution. That said, this connectivity ordering reflects Aur-P1’s larger site sample, not higher intrinsic connectivity (size-normalized MD ratios are ~1.0 for both phases, see S1).</w:t>
+        <w:t xml:space="preserve">We assessed the sensitivity of our network analysis to site assignment criteria in three ways: (1) reverting to purely date-based assignment; (2) excluding Vogelherd entirely, as a site with an unusually large sign assemblage; (3) excluding figurines concentrated at Vogelherd (S1 §</w:t>
+      </w:r>
+      <w:r>
+        <w:t xml:space="preserve">S1.5.5</w:t>
+      </w:r>
+      <w:r>
+        <w:t xml:space="preserve"> </w:t>
+      </w:r>
+      <w:r>
+        <w:t xml:space="preserve">and §</w:t>
+      </w:r>
+      <w:r>
+        <w:t xml:space="preserve">S1.12.7</w:t>
+      </w:r>
+      <w:r>
+        <w:t xml:space="preserve">). Under all conditions, the Aur-P1 &gt; Aur-P2 connectivity ordering is preserved (Aur-P1 mean degree: 7.50 baseline, 7.26 no Vogelherd, 7.40 no figurines; Aur-P2: 4.22). Excluding Vogelherd reduces Aur-P1 edges by 8% and mean degree by 3.2%, but does not alter the phase contrast or the within-phase two-group pattern. Because the principal results are unchanged when Vogelherd is excluded entirely, our conclusions do not depend on its inclusion or on its precise archaeological attribution. That said, this connectivity ordering reflects Aur-P1’s larger site sample, not higher intrinsic connectivity (size-normalized MD ratios are ~1.0 for both phases, see S1 §</w:t>
+      </w:r>
+      <w:r>
+        <w:t xml:space="preserve">S1.7.6</w:t>
+      </w:r>
+      <w:r>
+        <w:t xml:space="preserve">).</w:t>
       </w:r>
     </w:p>
     <w:tbl>
@@ -2538,7 +2664,43 @@
         <w:t xml:space="preserve">[2]</w:t>
       </w:r>
       <w:r>
-        <w:t xml:space="preserve">, whose k-means with silhouette criterion divided those sites into &gt;10 vs ≤10 types regardless of geography, similar to our seriation-inferred divide. However, quantitative investigation of our sign type composition groups indicates the two group contrast is recoverable only as gradual axis rather than a sharp partition. Group size differed between phases: in Aur-P1 the restricted-range group (9 sites) was slightly smaller than the broad-range group (11 sites), whereas in the much smaller Aur-P2 the restricted-range group (6 sites) exceeded the broad-range group (3 sites). The removal of Vogelherd, as a site with an unusually high number of signs, does not change the gradient observation. Sensitivity checks strengthen this reading from two further angles. Algorithmic partitions of the same data explain at least as much compositional variance as the manual grouping, so the manual contrast understates rather than overstates the structure, while cross-algorithm agreement holds in Aur-P1 and breaks down in the small Aur-P2 sample (S1). Communities differ mainly in the frequency of the most widespread sign types, with no type exclusive to one community, which favours graded repertoires over discrete provinces (S1).</w:t>
+        <w:t xml:space="preserve">, whose k-means with silhouette criterion divided those sites into &gt;10 vs ≤10 types regardless of geography, similar to our seriation-inferred divide. However, quantitative investigation of our sign type composition groups indicates the two group contrast is recoverable only as gradual axis rather than a sharp partition. Group size differed between phases: in Aur-P1 the restricted-range group (9 sites) was slightly smaller than the broad-range group (11 sites), whereas in the much smaller Aur-P2 the restricted-range group (6 sites) exceeded the broad-range group (3 sites). The removal of Vogelherd, as a site with an unusually high number of signs, does not change the gradient observation (S1 §</w:t>
+      </w:r>
+      <w:r>
+        <w:t xml:space="preserve">S1.5.5</w:t>
+      </w:r>
+      <w:r>
+        <w:t xml:space="preserve"> </w:t>
+      </w:r>
+      <w:r>
+        <w:t xml:space="preserve">and §</w:t>
+      </w:r>
+      <w:r>
+        <w:t xml:space="preserve">S1.12.7</w:t>
+      </w:r>
+      <w:r>
+        <w:t xml:space="preserve">). Sensitivity checks strengthen this reading from two further angles. Algorithmic partitions of the same data explain at least as much compositional variance as the manual grouping, so the manual contrast understates rather than overstates the structure, while cross-algorithm agreement holds in Aur-P1 and breaks down in the small Aur-P2 sample (S1 §</w:t>
+      </w:r>
+      <w:r>
+        <w:t xml:space="preserve">S1.6.6</w:t>
+      </w:r>
+      <w:r>
+        <w:t xml:space="preserve"> </w:t>
+      </w:r>
+      <w:r>
+        <w:t xml:space="preserve">and §</w:t>
+      </w:r>
+      <w:r>
+        <w:t xml:space="preserve">S1.6.7</w:t>
+      </w:r>
+      <w:r>
+        <w:t xml:space="preserve">). Communities differ mainly in the frequency of the most widespread sign types, with no type exclusive to one community, which favours graded repertoires over discrete provinces (S1 §</w:t>
+      </w:r>
+      <w:r>
+        <w:t xml:space="preserve">S1.11.3</w:t>
+      </w:r>
+      <w:r>
+        <w:t xml:space="preserve">).</w:t>
       </w:r>
     </w:p>
     <w:p>
@@ -2563,7 +2725,22 @@
         <w:t xml:space="preserve">S1.7.6</w:t>
       </w:r>
       <w:r>
-        <w:t xml:space="preserve">), indicating the Aur-P1–Aur-P2 contrast is a difference in network scale rather than in overall connectedness or community structure. An exploratory PerMANOVA returns a nominal separation of the restricted- and broad-range groups in Aur-P1 sign composition (R² = 0.196, p = 0.001) but not in Aur-P2 (R² = 0.223, p = 0.076), consistent with the smaller Aur-P2 sample. That said, our sensitivity analyses show that this result is best taken as a gradual axis of variation (S1 ).</w:t>
+        <w:t xml:space="preserve">), indicating the Aur-P1–Aur-P2 contrast is a difference in network scale rather than in overall connectedness or community structure. An exploratory PerMANOVA returns a nominal separation of the restricted- and broad-range groups in Aur-P1 sign composition (R² = 0.196, p = 0.001) but not in Aur-P2 (R² = 0.223, p = 0.076), consistent with the smaller Aur-P2 sample. That said, our sensitivity analyses show that this result is best taken as a gradual axis of variation (S1 §</w:t>
+      </w:r>
+      <w:r>
+        <w:t xml:space="preserve">S1.10</w:t>
+      </w:r>
+      <w:r>
+        <w:t xml:space="preserve"> </w:t>
+      </w:r>
+      <w:r>
+        <w:t xml:space="preserve">and §</w:t>
+      </w:r>
+      <w:r>
+        <w:t xml:space="preserve">S1.10.3</w:t>
+      </w:r>
+      <w:r>
+        <w:t xml:space="preserve">).</w:t>
       </w:r>
     </w:p>
     <w:p>
@@ -2690,7 +2867,22 @@
         </w:r>
       </w:hyperlink>
       <w:r>
-        <w:t xml:space="preserve">), although this null result should be interpreted cautiously given the small sample sizes and limited statistical power (see our S1 ), and bootstrap confidence intervals on the Mantel R show that a moderate geographic correlation could not be excluded at these sample sizes (S1 §</w:t>
+        <w:t xml:space="preserve">), although this null result should be interpreted cautiously given the small sample sizes and limited statistical power (see our S1 §</w:t>
+      </w:r>
+      <w:r>
+        <w:t xml:space="preserve">S1.13</w:t>
+      </w:r>
+      <w:r>
+        <w:t xml:space="preserve"> </w:t>
+      </w:r>
+      <w:r>
+        <w:t xml:space="preserve">and §</w:t>
+      </w:r>
+      <w:r>
+        <w:t xml:space="preserve">S1.4.3</w:t>
+      </w:r>
+      <w:r>
+        <w:t xml:space="preserve">), and bootstrap confidence intervals on the Mantel R show that a moderate geographic correlation could not be excluded at these sample sizes (S1 §</w:t>
       </w:r>
       <w:r>
         <w:t xml:space="preserve">S1.4.3</w:t>
@@ -2932,7 +3124,22 @@
         </w:r>
       </w:hyperlink>
       <w:r>
-        <w:t xml:space="preserve">), and no significant geographic signal was detected in either phase (Aur-P2: R = -0.299). A permutation test of the difference between these Mantel correlations (D = 0.34, p = 0.153; sites permuted between phases 1,000 times) shows that the isolation-by-distance relationship does not differ significantly between the phases, so the spatial-proximity explanation is not supported by this analysis. This null result reflects limited statistical power at these sample sizes rather than positive evidence that geography is irrelevant, as quantified by bootstrap confidence intervals on the Mantel R (S1 ).</w:t>
+        <w:t xml:space="preserve">), and no significant geographic signal was detected in either phase (Aur-P2: R = -0.299). A permutation test of the difference between these Mantel correlations (D = 0.34, p = 0.153; sites permuted between phases 1,000 times) shows that the isolation-by-distance relationship does not differ significantly between the phases, so the spatial-proximity explanation is not supported by this analysis. This null result reflects limited statistical power at these sample sizes rather than positive evidence that geography is irrelevant, as quantified by bootstrap confidence intervals on the Mantel R (S1 §</w:t>
+      </w:r>
+      <w:r>
+        <w:t xml:space="preserve">S1.4.3</w:t>
+      </w:r>
+      <w:r>
+        <w:t xml:space="preserve"> </w:t>
+      </w:r>
+      <w:r>
+        <w:t xml:space="preserve">and §</w:t>
+      </w:r>
+      <w:r>
+        <w:t xml:space="preserve">S1.13</w:t>
+      </w:r>
+      <w:r>
+        <w:t xml:space="preserve">).</w:t>
       </w:r>
       <w:r>
         <w:t xml:space="preserve"> </w:t>
@@ -2944,7 +3151,13 @@
         <w:t xml:space="preserve"> </w:t>
       </w:r>
       <w:r>
-        <w:t xml:space="preserve">report a similar pattern for ornaments, a non-significant, near-zero global Mantel with spatial structure only in correlograms at short lags (≤~300 km). We did not find structure in correlograms at short lags.</w:t>
+        <w:t xml:space="preserve">report a similar pattern for ornaments, a non-significant, near-zero global Mantel with spatial structure only in correlograms at short lags (≤~300 km). We did not find structure in correlograms at short lags (S1 §</w:t>
+      </w:r>
+      <w:r>
+        <w:t xml:space="preserve">S1.4.3</w:t>
+      </w:r>
+      <w:r>
+        <w:t xml:space="preserve">).</w:t>
       </w:r>
     </w:p>
     <w:p>
@@ -3033,7 +3246,13 @@
         <w:t xml:space="preserve"> </w:t>
       </w:r>
       <w:r>
-        <w:t xml:space="preserve">of seasonal or satellite use, with Core Areas corresponding to regions such as the Dordogne. As a speculative analogy, the Core/Extended framework would place highly connected Dordogne sites in Core Areas and lower-connectivity peripheral sites in periodically visited Extended Areas. The smaller Aur-P2 network would then correspond to more localised interaction under consolidation. These analogies are not tested by our analyses, which detected no significant size-adjusted network differences and no significant geographic signal. That said, the contraction of the geometric sign-type pool from Aur-P1 (26 types) to Aur-P2 (15 types) does not survive sensitivity testing. At equal sampling effort with incidence-frequency rarefaction to 63 objects (all types and shared object types only), the rarefied Aur-P1 pool overlaps the Aur-P2 pool, so the raw difference in the number of sign types is not distinguishable from sampling variation. Neither the networks or sign diversity patterns can be clearly linked to demographic dynamics with the current sample.</w:t>
+        <w:t xml:space="preserve">of seasonal or satellite use, with Core Areas corresponding to regions such as the Dordogne. As a speculative analogy, the Core/Extended framework would place highly connected Dordogne sites in Core Areas and lower-connectivity peripheral sites in periodically visited Extended Areas. The smaller Aur-P2 network would then correspond to more localised interaction under consolidation. These analogies are not tested by our analyses, which detected no significant size-adjusted network differences and no significant geographic signal. That said, the contraction of the geometric sign-type pool from Aur-P1 (26 types) to Aur-P2 (15 types) does not survive sensitivity testing. At equal sampling effort with incidence-frequency rarefaction to 63 objects (all types and shared object types only), the rarefied Aur-P1 pool overlaps the Aur-P2 pool, so the raw difference in the number of sign types is not distinguishable from sampling variation (S1 §</w:t>
+      </w:r>
+      <w:r>
+        <w:t xml:space="preserve">S1.12.6</w:t>
+      </w:r>
+      <w:r>
+        <w:t xml:space="preserve">). Neither the networks or sign diversity patterns can be clearly linked to demographic dynamics with the current sample.</w:t>
       </w:r>
     </w:p>
     <w:p>
@@ -3467,19 +3686,19 @@
         <w:pStyle w:val="BodyText"/>
       </w:pPr>
       <w:r>
-        <w:t xml:space="preserve">A restricted/broad repertoire axis is visible in seriation and bootstrap co-clustering, and stochastic block models recover it as the two largest blocks in Aur-P1. The split does not exceed fixed-fixed Curveball expectations in either phase, and the Jaccard separation disappears under Simpson turnover which removes the nestedness component (S1 §-</w:t>
-      </w:r>
-      <w:r>
-        <w:t xml:space="preserve">Section S1.9.5</w:t>
-      </w:r>
-      <w:r>
-        <w:t xml:space="preserve"> </w:t>
-      </w:r>
-      <w:r>
-        <w:t xml:space="preserve">and §-</w:t>
-      </w:r>
-      <w:r>
-        <w:t xml:space="preserve">Section S1.10.3</w:t>
+        <w:t xml:space="preserve">A restricted/broad repertoire axis is visible in seriation and bootstrap co-clustering, and stochastic block models recover it as the two largest blocks in Aur-P1. The split does not exceed fixed-fixed Curveball expectations in either phase, and the Jaccard separation disappears under Simpson turnover which removes the nestedness component (S1 §</w:t>
+      </w:r>
+      <w:r>
+        <w:t xml:space="preserve">S1.9.5</w:t>
+      </w:r>
+      <w:r>
+        <w:t xml:space="preserve"> </w:t>
+      </w:r>
+      <w:r>
+        <w:t xml:space="preserve">and §</w:t>
+      </w:r>
+      <w:r>
+        <w:t xml:space="preserve">S1.10.3</w:t>
       </w:r>
       <w:r>
         <w:t xml:space="preserve">). The division is therefore a descriptive richness gradient whose independence from object count is not demonstrated for sites with small numbers of signs.</w:t>

</xml_diff>